<commit_message>
docs: manual sections 12.2 and 12.3 use LiquidWeighHMI
The Append HMI Desktop and Web figures showed a demo project; they now show
LiquidWeighHMI in both launchers and in the browser.

Co-Authored-By: Claude Opus 5.5 <noreply@anthropic.com>
</commit_message>
<xml_diff>
--- a/doc/Append-HMI-Studio-User-Manual.docx
+++ b/doc/Append-HMI-Studio-User-Manual.docx
@@ -283,7 +283,7 @@
             </w:rPr>
             <w:fldChar w:fldCharType="separate"/>
           </w:r>
-          <w:hyperlink w:anchor="__RefHeading___Toc1952_959657298" w:tooltip="1 Introduction">
+          <w:hyperlink w:anchor="__RefHeading___Toc1952_934876998" w:tooltip="1 Introduction">
             <w:r>
               <w:rPr>
                 <w:rStyle w:val="IndexLink"/>
@@ -304,7 +304,7 @@
             </w:tabs>
             <w:rPr/>
           </w:pPr>
-          <w:hyperlink w:anchor="__RefHeading___Toc1954_959657298" w:tooltip="1.1 How an HMI application is organized">
+          <w:hyperlink w:anchor="__RefHeading___Toc1954_934876998" w:tooltip="1.1 How an HMI application is organized">
             <w:r>
               <w:rPr>
                 <w:rStyle w:val="IndexLink"/>
@@ -325,7 +325,7 @@
             </w:tabs>
             <w:rPr/>
           </w:pPr>
-          <w:hyperlink w:anchor="__RefHeading___Toc1956_959657298" w:tooltip="2 The Studio window">
+          <w:hyperlink w:anchor="__RefHeading___Toc1956_934876998" w:tooltip="2 The Studio window">
             <w:r>
               <w:rPr>
                 <w:rStyle w:val="IndexLink"/>
@@ -346,7 +346,7 @@
             </w:tabs>
             <w:rPr/>
           </w:pPr>
-          <w:hyperlink w:anchor="__RefHeading___Toc1958_959657298" w:tooltip="2.1 The HMI menu">
+          <w:hyperlink w:anchor="__RefHeading___Toc1958_934876998" w:tooltip="2.1 The HMI menu">
             <w:r>
               <w:rPr>
                 <w:rStyle w:val="IndexLink"/>
@@ -367,7 +367,7 @@
             </w:tabs>
             <w:rPr/>
           </w:pPr>
-          <w:hyperlink w:anchor="__RefHeading___Toc1960_959657298" w:tooltip="3 Application settings">
+          <w:hyperlink w:anchor="__RefHeading___Toc1960_934876998" w:tooltip="3 Application settings">
             <w:r>
               <w:rPr>
                 <w:rStyle w:val="IndexLink"/>
@@ -388,7 +388,7 @@
             </w:tabs>
             <w:rPr/>
           </w:pPr>
-          <w:hyperlink w:anchor="__RefHeading___Toc1962_959657298" w:tooltip="4 Devices">
+          <w:hyperlink w:anchor="__RefHeading___Toc1962_934876998" w:tooltip="4 Devices">
             <w:r>
               <w:rPr>
                 <w:rStyle w:val="IndexLink"/>
@@ -409,7 +409,7 @@
             </w:tabs>
             <w:rPr/>
           </w:pPr>
-          <w:hyperlink w:anchor="__RefHeading___Toc1964_959657298" w:tooltip="5 Tags">
+          <w:hyperlink w:anchor="__RefHeading___Toc1964_934876998" w:tooltip="5 Tags">
             <w:r>
               <w:rPr>
                 <w:rStyle w:val="IndexLink"/>
@@ -430,7 +430,7 @@
             </w:tabs>
             <w:rPr/>
           </w:pPr>
-          <w:hyperlink w:anchor="__RefHeading___Toc1966_959657298" w:tooltip="5.1 Tag fields">
+          <w:hyperlink w:anchor="__RefHeading___Toc1966_934876998" w:tooltip="5.1 Tag fields">
             <w:r>
               <w:rPr>
                 <w:rStyle w:val="IndexLink"/>
@@ -451,7 +451,7 @@
             </w:tabs>
             <w:rPr/>
           </w:pPr>
-          <w:hyperlink w:anchor="__RefHeading___Toc1968_959657298" w:tooltip="5.2 Alarms on a tag">
+          <w:hyperlink w:anchor="__RefHeading___Toc1968_934876998" w:tooltip="5.2 Alarms on a tag">
             <w:r>
               <w:rPr>
                 <w:rStyle w:val="IndexLink"/>
@@ -472,7 +472,7 @@
             </w:tabs>
             <w:rPr/>
           </w:pPr>
-          <w:hyperlink w:anchor="__RefHeading___Toc1970_959657298" w:tooltip="6 Screens and windows">
+          <w:hyperlink w:anchor="__RefHeading___Toc1970_934876998" w:tooltip="6 Screens and windows">
             <w:r>
               <w:rPr>
                 <w:rStyle w:val="IndexLink"/>
@@ -493,7 +493,7 @@
             </w:tabs>
             <w:rPr/>
           </w:pPr>
-          <w:hyperlink w:anchor="__RefHeading___Toc1972_959657298" w:tooltip="6.1 Window properties">
+          <w:hyperlink w:anchor="__RefHeading___Toc1972_934876998" w:tooltip="6.1 Window properties">
             <w:r>
               <w:rPr>
                 <w:rStyle w:val="IndexLink"/>
@@ -514,7 +514,7 @@
             </w:tabs>
             <w:rPr/>
           </w:pPr>
-          <w:hyperlink w:anchor="__RefHeading___Toc1974_959657298" w:tooltip="6.2 Navigation">
+          <w:hyperlink w:anchor="__RefHeading___Toc1974_934876998" w:tooltip="6.2 Navigation">
             <w:r>
               <w:rPr>
                 <w:rStyle w:val="IndexLink"/>
@@ -535,7 +535,7 @@
             </w:tabs>
             <w:rPr/>
           </w:pPr>
-          <w:hyperlink w:anchor="__RefHeading___Toc1976_959657298" w:tooltip="7 Drawing objects">
+          <w:hyperlink w:anchor="__RefHeading___Toc1976_934876998" w:tooltip="7 Drawing objects">
             <w:r>
               <w:rPr>
                 <w:rStyle w:val="IndexLink"/>
@@ -556,7 +556,7 @@
             </w:tabs>
             <w:rPr/>
           </w:pPr>
-          <w:hyperlink w:anchor="__RefHeading___Toc1978_959657298" w:tooltip="8 Animation links">
+          <w:hyperlink w:anchor="__RefHeading___Toc1978_934876998" w:tooltip="8 Animation links">
             <w:r>
               <w:rPr>
                 <w:rStyle w:val="IndexLink"/>
@@ -577,7 +577,7 @@
             </w:tabs>
             <w:rPr/>
           </w:pPr>
-          <w:hyperlink w:anchor="__RefHeading___Toc1980_959657298" w:tooltip="8.1 A valve: status color, fault blink and faceplate">
+          <w:hyperlink w:anchor="__RefHeading___Toc1980_934876998" w:tooltip="8.1 A valve: status color, fault blink and faceplate">
             <w:r>
               <w:rPr>
                 <w:rStyle w:val="IndexLink"/>
@@ -598,7 +598,7 @@
             </w:tabs>
             <w:rPr/>
           </w:pPr>
-          <w:hyperlink w:anchor="__RefHeading___Toc1982_959657298" w:tooltip="8.2 The weigh hopper: percent fill">
+          <w:hyperlink w:anchor="__RefHeading___Toc1982_934876998" w:tooltip="8.2 The weigh hopper: percent fill">
             <w:r>
               <w:rPr>
                 <w:rStyle w:val="IndexLink"/>
@@ -619,7 +619,7 @@
             </w:tabs>
             <w:rPr/>
           </w:pPr>
-          <w:hyperlink w:anchor="__RefHeading___Toc1984_959657298" w:tooltip="8.3 Hopper pressure: value display and alarm colors">
+          <w:hyperlink w:anchor="__RefHeading___Toc1984_934876998" w:tooltip="8.3 Hopper pressure: value display and alarm colors">
             <w:r>
               <w:rPr>
                 <w:rStyle w:val="IndexLink"/>
@@ -640,7 +640,7 @@
             </w:tabs>
             <w:rPr/>
           </w:pPr>
-          <w:hyperlink w:anchor="__RefHeading___Toc1986_959657298" w:tooltip="8.4 Setpoints: user input">
+          <w:hyperlink w:anchor="__RefHeading___Toc1986_934876998" w:tooltip="8.4 Setpoints: user input">
             <w:r>
               <w:rPr>
                 <w:rStyle w:val="IndexLink"/>
@@ -661,7 +661,7 @@
             </w:tabs>
             <w:rPr/>
           </w:pPr>
-          <w:hyperlink w:anchor="__RefHeading___Toc1988_959657298" w:tooltip="8.5 Commands: pushbutton and enable">
+          <w:hyperlink w:anchor="__RefHeading___Toc1988_934876998" w:tooltip="8.5 Commands: pushbutton and enable">
             <w:r>
               <w:rPr>
                 <w:rStyle w:val="IndexLink"/>
@@ -682,7 +682,7 @@
             </w:tabs>
             <w:rPr/>
           </w:pPr>
-          <w:hyperlink w:anchor="__RefHeading___Toc1990_959657298" w:tooltip="9 Expressions and scripts">
+          <w:hyperlink w:anchor="__RefHeading___Toc1990_934876998" w:tooltip="9 Expressions and scripts">
             <w:r>
               <w:rPr>
                 <w:rStyle w:val="IndexLink"/>
@@ -703,7 +703,7 @@
             </w:tabs>
             <w:rPr/>
           </w:pPr>
-          <w:hyperlink w:anchor="__RefHeading___Toc1992_959657298" w:tooltip="9.1 Window scripts">
+          <w:hyperlink w:anchor="__RefHeading___Toc1992_934876998" w:tooltip="9.1 Window scripts">
             <w:r>
               <w:rPr>
                 <w:rStyle w:val="IndexLink"/>
@@ -724,7 +724,7 @@
             </w:tabs>
             <w:rPr/>
           </w:pPr>
-          <w:hyperlink w:anchor="__RefHeading___Toc1994_959657298" w:tooltip="9.2 Action scripts">
+          <w:hyperlink w:anchor="__RefHeading___Toc1994_934876998" w:tooltip="9.2 Action scripts">
             <w:r>
               <w:rPr>
                 <w:rStyle w:val="IndexLink"/>
@@ -745,7 +745,7 @@
             </w:tabs>
             <w:rPr/>
           </w:pPr>
-          <w:hyperlink w:anchor="__RefHeading___Toc1996_959657298" w:tooltip="10 Alarms and security">
+          <w:hyperlink w:anchor="__RefHeading___Toc1996_934876998" w:tooltip="10 Alarms and security">
             <w:r>
               <w:rPr>
                 <w:rStyle w:val="IndexLink"/>
@@ -766,7 +766,7 @@
             </w:tabs>
             <w:rPr/>
           </w:pPr>
-          <w:hyperlink w:anchor="__RefHeading___Toc1998_959657298" w:tooltip="10.1 Alarms">
+          <w:hyperlink w:anchor="__RefHeading___Toc1998_934876998" w:tooltip="10.1 Alarms">
             <w:r>
               <w:rPr>
                 <w:rStyle w:val="IndexLink"/>
@@ -787,7 +787,7 @@
             </w:tabs>
             <w:rPr/>
           </w:pPr>
-          <w:hyperlink w:anchor="__RefHeading___Toc2000_959657298" w:tooltip="10.2 Users and access levels">
+          <w:hyperlink w:anchor="__RefHeading___Toc2000_934876998" w:tooltip="10.2 Users and access levels">
             <w:r>
               <w:rPr>
                 <w:rStyle w:val="IndexLink"/>
@@ -808,7 +808,7 @@
             </w:tabs>
             <w:rPr/>
           </w:pPr>
-          <w:hyperlink w:anchor="__RefHeading___Toc2002_959657298" w:tooltip="11 Testing">
+          <w:hyperlink w:anchor="__RefHeading___Toc2002_934876998" w:tooltip="11 Testing">
             <w:r>
               <w:rPr>
                 <w:rStyle w:val="IndexLink"/>
@@ -829,7 +829,7 @@
             </w:tabs>
             <w:rPr/>
           </w:pPr>
-          <w:hyperlink w:anchor="__RefHeading___Toc2004_959657298" w:tooltip="11.1 Validate">
+          <w:hyperlink w:anchor="__RefHeading___Toc2004_934876998" w:tooltip="11.1 Validate">
             <w:r>
               <w:rPr>
                 <w:rStyle w:val="IndexLink"/>
@@ -850,7 +850,7 @@
             </w:tabs>
             <w:rPr/>
           </w:pPr>
-          <w:hyperlink w:anchor="__RefHeading___Toc2006_959657298" w:tooltip="11.2 Run">
+          <w:hyperlink w:anchor="__RefHeading___Toc2006_934876998" w:tooltip="11.2 Run">
             <w:r>
               <w:rPr>
                 <w:rStyle w:val="IndexLink"/>
@@ -871,7 +871,7 @@
             </w:tabs>
             <w:rPr/>
           </w:pPr>
-          <w:hyperlink w:anchor="__RefHeading___Toc2008_959657298" w:tooltip="12 Deploying">
+          <w:hyperlink w:anchor="__RefHeading___Toc2008_934876998" w:tooltip="12 Deploying">
             <w:r>
               <w:rPr>
                 <w:rStyle w:val="IndexLink"/>
@@ -892,7 +892,7 @@
             </w:tabs>
             <w:rPr/>
           </w:pPr>
-          <w:hyperlink w:anchor="__RefHeading___Toc2010_959657298" w:tooltip="12.1 Publish">
+          <w:hyperlink w:anchor="__RefHeading___Toc2010_934876998" w:tooltip="12.1 Publish">
             <w:r>
               <w:rPr>
                 <w:rStyle w:val="IndexLink"/>
@@ -913,7 +913,7 @@
             </w:tabs>
             <w:rPr/>
           </w:pPr>
-          <w:hyperlink w:anchor="__RefHeading___Toc2012_959657298" w:tooltip="12.2 Append HMI Desktop">
+          <w:hyperlink w:anchor="__RefHeading___Toc2012_934876998" w:tooltip="12.2 Append HMI Desktop">
             <w:r>
               <w:rPr>
                 <w:rStyle w:val="IndexLink"/>
@@ -934,7 +934,7 @@
             </w:tabs>
             <w:rPr/>
           </w:pPr>
-          <w:hyperlink w:anchor="__RefHeading___Toc2014_959657298" w:tooltip="12.3 Append HMI Web">
+          <w:hyperlink w:anchor="__RefHeading___Toc2014_934876998" w:tooltip="12.3 Append HMI Web">
             <w:r>
               <w:rPr>
                 <w:rStyle w:val="IndexLink"/>
@@ -955,7 +955,7 @@
             </w:tabs>
             <w:rPr/>
           </w:pPr>
-          <w:hyperlink w:anchor="__RefHeading___Toc2016_959657298" w:tooltip="13 Tips and troubleshooting">
+          <w:hyperlink w:anchor="__RefHeading___Toc2016_934876998" w:tooltip="13 Tips and troubleshooting">
             <w:r>
               <w:rPr>
                 <w:rStyle w:val="IndexLink"/>
@@ -976,7 +976,7 @@
             </w:tabs>
             <w:rPr/>
           </w:pPr>
-          <w:hyperlink w:anchor="__RefHeading___Toc2018_959657298" w:tooltip="Appendix A Command-line automation">
+          <w:hyperlink w:anchor="__RefHeading___Toc2018_934876998" w:tooltip="Appendix A Command-line automation">
             <w:r>
               <w:rPr>
                 <w:rStyle w:val="IndexLink"/>
@@ -984,7 +984,7 @@
               </w:rPr>
               <w:t>Appendix A Command-line automation</w:t>
               <w:tab/>
-              <w:t>36</w:t>
+              <w:t>35</w:t>
             </w:r>
           </w:hyperlink>
           <w:r>
@@ -1014,7 +1014,7 @@
         <w:spacing w:before="0" w:after="0"/>
         <w:rPr/>
       </w:pPr>
-      <w:bookmarkStart w:id="0" w:name="__RefHeading___Toc1952_959657298"/>
+      <w:bookmarkStart w:id="0" w:name="__RefHeading___Toc1952_934876998"/>
       <w:bookmarkEnd w:id="0"/>
       <w:r>
         <w:rPr/>
@@ -1656,7 +1656,7 @@
         <w:pStyle w:val="Heading2"/>
         <w:rPr/>
       </w:pPr>
-      <w:bookmarkStart w:id="1" w:name="__RefHeading___Toc1954_959657298"/>
+      <w:bookmarkStart w:id="1" w:name="__RefHeading___Toc1954_934876998"/>
       <w:bookmarkEnd w:id="1"/>
       <w:r>
         <w:rPr/>
@@ -1799,7 +1799,7 @@
         <w:pStyle w:val="Heading1"/>
         <w:rPr/>
       </w:pPr>
-      <w:bookmarkStart w:id="2" w:name="__RefHeading___Toc1956_959657298"/>
+      <w:bookmarkStart w:id="2" w:name="__RefHeading___Toc1956_934876998"/>
       <w:bookmarkEnd w:id="2"/>
       <w:r>
         <w:rPr/>
@@ -2383,7 +2383,7 @@
         <w:pStyle w:val="Heading2"/>
         <w:rPr/>
       </w:pPr>
-      <w:bookmarkStart w:id="3" w:name="__RefHeading___Toc1958_959657298"/>
+      <w:bookmarkStart w:id="3" w:name="__RefHeading___Toc1958_934876998"/>
       <w:bookmarkEnd w:id="3"/>
       <w:r>
         <w:rPr/>
@@ -3302,7 +3302,7 @@
         <w:pStyle w:val="Heading1"/>
         <w:rPr/>
       </w:pPr>
-      <w:bookmarkStart w:id="4" w:name="__RefHeading___Toc1960_959657298"/>
+      <w:bookmarkStart w:id="4" w:name="__RefHeading___Toc1960_934876998"/>
       <w:bookmarkEnd w:id="4"/>
       <w:r>
         <w:rPr/>
@@ -3584,7 +3584,7 @@
         <w:pStyle w:val="Heading1"/>
         <w:rPr/>
       </w:pPr>
-      <w:bookmarkStart w:id="5" w:name="__RefHeading___Toc1962_959657298"/>
+      <w:bookmarkStart w:id="5" w:name="__RefHeading___Toc1962_934876998"/>
       <w:bookmarkEnd w:id="5"/>
       <w:r>
         <w:rPr/>
@@ -4387,7 +4387,7 @@
         <w:pStyle w:val="Heading1"/>
         <w:rPr/>
       </w:pPr>
-      <w:bookmarkStart w:id="6" w:name="__RefHeading___Toc1964_959657298"/>
+      <w:bookmarkStart w:id="6" w:name="__RefHeading___Toc1964_934876998"/>
       <w:bookmarkEnd w:id="6"/>
       <w:r>
         <w:rPr/>
@@ -5132,7 +5132,7 @@
         <w:pStyle w:val="Heading2"/>
         <w:rPr/>
       </w:pPr>
-      <w:bookmarkStart w:id="7" w:name="__RefHeading___Toc1966_959657298"/>
+      <w:bookmarkStart w:id="7" w:name="__RefHeading___Toc1966_934876998"/>
       <w:bookmarkEnd w:id="7"/>
       <w:r>
         <w:rPr/>
@@ -5790,7 +5790,7 @@
         <w:pStyle w:val="Heading2"/>
         <w:rPr/>
       </w:pPr>
-      <w:bookmarkStart w:id="8" w:name="__RefHeading___Toc1968_959657298"/>
+      <w:bookmarkStart w:id="8" w:name="__RefHeading___Toc1968_934876998"/>
       <w:bookmarkEnd w:id="8"/>
       <w:r>
         <w:rPr/>
@@ -5922,7 +5922,7 @@
         <w:pStyle w:val="Heading1"/>
         <w:rPr/>
       </w:pPr>
-      <w:bookmarkStart w:id="9" w:name="__RefHeading___Toc1970_959657298"/>
+      <w:bookmarkStart w:id="9" w:name="__RefHeading___Toc1970_934876998"/>
       <w:bookmarkEnd w:id="9"/>
       <w:r>
         <w:rPr/>
@@ -6441,7 +6441,7 @@
         <w:pStyle w:val="Heading2"/>
         <w:rPr/>
       </w:pPr>
-      <w:bookmarkStart w:id="10" w:name="__RefHeading___Toc1972_959657298"/>
+      <w:bookmarkStart w:id="10" w:name="__RefHeading___Toc1972_934876998"/>
       <w:bookmarkEnd w:id="10"/>
       <w:r>
         <w:rPr/>
@@ -6603,7 +6603,7 @@
         <w:pStyle w:val="Heading2"/>
         <w:rPr/>
       </w:pPr>
-      <w:bookmarkStart w:id="11" w:name="__RefHeading___Toc1974_959657298"/>
+      <w:bookmarkStart w:id="11" w:name="__RefHeading___Toc1974_934876998"/>
       <w:bookmarkEnd w:id="11"/>
       <w:r>
         <w:rPr/>
@@ -6645,7 +6645,7 @@
         <w:pStyle w:val="Heading1"/>
         <w:rPr/>
       </w:pPr>
-      <w:bookmarkStart w:id="12" w:name="__RefHeading___Toc1976_959657298"/>
+      <w:bookmarkStart w:id="12" w:name="__RefHeading___Toc1976_934876998"/>
       <w:bookmarkEnd w:id="12"/>
       <w:r>
         <w:rPr/>
@@ -6851,7 +6851,7 @@
         <w:pStyle w:val="Heading1"/>
         <w:rPr/>
       </w:pPr>
-      <w:bookmarkStart w:id="13" w:name="__RefHeading___Toc1978_959657298"/>
+      <w:bookmarkStart w:id="13" w:name="__RefHeading___Toc1978_934876998"/>
       <w:bookmarkEnd w:id="13"/>
       <w:r>
         <w:rPr/>
@@ -7586,7 +7586,7 @@
         <w:pStyle w:val="Heading2"/>
         <w:rPr/>
       </w:pPr>
-      <w:bookmarkStart w:id="14" w:name="__RefHeading___Toc1980_959657298"/>
+      <w:bookmarkStart w:id="14" w:name="__RefHeading___Toc1980_934876998"/>
       <w:bookmarkEnd w:id="14"/>
       <w:r>
         <w:rPr/>
@@ -7750,7 +7750,7 @@
         <w:pStyle w:val="Heading2"/>
         <w:rPr/>
       </w:pPr>
-      <w:bookmarkStart w:id="15" w:name="__RefHeading___Toc1982_959657298"/>
+      <w:bookmarkStart w:id="15" w:name="__RefHeading___Toc1982_934876998"/>
       <w:bookmarkEnd w:id="15"/>
       <w:r>
         <w:rPr/>
@@ -7871,7 +7871,7 @@
         <w:pStyle w:val="Heading2"/>
         <w:rPr/>
       </w:pPr>
-      <w:bookmarkStart w:id="16" w:name="__RefHeading___Toc1984_959657298"/>
+      <w:bookmarkStart w:id="16" w:name="__RefHeading___Toc1984_934876998"/>
       <w:bookmarkEnd w:id="16"/>
       <w:r>
         <w:rPr/>
@@ -7984,7 +7984,7 @@
         <w:pStyle w:val="Heading2"/>
         <w:rPr/>
       </w:pPr>
-      <w:bookmarkStart w:id="17" w:name="__RefHeading___Toc1986_959657298"/>
+      <w:bookmarkStart w:id="17" w:name="__RefHeading___Toc1986_934876998"/>
       <w:bookmarkEnd w:id="17"/>
       <w:r>
         <w:rPr/>
@@ -8097,7 +8097,7 @@
         <w:pStyle w:val="Heading2"/>
         <w:rPr/>
       </w:pPr>
-      <w:bookmarkStart w:id="18" w:name="__RefHeading___Toc1988_959657298"/>
+      <w:bookmarkStart w:id="18" w:name="__RefHeading___Toc1988_934876998"/>
       <w:bookmarkEnd w:id="18"/>
       <w:r>
         <w:rPr/>
@@ -8610,7 +8610,7 @@
         <w:pStyle w:val="Heading1"/>
         <w:rPr/>
       </w:pPr>
-      <w:bookmarkStart w:id="19" w:name="__RefHeading___Toc1990_959657298"/>
+      <w:bookmarkStart w:id="19" w:name="__RefHeading___Toc1990_934876998"/>
       <w:bookmarkEnd w:id="19"/>
       <w:r>
         <w:rPr/>
@@ -9522,7 +9522,7 @@
         <w:pStyle w:val="Heading2"/>
         <w:rPr/>
       </w:pPr>
-      <w:bookmarkStart w:id="20" w:name="__RefHeading___Toc1992_959657298"/>
+      <w:bookmarkStart w:id="20" w:name="__RefHeading___Toc1992_934876998"/>
       <w:bookmarkEnd w:id="20"/>
       <w:r>
         <w:rPr/>
@@ -9703,7 +9703,7 @@
         <w:pStyle w:val="Heading2"/>
         <w:rPr/>
       </w:pPr>
-      <w:bookmarkStart w:id="21" w:name="__RefHeading___Toc1994_959657298"/>
+      <w:bookmarkStart w:id="21" w:name="__RefHeading___Toc1994_934876998"/>
       <w:bookmarkEnd w:id="21"/>
       <w:r>
         <w:rPr/>
@@ -9819,7 +9819,7 @@
         <w:pStyle w:val="Heading1"/>
         <w:rPr/>
       </w:pPr>
-      <w:bookmarkStart w:id="22" w:name="__RefHeading___Toc1996_959657298"/>
+      <w:bookmarkStart w:id="22" w:name="__RefHeading___Toc1996_934876998"/>
       <w:bookmarkEnd w:id="22"/>
       <w:r>
         <w:rPr/>
@@ -9831,7 +9831,7 @@
         <w:pStyle w:val="Heading2"/>
         <w:rPr/>
       </w:pPr>
-      <w:bookmarkStart w:id="23" w:name="__RefHeading___Toc1998_959657298"/>
+      <w:bookmarkStart w:id="23" w:name="__RefHeading___Toc1998_934876998"/>
       <w:bookmarkEnd w:id="23"/>
       <w:r>
         <w:rPr/>
@@ -9961,7 +9961,7 @@
         <w:pStyle w:val="Heading2"/>
         <w:rPr/>
       </w:pPr>
-      <w:bookmarkStart w:id="24" w:name="__RefHeading___Toc2000_959657298"/>
+      <w:bookmarkStart w:id="24" w:name="__RefHeading___Toc2000_934876998"/>
       <w:bookmarkEnd w:id="24"/>
       <w:r>
         <w:rPr/>
@@ -10657,7 +10657,7 @@
         <w:pStyle w:val="Heading1"/>
         <w:rPr/>
       </w:pPr>
-      <w:bookmarkStart w:id="25" w:name="__RefHeading___Toc2002_959657298"/>
+      <w:bookmarkStart w:id="25" w:name="__RefHeading___Toc2002_934876998"/>
       <w:bookmarkEnd w:id="25"/>
       <w:r>
         <w:rPr/>
@@ -10669,7 +10669,7 @@
         <w:pStyle w:val="Heading2"/>
         <w:rPr/>
       </w:pPr>
-      <w:bookmarkStart w:id="26" w:name="__RefHeading___Toc2004_959657298"/>
+      <w:bookmarkStart w:id="26" w:name="__RefHeading___Toc2004_934876998"/>
       <w:bookmarkEnd w:id="26"/>
       <w:r>
         <w:rPr/>
@@ -10757,7 +10757,7 @@
         <w:pStyle w:val="Heading2"/>
         <w:rPr/>
       </w:pPr>
-      <w:bookmarkStart w:id="27" w:name="__RefHeading___Toc2006_959657298"/>
+      <w:bookmarkStart w:id="27" w:name="__RefHeading___Toc2006_934876998"/>
       <w:bookmarkEnd w:id="27"/>
       <w:r>
         <w:rPr/>
@@ -11303,7 +11303,7 @@
         <w:pStyle w:val="Heading1"/>
         <w:rPr/>
       </w:pPr>
-      <w:bookmarkStart w:id="28" w:name="__RefHeading___Toc2008_959657298"/>
+      <w:bookmarkStart w:id="28" w:name="__RefHeading___Toc2008_934876998"/>
       <w:bookmarkEnd w:id="28"/>
       <w:r>
         <w:rPr/>
@@ -11762,7 +11762,7 @@
         <w:pStyle w:val="Heading2"/>
         <w:rPr/>
       </w:pPr>
-      <w:bookmarkStart w:id="29" w:name="__RefHeading___Toc2010_959657298"/>
+      <w:bookmarkStart w:id="29" w:name="__RefHeading___Toc2010_934876998"/>
       <w:bookmarkEnd w:id="29"/>
       <w:r>
         <w:rPr/>
@@ -11850,7 +11850,7 @@
         <w:pStyle w:val="Heading2"/>
         <w:rPr/>
       </w:pPr>
-      <w:bookmarkStart w:id="30" w:name="__RefHeading___Toc2012_959657298"/>
+      <w:bookmarkStart w:id="30" w:name="__RefHeading___Toc2012_934876998"/>
       <w:bookmarkEnd w:id="30"/>
       <w:r>
         <w:rPr/>
@@ -11955,7 +11955,7 @@
       </w:pPr>
       <w:r>
         <w:rPr/>
-        <w:t>Figure 32. The Append HMI Desktop launcher</w:t>
+        <w:t>Figure 32. The Append HMI Desktop launcher with LiquidWeighHMI selected</w:t>
       </w:r>
     </w:p>
     <w:p>
@@ -11963,7 +11963,7 @@
         <w:pStyle w:val="Heading2"/>
         <w:rPr/>
       </w:pPr>
-      <w:bookmarkStart w:id="31" w:name="__RefHeading___Toc2014_959657298"/>
+      <w:bookmarkStart w:id="31" w:name="__RefHeading___Toc2014_934876998"/>
       <w:bookmarkEnd w:id="31"/>
       <w:r>
         <w:rPr/>
@@ -11997,7 +11997,7 @@
       </w:r>
       <w:r>
         <w:rPr/>
-        <w:t xml:space="preserve"> button. In the browser, the view button in the corner fits the screen to the window, maximizes it, or shows it at its original size with scroll bars.</w:t>
+        <w:t xml:space="preserve"> button. If the port is already in use on the PC (by another web server, or another application being served), choose another. In the browser, the view button in the corner fits the screen to the window, maximizes it, or shows it at its original size with scroll bars.</w:t>
       </w:r>
     </w:p>
     <w:p>
@@ -12057,7 +12057,7 @@
       </w:pPr>
       <w:r>
         <w:rPr/>
-        <w:t>Figure 33. The Append HMI Web launcher with a running server</w:t>
+        <w:t>Figure 33. The Append HMI Web launcher serving LiquidWeighHMI on port 8481 to one browser</w:t>
       </w:r>
     </w:p>
     <w:p>
@@ -12071,7 +12071,7 @@
         <w:rPr/>
         <w:drawing>
           <wp:inline distT="0" distB="0" distL="0" distR="0">
-            <wp:extent cx="5943600" cy="3714750"/>
+            <wp:extent cx="5943600" cy="3343275"/>
             <wp:effectExtent l="0" t="0" r="0" b="0"/>
             <wp:docPr id="35" name="Picture 35"/>
             <wp:cNvGraphicFramePr>
@@ -12095,7 +12095,7 @@
                   <pic:spPr bwMode="auto">
                     <a:xfrm>
                       <a:off x="0" y="0"/>
-                      <a:ext cx="5943600" cy="3714750"/>
+                      <a:ext cx="5943600" cy="3343275"/>
                     </a:xfrm>
                     <a:prstGeom prst="rect">
                       <a:avLst/>
@@ -12117,7 +12117,7 @@
       </w:pPr>
       <w:r>
         <w:rPr/>
-        <w:t>Figure 34. An application in a web browser, with the view menu open</w:t>
+        <w:t>Figure 34. LiquidWeighHMI in a web browser, with the view menu open</w:t>
       </w:r>
     </w:p>
     <w:p>
@@ -12125,7 +12125,7 @@
         <w:pStyle w:val="Heading1"/>
         <w:rPr/>
       </w:pPr>
-      <w:bookmarkStart w:id="32" w:name="__RefHeading___Toc2016_959657298"/>
+      <w:bookmarkStart w:id="32" w:name="__RefHeading___Toc2016_934876998"/>
       <w:bookmarkEnd w:id="32"/>
       <w:r>
         <w:rPr/>
@@ -12659,7 +12659,7 @@
         <w:pStyle w:val="Heading1"/>
         <w:rPr/>
       </w:pPr>
-      <w:bookmarkStart w:id="33" w:name="__RefHeading___Toc2018_959657298"/>
+      <w:bookmarkStart w:id="33" w:name="__RefHeading___Toc2018_934876998"/>
       <w:bookmarkEnd w:id="33"/>
       <w:r>
         <w:rPr/>
@@ -13202,7 +13202,7 @@
       <w:rPr>
         <w:sz w:val="18"/>
       </w:rPr>
-      <w:t>36</w:t>
+      <w:t>35</w:t>
     </w:r>
     <w:r>
       <w:rPr>

</xml_diff>

<commit_message>
docs: manual describes Append HMI Web's Running list
Co-Authored-By: Claude Opus 5.5 <noreply@anthropic.com>
</commit_message>
<xml_diff>
--- a/doc/Append-HMI-Studio-User-Manual.docx
+++ b/doc/Append-HMI-Studio-User-Manual.docx
@@ -283,7 +283,7 @@
             </w:rPr>
             <w:fldChar w:fldCharType="separate"/>
           </w:r>
-          <w:hyperlink w:anchor="__RefHeading___Toc1952_934876998" w:tooltip="1 Introduction">
+          <w:hyperlink w:anchor="__RefHeading___Toc1961_669030397" w:tooltip="1 Introduction">
             <w:r>
               <w:rPr>
                 <w:rStyle w:val="IndexLink"/>
@@ -304,7 +304,7 @@
             </w:tabs>
             <w:rPr/>
           </w:pPr>
-          <w:hyperlink w:anchor="__RefHeading___Toc1954_934876998" w:tooltip="1.1 How an HMI application is organized">
+          <w:hyperlink w:anchor="__RefHeading___Toc1963_669030397" w:tooltip="1.1 How an HMI application is organized">
             <w:r>
               <w:rPr>
                 <w:rStyle w:val="IndexLink"/>
@@ -325,7 +325,7 @@
             </w:tabs>
             <w:rPr/>
           </w:pPr>
-          <w:hyperlink w:anchor="__RefHeading___Toc1956_934876998" w:tooltip="2 The Studio window">
+          <w:hyperlink w:anchor="__RefHeading___Toc1965_669030397" w:tooltip="2 The Studio window">
             <w:r>
               <w:rPr>
                 <w:rStyle w:val="IndexLink"/>
@@ -346,7 +346,7 @@
             </w:tabs>
             <w:rPr/>
           </w:pPr>
-          <w:hyperlink w:anchor="__RefHeading___Toc1958_934876998" w:tooltip="2.1 The HMI menu">
+          <w:hyperlink w:anchor="__RefHeading___Toc1967_669030397" w:tooltip="2.1 The HMI menu">
             <w:r>
               <w:rPr>
                 <w:rStyle w:val="IndexLink"/>
@@ -367,7 +367,7 @@
             </w:tabs>
             <w:rPr/>
           </w:pPr>
-          <w:hyperlink w:anchor="__RefHeading___Toc1960_934876998" w:tooltip="3 Application settings">
+          <w:hyperlink w:anchor="__RefHeading___Toc1969_669030397" w:tooltip="3 Application settings">
             <w:r>
               <w:rPr>
                 <w:rStyle w:val="IndexLink"/>
@@ -388,7 +388,7 @@
             </w:tabs>
             <w:rPr/>
           </w:pPr>
-          <w:hyperlink w:anchor="__RefHeading___Toc1962_934876998" w:tooltip="4 Devices">
+          <w:hyperlink w:anchor="__RefHeading___Toc1971_669030397" w:tooltip="4 Devices">
             <w:r>
               <w:rPr>
                 <w:rStyle w:val="IndexLink"/>
@@ -409,7 +409,7 @@
             </w:tabs>
             <w:rPr/>
           </w:pPr>
-          <w:hyperlink w:anchor="__RefHeading___Toc1964_934876998" w:tooltip="5 Tags">
+          <w:hyperlink w:anchor="__RefHeading___Toc1973_669030397" w:tooltip="5 Tags">
             <w:r>
               <w:rPr>
                 <w:rStyle w:val="IndexLink"/>
@@ -430,7 +430,7 @@
             </w:tabs>
             <w:rPr/>
           </w:pPr>
-          <w:hyperlink w:anchor="__RefHeading___Toc1966_934876998" w:tooltip="5.1 Tag fields">
+          <w:hyperlink w:anchor="__RefHeading___Toc1975_669030397" w:tooltip="5.1 Tag fields">
             <w:r>
               <w:rPr>
                 <w:rStyle w:val="IndexLink"/>
@@ -451,7 +451,7 @@
             </w:tabs>
             <w:rPr/>
           </w:pPr>
-          <w:hyperlink w:anchor="__RefHeading___Toc1968_934876998" w:tooltip="5.2 Alarms on a tag">
+          <w:hyperlink w:anchor="__RefHeading___Toc1977_669030397" w:tooltip="5.2 Alarms on a tag">
             <w:r>
               <w:rPr>
                 <w:rStyle w:val="IndexLink"/>
@@ -472,7 +472,7 @@
             </w:tabs>
             <w:rPr/>
           </w:pPr>
-          <w:hyperlink w:anchor="__RefHeading___Toc1970_934876998" w:tooltip="6 Screens and windows">
+          <w:hyperlink w:anchor="__RefHeading___Toc1979_669030397" w:tooltip="6 Screens and windows">
             <w:r>
               <w:rPr>
                 <w:rStyle w:val="IndexLink"/>
@@ -493,7 +493,7 @@
             </w:tabs>
             <w:rPr/>
           </w:pPr>
-          <w:hyperlink w:anchor="__RefHeading___Toc1972_934876998" w:tooltip="6.1 Window properties">
+          <w:hyperlink w:anchor="__RefHeading___Toc1981_669030397" w:tooltip="6.1 Window properties">
             <w:r>
               <w:rPr>
                 <w:rStyle w:val="IndexLink"/>
@@ -514,7 +514,7 @@
             </w:tabs>
             <w:rPr/>
           </w:pPr>
-          <w:hyperlink w:anchor="__RefHeading___Toc1974_934876998" w:tooltip="6.2 Navigation">
+          <w:hyperlink w:anchor="__RefHeading___Toc1983_669030397" w:tooltip="6.2 Navigation">
             <w:r>
               <w:rPr>
                 <w:rStyle w:val="IndexLink"/>
@@ -535,7 +535,7 @@
             </w:tabs>
             <w:rPr/>
           </w:pPr>
-          <w:hyperlink w:anchor="__RefHeading___Toc1976_934876998" w:tooltip="7 Drawing objects">
+          <w:hyperlink w:anchor="__RefHeading___Toc1985_669030397" w:tooltip="7 Drawing objects">
             <w:r>
               <w:rPr>
                 <w:rStyle w:val="IndexLink"/>
@@ -556,7 +556,7 @@
             </w:tabs>
             <w:rPr/>
           </w:pPr>
-          <w:hyperlink w:anchor="__RefHeading___Toc1978_934876998" w:tooltip="8 Animation links">
+          <w:hyperlink w:anchor="__RefHeading___Toc1987_669030397" w:tooltip="8 Animation links">
             <w:r>
               <w:rPr>
                 <w:rStyle w:val="IndexLink"/>
@@ -577,7 +577,7 @@
             </w:tabs>
             <w:rPr/>
           </w:pPr>
-          <w:hyperlink w:anchor="__RefHeading___Toc1980_934876998" w:tooltip="8.1 A valve: status color, fault blink and faceplate">
+          <w:hyperlink w:anchor="__RefHeading___Toc1989_669030397" w:tooltip="8.1 A valve: status color, fault blink and faceplate">
             <w:r>
               <w:rPr>
                 <w:rStyle w:val="IndexLink"/>
@@ -598,7 +598,7 @@
             </w:tabs>
             <w:rPr/>
           </w:pPr>
-          <w:hyperlink w:anchor="__RefHeading___Toc1982_934876998" w:tooltip="8.2 The weigh hopper: percent fill">
+          <w:hyperlink w:anchor="__RefHeading___Toc1991_669030397" w:tooltip="8.2 The weigh hopper: percent fill">
             <w:r>
               <w:rPr>
                 <w:rStyle w:val="IndexLink"/>
@@ -619,7 +619,7 @@
             </w:tabs>
             <w:rPr/>
           </w:pPr>
-          <w:hyperlink w:anchor="__RefHeading___Toc1984_934876998" w:tooltip="8.3 Hopper pressure: value display and alarm colors">
+          <w:hyperlink w:anchor="__RefHeading___Toc1993_669030397" w:tooltip="8.3 Hopper pressure: value display and alarm colors">
             <w:r>
               <w:rPr>
                 <w:rStyle w:val="IndexLink"/>
@@ -640,7 +640,7 @@
             </w:tabs>
             <w:rPr/>
           </w:pPr>
-          <w:hyperlink w:anchor="__RefHeading___Toc1986_934876998" w:tooltip="8.4 Setpoints: user input">
+          <w:hyperlink w:anchor="__RefHeading___Toc1995_669030397" w:tooltip="8.4 Setpoints: user input">
             <w:r>
               <w:rPr>
                 <w:rStyle w:val="IndexLink"/>
@@ -661,7 +661,7 @@
             </w:tabs>
             <w:rPr/>
           </w:pPr>
-          <w:hyperlink w:anchor="__RefHeading___Toc1988_934876998" w:tooltip="8.5 Commands: pushbutton and enable">
+          <w:hyperlink w:anchor="__RefHeading___Toc1997_669030397" w:tooltip="8.5 Commands: pushbutton and enable">
             <w:r>
               <w:rPr>
                 <w:rStyle w:val="IndexLink"/>
@@ -682,7 +682,7 @@
             </w:tabs>
             <w:rPr/>
           </w:pPr>
-          <w:hyperlink w:anchor="__RefHeading___Toc1990_934876998" w:tooltip="9 Expressions and scripts">
+          <w:hyperlink w:anchor="__RefHeading___Toc1999_669030397" w:tooltip="9 Expressions and scripts">
             <w:r>
               <w:rPr>
                 <w:rStyle w:val="IndexLink"/>
@@ -703,7 +703,7 @@
             </w:tabs>
             <w:rPr/>
           </w:pPr>
-          <w:hyperlink w:anchor="__RefHeading___Toc1992_934876998" w:tooltip="9.1 Window scripts">
+          <w:hyperlink w:anchor="__RefHeading___Toc2001_669030397" w:tooltip="9.1 Window scripts">
             <w:r>
               <w:rPr>
                 <w:rStyle w:val="IndexLink"/>
@@ -724,7 +724,7 @@
             </w:tabs>
             <w:rPr/>
           </w:pPr>
-          <w:hyperlink w:anchor="__RefHeading___Toc1994_934876998" w:tooltip="9.2 Action scripts">
+          <w:hyperlink w:anchor="__RefHeading___Toc2003_669030397" w:tooltip="9.2 Action scripts">
             <w:r>
               <w:rPr>
                 <w:rStyle w:val="IndexLink"/>
@@ -745,7 +745,7 @@
             </w:tabs>
             <w:rPr/>
           </w:pPr>
-          <w:hyperlink w:anchor="__RefHeading___Toc1996_934876998" w:tooltip="10 Alarms and security">
+          <w:hyperlink w:anchor="__RefHeading___Toc2005_669030397" w:tooltip="10 Alarms and security">
             <w:r>
               <w:rPr>
                 <w:rStyle w:val="IndexLink"/>
@@ -766,7 +766,7 @@
             </w:tabs>
             <w:rPr/>
           </w:pPr>
-          <w:hyperlink w:anchor="__RefHeading___Toc1998_934876998" w:tooltip="10.1 Alarms">
+          <w:hyperlink w:anchor="__RefHeading___Toc2007_669030397" w:tooltip="10.1 Alarms">
             <w:r>
               <w:rPr>
                 <w:rStyle w:val="IndexLink"/>
@@ -787,7 +787,7 @@
             </w:tabs>
             <w:rPr/>
           </w:pPr>
-          <w:hyperlink w:anchor="__RefHeading___Toc2000_934876998" w:tooltip="10.2 Users and access levels">
+          <w:hyperlink w:anchor="__RefHeading___Toc2009_669030397" w:tooltip="10.2 Users and access levels">
             <w:r>
               <w:rPr>
                 <w:rStyle w:val="IndexLink"/>
@@ -808,7 +808,7 @@
             </w:tabs>
             <w:rPr/>
           </w:pPr>
-          <w:hyperlink w:anchor="__RefHeading___Toc2002_934876998" w:tooltip="11 Testing">
+          <w:hyperlink w:anchor="__RefHeading___Toc2011_669030397" w:tooltip="11 Testing">
             <w:r>
               <w:rPr>
                 <w:rStyle w:val="IndexLink"/>
@@ -829,7 +829,7 @@
             </w:tabs>
             <w:rPr/>
           </w:pPr>
-          <w:hyperlink w:anchor="__RefHeading___Toc2004_934876998" w:tooltip="11.1 Validate">
+          <w:hyperlink w:anchor="__RefHeading___Toc2013_669030397" w:tooltip="11.1 Validate">
             <w:r>
               <w:rPr>
                 <w:rStyle w:val="IndexLink"/>
@@ -850,7 +850,7 @@
             </w:tabs>
             <w:rPr/>
           </w:pPr>
-          <w:hyperlink w:anchor="__RefHeading___Toc2006_934876998" w:tooltip="11.2 Run">
+          <w:hyperlink w:anchor="__RefHeading___Toc2015_669030397" w:tooltip="11.2 Run">
             <w:r>
               <w:rPr>
                 <w:rStyle w:val="IndexLink"/>
@@ -871,7 +871,7 @@
             </w:tabs>
             <w:rPr/>
           </w:pPr>
-          <w:hyperlink w:anchor="__RefHeading___Toc2008_934876998" w:tooltip="12 Deploying">
+          <w:hyperlink w:anchor="__RefHeading___Toc2017_669030397" w:tooltip="12 Deploying">
             <w:r>
               <w:rPr>
                 <w:rStyle w:val="IndexLink"/>
@@ -892,7 +892,7 @@
             </w:tabs>
             <w:rPr/>
           </w:pPr>
-          <w:hyperlink w:anchor="__RefHeading___Toc2010_934876998" w:tooltip="12.1 Publish">
+          <w:hyperlink w:anchor="__RefHeading___Toc2019_669030397" w:tooltip="12.1 Publish">
             <w:r>
               <w:rPr>
                 <w:rStyle w:val="IndexLink"/>
@@ -913,7 +913,7 @@
             </w:tabs>
             <w:rPr/>
           </w:pPr>
-          <w:hyperlink w:anchor="__RefHeading___Toc2012_934876998" w:tooltip="12.2 Append HMI Desktop">
+          <w:hyperlink w:anchor="__RefHeading___Toc2021_669030397" w:tooltip="12.2 Append HMI Desktop">
             <w:r>
               <w:rPr>
                 <w:rStyle w:val="IndexLink"/>
@@ -934,7 +934,7 @@
             </w:tabs>
             <w:rPr/>
           </w:pPr>
-          <w:hyperlink w:anchor="__RefHeading___Toc2014_934876998" w:tooltip="12.3 Append HMI Web">
+          <w:hyperlink w:anchor="__RefHeading___Toc2023_669030397" w:tooltip="12.3 Append HMI Web">
             <w:r>
               <w:rPr>
                 <w:rStyle w:val="IndexLink"/>
@@ -955,7 +955,7 @@
             </w:tabs>
             <w:rPr/>
           </w:pPr>
-          <w:hyperlink w:anchor="__RefHeading___Toc2016_934876998" w:tooltip="13 Tips and troubleshooting">
+          <w:hyperlink w:anchor="__RefHeading___Toc2025_669030397" w:tooltip="13 Tips and troubleshooting">
             <w:r>
               <w:rPr>
                 <w:rStyle w:val="IndexLink"/>
@@ -976,7 +976,7 @@
             </w:tabs>
             <w:rPr/>
           </w:pPr>
-          <w:hyperlink w:anchor="__RefHeading___Toc2018_934876998" w:tooltip="Appendix A Command-line automation">
+          <w:hyperlink w:anchor="__RefHeading___Toc2027_669030397" w:tooltip="Appendix A Command-line automation">
             <w:r>
               <w:rPr>
                 <w:rStyle w:val="IndexLink"/>
@@ -984,7 +984,7 @@
               </w:rPr>
               <w:t>Appendix A Command-line automation</w:t>
               <w:tab/>
-              <w:t>35</w:t>
+              <w:t>36</w:t>
             </w:r>
           </w:hyperlink>
           <w:r>
@@ -1014,7 +1014,7 @@
         <w:spacing w:before="0" w:after="0"/>
         <w:rPr/>
       </w:pPr>
-      <w:bookmarkStart w:id="0" w:name="__RefHeading___Toc1952_934876998"/>
+      <w:bookmarkStart w:id="0" w:name="__RefHeading___Toc1961_669030397"/>
       <w:bookmarkEnd w:id="0"/>
       <w:r>
         <w:rPr/>
@@ -1656,7 +1656,7 @@
         <w:pStyle w:val="Heading2"/>
         <w:rPr/>
       </w:pPr>
-      <w:bookmarkStart w:id="1" w:name="__RefHeading___Toc1954_934876998"/>
+      <w:bookmarkStart w:id="1" w:name="__RefHeading___Toc1963_669030397"/>
       <w:bookmarkEnd w:id="1"/>
       <w:r>
         <w:rPr/>
@@ -1799,7 +1799,7 @@
         <w:pStyle w:val="Heading1"/>
         <w:rPr/>
       </w:pPr>
-      <w:bookmarkStart w:id="2" w:name="__RefHeading___Toc1956_934876998"/>
+      <w:bookmarkStart w:id="2" w:name="__RefHeading___Toc1965_669030397"/>
       <w:bookmarkEnd w:id="2"/>
       <w:r>
         <w:rPr/>
@@ -2383,7 +2383,7 @@
         <w:pStyle w:val="Heading2"/>
         <w:rPr/>
       </w:pPr>
-      <w:bookmarkStart w:id="3" w:name="__RefHeading___Toc1958_934876998"/>
+      <w:bookmarkStart w:id="3" w:name="__RefHeading___Toc1967_669030397"/>
       <w:bookmarkEnd w:id="3"/>
       <w:r>
         <w:rPr/>
@@ -3302,7 +3302,7 @@
         <w:pStyle w:val="Heading1"/>
         <w:rPr/>
       </w:pPr>
-      <w:bookmarkStart w:id="4" w:name="__RefHeading___Toc1960_934876998"/>
+      <w:bookmarkStart w:id="4" w:name="__RefHeading___Toc1969_669030397"/>
       <w:bookmarkEnd w:id="4"/>
       <w:r>
         <w:rPr/>
@@ -3584,7 +3584,7 @@
         <w:pStyle w:val="Heading1"/>
         <w:rPr/>
       </w:pPr>
-      <w:bookmarkStart w:id="5" w:name="__RefHeading___Toc1962_934876998"/>
+      <w:bookmarkStart w:id="5" w:name="__RefHeading___Toc1971_669030397"/>
       <w:bookmarkEnd w:id="5"/>
       <w:r>
         <w:rPr/>
@@ -4387,7 +4387,7 @@
         <w:pStyle w:val="Heading1"/>
         <w:rPr/>
       </w:pPr>
-      <w:bookmarkStart w:id="6" w:name="__RefHeading___Toc1964_934876998"/>
+      <w:bookmarkStart w:id="6" w:name="__RefHeading___Toc1973_669030397"/>
       <w:bookmarkEnd w:id="6"/>
       <w:r>
         <w:rPr/>
@@ -5132,7 +5132,7 @@
         <w:pStyle w:val="Heading2"/>
         <w:rPr/>
       </w:pPr>
-      <w:bookmarkStart w:id="7" w:name="__RefHeading___Toc1966_934876998"/>
+      <w:bookmarkStart w:id="7" w:name="__RefHeading___Toc1975_669030397"/>
       <w:bookmarkEnd w:id="7"/>
       <w:r>
         <w:rPr/>
@@ -5790,7 +5790,7 @@
         <w:pStyle w:val="Heading2"/>
         <w:rPr/>
       </w:pPr>
-      <w:bookmarkStart w:id="8" w:name="__RefHeading___Toc1968_934876998"/>
+      <w:bookmarkStart w:id="8" w:name="__RefHeading___Toc1977_669030397"/>
       <w:bookmarkEnd w:id="8"/>
       <w:r>
         <w:rPr/>
@@ -5922,7 +5922,7 @@
         <w:pStyle w:val="Heading1"/>
         <w:rPr/>
       </w:pPr>
-      <w:bookmarkStart w:id="9" w:name="__RefHeading___Toc1970_934876998"/>
+      <w:bookmarkStart w:id="9" w:name="__RefHeading___Toc1979_669030397"/>
       <w:bookmarkEnd w:id="9"/>
       <w:r>
         <w:rPr/>
@@ -6441,7 +6441,7 @@
         <w:pStyle w:val="Heading2"/>
         <w:rPr/>
       </w:pPr>
-      <w:bookmarkStart w:id="10" w:name="__RefHeading___Toc1972_934876998"/>
+      <w:bookmarkStart w:id="10" w:name="__RefHeading___Toc1981_669030397"/>
       <w:bookmarkEnd w:id="10"/>
       <w:r>
         <w:rPr/>
@@ -6603,7 +6603,7 @@
         <w:pStyle w:val="Heading2"/>
         <w:rPr/>
       </w:pPr>
-      <w:bookmarkStart w:id="11" w:name="__RefHeading___Toc1974_934876998"/>
+      <w:bookmarkStart w:id="11" w:name="__RefHeading___Toc1983_669030397"/>
       <w:bookmarkEnd w:id="11"/>
       <w:r>
         <w:rPr/>
@@ -6645,7 +6645,7 @@
         <w:pStyle w:val="Heading1"/>
         <w:rPr/>
       </w:pPr>
-      <w:bookmarkStart w:id="12" w:name="__RefHeading___Toc1976_934876998"/>
+      <w:bookmarkStart w:id="12" w:name="__RefHeading___Toc1985_669030397"/>
       <w:bookmarkEnd w:id="12"/>
       <w:r>
         <w:rPr/>
@@ -6851,7 +6851,7 @@
         <w:pStyle w:val="Heading1"/>
         <w:rPr/>
       </w:pPr>
-      <w:bookmarkStart w:id="13" w:name="__RefHeading___Toc1978_934876998"/>
+      <w:bookmarkStart w:id="13" w:name="__RefHeading___Toc1987_669030397"/>
       <w:bookmarkEnd w:id="13"/>
       <w:r>
         <w:rPr/>
@@ -7586,7 +7586,7 @@
         <w:pStyle w:val="Heading2"/>
         <w:rPr/>
       </w:pPr>
-      <w:bookmarkStart w:id="14" w:name="__RefHeading___Toc1980_934876998"/>
+      <w:bookmarkStart w:id="14" w:name="__RefHeading___Toc1989_669030397"/>
       <w:bookmarkEnd w:id="14"/>
       <w:r>
         <w:rPr/>
@@ -7750,7 +7750,7 @@
         <w:pStyle w:val="Heading2"/>
         <w:rPr/>
       </w:pPr>
-      <w:bookmarkStart w:id="15" w:name="__RefHeading___Toc1982_934876998"/>
+      <w:bookmarkStart w:id="15" w:name="__RefHeading___Toc1991_669030397"/>
       <w:bookmarkEnd w:id="15"/>
       <w:r>
         <w:rPr/>
@@ -7871,7 +7871,7 @@
         <w:pStyle w:val="Heading2"/>
         <w:rPr/>
       </w:pPr>
-      <w:bookmarkStart w:id="16" w:name="__RefHeading___Toc1984_934876998"/>
+      <w:bookmarkStart w:id="16" w:name="__RefHeading___Toc1993_669030397"/>
       <w:bookmarkEnd w:id="16"/>
       <w:r>
         <w:rPr/>
@@ -7984,7 +7984,7 @@
         <w:pStyle w:val="Heading2"/>
         <w:rPr/>
       </w:pPr>
-      <w:bookmarkStart w:id="17" w:name="__RefHeading___Toc1986_934876998"/>
+      <w:bookmarkStart w:id="17" w:name="__RefHeading___Toc1995_669030397"/>
       <w:bookmarkEnd w:id="17"/>
       <w:r>
         <w:rPr/>
@@ -8097,7 +8097,7 @@
         <w:pStyle w:val="Heading2"/>
         <w:rPr/>
       </w:pPr>
-      <w:bookmarkStart w:id="18" w:name="__RefHeading___Toc1988_934876998"/>
+      <w:bookmarkStart w:id="18" w:name="__RefHeading___Toc1997_669030397"/>
       <w:bookmarkEnd w:id="18"/>
       <w:r>
         <w:rPr/>
@@ -8610,7 +8610,7 @@
         <w:pStyle w:val="Heading1"/>
         <w:rPr/>
       </w:pPr>
-      <w:bookmarkStart w:id="19" w:name="__RefHeading___Toc1990_934876998"/>
+      <w:bookmarkStart w:id="19" w:name="__RefHeading___Toc1999_669030397"/>
       <w:bookmarkEnd w:id="19"/>
       <w:r>
         <w:rPr/>
@@ -9522,7 +9522,7 @@
         <w:pStyle w:val="Heading2"/>
         <w:rPr/>
       </w:pPr>
-      <w:bookmarkStart w:id="20" w:name="__RefHeading___Toc1992_934876998"/>
+      <w:bookmarkStart w:id="20" w:name="__RefHeading___Toc2001_669030397"/>
       <w:bookmarkEnd w:id="20"/>
       <w:r>
         <w:rPr/>
@@ -9703,7 +9703,7 @@
         <w:pStyle w:val="Heading2"/>
         <w:rPr/>
       </w:pPr>
-      <w:bookmarkStart w:id="21" w:name="__RefHeading___Toc1994_934876998"/>
+      <w:bookmarkStart w:id="21" w:name="__RefHeading___Toc2003_669030397"/>
       <w:bookmarkEnd w:id="21"/>
       <w:r>
         <w:rPr/>
@@ -9819,7 +9819,7 @@
         <w:pStyle w:val="Heading1"/>
         <w:rPr/>
       </w:pPr>
-      <w:bookmarkStart w:id="22" w:name="__RefHeading___Toc1996_934876998"/>
+      <w:bookmarkStart w:id="22" w:name="__RefHeading___Toc2005_669030397"/>
       <w:bookmarkEnd w:id="22"/>
       <w:r>
         <w:rPr/>
@@ -9831,7 +9831,7 @@
         <w:pStyle w:val="Heading2"/>
         <w:rPr/>
       </w:pPr>
-      <w:bookmarkStart w:id="23" w:name="__RefHeading___Toc1998_934876998"/>
+      <w:bookmarkStart w:id="23" w:name="__RefHeading___Toc2007_669030397"/>
       <w:bookmarkEnd w:id="23"/>
       <w:r>
         <w:rPr/>
@@ -9961,7 +9961,7 @@
         <w:pStyle w:val="Heading2"/>
         <w:rPr/>
       </w:pPr>
-      <w:bookmarkStart w:id="24" w:name="__RefHeading___Toc2000_934876998"/>
+      <w:bookmarkStart w:id="24" w:name="__RefHeading___Toc2009_669030397"/>
       <w:bookmarkEnd w:id="24"/>
       <w:r>
         <w:rPr/>
@@ -10657,7 +10657,7 @@
         <w:pStyle w:val="Heading1"/>
         <w:rPr/>
       </w:pPr>
-      <w:bookmarkStart w:id="25" w:name="__RefHeading___Toc2002_934876998"/>
+      <w:bookmarkStart w:id="25" w:name="__RefHeading___Toc2011_669030397"/>
       <w:bookmarkEnd w:id="25"/>
       <w:r>
         <w:rPr/>
@@ -10669,7 +10669,7 @@
         <w:pStyle w:val="Heading2"/>
         <w:rPr/>
       </w:pPr>
-      <w:bookmarkStart w:id="26" w:name="__RefHeading___Toc2004_934876998"/>
+      <w:bookmarkStart w:id="26" w:name="__RefHeading___Toc2013_669030397"/>
       <w:bookmarkEnd w:id="26"/>
       <w:r>
         <w:rPr/>
@@ -10757,7 +10757,7 @@
         <w:pStyle w:val="Heading2"/>
         <w:rPr/>
       </w:pPr>
-      <w:bookmarkStart w:id="27" w:name="__RefHeading___Toc2006_934876998"/>
+      <w:bookmarkStart w:id="27" w:name="__RefHeading___Toc2015_669030397"/>
       <w:bookmarkEnd w:id="27"/>
       <w:r>
         <w:rPr/>
@@ -11303,7 +11303,7 @@
         <w:pStyle w:val="Heading1"/>
         <w:rPr/>
       </w:pPr>
-      <w:bookmarkStart w:id="28" w:name="__RefHeading___Toc2008_934876998"/>
+      <w:bookmarkStart w:id="28" w:name="__RefHeading___Toc2017_669030397"/>
       <w:bookmarkEnd w:id="28"/>
       <w:r>
         <w:rPr/>
@@ -11762,7 +11762,7 @@
         <w:pStyle w:val="Heading2"/>
         <w:rPr/>
       </w:pPr>
-      <w:bookmarkStart w:id="29" w:name="__RefHeading___Toc2010_934876998"/>
+      <w:bookmarkStart w:id="29" w:name="__RefHeading___Toc2019_669030397"/>
       <w:bookmarkEnd w:id="29"/>
       <w:r>
         <w:rPr/>
@@ -11850,7 +11850,7 @@
         <w:pStyle w:val="Heading2"/>
         <w:rPr/>
       </w:pPr>
-      <w:bookmarkStart w:id="30" w:name="__RefHeading___Toc2012_934876998"/>
+      <w:bookmarkStart w:id="30" w:name="__RefHeading___Toc2021_669030397"/>
       <w:bookmarkEnd w:id="30"/>
       <w:r>
         <w:rPr/>
@@ -11963,7 +11963,7 @@
         <w:pStyle w:val="Heading2"/>
         <w:rPr/>
       </w:pPr>
-      <w:bookmarkStart w:id="31" w:name="__RefHeading___Toc2014_934876998"/>
+      <w:bookmarkStart w:id="31" w:name="__RefHeading___Toc2023_669030397"/>
       <w:bookmarkEnd w:id="31"/>
       <w:r>
         <w:rPr/>
@@ -12003,6 +12003,57 @@
     <w:p>
       <w:pPr>
         <w:pStyle w:val="Normal"/>
+        <w:rPr/>
+      </w:pPr>
+      <w:r>
+        <w:rPr/>
+        <w:t xml:space="preserve">The </w:t>
+      </w:r>
+      <w:r>
+        <w:rPr>
+          <w:b/>
+        </w:rPr>
+        <w:t>Running</w:t>
+      </w:r>
+      <w:r>
+        <w:rPr/>
+        <w:t xml:space="preserve"> list shows every Append HMI Web server on the PC, including ones started in the background from the command line (</w:t>
+      </w:r>
+      <w:r>
+        <w:rPr>
+          <w:rFonts w:ascii="Consolas" w:hAnsi="Consolas"/>
+          <w:sz w:val="20"/>
+        </w:rPr>
+        <w:t>--headless</w:t>
+      </w:r>
+      <w:r>
+        <w:rPr/>
+        <w:t xml:space="preserve">). Each has </w:t>
+      </w:r>
+      <w:r>
+        <w:rPr>
+          <w:b/>
+        </w:rPr>
+        <w:t>Restart</w:t>
+      </w:r>
+      <w:r>
+        <w:rPr/>
+        <w:t xml:space="preserve">, which starts it again with the same settings and reads the project file afresh (do this after saving changes in Studio; browsers reload by themselves), and </w:t>
+      </w:r>
+      <w:r>
+        <w:rPr>
+          <w:b/>
+        </w:rPr>
+        <w:t>Stop</w:t>
+      </w:r>
+      <w:r>
+        <w:rPr/>
+        <w:t>.</w:t>
+      </w:r>
+    </w:p>
+    <w:p>
+      <w:pPr>
+        <w:pStyle w:val="Normal"/>
         <w:keepNext w:val="true"/>
         <w:jc w:val="center"/>
         <w:rPr/>
@@ -12011,7 +12062,7 @@
         <w:rPr/>
         <w:drawing>
           <wp:inline distT="0" distB="0" distL="0" distR="0">
-            <wp:extent cx="3840480" cy="4066540"/>
+            <wp:extent cx="3840480" cy="4291965"/>
             <wp:effectExtent l="0" t="0" r="0" b="0"/>
             <wp:docPr id="34" name="Picture 34"/>
             <wp:cNvGraphicFramePr>
@@ -12035,7 +12086,7 @@
                   <pic:spPr bwMode="auto">
                     <a:xfrm>
                       <a:off x="0" y="0"/>
-                      <a:ext cx="3840480" cy="4066540"/>
+                      <a:ext cx="3840480" cy="4291965"/>
                     </a:xfrm>
                     <a:prstGeom prst="rect">
                       <a:avLst/>
@@ -12057,7 +12108,7 @@
       </w:pPr>
       <w:r>
         <w:rPr/>
-        <w:t>Figure 33. The Append HMI Web launcher serving LiquidWeighHMI on port 8481 to one browser</w:t>
+        <w:t>Figure 33. The Append HMI Web launcher: LiquidWeighHMI served on port 8481 to one browser, and a second application running in the background</w:t>
       </w:r>
     </w:p>
     <w:p>
@@ -12125,7 +12176,7 @@
         <w:pStyle w:val="Heading1"/>
         <w:rPr/>
       </w:pPr>
-      <w:bookmarkStart w:id="32" w:name="__RefHeading___Toc2016_934876998"/>
+      <w:bookmarkStart w:id="32" w:name="__RefHeading___Toc2025_669030397"/>
       <w:bookmarkEnd w:id="32"/>
       <w:r>
         <w:rPr/>
@@ -12659,7 +12710,7 @@
         <w:pStyle w:val="Heading1"/>
         <w:rPr/>
       </w:pPr>
-      <w:bookmarkStart w:id="33" w:name="__RefHeading___Toc2018_934876998"/>
+      <w:bookmarkStart w:id="33" w:name="__RefHeading___Toc2027_669030397"/>
       <w:bookmarkEnd w:id="33"/>
       <w:r>
         <w:rPr/>
@@ -13202,7 +13253,7 @@
       <w:rPr>
         <w:sz w:val="18"/>
       </w:rPr>
-      <w:t>35</w:t>
+      <w:t>36</w:t>
     </w:r>
     <w:r>
       <w:rPr>

</xml_diff>

<commit_message>
feat(indirect): indirect tags — docs, manual, skill
doc/HMI_INDIRECT.md, the automation reference, README, CLAUDE.md and the
append-hmi-studio skill; the User Manual lists the indirect types and
LinkIndirectTag.

Co-Authored-By: Claude Opus 5.5 <noreply@anthropic.com>
</commit_message>
<xml_diff>
--- a/doc/Append-HMI-Studio-User-Manual.docx
+++ b/doc/Append-HMI-Studio-User-Manual.docx
@@ -283,7 +283,7 @@
             </w:rPr>
             <w:fldChar w:fldCharType="separate"/>
           </w:r>
-          <w:hyperlink w:anchor="__RefHeading___Toc3455_1956587008" w:tooltip="1 Introduction">
+          <w:hyperlink w:anchor="__RefHeading___Toc3523_820669520" w:tooltip="1 Introduction">
             <w:r>
               <w:rPr>
                 <w:rStyle w:val="IndexLink"/>
@@ -304,7 +304,7 @@
             </w:tabs>
             <w:rPr/>
           </w:pPr>
-          <w:hyperlink w:anchor="__RefHeading___Toc3457_1956587008" w:tooltip="1.1 How an HMI application is organized">
+          <w:hyperlink w:anchor="__RefHeading___Toc3525_820669520" w:tooltip="1.1 How an HMI application is organized">
             <w:r>
               <w:rPr>
                 <w:rStyle w:val="IndexLink"/>
@@ -325,7 +325,7 @@
             </w:tabs>
             <w:rPr/>
           </w:pPr>
-          <w:hyperlink w:anchor="__RefHeading___Toc3459_1956587008" w:tooltip="2 The Studio window">
+          <w:hyperlink w:anchor="__RefHeading___Toc3527_820669520" w:tooltip="2 The Studio window">
             <w:r>
               <w:rPr>
                 <w:rStyle w:val="IndexLink"/>
@@ -346,7 +346,7 @@
             </w:tabs>
             <w:rPr/>
           </w:pPr>
-          <w:hyperlink w:anchor="__RefHeading___Toc3461_1956587008" w:tooltip="2.1 The HMI menu">
+          <w:hyperlink w:anchor="__RefHeading___Toc3529_820669520" w:tooltip="2.1 The HMI menu">
             <w:r>
               <w:rPr>
                 <w:rStyle w:val="IndexLink"/>
@@ -367,7 +367,7 @@
             </w:tabs>
             <w:rPr/>
           </w:pPr>
-          <w:hyperlink w:anchor="__RefHeading___Toc3463_1956587008" w:tooltip="3 Application settings">
+          <w:hyperlink w:anchor="__RefHeading___Toc3531_820669520" w:tooltip="3 Application settings">
             <w:r>
               <w:rPr>
                 <w:rStyle w:val="IndexLink"/>
@@ -388,7 +388,7 @@
             </w:tabs>
             <w:rPr/>
           </w:pPr>
-          <w:hyperlink w:anchor="__RefHeading___Toc3465_1956587008" w:tooltip="4 Devices">
+          <w:hyperlink w:anchor="__RefHeading___Toc3533_820669520" w:tooltip="4 Devices">
             <w:r>
               <w:rPr>
                 <w:rStyle w:val="IndexLink"/>
@@ -409,7 +409,7 @@
             </w:tabs>
             <w:rPr/>
           </w:pPr>
-          <w:hyperlink w:anchor="__RefHeading___Toc3467_1956587008" w:tooltip="5 Tags">
+          <w:hyperlink w:anchor="__RefHeading___Toc3535_820669520" w:tooltip="5 Tags">
             <w:r>
               <w:rPr>
                 <w:rStyle w:val="IndexLink"/>
@@ -430,7 +430,7 @@
             </w:tabs>
             <w:rPr/>
           </w:pPr>
-          <w:hyperlink w:anchor="__RefHeading___Toc3469_1956587008" w:tooltip="5.1 Tag fields">
+          <w:hyperlink w:anchor="__RefHeading___Toc3537_820669520" w:tooltip="5.1 Tag fields">
             <w:r>
               <w:rPr>
                 <w:rStyle w:val="IndexLink"/>
@@ -451,7 +451,7 @@
             </w:tabs>
             <w:rPr/>
           </w:pPr>
-          <w:hyperlink w:anchor="__RefHeading___Toc3471_1956587008" w:tooltip="5.2 Alarms on a tag">
+          <w:hyperlink w:anchor="__RefHeading___Toc3539_820669520" w:tooltip="5.2 Alarms on a tag">
             <w:r>
               <w:rPr>
                 <w:rStyle w:val="IndexLink"/>
@@ -472,7 +472,7 @@
             </w:tabs>
             <w:rPr/>
           </w:pPr>
-          <w:hyperlink w:anchor="__RefHeading___Toc3473_1956587008" w:tooltip="6 Screens and windows">
+          <w:hyperlink w:anchor="__RefHeading___Toc3541_820669520" w:tooltip="6 Screens and windows">
             <w:r>
               <w:rPr>
                 <w:rStyle w:val="IndexLink"/>
@@ -493,7 +493,7 @@
             </w:tabs>
             <w:rPr/>
           </w:pPr>
-          <w:hyperlink w:anchor="__RefHeading___Toc3475_1956587008" w:tooltip="6.1 Window properties">
+          <w:hyperlink w:anchor="__RefHeading___Toc3543_820669520" w:tooltip="6.1 Window properties">
             <w:r>
               <w:rPr>
                 <w:rStyle w:val="IndexLink"/>
@@ -514,7 +514,7 @@
             </w:tabs>
             <w:rPr/>
           </w:pPr>
-          <w:hyperlink w:anchor="__RefHeading___Toc3477_1956587008" w:tooltip="6.2 Navigation">
+          <w:hyperlink w:anchor="__RefHeading___Toc3545_820669520" w:tooltip="6.2 Navigation">
             <w:r>
               <w:rPr>
                 <w:rStyle w:val="IndexLink"/>
@@ -535,7 +535,7 @@
             </w:tabs>
             <w:rPr/>
           </w:pPr>
-          <w:hyperlink w:anchor="__RefHeading___Toc3479_1956587008" w:tooltip="7 Drawing objects">
+          <w:hyperlink w:anchor="__RefHeading___Toc3547_820669520" w:tooltip="7 Drawing objects">
             <w:r>
               <w:rPr>
                 <w:rStyle w:val="IndexLink"/>
@@ -556,7 +556,7 @@
             </w:tabs>
             <w:rPr/>
           </w:pPr>
-          <w:hyperlink w:anchor="__RefHeading___Toc3481_1956587008" w:tooltip="8 Animation links">
+          <w:hyperlink w:anchor="__RefHeading___Toc3549_820669520" w:tooltip="8 Animation links">
             <w:r>
               <w:rPr>
                 <w:rStyle w:val="IndexLink"/>
@@ -577,7 +577,7 @@
             </w:tabs>
             <w:rPr/>
           </w:pPr>
-          <w:hyperlink w:anchor="__RefHeading___Toc3483_1956587008" w:tooltip="8.1 A valve: status color, fault blink and faceplate">
+          <w:hyperlink w:anchor="__RefHeading___Toc3551_820669520" w:tooltip="8.1 A valve: status color, fault blink and faceplate">
             <w:r>
               <w:rPr>
                 <w:rStyle w:val="IndexLink"/>
@@ -598,7 +598,7 @@
             </w:tabs>
             <w:rPr/>
           </w:pPr>
-          <w:hyperlink w:anchor="__RefHeading___Toc3485_1956587008" w:tooltip="8.2 The weigh hopper: percent fill">
+          <w:hyperlink w:anchor="__RefHeading___Toc3553_820669520" w:tooltip="8.2 The weigh hopper: percent fill">
             <w:r>
               <w:rPr>
                 <w:rStyle w:val="IndexLink"/>
@@ -619,7 +619,7 @@
             </w:tabs>
             <w:rPr/>
           </w:pPr>
-          <w:hyperlink w:anchor="__RefHeading___Toc3487_1956587008" w:tooltip="8.3 Hopper pressure: value display and alarm colors">
+          <w:hyperlink w:anchor="__RefHeading___Toc3555_820669520" w:tooltip="8.3 Hopper pressure: value display and alarm colors">
             <w:r>
               <w:rPr>
                 <w:rStyle w:val="IndexLink"/>
@@ -640,7 +640,7 @@
             </w:tabs>
             <w:rPr/>
           </w:pPr>
-          <w:hyperlink w:anchor="__RefHeading___Toc3489_1956587008" w:tooltip="8.4 Setpoints: user input">
+          <w:hyperlink w:anchor="__RefHeading___Toc3557_820669520" w:tooltip="8.4 Setpoints: user input">
             <w:r>
               <w:rPr>
                 <w:rStyle w:val="IndexLink"/>
@@ -661,7 +661,7 @@
             </w:tabs>
             <w:rPr/>
           </w:pPr>
-          <w:hyperlink w:anchor="__RefHeading___Toc3491_1956587008" w:tooltip="8.5 Commands: pushbutton and enable">
+          <w:hyperlink w:anchor="__RefHeading___Toc3559_820669520" w:tooltip="8.5 Commands: pushbutton and enable">
             <w:r>
               <w:rPr>
                 <w:rStyle w:val="IndexLink"/>
@@ -682,7 +682,7 @@
             </w:tabs>
             <w:rPr/>
           </w:pPr>
-          <w:hyperlink w:anchor="__RefHeading___Toc3493_1956587008" w:tooltip="9 Expressions and scripts">
+          <w:hyperlink w:anchor="__RefHeading___Toc3561_820669520" w:tooltip="9 Expressions and scripts">
             <w:r>
               <w:rPr>
                 <w:rStyle w:val="IndexLink"/>
@@ -703,7 +703,7 @@
             </w:tabs>
             <w:rPr/>
           </w:pPr>
-          <w:hyperlink w:anchor="__RefHeading___Toc3495_1956587008" w:tooltip="9.1 Window scripts">
+          <w:hyperlink w:anchor="__RefHeading___Toc3563_820669520" w:tooltip="9.1 Window scripts">
             <w:r>
               <w:rPr>
                 <w:rStyle w:val="IndexLink"/>
@@ -724,7 +724,7 @@
             </w:tabs>
             <w:rPr/>
           </w:pPr>
-          <w:hyperlink w:anchor="__RefHeading___Toc3497_1956587008" w:tooltip="9.2 Action scripts">
+          <w:hyperlink w:anchor="__RefHeading___Toc3565_820669520" w:tooltip="9.2 Action scripts">
             <w:r>
               <w:rPr>
                 <w:rStyle w:val="IndexLink"/>
@@ -745,7 +745,7 @@
             </w:tabs>
             <w:rPr/>
           </w:pPr>
-          <w:hyperlink w:anchor="__RefHeading___Toc3499_1956587008" w:tooltip="9.3 Function reference">
+          <w:hyperlink w:anchor="__RefHeading___Toc3567_820669520" w:tooltip="9.3 Function reference">
             <w:r>
               <w:rPr>
                 <w:rStyle w:val="IndexLink"/>
@@ -766,7 +766,7 @@
             </w:tabs>
             <w:rPr/>
           </w:pPr>
-          <w:hyperlink w:anchor="__RefHeading___Toc3501_1956587008" w:tooltip="10 Alarms and security">
+          <w:hyperlink w:anchor="__RefHeading___Toc3569_820669520" w:tooltip="10 Alarms and security">
             <w:r>
               <w:rPr>
                 <w:rStyle w:val="IndexLink"/>
@@ -787,7 +787,7 @@
             </w:tabs>
             <w:rPr/>
           </w:pPr>
-          <w:hyperlink w:anchor="__RefHeading___Toc3503_1956587008" w:tooltip="10.1 Alarms">
+          <w:hyperlink w:anchor="__RefHeading___Toc3571_820669520" w:tooltip="10.1 Alarms">
             <w:r>
               <w:rPr>
                 <w:rStyle w:val="IndexLink"/>
@@ -808,7 +808,7 @@
             </w:tabs>
             <w:rPr/>
           </w:pPr>
-          <w:hyperlink w:anchor="__RefHeading___Toc3505_1956587008" w:tooltip="10.2 Users and access levels">
+          <w:hyperlink w:anchor="__RefHeading___Toc3573_820669520" w:tooltip="10.2 Users and access levels">
             <w:r>
               <w:rPr>
                 <w:rStyle w:val="IndexLink"/>
@@ -816,7 +816,7 @@
               </w:rPr>
               <w:t>10.2 Users and access levels</w:t>
               <w:tab/>
-              <w:t>28</w:t>
+              <w:t>29</w:t>
             </w:r>
           </w:hyperlink>
         </w:p>
@@ -829,7 +829,7 @@
             </w:tabs>
             <w:rPr/>
           </w:pPr>
-          <w:hyperlink w:anchor="__RefHeading___Toc3507_1956587008" w:tooltip="11 Recipes">
+          <w:hyperlink w:anchor="__RefHeading___Toc3575_820669520" w:tooltip="11 Recipes">
             <w:r>
               <w:rPr>
                 <w:rStyle w:val="IndexLink"/>
@@ -850,7 +850,7 @@
             </w:tabs>
             <w:rPr/>
           </w:pPr>
-          <w:hyperlink w:anchor="__RefHeading___Toc3509_1956587008" w:tooltip="11.1 Recipe books">
+          <w:hyperlink w:anchor="__RefHeading___Toc3577_820669520" w:tooltip="11.1 Recipe books">
             <w:r>
               <w:rPr>
                 <w:rStyle w:val="IndexLink"/>
@@ -858,7 +858,7 @@
               </w:rPr>
               <w:t>11.1 Recipe books</w:t>
               <w:tab/>
-              <w:t>31</w:t>
+              <w:t>30</w:t>
             </w:r>
           </w:hyperlink>
         </w:p>
@@ -871,7 +871,7 @@
             </w:tabs>
             <w:rPr/>
           </w:pPr>
-          <w:hyperlink w:anchor="__RefHeading___Toc3511_1956587008" w:tooltip="11.2 The Recipes screen">
+          <w:hyperlink w:anchor="__RefHeading___Toc3579_820669520" w:tooltip="11.2 The Recipes screen">
             <w:r>
               <w:rPr>
                 <w:rStyle w:val="IndexLink"/>
@@ -892,7 +892,7 @@
             </w:tabs>
             <w:rPr/>
           </w:pPr>
-          <w:hyperlink w:anchor="__RefHeading___Toc3513_1956587008" w:tooltip="11.3 The Recipe List object">
+          <w:hyperlink w:anchor="__RefHeading___Toc3581_820669520" w:tooltip="11.3 The Recipe List object">
             <w:r>
               <w:rPr>
                 <w:rStyle w:val="IndexLink"/>
@@ -913,7 +913,7 @@
             </w:tabs>
             <w:rPr/>
           </w:pPr>
-          <w:hyperlink w:anchor="__RefHeading___Toc3515_1956587008" w:tooltip="11.4 Selecting a recipe in a window">
+          <w:hyperlink w:anchor="__RefHeading___Toc3583_820669520" w:tooltip="11.4 Selecting a recipe in a window">
             <w:r>
               <w:rPr>
                 <w:rStyle w:val="IndexLink"/>
@@ -934,7 +934,7 @@
             </w:tabs>
             <w:rPr/>
           </w:pPr>
-          <w:hyperlink w:anchor="__RefHeading___Toc3517_1956587008" w:tooltip="11.5 When a recipe function fails">
+          <w:hyperlink w:anchor="__RefHeading___Toc3585_820669520" w:tooltip="11.5 When a recipe function fails">
             <w:r>
               <w:rPr>
                 <w:rStyle w:val="IndexLink"/>
@@ -955,7 +955,7 @@
             </w:tabs>
             <w:rPr/>
           </w:pPr>
-          <w:hyperlink w:anchor="__RefHeading___Toc3519_1956587008" w:tooltip="11.6 Where recipes are kept">
+          <w:hyperlink w:anchor="__RefHeading___Toc3587_820669520" w:tooltip="11.6 Where recipes are kept">
             <w:r>
               <w:rPr>
                 <w:rStyle w:val="IndexLink"/>
@@ -976,7 +976,7 @@
             </w:tabs>
             <w:rPr/>
           </w:pPr>
-          <w:hyperlink w:anchor="__RefHeading___Toc3521_1956587008" w:tooltip="12 Testing">
+          <w:hyperlink w:anchor="__RefHeading___Toc3589_820669520" w:tooltip="12 Testing">
             <w:r>
               <w:rPr>
                 <w:rStyle w:val="IndexLink"/>
@@ -997,7 +997,7 @@
             </w:tabs>
             <w:rPr/>
           </w:pPr>
-          <w:hyperlink w:anchor="__RefHeading___Toc3523_1956587008" w:tooltip="12.1 Validate">
+          <w:hyperlink w:anchor="__RefHeading___Toc3591_820669520" w:tooltip="12.1 Validate">
             <w:r>
               <w:rPr>
                 <w:rStyle w:val="IndexLink"/>
@@ -1018,7 +1018,7 @@
             </w:tabs>
             <w:rPr/>
           </w:pPr>
-          <w:hyperlink w:anchor="__RefHeading___Toc3525_1956587008" w:tooltip="12.2 Run">
+          <w:hyperlink w:anchor="__RefHeading___Toc3593_820669520" w:tooltip="12.2 Run">
             <w:r>
               <w:rPr>
                 <w:rStyle w:val="IndexLink"/>
@@ -1039,7 +1039,7 @@
             </w:tabs>
             <w:rPr/>
           </w:pPr>
-          <w:hyperlink w:anchor="__RefHeading___Toc3527_1956587008" w:tooltip="13 Deploying">
+          <w:hyperlink w:anchor="__RefHeading___Toc3595_820669520" w:tooltip="13 Deploying">
             <w:r>
               <w:rPr>
                 <w:rStyle w:val="IndexLink"/>
@@ -1060,7 +1060,7 @@
             </w:tabs>
             <w:rPr/>
           </w:pPr>
-          <w:hyperlink w:anchor="__RefHeading___Toc3529_1956587008" w:tooltip="13.1 Publish">
+          <w:hyperlink w:anchor="__RefHeading___Toc3597_820669520" w:tooltip="13.1 Publish">
             <w:r>
               <w:rPr>
                 <w:rStyle w:val="IndexLink"/>
@@ -1081,7 +1081,7 @@
             </w:tabs>
             <w:rPr/>
           </w:pPr>
-          <w:hyperlink w:anchor="__RefHeading___Toc3531_1956587008" w:tooltip="13.2 Append HMI Desktop">
+          <w:hyperlink w:anchor="__RefHeading___Toc3599_820669520" w:tooltip="13.2 Append HMI Desktop">
             <w:r>
               <w:rPr>
                 <w:rStyle w:val="IndexLink"/>
@@ -1102,7 +1102,7 @@
             </w:tabs>
             <w:rPr/>
           </w:pPr>
-          <w:hyperlink w:anchor="__RefHeading___Toc3533_1956587008" w:tooltip="13.3 Append HMI Web">
+          <w:hyperlink w:anchor="__RefHeading___Toc3601_820669520" w:tooltip="13.3 Append HMI Web">
             <w:r>
               <w:rPr>
                 <w:rStyle w:val="IndexLink"/>
@@ -1123,7 +1123,7 @@
             </w:tabs>
             <w:rPr/>
           </w:pPr>
-          <w:hyperlink w:anchor="__RefHeading___Toc3535_1956587008" w:tooltip="14 Tips and troubleshooting">
+          <w:hyperlink w:anchor="__RefHeading___Toc3603_820669520" w:tooltip="14 Tips and troubleshooting">
             <w:r>
               <w:rPr>
                 <w:rStyle w:val="IndexLink"/>
@@ -1144,7 +1144,7 @@
             </w:tabs>
             <w:rPr/>
           </w:pPr>
-          <w:hyperlink w:anchor="__RefHeading___Toc3537_1956587008" w:tooltip="Appendix A Command-line automation">
+          <w:hyperlink w:anchor="__RefHeading___Toc3605_820669520" w:tooltip="Appendix A Command-line automation">
             <w:r>
               <w:rPr>
                 <w:rStyle w:val="IndexLink"/>
@@ -1182,7 +1182,7 @@
         <w:spacing w:before="0" w:after="0"/>
         <w:rPr/>
       </w:pPr>
-      <w:bookmarkStart w:id="0" w:name="__RefHeading___Toc3455_1956587008"/>
+      <w:bookmarkStart w:id="0" w:name="__RefHeading___Toc3523_820669520"/>
       <w:bookmarkEnd w:id="0"/>
       <w:r>
         <w:rPr/>
@@ -1883,7 +1883,7 @@
         <w:pStyle w:val="Heading2"/>
         <w:rPr/>
       </w:pPr>
-      <w:bookmarkStart w:id="1" w:name="__RefHeading___Toc3457_1956587008"/>
+      <w:bookmarkStart w:id="1" w:name="__RefHeading___Toc3525_820669520"/>
       <w:bookmarkEnd w:id="1"/>
       <w:r>
         <w:rPr/>
@@ -2026,7 +2026,7 @@
         <w:pStyle w:val="Heading1"/>
         <w:rPr/>
       </w:pPr>
-      <w:bookmarkStart w:id="2" w:name="__RefHeading___Toc3459_1956587008"/>
+      <w:bookmarkStart w:id="2" w:name="__RefHeading___Toc3527_820669520"/>
       <w:bookmarkEnd w:id="2"/>
       <w:r>
         <w:rPr/>
@@ -2604,7 +2604,7 @@
         <w:pStyle w:val="Heading2"/>
         <w:rPr/>
       </w:pPr>
-      <w:bookmarkStart w:id="3" w:name="__RefHeading___Toc3461_1956587008"/>
+      <w:bookmarkStart w:id="3" w:name="__RefHeading___Toc3529_820669520"/>
       <w:bookmarkEnd w:id="3"/>
       <w:r>
         <w:rPr/>
@@ -3644,7 +3644,7 @@
         <w:pStyle w:val="Heading1"/>
         <w:rPr/>
       </w:pPr>
-      <w:bookmarkStart w:id="4" w:name="__RefHeading___Toc3463_1956587008"/>
+      <w:bookmarkStart w:id="4" w:name="__RefHeading___Toc3531_820669520"/>
       <w:bookmarkEnd w:id="4"/>
       <w:r>
         <w:rPr/>
@@ -3929,7 +3929,7 @@
         <w:pStyle w:val="Heading1"/>
         <w:rPr/>
       </w:pPr>
-      <w:bookmarkStart w:id="5" w:name="__RefHeading___Toc3465_1956587008"/>
+      <w:bookmarkStart w:id="5" w:name="__RefHeading___Toc3533_820669520"/>
       <w:bookmarkEnd w:id="5"/>
       <w:r>
         <w:rPr/>
@@ -4724,7 +4724,7 @@
         <w:pStyle w:val="Heading1"/>
         <w:rPr/>
       </w:pPr>
-      <w:bookmarkStart w:id="6" w:name="__RefHeading___Toc3467_1956587008"/>
+      <w:bookmarkStart w:id="6" w:name="__RefHeading___Toc3535_820669520"/>
       <w:bookmarkEnd w:id="6"/>
       <w:r>
         <w:rPr/>
@@ -4845,7 +4845,7 @@
     <w:tbl>
       <w:tblPr>
         <w:tblStyle w:val="TableGrid"/>
-        <w:tblW w:w="9360" w:type="dxa"/>
+        <w:tblW w:w="9361" w:type="dxa"/>
         <w:jc w:val="left"/>
         <w:tblInd w:w="0" w:type="dxa"/>
         <w:tblLayout w:type="fixed"/>
@@ -4858,9 +4858,9 @@
         <w:tblLook w:val="04a0" w:noHBand="0" w:noVBand="1" w:firstColumn="1" w:lastRow="0" w:lastColumn="0" w:firstRow="1"/>
       </w:tblPr>
       <w:tblGrid>
-        <w:gridCol w:w="4223"/>
-        <w:gridCol w:w="1940"/>
-        <w:gridCol w:w="3197"/>
+        <w:gridCol w:w="3232"/>
+        <w:gridCol w:w="3657"/>
+        <w:gridCol w:w="2472"/>
       </w:tblGrid>
       <w:tr>
         <w:trPr>
@@ -4869,7 +4869,7 @@
         </w:trPr>
         <w:tc>
           <w:tcPr>
-            <w:tcW w:w="4223" w:type="dxa"/>
+            <w:tcW w:w="3232" w:type="dxa"/>
             <w:tcBorders/>
             <w:shd w:color="auto" w:fill="D9E2EC" w:val="clear"/>
           </w:tcPr>
@@ -4901,7 +4901,7 @@
         </w:tc>
         <w:tc>
           <w:tcPr>
-            <w:tcW w:w="1940" w:type="dxa"/>
+            <w:tcW w:w="3657" w:type="dxa"/>
             <w:tcBorders/>
             <w:shd w:color="auto" w:fill="D9E2EC" w:val="clear"/>
           </w:tcPr>
@@ -4933,7 +4933,7 @@
         </w:tc>
         <w:tc>
           <w:tcPr>
-            <w:tcW w:w="3197" w:type="dxa"/>
+            <w:tcW w:w="2472" w:type="dxa"/>
             <w:tcBorders/>
             <w:shd w:color="auto" w:fill="D9E2EC" w:val="clear"/>
           </w:tcPr>
@@ -4970,7 +4970,7 @@
         </w:trPr>
         <w:tc>
           <w:tcPr>
-            <w:tcW w:w="4223" w:type="dxa"/>
+            <w:tcW w:w="3232" w:type="dxa"/>
             <w:tcBorders/>
           </w:tcPr>
           <w:p>
@@ -5001,7 +5001,7 @@
         </w:tc>
         <w:tc>
           <w:tcPr>
-            <w:tcW w:w="1940" w:type="dxa"/>
+            <w:tcW w:w="3657" w:type="dxa"/>
             <w:tcBorders/>
           </w:tcPr>
           <w:p>
@@ -5031,7 +5031,7 @@
         </w:tc>
         <w:tc>
           <w:tcPr>
-            <w:tcW w:w="3197" w:type="dxa"/>
+            <w:tcW w:w="2472" w:type="dxa"/>
             <w:tcBorders/>
           </w:tcPr>
           <w:p>
@@ -5066,7 +5066,7 @@
         </w:trPr>
         <w:tc>
           <w:tcPr>
-            <w:tcW w:w="4223" w:type="dxa"/>
+            <w:tcW w:w="3232" w:type="dxa"/>
             <w:tcBorders/>
           </w:tcPr>
           <w:p>
@@ -5097,7 +5097,7 @@
         </w:tc>
         <w:tc>
           <w:tcPr>
-            <w:tcW w:w="1940" w:type="dxa"/>
+            <w:tcW w:w="3657" w:type="dxa"/>
             <w:tcBorders/>
           </w:tcPr>
           <w:p>
@@ -5127,7 +5127,7 @@
         </w:tc>
         <w:tc>
           <w:tcPr>
-            <w:tcW w:w="3197" w:type="dxa"/>
+            <w:tcW w:w="2472" w:type="dxa"/>
             <w:tcBorders/>
           </w:tcPr>
           <w:p>
@@ -5162,7 +5162,7 @@
         </w:trPr>
         <w:tc>
           <w:tcPr>
-            <w:tcW w:w="4223" w:type="dxa"/>
+            <w:tcW w:w="3232" w:type="dxa"/>
             <w:tcBorders/>
           </w:tcPr>
           <w:p>
@@ -5193,7 +5193,7 @@
         </w:tc>
         <w:tc>
           <w:tcPr>
-            <w:tcW w:w="1940" w:type="dxa"/>
+            <w:tcW w:w="3657" w:type="dxa"/>
             <w:tcBorders/>
           </w:tcPr>
           <w:p>
@@ -5223,7 +5223,7 @@
         </w:tc>
         <w:tc>
           <w:tcPr>
-            <w:tcW w:w="3197" w:type="dxa"/>
+            <w:tcW w:w="2472" w:type="dxa"/>
             <w:tcBorders/>
           </w:tcPr>
           <w:p>
@@ -5258,7 +5258,7 @@
         </w:trPr>
         <w:tc>
           <w:tcPr>
-            <w:tcW w:w="4223" w:type="dxa"/>
+            <w:tcW w:w="3232" w:type="dxa"/>
             <w:tcBorders/>
           </w:tcPr>
           <w:p>
@@ -5289,7 +5289,7 @@
         </w:tc>
         <w:tc>
           <w:tcPr>
-            <w:tcW w:w="1940" w:type="dxa"/>
+            <w:tcW w:w="3657" w:type="dxa"/>
             <w:tcBorders/>
           </w:tcPr>
           <w:p>
@@ -5319,7 +5319,7 @@
         </w:tc>
         <w:tc>
           <w:tcPr>
-            <w:tcW w:w="3197" w:type="dxa"/>
+            <w:tcW w:w="2472" w:type="dxa"/>
             <w:tcBorders/>
           </w:tcPr>
           <w:p>
@@ -5354,7 +5354,7 @@
         </w:trPr>
         <w:tc>
           <w:tcPr>
-            <w:tcW w:w="4223" w:type="dxa"/>
+            <w:tcW w:w="3232" w:type="dxa"/>
             <w:tcBorders/>
           </w:tcPr>
           <w:p>
@@ -5385,7 +5385,7 @@
         </w:tc>
         <w:tc>
           <w:tcPr>
-            <w:tcW w:w="1940" w:type="dxa"/>
+            <w:tcW w:w="3657" w:type="dxa"/>
             <w:tcBorders/>
           </w:tcPr>
           <w:p>
@@ -5415,7 +5415,7 @@
         </w:tc>
         <w:tc>
           <w:tcPr>
-            <w:tcW w:w="3197" w:type="dxa"/>
+            <w:tcW w:w="2472" w:type="dxa"/>
             <w:tcBorders/>
           </w:tcPr>
           <w:p>
@@ -5440,6 +5440,102 @@
                 <w:lang w:val="en-US" w:eastAsia="en-US" w:bidi="ar-SA"/>
               </w:rPr>
               <w:t>StepText (sequence step description)</w:t>
+            </w:r>
+          </w:p>
+        </w:tc>
+      </w:tr>
+      <w:tr>
+        <w:trPr>
+          <w:cantSplit w:val="true"/>
+        </w:trPr>
+        <w:tc>
+          <w:tcPr>
+            <w:tcW w:w="3232" w:type="dxa"/>
+            <w:tcBorders/>
+          </w:tcPr>
+          <w:p>
+            <w:pPr>
+              <w:pStyle w:val="Normal"/>
+              <w:widowControl/>
+              <w:spacing w:lineRule="auto" w:line="240" w:before="20" w:after="20"/>
+              <w:jc w:val="left"/>
+              <w:rPr>
+                <w:rFonts w:cs=""/>
+                <w:kern w:val="0"/>
+                <w:szCs w:val="22"/>
+                <w:lang w:val="en-US" w:eastAsia="en-US" w:bidi="ar-SA"/>
+              </w:rPr>
+            </w:pPr>
+            <w:r>
+              <w:rPr>
+                <w:rFonts w:cs=""/>
+                <w:b/>
+                <w:kern w:val="0"/>
+                <w:sz w:val="20"/>
+                <w:szCs w:val="22"/>
+                <w:lang w:val="en-US" w:eastAsia="en-US" w:bidi="ar-SA"/>
+              </w:rPr>
+              <w:t>IndirectDiscrete, IndirectAnalog, IndirectMessage</w:t>
+            </w:r>
+          </w:p>
+        </w:tc>
+        <w:tc>
+          <w:tcPr>
+            <w:tcW w:w="3657" w:type="dxa"/>
+            <w:tcBorders/>
+          </w:tcPr>
+          <w:p>
+            <w:pPr>
+              <w:pStyle w:val="Normal"/>
+              <w:widowControl/>
+              <w:spacing w:lineRule="auto" w:line="240" w:before="20" w:after="20"/>
+              <w:jc w:val="left"/>
+              <w:rPr>
+                <w:rFonts w:cs=""/>
+                <w:kern w:val="0"/>
+                <w:szCs w:val="22"/>
+                <w:lang w:val="en-US" w:eastAsia="en-US" w:bidi="ar-SA"/>
+              </w:rPr>
+            </w:pPr>
+            <w:r>
+              <w:rPr>
+                <w:rFonts w:cs=""/>
+                <w:kern w:val="0"/>
+                <w:sz w:val="20"/>
+                <w:szCs w:val="22"/>
+                <w:lang w:val="en-US" w:eastAsia="en-US" w:bidi="ar-SA"/>
+              </w:rPr>
+              <w:t>No value of its own: stands for the tag a script links it to with LinkIndirectTag</w:t>
+            </w:r>
+          </w:p>
+        </w:tc>
+        <w:tc>
+          <w:tcPr>
+            <w:tcW w:w="2472" w:type="dxa"/>
+            <w:tcBorders/>
+          </w:tcPr>
+          <w:p>
+            <w:pPr>
+              <w:pStyle w:val="Normal"/>
+              <w:widowControl/>
+              <w:spacing w:lineRule="auto" w:line="240" w:before="20" w:after="20"/>
+              <w:jc w:val="left"/>
+              <w:rPr>
+                <w:rFonts w:cs=""/>
+                <w:kern w:val="0"/>
+                <w:szCs w:val="22"/>
+                <w:lang w:val="en-US" w:eastAsia="en-US" w:bidi="ar-SA"/>
+              </w:rPr>
+            </w:pPr>
+            <w:r>
+              <w:rPr>
+                <w:rFonts w:cs=""/>
+                <w:kern w:val="0"/>
+                <w:sz w:val="20"/>
+                <w:szCs w:val="22"/>
+                <w:lang w:val="en-US" w:eastAsia="en-US" w:bidi="ar-SA"/>
+              </w:rPr>
+              <w:t>One faceplate serving every valve</w:t>
             </w:r>
           </w:p>
         </w:tc>
@@ -5459,7 +5555,7 @@
         <w:pStyle w:val="Heading2"/>
         <w:rPr/>
       </w:pPr>
-      <w:bookmarkStart w:id="7" w:name="__RefHeading___Toc3469_1956587008"/>
+      <w:bookmarkStart w:id="7" w:name="__RefHeading___Toc3537_820669520"/>
       <w:bookmarkEnd w:id="7"/>
       <w:r>
         <w:rPr/>
@@ -6112,7 +6208,7 @@
         <w:pStyle w:val="Heading2"/>
         <w:rPr/>
       </w:pPr>
-      <w:bookmarkStart w:id="8" w:name="__RefHeading___Toc3471_1956587008"/>
+      <w:bookmarkStart w:id="8" w:name="__RefHeading___Toc3539_820669520"/>
       <w:bookmarkEnd w:id="8"/>
       <w:r>
         <w:rPr/>
@@ -6247,7 +6343,7 @@
         <w:pStyle w:val="Heading1"/>
         <w:rPr/>
       </w:pPr>
-      <w:bookmarkStart w:id="9" w:name="__RefHeading___Toc3473_1956587008"/>
+      <w:bookmarkStart w:id="9" w:name="__RefHeading___Toc3541_820669520"/>
       <w:bookmarkEnd w:id="9"/>
       <w:r>
         <w:rPr/>
@@ -6760,7 +6856,7 @@
         <w:pStyle w:val="Heading2"/>
         <w:rPr/>
       </w:pPr>
-      <w:bookmarkStart w:id="10" w:name="__RefHeading___Toc3475_1956587008"/>
+      <w:bookmarkStart w:id="10" w:name="__RefHeading___Toc3543_820669520"/>
       <w:bookmarkEnd w:id="10"/>
       <w:r>
         <w:rPr/>
@@ -6922,7 +7018,7 @@
         <w:pStyle w:val="Heading2"/>
         <w:rPr/>
       </w:pPr>
-      <w:bookmarkStart w:id="11" w:name="__RefHeading___Toc3477_1956587008"/>
+      <w:bookmarkStart w:id="11" w:name="__RefHeading___Toc3545_820669520"/>
       <w:bookmarkEnd w:id="11"/>
       <w:r>
         <w:rPr/>
@@ -6964,7 +7060,7 @@
         <w:pStyle w:val="Heading1"/>
         <w:rPr/>
       </w:pPr>
-      <w:bookmarkStart w:id="12" w:name="__RefHeading___Toc3479_1956587008"/>
+      <w:bookmarkStart w:id="12" w:name="__RefHeading___Toc3547_820669520"/>
       <w:bookmarkEnd w:id="12"/>
       <w:r>
         <w:rPr/>
@@ -7170,7 +7266,7 @@
         <w:pStyle w:val="Heading1"/>
         <w:rPr/>
       </w:pPr>
-      <w:bookmarkStart w:id="13" w:name="__RefHeading___Toc3481_1956587008"/>
+      <w:bookmarkStart w:id="13" w:name="__RefHeading___Toc3549_820669520"/>
       <w:bookmarkEnd w:id="13"/>
       <w:r>
         <w:rPr/>
@@ -7895,7 +7991,7 @@
         <w:pStyle w:val="Heading2"/>
         <w:rPr/>
       </w:pPr>
-      <w:bookmarkStart w:id="14" w:name="__RefHeading___Toc3483_1956587008"/>
+      <w:bookmarkStart w:id="14" w:name="__RefHeading___Toc3551_820669520"/>
       <w:bookmarkEnd w:id="14"/>
       <w:r>
         <w:rPr/>
@@ -8059,7 +8155,7 @@
         <w:pStyle w:val="Heading2"/>
         <w:rPr/>
       </w:pPr>
-      <w:bookmarkStart w:id="15" w:name="__RefHeading___Toc3485_1956587008"/>
+      <w:bookmarkStart w:id="15" w:name="__RefHeading___Toc3553_820669520"/>
       <w:bookmarkEnd w:id="15"/>
       <w:r>
         <w:rPr/>
@@ -8180,7 +8276,7 @@
         <w:pStyle w:val="Heading2"/>
         <w:rPr/>
       </w:pPr>
-      <w:bookmarkStart w:id="16" w:name="__RefHeading___Toc3487_1956587008"/>
+      <w:bookmarkStart w:id="16" w:name="__RefHeading___Toc3555_820669520"/>
       <w:bookmarkEnd w:id="16"/>
       <w:r>
         <w:rPr/>
@@ -8296,7 +8392,7 @@
         <w:pStyle w:val="Heading2"/>
         <w:rPr/>
       </w:pPr>
-      <w:bookmarkStart w:id="17" w:name="__RefHeading___Toc3489_1956587008"/>
+      <w:bookmarkStart w:id="17" w:name="__RefHeading___Toc3557_820669520"/>
       <w:bookmarkEnd w:id="17"/>
       <w:r>
         <w:rPr/>
@@ -8412,7 +8508,7 @@
         <w:pStyle w:val="Heading2"/>
         <w:rPr/>
       </w:pPr>
-      <w:bookmarkStart w:id="18" w:name="__RefHeading___Toc3491_1956587008"/>
+      <w:bookmarkStart w:id="18" w:name="__RefHeading___Toc3559_820669520"/>
       <w:bookmarkEnd w:id="18"/>
       <w:r>
         <w:rPr/>
@@ -8924,7 +9020,7 @@
         <w:pStyle w:val="Heading1"/>
         <w:rPr/>
       </w:pPr>
-      <w:bookmarkStart w:id="19" w:name="__RefHeading___Toc3493_1956587008"/>
+      <w:bookmarkStart w:id="19" w:name="__RefHeading___Toc3561_820669520"/>
       <w:bookmarkEnd w:id="19"/>
       <w:r>
         <w:rPr/>
@@ -9826,7 +9922,7 @@
         <w:pStyle w:val="Heading2"/>
         <w:rPr/>
       </w:pPr>
-      <w:bookmarkStart w:id="20" w:name="__RefHeading___Toc3495_1956587008"/>
+      <w:bookmarkStart w:id="20" w:name="__RefHeading___Toc3563_820669520"/>
       <w:bookmarkEnd w:id="20"/>
       <w:r>
         <w:rPr/>
@@ -10010,7 +10106,7 @@
         <w:pStyle w:val="Heading2"/>
         <w:rPr/>
       </w:pPr>
-      <w:bookmarkStart w:id="21" w:name="__RefHeading___Toc3497_1956587008"/>
+      <w:bookmarkStart w:id="21" w:name="__RefHeading___Toc3565_820669520"/>
       <w:bookmarkEnd w:id="21"/>
       <w:r>
         <w:rPr/>
@@ -10129,7 +10225,7 @@
         <w:pStyle w:val="Heading2"/>
         <w:rPr/>
       </w:pPr>
-      <w:bookmarkStart w:id="22" w:name="__RefHeading___Toc3499_1956587008"/>
+      <w:bookmarkStart w:id="22" w:name="__RefHeading___Toc3567_820669520"/>
       <w:bookmarkEnd w:id="22"/>
       <w:r>
         <w:rPr/>
@@ -10201,11 +10297,11 @@
         <w:rPr>
           <w:b/>
         </w:rPr>
-        <w:t>Security and recipe functions</w:t>
-      </w:r>
-      <w:r>
-        <w:rPr/>
-        <w:t xml:space="preserve"> do something (open a window, log in, write tags), so they can be called only from scripts: Action Scripts and window scripts. Validate reports one used in an animation link.</w:t>
+        <w:t>Security, indirect tag and recipe functions</w:t>
+      </w:r>
+      <w:r>
+        <w:rPr/>
+        <w:t xml:space="preserve"> do something (open a window, log in, link or write tags), so they can be called only from scripts: Action Scripts and window scripts. Validate reports one used in an animation link.</w:t>
       </w:r>
     </w:p>
     <w:p>
@@ -12087,6 +12183,265 @@
     </w:p>
     <w:p>
       <w:pPr>
+        <w:pStyle w:val="Caption"/>
+        <w:keepNext w:val="true"/>
+        <w:rPr/>
+      </w:pPr>
+      <w:r>
+        <w:rPr/>
+        <w:t>Table 14. Indirect tag function (scripts only)</w:t>
+      </w:r>
+    </w:p>
+    <w:tbl>
+      <w:tblPr>
+        <w:tblStyle w:val="TableGrid"/>
+        <w:tblW w:w="9360" w:type="dxa"/>
+        <w:jc w:val="left"/>
+        <w:tblInd w:w="0" w:type="dxa"/>
+        <w:tblLayout w:type="fixed"/>
+        <w:tblCellMar>
+          <w:top w:w="57" w:type="dxa"/>
+          <w:left w:w="180" w:type="dxa"/>
+          <w:bottom w:w="57" w:type="dxa"/>
+          <w:right w:w="180" w:type="dxa"/>
+        </w:tblCellMar>
+        <w:tblLook w:val="04a0" w:noHBand="0" w:noVBand="1" w:firstColumn="1" w:lastRow="0" w:lastColumn="0" w:firstRow="1"/>
+      </w:tblPr>
+      <w:tblGrid>
+        <w:gridCol w:w="2393"/>
+        <w:gridCol w:w="1349"/>
+        <w:gridCol w:w="5618"/>
+      </w:tblGrid>
+      <w:tr>
+        <w:trPr>
+          <w:tblHeader w:val="true"/>
+          <w:cantSplit w:val="true"/>
+        </w:trPr>
+        <w:tc>
+          <w:tcPr>
+            <w:tcW w:w="2393" w:type="dxa"/>
+            <w:tcBorders/>
+            <w:shd w:color="auto" w:fill="D9E2EC" w:val="clear"/>
+          </w:tcPr>
+          <w:p>
+            <w:pPr>
+              <w:pStyle w:val="Normal"/>
+              <w:widowControl/>
+              <w:spacing w:lineRule="auto" w:line="240" w:before="20" w:after="20"/>
+              <w:jc w:val="left"/>
+              <w:rPr>
+                <w:rFonts w:cs=""/>
+                <w:kern w:val="0"/>
+                <w:szCs w:val="22"/>
+                <w:lang w:val="en-US" w:eastAsia="en-US" w:bidi="ar-SA"/>
+              </w:rPr>
+            </w:pPr>
+            <w:r>
+              <w:rPr>
+                <w:rFonts w:cs=""/>
+                <w:b/>
+                <w:kern w:val="0"/>
+                <w:sz w:val="20"/>
+                <w:szCs w:val="22"/>
+                <w:lang w:val="en-US" w:eastAsia="en-US" w:bidi="ar-SA"/>
+              </w:rPr>
+              <w:t>Function</w:t>
+            </w:r>
+          </w:p>
+        </w:tc>
+        <w:tc>
+          <w:tcPr>
+            <w:tcW w:w="1349" w:type="dxa"/>
+            <w:tcBorders/>
+            <w:shd w:color="auto" w:fill="D9E2EC" w:val="clear"/>
+          </w:tcPr>
+          <w:p>
+            <w:pPr>
+              <w:pStyle w:val="Normal"/>
+              <w:widowControl/>
+              <w:spacing w:lineRule="auto" w:line="240" w:before="20" w:after="20"/>
+              <w:jc w:val="left"/>
+              <w:rPr>
+                <w:rFonts w:cs=""/>
+                <w:kern w:val="0"/>
+                <w:szCs w:val="22"/>
+                <w:lang w:val="en-US" w:eastAsia="en-US" w:bidi="ar-SA"/>
+              </w:rPr>
+            </w:pPr>
+            <w:r>
+              <w:rPr>
+                <w:rFonts w:cs=""/>
+                <w:b/>
+                <w:kern w:val="0"/>
+                <w:sz w:val="20"/>
+                <w:szCs w:val="22"/>
+                <w:lang w:val="en-US" w:eastAsia="en-US" w:bidi="ar-SA"/>
+              </w:rPr>
+              <w:t>Arguments</w:t>
+            </w:r>
+          </w:p>
+        </w:tc>
+        <w:tc>
+          <w:tcPr>
+            <w:tcW w:w="5618" w:type="dxa"/>
+            <w:tcBorders/>
+            <w:shd w:color="auto" w:fill="D9E2EC" w:val="clear"/>
+          </w:tcPr>
+          <w:p>
+            <w:pPr>
+              <w:pStyle w:val="Normal"/>
+              <w:widowControl/>
+              <w:spacing w:lineRule="auto" w:line="240" w:before="20" w:after="20"/>
+              <w:jc w:val="left"/>
+              <w:rPr>
+                <w:rFonts w:cs=""/>
+                <w:kern w:val="0"/>
+                <w:szCs w:val="22"/>
+                <w:lang w:val="en-US" w:eastAsia="en-US" w:bidi="ar-SA"/>
+              </w:rPr>
+            </w:pPr>
+            <w:r>
+              <w:rPr>
+                <w:rFonts w:cs=""/>
+                <w:b/>
+                <w:kern w:val="0"/>
+                <w:sz w:val="20"/>
+                <w:szCs w:val="22"/>
+                <w:lang w:val="en-US" w:eastAsia="en-US" w:bidi="ar-SA"/>
+              </w:rPr>
+              <w:t>What it does</w:t>
+            </w:r>
+          </w:p>
+        </w:tc>
+      </w:tr>
+      <w:tr>
+        <w:trPr>
+          <w:cantSplit w:val="true"/>
+        </w:trPr>
+        <w:tc>
+          <w:tcPr>
+            <w:tcW w:w="2393" w:type="dxa"/>
+            <w:tcBorders/>
+          </w:tcPr>
+          <w:p>
+            <w:pPr>
+              <w:pStyle w:val="Normal"/>
+              <w:widowControl/>
+              <w:spacing w:lineRule="auto" w:line="240" w:before="20" w:after="20"/>
+              <w:jc w:val="left"/>
+              <w:rPr>
+                <w:rFonts w:cs=""/>
+                <w:kern w:val="0"/>
+                <w:szCs w:val="22"/>
+                <w:lang w:val="en-US" w:eastAsia="en-US" w:bidi="ar-SA"/>
+              </w:rPr>
+            </w:pPr>
+            <w:r>
+              <w:rPr>
+                <w:rFonts w:cs=""/>
+                <w:b/>
+                <w:kern w:val="0"/>
+                <w:sz w:val="20"/>
+                <w:szCs w:val="22"/>
+                <w:lang w:val="en-US" w:eastAsia="en-US" w:bidi="ar-SA"/>
+              </w:rPr>
+              <w:t>LinkIndirectTag(indirect, tag)</w:t>
+            </w:r>
+          </w:p>
+        </w:tc>
+        <w:tc>
+          <w:tcPr>
+            <w:tcW w:w="1349" w:type="dxa"/>
+            <w:tcBorders/>
+          </w:tcPr>
+          <w:p>
+            <w:pPr>
+              <w:pStyle w:val="Normal"/>
+              <w:widowControl/>
+              <w:spacing w:lineRule="auto" w:line="240" w:before="20" w:after="20"/>
+              <w:jc w:val="left"/>
+              <w:rPr>
+                <w:rFonts w:cs=""/>
+                <w:kern w:val="0"/>
+                <w:szCs w:val="22"/>
+                <w:lang w:val="en-US" w:eastAsia="en-US" w:bidi="ar-SA"/>
+              </w:rPr>
+            </w:pPr>
+            <w:r>
+              <w:rPr>
+                <w:rFonts w:cs=""/>
+                <w:kern w:val="0"/>
+                <w:sz w:val="20"/>
+                <w:szCs w:val="22"/>
+                <w:lang w:val="en-US" w:eastAsia="en-US" w:bidi="ar-SA"/>
+              </w:rPr>
+              <w:t>indirect, tag: tag names as text</w:t>
+            </w:r>
+          </w:p>
+        </w:tc>
+        <w:tc>
+          <w:tcPr>
+            <w:tcW w:w="5618" w:type="dxa"/>
+            <w:tcBorders/>
+          </w:tcPr>
+          <w:p>
+            <w:pPr>
+              <w:pStyle w:val="Normal"/>
+              <w:widowControl/>
+              <w:spacing w:lineRule="auto" w:line="240" w:before="20" w:after="20"/>
+              <w:jc w:val="left"/>
+              <w:rPr>
+                <w:rFonts w:cs=""/>
+                <w:kern w:val="0"/>
+                <w:szCs w:val="22"/>
+                <w:lang w:val="en-US" w:eastAsia="en-US" w:bidi="ar-SA"/>
+              </w:rPr>
+            </w:pPr>
+            <w:r>
+              <w:rPr>
+                <w:rFonts w:cs=""/>
+                <w:kern w:val="0"/>
+                <w:sz w:val="20"/>
+                <w:szCs w:val="22"/>
+                <w:lang w:val="en-US" w:eastAsia="en-US" w:bidi="ar-SA"/>
+              </w:rPr>
+              <w:t xml:space="preserve">Points the indirect tag at the tag, replacing any earlier link; reading or writing the indirect tag then reads or writes that tag, in every window. The names can be built: </w:t>
+            </w:r>
+            <w:r>
+              <w:rPr>
+                <w:rFonts w:cs="" w:ascii="Consolas" w:hAnsi="Consolas"/>
+                <w:kern w:val="0"/>
+                <w:sz w:val="20"/>
+                <w:szCs w:val="22"/>
+                <w:lang w:val="en-US" w:eastAsia="en-US" w:bidi="ar-SA"/>
+              </w:rPr>
+              <w:t>LinkIndirectTag("FP_Status", "SV" + Text(Unit, "000") + "_Status")</w:t>
+            </w:r>
+            <w:r>
+              <w:rPr>
+                <w:rFonts w:cs=""/>
+                <w:kern w:val="0"/>
+                <w:sz w:val="20"/>
+                <w:szCs w:val="22"/>
+                <w:lang w:val="en-US" w:eastAsia="en-US" w:bidi="ar-SA"/>
+              </w:rPr>
+              <w:t>. Returns 1, or 0 with an Indirect Tag Error window when a name is unknown or the types do not match</w:t>
+            </w:r>
+          </w:p>
+        </w:tc>
+      </w:tr>
+    </w:tbl>
+    <w:p>
+      <w:pPr>
+        <w:pStyle w:val="Normal"/>
+        <w:rPr/>
+      </w:pPr>
+      <w:r>
+        <w:rPr/>
+      </w:r>
+    </w:p>
+    <w:p>
+      <w:pPr>
         <w:pStyle w:val="Normal"/>
         <w:rPr/>
       </w:pPr>
@@ -12135,7 +12490,7 @@
       </w:pPr>
       <w:r>
         <w:rPr/>
-        <w:t>Table 14. Recipe functions (scripts only)</w:t>
+        <w:t>Table 15. Recipe functions (scripts only)</w:t>
       </w:r>
     </w:p>
     <w:tbl>
@@ -13173,7 +13528,7 @@
         <w:pStyle w:val="Heading1"/>
         <w:rPr/>
       </w:pPr>
-      <w:bookmarkStart w:id="23" w:name="__RefHeading___Toc3501_1956587008"/>
+      <w:bookmarkStart w:id="23" w:name="__RefHeading___Toc3569_820669520"/>
       <w:bookmarkEnd w:id="23"/>
       <w:r>
         <w:rPr/>
@@ -13185,7 +13540,7 @@
         <w:pStyle w:val="Heading2"/>
         <w:rPr/>
       </w:pPr>
-      <w:bookmarkStart w:id="24" w:name="__RefHeading___Toc3503_1956587008"/>
+      <w:bookmarkStart w:id="24" w:name="__RefHeading___Toc3571_820669520"/>
       <w:bookmarkEnd w:id="24"/>
       <w:r>
         <w:rPr/>
@@ -13309,13 +13664,16 @@
         <w:rPr/>
         <w:t>Every alarm event is written to a daily history file kept for 90 days; the Alarm History object shows it (Figure 37).</w:t>
       </w:r>
+      <w:r>
+        <w:br w:type="page"/>
+      </w:r>
     </w:p>
     <w:p>
       <w:pPr>
         <w:pStyle w:val="Heading2"/>
         <w:rPr/>
       </w:pPr>
-      <w:bookmarkStart w:id="25" w:name="__RefHeading___Toc3505_1956587008"/>
+      <w:bookmarkStart w:id="25" w:name="__RefHeading___Toc3573_820669520"/>
       <w:bookmarkEnd w:id="25"/>
       <w:r>
         <w:rPr/>
@@ -13410,7 +13768,7 @@
       </w:pPr>
       <w:r>
         <w:rPr/>
-        <w:t>Table 15. LiquidWeighHMI users</w:t>
+        <w:t>Table 16. LiquidWeighHMI users</w:t>
       </w:r>
     </w:p>
     <w:tbl>
@@ -14005,7 +14363,7 @@
         <w:pStyle w:val="Heading1"/>
         <w:rPr/>
       </w:pPr>
-      <w:bookmarkStart w:id="26" w:name="__RefHeading___Toc3507_1956587008"/>
+      <w:bookmarkStart w:id="26" w:name="__RefHeading___Toc3575_820669520"/>
       <w:bookmarkEnd w:id="26"/>
       <w:r>
         <w:rPr/>
@@ -14135,16 +14493,13 @@
         <w:rPr/>
         <w:t>Keeping the edited values in memory tags means the operator can prepare a recipe without disturbing the PLC, and send it with one Download when the process is ready.</w:t>
       </w:r>
-      <w:r>
-        <w:br w:type="page"/>
-      </w:r>
     </w:p>
     <w:p>
       <w:pPr>
         <w:pStyle w:val="Heading2"/>
         <w:rPr/>
       </w:pPr>
-      <w:bookmarkStart w:id="27" w:name="__RefHeading___Toc3509_1956587008"/>
+      <w:bookmarkStart w:id="27" w:name="__RefHeading___Toc3577_820669520"/>
       <w:bookmarkEnd w:id="27"/>
       <w:r>
         <w:rPr/>
@@ -14399,7 +14754,7 @@
       </w:pPr>
       <w:r>
         <w:rPr/>
-        <w:t>Table 16. The tags of the Plasticizer Blends book</w:t>
+        <w:t>Table 17. The tags of the Plasticizer Blends book</w:t>
       </w:r>
     </w:p>
     <w:tbl>
@@ -15016,7 +15371,7 @@
       </w:pPr>
       <w:r>
         <w:rPr/>
-        <w:t>Table 17. LiquidWeighHMI's starting recipes</w:t>
+        <w:t>Table 18. LiquidWeighHMI's starting recipes</w:t>
       </w:r>
     </w:p>
     <w:tbl>
@@ -16005,7 +16360,7 @@
         <w:pStyle w:val="Heading2"/>
         <w:rPr/>
       </w:pPr>
-      <w:bookmarkStart w:id="28" w:name="__RefHeading___Toc3511_1956587008"/>
+      <w:bookmarkStart w:id="28" w:name="__RefHeading___Toc3579_820669520"/>
       <w:bookmarkEnd w:id="28"/>
       <w:r>
         <w:rPr/>
@@ -16192,7 +16547,7 @@
       </w:pPr>
       <w:r>
         <w:rPr/>
-        <w:t>Table 18. The Recipes screen's buttons</w:t>
+        <w:t>Table 19. The Recipes screen's buttons</w:t>
       </w:r>
     </w:p>
     <w:tbl>
@@ -17455,7 +17810,7 @@
         <w:pStyle w:val="Heading2"/>
         <w:rPr/>
       </w:pPr>
-      <w:bookmarkStart w:id="29" w:name="__RefHeading___Toc3513_1956587008"/>
+      <w:bookmarkStart w:id="29" w:name="__RefHeading___Toc3581_820669520"/>
       <w:bookmarkEnd w:id="29"/>
       <w:r>
         <w:rPr/>
@@ -17546,7 +17901,7 @@
       </w:pPr>
       <w:r>
         <w:rPr/>
-        <w:t>Table 19. Recipe List settings</w:t>
+        <w:t>Table 20. Recipe List settings</w:t>
       </w:r>
     </w:p>
     <w:tbl>
@@ -17996,7 +18351,7 @@
         <w:pStyle w:val="Heading2"/>
         <w:rPr/>
       </w:pPr>
-      <w:bookmarkStart w:id="30" w:name="__RefHeading___Toc3515_1956587008"/>
+      <w:bookmarkStart w:id="30" w:name="__RefHeading___Toc3583_820669520"/>
       <w:bookmarkEnd w:id="30"/>
       <w:r>
         <w:rPr/>
@@ -18281,7 +18636,7 @@
         <w:pStyle w:val="Heading2"/>
         <w:rPr/>
       </w:pPr>
-      <w:bookmarkStart w:id="31" w:name="__RefHeading___Toc3517_1956587008"/>
+      <w:bookmarkStart w:id="31" w:name="__RefHeading___Toc3585_820669520"/>
       <w:bookmarkEnd w:id="31"/>
       <w:r>
         <w:rPr/>
@@ -18439,7 +18794,7 @@
         <w:pStyle w:val="Heading2"/>
         <w:rPr/>
       </w:pPr>
-      <w:bookmarkStart w:id="32" w:name="__RefHeading___Toc3519_1956587008"/>
+      <w:bookmarkStart w:id="32" w:name="__RefHeading___Toc3587_820669520"/>
       <w:bookmarkEnd w:id="32"/>
       <w:r>
         <w:rPr/>
@@ -18464,7 +18819,7 @@
       </w:pPr>
       <w:r>
         <w:rPr/>
-        <w:t>Table 20. Where saved recipes are kept</w:t>
+        <w:t>Table 21. Where saved recipes are kept</w:t>
       </w:r>
     </w:p>
     <w:tbl>
@@ -18839,7 +19194,7 @@
         <w:pStyle w:val="Heading1"/>
         <w:rPr/>
       </w:pPr>
-      <w:bookmarkStart w:id="33" w:name="__RefHeading___Toc3521_1956587008"/>
+      <w:bookmarkStart w:id="33" w:name="__RefHeading___Toc3589_820669520"/>
       <w:bookmarkEnd w:id="33"/>
       <w:r>
         <w:rPr/>
@@ -18851,7 +19206,7 @@
         <w:pStyle w:val="Heading2"/>
         <w:rPr/>
       </w:pPr>
-      <w:bookmarkStart w:id="34" w:name="__RefHeading___Toc3523_1956587008"/>
+      <w:bookmarkStart w:id="34" w:name="__RefHeading___Toc3591_820669520"/>
       <w:bookmarkEnd w:id="34"/>
       <w:r>
         <w:rPr/>
@@ -18939,7 +19294,7 @@
         <w:pStyle w:val="Heading2"/>
         <w:rPr/>
       </w:pPr>
-      <w:bookmarkStart w:id="35" w:name="__RefHeading___Toc3525_1956587008"/>
+      <w:bookmarkStart w:id="35" w:name="__RefHeading___Toc3593_820669520"/>
       <w:bookmarkEnd w:id="35"/>
       <w:r>
         <w:rPr/>
@@ -19485,7 +19840,7 @@
         <w:pStyle w:val="Heading1"/>
         <w:rPr/>
       </w:pPr>
-      <w:bookmarkStart w:id="36" w:name="__RefHeading___Toc3527_1956587008"/>
+      <w:bookmarkStart w:id="36" w:name="__RefHeading___Toc3595_820669520"/>
       <w:bookmarkEnd w:id="36"/>
       <w:r>
         <w:rPr/>
@@ -19510,7 +19865,7 @@
       </w:pPr>
       <w:r>
         <w:rPr/>
-        <w:t>Table 21. Deployment options</w:t>
+        <w:t>Table 22. Deployment options</w:t>
       </w:r>
     </w:p>
     <w:tbl>
@@ -19938,7 +20293,7 @@
         <w:pStyle w:val="Heading2"/>
         <w:rPr/>
       </w:pPr>
-      <w:bookmarkStart w:id="37" w:name="__RefHeading___Toc3529_1956587008"/>
+      <w:bookmarkStart w:id="37" w:name="__RefHeading___Toc3597_820669520"/>
       <w:bookmarkEnd w:id="37"/>
       <w:r>
         <w:rPr/>
@@ -20026,7 +20381,7 @@
         <w:pStyle w:val="Heading2"/>
         <w:rPr/>
       </w:pPr>
-      <w:bookmarkStart w:id="38" w:name="__RefHeading___Toc3531_1956587008"/>
+      <w:bookmarkStart w:id="38" w:name="__RefHeading___Toc3599_820669520"/>
       <w:bookmarkEnd w:id="38"/>
       <w:r>
         <w:rPr/>
@@ -20139,7 +20494,7 @@
         <w:pStyle w:val="Heading2"/>
         <w:rPr/>
       </w:pPr>
-      <w:bookmarkStart w:id="39" w:name="__RefHeading___Toc3533_1956587008"/>
+      <w:bookmarkStart w:id="39" w:name="__RefHeading___Toc3601_820669520"/>
       <w:bookmarkEnd w:id="39"/>
       <w:r>
         <w:rPr/>
@@ -20352,7 +20707,7 @@
         <w:pStyle w:val="Heading1"/>
         <w:rPr/>
       </w:pPr>
-      <w:bookmarkStart w:id="40" w:name="__RefHeading___Toc3535_1956587008"/>
+      <w:bookmarkStart w:id="40" w:name="__RefHeading___Toc3603_820669520"/>
       <w:bookmarkEnd w:id="40"/>
       <w:r>
         <w:rPr/>
@@ -20367,7 +20722,7 @@
       </w:pPr>
       <w:r>
         <w:rPr/>
-        <w:t>Table 22. Common problems</w:t>
+        <w:t>Table 23. Common problems</w:t>
       </w:r>
     </w:p>
     <w:tbl>
@@ -21012,7 +21367,7 @@
         <w:pStyle w:val="Heading1"/>
         <w:rPr/>
       </w:pPr>
-      <w:bookmarkStart w:id="41" w:name="__RefHeading___Toc3537_1956587008"/>
+      <w:bookmarkStart w:id="41" w:name="__RefHeading___Toc3605_820669520"/>
       <w:bookmarkEnd w:id="41"/>
       <w:r>
         <w:rPr/>
@@ -21037,7 +21392,7 @@
       </w:pPr>
       <w:r>
         <w:rPr/>
-        <w:t>Table 23. Command-line modes</w:t>
+        <w:t>Table 24. Command-line modes</w:t>
       </w:r>
     </w:p>
     <w:tbl>

</xml_diff>

<commit_message>
docs: ShowWindow in the automation reference, skill, CLAUDE.md and manual
Co-Authored-By: Claude Opus 5.5 <noreply@anthropic.com>
</commit_message>
<xml_diff>
--- a/doc/Append-HMI-Studio-User-Manual.docx
+++ b/doc/Append-HMI-Studio-User-Manual.docx
@@ -283,7 +283,7 @@
             </w:rPr>
             <w:fldChar w:fldCharType="separate"/>
           </w:r>
-          <w:hyperlink w:anchor="__RefHeading___Toc3606_4179294864" w:tooltip="1 Introduction">
+          <w:hyperlink w:anchor="__RefHeading___Toc3655_906287577" w:tooltip="1 Introduction">
             <w:r>
               <w:rPr>
                 <w:rStyle w:val="IndexLink"/>
@@ -304,7 +304,7 @@
             </w:tabs>
             <w:rPr/>
           </w:pPr>
-          <w:hyperlink w:anchor="__RefHeading___Toc3608_4179294864" w:tooltip="1.1 How an HMI application is organized">
+          <w:hyperlink w:anchor="__RefHeading___Toc3657_906287577" w:tooltip="1.1 How an HMI application is organized">
             <w:r>
               <w:rPr>
                 <w:rStyle w:val="IndexLink"/>
@@ -325,7 +325,7 @@
             </w:tabs>
             <w:rPr/>
           </w:pPr>
-          <w:hyperlink w:anchor="__RefHeading___Toc3610_4179294864" w:tooltip="2 The Studio window">
+          <w:hyperlink w:anchor="__RefHeading___Toc3659_906287577" w:tooltip="2 The Studio window">
             <w:r>
               <w:rPr>
                 <w:rStyle w:val="IndexLink"/>
@@ -346,7 +346,7 @@
             </w:tabs>
             <w:rPr/>
           </w:pPr>
-          <w:hyperlink w:anchor="__RefHeading___Toc3612_4179294864" w:tooltip="2.1 The HMI menu">
+          <w:hyperlink w:anchor="__RefHeading___Toc3661_906287577" w:tooltip="2.1 The HMI menu">
             <w:r>
               <w:rPr>
                 <w:rStyle w:val="IndexLink"/>
@@ -367,7 +367,7 @@
             </w:tabs>
             <w:rPr/>
           </w:pPr>
-          <w:hyperlink w:anchor="__RefHeading___Toc3614_4179294864" w:tooltip="3 Application settings">
+          <w:hyperlink w:anchor="__RefHeading___Toc3663_906287577" w:tooltip="3 Application settings">
             <w:r>
               <w:rPr>
                 <w:rStyle w:val="IndexLink"/>
@@ -388,7 +388,7 @@
             </w:tabs>
             <w:rPr/>
           </w:pPr>
-          <w:hyperlink w:anchor="__RefHeading___Toc3616_4179294864" w:tooltip="4 Devices">
+          <w:hyperlink w:anchor="__RefHeading___Toc3665_906287577" w:tooltip="4 Devices">
             <w:r>
               <w:rPr>
                 <w:rStyle w:val="IndexLink"/>
@@ -409,7 +409,7 @@
             </w:tabs>
             <w:rPr/>
           </w:pPr>
-          <w:hyperlink w:anchor="__RefHeading___Toc3618_4179294864" w:tooltip="5 Tags">
+          <w:hyperlink w:anchor="__RefHeading___Toc3667_906287577" w:tooltip="5 Tags">
             <w:r>
               <w:rPr>
                 <w:rStyle w:val="IndexLink"/>
@@ -430,7 +430,7 @@
             </w:tabs>
             <w:rPr/>
           </w:pPr>
-          <w:hyperlink w:anchor="__RefHeading___Toc3620_4179294864" w:tooltip="5.1 Tag fields">
+          <w:hyperlink w:anchor="__RefHeading___Toc3669_906287577" w:tooltip="5.1 Tag fields">
             <w:r>
               <w:rPr>
                 <w:rStyle w:val="IndexLink"/>
@@ -451,7 +451,7 @@
             </w:tabs>
             <w:rPr/>
           </w:pPr>
-          <w:hyperlink w:anchor="__RefHeading___Toc3622_4179294864" w:tooltip="5.2 Alarms on a tag">
+          <w:hyperlink w:anchor="__RefHeading___Toc3671_906287577" w:tooltip="5.2 Alarms on a tag">
             <w:r>
               <w:rPr>
                 <w:rStyle w:val="IndexLink"/>
@@ -472,7 +472,7 @@
             </w:tabs>
             <w:rPr/>
           </w:pPr>
-          <w:hyperlink w:anchor="__RefHeading___Toc3624_4179294864" w:tooltip="6 Screens and windows">
+          <w:hyperlink w:anchor="__RefHeading___Toc3673_906287577" w:tooltip="6 Screens and windows">
             <w:r>
               <w:rPr>
                 <w:rStyle w:val="IndexLink"/>
@@ -493,7 +493,7 @@
             </w:tabs>
             <w:rPr/>
           </w:pPr>
-          <w:hyperlink w:anchor="__RefHeading___Toc3626_4179294864" w:tooltip="6.1 Window properties">
+          <w:hyperlink w:anchor="__RefHeading___Toc3675_906287577" w:tooltip="6.1 Window properties">
             <w:r>
               <w:rPr>
                 <w:rStyle w:val="IndexLink"/>
@@ -514,7 +514,7 @@
             </w:tabs>
             <w:rPr/>
           </w:pPr>
-          <w:hyperlink w:anchor="__RefHeading___Toc3628_4179294864" w:tooltip="6.2 Navigation">
+          <w:hyperlink w:anchor="__RefHeading___Toc3677_906287577" w:tooltip="6.2 Navigation">
             <w:r>
               <w:rPr>
                 <w:rStyle w:val="IndexLink"/>
@@ -535,7 +535,7 @@
             </w:tabs>
             <w:rPr/>
           </w:pPr>
-          <w:hyperlink w:anchor="__RefHeading___Toc3630_4179294864" w:tooltip="7 Drawing objects">
+          <w:hyperlink w:anchor="__RefHeading___Toc3679_906287577" w:tooltip="7 Drawing objects">
             <w:r>
               <w:rPr>
                 <w:rStyle w:val="IndexLink"/>
@@ -556,7 +556,7 @@
             </w:tabs>
             <w:rPr/>
           </w:pPr>
-          <w:hyperlink w:anchor="__RefHeading___Toc3632_4179294864" w:tooltip="8 Animation links">
+          <w:hyperlink w:anchor="__RefHeading___Toc3681_906287577" w:tooltip="8 Animation links">
             <w:r>
               <w:rPr>
                 <w:rStyle w:val="IndexLink"/>
@@ -577,7 +577,7 @@
             </w:tabs>
             <w:rPr/>
           </w:pPr>
-          <w:hyperlink w:anchor="__RefHeading___Toc3634_4179294864" w:tooltip="8.1 A valve: status color, fault blink and faceplate">
+          <w:hyperlink w:anchor="__RefHeading___Toc3683_906287577" w:tooltip="8.1 A valve: status color, fault blink and faceplate">
             <w:r>
               <w:rPr>
                 <w:rStyle w:val="IndexLink"/>
@@ -598,7 +598,7 @@
             </w:tabs>
             <w:rPr/>
           </w:pPr>
-          <w:hyperlink w:anchor="__RefHeading___Toc3636_4179294864" w:tooltip="8.2 The weigh hopper: percent fill">
+          <w:hyperlink w:anchor="__RefHeading___Toc3685_906287577" w:tooltip="8.2 The weigh hopper: percent fill">
             <w:r>
               <w:rPr>
                 <w:rStyle w:val="IndexLink"/>
@@ -619,7 +619,7 @@
             </w:tabs>
             <w:rPr/>
           </w:pPr>
-          <w:hyperlink w:anchor="__RefHeading___Toc3638_4179294864" w:tooltip="8.3 Hopper pressure: value display and alarm colors">
+          <w:hyperlink w:anchor="__RefHeading___Toc3687_906287577" w:tooltip="8.3 Hopper pressure: value display and alarm colors">
             <w:r>
               <w:rPr>
                 <w:rStyle w:val="IndexLink"/>
@@ -640,7 +640,7 @@
             </w:tabs>
             <w:rPr/>
           </w:pPr>
-          <w:hyperlink w:anchor="__RefHeading___Toc3640_4179294864" w:tooltip="8.4 Setpoints: user input">
+          <w:hyperlink w:anchor="__RefHeading___Toc3689_906287577" w:tooltip="8.4 Setpoints: user input">
             <w:r>
               <w:rPr>
                 <w:rStyle w:val="IndexLink"/>
@@ -661,7 +661,7 @@
             </w:tabs>
             <w:rPr/>
           </w:pPr>
-          <w:hyperlink w:anchor="__RefHeading___Toc3642_4179294864" w:tooltip="8.5 Commands: pushbutton and enable">
+          <w:hyperlink w:anchor="__RefHeading___Toc3691_906287577" w:tooltip="8.5 Commands: pushbutton and enable">
             <w:r>
               <w:rPr>
                 <w:rStyle w:val="IndexLink"/>
@@ -682,7 +682,7 @@
             </w:tabs>
             <w:rPr/>
           </w:pPr>
-          <w:hyperlink w:anchor="__RefHeading___Toc3644_4179294864" w:tooltip="9 Expressions and scripts">
+          <w:hyperlink w:anchor="__RefHeading___Toc3693_906287577" w:tooltip="9 Expressions and scripts">
             <w:r>
               <w:rPr>
                 <w:rStyle w:val="IndexLink"/>
@@ -703,7 +703,7 @@
             </w:tabs>
             <w:rPr/>
           </w:pPr>
-          <w:hyperlink w:anchor="__RefHeading___Toc3646_4179294864" w:tooltip="9.1 Window scripts">
+          <w:hyperlink w:anchor="__RefHeading___Toc3695_906287577" w:tooltip="9.1 Window scripts">
             <w:r>
               <w:rPr>
                 <w:rStyle w:val="IndexLink"/>
@@ -724,7 +724,7 @@
             </w:tabs>
             <w:rPr/>
           </w:pPr>
-          <w:hyperlink w:anchor="__RefHeading___Toc3648_4179294864" w:tooltip="9.2 Action scripts">
+          <w:hyperlink w:anchor="__RefHeading___Toc3697_906287577" w:tooltip="9.2 Action scripts">
             <w:r>
               <w:rPr>
                 <w:rStyle w:val="IndexLink"/>
@@ -745,7 +745,7 @@
             </w:tabs>
             <w:rPr/>
           </w:pPr>
-          <w:hyperlink w:anchor="__RefHeading___Toc3650_4179294864" w:tooltip="9.3 Function reference">
+          <w:hyperlink w:anchor="__RefHeading___Toc3699_906287577" w:tooltip="9.3 Function reference">
             <w:r>
               <w:rPr>
                 <w:rStyle w:val="IndexLink"/>
@@ -766,7 +766,7 @@
             </w:tabs>
             <w:rPr/>
           </w:pPr>
-          <w:hyperlink w:anchor="__RefHeading___Toc3652_4179294864" w:tooltip="9.4 Indirect tags: one faceplate for every device">
+          <w:hyperlink w:anchor="__RefHeading___Toc3701_906287577" w:tooltip="9.4 Indirect tags: one faceplate for every device">
             <w:r>
               <w:rPr>
                 <w:rStyle w:val="IndexLink"/>
@@ -774,7 +774,7 @@
               </w:rPr>
               <w:t>9.4 Indirect tags: one faceplate for every device</w:t>
               <w:tab/>
-              <w:t>28</w:t>
+              <w:t>29</w:t>
             </w:r>
           </w:hyperlink>
         </w:p>
@@ -787,7 +787,7 @@
             </w:tabs>
             <w:rPr/>
           </w:pPr>
-          <w:hyperlink w:anchor="__RefHeading___Toc3654_4179294864" w:tooltip="10 Alarms and security">
+          <w:hyperlink w:anchor="__RefHeading___Toc3703_906287577" w:tooltip="10 Alarms and security">
             <w:r>
               <w:rPr>
                 <w:rStyle w:val="IndexLink"/>
@@ -808,7 +808,7 @@
             </w:tabs>
             <w:rPr/>
           </w:pPr>
-          <w:hyperlink w:anchor="__RefHeading___Toc3656_4179294864" w:tooltip="10.1 Alarms">
+          <w:hyperlink w:anchor="__RefHeading___Toc3705_906287577" w:tooltip="10.1 Alarms">
             <w:r>
               <w:rPr>
                 <w:rStyle w:val="IndexLink"/>
@@ -816,7 +816,7 @@
               </w:rPr>
               <w:t>10.1 Alarms</w:t>
               <w:tab/>
-              <w:t>31</w:t>
+              <w:t>30</w:t>
             </w:r>
           </w:hyperlink>
         </w:p>
@@ -829,7 +829,7 @@
             </w:tabs>
             <w:rPr/>
           </w:pPr>
-          <w:hyperlink w:anchor="__RefHeading___Toc3658_4179294864" w:tooltip="10.2 Users and access levels">
+          <w:hyperlink w:anchor="__RefHeading___Toc3707_906287577" w:tooltip="10.2 Users and access levels">
             <w:r>
               <w:rPr>
                 <w:rStyle w:val="IndexLink"/>
@@ -850,7 +850,7 @@
             </w:tabs>
             <w:rPr/>
           </w:pPr>
-          <w:hyperlink w:anchor="__RefHeading___Toc3660_4179294864" w:tooltip="11 Recipes">
+          <w:hyperlink w:anchor="__RefHeading___Toc3709_906287577" w:tooltip="11 Recipes">
             <w:r>
               <w:rPr>
                 <w:rStyle w:val="IndexLink"/>
@@ -871,7 +871,7 @@
             </w:tabs>
             <w:rPr/>
           </w:pPr>
-          <w:hyperlink w:anchor="__RefHeading___Toc3662_4179294864" w:tooltip="11.1 Recipe books">
+          <w:hyperlink w:anchor="__RefHeading___Toc3711_906287577" w:tooltip="11.1 Recipe books">
             <w:r>
               <w:rPr>
                 <w:rStyle w:val="IndexLink"/>
@@ -879,7 +879,7 @@
               </w:rPr>
               <w:t>11.1 Recipe books</w:t>
               <w:tab/>
-              <w:t>33</w:t>
+              <w:t>32</w:t>
             </w:r>
           </w:hyperlink>
         </w:p>
@@ -892,7 +892,7 @@
             </w:tabs>
             <w:rPr/>
           </w:pPr>
-          <w:hyperlink w:anchor="__RefHeading___Toc3664_4179294864" w:tooltip="11.2 The Recipes screen">
+          <w:hyperlink w:anchor="__RefHeading___Toc3713_906287577" w:tooltip="11.2 The Recipes screen">
             <w:r>
               <w:rPr>
                 <w:rStyle w:val="IndexLink"/>
@@ -913,7 +913,7 @@
             </w:tabs>
             <w:rPr/>
           </w:pPr>
-          <w:hyperlink w:anchor="__RefHeading___Toc3666_4179294864" w:tooltip="11.3 The Recipe List object">
+          <w:hyperlink w:anchor="__RefHeading___Toc3715_906287577" w:tooltip="11.3 The Recipe List object">
             <w:r>
               <w:rPr>
                 <w:rStyle w:val="IndexLink"/>
@@ -934,7 +934,7 @@
             </w:tabs>
             <w:rPr/>
           </w:pPr>
-          <w:hyperlink w:anchor="__RefHeading___Toc3668_4179294864" w:tooltip="11.4 Selecting a recipe in a window">
+          <w:hyperlink w:anchor="__RefHeading___Toc3717_906287577" w:tooltip="11.4 Selecting a recipe in a window">
             <w:r>
               <w:rPr>
                 <w:rStyle w:val="IndexLink"/>
@@ -955,7 +955,7 @@
             </w:tabs>
             <w:rPr/>
           </w:pPr>
-          <w:hyperlink w:anchor="__RefHeading___Toc3670_4179294864" w:tooltip="11.5 When a recipe function fails">
+          <w:hyperlink w:anchor="__RefHeading___Toc3719_906287577" w:tooltip="11.5 When a recipe function fails">
             <w:r>
               <w:rPr>
                 <w:rStyle w:val="IndexLink"/>
@@ -976,7 +976,7 @@
             </w:tabs>
             <w:rPr/>
           </w:pPr>
-          <w:hyperlink w:anchor="__RefHeading___Toc3672_4179294864" w:tooltip="11.6 Where recipes are kept">
+          <w:hyperlink w:anchor="__RefHeading___Toc3721_906287577" w:tooltip="11.6 Where recipes are kept">
             <w:r>
               <w:rPr>
                 <w:rStyle w:val="IndexLink"/>
@@ -997,7 +997,7 @@
             </w:tabs>
             <w:rPr/>
           </w:pPr>
-          <w:hyperlink w:anchor="__RefHeading___Toc3674_4179294864" w:tooltip="12 Testing">
+          <w:hyperlink w:anchor="__RefHeading___Toc3723_906287577" w:tooltip="12 Testing">
             <w:r>
               <w:rPr>
                 <w:rStyle w:val="IndexLink"/>
@@ -1018,7 +1018,7 @@
             </w:tabs>
             <w:rPr/>
           </w:pPr>
-          <w:hyperlink w:anchor="__RefHeading___Toc3676_4179294864" w:tooltip="12.1 Validate">
+          <w:hyperlink w:anchor="__RefHeading___Toc3725_906287577" w:tooltip="12.1 Validate">
             <w:r>
               <w:rPr>
                 <w:rStyle w:val="IndexLink"/>
@@ -1039,7 +1039,7 @@
             </w:tabs>
             <w:rPr/>
           </w:pPr>
-          <w:hyperlink w:anchor="__RefHeading___Toc3678_4179294864" w:tooltip="12.2 Run">
+          <w:hyperlink w:anchor="__RefHeading___Toc3727_906287577" w:tooltip="12.2 Run">
             <w:r>
               <w:rPr>
                 <w:rStyle w:val="IndexLink"/>
@@ -1060,7 +1060,7 @@
             </w:tabs>
             <w:rPr/>
           </w:pPr>
-          <w:hyperlink w:anchor="__RefHeading___Toc3680_4179294864" w:tooltip="13 Deploying">
+          <w:hyperlink w:anchor="__RefHeading___Toc3729_906287577" w:tooltip="13 Deploying">
             <w:r>
               <w:rPr>
                 <w:rStyle w:val="IndexLink"/>
@@ -1081,7 +1081,7 @@
             </w:tabs>
             <w:rPr/>
           </w:pPr>
-          <w:hyperlink w:anchor="__RefHeading___Toc3682_4179294864" w:tooltip="13.1 Publish">
+          <w:hyperlink w:anchor="__RefHeading___Toc3731_906287577" w:tooltip="13.1 Publish">
             <w:r>
               <w:rPr>
                 <w:rStyle w:val="IndexLink"/>
@@ -1102,7 +1102,7 @@
             </w:tabs>
             <w:rPr/>
           </w:pPr>
-          <w:hyperlink w:anchor="__RefHeading___Toc3684_4179294864" w:tooltip="13.2 Append HMI Desktop">
+          <w:hyperlink w:anchor="__RefHeading___Toc3733_906287577" w:tooltip="13.2 Append HMI Desktop">
             <w:r>
               <w:rPr>
                 <w:rStyle w:val="IndexLink"/>
@@ -1123,7 +1123,7 @@
             </w:tabs>
             <w:rPr/>
           </w:pPr>
-          <w:hyperlink w:anchor="__RefHeading___Toc3686_4179294864" w:tooltip="13.3 Append HMI Web">
+          <w:hyperlink w:anchor="__RefHeading___Toc3735_906287577" w:tooltip="13.3 Append HMI Web">
             <w:r>
               <w:rPr>
                 <w:rStyle w:val="IndexLink"/>
@@ -1144,7 +1144,7 @@
             </w:tabs>
             <w:rPr/>
           </w:pPr>
-          <w:hyperlink w:anchor="__RefHeading___Toc3688_4179294864" w:tooltip="14 Tips and troubleshooting">
+          <w:hyperlink w:anchor="__RefHeading___Toc3737_906287577" w:tooltip="14 Tips and troubleshooting">
             <w:r>
               <w:rPr>
                 <w:rStyle w:val="IndexLink"/>
@@ -1165,7 +1165,7 @@
             </w:tabs>
             <w:rPr/>
           </w:pPr>
-          <w:hyperlink w:anchor="__RefHeading___Toc3690_4179294864" w:tooltip="Appendix A Command-line automation">
+          <w:hyperlink w:anchor="__RefHeading___Toc3739_906287577" w:tooltip="Appendix A Command-line automation">
             <w:r>
               <w:rPr>
                 <w:rStyle w:val="IndexLink"/>
@@ -1203,7 +1203,7 @@
         <w:spacing w:before="0" w:after="0"/>
         <w:rPr/>
       </w:pPr>
-      <w:bookmarkStart w:id="0" w:name="__RefHeading___Toc3606_4179294864"/>
+      <w:bookmarkStart w:id="0" w:name="__RefHeading___Toc3655_906287577"/>
       <w:bookmarkEnd w:id="0"/>
       <w:r>
         <w:rPr/>
@@ -1904,7 +1904,7 @@
         <w:pStyle w:val="Heading2"/>
         <w:rPr/>
       </w:pPr>
-      <w:bookmarkStart w:id="1" w:name="__RefHeading___Toc3608_4179294864"/>
+      <w:bookmarkStart w:id="1" w:name="__RefHeading___Toc3657_906287577"/>
       <w:bookmarkEnd w:id="1"/>
       <w:r>
         <w:rPr/>
@@ -2047,7 +2047,7 @@
         <w:pStyle w:val="Heading1"/>
         <w:rPr/>
       </w:pPr>
-      <w:bookmarkStart w:id="2" w:name="__RefHeading___Toc3610_4179294864"/>
+      <w:bookmarkStart w:id="2" w:name="__RefHeading___Toc3659_906287577"/>
       <w:bookmarkEnd w:id="2"/>
       <w:r>
         <w:rPr/>
@@ -2625,7 +2625,7 @@
         <w:pStyle w:val="Heading2"/>
         <w:rPr/>
       </w:pPr>
-      <w:bookmarkStart w:id="3" w:name="__RefHeading___Toc3612_4179294864"/>
+      <w:bookmarkStart w:id="3" w:name="__RefHeading___Toc3661_906287577"/>
       <w:bookmarkEnd w:id="3"/>
       <w:r>
         <w:rPr/>
@@ -3665,7 +3665,7 @@
         <w:pStyle w:val="Heading1"/>
         <w:rPr/>
       </w:pPr>
-      <w:bookmarkStart w:id="4" w:name="__RefHeading___Toc3614_4179294864"/>
+      <w:bookmarkStart w:id="4" w:name="__RefHeading___Toc3663_906287577"/>
       <w:bookmarkEnd w:id="4"/>
       <w:r>
         <w:rPr/>
@@ -3950,7 +3950,7 @@
         <w:pStyle w:val="Heading1"/>
         <w:rPr/>
       </w:pPr>
-      <w:bookmarkStart w:id="5" w:name="__RefHeading___Toc3616_4179294864"/>
+      <w:bookmarkStart w:id="5" w:name="__RefHeading___Toc3665_906287577"/>
       <w:bookmarkEnd w:id="5"/>
       <w:r>
         <w:rPr/>
@@ -4745,7 +4745,7 @@
         <w:pStyle w:val="Heading1"/>
         <w:rPr/>
       </w:pPr>
-      <w:bookmarkStart w:id="6" w:name="__RefHeading___Toc3618_4179294864"/>
+      <w:bookmarkStart w:id="6" w:name="__RefHeading___Toc3667_906287577"/>
       <w:bookmarkEnd w:id="6"/>
       <w:r>
         <w:rPr/>
@@ -5576,7 +5576,7 @@
         <w:pStyle w:val="Heading2"/>
         <w:rPr/>
       </w:pPr>
-      <w:bookmarkStart w:id="7" w:name="__RefHeading___Toc3620_4179294864"/>
+      <w:bookmarkStart w:id="7" w:name="__RefHeading___Toc3669_906287577"/>
       <w:bookmarkEnd w:id="7"/>
       <w:r>
         <w:rPr/>
@@ -6229,7 +6229,7 @@
         <w:pStyle w:val="Heading2"/>
         <w:rPr/>
       </w:pPr>
-      <w:bookmarkStart w:id="8" w:name="__RefHeading___Toc3622_4179294864"/>
+      <w:bookmarkStart w:id="8" w:name="__RefHeading___Toc3671_906287577"/>
       <w:bookmarkEnd w:id="8"/>
       <w:r>
         <w:rPr/>
@@ -6364,7 +6364,7 @@
         <w:pStyle w:val="Heading1"/>
         <w:rPr/>
       </w:pPr>
-      <w:bookmarkStart w:id="9" w:name="__RefHeading___Toc3624_4179294864"/>
+      <w:bookmarkStart w:id="9" w:name="__RefHeading___Toc3673_906287577"/>
       <w:bookmarkEnd w:id="9"/>
       <w:r>
         <w:rPr/>
@@ -6877,7 +6877,7 @@
         <w:pStyle w:val="Heading2"/>
         <w:rPr/>
       </w:pPr>
-      <w:bookmarkStart w:id="10" w:name="__RefHeading___Toc3626_4179294864"/>
+      <w:bookmarkStart w:id="10" w:name="__RefHeading___Toc3675_906287577"/>
       <w:bookmarkEnd w:id="10"/>
       <w:r>
         <w:rPr/>
@@ -7039,7 +7039,7 @@
         <w:pStyle w:val="Heading2"/>
         <w:rPr/>
       </w:pPr>
-      <w:bookmarkStart w:id="11" w:name="__RefHeading___Toc3628_4179294864"/>
+      <w:bookmarkStart w:id="11" w:name="__RefHeading___Toc3677_906287577"/>
       <w:bookmarkEnd w:id="11"/>
       <w:r>
         <w:rPr/>
@@ -7073,7 +7073,18 @@
       </w:r>
       <w:r>
         <w:rPr/>
-        <w:t xml:space="preserve"> link.</w:t>
+        <w:t xml:space="preserve"> link. A script can also open a window with </w:t>
+      </w:r>
+      <w:r>
+        <w:rPr>
+          <w:rFonts w:ascii="Consolas" w:hAnsi="Consolas"/>
+          <w:sz w:val="19"/>
+        </w:rPr>
+        <w:t>ShowWindow</w:t>
+      </w:r>
+      <w:r>
+        <w:rPr/>
+        <w:t xml:space="preserve"> (section 9.3), at another position, and wait for it to close.</w:t>
       </w:r>
       <w:r>
         <w:br w:type="page"/>
@@ -7084,7 +7095,7 @@
         <w:pStyle w:val="Heading1"/>
         <w:rPr/>
       </w:pPr>
-      <w:bookmarkStart w:id="12" w:name="__RefHeading___Toc3630_4179294864"/>
+      <w:bookmarkStart w:id="12" w:name="__RefHeading___Toc3679_906287577"/>
       <w:bookmarkEnd w:id="12"/>
       <w:r>
         <w:rPr/>
@@ -7290,7 +7301,7 @@
         <w:pStyle w:val="Heading1"/>
         <w:rPr/>
       </w:pPr>
-      <w:bookmarkStart w:id="13" w:name="__RefHeading___Toc3632_4179294864"/>
+      <w:bookmarkStart w:id="13" w:name="__RefHeading___Toc3681_906287577"/>
       <w:bookmarkEnd w:id="13"/>
       <w:r>
         <w:rPr/>
@@ -8015,7 +8026,7 @@
         <w:pStyle w:val="Heading2"/>
         <w:rPr/>
       </w:pPr>
-      <w:bookmarkStart w:id="14" w:name="__RefHeading___Toc3634_4179294864"/>
+      <w:bookmarkStart w:id="14" w:name="__RefHeading___Toc3683_906287577"/>
       <w:bookmarkEnd w:id="14"/>
       <w:r>
         <w:rPr/>
@@ -8210,7 +8221,7 @@
         <w:pStyle w:val="Heading2"/>
         <w:rPr/>
       </w:pPr>
-      <w:bookmarkStart w:id="15" w:name="__RefHeading___Toc3636_4179294864"/>
+      <w:bookmarkStart w:id="15" w:name="__RefHeading___Toc3685_906287577"/>
       <w:bookmarkEnd w:id="15"/>
       <w:r>
         <w:rPr/>
@@ -8331,7 +8342,7 @@
         <w:pStyle w:val="Heading2"/>
         <w:rPr/>
       </w:pPr>
-      <w:bookmarkStart w:id="16" w:name="__RefHeading___Toc3638_4179294864"/>
+      <w:bookmarkStart w:id="16" w:name="__RefHeading___Toc3687_906287577"/>
       <w:bookmarkEnd w:id="16"/>
       <w:r>
         <w:rPr/>
@@ -8447,7 +8458,7 @@
         <w:pStyle w:val="Heading2"/>
         <w:rPr/>
       </w:pPr>
-      <w:bookmarkStart w:id="17" w:name="__RefHeading___Toc3640_4179294864"/>
+      <w:bookmarkStart w:id="17" w:name="__RefHeading___Toc3689_906287577"/>
       <w:bookmarkEnd w:id="17"/>
       <w:r>
         <w:rPr/>
@@ -8563,7 +8574,7 @@
         <w:pStyle w:val="Heading2"/>
         <w:rPr/>
       </w:pPr>
-      <w:bookmarkStart w:id="18" w:name="__RefHeading___Toc3642_4179294864"/>
+      <w:bookmarkStart w:id="18" w:name="__RefHeading___Toc3691_906287577"/>
       <w:bookmarkEnd w:id="18"/>
       <w:r>
         <w:rPr/>
@@ -9075,7 +9086,7 @@
         <w:pStyle w:val="Heading1"/>
         <w:rPr/>
       </w:pPr>
-      <w:bookmarkStart w:id="19" w:name="__RefHeading___Toc3644_4179294864"/>
+      <w:bookmarkStart w:id="19" w:name="__RefHeading___Toc3693_906287577"/>
       <w:bookmarkEnd w:id="19"/>
       <w:r>
         <w:rPr/>
@@ -9977,7 +9988,7 @@
         <w:pStyle w:val="Heading2"/>
         <w:rPr/>
       </w:pPr>
-      <w:bookmarkStart w:id="20" w:name="__RefHeading___Toc3646_4179294864"/>
+      <w:bookmarkStart w:id="20" w:name="__RefHeading___Toc3695_906287577"/>
       <w:bookmarkEnd w:id="20"/>
       <w:r>
         <w:rPr/>
@@ -10161,7 +10172,7 @@
         <w:pStyle w:val="Heading2"/>
         <w:rPr/>
       </w:pPr>
-      <w:bookmarkStart w:id="21" w:name="__RefHeading___Toc3648_4179294864"/>
+      <w:bookmarkStart w:id="21" w:name="__RefHeading___Toc3697_906287577"/>
       <w:bookmarkEnd w:id="21"/>
       <w:r>
         <w:rPr/>
@@ -10280,7 +10291,7 @@
         <w:pStyle w:val="Heading2"/>
         <w:rPr/>
       </w:pPr>
-      <w:bookmarkStart w:id="22" w:name="__RefHeading___Toc3650_4179294864"/>
+      <w:bookmarkStart w:id="22" w:name="__RefHeading___Toc3699_906287577"/>
       <w:bookmarkEnd w:id="22"/>
       <w:r>
         <w:rPr/>
@@ -10352,7 +10363,7 @@
         <w:rPr>
           <w:b/>
         </w:rPr>
-        <w:t>Security, indirect tag and recipe functions</w:t>
+        <w:t>Security, indirect tag, window and recipe functions</w:t>
       </w:r>
       <w:r>
         <w:rPr/>
@@ -12497,6 +12508,247 @@
     </w:p>
     <w:p>
       <w:pPr>
+        <w:pStyle w:val="Caption"/>
+        <w:keepNext w:val="true"/>
+        <w:rPr/>
+      </w:pPr>
+      <w:r>
+        <w:rPr/>
+        <w:t>Table 15. Window function (scripts only)</w:t>
+      </w:r>
+    </w:p>
+    <w:tbl>
+      <w:tblPr>
+        <w:tblStyle w:val="TableGrid"/>
+        <w:tblW w:w="9359" w:type="dxa"/>
+        <w:jc w:val="left"/>
+        <w:tblInd w:w="0" w:type="dxa"/>
+        <w:tblLayout w:type="fixed"/>
+        <w:tblCellMar>
+          <w:top w:w="57" w:type="dxa"/>
+          <w:left w:w="180" w:type="dxa"/>
+          <w:bottom w:w="57" w:type="dxa"/>
+          <w:right w:w="180" w:type="dxa"/>
+        </w:tblCellMar>
+        <w:tblLook w:val="04a0" w:noHBand="0" w:noVBand="1" w:firstColumn="1" w:lastRow="0" w:lastColumn="0" w:firstRow="1"/>
+      </w:tblPr>
+      <w:tblGrid>
+        <w:gridCol w:w="2135"/>
+        <w:gridCol w:w="1350"/>
+        <w:gridCol w:w="5874"/>
+      </w:tblGrid>
+      <w:tr>
+        <w:trPr>
+          <w:tblHeader w:val="true"/>
+          <w:cantSplit w:val="true"/>
+        </w:trPr>
+        <w:tc>
+          <w:tcPr>
+            <w:tcW w:w="2135" w:type="dxa"/>
+            <w:tcBorders/>
+            <w:shd w:color="auto" w:fill="D9E2EC" w:val="clear"/>
+          </w:tcPr>
+          <w:p>
+            <w:pPr>
+              <w:pStyle w:val="Normal"/>
+              <w:widowControl/>
+              <w:spacing w:lineRule="auto" w:line="240" w:before="20" w:after="20"/>
+              <w:jc w:val="left"/>
+              <w:rPr>
+                <w:rFonts w:cs=""/>
+                <w:kern w:val="0"/>
+                <w:szCs w:val="22"/>
+                <w:lang w:val="en-US" w:eastAsia="en-US" w:bidi="ar-SA"/>
+              </w:rPr>
+            </w:pPr>
+            <w:r>
+              <w:rPr>
+                <w:rFonts w:cs=""/>
+                <w:b/>
+                <w:kern w:val="0"/>
+                <w:sz w:val="20"/>
+                <w:szCs w:val="22"/>
+                <w:lang w:val="en-US" w:eastAsia="en-US" w:bidi="ar-SA"/>
+              </w:rPr>
+              <w:t>Function</w:t>
+            </w:r>
+          </w:p>
+        </w:tc>
+        <w:tc>
+          <w:tcPr>
+            <w:tcW w:w="1350" w:type="dxa"/>
+            <w:tcBorders/>
+            <w:shd w:color="auto" w:fill="D9E2EC" w:val="clear"/>
+          </w:tcPr>
+          <w:p>
+            <w:pPr>
+              <w:pStyle w:val="Normal"/>
+              <w:widowControl/>
+              <w:spacing w:lineRule="auto" w:line="240" w:before="20" w:after="20"/>
+              <w:jc w:val="left"/>
+              <w:rPr>
+                <w:rFonts w:cs=""/>
+                <w:kern w:val="0"/>
+                <w:szCs w:val="22"/>
+                <w:lang w:val="en-US" w:eastAsia="en-US" w:bidi="ar-SA"/>
+              </w:rPr>
+            </w:pPr>
+            <w:r>
+              <w:rPr>
+                <w:rFonts w:cs=""/>
+                <w:b/>
+                <w:kern w:val="0"/>
+                <w:sz w:val="20"/>
+                <w:szCs w:val="22"/>
+                <w:lang w:val="en-US" w:eastAsia="en-US" w:bidi="ar-SA"/>
+              </w:rPr>
+              <w:t>Arguments</w:t>
+            </w:r>
+          </w:p>
+        </w:tc>
+        <w:tc>
+          <w:tcPr>
+            <w:tcW w:w="5874" w:type="dxa"/>
+            <w:tcBorders/>
+            <w:shd w:color="auto" w:fill="D9E2EC" w:val="clear"/>
+          </w:tcPr>
+          <w:p>
+            <w:pPr>
+              <w:pStyle w:val="Normal"/>
+              <w:widowControl/>
+              <w:spacing w:lineRule="auto" w:line="240" w:before="20" w:after="20"/>
+              <w:jc w:val="left"/>
+              <w:rPr>
+                <w:rFonts w:cs=""/>
+                <w:kern w:val="0"/>
+                <w:szCs w:val="22"/>
+                <w:lang w:val="en-US" w:eastAsia="en-US" w:bidi="ar-SA"/>
+              </w:rPr>
+            </w:pPr>
+            <w:r>
+              <w:rPr>
+                <w:rFonts w:cs=""/>
+                <w:b/>
+                <w:kern w:val="0"/>
+                <w:sz w:val="20"/>
+                <w:szCs w:val="22"/>
+                <w:lang w:val="en-US" w:eastAsia="en-US" w:bidi="ar-SA"/>
+              </w:rPr>
+              <w:t>What it does</w:t>
+            </w:r>
+          </w:p>
+        </w:tc>
+      </w:tr>
+      <w:tr>
+        <w:trPr>
+          <w:cantSplit w:val="true"/>
+        </w:trPr>
+        <w:tc>
+          <w:tcPr>
+            <w:tcW w:w="2135" w:type="dxa"/>
+            <w:tcBorders/>
+          </w:tcPr>
+          <w:p>
+            <w:pPr>
+              <w:pStyle w:val="Normal"/>
+              <w:widowControl/>
+              <w:spacing w:lineRule="auto" w:line="240" w:before="20" w:after="20"/>
+              <w:jc w:val="left"/>
+              <w:rPr>
+                <w:rFonts w:cs=""/>
+                <w:kern w:val="0"/>
+                <w:szCs w:val="22"/>
+                <w:lang w:val="en-US" w:eastAsia="en-US" w:bidi="ar-SA"/>
+              </w:rPr>
+            </w:pPr>
+            <w:r>
+              <w:rPr>
+                <w:rFonts w:cs=""/>
+                <w:b/>
+                <w:kern w:val="0"/>
+                <w:sz w:val="20"/>
+                <w:szCs w:val="22"/>
+                <w:lang w:val="en-US" w:eastAsia="en-US" w:bidi="ar-SA"/>
+              </w:rPr>
+              <w:t>ShowWindow(name, left, top, modal, wait)</w:t>
+            </w:r>
+          </w:p>
+        </w:tc>
+        <w:tc>
+          <w:tcPr>
+            <w:tcW w:w="1350" w:type="dxa"/>
+            <w:tcBorders/>
+          </w:tcPr>
+          <w:p>
+            <w:pPr>
+              <w:pStyle w:val="Normal"/>
+              <w:widowControl/>
+              <w:spacing w:lineRule="auto" w:line="240" w:before="20" w:after="20"/>
+              <w:jc w:val="left"/>
+              <w:rPr>
+                <w:rFonts w:cs=""/>
+                <w:kern w:val="0"/>
+                <w:szCs w:val="22"/>
+                <w:lang w:val="en-US" w:eastAsia="en-US" w:bidi="ar-SA"/>
+              </w:rPr>
+            </w:pPr>
+            <w:r>
+              <w:rPr>
+                <w:rFonts w:cs=""/>
+                <w:kern w:val="0"/>
+                <w:sz w:val="20"/>
+                <w:szCs w:val="22"/>
+                <w:lang w:val="en-US" w:eastAsia="en-US" w:bidi="ar-SA"/>
+              </w:rPr>
+              <w:t>name</w:t>
+              <w:br/>
+              <w:t>left, top, modal, wait: optional</w:t>
+            </w:r>
+          </w:p>
+        </w:tc>
+        <w:tc>
+          <w:tcPr>
+            <w:tcW w:w="5874" w:type="dxa"/>
+            <w:tcBorders/>
+          </w:tcPr>
+          <w:p>
+            <w:pPr>
+              <w:pStyle w:val="Normal"/>
+              <w:widowControl/>
+              <w:spacing w:lineRule="auto" w:line="240" w:before="20" w:after="20"/>
+              <w:jc w:val="left"/>
+              <w:rPr>
+                <w:rFonts w:cs=""/>
+                <w:kern w:val="0"/>
+                <w:szCs w:val="22"/>
+                <w:lang w:val="en-US" w:eastAsia="en-US" w:bidi="ar-SA"/>
+              </w:rPr>
+            </w:pPr>
+            <w:r>
+              <w:rPr>
+                <w:rFonts w:cs=""/>
+                <w:kern w:val="0"/>
+                <w:sz w:val="20"/>
+                <w:szCs w:val="22"/>
+                <w:lang w:val="en-US" w:eastAsia="en-US" w:bidi="ar-SA"/>
+              </w:rPr>
+              <w:t>Opens the window (page) named by name (text), as a Show Window link does. left and top (screen pixels; "" keeps the window's own) move it for this showing; it still shows the same part of its page. modal (0 or 1) overrides a popup's modality: with 0 the windows beneath can still be touched. With wait 1 the script pauses until the window closes, so it can act on the operator's choice; by default it carries on at once. Like ShowRecipeSelect it must be a statement on its own or the whole right side of an assignment. Returns 1, or 0 with a Window Error window when the name is unknown, a position is not a number or the window would be off the screen</w:t>
+            </w:r>
+          </w:p>
+        </w:tc>
+      </w:tr>
+    </w:tbl>
+    <w:p>
+      <w:pPr>
+        <w:pStyle w:val="Normal"/>
+        <w:rPr/>
+      </w:pPr>
+      <w:r>
+        <w:rPr/>
+      </w:r>
+    </w:p>
+    <w:p>
+      <w:pPr>
         <w:pStyle w:val="Normal"/>
         <w:rPr/>
       </w:pPr>
@@ -12545,7 +12797,7 @@
       </w:pPr>
       <w:r>
         <w:rPr/>
-        <w:t>Table 15. Recipe functions (scripts only)</w:t>
+        <w:t>Table 16. Recipe functions (scripts only)</w:t>
       </w:r>
     </w:p>
     <w:tbl>
@@ -13577,13 +13829,16 @@
         <w:rPr/>
         <w:t>The recipe functions other than ShowRecipeSelect return 1 when they succeed and 0 when they fail. A failure also opens the Recipe Error window (section 11.5).</w:t>
       </w:r>
+      <w:r>
+        <w:br w:type="page"/>
+      </w:r>
     </w:p>
     <w:p>
       <w:pPr>
         <w:pStyle w:val="Heading2"/>
         <w:rPr/>
       </w:pPr>
-      <w:bookmarkStart w:id="23" w:name="__RefHeading___Toc3652_4179294864"/>
+      <w:bookmarkStart w:id="23" w:name="__RefHeading___Toc3701_906287577"/>
       <w:bookmarkEnd w:id="23"/>
       <w:r>
         <w:rPr/>
@@ -14398,23 +14653,17 @@
         <w:rPr/>
         <w:t xml:space="preserve"> while SV-100 is shown. Before the first link an indirect tag has bad quality and writes to it are ignored.</w:t>
       </w:r>
-      <w:r>
-        <w:br w:type="page"/>
-      </w:r>
     </w:p>
     <w:p>
       <w:pPr>
         <w:pStyle w:val="Heading1"/>
         <w:rPr/>
       </w:pPr>
-      <w:bookmarkStart w:id="24" w:name="__RefHeading___Toc3654_4179294864"/>
+      <w:bookmarkStart w:id="24" w:name="__RefHeading___Toc3703_906287577"/>
       <w:bookmarkEnd w:id="24"/>
       <w:r>
         <w:rPr/>
         <w:t>10  Alarms and security</w:t>
-      </w:r>
-      <w:r>
-        <w:br w:type="page"/>
       </w:r>
     </w:p>
     <w:p>
@@ -14422,7 +14671,7 @@
         <w:pStyle w:val="Heading2"/>
         <w:rPr/>
       </w:pPr>
-      <w:bookmarkStart w:id="25" w:name="__RefHeading___Toc3656_4179294864"/>
+      <w:bookmarkStart w:id="25" w:name="__RefHeading___Toc3705_906287577"/>
       <w:bookmarkEnd w:id="25"/>
       <w:r>
         <w:rPr/>
@@ -14546,13 +14795,16 @@
         <w:rPr/>
         <w:t>Every alarm event is written to a daily history file kept for 90 days; the Alarm History object shows it (Figure 38).</w:t>
       </w:r>
+      <w:r>
+        <w:br w:type="page"/>
+      </w:r>
     </w:p>
     <w:p>
       <w:pPr>
         <w:pStyle w:val="Heading2"/>
         <w:rPr/>
       </w:pPr>
-      <w:bookmarkStart w:id="26" w:name="__RefHeading___Toc3658_4179294864"/>
+      <w:bookmarkStart w:id="26" w:name="__RefHeading___Toc3707_906287577"/>
       <w:bookmarkEnd w:id="26"/>
       <w:r>
         <w:rPr/>
@@ -14647,7 +14899,7 @@
       </w:pPr>
       <w:r>
         <w:rPr/>
-        <w:t>Table 16. LiquidWeighHMI users</w:t>
+        <w:t>Table 17. LiquidWeighHMI users</w:t>
       </w:r>
     </w:p>
     <w:tbl>
@@ -15242,7 +15494,7 @@
         <w:pStyle w:val="Heading1"/>
         <w:rPr/>
       </w:pPr>
-      <w:bookmarkStart w:id="27" w:name="__RefHeading___Toc3660_4179294864"/>
+      <w:bookmarkStart w:id="27" w:name="__RefHeading___Toc3709_906287577"/>
       <w:bookmarkEnd w:id="27"/>
       <w:r>
         <w:rPr/>
@@ -15372,16 +15624,13 @@
         <w:rPr/>
         <w:t>Keeping the edited values in memory tags means the operator can prepare a recipe without disturbing the PLC, and send it with one Download when the process is ready.</w:t>
       </w:r>
-      <w:r>
-        <w:br w:type="page"/>
-      </w:r>
     </w:p>
     <w:p>
       <w:pPr>
         <w:pStyle w:val="Heading2"/>
         <w:rPr/>
       </w:pPr>
-      <w:bookmarkStart w:id="28" w:name="__RefHeading___Toc3662_4179294864"/>
+      <w:bookmarkStart w:id="28" w:name="__RefHeading___Toc3711_906287577"/>
       <w:bookmarkEnd w:id="28"/>
       <w:r>
         <w:rPr/>
@@ -15636,7 +15885,7 @@
       </w:pPr>
       <w:r>
         <w:rPr/>
-        <w:t>Table 17. The tags of the Plasticizer Blends book</w:t>
+        <w:t>Table 18. The tags of the Plasticizer Blends book</w:t>
       </w:r>
     </w:p>
     <w:tbl>
@@ -16253,7 +16502,7 @@
       </w:pPr>
       <w:r>
         <w:rPr/>
-        <w:t>Table 18. LiquidWeighHMI's starting recipes</w:t>
+        <w:t>Table 19. LiquidWeighHMI's starting recipes</w:t>
       </w:r>
     </w:p>
     <w:tbl>
@@ -17242,7 +17491,7 @@
         <w:pStyle w:val="Heading2"/>
         <w:rPr/>
       </w:pPr>
-      <w:bookmarkStart w:id="29" w:name="__RefHeading___Toc3664_4179294864"/>
+      <w:bookmarkStart w:id="29" w:name="__RefHeading___Toc3713_906287577"/>
       <w:bookmarkEnd w:id="29"/>
       <w:r>
         <w:rPr/>
@@ -17429,7 +17678,7 @@
       </w:pPr>
       <w:r>
         <w:rPr/>
-        <w:t>Table 19. The Recipes screen's buttons</w:t>
+        <w:t>Table 20. The Recipes screen's buttons</w:t>
       </w:r>
     </w:p>
     <w:tbl>
@@ -18692,7 +18941,7 @@
         <w:pStyle w:val="Heading2"/>
         <w:rPr/>
       </w:pPr>
-      <w:bookmarkStart w:id="30" w:name="__RefHeading___Toc3666_4179294864"/>
+      <w:bookmarkStart w:id="30" w:name="__RefHeading___Toc3715_906287577"/>
       <w:bookmarkEnd w:id="30"/>
       <w:r>
         <w:rPr/>
@@ -18783,7 +19032,7 @@
       </w:pPr>
       <w:r>
         <w:rPr/>
-        <w:t>Table 20. Recipe List settings</w:t>
+        <w:t>Table 21. Recipe List settings</w:t>
       </w:r>
     </w:p>
     <w:tbl>
@@ -19233,7 +19482,7 @@
         <w:pStyle w:val="Heading2"/>
         <w:rPr/>
       </w:pPr>
-      <w:bookmarkStart w:id="31" w:name="__RefHeading___Toc3668_4179294864"/>
+      <w:bookmarkStart w:id="31" w:name="__RefHeading___Toc3717_906287577"/>
       <w:bookmarkEnd w:id="31"/>
       <w:r>
         <w:rPr/>
@@ -19518,7 +19767,7 @@
         <w:pStyle w:val="Heading2"/>
         <w:rPr/>
       </w:pPr>
-      <w:bookmarkStart w:id="32" w:name="__RefHeading___Toc3670_4179294864"/>
+      <w:bookmarkStart w:id="32" w:name="__RefHeading___Toc3719_906287577"/>
       <w:bookmarkEnd w:id="32"/>
       <w:r>
         <w:rPr/>
@@ -19676,7 +19925,7 @@
         <w:pStyle w:val="Heading2"/>
         <w:rPr/>
       </w:pPr>
-      <w:bookmarkStart w:id="33" w:name="__RefHeading___Toc3672_4179294864"/>
+      <w:bookmarkStart w:id="33" w:name="__RefHeading___Toc3721_906287577"/>
       <w:bookmarkEnd w:id="33"/>
       <w:r>
         <w:rPr/>
@@ -19701,7 +19950,7 @@
       </w:pPr>
       <w:r>
         <w:rPr/>
-        <w:t>Table 21. Where saved recipes are kept</w:t>
+        <w:t>Table 22. Where saved recipes are kept</w:t>
       </w:r>
     </w:p>
     <w:tbl>
@@ -20076,7 +20325,7 @@
         <w:pStyle w:val="Heading1"/>
         <w:rPr/>
       </w:pPr>
-      <w:bookmarkStart w:id="34" w:name="__RefHeading___Toc3674_4179294864"/>
+      <w:bookmarkStart w:id="34" w:name="__RefHeading___Toc3723_906287577"/>
       <w:bookmarkEnd w:id="34"/>
       <w:r>
         <w:rPr/>
@@ -20088,7 +20337,7 @@
         <w:pStyle w:val="Heading2"/>
         <w:rPr/>
       </w:pPr>
-      <w:bookmarkStart w:id="35" w:name="__RefHeading___Toc3676_4179294864"/>
+      <w:bookmarkStart w:id="35" w:name="__RefHeading___Toc3725_906287577"/>
       <w:bookmarkEnd w:id="35"/>
       <w:r>
         <w:rPr/>
@@ -20176,7 +20425,7 @@
         <w:pStyle w:val="Heading2"/>
         <w:rPr/>
       </w:pPr>
-      <w:bookmarkStart w:id="36" w:name="__RefHeading___Toc3678_4179294864"/>
+      <w:bookmarkStart w:id="36" w:name="__RefHeading___Toc3727_906287577"/>
       <w:bookmarkEnd w:id="36"/>
       <w:r>
         <w:rPr/>
@@ -20722,7 +20971,7 @@
         <w:pStyle w:val="Heading1"/>
         <w:rPr/>
       </w:pPr>
-      <w:bookmarkStart w:id="37" w:name="__RefHeading___Toc3680_4179294864"/>
+      <w:bookmarkStart w:id="37" w:name="__RefHeading___Toc3729_906287577"/>
       <w:bookmarkEnd w:id="37"/>
       <w:r>
         <w:rPr/>
@@ -20747,7 +20996,7 @@
       </w:pPr>
       <w:r>
         <w:rPr/>
-        <w:t>Table 22. Deployment options</w:t>
+        <w:t>Table 23. Deployment options</w:t>
       </w:r>
     </w:p>
     <w:tbl>
@@ -21175,7 +21424,7 @@
         <w:pStyle w:val="Heading2"/>
         <w:rPr/>
       </w:pPr>
-      <w:bookmarkStart w:id="38" w:name="__RefHeading___Toc3682_4179294864"/>
+      <w:bookmarkStart w:id="38" w:name="__RefHeading___Toc3731_906287577"/>
       <w:bookmarkEnd w:id="38"/>
       <w:r>
         <w:rPr/>
@@ -21263,7 +21512,7 @@
         <w:pStyle w:val="Heading2"/>
         <w:rPr/>
       </w:pPr>
-      <w:bookmarkStart w:id="39" w:name="__RefHeading___Toc3684_4179294864"/>
+      <w:bookmarkStart w:id="39" w:name="__RefHeading___Toc3733_906287577"/>
       <w:bookmarkEnd w:id="39"/>
       <w:r>
         <w:rPr/>
@@ -21376,7 +21625,7 @@
         <w:pStyle w:val="Heading2"/>
         <w:rPr/>
       </w:pPr>
-      <w:bookmarkStart w:id="40" w:name="__RefHeading___Toc3686_4179294864"/>
+      <w:bookmarkStart w:id="40" w:name="__RefHeading___Toc3735_906287577"/>
       <w:bookmarkEnd w:id="40"/>
       <w:r>
         <w:rPr/>
@@ -21589,7 +21838,7 @@
         <w:pStyle w:val="Heading1"/>
         <w:rPr/>
       </w:pPr>
-      <w:bookmarkStart w:id="41" w:name="__RefHeading___Toc3688_4179294864"/>
+      <w:bookmarkStart w:id="41" w:name="__RefHeading___Toc3737_906287577"/>
       <w:bookmarkEnd w:id="41"/>
       <w:r>
         <w:rPr/>
@@ -21604,7 +21853,7 @@
       </w:pPr>
       <w:r>
         <w:rPr/>
-        <w:t>Table 23. Common problems</w:t>
+        <w:t>Table 24. Common problems</w:t>
       </w:r>
     </w:p>
     <w:tbl>
@@ -22249,7 +22498,7 @@
         <w:pStyle w:val="Heading1"/>
         <w:rPr/>
       </w:pPr>
-      <w:bookmarkStart w:id="42" w:name="__RefHeading___Toc3690_4179294864"/>
+      <w:bookmarkStart w:id="42" w:name="__RefHeading___Toc3739_906287577"/>
       <w:bookmarkEnd w:id="42"/>
       <w:r>
         <w:rPr/>
@@ -22274,7 +22523,7 @@
       </w:pPr>
       <w:r>
         <w:rPr/>
-        <w:t>Table 24. Command-line modes</w:t>
+        <w:t>Table 25. Command-line modes</w:t>
       </w:r>
     </w:p>
     <w:tbl>

</xml_diff>

<commit_message>
docs(example): ShowWindow in LiquidWeighHMI and the User Manual
The valve and pump symbols open the Device Faceplate with
ShowWindow("Device Faceplate", left, top) beside the symbol touched, and
ABORT opens Confirm Abort with wait and aborts only if YES set
AbortConfirmed. Manual section 9.5 shows both; chapters 6 and 8 and the
faceplate figures follow.

Co-Authored-By: Claude Opus 5.5 <noreply@anthropic.com>
</commit_message>
<xml_diff>
--- a/doc/Append-HMI-Studio-User-Manual.docx
+++ b/doc/Append-HMI-Studio-User-Manual.docx
@@ -283,7 +283,7 @@
             </w:rPr>
             <w:fldChar w:fldCharType="separate"/>
           </w:r>
-          <w:hyperlink w:anchor="__RefHeading___Toc3655_3507643775" w:tooltip="1 Introduction">
+          <w:hyperlink w:anchor="__RefHeading___Toc3689_1782117212" w:tooltip="1 Introduction">
             <w:r>
               <w:rPr>
                 <w:rStyle w:val="IndexLink"/>
@@ -304,7 +304,7 @@
             </w:tabs>
             <w:rPr/>
           </w:pPr>
-          <w:hyperlink w:anchor="__RefHeading___Toc3657_3507643775" w:tooltip="1.1 How an HMI application is organized">
+          <w:hyperlink w:anchor="__RefHeading___Toc3691_1782117212" w:tooltip="1.1 How an HMI application is organized">
             <w:r>
               <w:rPr>
                 <w:rStyle w:val="IndexLink"/>
@@ -325,7 +325,7 @@
             </w:tabs>
             <w:rPr/>
           </w:pPr>
-          <w:hyperlink w:anchor="__RefHeading___Toc3659_3507643775" w:tooltip="2 The Studio window">
+          <w:hyperlink w:anchor="__RefHeading___Toc3693_1782117212" w:tooltip="2 The Studio window">
             <w:r>
               <w:rPr>
                 <w:rStyle w:val="IndexLink"/>
@@ -346,7 +346,7 @@
             </w:tabs>
             <w:rPr/>
           </w:pPr>
-          <w:hyperlink w:anchor="__RefHeading___Toc3661_3507643775" w:tooltip="2.1 The HMI menu">
+          <w:hyperlink w:anchor="__RefHeading___Toc3695_1782117212" w:tooltip="2.1 The HMI menu">
             <w:r>
               <w:rPr>
                 <w:rStyle w:val="IndexLink"/>
@@ -367,7 +367,7 @@
             </w:tabs>
             <w:rPr/>
           </w:pPr>
-          <w:hyperlink w:anchor="__RefHeading___Toc3663_3507643775" w:tooltip="3 Application settings">
+          <w:hyperlink w:anchor="__RefHeading___Toc3697_1782117212" w:tooltip="3 Application settings">
             <w:r>
               <w:rPr>
                 <w:rStyle w:val="IndexLink"/>
@@ -388,7 +388,7 @@
             </w:tabs>
             <w:rPr/>
           </w:pPr>
-          <w:hyperlink w:anchor="__RefHeading___Toc3665_3507643775" w:tooltip="4 Devices">
+          <w:hyperlink w:anchor="__RefHeading___Toc3699_1782117212" w:tooltip="4 Devices">
             <w:r>
               <w:rPr>
                 <w:rStyle w:val="IndexLink"/>
@@ -409,7 +409,7 @@
             </w:tabs>
             <w:rPr/>
           </w:pPr>
-          <w:hyperlink w:anchor="__RefHeading___Toc3667_3507643775" w:tooltip="5 Tags">
+          <w:hyperlink w:anchor="__RefHeading___Toc3701_1782117212" w:tooltip="5 Tags">
             <w:r>
               <w:rPr>
                 <w:rStyle w:val="IndexLink"/>
@@ -430,7 +430,7 @@
             </w:tabs>
             <w:rPr/>
           </w:pPr>
-          <w:hyperlink w:anchor="__RefHeading___Toc3669_3507643775" w:tooltip="5.1 Tag fields">
+          <w:hyperlink w:anchor="__RefHeading___Toc3703_1782117212" w:tooltip="5.1 Tag fields">
             <w:r>
               <w:rPr>
                 <w:rStyle w:val="IndexLink"/>
@@ -451,7 +451,7 @@
             </w:tabs>
             <w:rPr/>
           </w:pPr>
-          <w:hyperlink w:anchor="__RefHeading___Toc3671_3507643775" w:tooltip="5.2 Alarms on a tag">
+          <w:hyperlink w:anchor="__RefHeading___Toc3705_1782117212" w:tooltip="5.2 Alarms on a tag">
             <w:r>
               <w:rPr>
                 <w:rStyle w:val="IndexLink"/>
@@ -472,7 +472,7 @@
             </w:tabs>
             <w:rPr/>
           </w:pPr>
-          <w:hyperlink w:anchor="__RefHeading___Toc3673_3507643775" w:tooltip="6 Screens and windows">
+          <w:hyperlink w:anchor="__RefHeading___Toc3707_1782117212" w:tooltip="6 Screens and windows">
             <w:r>
               <w:rPr>
                 <w:rStyle w:val="IndexLink"/>
@@ -493,7 +493,7 @@
             </w:tabs>
             <w:rPr/>
           </w:pPr>
-          <w:hyperlink w:anchor="__RefHeading___Toc3675_3507643775" w:tooltip="6.1 Window properties">
+          <w:hyperlink w:anchor="__RefHeading___Toc3709_1782117212" w:tooltip="6.1 Window properties">
             <w:r>
               <w:rPr>
                 <w:rStyle w:val="IndexLink"/>
@@ -514,7 +514,7 @@
             </w:tabs>
             <w:rPr/>
           </w:pPr>
-          <w:hyperlink w:anchor="__RefHeading___Toc3677_3507643775" w:tooltip="6.2 Navigation">
+          <w:hyperlink w:anchor="__RefHeading___Toc3711_1782117212" w:tooltip="6.2 Navigation">
             <w:r>
               <w:rPr>
                 <w:rStyle w:val="IndexLink"/>
@@ -535,7 +535,7 @@
             </w:tabs>
             <w:rPr/>
           </w:pPr>
-          <w:hyperlink w:anchor="__RefHeading___Toc3679_3507643775" w:tooltip="7 Drawing objects">
+          <w:hyperlink w:anchor="__RefHeading___Toc3713_1782117212" w:tooltip="7 Drawing objects">
             <w:r>
               <w:rPr>
                 <w:rStyle w:val="IndexLink"/>
@@ -556,7 +556,7 @@
             </w:tabs>
             <w:rPr/>
           </w:pPr>
-          <w:hyperlink w:anchor="__RefHeading___Toc3681_3507643775" w:tooltip="8 Animation links">
+          <w:hyperlink w:anchor="__RefHeading___Toc3715_1782117212" w:tooltip="8 Animation links">
             <w:r>
               <w:rPr>
                 <w:rStyle w:val="IndexLink"/>
@@ -577,7 +577,7 @@
             </w:tabs>
             <w:rPr/>
           </w:pPr>
-          <w:hyperlink w:anchor="__RefHeading___Toc3683_3507643775" w:tooltip="8.1 A valve: status color, fault blink and faceplate">
+          <w:hyperlink w:anchor="__RefHeading___Toc3717_1782117212" w:tooltip="8.1 A valve: status color, fault blink and faceplate">
             <w:r>
               <w:rPr>
                 <w:rStyle w:val="IndexLink"/>
@@ -598,7 +598,7 @@
             </w:tabs>
             <w:rPr/>
           </w:pPr>
-          <w:hyperlink w:anchor="__RefHeading___Toc3685_3507643775" w:tooltip="8.2 The weigh hopper: percent fill">
+          <w:hyperlink w:anchor="__RefHeading___Toc3719_1782117212" w:tooltip="8.2 The weigh hopper: percent fill">
             <w:r>
               <w:rPr>
                 <w:rStyle w:val="IndexLink"/>
@@ -619,7 +619,7 @@
             </w:tabs>
             <w:rPr/>
           </w:pPr>
-          <w:hyperlink w:anchor="__RefHeading___Toc3687_3507643775" w:tooltip="8.3 Hopper pressure: value display and alarm colors">
+          <w:hyperlink w:anchor="__RefHeading___Toc3721_1782117212" w:tooltip="8.3 Hopper pressure: value display and alarm colors">
             <w:r>
               <w:rPr>
                 <w:rStyle w:val="IndexLink"/>
@@ -640,7 +640,7 @@
             </w:tabs>
             <w:rPr/>
           </w:pPr>
-          <w:hyperlink w:anchor="__RefHeading___Toc3689_3507643775" w:tooltip="8.4 Setpoints: user input">
+          <w:hyperlink w:anchor="__RefHeading___Toc3723_1782117212" w:tooltip="8.4 Setpoints: user input">
             <w:r>
               <w:rPr>
                 <w:rStyle w:val="IndexLink"/>
@@ -661,7 +661,7 @@
             </w:tabs>
             <w:rPr/>
           </w:pPr>
-          <w:hyperlink w:anchor="__RefHeading___Toc3691_3507643775" w:tooltip="8.5 Commands: pushbutton and enable">
+          <w:hyperlink w:anchor="__RefHeading___Toc3725_1782117212" w:tooltip="8.5 Commands: pushbutton and enable">
             <w:r>
               <w:rPr>
                 <w:rStyle w:val="IndexLink"/>
@@ -682,7 +682,7 @@
             </w:tabs>
             <w:rPr/>
           </w:pPr>
-          <w:hyperlink w:anchor="__RefHeading___Toc3693_3507643775" w:tooltip="9 Expressions and scripts">
+          <w:hyperlink w:anchor="__RefHeading___Toc3727_1782117212" w:tooltip="9 Expressions and scripts">
             <w:r>
               <w:rPr>
                 <w:rStyle w:val="IndexLink"/>
@@ -703,7 +703,7 @@
             </w:tabs>
             <w:rPr/>
           </w:pPr>
-          <w:hyperlink w:anchor="__RefHeading___Toc3695_3507643775" w:tooltip="9.1 Window scripts">
+          <w:hyperlink w:anchor="__RefHeading___Toc3729_1782117212" w:tooltip="9.1 Window scripts">
             <w:r>
               <w:rPr>
                 <w:rStyle w:val="IndexLink"/>
@@ -724,7 +724,7 @@
             </w:tabs>
             <w:rPr/>
           </w:pPr>
-          <w:hyperlink w:anchor="__RefHeading___Toc3697_3507643775" w:tooltip="9.2 Action scripts">
+          <w:hyperlink w:anchor="__RefHeading___Toc3731_1782117212" w:tooltip="9.2 Action scripts">
             <w:r>
               <w:rPr>
                 <w:rStyle w:val="IndexLink"/>
@@ -745,7 +745,7 @@
             </w:tabs>
             <w:rPr/>
           </w:pPr>
-          <w:hyperlink w:anchor="__RefHeading___Toc3699_3507643775" w:tooltip="9.3 Function reference">
+          <w:hyperlink w:anchor="__RefHeading___Toc3733_1782117212" w:tooltip="9.3 Function reference">
             <w:r>
               <w:rPr>
                 <w:rStyle w:val="IndexLink"/>
@@ -766,7 +766,7 @@
             </w:tabs>
             <w:rPr/>
           </w:pPr>
-          <w:hyperlink w:anchor="__RefHeading___Toc3701_3507643775" w:tooltip="9.4 Indirect tags: one faceplate for every device">
+          <w:hyperlink w:anchor="__RefHeading___Toc3735_1782117212" w:tooltip="9.4 Indirect tags: one faceplate for every device">
             <w:r>
               <w:rPr>
                 <w:rStyle w:val="IndexLink"/>
@@ -775,6 +775,27 @@
               <w:t>9.4 Indirect tags: one faceplate for every device</w:t>
               <w:tab/>
               <w:t>29</w:t>
+            </w:r>
+          </w:hyperlink>
+        </w:p>
+        <w:p>
+          <w:pPr>
+            <w:pStyle w:val="TOC2"/>
+            <w:tabs>
+              <w:tab w:val="clear" w:pos="9077"/>
+              <w:tab w:val="right" w:pos="9359" w:leader="dot"/>
+            </w:tabs>
+            <w:rPr/>
+          </w:pPr>
+          <w:hyperlink w:anchor="__RefHeading___Toc3737_1782117212" w:tooltip="9.5 Opening windows from scripts: ShowWindow">
+            <w:r>
+              <w:rPr>
+                <w:rStyle w:val="IndexLink"/>
+                <w:webHidden/>
+              </w:rPr>
+              <w:t>9.5 Opening windows from scripts: ShowWindow</w:t>
+              <w:tab/>
+              <w:t>30</w:t>
             </w:r>
           </w:hyperlink>
         </w:p>
@@ -787,7 +808,7 @@
             </w:tabs>
             <w:rPr/>
           </w:pPr>
-          <w:hyperlink w:anchor="__RefHeading___Toc3703_3507643775" w:tooltip="10 Alarms and security">
+          <w:hyperlink w:anchor="__RefHeading___Toc3739_1782117212" w:tooltip="10 Alarms and security">
             <w:r>
               <w:rPr>
                 <w:rStyle w:val="IndexLink"/>
@@ -795,7 +816,7 @@
               </w:rPr>
               <w:t>10 Alarms and security</w:t>
               <w:tab/>
-              <w:t>30</w:t>
+              <w:t>32</w:t>
             </w:r>
           </w:hyperlink>
         </w:p>
@@ -808,7 +829,7 @@
             </w:tabs>
             <w:rPr/>
           </w:pPr>
-          <w:hyperlink w:anchor="__RefHeading___Toc3705_3507643775" w:tooltip="10.1 Alarms">
+          <w:hyperlink w:anchor="__RefHeading___Toc3741_1782117212" w:tooltip="10.1 Alarms">
             <w:r>
               <w:rPr>
                 <w:rStyle w:val="IndexLink"/>
@@ -816,7 +837,7 @@
               </w:rPr>
               <w:t>10.1 Alarms</w:t>
               <w:tab/>
-              <w:t>30</w:t>
+              <w:t>32</w:t>
             </w:r>
           </w:hyperlink>
         </w:p>
@@ -829,7 +850,7 @@
             </w:tabs>
             <w:rPr/>
           </w:pPr>
-          <w:hyperlink w:anchor="__RefHeading___Toc3707_3507643775" w:tooltip="10.2 Users and access levels">
+          <w:hyperlink w:anchor="__RefHeading___Toc3743_1782117212" w:tooltip="10.2 Users and access levels">
             <w:r>
               <w:rPr>
                 <w:rStyle w:val="IndexLink"/>
@@ -837,7 +858,7 @@
               </w:rPr>
               <w:t>10.2 Users and access levels</w:t>
               <w:tab/>
-              <w:t>31</w:t>
+              <w:t>33</w:t>
             </w:r>
           </w:hyperlink>
         </w:p>
@@ -850,7 +871,7 @@
             </w:tabs>
             <w:rPr/>
           </w:pPr>
-          <w:hyperlink w:anchor="__RefHeading___Toc3709_3507643775" w:tooltip="11 Recipes">
+          <w:hyperlink w:anchor="__RefHeading___Toc3745_1782117212" w:tooltip="11 Recipes">
             <w:r>
               <w:rPr>
                 <w:rStyle w:val="IndexLink"/>
@@ -858,7 +879,7 @@
               </w:rPr>
               <w:t>11 Recipes</w:t>
               <w:tab/>
-              <w:t>32</w:t>
+              <w:t>34</w:t>
             </w:r>
           </w:hyperlink>
         </w:p>
@@ -871,7 +892,7 @@
             </w:tabs>
             <w:rPr/>
           </w:pPr>
-          <w:hyperlink w:anchor="__RefHeading___Toc3711_3507643775" w:tooltip="11.1 Recipe books">
+          <w:hyperlink w:anchor="__RefHeading___Toc3747_1782117212" w:tooltip="11.1 Recipe books">
             <w:r>
               <w:rPr>
                 <w:rStyle w:val="IndexLink"/>
@@ -879,7 +900,7 @@
               </w:rPr>
               <w:t>11.1 Recipe books</w:t>
               <w:tab/>
-              <w:t>32</w:t>
+              <w:t>34</w:t>
             </w:r>
           </w:hyperlink>
         </w:p>
@@ -892,7 +913,7 @@
             </w:tabs>
             <w:rPr/>
           </w:pPr>
-          <w:hyperlink w:anchor="__RefHeading___Toc3713_3507643775" w:tooltip="11.2 The Recipes screen">
+          <w:hyperlink w:anchor="__RefHeading___Toc3749_1782117212" w:tooltip="11.2 The Recipes screen">
             <w:r>
               <w:rPr>
                 <w:rStyle w:val="IndexLink"/>
@@ -900,7 +921,7 @@
               </w:rPr>
               <w:t>11.2 The Recipes screen</w:t>
               <w:tab/>
-              <w:t>35</w:t>
+              <w:t>37</w:t>
             </w:r>
           </w:hyperlink>
         </w:p>
@@ -913,7 +934,7 @@
             </w:tabs>
             <w:rPr/>
           </w:pPr>
-          <w:hyperlink w:anchor="__RefHeading___Toc3715_3507643775" w:tooltip="11.3 The Recipe List object">
+          <w:hyperlink w:anchor="__RefHeading___Toc3751_1782117212" w:tooltip="11.3 The Recipe List object">
             <w:r>
               <w:rPr>
                 <w:rStyle w:val="IndexLink"/>
@@ -921,7 +942,7 @@
               </w:rPr>
               <w:t>11.3 The Recipe List object</w:t>
               <w:tab/>
-              <w:t>37</w:t>
+              <w:t>39</w:t>
             </w:r>
           </w:hyperlink>
         </w:p>
@@ -934,7 +955,7 @@
             </w:tabs>
             <w:rPr/>
           </w:pPr>
-          <w:hyperlink w:anchor="__RefHeading___Toc3717_3507643775" w:tooltip="11.4 Selecting a recipe in a window">
+          <w:hyperlink w:anchor="__RefHeading___Toc3753_1782117212" w:tooltip="11.4 Selecting a recipe in a window">
             <w:r>
               <w:rPr>
                 <w:rStyle w:val="IndexLink"/>
@@ -942,7 +963,7 @@
               </w:rPr>
               <w:t>11.4 Selecting a recipe in a window</w:t>
               <w:tab/>
-              <w:t>38</w:t>
+              <w:t>40</w:t>
             </w:r>
           </w:hyperlink>
         </w:p>
@@ -955,7 +976,7 @@
             </w:tabs>
             <w:rPr/>
           </w:pPr>
-          <w:hyperlink w:anchor="__RefHeading___Toc3719_3507643775" w:tooltip="11.5 When a recipe function fails">
+          <w:hyperlink w:anchor="__RefHeading___Toc3755_1782117212" w:tooltip="11.5 When a recipe function fails">
             <w:r>
               <w:rPr>
                 <w:rStyle w:val="IndexLink"/>
@@ -963,7 +984,7 @@
               </w:rPr>
               <w:t>11.5 When a recipe function fails</w:t>
               <w:tab/>
-              <w:t>39</w:t>
+              <w:t>41</w:t>
             </w:r>
           </w:hyperlink>
         </w:p>
@@ -976,7 +997,7 @@
             </w:tabs>
             <w:rPr/>
           </w:pPr>
-          <w:hyperlink w:anchor="__RefHeading___Toc3721_3507643775" w:tooltip="11.6 Where recipes are kept">
+          <w:hyperlink w:anchor="__RefHeading___Toc3757_1782117212" w:tooltip="11.6 Where recipes are kept">
             <w:r>
               <w:rPr>
                 <w:rStyle w:val="IndexLink"/>
@@ -984,7 +1005,7 @@
               </w:rPr>
               <w:t>11.6 Where recipes are kept</w:t>
               <w:tab/>
-              <w:t>39</w:t>
+              <w:t>41</w:t>
             </w:r>
           </w:hyperlink>
         </w:p>
@@ -997,7 +1018,7 @@
             </w:tabs>
             <w:rPr/>
           </w:pPr>
-          <w:hyperlink w:anchor="__RefHeading___Toc3723_3507643775" w:tooltip="12 Testing">
+          <w:hyperlink w:anchor="__RefHeading___Toc3759_1782117212" w:tooltip="12 Testing">
             <w:r>
               <w:rPr>
                 <w:rStyle w:val="IndexLink"/>
@@ -1005,7 +1026,7 @@
               </w:rPr>
               <w:t>12 Testing</w:t>
               <w:tab/>
-              <w:t>40</w:t>
+              <w:t>42</w:t>
             </w:r>
           </w:hyperlink>
         </w:p>
@@ -1018,7 +1039,7 @@
             </w:tabs>
             <w:rPr/>
           </w:pPr>
-          <w:hyperlink w:anchor="__RefHeading___Toc3725_3507643775" w:tooltip="12.1 Validate">
+          <w:hyperlink w:anchor="__RefHeading___Toc3761_1782117212" w:tooltip="12.1 Validate">
             <w:r>
               <w:rPr>
                 <w:rStyle w:val="IndexLink"/>
@@ -1026,7 +1047,7 @@
               </w:rPr>
               <w:t>12.1 Validate</w:t>
               <w:tab/>
-              <w:t>40</w:t>
+              <w:t>42</w:t>
             </w:r>
           </w:hyperlink>
         </w:p>
@@ -1039,7 +1060,7 @@
             </w:tabs>
             <w:rPr/>
           </w:pPr>
-          <w:hyperlink w:anchor="__RefHeading___Toc3727_3507643775" w:tooltip="12.2 Run">
+          <w:hyperlink w:anchor="__RefHeading___Toc3763_1782117212" w:tooltip="12.2 Run">
             <w:r>
               <w:rPr>
                 <w:rStyle w:val="IndexLink"/>
@@ -1047,7 +1068,7 @@
               </w:rPr>
               <w:t>12.2 Run</w:t>
               <w:tab/>
-              <w:t>40</w:t>
+              <w:t>42</w:t>
             </w:r>
           </w:hyperlink>
         </w:p>
@@ -1060,7 +1081,7 @@
             </w:tabs>
             <w:rPr/>
           </w:pPr>
-          <w:hyperlink w:anchor="__RefHeading___Toc3729_3507643775" w:tooltip="13 Deploying">
+          <w:hyperlink w:anchor="__RefHeading___Toc3765_1782117212" w:tooltip="13 Deploying">
             <w:r>
               <w:rPr>
                 <w:rStyle w:val="IndexLink"/>
@@ -1068,7 +1089,7 @@
               </w:rPr>
               <w:t>13 Deploying</w:t>
               <w:tab/>
-              <w:t>45</w:t>
+              <w:t>47</w:t>
             </w:r>
           </w:hyperlink>
         </w:p>
@@ -1081,7 +1102,7 @@
             </w:tabs>
             <w:rPr/>
           </w:pPr>
-          <w:hyperlink w:anchor="__RefHeading___Toc3731_3507643775" w:tooltip="13.1 Publish">
+          <w:hyperlink w:anchor="__RefHeading___Toc3767_1782117212" w:tooltip="13.1 Publish">
             <w:r>
               <w:rPr>
                 <w:rStyle w:val="IndexLink"/>
@@ -1089,7 +1110,7 @@
               </w:rPr>
               <w:t>13.1 Publish</w:t>
               <w:tab/>
-              <w:t>45</w:t>
+              <w:t>47</w:t>
             </w:r>
           </w:hyperlink>
         </w:p>
@@ -1102,7 +1123,7 @@
             </w:tabs>
             <w:rPr/>
           </w:pPr>
-          <w:hyperlink w:anchor="__RefHeading___Toc3733_3507643775" w:tooltip="13.2 Append HMI Desktop">
+          <w:hyperlink w:anchor="__RefHeading___Toc3769_1782117212" w:tooltip="13.2 Append HMI Desktop">
             <w:r>
               <w:rPr>
                 <w:rStyle w:val="IndexLink"/>
@@ -1110,7 +1131,7 @@
               </w:rPr>
               <w:t>13.2 Append HMI Desktop</w:t>
               <w:tab/>
-              <w:t>46</w:t>
+              <w:t>48</w:t>
             </w:r>
           </w:hyperlink>
         </w:p>
@@ -1123,7 +1144,7 @@
             </w:tabs>
             <w:rPr/>
           </w:pPr>
-          <w:hyperlink w:anchor="__RefHeading___Toc3735_3507643775" w:tooltip="13.3 Append HMI Web">
+          <w:hyperlink w:anchor="__RefHeading___Toc3771_1782117212" w:tooltip="13.3 Append HMI Web">
             <w:r>
               <w:rPr>
                 <w:rStyle w:val="IndexLink"/>
@@ -1131,7 +1152,7 @@
               </w:rPr>
               <w:t>13.3 Append HMI Web</w:t>
               <w:tab/>
-              <w:t>47</w:t>
+              <w:t>49</w:t>
             </w:r>
           </w:hyperlink>
         </w:p>
@@ -1144,7 +1165,7 @@
             </w:tabs>
             <w:rPr/>
           </w:pPr>
-          <w:hyperlink w:anchor="__RefHeading___Toc3737_3507643775" w:tooltip="14 Tips and troubleshooting">
+          <w:hyperlink w:anchor="__RefHeading___Toc3773_1782117212" w:tooltip="14 Tips and troubleshooting">
             <w:r>
               <w:rPr>
                 <w:rStyle w:val="IndexLink"/>
@@ -1152,7 +1173,7 @@
               </w:rPr>
               <w:t>14 Tips and troubleshooting</w:t>
               <w:tab/>
-              <w:t>49</w:t>
+              <w:t>51</w:t>
             </w:r>
           </w:hyperlink>
         </w:p>
@@ -1165,7 +1186,7 @@
             </w:tabs>
             <w:rPr/>
           </w:pPr>
-          <w:hyperlink w:anchor="__RefHeading___Toc3739_3507643775" w:tooltip="Appendix A Command-line automation">
+          <w:hyperlink w:anchor="__RefHeading___Toc3775_1782117212" w:tooltip="Appendix A Command-line automation">
             <w:r>
               <w:rPr>
                 <w:rStyle w:val="IndexLink"/>
@@ -1173,7 +1194,7 @@
               </w:rPr>
               <w:t>Appendix A Command-line automation</w:t>
               <w:tab/>
-              <w:t>50</w:t>
+              <w:t>52</w:t>
             </w:r>
           </w:hyperlink>
           <w:r>
@@ -1203,7 +1224,7 @@
         <w:spacing w:before="0" w:after="0"/>
         <w:rPr/>
       </w:pPr>
-      <w:bookmarkStart w:id="0" w:name="__RefHeading___Toc3655_3507643775"/>
+      <w:bookmarkStart w:id="0" w:name="__RefHeading___Toc3689_1782117212"/>
       <w:bookmarkEnd w:id="0"/>
       <w:r>
         <w:rPr/>
@@ -1884,7 +1905,7 @@
                 <w:szCs w:val="22"/>
                 <w:lang w:val="en-US" w:eastAsia="en-US" w:bidi="ar-SA"/>
               </w:rPr>
-              <w:t>Window scripts that turn the sequence step number into text, and action scripts that call the login and recipe functions</w:t>
+              <w:t>Window scripts that turn the sequence step number into text, and action scripts that call the login, recipe, indirect tag and ShowWindow functions</w:t>
             </w:r>
           </w:p>
         </w:tc>
@@ -1904,7 +1925,7 @@
         <w:pStyle w:val="Heading2"/>
         <w:rPr/>
       </w:pPr>
-      <w:bookmarkStart w:id="1" w:name="__RefHeading___Toc3657_3507643775"/>
+      <w:bookmarkStart w:id="1" w:name="__RefHeading___Toc3691_1782117212"/>
       <w:bookmarkEnd w:id="1"/>
       <w:r>
         <w:rPr/>
@@ -2047,7 +2068,7 @@
         <w:pStyle w:val="Heading1"/>
         <w:rPr/>
       </w:pPr>
-      <w:bookmarkStart w:id="2" w:name="__RefHeading___Toc3659_3507643775"/>
+      <w:bookmarkStart w:id="2" w:name="__RefHeading___Toc3693_1782117212"/>
       <w:bookmarkEnd w:id="2"/>
       <w:r>
         <w:rPr/>
@@ -2625,7 +2646,7 @@
         <w:pStyle w:val="Heading2"/>
         <w:rPr/>
       </w:pPr>
-      <w:bookmarkStart w:id="3" w:name="__RefHeading___Toc3661_3507643775"/>
+      <w:bookmarkStart w:id="3" w:name="__RefHeading___Toc3695_1782117212"/>
       <w:bookmarkEnd w:id="3"/>
       <w:r>
         <w:rPr/>
@@ -3665,7 +3686,7 @@
         <w:pStyle w:val="Heading1"/>
         <w:rPr/>
       </w:pPr>
-      <w:bookmarkStart w:id="4" w:name="__RefHeading___Toc3663_3507643775"/>
+      <w:bookmarkStart w:id="4" w:name="__RefHeading___Toc3697_1782117212"/>
       <w:bookmarkEnd w:id="4"/>
       <w:r>
         <w:rPr/>
@@ -3950,7 +3971,7 @@
         <w:pStyle w:val="Heading1"/>
         <w:rPr/>
       </w:pPr>
-      <w:bookmarkStart w:id="5" w:name="__RefHeading___Toc3665_3507643775"/>
+      <w:bookmarkStart w:id="5" w:name="__RefHeading___Toc3699_1782117212"/>
       <w:bookmarkEnd w:id="5"/>
       <w:r>
         <w:rPr/>
@@ -4745,7 +4766,7 @@
         <w:pStyle w:val="Heading1"/>
         <w:rPr/>
       </w:pPr>
-      <w:bookmarkStart w:id="6" w:name="__RefHeading___Toc3667_3507643775"/>
+      <w:bookmarkStart w:id="6" w:name="__RefHeading___Toc3701_1782117212"/>
       <w:bookmarkEnd w:id="6"/>
       <w:r>
         <w:rPr/>
@@ -5576,7 +5597,7 @@
         <w:pStyle w:val="Heading2"/>
         <w:rPr/>
       </w:pPr>
-      <w:bookmarkStart w:id="7" w:name="__RefHeading___Toc3669_3507643775"/>
+      <w:bookmarkStart w:id="7" w:name="__RefHeading___Toc3703_1782117212"/>
       <w:bookmarkEnd w:id="7"/>
       <w:r>
         <w:rPr/>
@@ -6229,7 +6250,7 @@
         <w:pStyle w:val="Heading2"/>
         <w:rPr/>
       </w:pPr>
-      <w:bookmarkStart w:id="8" w:name="__RefHeading___Toc3671_3507643775"/>
+      <w:bookmarkStart w:id="8" w:name="__RefHeading___Toc3705_1782117212"/>
       <w:bookmarkEnd w:id="8"/>
       <w:r>
         <w:rPr/>
@@ -6364,7 +6385,7 @@
         <w:pStyle w:val="Heading1"/>
         <w:rPr/>
       </w:pPr>
-      <w:bookmarkStart w:id="9" w:name="__RefHeading___Toc3673_3507643775"/>
+      <w:bookmarkStart w:id="9" w:name="__RefHeading___Toc3707_1782117212"/>
       <w:bookmarkEnd w:id="9"/>
       <w:r>
         <w:rPr/>
@@ -6877,7 +6898,7 @@
         <w:pStyle w:val="Heading2"/>
         <w:rPr/>
       </w:pPr>
-      <w:bookmarkStart w:id="10" w:name="__RefHeading___Toc3675_3507643775"/>
+      <w:bookmarkStart w:id="10" w:name="__RefHeading___Toc3709_1782117212"/>
       <w:bookmarkEnd w:id="10"/>
       <w:r>
         <w:rPr/>
@@ -7039,7 +7060,7 @@
         <w:pStyle w:val="Heading2"/>
         <w:rPr/>
       </w:pPr>
-      <w:bookmarkStart w:id="11" w:name="__RefHeading___Toc3677_3507643775"/>
+      <w:bookmarkStart w:id="11" w:name="__RefHeading___Toc3711_1782117212"/>
       <w:bookmarkEnd w:id="11"/>
       <w:r>
         <w:rPr/>
@@ -7063,17 +7084,7 @@
       </w:r>
       <w:r>
         <w:rPr/>
-        <w:t xml:space="preserve"> link to one screen. Because the main screens are Replace windows, opening one closes the current screen. The valve and pump symbols open the Device Faceplate the same way, after an Action Script has told it which device to show (section 9.4); its DONE button closes it with a </w:t>
-      </w:r>
-      <w:r>
-        <w:rPr>
-          <w:b/>
-        </w:rPr>
-        <w:t>Hide Window</w:t>
-      </w:r>
-      <w:r>
-        <w:rPr/>
-        <w:t xml:space="preserve"> link. A script can also open a window with </w:t>
+        <w:t xml:space="preserve"> link to one screen. Because the main screens are Replace windows, opening one closes the current screen. The valve and pump symbols open the Device Faceplate from their Action Scripts instead, with the </w:t>
       </w:r>
       <w:r>
         <w:rPr>
@@ -7084,7 +7095,17 @@
       </w:r>
       <w:r>
         <w:rPr/>
-        <w:t xml:space="preserve"> (section 9.3), at another position, and wait for it to close.</w:t>
+        <w:t xml:space="preserve"> function, beside the symbol touched (section 9.5); its DONE button closes it with a </w:t>
+      </w:r>
+      <w:r>
+        <w:rPr>
+          <w:b/>
+        </w:rPr>
+        <w:t>Hide Window</w:t>
+      </w:r>
+      <w:r>
+        <w:rPr/>
+        <w:t xml:space="preserve"> link.</w:t>
       </w:r>
       <w:r>
         <w:br w:type="page"/>
@@ -7095,7 +7116,7 @@
         <w:pStyle w:val="Heading1"/>
         <w:rPr/>
       </w:pPr>
-      <w:bookmarkStart w:id="12" w:name="__RefHeading___Toc3679_3507643775"/>
+      <w:bookmarkStart w:id="12" w:name="__RefHeading___Toc3713_1782117212"/>
       <w:bookmarkEnd w:id="12"/>
       <w:r>
         <w:rPr/>
@@ -7301,7 +7322,7 @@
         <w:pStyle w:val="Heading1"/>
         <w:rPr/>
       </w:pPr>
-      <w:bookmarkStart w:id="13" w:name="__RefHeading___Toc3681_3507643775"/>
+      <w:bookmarkStart w:id="13" w:name="__RefHeading___Toc3715_1782117212"/>
       <w:bookmarkEnd w:id="13"/>
       <w:r>
         <w:rPr/>
@@ -8026,7 +8047,7 @@
         <w:pStyle w:val="Heading2"/>
         <w:rPr/>
       </w:pPr>
-      <w:bookmarkStart w:id="14" w:name="__RefHeading___Toc3683_3507643775"/>
+      <w:bookmarkStart w:id="14" w:name="__RefHeading___Toc3717_1782117212"/>
       <w:bookmarkEnd w:id="14"/>
       <w:r>
         <w:rPr/>
@@ -8040,7 +8061,7 @@
       </w:pPr>
       <w:r>
         <w:rPr/>
-        <w:t>Each valve symbol on the Process screen carries four links. SV-102 is selected in Figure 13.</w:t>
+        <w:t>Each valve symbol on the Process screen carries three links. SV-102 is selected in Figure 13.</w:t>
       </w:r>
     </w:p>
     <w:p>
@@ -8193,27 +8214,18 @@
       </w:r>
       <w:r>
         <w:rPr/>
-        <w:t xml:space="preserve"> tells the faceplate which device to show (section 9.4).</w:t>
-      </w:r>
-    </w:p>
-    <w:p>
-      <w:pPr>
-        <w:pStyle w:val="ListBullet"/>
-        <w:numPr>
-          <w:ilvl w:val="0"/>
-          <w:numId w:val="1"/>
-        </w:numPr>
-        <w:rPr/>
-      </w:pPr>
+        <w:t xml:space="preserve"> tells the faceplate which device to show (section 9.4), and </w:t>
+      </w:r>
       <w:r>
         <w:rPr>
-          <w:b/>
+          <w:rFonts w:ascii="Consolas" w:hAnsi="Consolas"/>
+          <w:sz w:val="19"/>
         </w:rPr>
-        <w:t>Show Window</w:t>
-      </w:r>
-      <w:r>
-        <w:rPr/>
-        <w:t xml:space="preserve"> Device Faceplate: touching the valve then opens the faceplate.</w:t>
+        <w:t>ShowWindow("Device Faceplate", 132, 80);</w:t>
+      </w:r>
+      <w:r>
+        <w:rPr/>
+        <w:t xml:space="preserve"> opens it beside the valve (section 9.5).</w:t>
       </w:r>
     </w:p>
     <w:p>
@@ -8221,7 +8233,7 @@
         <w:pStyle w:val="Heading2"/>
         <w:rPr/>
       </w:pPr>
-      <w:bookmarkStart w:id="15" w:name="__RefHeading___Toc3685_3507643775"/>
+      <w:bookmarkStart w:id="15" w:name="__RefHeading___Toc3719_1782117212"/>
       <w:bookmarkEnd w:id="15"/>
       <w:r>
         <w:rPr/>
@@ -8342,7 +8354,7 @@
         <w:pStyle w:val="Heading2"/>
         <w:rPr/>
       </w:pPr>
-      <w:bookmarkStart w:id="16" w:name="__RefHeading___Toc3687_3507643775"/>
+      <w:bookmarkStart w:id="16" w:name="__RefHeading___Toc3721_1782117212"/>
       <w:bookmarkEnd w:id="16"/>
       <w:r>
         <w:rPr/>
@@ -8458,7 +8470,7 @@
         <w:pStyle w:val="Heading2"/>
         <w:rPr/>
       </w:pPr>
-      <w:bookmarkStart w:id="17" w:name="__RefHeading___Toc3689_3507643775"/>
+      <w:bookmarkStart w:id="17" w:name="__RefHeading___Toc3723_1782117212"/>
       <w:bookmarkEnd w:id="17"/>
       <w:r>
         <w:rPr/>
@@ -8574,7 +8586,7 @@
         <w:pStyle w:val="Heading2"/>
         <w:rPr/>
       </w:pPr>
-      <w:bookmarkStart w:id="18" w:name="__RefHeading___Toc3691_3507643775"/>
+      <w:bookmarkStart w:id="18" w:name="__RefHeading___Toc3725_1782117212"/>
       <w:bookmarkEnd w:id="18"/>
       <w:r>
         <w:rPr/>
@@ -9086,7 +9098,7 @@
         <w:pStyle w:val="Heading1"/>
         <w:rPr/>
       </w:pPr>
-      <w:bookmarkStart w:id="19" w:name="__RefHeading___Toc3693_3507643775"/>
+      <w:bookmarkStart w:id="19" w:name="__RefHeading___Toc3727_1782117212"/>
       <w:bookmarkEnd w:id="19"/>
       <w:r>
         <w:rPr/>
@@ -9988,7 +10000,7 @@
         <w:pStyle w:val="Heading2"/>
         <w:rPr/>
       </w:pPr>
-      <w:bookmarkStart w:id="20" w:name="__RefHeading___Toc3695_3507643775"/>
+      <w:bookmarkStart w:id="20" w:name="__RefHeading___Toc3729_1782117212"/>
       <w:bookmarkEnd w:id="20"/>
       <w:r>
         <w:rPr/>
@@ -10172,7 +10184,7 @@
         <w:pStyle w:val="Heading2"/>
         <w:rPr/>
       </w:pPr>
-      <w:bookmarkStart w:id="21" w:name="__RefHeading___Toc3697_3507643775"/>
+      <w:bookmarkStart w:id="21" w:name="__RefHeading___Toc3731_1782117212"/>
       <w:bookmarkEnd w:id="21"/>
       <w:r>
         <w:rPr/>
@@ -10291,7 +10303,7 @@
         <w:pStyle w:val="Heading2"/>
         <w:rPr/>
       </w:pPr>
-      <w:bookmarkStart w:id="22" w:name="__RefHeading___Toc3699_3507643775"/>
+      <w:bookmarkStart w:id="22" w:name="__RefHeading___Toc3733_1782117212"/>
       <w:bookmarkEnd w:id="22"/>
       <w:r>
         <w:rPr/>
@@ -13838,7 +13850,7 @@
         <w:pStyle w:val="Heading2"/>
         <w:rPr/>
       </w:pPr>
-      <w:bookmarkStart w:id="23" w:name="__RefHeading___Toc3701_3507643775"/>
+      <w:bookmarkStart w:id="23" w:name="__RefHeading___Toc3735_1782117212"/>
       <w:bookmarkEnd w:id="23"/>
       <w:r>
         <w:rPr/>
@@ -13948,7 +13960,7 @@
       </w:pPr>
       <w:r>
         <w:rPr/>
-        <w:t>Opening it takes two steps. First, the valve or pump symbol's Action Script names the device in memory tags:</w:t>
+        <w:t>Opening it takes two steps. First, the valve or pump symbol's Action Script names the device in memory tags and opens the faceplate beside the symbol (section 9.5):</w:t>
       </w:r>
     </w:p>
     <w:p>
@@ -13999,10 +14011,16 @@
     <w:p>
       <w:pPr>
         <w:pStyle w:val="Normal"/>
-        <w:rPr/>
-      </w:pPr>
-      <w:r>
-        <w:rPr/>
+        <w:spacing w:before="0" w:after="0"/>
+        <w:ind w:left="432"/>
+        <w:rPr/>
+      </w:pPr>
+      <w:r>
+        <w:rPr>
+          <w:rFonts w:ascii="Consolas" w:hAnsi="Consolas"/>
+          <w:sz w:val="19"/>
+        </w:rPr>
+        <w:t>ShowWindow("Device Faceplate", 132, 80);</w:t>
       </w:r>
     </w:p>
     <w:p>
@@ -14012,7 +14030,16 @@
       </w:pPr>
       <w:r>
         <w:rPr/>
-        <w:t xml:space="preserve">Then its Show Window link opens the faceplate, whose </w:t>
+      </w:r>
+    </w:p>
+    <w:p>
+      <w:pPr>
+        <w:pStyle w:val="Normal"/>
+        <w:rPr/>
+      </w:pPr>
+      <w:r>
+        <w:rPr/>
+        <w:t xml:space="preserve">Then the faceplate's </w:t>
       </w:r>
       <w:r>
         <w:rPr>
@@ -14611,7 +14638,7 @@
       </w:pPr>
       <w:r>
         <w:rPr/>
-        <w:t>Figure 20. The same faceplate showing pump P-100</w:t>
+        <w:t>Figure 20. The same faceplate showing pump P-200</w:t>
       </w:r>
     </w:p>
     <w:p>
@@ -14656,26 +14683,14 @@
     </w:p>
     <w:p>
       <w:pPr>
-        <w:pStyle w:val="Heading1"/>
-        <w:rPr/>
-      </w:pPr>
-      <w:bookmarkStart w:id="24" w:name="__RefHeading___Toc3703_3507643775"/>
+        <w:pStyle w:val="Heading2"/>
+        <w:rPr/>
+      </w:pPr>
+      <w:bookmarkStart w:id="24" w:name="__RefHeading___Toc3737_1782117212"/>
       <w:bookmarkEnd w:id="24"/>
       <w:r>
         <w:rPr/>
-        <w:t>10  Alarms and security</w:t>
-      </w:r>
-    </w:p>
-    <w:p>
-      <w:pPr>
-        <w:pStyle w:val="Heading2"/>
-        <w:rPr/>
-      </w:pPr>
-      <w:bookmarkStart w:id="25" w:name="__RefHeading___Toc3705_3507643775"/>
-      <w:bookmarkEnd w:id="25"/>
-      <w:r>
-        <w:rPr/>
-        <w:t>10.1  Alarms</w:t>
+        <w:t>9.5  Opening windows from scripts: ShowWindow</w:t>
       </w:r>
     </w:p>
     <w:p>
@@ -14685,150 +14700,88 @@
       </w:pPr>
       <w:r>
         <w:rPr/>
-        <w:t>Alarms come from the limits set on tags (chapter 5). While the application runs, every alarmed tag is watched, whether or not a screen shows it:</w:t>
-      </w:r>
-    </w:p>
-    <w:p>
-      <w:pPr>
-        <w:pStyle w:val="ListBullet"/>
-        <w:numPr>
-          <w:ilvl w:val="0"/>
-          <w:numId w:val="1"/>
-        </w:numPr>
-        <w:rPr/>
-      </w:pPr>
-      <w:r>
-        <w:rPr/>
-        <w:t>Entering alarm, or escalating (High to HiHi), raises an alarm that needs acknowledging.</w:t>
-      </w:r>
-    </w:p>
-    <w:p>
-      <w:pPr>
-        <w:pStyle w:val="ListBullet"/>
-        <w:numPr>
-          <w:ilvl w:val="0"/>
-          <w:numId w:val="1"/>
-        </w:numPr>
-        <w:rPr/>
-      </w:pPr>
-      <w:r>
-        <w:rPr/>
-        <w:t xml:space="preserve">An alarm stays in the Alarm List until it has returned to normal </w:t>
-      </w:r>
-      <w:r>
-        <w:rPr>
-          <w:b/>
-        </w:rPr>
-        <w:t>and</w:t>
-      </w:r>
-      <w:r>
-        <w:rPr/>
-        <w:t xml:space="preserve"> been acknowledged (ISA-18.2).</w:t>
-      </w:r>
-    </w:p>
-    <w:p>
-      <w:pPr>
-        <w:pStyle w:val="ListBullet"/>
-        <w:numPr>
-          <w:ilvl w:val="0"/>
-          <w:numId w:val="1"/>
-        </w:numPr>
-        <w:rPr/>
-      </w:pPr>
-      <w:r>
-        <w:rPr/>
-        <w:t xml:space="preserve">The Alarm List object has an </w:t>
-      </w:r>
-      <w:r>
-        <w:rPr>
-          <w:b/>
-        </w:rPr>
-        <w:t>Ack All</w:t>
-      </w:r>
-      <w:r>
-        <w:rPr/>
-        <w:t xml:space="preserve"> button and an </w:t>
-      </w:r>
-      <w:r>
-        <w:rPr>
-          <w:b/>
-        </w:rPr>
-        <w:t>Ack</w:t>
-      </w:r>
-      <w:r>
-        <w:rPr/>
-        <w:t xml:space="preserve"> button on each row. A script can acknowledge with </w:t>
+        <w:t xml:space="preserve">A Show Window link always opens its window where the window is defined. The </w:t>
       </w:r>
       <w:r>
         <w:rPr>
           <w:rFonts w:ascii="Consolas" w:hAnsi="Consolas"/>
           <w:sz w:val="19"/>
         </w:rPr>
-        <w:t>_AckAll = 1;</w:t>
-      </w:r>
-      <w:r>
-        <w:rPr/>
-        <w:t xml:space="preserve"> or </w:t>
+        <w:t>ShowWindow</w:t>
+      </w:r>
+      <w:r>
+        <w:rPr/>
+        <w:t xml:space="preserve"> function (section 9.3) does the same from a script, and can also move the window, make a popup modal or not, and pause the script until the window closes. LiquidWeighHMI uses it in two ways.</w:t>
+      </w:r>
+    </w:p>
+    <w:p>
+      <w:pPr>
+        <w:pStyle w:val="Heading3"/>
+        <w:rPr/>
+      </w:pPr>
+      <w:r>
+        <w:rPr/>
+        <w:t>Beside the device touched</w:t>
+      </w:r>
+    </w:p>
+    <w:p>
+      <w:pPr>
+        <w:pStyle w:val="Normal"/>
+        <w:rPr/>
+      </w:pPr>
+      <w:r>
+        <w:rPr/>
+        <w:t xml:space="preserve">Every valve and pump symbol ends its Action Script with a </w:t>
       </w:r>
       <w:r>
         <w:rPr>
           <w:rFonts w:ascii="Consolas" w:hAnsi="Consolas"/>
           <w:sz w:val="19"/>
         </w:rPr>
-        <w:t>Tag.Acked = 1;</w:t>
-      </w:r>
-      <w:r>
-        <w:rPr/>
-        <w:t>.</w:t>
-      </w:r>
-    </w:p>
-    <w:p>
-      <w:pPr>
-        <w:pStyle w:val="ListBullet"/>
-        <w:numPr>
-          <w:ilvl w:val="0"/>
-          <w:numId w:val="1"/>
-        </w:numPr>
-        <w:rPr/>
-      </w:pPr>
-      <w:r>
-        <w:rPr/>
-        <w:t>Every alarm event is written to a daily history file kept for 90 days; the Alarm History object shows it (Figure 38).</w:t>
-      </w:r>
-      <w:r>
-        <w:br w:type="page"/>
-      </w:r>
-    </w:p>
-    <w:p>
-      <w:pPr>
-        <w:pStyle w:val="Heading2"/>
-        <w:rPr/>
-      </w:pPr>
-      <w:bookmarkStart w:id="26" w:name="__RefHeading___Toc3707_3507643775"/>
-      <w:bookmarkEnd w:id="26"/>
-      <w:r>
-        <w:rPr/>
-        <w:t>10.2  Users and access levels</w:t>
+        <w:t>ShowWindow</w:t>
+      </w:r>
+      <w:r>
+        <w:rPr/>
+        <w:t xml:space="preserve"> call that places the Device Faceplate beside the symbol, so the operator still sees the device being operated. The faceplate still shows its own part of its page; only its place on the screen changes. P-100, at the bottom left of the Process screen, opens it at 414, 398:</w:t>
       </w:r>
     </w:p>
     <w:p>
       <w:pPr>
         <w:pStyle w:val="Normal"/>
-        <w:rPr/>
-      </w:pPr>
-      <w:r>
-        <w:rPr/>
-        <w:t xml:space="preserve">Open </w:t>
-      </w:r>
+        <w:spacing w:before="0" w:after="0"/>
+        <w:ind w:left="432"/>
+        <w:rPr/>
+      </w:pPr>
       <w:r>
         <w:rPr>
-          <w:b/>
+          <w:rFonts w:ascii="Consolas" w:hAnsi="Consolas"/>
+          <w:sz w:val="19"/>
         </w:rPr>
-        <w:t>HMI &gt; Users</w:t>
-      </w:r>
-      <w:r>
-        <w:rPr/>
-        <w:t xml:space="preserve"> to define who can log in. Each user has a name, a password (stored only as a salted hash) and an access level from 0 to 9999.</w:t>
+        <w:t>FP_Prefix = "P100"; FP_Device = "P-100"; ...</w:t>
+      </w:r>
+    </w:p>
+    <w:p>
+      <w:pPr>
+        <w:pStyle w:val="Normal"/>
+        <w:spacing w:before="0" w:after="0"/>
+        <w:ind w:left="432"/>
+        <w:rPr/>
+      </w:pPr>
+      <w:r>
+        <w:rPr>
+          <w:rFonts w:ascii="Consolas" w:hAnsi="Consolas"/>
+          <w:sz w:val="19"/>
+        </w:rPr>
+        <w:t>ShowWindow("Device Faceplate", 414, 398);</w:t>
+      </w:r>
+    </w:p>
+    <w:p>
+      <w:pPr>
+        <w:pStyle w:val="Normal"/>
+        <w:rPr/>
+      </w:pPr>
+      <w:r>
+        <w:rPr/>
       </w:r>
     </w:p>
     <w:p>
@@ -14842,7 +14795,7 @@
         <w:rPr/>
         <w:drawing>
           <wp:inline distT="0" distB="0" distL="0" distR="0">
-            <wp:extent cx="4023360" cy="4023360"/>
+            <wp:extent cx="5943600" cy="3343275"/>
             <wp:effectExtent l="0" t="0" r="0" b="0"/>
             <wp:docPr id="22" name="Picture 22"/>
             <wp:cNvGraphicFramePr>
@@ -14866,6 +14819,557 @@
                   <pic:spPr bwMode="auto">
                     <a:xfrm>
                       <a:off x="0" y="0"/>
+                      <a:ext cx="5943600" cy="3343275"/>
+                    </a:xfrm>
+                    <a:prstGeom prst="rect">
+                      <a:avLst/>
+                    </a:prstGeom>
+                    <a:noFill/>
+                  </pic:spPr>
+                </pic:pic>
+              </a:graphicData>
+            </a:graphic>
+          </wp:inline>
+        </w:drawing>
+      </w:r>
+    </w:p>
+    <w:p>
+      <w:pPr>
+        <w:pStyle w:val="Caption"/>
+        <w:jc w:val="center"/>
+        <w:rPr/>
+      </w:pPr>
+      <w:r>
+        <w:rPr/>
+        <w:t>Figure 21. The Device Faceplate opened beside pump P-100</w:t>
+      </w:r>
+    </w:p>
+    <w:p>
+      <w:pPr>
+        <w:pStyle w:val="Heading3"/>
+        <w:rPr/>
+      </w:pPr>
+      <w:r>
+        <w:rPr/>
+        <w:t>Waiting for an answer</w:t>
+      </w:r>
+    </w:p>
+    <w:p>
+      <w:pPr>
+        <w:pStyle w:val="Normal"/>
+        <w:rPr/>
+      </w:pPr>
+      <w:r>
+        <w:rPr/>
+        <w:t xml:space="preserve">ABORT on the Batch screen asks first. Its Action Script opens the Confirm Abort popup with wait (the fifth argument), so the script pauses at </w:t>
+      </w:r>
+      <w:r>
+        <w:rPr>
+          <w:rFonts w:ascii="Consolas" w:hAnsi="Consolas"/>
+          <w:sz w:val="19"/>
+        </w:rPr>
+        <w:t>ShowWindow</w:t>
+      </w:r>
+      <w:r>
+        <w:rPr/>
+        <w:t xml:space="preserve"> until the popup closes, then acts on the answer:</w:t>
+      </w:r>
+    </w:p>
+    <w:p>
+      <w:pPr>
+        <w:pStyle w:val="Normal"/>
+        <w:spacing w:before="0" w:after="0"/>
+        <w:ind w:left="432"/>
+        <w:rPr/>
+      </w:pPr>
+      <w:r>
+        <w:rPr>
+          <w:rFonts w:ascii="Consolas" w:hAnsi="Consolas"/>
+          <w:sz w:val="19"/>
+        </w:rPr>
+        <w:t>IF Seq_Running OR Seq_Held THEN</w:t>
+      </w:r>
+    </w:p>
+    <w:p>
+      <w:pPr>
+        <w:pStyle w:val="Normal"/>
+        <w:spacing w:before="0" w:after="0"/>
+        <w:ind w:left="432"/>
+        <w:rPr/>
+      </w:pPr>
+      <w:r>
+        <w:rPr>
+          <w:rFonts w:ascii="Consolas" w:hAnsi="Consolas"/>
+          <w:sz w:val="19"/>
+        </w:rPr>
+        <w:t xml:space="preserve">    </w:t>
+      </w:r>
+      <w:r>
+        <w:rPr>
+          <w:rFonts w:ascii="Consolas" w:hAnsi="Consolas"/>
+          <w:sz w:val="19"/>
+        </w:rPr>
+        <w:t>AbortConfirmed = 0;</w:t>
+      </w:r>
+    </w:p>
+    <w:p>
+      <w:pPr>
+        <w:pStyle w:val="Normal"/>
+        <w:spacing w:before="0" w:after="0"/>
+        <w:ind w:left="432"/>
+        <w:rPr/>
+      </w:pPr>
+      <w:r>
+        <w:rPr>
+          <w:rFonts w:ascii="Consolas" w:hAnsi="Consolas"/>
+          <w:sz w:val="19"/>
+        </w:rPr>
+        <w:t xml:space="preserve">    </w:t>
+      </w:r>
+      <w:r>
+        <w:rPr>
+          <w:rFonts w:ascii="Consolas" w:hAnsi="Consolas"/>
+          <w:sz w:val="19"/>
+        </w:rPr>
+        <w:t>ShowWindow("Confirm Abort", "", "", 1, 1);</w:t>
+      </w:r>
+    </w:p>
+    <w:p>
+      <w:pPr>
+        <w:pStyle w:val="Normal"/>
+        <w:spacing w:before="0" w:after="0"/>
+        <w:ind w:left="432"/>
+        <w:rPr/>
+      </w:pPr>
+      <w:r>
+        <w:rPr>
+          <w:rFonts w:ascii="Consolas" w:hAnsi="Consolas"/>
+          <w:sz w:val="19"/>
+        </w:rPr>
+        <w:t xml:space="preserve">    </w:t>
+      </w:r>
+      <w:r>
+        <w:rPr>
+          <w:rFonts w:ascii="Consolas" w:hAnsi="Consolas"/>
+          <w:sz w:val="19"/>
+        </w:rPr>
+        <w:t>IF AbortConfirmed THEN</w:t>
+      </w:r>
+    </w:p>
+    <w:p>
+      <w:pPr>
+        <w:pStyle w:val="Normal"/>
+        <w:spacing w:before="0" w:after="0"/>
+        <w:ind w:left="432"/>
+        <w:rPr/>
+      </w:pPr>
+      <w:r>
+        <w:rPr>
+          <w:rFonts w:ascii="Consolas" w:hAnsi="Consolas"/>
+          <w:sz w:val="19"/>
+        </w:rPr>
+        <w:t xml:space="preserve">        </w:t>
+      </w:r>
+      <w:r>
+        <w:rPr>
+          <w:rFonts w:ascii="Consolas" w:hAnsi="Consolas"/>
+          <w:sz w:val="19"/>
+        </w:rPr>
+        <w:t>PB_Abort = 1;</w:t>
+      </w:r>
+    </w:p>
+    <w:p>
+      <w:pPr>
+        <w:pStyle w:val="Normal"/>
+        <w:spacing w:before="0" w:after="0"/>
+        <w:ind w:left="432"/>
+        <w:rPr/>
+      </w:pPr>
+      <w:r>
+        <w:rPr>
+          <w:rFonts w:ascii="Consolas" w:hAnsi="Consolas"/>
+          <w:sz w:val="19"/>
+        </w:rPr>
+        <w:t xml:space="preserve">    </w:t>
+      </w:r>
+      <w:r>
+        <w:rPr>
+          <w:rFonts w:ascii="Consolas" w:hAnsi="Consolas"/>
+          <w:sz w:val="19"/>
+        </w:rPr>
+        <w:t>ENDIF;</w:t>
+      </w:r>
+    </w:p>
+    <w:p>
+      <w:pPr>
+        <w:pStyle w:val="Normal"/>
+        <w:spacing w:before="0" w:after="0"/>
+        <w:ind w:left="432"/>
+        <w:rPr/>
+      </w:pPr>
+      <w:r>
+        <w:rPr>
+          <w:rFonts w:ascii="Consolas" w:hAnsi="Consolas"/>
+          <w:sz w:val="19"/>
+        </w:rPr>
+        <w:t>ENDIF;</w:t>
+      </w:r>
+    </w:p>
+    <w:p>
+      <w:pPr>
+        <w:pStyle w:val="Normal"/>
+        <w:rPr/>
+      </w:pPr>
+      <w:r>
+        <w:rPr/>
+      </w:r>
+    </w:p>
+    <w:p>
+      <w:pPr>
+        <w:pStyle w:val="Normal"/>
+        <w:rPr/>
+      </w:pPr>
+      <w:r>
+        <w:rPr/>
+        <w:t xml:space="preserve">The popup's YES button sets </w:t>
+      </w:r>
+      <w:r>
+        <w:rPr>
+          <w:rFonts w:ascii="Consolas" w:hAnsi="Consolas"/>
+          <w:sz w:val="19"/>
+        </w:rPr>
+        <w:t>AbortConfirmed = 1</w:t>
+      </w:r>
+      <w:r>
+        <w:rPr/>
+        <w:t xml:space="preserve"> and closes it; NO, or the close box, just closes it. "" keeps the popup where it is defined, and 1 keeps it modal.</w:t>
+      </w:r>
+    </w:p>
+    <w:p>
+      <w:pPr>
+        <w:pStyle w:val="Normal"/>
+        <w:keepNext w:val="true"/>
+        <w:jc w:val="center"/>
+        <w:rPr/>
+      </w:pPr>
+      <w:r>
+        <w:rPr/>
+        <w:drawing>
+          <wp:inline distT="0" distB="0" distL="0" distR="0">
+            <wp:extent cx="5943600" cy="3343275"/>
+            <wp:effectExtent l="0" t="0" r="0" b="0"/>
+            <wp:docPr id="23" name="Picture 23"/>
+            <wp:cNvGraphicFramePr>
+              <a:graphicFrameLocks xmlns:a="http://schemas.openxmlformats.org/drawingml/2006/main" noChangeAspect="1"/>
+            </wp:cNvGraphicFramePr>
+            <a:graphic xmlns:a="http://schemas.openxmlformats.org/drawingml/2006/main">
+              <a:graphicData uri="http://schemas.openxmlformats.org/drawingml/2006/picture">
+                <pic:pic xmlns:pic="http://schemas.openxmlformats.org/drawingml/2006/picture">
+                  <pic:nvPicPr>
+                    <pic:cNvPr id="23" name="Picture 23"/>
+                    <pic:cNvPicPr>
+                      <a:picLocks noChangeAspect="1" noChangeArrowheads="1"/>
+                    </pic:cNvPicPr>
+                  </pic:nvPicPr>
+                  <pic:blipFill>
+                    <a:blip r:embed="rId24"/>
+                    <a:stretch>
+                      <a:fillRect/>
+                    </a:stretch>
+                  </pic:blipFill>
+                  <pic:spPr bwMode="auto">
+                    <a:xfrm>
+                      <a:off x="0" y="0"/>
+                      <a:ext cx="5943600" cy="3343275"/>
+                    </a:xfrm>
+                    <a:prstGeom prst="rect">
+                      <a:avLst/>
+                    </a:prstGeom>
+                    <a:noFill/>
+                  </pic:spPr>
+                </pic:pic>
+              </a:graphicData>
+            </a:graphic>
+          </wp:inline>
+        </w:drawing>
+      </w:r>
+    </w:p>
+    <w:p>
+      <w:pPr>
+        <w:pStyle w:val="Caption"/>
+        <w:jc w:val="center"/>
+        <w:rPr/>
+      </w:pPr>
+      <w:r>
+        <w:rPr/>
+        <w:t>Figure 22. Confirm Abort, opened by ShowWindow with wait: the ABORT script waits for the answer</w:t>
+      </w:r>
+    </w:p>
+    <w:p>
+      <w:pPr>
+        <w:pStyle w:val="ListBullet"/>
+        <w:numPr>
+          <w:ilvl w:val="0"/>
+          <w:numId w:val="1"/>
+        </w:numPr>
+        <w:rPr/>
+      </w:pPr>
+      <w:r>
+        <w:rPr/>
+        <w:t>While a script waits, the rest of the application runs normally; only that script is paused.</w:t>
+      </w:r>
+    </w:p>
+    <w:p>
+      <w:pPr>
+        <w:pStyle w:val="ListBullet"/>
+        <w:numPr>
+          <w:ilvl w:val="0"/>
+          <w:numId w:val="1"/>
+        </w:numPr>
+        <w:rPr/>
+      </w:pPr>
+      <w:r>
+        <w:rPr/>
+        <w:t xml:space="preserve">A waiting </w:t>
+      </w:r>
+      <w:r>
+        <w:rPr>
+          <w:rFonts w:ascii="Consolas" w:hAnsi="Consolas"/>
+          <w:sz w:val="19"/>
+        </w:rPr>
+        <w:t>ShowWindow</w:t>
+      </w:r>
+      <w:r>
+        <w:rPr/>
+        <w:t xml:space="preserve"> must be a statement on its own (or the whole value of an assignment), as here, inside an IF if needed.</w:t>
+      </w:r>
+    </w:p>
+    <w:p>
+      <w:pPr>
+        <w:pStyle w:val="ListBullet"/>
+        <w:numPr>
+          <w:ilvl w:val="0"/>
+          <w:numId w:val="1"/>
+        </w:numPr>
+        <w:rPr/>
+      </w:pPr>
+      <w:r>
+        <w:rPr/>
+        <w:t>If the window running the script closes, or the application stops, before the answer, the rest of the script does not run.</w:t>
+      </w:r>
+    </w:p>
+    <w:p>
+      <w:pPr>
+        <w:pStyle w:val="Heading1"/>
+        <w:rPr/>
+      </w:pPr>
+      <w:bookmarkStart w:id="25" w:name="__RefHeading___Toc3739_1782117212"/>
+      <w:bookmarkEnd w:id="25"/>
+      <w:r>
+        <w:rPr/>
+        <w:t>10  Alarms and security</w:t>
+      </w:r>
+    </w:p>
+    <w:p>
+      <w:pPr>
+        <w:pStyle w:val="Heading2"/>
+        <w:rPr/>
+      </w:pPr>
+      <w:bookmarkStart w:id="26" w:name="__RefHeading___Toc3741_1782117212"/>
+      <w:bookmarkEnd w:id="26"/>
+      <w:r>
+        <w:rPr/>
+        <w:t>10.1  Alarms</w:t>
+      </w:r>
+    </w:p>
+    <w:p>
+      <w:pPr>
+        <w:pStyle w:val="Normal"/>
+        <w:rPr/>
+      </w:pPr>
+      <w:r>
+        <w:rPr/>
+        <w:t>Alarms come from the limits set on tags (chapter 5). While the application runs, every alarmed tag is watched, whether or not a screen shows it:</w:t>
+      </w:r>
+    </w:p>
+    <w:p>
+      <w:pPr>
+        <w:pStyle w:val="ListBullet"/>
+        <w:numPr>
+          <w:ilvl w:val="0"/>
+          <w:numId w:val="1"/>
+        </w:numPr>
+        <w:rPr/>
+      </w:pPr>
+      <w:r>
+        <w:rPr/>
+        <w:t>Entering alarm, or escalating (High to HiHi), raises an alarm that needs acknowledging.</w:t>
+      </w:r>
+    </w:p>
+    <w:p>
+      <w:pPr>
+        <w:pStyle w:val="ListBullet"/>
+        <w:numPr>
+          <w:ilvl w:val="0"/>
+          <w:numId w:val="1"/>
+        </w:numPr>
+        <w:rPr/>
+      </w:pPr>
+      <w:r>
+        <w:rPr/>
+        <w:t xml:space="preserve">An alarm stays in the Alarm List until it has returned to normal </w:t>
+      </w:r>
+      <w:r>
+        <w:rPr>
+          <w:b/>
+        </w:rPr>
+        <w:t>and</w:t>
+      </w:r>
+      <w:r>
+        <w:rPr/>
+        <w:t xml:space="preserve"> been acknowledged (ISA-18.2).</w:t>
+      </w:r>
+    </w:p>
+    <w:p>
+      <w:pPr>
+        <w:pStyle w:val="ListBullet"/>
+        <w:numPr>
+          <w:ilvl w:val="0"/>
+          <w:numId w:val="1"/>
+        </w:numPr>
+        <w:rPr/>
+      </w:pPr>
+      <w:r>
+        <w:rPr/>
+        <w:t xml:space="preserve">The Alarm List object has an </w:t>
+      </w:r>
+      <w:r>
+        <w:rPr>
+          <w:b/>
+        </w:rPr>
+        <w:t>Ack All</w:t>
+      </w:r>
+      <w:r>
+        <w:rPr/>
+        <w:t xml:space="preserve"> button and an </w:t>
+      </w:r>
+      <w:r>
+        <w:rPr>
+          <w:b/>
+        </w:rPr>
+        <w:t>Ack</w:t>
+      </w:r>
+      <w:r>
+        <w:rPr/>
+        <w:t xml:space="preserve"> button on each row. A script can acknowledge with </w:t>
+      </w:r>
+      <w:r>
+        <w:rPr>
+          <w:rFonts w:ascii="Consolas" w:hAnsi="Consolas"/>
+          <w:sz w:val="19"/>
+        </w:rPr>
+        <w:t>_AckAll = 1;</w:t>
+      </w:r>
+      <w:r>
+        <w:rPr/>
+        <w:t xml:space="preserve"> or </w:t>
+      </w:r>
+      <w:r>
+        <w:rPr>
+          <w:rFonts w:ascii="Consolas" w:hAnsi="Consolas"/>
+          <w:sz w:val="19"/>
+        </w:rPr>
+        <w:t>Tag.Acked = 1;</w:t>
+      </w:r>
+      <w:r>
+        <w:rPr/>
+        <w:t>.</w:t>
+      </w:r>
+    </w:p>
+    <w:p>
+      <w:pPr>
+        <w:pStyle w:val="ListBullet"/>
+        <w:numPr>
+          <w:ilvl w:val="0"/>
+          <w:numId w:val="1"/>
+        </w:numPr>
+        <w:rPr/>
+      </w:pPr>
+      <w:r>
+        <w:rPr/>
+        <w:t>Every alarm event is written to a daily history file kept for 90 days; the Alarm History object shows it (Figure 40).</w:t>
+      </w:r>
+      <w:r>
+        <w:br w:type="page"/>
+      </w:r>
+    </w:p>
+    <w:p>
+      <w:pPr>
+        <w:pStyle w:val="Heading2"/>
+        <w:rPr/>
+      </w:pPr>
+      <w:bookmarkStart w:id="27" w:name="__RefHeading___Toc3743_1782117212"/>
+      <w:bookmarkEnd w:id="27"/>
+      <w:r>
+        <w:rPr/>
+        <w:t>10.2  Users and access levels</w:t>
+      </w:r>
+    </w:p>
+    <w:p>
+      <w:pPr>
+        <w:pStyle w:val="Normal"/>
+        <w:rPr/>
+      </w:pPr>
+      <w:r>
+        <w:rPr/>
+        <w:t xml:space="preserve">Open </w:t>
+      </w:r>
+      <w:r>
+        <w:rPr>
+          <w:b/>
+        </w:rPr>
+        <w:t>HMI &gt; Users</w:t>
+      </w:r>
+      <w:r>
+        <w:rPr/>
+        <w:t xml:space="preserve"> to define who can log in. Each user has a name, a password (stored only as a salted hash) and an access level from 0 to 9999.</w:t>
+      </w:r>
+    </w:p>
+    <w:p>
+      <w:pPr>
+        <w:pStyle w:val="Normal"/>
+        <w:keepNext w:val="true"/>
+        <w:jc w:val="center"/>
+        <w:rPr/>
+      </w:pPr>
+      <w:r>
+        <w:rPr/>
+        <w:drawing>
+          <wp:inline distT="0" distB="0" distL="0" distR="0">
+            <wp:extent cx="4023360" cy="4023360"/>
+            <wp:effectExtent l="0" t="0" r="0" b="0"/>
+            <wp:docPr id="24" name="Picture 24"/>
+            <wp:cNvGraphicFramePr>
+              <a:graphicFrameLocks xmlns:a="http://schemas.openxmlformats.org/drawingml/2006/main" noChangeAspect="1"/>
+            </wp:cNvGraphicFramePr>
+            <a:graphic xmlns:a="http://schemas.openxmlformats.org/drawingml/2006/main">
+              <a:graphicData uri="http://schemas.openxmlformats.org/drawingml/2006/picture">
+                <pic:pic xmlns:pic="http://schemas.openxmlformats.org/drawingml/2006/picture">
+                  <pic:nvPicPr>
+                    <pic:cNvPr id="24" name="Picture 24"/>
+                    <pic:cNvPicPr>
+                      <a:picLocks noChangeAspect="1" noChangeArrowheads="1"/>
+                    </pic:cNvPicPr>
+                  </pic:nvPicPr>
+                  <pic:blipFill>
+                    <a:blip r:embed="rId25"/>
+                    <a:stretch>
+                      <a:fillRect/>
+                    </a:stretch>
+                  </pic:blipFill>
+                  <pic:spPr bwMode="auto">
+                    <a:xfrm>
+                      <a:off x="0" y="0"/>
                       <a:ext cx="4023360" cy="4023360"/>
                     </a:xfrm>
                     <a:prstGeom prst="rect">
@@ -14888,7 +15392,7 @@
       </w:pPr>
       <w:r>
         <w:rPr/>
-        <w:t>Figure 21. The Users dialog with LiquidWeighHMI's three users</w:t>
+        <w:t>Figure 23. The Users dialog with LiquidWeighHMI's three users</w:t>
       </w:r>
     </w:p>
     <w:p>
@@ -15382,7 +15886,7 @@
       </w:r>
       <w:r>
         <w:rPr/>
-        <w:t xml:space="preserve"> opens the built-in login window (Figure 22); </w:t>
+        <w:t xml:space="preserve"> opens the built-in login window (Figure 24); </w:t>
       </w:r>
       <w:r>
         <w:rPr>
@@ -15442,7 +15946,7 @@
           <wp:inline distT="0" distB="0" distL="0" distR="0">
             <wp:extent cx="3657600" cy="1840865"/>
             <wp:effectExtent l="0" t="0" r="0" b="0"/>
-            <wp:docPr id="23" name="Picture 23"/>
+            <wp:docPr id="25" name="Picture 25"/>
             <wp:cNvGraphicFramePr>
               <a:graphicFrameLocks xmlns:a="http://schemas.openxmlformats.org/drawingml/2006/main" noChangeAspect="1"/>
             </wp:cNvGraphicFramePr>
@@ -15450,13 +15954,13 @@
               <a:graphicData uri="http://schemas.openxmlformats.org/drawingml/2006/picture">
                 <pic:pic xmlns:pic="http://schemas.openxmlformats.org/drawingml/2006/picture">
                   <pic:nvPicPr>
-                    <pic:cNvPr id="23" name="Picture 23"/>
+                    <pic:cNvPr id="25" name="Picture 25"/>
                     <pic:cNvPicPr>
                       <a:picLocks noChangeAspect="1" noChangeArrowheads="1"/>
                     </pic:cNvPicPr>
                   </pic:nvPicPr>
                   <pic:blipFill>
-                    <a:blip r:embed="rId24"/>
+                    <a:blip r:embed="rId26"/>
                     <a:stretch>
                       <a:fillRect/>
                     </a:stretch>
@@ -15486,7 +15990,7 @@
       </w:pPr>
       <w:r>
         <w:rPr/>
-        <w:t>Figure 22. The login window opened by ShowLogin()</w:t>
+        <w:t>Figure 24. The login window opened by ShowLogin()</w:t>
       </w:r>
     </w:p>
     <w:p>
@@ -15494,8 +15998,8 @@
         <w:pStyle w:val="Heading1"/>
         <w:rPr/>
       </w:pPr>
-      <w:bookmarkStart w:id="27" w:name="__RefHeading___Toc3709_3507643775"/>
-      <w:bookmarkEnd w:id="27"/>
+      <w:bookmarkStart w:id="28" w:name="__RefHeading___Toc3745_1782117212"/>
+      <w:bookmarkEnd w:id="28"/>
       <w:r>
         <w:rPr/>
         <w:t>11  Recipes</w:t>
@@ -15630,8 +16134,8 @@
         <w:pStyle w:val="Heading2"/>
         <w:rPr/>
       </w:pPr>
-      <w:bookmarkStart w:id="28" w:name="__RefHeading___Toc3711_3507643775"/>
-      <w:bookmarkEnd w:id="28"/>
+      <w:bookmarkStart w:id="29" w:name="__RefHeading___Toc3747_1782117212"/>
+      <w:bookmarkEnd w:id="29"/>
       <w:r>
         <w:rPr/>
         <w:t>11.1  Recipe books</w:t>
@@ -15680,7 +16184,7 @@
           <wp:inline distT="0" distB="0" distL="0" distR="0">
             <wp:extent cx="5120640" cy="3790315"/>
             <wp:effectExtent l="0" t="0" r="0" b="0"/>
-            <wp:docPr id="24" name="Picture 24"/>
+            <wp:docPr id="26" name="Picture 26"/>
             <wp:cNvGraphicFramePr>
               <a:graphicFrameLocks xmlns:a="http://schemas.openxmlformats.org/drawingml/2006/main" noChangeAspect="1"/>
             </wp:cNvGraphicFramePr>
@@ -15688,13 +16192,13 @@
               <a:graphicData uri="http://schemas.openxmlformats.org/drawingml/2006/picture">
                 <pic:pic xmlns:pic="http://schemas.openxmlformats.org/drawingml/2006/picture">
                   <pic:nvPicPr>
-                    <pic:cNvPr id="24" name="Picture 24"/>
+                    <pic:cNvPr id="26" name="Picture 26"/>
                     <pic:cNvPicPr>
                       <a:picLocks noChangeAspect="1" noChangeArrowheads="1"/>
                     </pic:cNvPicPr>
                   </pic:nvPicPr>
                   <pic:blipFill>
-                    <a:blip r:embed="rId25"/>
+                    <a:blip r:embed="rId27"/>
                     <a:stretch>
                       <a:fillRect/>
                     </a:stretch>
@@ -15724,7 +16228,7 @@
       </w:pPr>
       <w:r>
         <w:rPr/>
-        <w:t>Figure 23. HMI &gt; Recipes: the Plasticizer Blends book and its tags</w:t>
+        <w:t>Figure 25. HMI &gt; Recipes: the Plasticizer Blends book and its tags</w:t>
       </w:r>
     </w:p>
     <w:p>
@@ -16447,7 +16951,7 @@
           <wp:inline distT="0" distB="0" distL="0" distR="0">
             <wp:extent cx="5120640" cy="3790315"/>
             <wp:effectExtent l="0" t="0" r="0" b="0"/>
-            <wp:docPr id="25" name="Picture 25"/>
+            <wp:docPr id="27" name="Picture 27"/>
             <wp:cNvGraphicFramePr>
               <a:graphicFrameLocks xmlns:a="http://schemas.openxmlformats.org/drawingml/2006/main" noChangeAspect="1"/>
             </wp:cNvGraphicFramePr>
@@ -16455,13 +16959,13 @@
               <a:graphicData uri="http://schemas.openxmlformats.org/drawingml/2006/picture">
                 <pic:pic xmlns:pic="http://schemas.openxmlformats.org/drawingml/2006/picture">
                   <pic:nvPicPr>
-                    <pic:cNvPr id="25" name="Picture 25"/>
+                    <pic:cNvPr id="27" name="Picture 27"/>
                     <pic:cNvPicPr>
                       <a:picLocks noChangeAspect="1" noChangeArrowheads="1"/>
                     </pic:cNvPicPr>
                   </pic:nvPicPr>
                   <pic:blipFill>
-                    <a:blip r:embed="rId26"/>
+                    <a:blip r:embed="rId28"/>
                     <a:stretch>
                       <a:fillRect/>
                     </a:stretch>
@@ -16491,7 +16995,7 @@
       </w:pPr>
       <w:r>
         <w:rPr/>
-        <w:t>Figure 24. The starting recipes of Plasticizer Blends, below its tags</w:t>
+        <w:t>Figure 26. The starting recipes of Plasticizer Blends, below its tags</w:t>
       </w:r>
     </w:p>
     <w:p>
@@ -17491,8 +17995,8 @@
         <w:pStyle w:val="Heading2"/>
         <w:rPr/>
       </w:pPr>
-      <w:bookmarkStart w:id="29" w:name="__RefHeading___Toc3713_3507643775"/>
-      <w:bookmarkEnd w:id="29"/>
+      <w:bookmarkStart w:id="30" w:name="__RefHeading___Toc3749_1782117212"/>
+      <w:bookmarkEnd w:id="30"/>
       <w:r>
         <w:rPr/>
         <w:t>11.2  The Recipes screen</w:t>
@@ -17531,7 +18035,7 @@
           <wp:inline distT="0" distB="0" distL="0" distR="0">
             <wp:extent cx="5943600" cy="3343275"/>
             <wp:effectExtent l="0" t="0" r="0" b="0"/>
-            <wp:docPr id="26" name="Picture 26"/>
+            <wp:docPr id="28" name="Picture 28"/>
             <wp:cNvGraphicFramePr>
               <a:graphicFrameLocks xmlns:a="http://schemas.openxmlformats.org/drawingml/2006/main" noChangeAspect="1"/>
             </wp:cNvGraphicFramePr>
@@ -17539,13 +18043,13 @@
               <a:graphicData uri="http://schemas.openxmlformats.org/drawingml/2006/picture">
                 <pic:pic xmlns:pic="http://schemas.openxmlformats.org/drawingml/2006/picture">
                   <pic:nvPicPr>
-                    <pic:cNvPr id="26" name="Picture 26"/>
+                    <pic:cNvPr id="28" name="Picture 28"/>
                     <pic:cNvPicPr>
                       <a:picLocks noChangeAspect="1" noChangeArrowheads="1"/>
                     </pic:cNvPicPr>
                   </pic:nvPicPr>
                   <pic:blipFill>
-                    <a:blip r:embed="rId27"/>
+                    <a:blip r:embed="rId29"/>
                     <a:stretch>
                       <a:fillRect/>
                     </a:stretch>
@@ -17575,7 +18079,7 @@
       </w:pPr>
       <w:r>
         <w:rPr/>
-        <w:t>Figure 25. The Recipes screen at Run: Standard Blend selected, loaded and downloaded to the PLC</w:t>
+        <w:t>Figure 27. The Recipes screen at Run: Standard Blend selected, loaded and downloaded to the PLC</w:t>
       </w:r>
     </w:p>
     <w:p>
@@ -18886,7 +19390,7 @@
           <wp:inline distT="0" distB="0" distL="0" distR="0">
             <wp:extent cx="3657600" cy="1771015"/>
             <wp:effectExtent l="0" t="0" r="0" b="0"/>
-            <wp:docPr id="27" name="Picture 27"/>
+            <wp:docPr id="29" name="Picture 29"/>
             <wp:cNvGraphicFramePr>
               <a:graphicFrameLocks xmlns:a="http://schemas.openxmlformats.org/drawingml/2006/main" noChangeAspect="1"/>
             </wp:cNvGraphicFramePr>
@@ -18894,13 +19398,13 @@
               <a:graphicData uri="http://schemas.openxmlformats.org/drawingml/2006/picture">
                 <pic:pic xmlns:pic="http://schemas.openxmlformats.org/drawingml/2006/picture">
                   <pic:nvPicPr>
-                    <pic:cNvPr id="27" name="Picture 27"/>
+                    <pic:cNvPr id="29" name="Picture 29"/>
                     <pic:cNvPicPr>
                       <a:picLocks noChangeAspect="1" noChangeArrowheads="1"/>
                     </pic:cNvPicPr>
                   </pic:nvPicPr>
                   <pic:blipFill>
-                    <a:blip r:embed="rId28"/>
+                    <a:blip r:embed="rId30"/>
                     <a:stretch>
                       <a:fillRect/>
                     </a:stretch>
@@ -18930,7 +19434,7 @@
       </w:pPr>
       <w:r>
         <w:rPr/>
-        <w:t>Figure 26. RecipeDelete with confirm: the operator answers before anything is deleted</w:t>
+        <w:t>Figure 28. RecipeDelete with confirm: the operator answers before anything is deleted</w:t>
       </w:r>
       <w:r>
         <w:br w:type="page"/>
@@ -18941,8 +19445,8 @@
         <w:pStyle w:val="Heading2"/>
         <w:rPr/>
       </w:pPr>
-      <w:bookmarkStart w:id="30" w:name="__RefHeading___Toc3715_3507643775"/>
-      <w:bookmarkEnd w:id="30"/>
+      <w:bookmarkStart w:id="31" w:name="__RefHeading___Toc3751_1782117212"/>
+      <w:bookmarkEnd w:id="31"/>
       <w:r>
         <w:rPr/>
         <w:t>11.3  The Recipe List object</w:t>
@@ -18977,7 +19481,7 @@
           <wp:inline distT="0" distB="0" distL="0" distR="0">
             <wp:extent cx="1908175" cy="3307715"/>
             <wp:effectExtent l="0" t="0" r="0" b="0"/>
-            <wp:docPr id="28" name="Picture 28"/>
+            <wp:docPr id="30" name="Picture 30"/>
             <wp:cNvGraphicFramePr>
               <a:graphicFrameLocks xmlns:a="http://schemas.openxmlformats.org/drawingml/2006/main" noChangeAspect="1"/>
             </wp:cNvGraphicFramePr>
@@ -18985,13 +19489,13 @@
               <a:graphicData uri="http://schemas.openxmlformats.org/drawingml/2006/picture">
                 <pic:pic xmlns:pic="http://schemas.openxmlformats.org/drawingml/2006/picture">
                   <pic:nvPicPr>
-                    <pic:cNvPr id="28" name="Picture 28"/>
+                    <pic:cNvPr id="30" name="Picture 30"/>
                     <pic:cNvPicPr>
                       <a:picLocks noChangeAspect="1" noChangeArrowheads="1"/>
                     </pic:cNvPicPr>
                   </pic:nvPicPr>
                   <pic:blipFill>
-                    <a:blip r:embed="rId29"/>
+                    <a:blip r:embed="rId31"/>
                     <a:stretch>
                       <a:fillRect/>
                     </a:stretch>
@@ -19021,7 +19525,7 @@
       </w:pPr>
       <w:r>
         <w:rPr/>
-        <w:t>Figure 27. The Recipe List settings of the Recipes screen's list</w:t>
+        <w:t>Figure 29. The Recipe List settings of the Recipes screen's list</w:t>
       </w:r>
     </w:p>
     <w:p>
@@ -19482,8 +19986,8 @@
         <w:pStyle w:val="Heading2"/>
         <w:rPr/>
       </w:pPr>
-      <w:bookmarkStart w:id="31" w:name="__RefHeading___Toc3717_3507643775"/>
-      <w:bookmarkEnd w:id="31"/>
+      <w:bookmarkStart w:id="32" w:name="__RefHeading___Toc3753_1782117212"/>
+      <w:bookmarkEnd w:id="32"/>
       <w:r>
         <w:rPr/>
         <w:t>11.4  Selecting a recipe in a window</w:t>
@@ -19659,7 +20163,7 @@
           <wp:inline distT="0" distB="0" distL="0" distR="0">
             <wp:extent cx="3657600" cy="3100070"/>
             <wp:effectExtent l="0" t="0" r="0" b="0"/>
-            <wp:docPr id="29" name="Picture 29"/>
+            <wp:docPr id="31" name="Picture 31"/>
             <wp:cNvGraphicFramePr>
               <a:graphicFrameLocks xmlns:a="http://schemas.openxmlformats.org/drawingml/2006/main" noChangeAspect="1"/>
             </wp:cNvGraphicFramePr>
@@ -19667,13 +20171,13 @@
               <a:graphicData uri="http://schemas.openxmlformats.org/drawingml/2006/picture">
                 <pic:pic xmlns:pic="http://schemas.openxmlformats.org/drawingml/2006/picture">
                   <pic:nvPicPr>
-                    <pic:cNvPr id="29" name="Picture 29"/>
+                    <pic:cNvPr id="31" name="Picture 31"/>
                     <pic:cNvPicPr>
                       <a:picLocks noChangeAspect="1" noChangeArrowheads="1"/>
                     </pic:cNvPicPr>
                   </pic:nvPicPr>
                   <pic:blipFill>
-                    <a:blip r:embed="rId30"/>
+                    <a:blip r:embed="rId32"/>
                     <a:stretch>
                       <a:fillRect/>
                     </a:stretch>
@@ -19703,7 +20207,7 @@
       </w:pPr>
       <w:r>
         <w:rPr/>
-        <w:t>Figure 28. The window opened by ShowRecipeSelect</w:t>
+        <w:t>Figure 30. The window opened by ShowRecipeSelect</w:t>
       </w:r>
     </w:p>
     <w:p>
@@ -19767,8 +20271,8 @@
         <w:pStyle w:val="Heading2"/>
         <w:rPr/>
       </w:pPr>
-      <w:bookmarkStart w:id="32" w:name="__RefHeading___Toc3719_3507643775"/>
-      <w:bookmarkEnd w:id="32"/>
+      <w:bookmarkStart w:id="33" w:name="__RefHeading___Toc3755_1782117212"/>
+      <w:bookmarkEnd w:id="33"/>
       <w:r>
         <w:rPr/>
         <w:t>11.5  When a recipe function fails</w:t>
@@ -19807,7 +20311,7 @@
           <wp:inline distT="0" distB="0" distL="0" distR="0">
             <wp:extent cx="3657600" cy="2279650"/>
             <wp:effectExtent l="0" t="0" r="0" b="0"/>
-            <wp:docPr id="30" name="Picture 30"/>
+            <wp:docPr id="32" name="Picture 32"/>
             <wp:cNvGraphicFramePr>
               <a:graphicFrameLocks xmlns:a="http://schemas.openxmlformats.org/drawingml/2006/main" noChangeAspect="1"/>
             </wp:cNvGraphicFramePr>
@@ -19815,13 +20319,13 @@
               <a:graphicData uri="http://schemas.openxmlformats.org/drawingml/2006/picture">
                 <pic:pic xmlns:pic="http://schemas.openxmlformats.org/drawingml/2006/picture">
                   <pic:nvPicPr>
-                    <pic:cNvPr id="30" name="Picture 30"/>
+                    <pic:cNvPr id="32" name="Picture 32"/>
                     <pic:cNvPicPr>
                       <a:picLocks noChangeAspect="1" noChangeArrowheads="1"/>
                     </pic:cNvPicPr>
                   </pic:nvPicPr>
                   <pic:blipFill>
-                    <a:blip r:embed="rId31"/>
+                    <a:blip r:embed="rId33"/>
                     <a:stretch>
                       <a:fillRect/>
                     </a:stretch>
@@ -19851,7 +20355,7 @@
       </w:pPr>
       <w:r>
         <w:rPr/>
-        <w:t>Figure 29. The Recipe Error window</w:t>
+        <w:t>Figure 31. The Recipe Error window</w:t>
       </w:r>
     </w:p>
     <w:p>
@@ -19925,8 +20429,8 @@
         <w:pStyle w:val="Heading2"/>
         <w:rPr/>
       </w:pPr>
-      <w:bookmarkStart w:id="33" w:name="__RefHeading___Toc3721_3507643775"/>
-      <w:bookmarkEnd w:id="33"/>
+      <w:bookmarkStart w:id="34" w:name="__RefHeading___Toc3757_1782117212"/>
+      <w:bookmarkEnd w:id="34"/>
       <w:r>
         <w:rPr/>
         <w:t>11.6  Where recipes are kept</w:t>
@@ -20325,8 +20829,8 @@
         <w:pStyle w:val="Heading1"/>
         <w:rPr/>
       </w:pPr>
-      <w:bookmarkStart w:id="34" w:name="__RefHeading___Toc3723_3507643775"/>
-      <w:bookmarkEnd w:id="34"/>
+      <w:bookmarkStart w:id="35" w:name="__RefHeading___Toc3759_1782117212"/>
+      <w:bookmarkEnd w:id="35"/>
       <w:r>
         <w:rPr/>
         <w:t>12  Testing</w:t>
@@ -20337,8 +20841,8 @@
         <w:pStyle w:val="Heading2"/>
         <w:rPr/>
       </w:pPr>
-      <w:bookmarkStart w:id="35" w:name="__RefHeading___Toc3725_3507643775"/>
-      <w:bookmarkEnd w:id="35"/>
+      <w:bookmarkStart w:id="36" w:name="__RefHeading___Toc3761_1782117212"/>
+      <w:bookmarkEnd w:id="36"/>
       <w:r>
         <w:rPr/>
         <w:t>12.1  Validate</w:t>
@@ -20372,174 +20876,6 @@
         <w:drawing>
           <wp:inline distT="0" distB="0" distL="0" distR="0">
             <wp:extent cx="3657600" cy="2837180"/>
-            <wp:effectExtent l="0" t="0" r="0" b="0"/>
-            <wp:docPr id="31" name="Picture 31"/>
-            <wp:cNvGraphicFramePr>
-              <a:graphicFrameLocks xmlns:a="http://schemas.openxmlformats.org/drawingml/2006/main" noChangeAspect="1"/>
-            </wp:cNvGraphicFramePr>
-            <a:graphic xmlns:a="http://schemas.openxmlformats.org/drawingml/2006/main">
-              <a:graphicData uri="http://schemas.openxmlformats.org/drawingml/2006/picture">
-                <pic:pic xmlns:pic="http://schemas.openxmlformats.org/drawingml/2006/picture">
-                  <pic:nvPicPr>
-                    <pic:cNvPr id="31" name="Picture 31"/>
-                    <pic:cNvPicPr>
-                      <a:picLocks noChangeAspect="1" noChangeArrowheads="1"/>
-                    </pic:cNvPicPr>
-                  </pic:nvPicPr>
-                  <pic:blipFill>
-                    <a:blip r:embed="rId32"/>
-                    <a:stretch>
-                      <a:fillRect/>
-                    </a:stretch>
-                  </pic:blipFill>
-                  <pic:spPr bwMode="auto">
-                    <a:xfrm>
-                      <a:off x="0" y="0"/>
-                      <a:ext cx="3657600" cy="2837180"/>
-                    </a:xfrm>
-                    <a:prstGeom prst="rect">
-                      <a:avLst/>
-                    </a:prstGeom>
-                    <a:noFill/>
-                  </pic:spPr>
-                </pic:pic>
-              </a:graphicData>
-            </a:graphic>
-          </wp:inline>
-        </w:drawing>
-      </w:r>
-    </w:p>
-    <w:p>
-      <w:pPr>
-        <w:pStyle w:val="Caption"/>
-        <w:jc w:val="center"/>
-        <w:rPr/>
-      </w:pPr>
-      <w:r>
-        <w:rPr/>
-        <w:t>Figure 30. Validation of LiquidWeighHMI: no problems found</w:t>
-      </w:r>
-    </w:p>
-    <w:p>
-      <w:pPr>
-        <w:pStyle w:val="Heading2"/>
-        <w:rPr/>
-      </w:pPr>
-      <w:bookmarkStart w:id="36" w:name="__RefHeading___Toc3727_3507643775"/>
-      <w:bookmarkEnd w:id="36"/>
-      <w:r>
-        <w:rPr/>
-        <w:t>12.2  Run</w:t>
-      </w:r>
-    </w:p>
-    <w:p>
-      <w:pPr>
-        <w:pStyle w:val="Normal"/>
-        <w:rPr/>
-      </w:pPr>
-      <w:r>
-        <w:rPr>
-          <w:b/>
-        </w:rPr>
-        <w:t>HMI &gt; Run</w:t>
-      </w:r>
-      <w:r>
-        <w:rPr/>
-        <w:t xml:space="preserve"> (F5) runs the application inside the Studio: the drawing is locked, the start-up windows open, and the application connects to its PLCs. A green RUNNING banner shows that the screen is live and that touching it operates real equipment. </w:t>
-      </w:r>
-      <w:r>
-        <w:rPr>
-          <w:b/>
-        </w:rPr>
-        <w:t>HMI &gt; Stop</w:t>
-      </w:r>
-      <w:r>
-        <w:rPr/>
-        <w:t xml:space="preserve"> returns to editing.</w:t>
-      </w:r>
-    </w:p>
-    <w:p>
-      <w:pPr>
-        <w:pStyle w:val="Normal"/>
-        <w:keepNext w:val="true"/>
-        <w:jc w:val="center"/>
-        <w:rPr/>
-      </w:pPr>
-      <w:r>
-        <w:rPr/>
-        <w:drawing>
-          <wp:inline distT="0" distB="0" distL="0" distR="0">
-            <wp:extent cx="5943600" cy="3714750"/>
-            <wp:effectExtent l="0" t="0" r="0" b="0"/>
-            <wp:docPr id="32" name="Picture 32"/>
-            <wp:cNvGraphicFramePr>
-              <a:graphicFrameLocks xmlns:a="http://schemas.openxmlformats.org/drawingml/2006/main" noChangeAspect="1"/>
-            </wp:cNvGraphicFramePr>
-            <a:graphic xmlns:a="http://schemas.openxmlformats.org/drawingml/2006/main">
-              <a:graphicData uri="http://schemas.openxmlformats.org/drawingml/2006/picture">
-                <pic:pic xmlns:pic="http://schemas.openxmlformats.org/drawingml/2006/picture">
-                  <pic:nvPicPr>
-                    <pic:cNvPr id="32" name="Picture 32"/>
-                    <pic:cNvPicPr>
-                      <a:picLocks noChangeAspect="1" noChangeArrowheads="1"/>
-                    </pic:cNvPicPr>
-                  </pic:nvPicPr>
-                  <pic:blipFill>
-                    <a:blip r:embed="rId33"/>
-                    <a:stretch>
-                      <a:fillRect/>
-                    </a:stretch>
-                  </pic:blipFill>
-                  <pic:spPr bwMode="auto">
-                    <a:xfrm>
-                      <a:off x="0" y="0"/>
-                      <a:ext cx="5943600" cy="3714750"/>
-                    </a:xfrm>
-                    <a:prstGeom prst="rect">
-                      <a:avLst/>
-                    </a:prstGeom>
-                    <a:noFill/>
-                  </pic:spPr>
-                </pic:pic>
-              </a:graphicData>
-            </a:graphic>
-          </wp:inline>
-        </w:drawing>
-      </w:r>
-    </w:p>
-    <w:p>
-      <w:pPr>
-        <w:pStyle w:val="Caption"/>
-        <w:jc w:val="center"/>
-        <w:rPr/>
-      </w:pPr>
-      <w:r>
-        <w:rPr/>
-        <w:t>Figure 31. LiquidWeighHMI running in the Studio</w:t>
-      </w:r>
-    </w:p>
-    <w:p>
-      <w:pPr>
-        <w:pStyle w:val="Normal"/>
-        <w:rPr/>
-      </w:pPr>
-      <w:r>
-        <w:rPr/>
-        <w:t>The screens below were captured while LiquidWeighHMI ran against its controller, between batches.</w:t>
-      </w:r>
-    </w:p>
-    <w:p>
-      <w:pPr>
-        <w:pStyle w:val="Normal"/>
-        <w:keepNext w:val="true"/>
-        <w:jc w:val="center"/>
-        <w:rPr/>
-      </w:pPr>
-      <w:r>
-        <w:rPr/>
-        <w:drawing>
-          <wp:inline distT="0" distB="0" distL="0" distR="0">
-            <wp:extent cx="5943600" cy="3343275"/>
             <wp:effectExtent l="0" t="0" r="0" b="0"/>
             <wp:docPr id="33" name="Picture 33"/>
             <wp:cNvGraphicFramePr>
@@ -20563,7 +20899,7 @@
                   <pic:spPr bwMode="auto">
                     <a:xfrm>
                       <a:off x="0" y="0"/>
-                      <a:ext cx="5943600" cy="3343275"/>
+                      <a:ext cx="3657600" cy="2837180"/>
                     </a:xfrm>
                     <a:prstGeom prst="rect">
                       <a:avLst/>
@@ -20585,7 +20921,45 @@
       </w:pPr>
       <w:r>
         <w:rPr/>
-        <w:t>Figure 32. Process screen: tank and hopper levels, valve states, sequence and active alarms</w:t>
+        <w:t>Figure 32. Validation of LiquidWeighHMI: no problems found</w:t>
+      </w:r>
+    </w:p>
+    <w:p>
+      <w:pPr>
+        <w:pStyle w:val="Heading2"/>
+        <w:rPr/>
+      </w:pPr>
+      <w:bookmarkStart w:id="37" w:name="__RefHeading___Toc3763_1782117212"/>
+      <w:bookmarkEnd w:id="37"/>
+      <w:r>
+        <w:rPr/>
+        <w:t>12.2  Run</w:t>
+      </w:r>
+    </w:p>
+    <w:p>
+      <w:pPr>
+        <w:pStyle w:val="Normal"/>
+        <w:rPr/>
+      </w:pPr>
+      <w:r>
+        <w:rPr>
+          <w:b/>
+        </w:rPr>
+        <w:t>HMI &gt; Run</w:t>
+      </w:r>
+      <w:r>
+        <w:rPr/>
+        <w:t xml:space="preserve"> (F5) runs the application inside the Studio: the drawing is locked, the start-up windows open, and the application connects to its PLCs. A green RUNNING banner shows that the screen is live and that touching it operates real equipment. </w:t>
+      </w:r>
+      <w:r>
+        <w:rPr>
+          <w:b/>
+        </w:rPr>
+        <w:t>HMI &gt; Stop</w:t>
+      </w:r>
+      <w:r>
+        <w:rPr/>
+        <w:t xml:space="preserve"> returns to editing.</w:t>
       </w:r>
     </w:p>
     <w:p>
@@ -20599,7 +20973,7 @@
         <w:rPr/>
         <w:drawing>
           <wp:inline distT="0" distB="0" distL="0" distR="0">
-            <wp:extent cx="5943600" cy="3343275"/>
+            <wp:extent cx="5943600" cy="3714750"/>
             <wp:effectExtent l="0" t="0" r="0" b="0"/>
             <wp:docPr id="34" name="Picture 34"/>
             <wp:cNvGraphicFramePr>
@@ -20623,7 +20997,7 @@
                   <pic:spPr bwMode="auto">
                     <a:xfrm>
                       <a:off x="0" y="0"/>
-                      <a:ext cx="5943600" cy="3343275"/>
+                      <a:ext cx="5943600" cy="3714750"/>
                     </a:xfrm>
                     <a:prstGeom prst="rect">
                       <a:avLst/>
@@ -20645,7 +21019,17 @@
       </w:pPr>
       <w:r>
         <w:rPr/>
-        <w:t>Figure 33. The Device Faceplate showing SV-001: mode, commands, interlocks and fault reset</w:t>
+        <w:t>Figure 33. LiquidWeighHMI running in the Studio</w:t>
+      </w:r>
+    </w:p>
+    <w:p>
+      <w:pPr>
+        <w:pStyle w:val="Normal"/>
+        <w:rPr/>
+      </w:pPr>
+      <w:r>
+        <w:rPr/>
+        <w:t>The screens below were captured while LiquidWeighHMI ran against its controller, between batches.</w:t>
       </w:r>
     </w:p>
     <w:p>
@@ -20705,7 +21089,7 @@
       </w:pPr>
       <w:r>
         <w:rPr/>
-        <w:t>Figure 34. Batch screen: recipe, sequence control, start permissives and batch progress</w:t>
+        <w:t>Figure 34. Process screen: tank and hopper levels, valve states, sequence and active alarms</w:t>
       </w:r>
     </w:p>
     <w:p>
@@ -20765,7 +21149,7 @@
       </w:pPr>
       <w:r>
         <w:rPr/>
-        <w:t>Figure 35. Setpoints screen: materials, weighing, pressure and timing</w:t>
+        <w:t>Figure 35. The Device Faceplate showing SV-001: mode, commands, interlocks and fault reset</w:t>
       </w:r>
     </w:p>
     <w:p>
@@ -20825,7 +21209,7 @@
       </w:pPr>
       <w:r>
         <w:rPr/>
-        <w:t>Figure 36. Devices screen: every valve and pump with mode, state and faceplate</w:t>
+        <w:t>Figure 36. Batch screen: recipe, sequence control, start permissives and batch progress</w:t>
       </w:r>
     </w:p>
     <w:p>
@@ -20885,7 +21269,7 @@
       </w:pPr>
       <w:r>
         <w:rPr/>
-        <w:t>Figure 37. Supply screen: plasticizer tank, refill station and totes</w:t>
+        <w:t>Figure 37. Setpoints screen: materials, weighing, pressure and timing</w:t>
       </w:r>
     </w:p>
     <w:p>
@@ -20945,7 +21329,127 @@
       </w:pPr>
       <w:r>
         <w:rPr/>
-        <w:t>Figure 38. Alarm History screen</w:t>
+        <w:t>Figure 38. Devices screen: every valve and pump with mode, state and faceplate</w:t>
+      </w:r>
+    </w:p>
+    <w:p>
+      <w:pPr>
+        <w:pStyle w:val="Normal"/>
+        <w:keepNext w:val="true"/>
+        <w:jc w:val="center"/>
+        <w:rPr/>
+      </w:pPr>
+      <w:r>
+        <w:rPr/>
+        <w:drawing>
+          <wp:inline distT="0" distB="0" distL="0" distR="0">
+            <wp:extent cx="5943600" cy="3343275"/>
+            <wp:effectExtent l="0" t="0" r="0" b="0"/>
+            <wp:docPr id="40" name="Picture 40"/>
+            <wp:cNvGraphicFramePr>
+              <a:graphicFrameLocks xmlns:a="http://schemas.openxmlformats.org/drawingml/2006/main" noChangeAspect="1"/>
+            </wp:cNvGraphicFramePr>
+            <a:graphic xmlns:a="http://schemas.openxmlformats.org/drawingml/2006/main">
+              <a:graphicData uri="http://schemas.openxmlformats.org/drawingml/2006/picture">
+                <pic:pic xmlns:pic="http://schemas.openxmlformats.org/drawingml/2006/picture">
+                  <pic:nvPicPr>
+                    <pic:cNvPr id="40" name="Picture 40"/>
+                    <pic:cNvPicPr>
+                      <a:picLocks noChangeAspect="1" noChangeArrowheads="1"/>
+                    </pic:cNvPicPr>
+                  </pic:nvPicPr>
+                  <pic:blipFill>
+                    <a:blip r:embed="rId41"/>
+                    <a:stretch>
+                      <a:fillRect/>
+                    </a:stretch>
+                  </pic:blipFill>
+                  <pic:spPr bwMode="auto">
+                    <a:xfrm>
+                      <a:off x="0" y="0"/>
+                      <a:ext cx="5943600" cy="3343275"/>
+                    </a:xfrm>
+                    <a:prstGeom prst="rect">
+                      <a:avLst/>
+                    </a:prstGeom>
+                    <a:noFill/>
+                  </pic:spPr>
+                </pic:pic>
+              </a:graphicData>
+            </a:graphic>
+          </wp:inline>
+        </w:drawing>
+      </w:r>
+    </w:p>
+    <w:p>
+      <w:pPr>
+        <w:pStyle w:val="Caption"/>
+        <w:jc w:val="center"/>
+        <w:rPr/>
+      </w:pPr>
+      <w:r>
+        <w:rPr/>
+        <w:t>Figure 39. Supply screen: plasticizer tank, refill station and totes</w:t>
+      </w:r>
+    </w:p>
+    <w:p>
+      <w:pPr>
+        <w:pStyle w:val="Normal"/>
+        <w:keepNext w:val="true"/>
+        <w:jc w:val="center"/>
+        <w:rPr/>
+      </w:pPr>
+      <w:r>
+        <w:rPr/>
+        <w:drawing>
+          <wp:inline distT="0" distB="0" distL="0" distR="0">
+            <wp:extent cx="5943600" cy="3343275"/>
+            <wp:effectExtent l="0" t="0" r="0" b="0"/>
+            <wp:docPr id="41" name="Picture 41"/>
+            <wp:cNvGraphicFramePr>
+              <a:graphicFrameLocks xmlns:a="http://schemas.openxmlformats.org/drawingml/2006/main" noChangeAspect="1"/>
+            </wp:cNvGraphicFramePr>
+            <a:graphic xmlns:a="http://schemas.openxmlformats.org/drawingml/2006/main">
+              <a:graphicData uri="http://schemas.openxmlformats.org/drawingml/2006/picture">
+                <pic:pic xmlns:pic="http://schemas.openxmlformats.org/drawingml/2006/picture">
+                  <pic:nvPicPr>
+                    <pic:cNvPr id="41" name="Picture 41"/>
+                    <pic:cNvPicPr>
+                      <a:picLocks noChangeAspect="1" noChangeArrowheads="1"/>
+                    </pic:cNvPicPr>
+                  </pic:nvPicPr>
+                  <pic:blipFill>
+                    <a:blip r:embed="rId42"/>
+                    <a:stretch>
+                      <a:fillRect/>
+                    </a:stretch>
+                  </pic:blipFill>
+                  <pic:spPr bwMode="auto">
+                    <a:xfrm>
+                      <a:off x="0" y="0"/>
+                      <a:ext cx="5943600" cy="3343275"/>
+                    </a:xfrm>
+                    <a:prstGeom prst="rect">
+                      <a:avLst/>
+                    </a:prstGeom>
+                    <a:noFill/>
+                  </pic:spPr>
+                </pic:pic>
+              </a:graphicData>
+            </a:graphic>
+          </wp:inline>
+        </w:drawing>
+      </w:r>
+    </w:p>
+    <w:p>
+      <w:pPr>
+        <w:pStyle w:val="Caption"/>
+        <w:jc w:val="center"/>
+        <w:rPr/>
+      </w:pPr>
+      <w:r>
+        <w:rPr/>
+        <w:t>Figure 40. Alarm History screen</w:t>
       </w:r>
     </w:p>
     <w:p>
@@ -20971,8 +21475,8 @@
         <w:pStyle w:val="Heading1"/>
         <w:rPr/>
       </w:pPr>
-      <w:bookmarkStart w:id="37" w:name="__RefHeading___Toc3729_3507643775"/>
-      <w:bookmarkEnd w:id="37"/>
+      <w:bookmarkStart w:id="38" w:name="__RefHeading___Toc3765_1782117212"/>
+      <w:bookmarkEnd w:id="38"/>
       <w:r>
         <w:rPr/>
         <w:t>13  Deploying</w:t>
@@ -21424,8 +21928,8 @@
         <w:pStyle w:val="Heading2"/>
         <w:rPr/>
       </w:pPr>
-      <w:bookmarkStart w:id="38" w:name="__RefHeading___Toc3731_3507643775"/>
-      <w:bookmarkEnd w:id="38"/>
+      <w:bookmarkStart w:id="39" w:name="__RefHeading___Toc3767_1782117212"/>
+      <w:bookmarkEnd w:id="39"/>
       <w:r>
         <w:rPr/>
         <w:t>13.1  Publish</w:t>
@@ -21459,272 +21963,6 @@
         <w:drawing>
           <wp:inline distT="0" distB="0" distL="0" distR="0">
             <wp:extent cx="3657600" cy="4046855"/>
-            <wp:effectExtent l="0" t="0" r="0" b="0"/>
-            <wp:docPr id="40" name="Picture 40"/>
-            <wp:cNvGraphicFramePr>
-              <a:graphicFrameLocks xmlns:a="http://schemas.openxmlformats.org/drawingml/2006/main" noChangeAspect="1"/>
-            </wp:cNvGraphicFramePr>
-            <a:graphic xmlns:a="http://schemas.openxmlformats.org/drawingml/2006/main">
-              <a:graphicData uri="http://schemas.openxmlformats.org/drawingml/2006/picture">
-                <pic:pic xmlns:pic="http://schemas.openxmlformats.org/drawingml/2006/picture">
-                  <pic:nvPicPr>
-                    <pic:cNvPr id="40" name="Picture 40"/>
-                    <pic:cNvPicPr>
-                      <a:picLocks noChangeAspect="1" noChangeArrowheads="1"/>
-                    </pic:cNvPicPr>
-                  </pic:nvPicPr>
-                  <pic:blipFill>
-                    <a:blip r:embed="rId41"/>
-                    <a:stretch>
-                      <a:fillRect/>
-                    </a:stretch>
-                  </pic:blipFill>
-                  <pic:spPr bwMode="auto">
-                    <a:xfrm>
-                      <a:off x="0" y="0"/>
-                      <a:ext cx="3657600" cy="4046855"/>
-                    </a:xfrm>
-                    <a:prstGeom prst="rect">
-                      <a:avLst/>
-                    </a:prstGeom>
-                    <a:noFill/>
-                  </pic:spPr>
-                </pic:pic>
-              </a:graphicData>
-            </a:graphic>
-          </wp:inline>
-        </w:drawing>
-      </w:r>
-    </w:p>
-    <w:p>
-      <w:pPr>
-        <w:pStyle w:val="Caption"/>
-        <w:jc w:val="center"/>
-        <w:rPr/>
-      </w:pPr>
-      <w:r>
-        <w:rPr/>
-        <w:t>Figure 39. The Publish dialog</w:t>
-      </w:r>
-    </w:p>
-    <w:p>
-      <w:pPr>
-        <w:pStyle w:val="Heading2"/>
-        <w:rPr/>
-      </w:pPr>
-      <w:bookmarkStart w:id="39" w:name="__RefHeading___Toc3733_3507643775"/>
-      <w:bookmarkEnd w:id="39"/>
-      <w:r>
-        <w:rPr/>
-        <w:t>13.2  Append HMI Desktop</w:t>
-      </w:r>
-    </w:p>
-    <w:p>
-      <w:pPr>
-        <w:pStyle w:val="Normal"/>
-        <w:rPr/>
-      </w:pPr>
-      <w:r>
-        <w:rPr/>
-        <w:t xml:space="preserve">Append HMI Desktop runs .ahmi files without the editor. Choose an application, then </w:t>
-      </w:r>
-      <w:r>
-        <w:rPr>
-          <w:b/>
-        </w:rPr>
-        <w:t>Run now</w:t>
-      </w:r>
-      <w:r>
-        <w:rPr/>
-        <w:t xml:space="preserve">, create a desktop shortcut or menu entry, or tick </w:t>
-      </w:r>
-      <w:r>
-        <w:rPr>
-          <w:b/>
-        </w:rPr>
-        <w:t>Run this application automatically when I log in</w:t>
-      </w:r>
-      <w:r>
-        <w:rPr/>
-        <w:t xml:space="preserve">. From the command line: </w:t>
-      </w:r>
-      <w:r>
-        <w:rPr>
-          <w:rFonts w:ascii="Consolas" w:hAnsi="Consolas"/>
-          <w:sz w:val="19"/>
-        </w:rPr>
-        <w:t>append-hmi-desktop LiquidWeighHMI.ahmi</w:t>
-      </w:r>
-      <w:r>
-        <w:rPr/>
-        <w:t>.</w:t>
-      </w:r>
-    </w:p>
-    <w:p>
-      <w:pPr>
-        <w:pStyle w:val="Normal"/>
-        <w:keepNext w:val="true"/>
-        <w:jc w:val="center"/>
-        <w:rPr/>
-      </w:pPr>
-      <w:r>
-        <w:rPr/>
-        <w:drawing>
-          <wp:inline distT="0" distB="0" distL="0" distR="0">
-            <wp:extent cx="3840480" cy="3600450"/>
-            <wp:effectExtent l="0" t="0" r="0" b="0"/>
-            <wp:docPr id="41" name="Picture 41"/>
-            <wp:cNvGraphicFramePr>
-              <a:graphicFrameLocks xmlns:a="http://schemas.openxmlformats.org/drawingml/2006/main" noChangeAspect="1"/>
-            </wp:cNvGraphicFramePr>
-            <a:graphic xmlns:a="http://schemas.openxmlformats.org/drawingml/2006/main">
-              <a:graphicData uri="http://schemas.openxmlformats.org/drawingml/2006/picture">
-                <pic:pic xmlns:pic="http://schemas.openxmlformats.org/drawingml/2006/picture">
-                  <pic:nvPicPr>
-                    <pic:cNvPr id="41" name="Picture 41"/>
-                    <pic:cNvPicPr>
-                      <a:picLocks noChangeAspect="1" noChangeArrowheads="1"/>
-                    </pic:cNvPicPr>
-                  </pic:nvPicPr>
-                  <pic:blipFill>
-                    <a:blip r:embed="rId42"/>
-                    <a:stretch>
-                      <a:fillRect/>
-                    </a:stretch>
-                  </pic:blipFill>
-                  <pic:spPr bwMode="auto">
-                    <a:xfrm>
-                      <a:off x="0" y="0"/>
-                      <a:ext cx="3840480" cy="3600450"/>
-                    </a:xfrm>
-                    <a:prstGeom prst="rect">
-                      <a:avLst/>
-                    </a:prstGeom>
-                    <a:noFill/>
-                  </pic:spPr>
-                </pic:pic>
-              </a:graphicData>
-            </a:graphic>
-          </wp:inline>
-        </w:drawing>
-      </w:r>
-    </w:p>
-    <w:p>
-      <w:pPr>
-        <w:pStyle w:val="Caption"/>
-        <w:jc w:val="center"/>
-        <w:rPr/>
-      </w:pPr>
-      <w:r>
-        <w:rPr/>
-        <w:t>Figure 40. The Append HMI Desktop launcher with LiquidWeighHMI selected</w:t>
-      </w:r>
-    </w:p>
-    <w:p>
-      <w:pPr>
-        <w:pStyle w:val="Heading2"/>
-        <w:rPr/>
-      </w:pPr>
-      <w:bookmarkStart w:id="40" w:name="__RefHeading___Toc3735_3507643775"/>
-      <w:bookmarkEnd w:id="40"/>
-      <w:r>
-        <w:rPr/>
-        <w:t>13.3  Append HMI Web</w:t>
-      </w:r>
-    </w:p>
-    <w:p>
-      <w:pPr>
-        <w:pStyle w:val="Normal"/>
-        <w:rPr/>
-      </w:pPr>
-      <w:r>
-        <w:rPr/>
-        <w:t xml:space="preserve">Append HMI Web serves an application to web browsers on the plant network. Choose the application and a port (8480 by default), then </w:t>
-      </w:r>
-      <w:r>
-        <w:rPr>
-          <w:b/>
-        </w:rPr>
-        <w:t>Start web server</w:t>
-      </w:r>
-      <w:r>
-        <w:rPr/>
-        <w:t xml:space="preserve">; the launcher shows the link to share, with a </w:t>
-      </w:r>
-      <w:r>
-        <w:rPr>
-          <w:b/>
-        </w:rPr>
-        <w:t>Copy</w:t>
-      </w:r>
-      <w:r>
-        <w:rPr/>
-        <w:t xml:space="preserve"> button. If the port is already in use on the PC (by another web server, or another application being served), choose another. In the browser, the view button in the corner fits the screen to the window, maximizes it, or shows it at its original size with scroll bars.</w:t>
-      </w:r>
-    </w:p>
-    <w:p>
-      <w:pPr>
-        <w:pStyle w:val="Normal"/>
-        <w:rPr/>
-      </w:pPr>
-      <w:r>
-        <w:rPr/>
-        <w:t xml:space="preserve">The </w:t>
-      </w:r>
-      <w:r>
-        <w:rPr>
-          <w:b/>
-        </w:rPr>
-        <w:t>Running</w:t>
-      </w:r>
-      <w:r>
-        <w:rPr/>
-        <w:t xml:space="preserve"> list shows every Append HMI Web server on the PC, including ones started in the background from the command line (</w:t>
-      </w:r>
-      <w:r>
-        <w:rPr>
-          <w:rFonts w:ascii="Consolas" w:hAnsi="Consolas"/>
-          <w:sz w:val="19"/>
-        </w:rPr>
-        <w:t>--headless</w:t>
-      </w:r>
-      <w:r>
-        <w:rPr/>
-        <w:t xml:space="preserve">). Each has </w:t>
-      </w:r>
-      <w:r>
-        <w:rPr>
-          <w:b/>
-        </w:rPr>
-        <w:t>Restart</w:t>
-      </w:r>
-      <w:r>
-        <w:rPr/>
-        <w:t xml:space="preserve">, which starts it again with the same settings and reads the project file afresh (do this after saving changes in Studio; browsers reload by themselves), and </w:t>
-      </w:r>
-      <w:r>
-        <w:rPr>
-          <w:b/>
-        </w:rPr>
-        <w:t>Stop</w:t>
-      </w:r>
-      <w:r>
-        <w:rPr/>
-        <w:t>.</w:t>
-      </w:r>
-    </w:p>
-    <w:p>
-      <w:pPr>
-        <w:pStyle w:val="Normal"/>
-        <w:keepNext w:val="true"/>
-        <w:jc w:val="center"/>
-        <w:rPr/>
-      </w:pPr>
-      <w:r>
-        <w:rPr/>
-        <w:drawing>
-          <wp:inline distT="0" distB="0" distL="0" distR="0">
-            <wp:extent cx="3840480" cy="4291965"/>
             <wp:effectExtent l="0" t="0" r="0" b="0"/>
             <wp:docPr id="42" name="Picture 42"/>
             <wp:cNvGraphicFramePr>
@@ -21748,7 +21986,7 @@
                   <pic:spPr bwMode="auto">
                     <a:xfrm>
                       <a:off x="0" y="0"/>
-                      <a:ext cx="3840480" cy="4291965"/>
+                      <a:ext cx="3657600" cy="4046855"/>
                     </a:xfrm>
                     <a:prstGeom prst="rect">
                       <a:avLst/>
@@ -21770,7 +22008,60 @@
       </w:pPr>
       <w:r>
         <w:rPr/>
-        <w:t>Figure 41. The Append HMI Web launcher: LiquidWeighHMI served on port 8481 to one browser, and a second application running in the background</w:t>
+        <w:t>Figure 41. The Publish dialog</w:t>
+      </w:r>
+    </w:p>
+    <w:p>
+      <w:pPr>
+        <w:pStyle w:val="Heading2"/>
+        <w:rPr/>
+      </w:pPr>
+      <w:bookmarkStart w:id="40" w:name="__RefHeading___Toc3769_1782117212"/>
+      <w:bookmarkEnd w:id="40"/>
+      <w:r>
+        <w:rPr/>
+        <w:t>13.2  Append HMI Desktop</w:t>
+      </w:r>
+    </w:p>
+    <w:p>
+      <w:pPr>
+        <w:pStyle w:val="Normal"/>
+        <w:rPr/>
+      </w:pPr>
+      <w:r>
+        <w:rPr/>
+        <w:t xml:space="preserve">Append HMI Desktop runs .ahmi files without the editor. Choose an application, then </w:t>
+      </w:r>
+      <w:r>
+        <w:rPr>
+          <w:b/>
+        </w:rPr>
+        <w:t>Run now</w:t>
+      </w:r>
+      <w:r>
+        <w:rPr/>
+        <w:t xml:space="preserve">, create a desktop shortcut or menu entry, or tick </w:t>
+      </w:r>
+      <w:r>
+        <w:rPr>
+          <w:b/>
+        </w:rPr>
+        <w:t>Run this application automatically when I log in</w:t>
+      </w:r>
+      <w:r>
+        <w:rPr/>
+        <w:t xml:space="preserve">. From the command line: </w:t>
+      </w:r>
+      <w:r>
+        <w:rPr>
+          <w:rFonts w:ascii="Consolas" w:hAnsi="Consolas"/>
+          <w:sz w:val="19"/>
+        </w:rPr>
+        <w:t>append-hmi-desktop LiquidWeighHMI.ahmi</w:t>
+      </w:r>
+      <w:r>
+        <w:rPr/>
+        <w:t>.</w:t>
       </w:r>
     </w:p>
     <w:p>
@@ -21784,7 +22075,7 @@
         <w:rPr/>
         <w:drawing>
           <wp:inline distT="0" distB="0" distL="0" distR="0">
-            <wp:extent cx="5943600" cy="3343275"/>
+            <wp:extent cx="3840480" cy="3600450"/>
             <wp:effectExtent l="0" t="0" r="0" b="0"/>
             <wp:docPr id="43" name="Picture 43"/>
             <wp:cNvGraphicFramePr>
@@ -21808,6 +22099,219 @@
                   <pic:spPr bwMode="auto">
                     <a:xfrm>
                       <a:off x="0" y="0"/>
+                      <a:ext cx="3840480" cy="3600450"/>
+                    </a:xfrm>
+                    <a:prstGeom prst="rect">
+                      <a:avLst/>
+                    </a:prstGeom>
+                    <a:noFill/>
+                  </pic:spPr>
+                </pic:pic>
+              </a:graphicData>
+            </a:graphic>
+          </wp:inline>
+        </w:drawing>
+      </w:r>
+    </w:p>
+    <w:p>
+      <w:pPr>
+        <w:pStyle w:val="Caption"/>
+        <w:jc w:val="center"/>
+        <w:rPr/>
+      </w:pPr>
+      <w:r>
+        <w:rPr/>
+        <w:t>Figure 42. The Append HMI Desktop launcher with LiquidWeighHMI selected</w:t>
+      </w:r>
+    </w:p>
+    <w:p>
+      <w:pPr>
+        <w:pStyle w:val="Heading2"/>
+        <w:rPr/>
+      </w:pPr>
+      <w:bookmarkStart w:id="41" w:name="__RefHeading___Toc3771_1782117212"/>
+      <w:bookmarkEnd w:id="41"/>
+      <w:r>
+        <w:rPr/>
+        <w:t>13.3  Append HMI Web</w:t>
+      </w:r>
+    </w:p>
+    <w:p>
+      <w:pPr>
+        <w:pStyle w:val="Normal"/>
+        <w:rPr/>
+      </w:pPr>
+      <w:r>
+        <w:rPr/>
+        <w:t xml:space="preserve">Append HMI Web serves an application to web browsers on the plant network. Choose the application and a port (8480 by default), then </w:t>
+      </w:r>
+      <w:r>
+        <w:rPr>
+          <w:b/>
+        </w:rPr>
+        <w:t>Start web server</w:t>
+      </w:r>
+      <w:r>
+        <w:rPr/>
+        <w:t xml:space="preserve">; the launcher shows the link to share, with a </w:t>
+      </w:r>
+      <w:r>
+        <w:rPr>
+          <w:b/>
+        </w:rPr>
+        <w:t>Copy</w:t>
+      </w:r>
+      <w:r>
+        <w:rPr/>
+        <w:t xml:space="preserve"> button. If the port is already in use on the PC (by another web server, or another application being served), choose another. In the browser, the view button in the corner fits the screen to the window, maximizes it, or shows it at its original size with scroll bars.</w:t>
+      </w:r>
+    </w:p>
+    <w:p>
+      <w:pPr>
+        <w:pStyle w:val="Normal"/>
+        <w:rPr/>
+      </w:pPr>
+      <w:r>
+        <w:rPr/>
+        <w:t xml:space="preserve">The </w:t>
+      </w:r>
+      <w:r>
+        <w:rPr>
+          <w:b/>
+        </w:rPr>
+        <w:t>Running</w:t>
+      </w:r>
+      <w:r>
+        <w:rPr/>
+        <w:t xml:space="preserve"> list shows every Append HMI Web server on the PC, including ones started in the background from the command line (</w:t>
+      </w:r>
+      <w:r>
+        <w:rPr>
+          <w:rFonts w:ascii="Consolas" w:hAnsi="Consolas"/>
+          <w:sz w:val="19"/>
+        </w:rPr>
+        <w:t>--headless</w:t>
+      </w:r>
+      <w:r>
+        <w:rPr/>
+        <w:t xml:space="preserve">). Each has </w:t>
+      </w:r>
+      <w:r>
+        <w:rPr>
+          <w:b/>
+        </w:rPr>
+        <w:t>Restart</w:t>
+      </w:r>
+      <w:r>
+        <w:rPr/>
+        <w:t xml:space="preserve">, which starts it again with the same settings and reads the project file afresh (do this after saving changes in Studio; browsers reload by themselves), and </w:t>
+      </w:r>
+      <w:r>
+        <w:rPr>
+          <w:b/>
+        </w:rPr>
+        <w:t>Stop</w:t>
+      </w:r>
+      <w:r>
+        <w:rPr/>
+        <w:t>.</w:t>
+      </w:r>
+    </w:p>
+    <w:p>
+      <w:pPr>
+        <w:pStyle w:val="Normal"/>
+        <w:keepNext w:val="true"/>
+        <w:jc w:val="center"/>
+        <w:rPr/>
+      </w:pPr>
+      <w:r>
+        <w:rPr/>
+        <w:drawing>
+          <wp:inline distT="0" distB="0" distL="0" distR="0">
+            <wp:extent cx="3840480" cy="4291965"/>
+            <wp:effectExtent l="0" t="0" r="0" b="0"/>
+            <wp:docPr id="44" name="Picture 44"/>
+            <wp:cNvGraphicFramePr>
+              <a:graphicFrameLocks xmlns:a="http://schemas.openxmlformats.org/drawingml/2006/main" noChangeAspect="1"/>
+            </wp:cNvGraphicFramePr>
+            <a:graphic xmlns:a="http://schemas.openxmlformats.org/drawingml/2006/main">
+              <a:graphicData uri="http://schemas.openxmlformats.org/drawingml/2006/picture">
+                <pic:pic xmlns:pic="http://schemas.openxmlformats.org/drawingml/2006/picture">
+                  <pic:nvPicPr>
+                    <pic:cNvPr id="44" name="Picture 44"/>
+                    <pic:cNvPicPr>
+                      <a:picLocks noChangeAspect="1" noChangeArrowheads="1"/>
+                    </pic:cNvPicPr>
+                  </pic:nvPicPr>
+                  <pic:blipFill>
+                    <a:blip r:embed="rId45"/>
+                    <a:stretch>
+                      <a:fillRect/>
+                    </a:stretch>
+                  </pic:blipFill>
+                  <pic:spPr bwMode="auto">
+                    <a:xfrm>
+                      <a:off x="0" y="0"/>
+                      <a:ext cx="3840480" cy="4291965"/>
+                    </a:xfrm>
+                    <a:prstGeom prst="rect">
+                      <a:avLst/>
+                    </a:prstGeom>
+                    <a:noFill/>
+                  </pic:spPr>
+                </pic:pic>
+              </a:graphicData>
+            </a:graphic>
+          </wp:inline>
+        </w:drawing>
+      </w:r>
+    </w:p>
+    <w:p>
+      <w:pPr>
+        <w:pStyle w:val="Caption"/>
+        <w:jc w:val="center"/>
+        <w:rPr/>
+      </w:pPr>
+      <w:r>
+        <w:rPr/>
+        <w:t>Figure 43. The Append HMI Web launcher: LiquidWeighHMI served on port 8481 to one browser, and a second application running in the background</w:t>
+      </w:r>
+    </w:p>
+    <w:p>
+      <w:pPr>
+        <w:pStyle w:val="Normal"/>
+        <w:keepNext w:val="true"/>
+        <w:jc w:val="center"/>
+        <w:rPr/>
+      </w:pPr>
+      <w:r>
+        <w:rPr/>
+        <w:drawing>
+          <wp:inline distT="0" distB="0" distL="0" distR="0">
+            <wp:extent cx="5943600" cy="3343275"/>
+            <wp:effectExtent l="0" t="0" r="0" b="0"/>
+            <wp:docPr id="45" name="Picture 45"/>
+            <wp:cNvGraphicFramePr>
+              <a:graphicFrameLocks xmlns:a="http://schemas.openxmlformats.org/drawingml/2006/main" noChangeAspect="1"/>
+            </wp:cNvGraphicFramePr>
+            <a:graphic xmlns:a="http://schemas.openxmlformats.org/drawingml/2006/main">
+              <a:graphicData uri="http://schemas.openxmlformats.org/drawingml/2006/picture">
+                <pic:pic xmlns:pic="http://schemas.openxmlformats.org/drawingml/2006/picture">
+                  <pic:nvPicPr>
+                    <pic:cNvPr id="45" name="Picture 45"/>
+                    <pic:cNvPicPr>
+                      <a:picLocks noChangeAspect="1" noChangeArrowheads="1"/>
+                    </pic:cNvPicPr>
+                  </pic:nvPicPr>
+                  <pic:blipFill>
+                    <a:blip r:embed="rId46"/>
+                    <a:stretch>
+                      <a:fillRect/>
+                    </a:stretch>
+                  </pic:blipFill>
+                  <pic:spPr bwMode="auto">
+                    <a:xfrm>
+                      <a:off x="0" y="0"/>
                       <a:ext cx="5943600" cy="3343275"/>
                     </a:xfrm>
                     <a:prstGeom prst="rect">
@@ -21830,7 +22334,7 @@
       </w:pPr>
       <w:r>
         <w:rPr/>
-        <w:t>Figure 42. LiquidWeighHMI in a web browser, with the view menu open</w:t>
+        <w:t>Figure 44. LiquidWeighHMI in a web browser, with the view menu open</w:t>
       </w:r>
     </w:p>
     <w:p>
@@ -21838,8 +22342,8 @@
         <w:pStyle w:val="Heading1"/>
         <w:rPr/>
       </w:pPr>
-      <w:bookmarkStart w:id="41" w:name="__RefHeading___Toc3737_3507643775"/>
-      <w:bookmarkEnd w:id="41"/>
+      <w:bookmarkStart w:id="42" w:name="__RefHeading___Toc3773_1782117212"/>
+      <w:bookmarkEnd w:id="42"/>
       <w:r>
         <w:rPr/>
         <w:t>14  Tips and troubleshooting</w:t>
@@ -22498,8 +23002,8 @@
         <w:pStyle w:val="Heading1"/>
         <w:rPr/>
       </w:pPr>
-      <w:bookmarkStart w:id="42" w:name="__RefHeading___Toc3739_3507643775"/>
-      <w:bookmarkEnd w:id="42"/>
+      <w:bookmarkStart w:id="43" w:name="__RefHeading___Toc3775_1782117212"/>
+      <w:bookmarkEnd w:id="43"/>
       <w:r>
         <w:rPr/>
         <w:t>Appendix A  Command-line automation</w:t>
@@ -22970,9 +23474,9 @@
       </w:r>
     </w:p>
     <w:sectPr>
-      <w:footerReference w:type="even" r:id="rId45"/>
-      <w:footerReference w:type="default" r:id="rId46"/>
-      <w:footerReference w:type="first" r:id="rId47"/>
+      <w:footerReference w:type="even" r:id="rId47"/>
+      <w:footerReference w:type="default" r:id="rId48"/>
+      <w:footerReference w:type="first" r:id="rId49"/>
       <w:type w:val="nextPage"/>
       <w:pgSz w:w="12240" w:h="15840"/>
       <w:pgMar w:left="1440" w:right="1440" w:gutter="0" w:header="0" w:top="1440" w:footer="720" w:bottom="1440"/>
@@ -23036,7 +23540,7 @@
       <w:rPr>
         <w:sz w:val="18"/>
       </w:rPr>
-      <w:t>50</w:t>
+      <w:t>52</w:t>
     </w:r>
     <w:r>
       <w:rPr>

</xml_diff>

<commit_message>
docs: arcs in the manual, automation reference, skill and CLAUDE.md
Co-Authored-By: Claude Opus 5.5 <noreply@anthropic.com>
</commit_message>
<xml_diff>
--- a/doc/Append-HMI-Studio-User-Manual.docx
+++ b/doc/Append-HMI-Studio-User-Manual.docx
@@ -283,7 +283,7 @@
             </w:rPr>
             <w:fldChar w:fldCharType="separate"/>
           </w:r>
-          <w:hyperlink w:anchor="__RefHeading___Toc3689_1782117212" w:tooltip="1 Introduction">
+          <w:hyperlink w:anchor="__RefHeading___Toc3788_31916387" w:tooltip="1 Introduction">
             <w:r>
               <w:rPr>
                 <w:rStyle w:val="IndexLink"/>
@@ -304,7 +304,7 @@
             </w:tabs>
             <w:rPr/>
           </w:pPr>
-          <w:hyperlink w:anchor="__RefHeading___Toc3691_1782117212" w:tooltip="1.1 How an HMI application is organized">
+          <w:hyperlink w:anchor="__RefHeading___Toc3790_31916387" w:tooltip="1.1 How an HMI application is organized">
             <w:r>
               <w:rPr>
                 <w:rStyle w:val="IndexLink"/>
@@ -325,7 +325,7 @@
             </w:tabs>
             <w:rPr/>
           </w:pPr>
-          <w:hyperlink w:anchor="__RefHeading___Toc3693_1782117212" w:tooltip="2 The Studio window">
+          <w:hyperlink w:anchor="__RefHeading___Toc3792_31916387" w:tooltip="2 The Studio window">
             <w:r>
               <w:rPr>
                 <w:rStyle w:val="IndexLink"/>
@@ -346,7 +346,7 @@
             </w:tabs>
             <w:rPr/>
           </w:pPr>
-          <w:hyperlink w:anchor="__RefHeading___Toc3695_1782117212" w:tooltip="2.1 The HMI menu">
+          <w:hyperlink w:anchor="__RefHeading___Toc3794_31916387" w:tooltip="2.1 The HMI menu">
             <w:r>
               <w:rPr>
                 <w:rStyle w:val="IndexLink"/>
@@ -367,7 +367,7 @@
             </w:tabs>
             <w:rPr/>
           </w:pPr>
-          <w:hyperlink w:anchor="__RefHeading___Toc3697_1782117212" w:tooltip="3 Application settings">
+          <w:hyperlink w:anchor="__RefHeading___Toc3796_31916387" w:tooltip="3 Application settings">
             <w:r>
               <w:rPr>
                 <w:rStyle w:val="IndexLink"/>
@@ -388,7 +388,7 @@
             </w:tabs>
             <w:rPr/>
           </w:pPr>
-          <w:hyperlink w:anchor="__RefHeading___Toc3699_1782117212" w:tooltip="4 Devices">
+          <w:hyperlink w:anchor="__RefHeading___Toc3798_31916387" w:tooltip="4 Devices">
             <w:r>
               <w:rPr>
                 <w:rStyle w:val="IndexLink"/>
@@ -409,7 +409,7 @@
             </w:tabs>
             <w:rPr/>
           </w:pPr>
-          <w:hyperlink w:anchor="__RefHeading___Toc3701_1782117212" w:tooltip="5 Tags">
+          <w:hyperlink w:anchor="__RefHeading___Toc3800_31916387" w:tooltip="5 Tags">
             <w:r>
               <w:rPr>
                 <w:rStyle w:val="IndexLink"/>
@@ -430,7 +430,7 @@
             </w:tabs>
             <w:rPr/>
           </w:pPr>
-          <w:hyperlink w:anchor="__RefHeading___Toc3703_1782117212" w:tooltip="5.1 Tag fields">
+          <w:hyperlink w:anchor="__RefHeading___Toc3802_31916387" w:tooltip="5.1 Tag fields">
             <w:r>
               <w:rPr>
                 <w:rStyle w:val="IndexLink"/>
@@ -451,7 +451,7 @@
             </w:tabs>
             <w:rPr/>
           </w:pPr>
-          <w:hyperlink w:anchor="__RefHeading___Toc3705_1782117212" w:tooltip="5.2 Alarms on a tag">
+          <w:hyperlink w:anchor="__RefHeading___Toc3804_31916387" w:tooltip="5.2 Alarms on a tag">
             <w:r>
               <w:rPr>
                 <w:rStyle w:val="IndexLink"/>
@@ -472,7 +472,7 @@
             </w:tabs>
             <w:rPr/>
           </w:pPr>
-          <w:hyperlink w:anchor="__RefHeading___Toc3707_1782117212" w:tooltip="6 Screens and windows">
+          <w:hyperlink w:anchor="__RefHeading___Toc3806_31916387" w:tooltip="6 Screens and windows">
             <w:r>
               <w:rPr>
                 <w:rStyle w:val="IndexLink"/>
@@ -493,7 +493,7 @@
             </w:tabs>
             <w:rPr/>
           </w:pPr>
-          <w:hyperlink w:anchor="__RefHeading___Toc3709_1782117212" w:tooltip="6.1 Window properties">
+          <w:hyperlink w:anchor="__RefHeading___Toc3808_31916387" w:tooltip="6.1 Window properties">
             <w:r>
               <w:rPr>
                 <w:rStyle w:val="IndexLink"/>
@@ -514,7 +514,7 @@
             </w:tabs>
             <w:rPr/>
           </w:pPr>
-          <w:hyperlink w:anchor="__RefHeading___Toc3711_1782117212" w:tooltip="6.2 Navigation">
+          <w:hyperlink w:anchor="__RefHeading___Toc3810_31916387" w:tooltip="6.2 Navigation">
             <w:r>
               <w:rPr>
                 <w:rStyle w:val="IndexLink"/>
@@ -535,7 +535,7 @@
             </w:tabs>
             <w:rPr/>
           </w:pPr>
-          <w:hyperlink w:anchor="__RefHeading___Toc3713_1782117212" w:tooltip="7 Drawing objects">
+          <w:hyperlink w:anchor="__RefHeading___Toc3812_31916387" w:tooltip="7 Drawing objects">
             <w:r>
               <w:rPr>
                 <w:rStyle w:val="IndexLink"/>
@@ -556,7 +556,7 @@
             </w:tabs>
             <w:rPr/>
           </w:pPr>
-          <w:hyperlink w:anchor="__RefHeading___Toc3715_1782117212" w:tooltip="8 Animation links">
+          <w:hyperlink w:anchor="__RefHeading___Toc3814_31916387" w:tooltip="8 Animation links">
             <w:r>
               <w:rPr>
                 <w:rStyle w:val="IndexLink"/>
@@ -564,7 +564,7 @@
               </w:rPr>
               <w:t>8 Animation links</w:t>
               <w:tab/>
-              <w:t>16</w:t>
+              <w:t>17</w:t>
             </w:r>
           </w:hyperlink>
         </w:p>
@@ -577,7 +577,7 @@
             </w:tabs>
             <w:rPr/>
           </w:pPr>
-          <w:hyperlink w:anchor="__RefHeading___Toc3717_1782117212" w:tooltip="8.1 A valve: status color, fault blink and faceplate">
+          <w:hyperlink w:anchor="__RefHeading___Toc3816_31916387" w:tooltip="8.1 A valve: status color, fault blink and faceplate">
             <w:r>
               <w:rPr>
                 <w:rStyle w:val="IndexLink"/>
@@ -598,7 +598,7 @@
             </w:tabs>
             <w:rPr/>
           </w:pPr>
-          <w:hyperlink w:anchor="__RefHeading___Toc3719_1782117212" w:tooltip="8.2 The weigh hopper: percent fill">
+          <w:hyperlink w:anchor="__RefHeading___Toc3818_31916387" w:tooltip="8.2 The weigh hopper: percent fill">
             <w:r>
               <w:rPr>
                 <w:rStyle w:val="IndexLink"/>
@@ -619,7 +619,7 @@
             </w:tabs>
             <w:rPr/>
           </w:pPr>
-          <w:hyperlink w:anchor="__RefHeading___Toc3721_1782117212" w:tooltip="8.3 Hopper pressure: value display and alarm colors">
+          <w:hyperlink w:anchor="__RefHeading___Toc3820_31916387" w:tooltip="8.3 Hopper pressure: value display and alarm colors">
             <w:r>
               <w:rPr>
                 <w:rStyle w:val="IndexLink"/>
@@ -627,7 +627,7 @@
               </w:rPr>
               <w:t>8.3 Hopper pressure: value display and alarm colors</w:t>
               <w:tab/>
-              <w:t>20</w:t>
+              <w:t>21</w:t>
             </w:r>
           </w:hyperlink>
         </w:p>
@@ -640,7 +640,7 @@
             </w:tabs>
             <w:rPr/>
           </w:pPr>
-          <w:hyperlink w:anchor="__RefHeading___Toc3723_1782117212" w:tooltip="8.4 Setpoints: user input">
+          <w:hyperlink w:anchor="__RefHeading___Toc3822_31916387" w:tooltip="8.4 Setpoints: user input">
             <w:r>
               <w:rPr>
                 <w:rStyle w:val="IndexLink"/>
@@ -648,7 +648,7 @@
               </w:rPr>
               <w:t>8.4 Setpoints: user input</w:t>
               <w:tab/>
-              <w:t>21</w:t>
+              <w:t>22</w:t>
             </w:r>
           </w:hyperlink>
         </w:p>
@@ -661,7 +661,7 @@
             </w:tabs>
             <w:rPr/>
           </w:pPr>
-          <w:hyperlink w:anchor="__RefHeading___Toc3725_1782117212" w:tooltip="8.5 Commands: pushbutton and enable">
+          <w:hyperlink w:anchor="__RefHeading___Toc3824_31916387" w:tooltip="8.5 Commands: pushbutton and enable">
             <w:r>
               <w:rPr>
                 <w:rStyle w:val="IndexLink"/>
@@ -669,7 +669,7 @@
               </w:rPr>
               <w:t>8.5 Commands: pushbutton and enable</w:t>
               <w:tab/>
-              <w:t>22</w:t>
+              <w:t>23</w:t>
             </w:r>
           </w:hyperlink>
         </w:p>
@@ -682,7 +682,7 @@
             </w:tabs>
             <w:rPr/>
           </w:pPr>
-          <w:hyperlink w:anchor="__RefHeading___Toc3727_1782117212" w:tooltip="9 Expressions and scripts">
+          <w:hyperlink w:anchor="__RefHeading___Toc3826_31916387" w:tooltip="9 Expressions and scripts">
             <w:r>
               <w:rPr>
                 <w:rStyle w:val="IndexLink"/>
@@ -690,7 +690,7 @@
               </w:rPr>
               <w:t>9 Expressions and scripts</w:t>
               <w:tab/>
-              <w:t>23</w:t>
+              <w:t>24</w:t>
             </w:r>
           </w:hyperlink>
         </w:p>
@@ -703,7 +703,7 @@
             </w:tabs>
             <w:rPr/>
           </w:pPr>
-          <w:hyperlink w:anchor="__RefHeading___Toc3729_1782117212" w:tooltip="9.1 Window scripts">
+          <w:hyperlink w:anchor="__RefHeading___Toc3828_31916387" w:tooltip="9.1 Window scripts">
             <w:r>
               <w:rPr>
                 <w:rStyle w:val="IndexLink"/>
@@ -711,7 +711,7 @@
               </w:rPr>
               <w:t>9.1 Window scripts</w:t>
               <w:tab/>
-              <w:t>23</w:t>
+              <w:t>24</w:t>
             </w:r>
           </w:hyperlink>
         </w:p>
@@ -724,7 +724,7 @@
             </w:tabs>
             <w:rPr/>
           </w:pPr>
-          <w:hyperlink w:anchor="__RefHeading___Toc3731_1782117212" w:tooltip="9.2 Action scripts">
+          <w:hyperlink w:anchor="__RefHeading___Toc3830_31916387" w:tooltip="9.2 Action scripts">
             <w:r>
               <w:rPr>
                 <w:rStyle w:val="IndexLink"/>
@@ -732,7 +732,7 @@
               </w:rPr>
               <w:t>9.2 Action scripts</w:t>
               <w:tab/>
-              <w:t>25</w:t>
+              <w:t>26</w:t>
             </w:r>
           </w:hyperlink>
         </w:p>
@@ -745,7 +745,7 @@
             </w:tabs>
             <w:rPr/>
           </w:pPr>
-          <w:hyperlink w:anchor="__RefHeading___Toc3733_1782117212" w:tooltip="9.3 Function reference">
+          <w:hyperlink w:anchor="__RefHeading___Toc3832_31916387" w:tooltip="9.3 Function reference">
             <w:r>
               <w:rPr>
                 <w:rStyle w:val="IndexLink"/>
@@ -753,7 +753,7 @@
               </w:rPr>
               <w:t>9.3 Function reference</w:t>
               <w:tab/>
-              <w:t>26</w:t>
+              <w:t>27</w:t>
             </w:r>
           </w:hyperlink>
         </w:p>
@@ -766,7 +766,7 @@
             </w:tabs>
             <w:rPr/>
           </w:pPr>
-          <w:hyperlink w:anchor="__RefHeading___Toc3735_1782117212" w:tooltip="9.4 Indirect tags: one faceplate for every device">
+          <w:hyperlink w:anchor="__RefHeading___Toc3834_31916387" w:tooltip="9.4 Indirect tags: one faceplate for every device">
             <w:r>
               <w:rPr>
                 <w:rStyle w:val="IndexLink"/>
@@ -774,7 +774,7 @@
               </w:rPr>
               <w:t>9.4 Indirect tags: one faceplate for every device</w:t>
               <w:tab/>
-              <w:t>29</w:t>
+              <w:t>30</w:t>
             </w:r>
           </w:hyperlink>
         </w:p>
@@ -787,7 +787,7 @@
             </w:tabs>
             <w:rPr/>
           </w:pPr>
-          <w:hyperlink w:anchor="__RefHeading___Toc3737_1782117212" w:tooltip="9.5 Opening windows from scripts: ShowWindow">
+          <w:hyperlink w:anchor="__RefHeading___Toc3836_31916387" w:tooltip="9.5 Opening windows from scripts: ShowWindow">
             <w:r>
               <w:rPr>
                 <w:rStyle w:val="IndexLink"/>
@@ -795,7 +795,7 @@
               </w:rPr>
               <w:t>9.5 Opening windows from scripts: ShowWindow</w:t>
               <w:tab/>
-              <w:t>30</w:t>
+              <w:t>31</w:t>
             </w:r>
           </w:hyperlink>
         </w:p>
@@ -808,7 +808,7 @@
             </w:tabs>
             <w:rPr/>
           </w:pPr>
-          <w:hyperlink w:anchor="__RefHeading___Toc3739_1782117212" w:tooltip="10 Alarms and security">
+          <w:hyperlink w:anchor="__RefHeading___Toc3838_31916387" w:tooltip="10 Alarms and security">
             <w:r>
               <w:rPr>
                 <w:rStyle w:val="IndexLink"/>
@@ -816,7 +816,7 @@
               </w:rPr>
               <w:t>10 Alarms and security</w:t>
               <w:tab/>
-              <w:t>32</w:t>
+              <w:t>33</w:t>
             </w:r>
           </w:hyperlink>
         </w:p>
@@ -829,7 +829,7 @@
             </w:tabs>
             <w:rPr/>
           </w:pPr>
-          <w:hyperlink w:anchor="__RefHeading___Toc3741_1782117212" w:tooltip="10.1 Alarms">
+          <w:hyperlink w:anchor="__RefHeading___Toc3840_31916387" w:tooltip="10.1 Alarms">
             <w:r>
               <w:rPr>
                 <w:rStyle w:val="IndexLink"/>
@@ -837,7 +837,7 @@
               </w:rPr>
               <w:t>10.1 Alarms</w:t>
               <w:tab/>
-              <w:t>32</w:t>
+              <w:t>33</w:t>
             </w:r>
           </w:hyperlink>
         </w:p>
@@ -850,7 +850,7 @@
             </w:tabs>
             <w:rPr/>
           </w:pPr>
-          <w:hyperlink w:anchor="__RefHeading___Toc3743_1782117212" w:tooltip="10.2 Users and access levels">
+          <w:hyperlink w:anchor="__RefHeading___Toc3842_31916387" w:tooltip="10.2 Users and access levels">
             <w:r>
               <w:rPr>
                 <w:rStyle w:val="IndexLink"/>
@@ -858,7 +858,7 @@
               </w:rPr>
               <w:t>10.2 Users and access levels</w:t>
               <w:tab/>
-              <w:t>33</w:t>
+              <w:t>34</w:t>
             </w:r>
           </w:hyperlink>
         </w:p>
@@ -871,7 +871,7 @@
             </w:tabs>
             <w:rPr/>
           </w:pPr>
-          <w:hyperlink w:anchor="__RefHeading___Toc3745_1782117212" w:tooltip="11 Recipes">
+          <w:hyperlink w:anchor="__RefHeading___Toc3844_31916387" w:tooltip="11 Recipes">
             <w:r>
               <w:rPr>
                 <w:rStyle w:val="IndexLink"/>
@@ -879,7 +879,7 @@
               </w:rPr>
               <w:t>11 Recipes</w:t>
               <w:tab/>
-              <w:t>34</w:t>
+              <w:t>35</w:t>
             </w:r>
           </w:hyperlink>
         </w:p>
@@ -892,7 +892,7 @@
             </w:tabs>
             <w:rPr/>
           </w:pPr>
-          <w:hyperlink w:anchor="__RefHeading___Toc3747_1782117212" w:tooltip="11.1 Recipe books">
+          <w:hyperlink w:anchor="__RefHeading___Toc3846_31916387" w:tooltip="11.1 Recipe books">
             <w:r>
               <w:rPr>
                 <w:rStyle w:val="IndexLink"/>
@@ -900,7 +900,7 @@
               </w:rPr>
               <w:t>11.1 Recipe books</w:t>
               <w:tab/>
-              <w:t>34</w:t>
+              <w:t>35</w:t>
             </w:r>
           </w:hyperlink>
         </w:p>
@@ -913,7 +913,7 @@
             </w:tabs>
             <w:rPr/>
           </w:pPr>
-          <w:hyperlink w:anchor="__RefHeading___Toc3749_1782117212" w:tooltip="11.2 The Recipes screen">
+          <w:hyperlink w:anchor="__RefHeading___Toc3848_31916387" w:tooltip="11.2 The Recipes screen">
             <w:r>
               <w:rPr>
                 <w:rStyle w:val="IndexLink"/>
@@ -921,7 +921,7 @@
               </w:rPr>
               <w:t>11.2 The Recipes screen</w:t>
               <w:tab/>
-              <w:t>37</w:t>
+              <w:t>38</w:t>
             </w:r>
           </w:hyperlink>
         </w:p>
@@ -934,7 +934,7 @@
             </w:tabs>
             <w:rPr/>
           </w:pPr>
-          <w:hyperlink w:anchor="__RefHeading___Toc3751_1782117212" w:tooltip="11.3 The Recipe List object">
+          <w:hyperlink w:anchor="__RefHeading___Toc3850_31916387" w:tooltip="11.3 The Recipe List object">
             <w:r>
               <w:rPr>
                 <w:rStyle w:val="IndexLink"/>
@@ -942,7 +942,7 @@
               </w:rPr>
               <w:t>11.3 The Recipe List object</w:t>
               <w:tab/>
-              <w:t>39</w:t>
+              <w:t>40</w:t>
             </w:r>
           </w:hyperlink>
         </w:p>
@@ -955,7 +955,7 @@
             </w:tabs>
             <w:rPr/>
           </w:pPr>
-          <w:hyperlink w:anchor="__RefHeading___Toc3753_1782117212" w:tooltip="11.4 Selecting a recipe in a window">
+          <w:hyperlink w:anchor="__RefHeading___Toc3852_31916387" w:tooltip="11.4 Selecting a recipe in a window">
             <w:r>
               <w:rPr>
                 <w:rStyle w:val="IndexLink"/>
@@ -963,7 +963,7 @@
               </w:rPr>
               <w:t>11.4 Selecting a recipe in a window</w:t>
               <w:tab/>
-              <w:t>40</w:t>
+              <w:t>41</w:t>
             </w:r>
           </w:hyperlink>
         </w:p>
@@ -976,7 +976,7 @@
             </w:tabs>
             <w:rPr/>
           </w:pPr>
-          <w:hyperlink w:anchor="__RefHeading___Toc3755_1782117212" w:tooltip="11.5 When a recipe function fails">
+          <w:hyperlink w:anchor="__RefHeading___Toc3854_31916387" w:tooltip="11.5 When a recipe function fails">
             <w:r>
               <w:rPr>
                 <w:rStyle w:val="IndexLink"/>
@@ -984,7 +984,7 @@
               </w:rPr>
               <w:t>11.5 When a recipe function fails</w:t>
               <w:tab/>
-              <w:t>41</w:t>
+              <w:t>42</w:t>
             </w:r>
           </w:hyperlink>
         </w:p>
@@ -997,7 +997,7 @@
             </w:tabs>
             <w:rPr/>
           </w:pPr>
-          <w:hyperlink w:anchor="__RefHeading___Toc3757_1782117212" w:tooltip="11.6 Where recipes are kept">
+          <w:hyperlink w:anchor="__RefHeading___Toc3856_31916387" w:tooltip="11.6 Where recipes are kept">
             <w:r>
               <w:rPr>
                 <w:rStyle w:val="IndexLink"/>
@@ -1005,7 +1005,7 @@
               </w:rPr>
               <w:t>11.6 Where recipes are kept</w:t>
               <w:tab/>
-              <w:t>41</w:t>
+              <w:t>42</w:t>
             </w:r>
           </w:hyperlink>
         </w:p>
@@ -1018,7 +1018,7 @@
             </w:tabs>
             <w:rPr/>
           </w:pPr>
-          <w:hyperlink w:anchor="__RefHeading___Toc3759_1782117212" w:tooltip="12 Testing">
+          <w:hyperlink w:anchor="__RefHeading___Toc3858_31916387" w:tooltip="12 Testing">
             <w:r>
               <w:rPr>
                 <w:rStyle w:val="IndexLink"/>
@@ -1026,7 +1026,7 @@
               </w:rPr>
               <w:t>12 Testing</w:t>
               <w:tab/>
-              <w:t>42</w:t>
+              <w:t>43</w:t>
             </w:r>
           </w:hyperlink>
         </w:p>
@@ -1039,7 +1039,7 @@
             </w:tabs>
             <w:rPr/>
           </w:pPr>
-          <w:hyperlink w:anchor="__RefHeading___Toc3761_1782117212" w:tooltip="12.1 Validate">
+          <w:hyperlink w:anchor="__RefHeading___Toc3860_31916387" w:tooltip="12.1 Validate">
             <w:r>
               <w:rPr>
                 <w:rStyle w:val="IndexLink"/>
@@ -1047,7 +1047,7 @@
               </w:rPr>
               <w:t>12.1 Validate</w:t>
               <w:tab/>
-              <w:t>42</w:t>
+              <w:t>43</w:t>
             </w:r>
           </w:hyperlink>
         </w:p>
@@ -1060,7 +1060,7 @@
             </w:tabs>
             <w:rPr/>
           </w:pPr>
-          <w:hyperlink w:anchor="__RefHeading___Toc3763_1782117212" w:tooltip="12.2 Run">
+          <w:hyperlink w:anchor="__RefHeading___Toc3862_31916387" w:tooltip="12.2 Run">
             <w:r>
               <w:rPr>
                 <w:rStyle w:val="IndexLink"/>
@@ -1068,7 +1068,7 @@
               </w:rPr>
               <w:t>12.2 Run</w:t>
               <w:tab/>
-              <w:t>42</w:t>
+              <w:t>43</w:t>
             </w:r>
           </w:hyperlink>
         </w:p>
@@ -1081,7 +1081,7 @@
             </w:tabs>
             <w:rPr/>
           </w:pPr>
-          <w:hyperlink w:anchor="__RefHeading___Toc3765_1782117212" w:tooltip="13 Deploying">
+          <w:hyperlink w:anchor="__RefHeading___Toc3864_31916387" w:tooltip="13 Deploying">
             <w:r>
               <w:rPr>
                 <w:rStyle w:val="IndexLink"/>
@@ -1089,7 +1089,7 @@
               </w:rPr>
               <w:t>13 Deploying</w:t>
               <w:tab/>
-              <w:t>47</w:t>
+              <w:t>48</w:t>
             </w:r>
           </w:hyperlink>
         </w:p>
@@ -1102,7 +1102,7 @@
             </w:tabs>
             <w:rPr/>
           </w:pPr>
-          <w:hyperlink w:anchor="__RefHeading___Toc3767_1782117212" w:tooltip="13.1 Publish">
+          <w:hyperlink w:anchor="__RefHeading___Toc3866_31916387" w:tooltip="13.1 Publish">
             <w:r>
               <w:rPr>
                 <w:rStyle w:val="IndexLink"/>
@@ -1110,7 +1110,7 @@
               </w:rPr>
               <w:t>13.1 Publish</w:t>
               <w:tab/>
-              <w:t>47</w:t>
+              <w:t>48</w:t>
             </w:r>
           </w:hyperlink>
         </w:p>
@@ -1123,7 +1123,7 @@
             </w:tabs>
             <w:rPr/>
           </w:pPr>
-          <w:hyperlink w:anchor="__RefHeading___Toc3769_1782117212" w:tooltip="13.2 Append HMI Desktop">
+          <w:hyperlink w:anchor="__RefHeading___Toc3868_31916387" w:tooltip="13.2 Append HMI Desktop">
             <w:r>
               <w:rPr>
                 <w:rStyle w:val="IndexLink"/>
@@ -1131,7 +1131,7 @@
               </w:rPr>
               <w:t>13.2 Append HMI Desktop</w:t>
               <w:tab/>
-              <w:t>48</w:t>
+              <w:t>49</w:t>
             </w:r>
           </w:hyperlink>
         </w:p>
@@ -1144,7 +1144,7 @@
             </w:tabs>
             <w:rPr/>
           </w:pPr>
-          <w:hyperlink w:anchor="__RefHeading___Toc3771_1782117212" w:tooltip="13.3 Append HMI Web">
+          <w:hyperlink w:anchor="__RefHeading___Toc3870_31916387" w:tooltip="13.3 Append HMI Web">
             <w:r>
               <w:rPr>
                 <w:rStyle w:val="IndexLink"/>
@@ -1152,7 +1152,7 @@
               </w:rPr>
               <w:t>13.3 Append HMI Web</w:t>
               <w:tab/>
-              <w:t>49</w:t>
+              <w:t>50</w:t>
             </w:r>
           </w:hyperlink>
         </w:p>
@@ -1165,7 +1165,7 @@
             </w:tabs>
             <w:rPr/>
           </w:pPr>
-          <w:hyperlink w:anchor="__RefHeading___Toc3773_1782117212" w:tooltip="14 Tips and troubleshooting">
+          <w:hyperlink w:anchor="__RefHeading___Toc3872_31916387" w:tooltip="14 Tips and troubleshooting">
             <w:r>
               <w:rPr>
                 <w:rStyle w:val="IndexLink"/>
@@ -1173,7 +1173,7 @@
               </w:rPr>
               <w:t>14 Tips and troubleshooting</w:t>
               <w:tab/>
-              <w:t>51</w:t>
+              <w:t>52</w:t>
             </w:r>
           </w:hyperlink>
         </w:p>
@@ -1186,7 +1186,7 @@
             </w:tabs>
             <w:rPr/>
           </w:pPr>
-          <w:hyperlink w:anchor="__RefHeading___Toc3775_1782117212" w:tooltip="Appendix A Command-line automation">
+          <w:hyperlink w:anchor="__RefHeading___Toc3874_31916387" w:tooltip="Appendix A Command-line automation">
             <w:r>
               <w:rPr>
                 <w:rStyle w:val="IndexLink"/>
@@ -1194,7 +1194,7 @@
               </w:rPr>
               <w:t>Appendix A Command-line automation</w:t>
               <w:tab/>
-              <w:t>52</w:t>
+              <w:t>53</w:t>
             </w:r>
           </w:hyperlink>
           <w:r>
@@ -1224,7 +1224,7 @@
         <w:spacing w:before="0" w:after="0"/>
         <w:rPr/>
       </w:pPr>
-      <w:bookmarkStart w:id="0" w:name="__RefHeading___Toc3689_1782117212"/>
+      <w:bookmarkStart w:id="0" w:name="__RefHeading___Toc3788_31916387"/>
       <w:bookmarkEnd w:id="0"/>
       <w:r>
         <w:rPr/>
@@ -1925,7 +1925,7 @@
         <w:pStyle w:val="Heading2"/>
         <w:rPr/>
       </w:pPr>
-      <w:bookmarkStart w:id="1" w:name="__RefHeading___Toc3691_1782117212"/>
+      <w:bookmarkStart w:id="1" w:name="__RefHeading___Toc3790_31916387"/>
       <w:bookmarkEnd w:id="1"/>
       <w:r>
         <w:rPr/>
@@ -2068,7 +2068,7 @@
         <w:pStyle w:val="Heading1"/>
         <w:rPr/>
       </w:pPr>
-      <w:bookmarkStart w:id="2" w:name="__RefHeading___Toc3693_1782117212"/>
+      <w:bookmarkStart w:id="2" w:name="__RefHeading___Toc3792_31916387"/>
       <w:bookmarkEnd w:id="2"/>
       <w:r>
         <w:rPr/>
@@ -2646,7 +2646,7 @@
         <w:pStyle w:val="Heading2"/>
         <w:rPr/>
       </w:pPr>
-      <w:bookmarkStart w:id="3" w:name="__RefHeading___Toc3695_1782117212"/>
+      <w:bookmarkStart w:id="3" w:name="__RefHeading___Toc3794_31916387"/>
       <w:bookmarkEnd w:id="3"/>
       <w:r>
         <w:rPr/>
@@ -3686,7 +3686,7 @@
         <w:pStyle w:val="Heading1"/>
         <w:rPr/>
       </w:pPr>
-      <w:bookmarkStart w:id="4" w:name="__RefHeading___Toc3697_1782117212"/>
+      <w:bookmarkStart w:id="4" w:name="__RefHeading___Toc3796_31916387"/>
       <w:bookmarkEnd w:id="4"/>
       <w:r>
         <w:rPr/>
@@ -3971,7 +3971,7 @@
         <w:pStyle w:val="Heading1"/>
         <w:rPr/>
       </w:pPr>
-      <w:bookmarkStart w:id="5" w:name="__RefHeading___Toc3699_1782117212"/>
+      <w:bookmarkStart w:id="5" w:name="__RefHeading___Toc3798_31916387"/>
       <w:bookmarkEnd w:id="5"/>
       <w:r>
         <w:rPr/>
@@ -4766,7 +4766,7 @@
         <w:pStyle w:val="Heading1"/>
         <w:rPr/>
       </w:pPr>
-      <w:bookmarkStart w:id="6" w:name="__RefHeading___Toc3701_1782117212"/>
+      <w:bookmarkStart w:id="6" w:name="__RefHeading___Toc3800_31916387"/>
       <w:bookmarkEnd w:id="6"/>
       <w:r>
         <w:rPr/>
@@ -5597,7 +5597,7 @@
         <w:pStyle w:val="Heading2"/>
         <w:rPr/>
       </w:pPr>
-      <w:bookmarkStart w:id="7" w:name="__RefHeading___Toc3703_1782117212"/>
+      <w:bookmarkStart w:id="7" w:name="__RefHeading___Toc3802_31916387"/>
       <w:bookmarkEnd w:id="7"/>
       <w:r>
         <w:rPr/>
@@ -6250,7 +6250,7 @@
         <w:pStyle w:val="Heading2"/>
         <w:rPr/>
       </w:pPr>
-      <w:bookmarkStart w:id="8" w:name="__RefHeading___Toc3705_1782117212"/>
+      <w:bookmarkStart w:id="8" w:name="__RefHeading___Toc3804_31916387"/>
       <w:bookmarkEnd w:id="8"/>
       <w:r>
         <w:rPr/>
@@ -6385,7 +6385,7 @@
         <w:pStyle w:val="Heading1"/>
         <w:rPr/>
       </w:pPr>
-      <w:bookmarkStart w:id="9" w:name="__RefHeading___Toc3707_1782117212"/>
+      <w:bookmarkStart w:id="9" w:name="__RefHeading___Toc3806_31916387"/>
       <w:bookmarkEnd w:id="9"/>
       <w:r>
         <w:rPr/>
@@ -6898,7 +6898,7 @@
         <w:pStyle w:val="Heading2"/>
         <w:rPr/>
       </w:pPr>
-      <w:bookmarkStart w:id="10" w:name="__RefHeading___Toc3709_1782117212"/>
+      <w:bookmarkStart w:id="10" w:name="__RefHeading___Toc3808_31916387"/>
       <w:bookmarkEnd w:id="10"/>
       <w:r>
         <w:rPr/>
@@ -7060,7 +7060,7 @@
         <w:pStyle w:val="Heading2"/>
         <w:rPr/>
       </w:pPr>
-      <w:bookmarkStart w:id="11" w:name="__RefHeading___Toc3711_1782117212"/>
+      <w:bookmarkStart w:id="11" w:name="__RefHeading___Toc3810_31916387"/>
       <w:bookmarkEnd w:id="11"/>
       <w:r>
         <w:rPr/>
@@ -7116,7 +7116,7 @@
         <w:pStyle w:val="Heading1"/>
         <w:rPr/>
       </w:pPr>
-      <w:bookmarkStart w:id="12" w:name="__RefHeading___Toc3713_1782117212"/>
+      <w:bookmarkStart w:id="12" w:name="__RefHeading___Toc3812_31916387"/>
       <w:bookmarkEnd w:id="12"/>
       <w:r>
         <w:rPr/>
@@ -7212,11 +7212,511 @@
         <w:rPr>
           <w:b/>
         </w:rPr>
+        <w:t>General</w:t>
+      </w:r>
+      <w:r>
+        <w:rPr/>
+        <w:t xml:space="preserve"> palette ends with two </w:t>
+      </w:r>
+      <w:r>
+        <w:rPr>
+          <w:b/>
+        </w:rPr>
+        <w:t>arcs</w:t>
+      </w:r>
+      <w:r>
+        <w:rPr/>
+        <w:t xml:space="preserve">: an open curve along a circle, </w:t>
+      </w:r>
+      <w:r>
+        <w:rPr>
+          <w:b/>
+        </w:rPr>
+        <w:t>Arc (Circle)</w:t>
+      </w:r>
+      <w:r>
+        <w:rPr/>
+        <w:t xml:space="preserve">, which stays round when resized, and one along an ellipse, </w:t>
+      </w:r>
+      <w:r>
+        <w:rPr>
+          <w:b/>
+        </w:rPr>
+        <w:t>Arc (Ellipse)</w:t>
+      </w:r>
+      <w:r>
+        <w:rPr/>
+        <w:t>, which fills its box. Like lines, arcs take a line width and an arrow or other end at either end. Select an arc and open the Style tab to set it:</w:t>
+      </w:r>
+    </w:p>
+    <w:p>
+      <w:pPr>
+        <w:pStyle w:val="Caption"/>
+        <w:keepNext w:val="true"/>
+        <w:rPr/>
+      </w:pPr>
+      <w:r>
+        <w:rPr/>
+        <w:t>Table 8. Arc settings (Style tab, Arc section)</w:t>
+      </w:r>
+    </w:p>
+    <w:tbl>
+      <w:tblPr>
+        <w:tblStyle w:val="TableGrid"/>
+        <w:tblW w:w="9360" w:type="dxa"/>
+        <w:jc w:val="left"/>
+        <w:tblInd w:w="0" w:type="dxa"/>
+        <w:tblLayout w:type="fixed"/>
+        <w:tblCellMar>
+          <w:top w:w="57" w:type="dxa"/>
+          <w:left w:w="180" w:type="dxa"/>
+          <w:bottom w:w="57" w:type="dxa"/>
+          <w:right w:w="180" w:type="dxa"/>
+        </w:tblCellMar>
+        <w:tblLook w:val="04a0" w:noHBand="0" w:noVBand="1" w:firstColumn="1" w:lastRow="0" w:lastColumn="0" w:firstRow="1"/>
+      </w:tblPr>
+      <w:tblGrid>
+        <w:gridCol w:w="2264"/>
+        <w:gridCol w:w="7096"/>
+      </w:tblGrid>
+      <w:tr>
+        <w:trPr>
+          <w:tblHeader w:val="true"/>
+          <w:cantSplit w:val="true"/>
+        </w:trPr>
+        <w:tc>
+          <w:tcPr>
+            <w:tcW w:w="2264" w:type="dxa"/>
+            <w:tcBorders/>
+            <w:shd w:color="auto" w:fill="D9E2EC" w:val="clear"/>
+          </w:tcPr>
+          <w:p>
+            <w:pPr>
+              <w:pStyle w:val="Normal"/>
+              <w:widowControl/>
+              <w:spacing w:lineRule="auto" w:line="240" w:before="20" w:after="20"/>
+              <w:jc w:val="left"/>
+              <w:rPr>
+                <w:rFonts w:cs=""/>
+                <w:kern w:val="0"/>
+                <w:szCs w:val="22"/>
+                <w:lang w:val="en-US" w:eastAsia="en-US" w:bidi="ar-SA"/>
+              </w:rPr>
+            </w:pPr>
+            <w:r>
+              <w:rPr>
+                <w:rFonts w:cs=""/>
+                <w:b/>
+                <w:kern w:val="0"/>
+                <w:sz w:val="20"/>
+                <w:szCs w:val="22"/>
+                <w:lang w:val="en-US" w:eastAsia="en-US" w:bidi="ar-SA"/>
+              </w:rPr>
+              <w:t>Setting</w:t>
+            </w:r>
+          </w:p>
+        </w:tc>
+        <w:tc>
+          <w:tcPr>
+            <w:tcW w:w="7096" w:type="dxa"/>
+            <w:tcBorders/>
+            <w:shd w:color="auto" w:fill="D9E2EC" w:val="clear"/>
+          </w:tcPr>
+          <w:p>
+            <w:pPr>
+              <w:pStyle w:val="Normal"/>
+              <w:widowControl/>
+              <w:spacing w:lineRule="auto" w:line="240" w:before="20" w:after="20"/>
+              <w:jc w:val="left"/>
+              <w:rPr>
+                <w:rFonts w:cs=""/>
+                <w:kern w:val="0"/>
+                <w:szCs w:val="22"/>
+                <w:lang w:val="en-US" w:eastAsia="en-US" w:bidi="ar-SA"/>
+              </w:rPr>
+            </w:pPr>
+            <w:r>
+              <w:rPr>
+                <w:rFonts w:cs=""/>
+                <w:b/>
+                <w:kern w:val="0"/>
+                <w:sz w:val="20"/>
+                <w:szCs w:val="22"/>
+                <w:lang w:val="en-US" w:eastAsia="en-US" w:bidi="ar-SA"/>
+              </w:rPr>
+              <w:t>Meaning</w:t>
+            </w:r>
+          </w:p>
+        </w:tc>
+      </w:tr>
+      <w:tr>
+        <w:trPr>
+          <w:cantSplit w:val="true"/>
+        </w:trPr>
+        <w:tc>
+          <w:tcPr>
+            <w:tcW w:w="2264" w:type="dxa"/>
+            <w:tcBorders/>
+          </w:tcPr>
+          <w:p>
+            <w:pPr>
+              <w:pStyle w:val="Normal"/>
+              <w:widowControl/>
+              <w:spacing w:lineRule="auto" w:line="240" w:before="20" w:after="20"/>
+              <w:jc w:val="left"/>
+              <w:rPr>
+                <w:rFonts w:cs=""/>
+                <w:kern w:val="0"/>
+                <w:szCs w:val="22"/>
+                <w:lang w:val="en-US" w:eastAsia="en-US" w:bidi="ar-SA"/>
+              </w:rPr>
+            </w:pPr>
+            <w:r>
+              <w:rPr>
+                <w:rFonts w:cs=""/>
+                <w:b/>
+                <w:kern w:val="0"/>
+                <w:sz w:val="20"/>
+                <w:szCs w:val="22"/>
+                <w:lang w:val="en-US" w:eastAsia="en-US" w:bidi="ar-SA"/>
+              </w:rPr>
+              <w:t>Start angle, End angle</w:t>
+            </w:r>
+          </w:p>
+        </w:tc>
+        <w:tc>
+          <w:tcPr>
+            <w:tcW w:w="7096" w:type="dxa"/>
+            <w:tcBorders/>
+          </w:tcPr>
+          <w:p>
+            <w:pPr>
+              <w:pStyle w:val="Normal"/>
+              <w:widowControl/>
+              <w:spacing w:lineRule="auto" w:line="240" w:before="20" w:after="20"/>
+              <w:jc w:val="left"/>
+              <w:rPr>
+                <w:rFonts w:cs=""/>
+                <w:kern w:val="0"/>
+                <w:szCs w:val="22"/>
+                <w:lang w:val="en-US" w:eastAsia="en-US" w:bidi="ar-SA"/>
+              </w:rPr>
+            </w:pPr>
+            <w:r>
+              <w:rPr>
+                <w:rFonts w:cs=""/>
+                <w:kern w:val="0"/>
+                <w:sz w:val="20"/>
+                <w:szCs w:val="22"/>
+                <w:lang w:val="en-US" w:eastAsia="en-US" w:bidi="ar-SA"/>
+              </w:rPr>
+              <w:t>Where the arc begins and ends, in degrees: 0 is twelve o'clock, and the arc runs clockwise from the start angle to the end angle. 270 to 90 is the top half</w:t>
+            </w:r>
+          </w:p>
+        </w:tc>
+      </w:tr>
+      <w:tr>
+        <w:trPr>
+          <w:cantSplit w:val="true"/>
+        </w:trPr>
+        <w:tc>
+          <w:tcPr>
+            <w:tcW w:w="2264" w:type="dxa"/>
+            <w:tcBorders/>
+          </w:tcPr>
+          <w:p>
+            <w:pPr>
+              <w:pStyle w:val="Normal"/>
+              <w:widowControl/>
+              <w:spacing w:lineRule="auto" w:line="240" w:before="20" w:after="20"/>
+              <w:jc w:val="left"/>
+              <w:rPr>
+                <w:rFonts w:cs=""/>
+                <w:kern w:val="0"/>
+                <w:szCs w:val="22"/>
+                <w:lang w:val="en-US" w:eastAsia="en-US" w:bidi="ar-SA"/>
+              </w:rPr>
+            </w:pPr>
+            <w:r>
+              <w:rPr>
+                <w:rFonts w:cs=""/>
+                <w:b/>
+                <w:kern w:val="0"/>
+                <w:sz w:val="20"/>
+                <w:szCs w:val="22"/>
+                <w:lang w:val="en-US" w:eastAsia="en-US" w:bidi="ar-SA"/>
+              </w:rPr>
+              <w:t>Line width</w:t>
+            </w:r>
+          </w:p>
+        </w:tc>
+        <w:tc>
+          <w:tcPr>
+            <w:tcW w:w="7096" w:type="dxa"/>
+            <w:tcBorders/>
+          </w:tcPr>
+          <w:p>
+            <w:pPr>
+              <w:pStyle w:val="Normal"/>
+              <w:widowControl/>
+              <w:spacing w:lineRule="auto" w:line="240" w:before="20" w:after="20"/>
+              <w:jc w:val="left"/>
+              <w:rPr>
+                <w:rFonts w:cs=""/>
+                <w:kern w:val="0"/>
+                <w:szCs w:val="22"/>
+                <w:lang w:val="en-US" w:eastAsia="en-US" w:bidi="ar-SA"/>
+              </w:rPr>
+            </w:pPr>
+            <w:r>
+              <w:rPr>
+                <w:rFonts w:cs=""/>
+                <w:kern w:val="0"/>
+                <w:sz w:val="20"/>
+                <w:szCs w:val="22"/>
+                <w:lang w:val="en-US" w:eastAsia="en-US" w:bidi="ar-SA"/>
+              </w:rPr>
+              <w:t>The thickness of the line, as for any shape</w:t>
+            </w:r>
+          </w:p>
+        </w:tc>
+      </w:tr>
+      <w:tr>
+        <w:trPr>
+          <w:cantSplit w:val="true"/>
+        </w:trPr>
+        <w:tc>
+          <w:tcPr>
+            <w:tcW w:w="2264" w:type="dxa"/>
+            <w:tcBorders/>
+          </w:tcPr>
+          <w:p>
+            <w:pPr>
+              <w:pStyle w:val="Normal"/>
+              <w:widowControl/>
+              <w:spacing w:lineRule="auto" w:line="240" w:before="20" w:after="20"/>
+              <w:jc w:val="left"/>
+              <w:rPr>
+                <w:rFonts w:cs=""/>
+                <w:kern w:val="0"/>
+                <w:szCs w:val="22"/>
+                <w:lang w:val="en-US" w:eastAsia="en-US" w:bidi="ar-SA"/>
+              </w:rPr>
+            </w:pPr>
+            <w:r>
+              <w:rPr>
+                <w:rFonts w:cs=""/>
+                <w:b/>
+                <w:kern w:val="0"/>
+                <w:sz w:val="20"/>
+                <w:szCs w:val="22"/>
+                <w:lang w:val="en-US" w:eastAsia="en-US" w:bidi="ar-SA"/>
+              </w:rPr>
+              <w:t>Start arrow, End arrow</w:t>
+            </w:r>
+          </w:p>
+        </w:tc>
+        <w:tc>
+          <w:tcPr>
+            <w:tcW w:w="7096" w:type="dxa"/>
+            <w:tcBorders/>
+          </w:tcPr>
+          <w:p>
+            <w:pPr>
+              <w:pStyle w:val="Normal"/>
+              <w:widowControl/>
+              <w:spacing w:lineRule="auto" w:line="240" w:before="20" w:after="20"/>
+              <w:jc w:val="left"/>
+              <w:rPr>
+                <w:rFonts w:cs=""/>
+                <w:kern w:val="0"/>
+                <w:szCs w:val="22"/>
+                <w:lang w:val="en-US" w:eastAsia="en-US" w:bidi="ar-SA"/>
+              </w:rPr>
+            </w:pPr>
+            <w:r>
+              <w:rPr>
+                <w:rFonts w:cs=""/>
+                <w:kern w:val="0"/>
+                <w:sz w:val="20"/>
+                <w:szCs w:val="22"/>
+                <w:lang w:val="en-US" w:eastAsia="en-US" w:bidi="ar-SA"/>
+              </w:rPr>
+              <w:t>The end at each end: none, classic, block, open, oval, diamond, box and others, as on lines</w:t>
+            </w:r>
+          </w:p>
+        </w:tc>
+      </w:tr>
+      <w:tr>
+        <w:trPr>
+          <w:cantSplit w:val="true"/>
+        </w:trPr>
+        <w:tc>
+          <w:tcPr>
+            <w:tcW w:w="2264" w:type="dxa"/>
+            <w:tcBorders/>
+          </w:tcPr>
+          <w:p>
+            <w:pPr>
+              <w:pStyle w:val="Normal"/>
+              <w:widowControl/>
+              <w:spacing w:lineRule="auto" w:line="240" w:before="20" w:after="20"/>
+              <w:jc w:val="left"/>
+              <w:rPr>
+                <w:rFonts w:cs=""/>
+                <w:kern w:val="0"/>
+                <w:szCs w:val="22"/>
+                <w:lang w:val="en-US" w:eastAsia="en-US" w:bidi="ar-SA"/>
+              </w:rPr>
+            </w:pPr>
+            <w:r>
+              <w:rPr>
+                <w:rFonts w:cs=""/>
+                <w:b/>
+                <w:kern w:val="0"/>
+                <w:sz w:val="20"/>
+                <w:szCs w:val="22"/>
+                <w:lang w:val="en-US" w:eastAsia="en-US" w:bidi="ar-SA"/>
+              </w:rPr>
+              <w:t>Start size, End size</w:t>
+            </w:r>
+          </w:p>
+        </w:tc>
+        <w:tc>
+          <w:tcPr>
+            <w:tcW w:w="7096" w:type="dxa"/>
+            <w:tcBorders/>
+          </w:tcPr>
+          <w:p>
+            <w:pPr>
+              <w:pStyle w:val="Normal"/>
+              <w:widowControl/>
+              <w:spacing w:lineRule="auto" w:line="240" w:before="20" w:after="20"/>
+              <w:jc w:val="left"/>
+              <w:rPr>
+                <w:rFonts w:cs=""/>
+                <w:kern w:val="0"/>
+                <w:szCs w:val="22"/>
+                <w:lang w:val="en-US" w:eastAsia="en-US" w:bidi="ar-SA"/>
+              </w:rPr>
+            </w:pPr>
+            <w:r>
+              <w:rPr>
+                <w:rFonts w:cs=""/>
+                <w:kern w:val="0"/>
+                <w:sz w:val="20"/>
+                <w:szCs w:val="22"/>
+                <w:lang w:val="en-US" w:eastAsia="en-US" w:bidi="ar-SA"/>
+              </w:rPr>
+              <w:t>The size of each end</w:t>
+            </w:r>
+          </w:p>
+        </w:tc>
+      </w:tr>
+      <w:tr>
+        <w:trPr>
+          <w:cantSplit w:val="true"/>
+        </w:trPr>
+        <w:tc>
+          <w:tcPr>
+            <w:tcW w:w="2264" w:type="dxa"/>
+            <w:tcBorders/>
+          </w:tcPr>
+          <w:p>
+            <w:pPr>
+              <w:pStyle w:val="Normal"/>
+              <w:widowControl/>
+              <w:spacing w:lineRule="auto" w:line="240" w:before="20" w:after="20"/>
+              <w:jc w:val="left"/>
+              <w:rPr>
+                <w:rFonts w:cs=""/>
+                <w:kern w:val="0"/>
+                <w:szCs w:val="22"/>
+                <w:lang w:val="en-US" w:eastAsia="en-US" w:bidi="ar-SA"/>
+              </w:rPr>
+            </w:pPr>
+            <w:r>
+              <w:rPr>
+                <w:rFonts w:cs=""/>
+                <w:b/>
+                <w:kern w:val="0"/>
+                <w:sz w:val="20"/>
+                <w:szCs w:val="22"/>
+                <w:lang w:val="en-US" w:eastAsia="en-US" w:bidi="ar-SA"/>
+              </w:rPr>
+              <w:t>Start filled, End filled</w:t>
+            </w:r>
+          </w:p>
+        </w:tc>
+        <w:tc>
+          <w:tcPr>
+            <w:tcW w:w="7096" w:type="dxa"/>
+            <w:tcBorders/>
+          </w:tcPr>
+          <w:p>
+            <w:pPr>
+              <w:pStyle w:val="Normal"/>
+              <w:widowControl/>
+              <w:spacing w:lineRule="auto" w:line="240" w:before="20" w:after="20"/>
+              <w:jc w:val="left"/>
+              <w:rPr>
+                <w:rFonts w:cs=""/>
+                <w:kern w:val="0"/>
+                <w:szCs w:val="22"/>
+                <w:lang w:val="en-US" w:eastAsia="en-US" w:bidi="ar-SA"/>
+              </w:rPr>
+            </w:pPr>
+            <w:r>
+              <w:rPr>
+                <w:rFonts w:cs=""/>
+                <w:kern w:val="0"/>
+                <w:sz w:val="20"/>
+                <w:szCs w:val="22"/>
+                <w:lang w:val="en-US" w:eastAsia="en-US" w:bidi="ar-SA"/>
+              </w:rPr>
+              <w:t>Whether a closed end, such as a block or diamond, is filled or drawn as an outline</w:t>
+            </w:r>
+          </w:p>
+        </w:tc>
+      </w:tr>
+    </w:tbl>
+    <w:p>
+      <w:pPr>
+        <w:pStyle w:val="Normal"/>
+        <w:rPr/>
+      </w:pPr>
+      <w:r>
+        <w:rPr/>
+      </w:r>
+    </w:p>
+    <w:p>
+      <w:pPr>
+        <w:pStyle w:val="Normal"/>
+        <w:rPr/>
+      </w:pPr>
+      <w:r>
+        <w:rPr/>
+        <w:t>Arcs are objects like any other: animation links such as Line Color, Blink, Visibility and Orientation work on them, for example to show a gauge sweep or a flow direction.</w:t>
+      </w:r>
+    </w:p>
+    <w:p>
+      <w:pPr>
+        <w:pStyle w:val="Normal"/>
+        <w:rPr/>
+      </w:pPr>
+      <w:r>
+        <w:rPr/>
+        <w:t xml:space="preserve">The </w:t>
+      </w:r>
+      <w:r>
+        <w:rPr>
+          <w:b/>
+        </w:rPr>
         <w:t>HMI</w:t>
       </w:r>
       <w:r>
         <w:rPr/>
-        <w:t xml:space="preserve"> palette adds two objects: the </w:t>
+        <w:t xml:space="preserve"> palette adds three objects: the </w:t>
       </w:r>
       <w:r>
         <w:rPr>
@@ -7226,7 +7726,7 @@
       </w:r>
       <w:r>
         <w:rPr/>
-        <w:t xml:space="preserve">, the live list of active alarms at the bottom of every LiquidWeighHMI screen, and the </w:t>
+        <w:t xml:space="preserve">, the live list of active alarms at the bottom of every LiquidWeighHMI screen, the </w:t>
       </w:r>
       <w:r>
         <w:rPr>
@@ -7236,7 +7736,17 @@
       </w:r>
       <w:r>
         <w:rPr/>
-        <w:t>, used on the Alarm History screen.</w:t>
+        <w:t xml:space="preserve">, used on the Alarm History screen, and the </w:t>
+      </w:r>
+      <w:r>
+        <w:rPr>
+          <w:b/>
+        </w:rPr>
+        <w:t>Recipe List</w:t>
+      </w:r>
+      <w:r>
+        <w:rPr/>
+        <w:t xml:space="preserve"> (chapter 11).</w:t>
       </w:r>
     </w:p>
     <w:p>
@@ -7296,7 +7806,7 @@
       </w:pPr>
       <w:r>
         <w:rPr/>
-        <w:t>Figure 11. The HMI palette: Alarm List and Alarm History</w:t>
+        <w:t>Figure 11. The HMI palette: Alarm List, Alarm History and Recipe List</w:t>
       </w:r>
     </w:p>
     <w:p>
@@ -7316,13 +7826,16 @@
         <w:rPr/>
         <w:t>Keep objects inside the Screen frame, and group repeated symbols (a valve with its tag label) so they can be copied with their links.</w:t>
       </w:r>
+      <w:r>
+        <w:br w:type="page"/>
+      </w:r>
     </w:p>
     <w:p>
       <w:pPr>
         <w:pStyle w:val="Heading1"/>
         <w:rPr/>
       </w:pPr>
-      <w:bookmarkStart w:id="13" w:name="__RefHeading___Toc3715_1782117212"/>
+      <w:bookmarkStart w:id="13" w:name="__RefHeading___Toc3814_31916387"/>
       <w:bookmarkEnd w:id="13"/>
       <w:r>
         <w:rPr/>
@@ -7417,7 +7930,7 @@
       </w:pPr>
       <w:r>
         <w:rPr/>
-        <w:t>Table 8. Animation link families</w:t>
+        <w:t>Table 9. Animation link families</w:t>
       </w:r>
     </w:p>
     <w:tbl>
@@ -8047,7 +8560,7 @@
         <w:pStyle w:val="Heading2"/>
         <w:rPr/>
       </w:pPr>
-      <w:bookmarkStart w:id="14" w:name="__RefHeading___Toc3717_1782117212"/>
+      <w:bookmarkStart w:id="14" w:name="__RefHeading___Toc3816_31916387"/>
       <w:bookmarkEnd w:id="14"/>
       <w:r>
         <w:rPr/>
@@ -8233,7 +8746,7 @@
         <w:pStyle w:val="Heading2"/>
         <w:rPr/>
       </w:pPr>
-      <w:bookmarkStart w:id="15" w:name="__RefHeading___Toc3719_1782117212"/>
+      <w:bookmarkStart w:id="15" w:name="__RefHeading___Toc3818_31916387"/>
       <w:bookmarkEnd w:id="15"/>
       <w:r>
         <w:rPr/>
@@ -8348,13 +8861,16 @@
         <w:rPr/>
         <w:t>Percent Fill draws only the filled part of the object, outline included. Place an identical shape with no fill on top as the vessel outline, as LiquidWeighHMI does.</w:t>
       </w:r>
+      <w:r>
+        <w:br w:type="page"/>
+      </w:r>
     </w:p>
     <w:p>
       <w:pPr>
         <w:pStyle w:val="Heading2"/>
         <w:rPr/>
       </w:pPr>
-      <w:bookmarkStart w:id="16" w:name="__RefHeading___Toc3721_1782117212"/>
+      <w:bookmarkStart w:id="16" w:name="__RefHeading___Toc3820_31916387"/>
       <w:bookmarkEnd w:id="16"/>
       <w:r>
         <w:rPr/>
@@ -8470,7 +8986,7 @@
         <w:pStyle w:val="Heading2"/>
         <w:rPr/>
       </w:pPr>
-      <w:bookmarkStart w:id="17" w:name="__RefHeading___Toc3723_1782117212"/>
+      <w:bookmarkStart w:id="17" w:name="__RefHeading___Toc3822_31916387"/>
       <w:bookmarkEnd w:id="17"/>
       <w:r>
         <w:rPr/>
@@ -8586,7 +9102,7 @@
         <w:pStyle w:val="Heading2"/>
         <w:rPr/>
       </w:pPr>
-      <w:bookmarkStart w:id="18" w:name="__RefHeading___Toc3725_1782117212"/>
+      <w:bookmarkStart w:id="18" w:name="__RefHeading___Toc3824_31916387"/>
       <w:bookmarkEnd w:id="18"/>
       <w:r>
         <w:rPr/>
@@ -8724,7 +9240,7 @@
       </w:pPr>
       <w:r>
         <w:rPr/>
-        <w:t>Table 9. Pushbutton actions</w:t>
+        <w:t>Table 10. Pushbutton actions</w:t>
       </w:r>
     </w:p>
     <w:tbl>
@@ -9098,7 +9614,7 @@
         <w:pStyle w:val="Heading1"/>
         <w:rPr/>
       </w:pPr>
-      <w:bookmarkStart w:id="19" w:name="__RefHeading___Toc3727_1782117212"/>
+      <w:bookmarkStart w:id="19" w:name="__RefHeading___Toc3826_31916387"/>
       <w:bookmarkEnd w:id="19"/>
       <w:r>
         <w:rPr/>
@@ -9123,7 +9639,7 @@
       </w:pPr>
       <w:r>
         <w:rPr/>
-        <w:t>Table 10. Expression syntax</w:t>
+        <w:t>Table 11. Expression syntax</w:t>
       </w:r>
     </w:p>
     <w:tbl>
@@ -9563,7 +10079,7 @@
       </w:pPr>
       <w:r>
         <w:rPr/>
-        <w:t>Table 11. System tags</w:t>
+        <w:t>Table 12. System tags</w:t>
       </w:r>
     </w:p>
     <w:tbl>
@@ -10000,7 +10516,7 @@
         <w:pStyle w:val="Heading2"/>
         <w:rPr/>
       </w:pPr>
-      <w:bookmarkStart w:id="20" w:name="__RefHeading___Toc3729_1782117212"/>
+      <w:bookmarkStart w:id="20" w:name="__RefHeading___Toc3828_31916387"/>
       <w:bookmarkEnd w:id="20"/>
       <w:r>
         <w:rPr/>
@@ -10184,7 +10700,7 @@
         <w:pStyle w:val="Heading2"/>
         <w:rPr/>
       </w:pPr>
-      <w:bookmarkStart w:id="21" w:name="__RefHeading___Toc3731_1782117212"/>
+      <w:bookmarkStart w:id="21" w:name="__RefHeading___Toc3830_31916387"/>
       <w:bookmarkEnd w:id="21"/>
       <w:r>
         <w:rPr/>
@@ -10303,7 +10819,7 @@
         <w:pStyle w:val="Heading2"/>
         <w:rPr/>
       </w:pPr>
-      <w:bookmarkStart w:id="22" w:name="__RefHeading___Toc3733_1782117212"/>
+      <w:bookmarkStart w:id="22" w:name="__RefHeading___Toc3832_31916387"/>
       <w:bookmarkEnd w:id="22"/>
       <w:r>
         <w:rPr/>
@@ -10435,7 +10951,7 @@
       </w:pPr>
       <w:r>
         <w:rPr/>
-        <w:t>Table 12. Math and text functions (links and scripts)</w:t>
+        <w:t>Table 13. Math and text functions (links and scripts)</w:t>
       </w:r>
     </w:p>
     <w:tbl>
@@ -11604,7 +12120,7 @@
       </w:pPr>
       <w:r>
         <w:rPr/>
-        <w:t>Table 13. Security functions (scripts only)</w:t>
+        <w:t>Table 14. Security functions (scripts only)</w:t>
       </w:r>
     </w:p>
     <w:tbl>
@@ -12267,7 +12783,7 @@
       </w:pPr>
       <w:r>
         <w:rPr/>
-        <w:t>Table 14. Indirect tag function (scripts only)</w:t>
+        <w:t>Table 15. Indirect tag function (scripts only)</w:t>
       </w:r>
     </w:p>
     <w:tbl>
@@ -12526,7 +13042,7 @@
       </w:pPr>
       <w:r>
         <w:rPr/>
-        <w:t>Table 15. Window function (scripts only)</w:t>
+        <w:t>Table 16. Window function (scripts only)</w:t>
       </w:r>
     </w:p>
     <w:tbl>
@@ -12809,7 +13325,7 @@
       </w:pPr>
       <w:r>
         <w:rPr/>
-        <w:t>Table 16. Recipe functions (scripts only)</w:t>
+        <w:t>Table 17. Recipe functions (scripts only)</w:t>
       </w:r>
     </w:p>
     <w:tbl>
@@ -13850,7 +14366,7 @@
         <w:pStyle w:val="Heading2"/>
         <w:rPr/>
       </w:pPr>
-      <w:bookmarkStart w:id="23" w:name="__RefHeading___Toc3735_1782117212"/>
+      <w:bookmarkStart w:id="23" w:name="__RefHeading___Toc3834_31916387"/>
       <w:bookmarkEnd w:id="23"/>
       <w:r>
         <w:rPr/>
@@ -14686,7 +15202,7 @@
         <w:pStyle w:val="Heading2"/>
         <w:rPr/>
       </w:pPr>
-      <w:bookmarkStart w:id="24" w:name="__RefHeading___Toc3737_1782117212"/>
+      <w:bookmarkStart w:id="24" w:name="__RefHeading___Toc3836_31916387"/>
       <w:bookmarkEnd w:id="24"/>
       <w:r>
         <w:rPr/>
@@ -15163,7 +15679,7 @@
         <w:pStyle w:val="Heading1"/>
         <w:rPr/>
       </w:pPr>
-      <w:bookmarkStart w:id="25" w:name="__RefHeading___Toc3739_1782117212"/>
+      <w:bookmarkStart w:id="25" w:name="__RefHeading___Toc3838_31916387"/>
       <w:bookmarkEnd w:id="25"/>
       <w:r>
         <w:rPr/>
@@ -15175,7 +15691,7 @@
         <w:pStyle w:val="Heading2"/>
         <w:rPr/>
       </w:pPr>
-      <w:bookmarkStart w:id="26" w:name="__RefHeading___Toc3741_1782117212"/>
+      <w:bookmarkStart w:id="26" w:name="__RefHeading___Toc3840_31916387"/>
       <w:bookmarkEnd w:id="26"/>
       <w:r>
         <w:rPr/>
@@ -15308,7 +15824,7 @@
         <w:pStyle w:val="Heading2"/>
         <w:rPr/>
       </w:pPr>
-      <w:bookmarkStart w:id="27" w:name="__RefHeading___Toc3743_1782117212"/>
+      <w:bookmarkStart w:id="27" w:name="__RefHeading___Toc3842_31916387"/>
       <w:bookmarkEnd w:id="27"/>
       <w:r>
         <w:rPr/>
@@ -15403,7 +15919,7 @@
       </w:pPr>
       <w:r>
         <w:rPr/>
-        <w:t>Table 17. LiquidWeighHMI users</w:t>
+        <w:t>Table 18. LiquidWeighHMI users</w:t>
       </w:r>
     </w:p>
     <w:tbl>
@@ -15998,7 +16514,7 @@
         <w:pStyle w:val="Heading1"/>
         <w:rPr/>
       </w:pPr>
-      <w:bookmarkStart w:id="28" w:name="__RefHeading___Toc3745_1782117212"/>
+      <w:bookmarkStart w:id="28" w:name="__RefHeading___Toc3844_31916387"/>
       <w:bookmarkEnd w:id="28"/>
       <w:r>
         <w:rPr/>
@@ -16134,7 +16650,7 @@
         <w:pStyle w:val="Heading2"/>
         <w:rPr/>
       </w:pPr>
-      <w:bookmarkStart w:id="29" w:name="__RefHeading___Toc3747_1782117212"/>
+      <w:bookmarkStart w:id="29" w:name="__RefHeading___Toc3846_31916387"/>
       <w:bookmarkEnd w:id="29"/>
       <w:r>
         <w:rPr/>
@@ -16389,7 +16905,7 @@
       </w:pPr>
       <w:r>
         <w:rPr/>
-        <w:t>Table 18. The tags of the Plasticizer Blends book</w:t>
+        <w:t>Table 19. The tags of the Plasticizer Blends book</w:t>
       </w:r>
     </w:p>
     <w:tbl>
@@ -17006,7 +17522,7 @@
       </w:pPr>
       <w:r>
         <w:rPr/>
-        <w:t>Table 19. LiquidWeighHMI's starting recipes</w:t>
+        <w:t>Table 20. LiquidWeighHMI's starting recipes</w:t>
       </w:r>
     </w:p>
     <w:tbl>
@@ -17995,7 +18511,7 @@
         <w:pStyle w:val="Heading2"/>
         <w:rPr/>
       </w:pPr>
-      <w:bookmarkStart w:id="30" w:name="__RefHeading___Toc3749_1782117212"/>
+      <w:bookmarkStart w:id="30" w:name="__RefHeading___Toc3848_31916387"/>
       <w:bookmarkEnd w:id="30"/>
       <w:r>
         <w:rPr/>
@@ -18182,7 +18698,7 @@
       </w:pPr>
       <w:r>
         <w:rPr/>
-        <w:t>Table 20. The Recipes screen's buttons</w:t>
+        <w:t>Table 21. The Recipes screen's buttons</w:t>
       </w:r>
     </w:p>
     <w:tbl>
@@ -19445,7 +19961,7 @@
         <w:pStyle w:val="Heading2"/>
         <w:rPr/>
       </w:pPr>
-      <w:bookmarkStart w:id="31" w:name="__RefHeading___Toc3751_1782117212"/>
+      <w:bookmarkStart w:id="31" w:name="__RefHeading___Toc3850_31916387"/>
       <w:bookmarkEnd w:id="31"/>
       <w:r>
         <w:rPr/>
@@ -19536,7 +20052,7 @@
       </w:pPr>
       <w:r>
         <w:rPr/>
-        <w:t>Table 21. Recipe List settings</w:t>
+        <w:t>Table 22. Recipe List settings</w:t>
       </w:r>
     </w:p>
     <w:tbl>
@@ -19986,7 +20502,7 @@
         <w:pStyle w:val="Heading2"/>
         <w:rPr/>
       </w:pPr>
-      <w:bookmarkStart w:id="32" w:name="__RefHeading___Toc3753_1782117212"/>
+      <w:bookmarkStart w:id="32" w:name="__RefHeading___Toc3852_31916387"/>
       <w:bookmarkEnd w:id="32"/>
       <w:r>
         <w:rPr/>
@@ -20271,7 +20787,7 @@
         <w:pStyle w:val="Heading2"/>
         <w:rPr/>
       </w:pPr>
-      <w:bookmarkStart w:id="33" w:name="__RefHeading___Toc3755_1782117212"/>
+      <w:bookmarkStart w:id="33" w:name="__RefHeading___Toc3854_31916387"/>
       <w:bookmarkEnd w:id="33"/>
       <w:r>
         <w:rPr/>
@@ -20429,7 +20945,7 @@
         <w:pStyle w:val="Heading2"/>
         <w:rPr/>
       </w:pPr>
-      <w:bookmarkStart w:id="34" w:name="__RefHeading___Toc3757_1782117212"/>
+      <w:bookmarkStart w:id="34" w:name="__RefHeading___Toc3856_31916387"/>
       <w:bookmarkEnd w:id="34"/>
       <w:r>
         <w:rPr/>
@@ -20454,7 +20970,7 @@
       </w:pPr>
       <w:r>
         <w:rPr/>
-        <w:t>Table 22. Where saved recipes are kept</w:t>
+        <w:t>Table 23. Where saved recipes are kept</w:t>
       </w:r>
     </w:p>
     <w:tbl>
@@ -20829,7 +21345,7 @@
         <w:pStyle w:val="Heading1"/>
         <w:rPr/>
       </w:pPr>
-      <w:bookmarkStart w:id="35" w:name="__RefHeading___Toc3759_1782117212"/>
+      <w:bookmarkStart w:id="35" w:name="__RefHeading___Toc3858_31916387"/>
       <w:bookmarkEnd w:id="35"/>
       <w:r>
         <w:rPr/>
@@ -20841,7 +21357,7 @@
         <w:pStyle w:val="Heading2"/>
         <w:rPr/>
       </w:pPr>
-      <w:bookmarkStart w:id="36" w:name="__RefHeading___Toc3761_1782117212"/>
+      <w:bookmarkStart w:id="36" w:name="__RefHeading___Toc3860_31916387"/>
       <w:bookmarkEnd w:id="36"/>
       <w:r>
         <w:rPr/>
@@ -20929,7 +21445,7 @@
         <w:pStyle w:val="Heading2"/>
         <w:rPr/>
       </w:pPr>
-      <w:bookmarkStart w:id="37" w:name="__RefHeading___Toc3763_1782117212"/>
+      <w:bookmarkStart w:id="37" w:name="__RefHeading___Toc3862_31916387"/>
       <w:bookmarkEnd w:id="37"/>
       <w:r>
         <w:rPr/>
@@ -21475,7 +21991,7 @@
         <w:pStyle w:val="Heading1"/>
         <w:rPr/>
       </w:pPr>
-      <w:bookmarkStart w:id="38" w:name="__RefHeading___Toc3765_1782117212"/>
+      <w:bookmarkStart w:id="38" w:name="__RefHeading___Toc3864_31916387"/>
       <w:bookmarkEnd w:id="38"/>
       <w:r>
         <w:rPr/>
@@ -21500,7 +22016,7 @@
       </w:pPr>
       <w:r>
         <w:rPr/>
-        <w:t>Table 23. Deployment options</w:t>
+        <w:t>Table 24. Deployment options</w:t>
       </w:r>
     </w:p>
     <w:tbl>
@@ -21928,7 +22444,7 @@
         <w:pStyle w:val="Heading2"/>
         <w:rPr/>
       </w:pPr>
-      <w:bookmarkStart w:id="39" w:name="__RefHeading___Toc3767_1782117212"/>
+      <w:bookmarkStart w:id="39" w:name="__RefHeading___Toc3866_31916387"/>
       <w:bookmarkEnd w:id="39"/>
       <w:r>
         <w:rPr/>
@@ -22016,7 +22532,7 @@
         <w:pStyle w:val="Heading2"/>
         <w:rPr/>
       </w:pPr>
-      <w:bookmarkStart w:id="40" w:name="__RefHeading___Toc3769_1782117212"/>
+      <w:bookmarkStart w:id="40" w:name="__RefHeading___Toc3868_31916387"/>
       <w:bookmarkEnd w:id="40"/>
       <w:r>
         <w:rPr/>
@@ -22129,7 +22645,7 @@
         <w:pStyle w:val="Heading2"/>
         <w:rPr/>
       </w:pPr>
-      <w:bookmarkStart w:id="41" w:name="__RefHeading___Toc3771_1782117212"/>
+      <w:bookmarkStart w:id="41" w:name="__RefHeading___Toc3870_31916387"/>
       <w:bookmarkEnd w:id="41"/>
       <w:r>
         <w:rPr/>
@@ -22342,7 +22858,7 @@
         <w:pStyle w:val="Heading1"/>
         <w:rPr/>
       </w:pPr>
-      <w:bookmarkStart w:id="42" w:name="__RefHeading___Toc3773_1782117212"/>
+      <w:bookmarkStart w:id="42" w:name="__RefHeading___Toc3872_31916387"/>
       <w:bookmarkEnd w:id="42"/>
       <w:r>
         <w:rPr/>
@@ -22357,7 +22873,7 @@
       </w:pPr>
       <w:r>
         <w:rPr/>
-        <w:t>Table 24. Common problems</w:t>
+        <w:t>Table 25. Common problems</w:t>
       </w:r>
     </w:p>
     <w:tbl>
@@ -23002,7 +23518,7 @@
         <w:pStyle w:val="Heading1"/>
         <w:rPr/>
       </w:pPr>
-      <w:bookmarkStart w:id="43" w:name="__RefHeading___Toc3775_1782117212"/>
+      <w:bookmarkStart w:id="43" w:name="__RefHeading___Toc3874_31916387"/>
       <w:bookmarkEnd w:id="43"/>
       <w:r>
         <w:rPr/>
@@ -23027,7 +23543,7 @@
       </w:pPr>
       <w:r>
         <w:rPr/>
-        <w:t>Table 25. Command-line modes</w:t>
+        <w:t>Table 26. Command-line modes</w:t>
       </w:r>
     </w:p>
     <w:tbl>
@@ -23540,7 +24056,7 @@
       <w:rPr>
         <w:sz w:val="18"/>
       </w:rPr>
-      <w:t>52</w:t>
+      <w:t>53</w:t>
     </w:r>
     <w:r>
       <w:rPr>

</xml_diff>

<commit_message>
docs: arc angles as on a protractor; start and end widths
Co-Authored-By: Claude Opus 5.5 <noreply@anthropic.com>
</commit_message>
<xml_diff>
--- a/doc/Append-HMI-Studio-User-Manual.docx
+++ b/doc/Append-HMI-Studio-User-Manual.docx
@@ -283,7 +283,7 @@
             </w:rPr>
             <w:fldChar w:fldCharType="separate"/>
           </w:r>
-          <w:hyperlink w:anchor="__RefHeading___Toc3788_31916387" w:tooltip="1 Introduction">
+          <w:hyperlink w:anchor="__RefHeading___Toc3788_4120085704" w:tooltip="1 Introduction">
             <w:r>
               <w:rPr>
                 <w:rStyle w:val="IndexLink"/>
@@ -304,7 +304,7 @@
             </w:tabs>
             <w:rPr/>
           </w:pPr>
-          <w:hyperlink w:anchor="__RefHeading___Toc3790_31916387" w:tooltip="1.1 How an HMI application is organized">
+          <w:hyperlink w:anchor="__RefHeading___Toc3790_4120085704" w:tooltip="1.1 How an HMI application is organized">
             <w:r>
               <w:rPr>
                 <w:rStyle w:val="IndexLink"/>
@@ -325,7 +325,7 @@
             </w:tabs>
             <w:rPr/>
           </w:pPr>
-          <w:hyperlink w:anchor="__RefHeading___Toc3792_31916387" w:tooltip="2 The Studio window">
+          <w:hyperlink w:anchor="__RefHeading___Toc3792_4120085704" w:tooltip="2 The Studio window">
             <w:r>
               <w:rPr>
                 <w:rStyle w:val="IndexLink"/>
@@ -346,7 +346,7 @@
             </w:tabs>
             <w:rPr/>
           </w:pPr>
-          <w:hyperlink w:anchor="__RefHeading___Toc3794_31916387" w:tooltip="2.1 The HMI menu">
+          <w:hyperlink w:anchor="__RefHeading___Toc3794_4120085704" w:tooltip="2.1 The HMI menu">
             <w:r>
               <w:rPr>
                 <w:rStyle w:val="IndexLink"/>
@@ -367,7 +367,7 @@
             </w:tabs>
             <w:rPr/>
           </w:pPr>
-          <w:hyperlink w:anchor="__RefHeading___Toc3796_31916387" w:tooltip="3 Application settings">
+          <w:hyperlink w:anchor="__RefHeading___Toc3796_4120085704" w:tooltip="3 Application settings">
             <w:r>
               <w:rPr>
                 <w:rStyle w:val="IndexLink"/>
@@ -388,7 +388,7 @@
             </w:tabs>
             <w:rPr/>
           </w:pPr>
-          <w:hyperlink w:anchor="__RefHeading___Toc3798_31916387" w:tooltip="4 Devices">
+          <w:hyperlink w:anchor="__RefHeading___Toc3798_4120085704" w:tooltip="4 Devices">
             <w:r>
               <w:rPr>
                 <w:rStyle w:val="IndexLink"/>
@@ -409,7 +409,7 @@
             </w:tabs>
             <w:rPr/>
           </w:pPr>
-          <w:hyperlink w:anchor="__RefHeading___Toc3800_31916387" w:tooltip="5 Tags">
+          <w:hyperlink w:anchor="__RefHeading___Toc3800_4120085704" w:tooltip="5 Tags">
             <w:r>
               <w:rPr>
                 <w:rStyle w:val="IndexLink"/>
@@ -430,7 +430,7 @@
             </w:tabs>
             <w:rPr/>
           </w:pPr>
-          <w:hyperlink w:anchor="__RefHeading___Toc3802_31916387" w:tooltip="5.1 Tag fields">
+          <w:hyperlink w:anchor="__RefHeading___Toc3802_4120085704" w:tooltip="5.1 Tag fields">
             <w:r>
               <w:rPr>
                 <w:rStyle w:val="IndexLink"/>
@@ -451,7 +451,7 @@
             </w:tabs>
             <w:rPr/>
           </w:pPr>
-          <w:hyperlink w:anchor="__RefHeading___Toc3804_31916387" w:tooltip="5.2 Alarms on a tag">
+          <w:hyperlink w:anchor="__RefHeading___Toc3804_4120085704" w:tooltip="5.2 Alarms on a tag">
             <w:r>
               <w:rPr>
                 <w:rStyle w:val="IndexLink"/>
@@ -472,7 +472,7 @@
             </w:tabs>
             <w:rPr/>
           </w:pPr>
-          <w:hyperlink w:anchor="__RefHeading___Toc3806_31916387" w:tooltip="6 Screens and windows">
+          <w:hyperlink w:anchor="__RefHeading___Toc3806_4120085704" w:tooltip="6 Screens and windows">
             <w:r>
               <w:rPr>
                 <w:rStyle w:val="IndexLink"/>
@@ -493,7 +493,7 @@
             </w:tabs>
             <w:rPr/>
           </w:pPr>
-          <w:hyperlink w:anchor="__RefHeading___Toc3808_31916387" w:tooltip="6.1 Window properties">
+          <w:hyperlink w:anchor="__RefHeading___Toc3808_4120085704" w:tooltip="6.1 Window properties">
             <w:r>
               <w:rPr>
                 <w:rStyle w:val="IndexLink"/>
@@ -514,7 +514,7 @@
             </w:tabs>
             <w:rPr/>
           </w:pPr>
-          <w:hyperlink w:anchor="__RefHeading___Toc3810_31916387" w:tooltip="6.2 Navigation">
+          <w:hyperlink w:anchor="__RefHeading___Toc3810_4120085704" w:tooltip="6.2 Navigation">
             <w:r>
               <w:rPr>
                 <w:rStyle w:val="IndexLink"/>
@@ -535,7 +535,7 @@
             </w:tabs>
             <w:rPr/>
           </w:pPr>
-          <w:hyperlink w:anchor="__RefHeading___Toc3812_31916387" w:tooltip="7 Drawing objects">
+          <w:hyperlink w:anchor="__RefHeading___Toc3812_4120085704" w:tooltip="7 Drawing objects">
             <w:r>
               <w:rPr>
                 <w:rStyle w:val="IndexLink"/>
@@ -556,7 +556,7 @@
             </w:tabs>
             <w:rPr/>
           </w:pPr>
-          <w:hyperlink w:anchor="__RefHeading___Toc3814_31916387" w:tooltip="8 Animation links">
+          <w:hyperlink w:anchor="__RefHeading___Toc3814_4120085704" w:tooltip="8 Animation links">
             <w:r>
               <w:rPr>
                 <w:rStyle w:val="IndexLink"/>
@@ -577,7 +577,7 @@
             </w:tabs>
             <w:rPr/>
           </w:pPr>
-          <w:hyperlink w:anchor="__RefHeading___Toc3816_31916387" w:tooltip="8.1 A valve: status color, fault blink and faceplate">
+          <w:hyperlink w:anchor="__RefHeading___Toc3816_4120085704" w:tooltip="8.1 A valve: status color, fault blink and faceplate">
             <w:r>
               <w:rPr>
                 <w:rStyle w:val="IndexLink"/>
@@ -585,7 +585,7 @@
               </w:rPr>
               <w:t>8.1 A valve: status color, fault blink and faceplate</w:t>
               <w:tab/>
-              <w:t>18</w:t>
+              <w:t>19</w:t>
             </w:r>
           </w:hyperlink>
         </w:p>
@@ -598,7 +598,7 @@
             </w:tabs>
             <w:rPr/>
           </w:pPr>
-          <w:hyperlink w:anchor="__RefHeading___Toc3818_31916387" w:tooltip="8.2 The weigh hopper: percent fill">
+          <w:hyperlink w:anchor="__RefHeading___Toc3818_4120085704" w:tooltip="8.2 The weigh hopper: percent fill">
             <w:r>
               <w:rPr>
                 <w:rStyle w:val="IndexLink"/>
@@ -606,7 +606,7 @@
               </w:rPr>
               <w:t>8.2 The weigh hopper: percent fill</w:t>
               <w:tab/>
-              <w:t>19</w:t>
+              <w:t>20</w:t>
             </w:r>
           </w:hyperlink>
         </w:p>
@@ -619,7 +619,7 @@
             </w:tabs>
             <w:rPr/>
           </w:pPr>
-          <w:hyperlink w:anchor="__RefHeading___Toc3820_31916387" w:tooltip="8.3 Hopper pressure: value display and alarm colors">
+          <w:hyperlink w:anchor="__RefHeading___Toc3820_4120085704" w:tooltip="8.3 Hopper pressure: value display and alarm colors">
             <w:r>
               <w:rPr>
                 <w:rStyle w:val="IndexLink"/>
@@ -640,7 +640,7 @@
             </w:tabs>
             <w:rPr/>
           </w:pPr>
-          <w:hyperlink w:anchor="__RefHeading___Toc3822_31916387" w:tooltip="8.4 Setpoints: user input">
+          <w:hyperlink w:anchor="__RefHeading___Toc3822_4120085704" w:tooltip="8.4 Setpoints: user input">
             <w:r>
               <w:rPr>
                 <w:rStyle w:val="IndexLink"/>
@@ -661,7 +661,7 @@
             </w:tabs>
             <w:rPr/>
           </w:pPr>
-          <w:hyperlink w:anchor="__RefHeading___Toc3824_31916387" w:tooltip="8.5 Commands: pushbutton and enable">
+          <w:hyperlink w:anchor="__RefHeading___Toc3824_4120085704" w:tooltip="8.5 Commands: pushbutton and enable">
             <w:r>
               <w:rPr>
                 <w:rStyle w:val="IndexLink"/>
@@ -682,7 +682,7 @@
             </w:tabs>
             <w:rPr/>
           </w:pPr>
-          <w:hyperlink w:anchor="__RefHeading___Toc3826_31916387" w:tooltip="9 Expressions and scripts">
+          <w:hyperlink w:anchor="__RefHeading___Toc3826_4120085704" w:tooltip="9 Expressions and scripts">
             <w:r>
               <w:rPr>
                 <w:rStyle w:val="IndexLink"/>
@@ -703,7 +703,7 @@
             </w:tabs>
             <w:rPr/>
           </w:pPr>
-          <w:hyperlink w:anchor="__RefHeading___Toc3828_31916387" w:tooltip="9.1 Window scripts">
+          <w:hyperlink w:anchor="__RefHeading___Toc3828_4120085704" w:tooltip="9.1 Window scripts">
             <w:r>
               <w:rPr>
                 <w:rStyle w:val="IndexLink"/>
@@ -724,7 +724,7 @@
             </w:tabs>
             <w:rPr/>
           </w:pPr>
-          <w:hyperlink w:anchor="__RefHeading___Toc3830_31916387" w:tooltip="9.2 Action scripts">
+          <w:hyperlink w:anchor="__RefHeading___Toc3830_4120085704" w:tooltip="9.2 Action scripts">
             <w:r>
               <w:rPr>
                 <w:rStyle w:val="IndexLink"/>
@@ -745,7 +745,7 @@
             </w:tabs>
             <w:rPr/>
           </w:pPr>
-          <w:hyperlink w:anchor="__RefHeading___Toc3832_31916387" w:tooltip="9.3 Function reference">
+          <w:hyperlink w:anchor="__RefHeading___Toc3832_4120085704" w:tooltip="9.3 Function reference">
             <w:r>
               <w:rPr>
                 <w:rStyle w:val="IndexLink"/>
@@ -766,7 +766,7 @@
             </w:tabs>
             <w:rPr/>
           </w:pPr>
-          <w:hyperlink w:anchor="__RefHeading___Toc3834_31916387" w:tooltip="9.4 Indirect tags: one faceplate for every device">
+          <w:hyperlink w:anchor="__RefHeading___Toc3834_4120085704" w:tooltip="9.4 Indirect tags: one faceplate for every device">
             <w:r>
               <w:rPr>
                 <w:rStyle w:val="IndexLink"/>
@@ -787,7 +787,7 @@
             </w:tabs>
             <w:rPr/>
           </w:pPr>
-          <w:hyperlink w:anchor="__RefHeading___Toc3836_31916387" w:tooltip="9.5 Opening windows from scripts: ShowWindow">
+          <w:hyperlink w:anchor="__RefHeading___Toc3836_4120085704" w:tooltip="9.5 Opening windows from scripts: ShowWindow">
             <w:r>
               <w:rPr>
                 <w:rStyle w:val="IndexLink"/>
@@ -808,7 +808,7 @@
             </w:tabs>
             <w:rPr/>
           </w:pPr>
-          <w:hyperlink w:anchor="__RefHeading___Toc3838_31916387" w:tooltip="10 Alarms and security">
+          <w:hyperlink w:anchor="__RefHeading___Toc3838_4120085704" w:tooltip="10 Alarms and security">
             <w:r>
               <w:rPr>
                 <w:rStyle w:val="IndexLink"/>
@@ -829,7 +829,7 @@
             </w:tabs>
             <w:rPr/>
           </w:pPr>
-          <w:hyperlink w:anchor="__RefHeading___Toc3840_31916387" w:tooltip="10.1 Alarms">
+          <w:hyperlink w:anchor="__RefHeading___Toc3840_4120085704" w:tooltip="10.1 Alarms">
             <w:r>
               <w:rPr>
                 <w:rStyle w:val="IndexLink"/>
@@ -850,7 +850,7 @@
             </w:tabs>
             <w:rPr/>
           </w:pPr>
-          <w:hyperlink w:anchor="__RefHeading___Toc3842_31916387" w:tooltip="10.2 Users and access levels">
+          <w:hyperlink w:anchor="__RefHeading___Toc3842_4120085704" w:tooltip="10.2 Users and access levels">
             <w:r>
               <w:rPr>
                 <w:rStyle w:val="IndexLink"/>
@@ -871,7 +871,7 @@
             </w:tabs>
             <w:rPr/>
           </w:pPr>
-          <w:hyperlink w:anchor="__RefHeading___Toc3844_31916387" w:tooltip="11 Recipes">
+          <w:hyperlink w:anchor="__RefHeading___Toc3844_4120085704" w:tooltip="11 Recipes">
             <w:r>
               <w:rPr>
                 <w:rStyle w:val="IndexLink"/>
@@ -892,7 +892,7 @@
             </w:tabs>
             <w:rPr/>
           </w:pPr>
-          <w:hyperlink w:anchor="__RefHeading___Toc3846_31916387" w:tooltip="11.1 Recipe books">
+          <w:hyperlink w:anchor="__RefHeading___Toc3846_4120085704" w:tooltip="11.1 Recipe books">
             <w:r>
               <w:rPr>
                 <w:rStyle w:val="IndexLink"/>
@@ -913,7 +913,7 @@
             </w:tabs>
             <w:rPr/>
           </w:pPr>
-          <w:hyperlink w:anchor="__RefHeading___Toc3848_31916387" w:tooltip="11.2 The Recipes screen">
+          <w:hyperlink w:anchor="__RefHeading___Toc3848_4120085704" w:tooltip="11.2 The Recipes screen">
             <w:r>
               <w:rPr>
                 <w:rStyle w:val="IndexLink"/>
@@ -934,7 +934,7 @@
             </w:tabs>
             <w:rPr/>
           </w:pPr>
-          <w:hyperlink w:anchor="__RefHeading___Toc3850_31916387" w:tooltip="11.3 The Recipe List object">
+          <w:hyperlink w:anchor="__RefHeading___Toc3850_4120085704" w:tooltip="11.3 The Recipe List object">
             <w:r>
               <w:rPr>
                 <w:rStyle w:val="IndexLink"/>
@@ -955,7 +955,7 @@
             </w:tabs>
             <w:rPr/>
           </w:pPr>
-          <w:hyperlink w:anchor="__RefHeading___Toc3852_31916387" w:tooltip="11.4 Selecting a recipe in a window">
+          <w:hyperlink w:anchor="__RefHeading___Toc3852_4120085704" w:tooltip="11.4 Selecting a recipe in a window">
             <w:r>
               <w:rPr>
                 <w:rStyle w:val="IndexLink"/>
@@ -976,7 +976,7 @@
             </w:tabs>
             <w:rPr/>
           </w:pPr>
-          <w:hyperlink w:anchor="__RefHeading___Toc3854_31916387" w:tooltip="11.5 When a recipe function fails">
+          <w:hyperlink w:anchor="__RefHeading___Toc3854_4120085704" w:tooltip="11.5 When a recipe function fails">
             <w:r>
               <w:rPr>
                 <w:rStyle w:val="IndexLink"/>
@@ -997,7 +997,7 @@
             </w:tabs>
             <w:rPr/>
           </w:pPr>
-          <w:hyperlink w:anchor="__RefHeading___Toc3856_31916387" w:tooltip="11.6 Where recipes are kept">
+          <w:hyperlink w:anchor="__RefHeading___Toc3856_4120085704" w:tooltip="11.6 Where recipes are kept">
             <w:r>
               <w:rPr>
                 <w:rStyle w:val="IndexLink"/>
@@ -1018,7 +1018,7 @@
             </w:tabs>
             <w:rPr/>
           </w:pPr>
-          <w:hyperlink w:anchor="__RefHeading___Toc3858_31916387" w:tooltip="12 Testing">
+          <w:hyperlink w:anchor="__RefHeading___Toc3858_4120085704" w:tooltip="12 Testing">
             <w:r>
               <w:rPr>
                 <w:rStyle w:val="IndexLink"/>
@@ -1039,7 +1039,7 @@
             </w:tabs>
             <w:rPr/>
           </w:pPr>
-          <w:hyperlink w:anchor="__RefHeading___Toc3860_31916387" w:tooltip="12.1 Validate">
+          <w:hyperlink w:anchor="__RefHeading___Toc3860_4120085704" w:tooltip="12.1 Validate">
             <w:r>
               <w:rPr>
                 <w:rStyle w:val="IndexLink"/>
@@ -1060,7 +1060,7 @@
             </w:tabs>
             <w:rPr/>
           </w:pPr>
-          <w:hyperlink w:anchor="__RefHeading___Toc3862_31916387" w:tooltip="12.2 Run">
+          <w:hyperlink w:anchor="__RefHeading___Toc3862_4120085704" w:tooltip="12.2 Run">
             <w:r>
               <w:rPr>
                 <w:rStyle w:val="IndexLink"/>
@@ -1081,7 +1081,7 @@
             </w:tabs>
             <w:rPr/>
           </w:pPr>
-          <w:hyperlink w:anchor="__RefHeading___Toc3864_31916387" w:tooltip="13 Deploying">
+          <w:hyperlink w:anchor="__RefHeading___Toc3864_4120085704" w:tooltip="13 Deploying">
             <w:r>
               <w:rPr>
                 <w:rStyle w:val="IndexLink"/>
@@ -1102,7 +1102,7 @@
             </w:tabs>
             <w:rPr/>
           </w:pPr>
-          <w:hyperlink w:anchor="__RefHeading___Toc3866_31916387" w:tooltip="13.1 Publish">
+          <w:hyperlink w:anchor="__RefHeading___Toc3866_4120085704" w:tooltip="13.1 Publish">
             <w:r>
               <w:rPr>
                 <w:rStyle w:val="IndexLink"/>
@@ -1123,7 +1123,7 @@
             </w:tabs>
             <w:rPr/>
           </w:pPr>
-          <w:hyperlink w:anchor="__RefHeading___Toc3868_31916387" w:tooltip="13.2 Append HMI Desktop">
+          <w:hyperlink w:anchor="__RefHeading___Toc3868_4120085704" w:tooltip="13.2 Append HMI Desktop">
             <w:r>
               <w:rPr>
                 <w:rStyle w:val="IndexLink"/>
@@ -1144,7 +1144,7 @@
             </w:tabs>
             <w:rPr/>
           </w:pPr>
-          <w:hyperlink w:anchor="__RefHeading___Toc3870_31916387" w:tooltip="13.3 Append HMI Web">
+          <w:hyperlink w:anchor="__RefHeading___Toc3870_4120085704" w:tooltip="13.3 Append HMI Web">
             <w:r>
               <w:rPr>
                 <w:rStyle w:val="IndexLink"/>
@@ -1165,7 +1165,7 @@
             </w:tabs>
             <w:rPr/>
           </w:pPr>
-          <w:hyperlink w:anchor="__RefHeading___Toc3872_31916387" w:tooltip="14 Tips and troubleshooting">
+          <w:hyperlink w:anchor="__RefHeading___Toc3872_4120085704" w:tooltip="14 Tips and troubleshooting">
             <w:r>
               <w:rPr>
                 <w:rStyle w:val="IndexLink"/>
@@ -1186,7 +1186,7 @@
             </w:tabs>
             <w:rPr/>
           </w:pPr>
-          <w:hyperlink w:anchor="__RefHeading___Toc3874_31916387" w:tooltip="Appendix A Command-line automation">
+          <w:hyperlink w:anchor="__RefHeading___Toc3874_4120085704" w:tooltip="Appendix A Command-line automation">
             <w:r>
               <w:rPr>
                 <w:rStyle w:val="IndexLink"/>
@@ -1224,7 +1224,7 @@
         <w:spacing w:before="0" w:after="0"/>
         <w:rPr/>
       </w:pPr>
-      <w:bookmarkStart w:id="0" w:name="__RefHeading___Toc3788_31916387"/>
+      <w:bookmarkStart w:id="0" w:name="__RefHeading___Toc3788_4120085704"/>
       <w:bookmarkEnd w:id="0"/>
       <w:r>
         <w:rPr/>
@@ -1925,7 +1925,7 @@
         <w:pStyle w:val="Heading2"/>
         <w:rPr/>
       </w:pPr>
-      <w:bookmarkStart w:id="1" w:name="__RefHeading___Toc3790_31916387"/>
+      <w:bookmarkStart w:id="1" w:name="__RefHeading___Toc3790_4120085704"/>
       <w:bookmarkEnd w:id="1"/>
       <w:r>
         <w:rPr/>
@@ -2068,7 +2068,7 @@
         <w:pStyle w:val="Heading1"/>
         <w:rPr/>
       </w:pPr>
-      <w:bookmarkStart w:id="2" w:name="__RefHeading___Toc3792_31916387"/>
+      <w:bookmarkStart w:id="2" w:name="__RefHeading___Toc3792_4120085704"/>
       <w:bookmarkEnd w:id="2"/>
       <w:r>
         <w:rPr/>
@@ -2646,7 +2646,7 @@
         <w:pStyle w:val="Heading2"/>
         <w:rPr/>
       </w:pPr>
-      <w:bookmarkStart w:id="3" w:name="__RefHeading___Toc3794_31916387"/>
+      <w:bookmarkStart w:id="3" w:name="__RefHeading___Toc3794_4120085704"/>
       <w:bookmarkEnd w:id="3"/>
       <w:r>
         <w:rPr/>
@@ -3686,7 +3686,7 @@
         <w:pStyle w:val="Heading1"/>
         <w:rPr/>
       </w:pPr>
-      <w:bookmarkStart w:id="4" w:name="__RefHeading___Toc3796_31916387"/>
+      <w:bookmarkStart w:id="4" w:name="__RefHeading___Toc3796_4120085704"/>
       <w:bookmarkEnd w:id="4"/>
       <w:r>
         <w:rPr/>
@@ -3971,7 +3971,7 @@
         <w:pStyle w:val="Heading1"/>
         <w:rPr/>
       </w:pPr>
-      <w:bookmarkStart w:id="5" w:name="__RefHeading___Toc3798_31916387"/>
+      <w:bookmarkStart w:id="5" w:name="__RefHeading___Toc3798_4120085704"/>
       <w:bookmarkEnd w:id="5"/>
       <w:r>
         <w:rPr/>
@@ -4766,7 +4766,7 @@
         <w:pStyle w:val="Heading1"/>
         <w:rPr/>
       </w:pPr>
-      <w:bookmarkStart w:id="6" w:name="__RefHeading___Toc3800_31916387"/>
+      <w:bookmarkStart w:id="6" w:name="__RefHeading___Toc3800_4120085704"/>
       <w:bookmarkEnd w:id="6"/>
       <w:r>
         <w:rPr/>
@@ -5597,7 +5597,7 @@
         <w:pStyle w:val="Heading2"/>
         <w:rPr/>
       </w:pPr>
-      <w:bookmarkStart w:id="7" w:name="__RefHeading___Toc3802_31916387"/>
+      <w:bookmarkStart w:id="7" w:name="__RefHeading___Toc3802_4120085704"/>
       <w:bookmarkEnd w:id="7"/>
       <w:r>
         <w:rPr/>
@@ -6250,7 +6250,7 @@
         <w:pStyle w:val="Heading2"/>
         <w:rPr/>
       </w:pPr>
-      <w:bookmarkStart w:id="8" w:name="__RefHeading___Toc3804_31916387"/>
+      <w:bookmarkStart w:id="8" w:name="__RefHeading___Toc3804_4120085704"/>
       <w:bookmarkEnd w:id="8"/>
       <w:r>
         <w:rPr/>
@@ -6385,7 +6385,7 @@
         <w:pStyle w:val="Heading1"/>
         <w:rPr/>
       </w:pPr>
-      <w:bookmarkStart w:id="9" w:name="__RefHeading___Toc3806_31916387"/>
+      <w:bookmarkStart w:id="9" w:name="__RefHeading___Toc3806_4120085704"/>
       <w:bookmarkEnd w:id="9"/>
       <w:r>
         <w:rPr/>
@@ -6898,7 +6898,7 @@
         <w:pStyle w:val="Heading2"/>
         <w:rPr/>
       </w:pPr>
-      <w:bookmarkStart w:id="10" w:name="__RefHeading___Toc3808_31916387"/>
+      <w:bookmarkStart w:id="10" w:name="__RefHeading___Toc3808_4120085704"/>
       <w:bookmarkEnd w:id="10"/>
       <w:r>
         <w:rPr/>
@@ -7060,7 +7060,7 @@
         <w:pStyle w:val="Heading2"/>
         <w:rPr/>
       </w:pPr>
-      <w:bookmarkStart w:id="11" w:name="__RefHeading___Toc3810_31916387"/>
+      <w:bookmarkStart w:id="11" w:name="__RefHeading___Toc3810_4120085704"/>
       <w:bookmarkEnd w:id="11"/>
       <w:r>
         <w:rPr/>
@@ -7116,7 +7116,7 @@
         <w:pStyle w:val="Heading1"/>
         <w:rPr/>
       </w:pPr>
-      <w:bookmarkStart w:id="12" w:name="__RefHeading___Toc3812_31916387"/>
+      <w:bookmarkStart w:id="12" w:name="__RefHeading___Toc3812_4120085704"/>
       <w:bookmarkEnd w:id="12"/>
       <w:r>
         <w:rPr/>
@@ -7246,7 +7246,7 @@
       </w:r>
       <w:r>
         <w:rPr/>
-        <w:t>, which fills its box. Like lines, arcs take a line width and an arrow or other end at either end. Select an arc and open the Style tab to set it:</w:t>
+        <w:t>, which fills its box. Like lines, arcs take an arrow or other end at either end, and their width can change from one end to the other. Select an arc and open the Style tab to set it:</w:t>
       </w:r>
     </w:p>
     <w:p>
@@ -7276,8 +7276,8 @@
         <w:tblLook w:val="04a0" w:noHBand="0" w:noVBand="1" w:firstColumn="1" w:lastRow="0" w:lastColumn="0" w:firstRow="1"/>
       </w:tblPr>
       <w:tblGrid>
-        <w:gridCol w:w="2264"/>
-        <w:gridCol w:w="7096"/>
+        <w:gridCol w:w="1212"/>
+        <w:gridCol w:w="8148"/>
       </w:tblGrid>
       <w:tr>
         <w:trPr>
@@ -7286,7 +7286,7 @@
         </w:trPr>
         <w:tc>
           <w:tcPr>
-            <w:tcW w:w="2264" w:type="dxa"/>
+            <w:tcW w:w="1212" w:type="dxa"/>
             <w:tcBorders/>
             <w:shd w:color="auto" w:fill="D9E2EC" w:val="clear"/>
           </w:tcPr>
@@ -7318,7 +7318,7 @@
         </w:tc>
         <w:tc>
           <w:tcPr>
-            <w:tcW w:w="7096" w:type="dxa"/>
+            <w:tcW w:w="8148" w:type="dxa"/>
             <w:tcBorders/>
             <w:shd w:color="auto" w:fill="D9E2EC" w:val="clear"/>
           </w:tcPr>
@@ -7355,7 +7355,7 @@
         </w:trPr>
         <w:tc>
           <w:tcPr>
-            <w:tcW w:w="2264" w:type="dxa"/>
+            <w:tcW w:w="1212" w:type="dxa"/>
             <w:tcBorders/>
           </w:tcPr>
           <w:p>
@@ -7386,31 +7386,31 @@
         </w:tc>
         <w:tc>
           <w:tcPr>
-            <w:tcW w:w="7096" w:type="dxa"/>
-            <w:tcBorders/>
-          </w:tcPr>
-          <w:p>
-            <w:pPr>
-              <w:pStyle w:val="Normal"/>
-              <w:widowControl/>
-              <w:spacing w:lineRule="auto" w:line="240" w:before="20" w:after="20"/>
-              <w:jc w:val="left"/>
-              <w:rPr>
-                <w:rFonts w:cs=""/>
-                <w:kern w:val="0"/>
-                <w:szCs w:val="22"/>
-                <w:lang w:val="en-US" w:eastAsia="en-US" w:bidi="ar-SA"/>
-              </w:rPr>
-            </w:pPr>
-            <w:r>
-              <w:rPr>
-                <w:rFonts w:cs=""/>
-                <w:kern w:val="0"/>
-                <w:sz w:val="20"/>
-                <w:szCs w:val="22"/>
-                <w:lang w:val="en-US" w:eastAsia="en-US" w:bidi="ar-SA"/>
-              </w:rPr>
-              <w:t>Where the arc begins and ends, in degrees: 0 is twelve o'clock, and the arc runs clockwise from the start angle to the end angle. 270 to 90 is the top half</w:t>
+            <w:tcW w:w="8148" w:type="dxa"/>
+            <w:tcBorders/>
+          </w:tcPr>
+          <w:p>
+            <w:pPr>
+              <w:pStyle w:val="Normal"/>
+              <w:widowControl/>
+              <w:spacing w:lineRule="auto" w:line="240" w:before="20" w:after="20"/>
+              <w:jc w:val="left"/>
+              <w:rPr>
+                <w:rFonts w:cs=""/>
+                <w:kern w:val="0"/>
+                <w:szCs w:val="22"/>
+                <w:lang w:val="en-US" w:eastAsia="en-US" w:bidi="ar-SA"/>
+              </w:rPr>
+            </w:pPr>
+            <w:r>
+              <w:rPr>
+                <w:rFonts w:cs=""/>
+                <w:kern w:val="0"/>
+                <w:sz w:val="20"/>
+                <w:szCs w:val="22"/>
+                <w:lang w:val="en-US" w:eastAsia="en-US" w:bidi="ar-SA"/>
+              </w:rPr>
+              <w:t>Where the arc begins and ends, in degrees measured as on a protractor: 0 at the right, increasing counterclockwise, so 90 is the top. The arc runs counterclockwise from the start angle to the end angle: 0 to 180 is the top half, and a start greater than the end, such as 315 to 225, sweeps through 0</w:t>
             </w:r>
           </w:p>
         </w:tc>
@@ -7421,7 +7421,7 @@
         </w:trPr>
         <w:tc>
           <w:tcPr>
-            <w:tcW w:w="2264" w:type="dxa"/>
+            <w:tcW w:w="1212" w:type="dxa"/>
             <w:tcBorders/>
           </w:tcPr>
           <w:p>
@@ -7446,37 +7446,37 @@
                 <w:szCs w:val="22"/>
                 <w:lang w:val="en-US" w:eastAsia="en-US" w:bidi="ar-SA"/>
               </w:rPr>
-              <w:t>Line width</w:t>
-            </w:r>
-          </w:p>
-        </w:tc>
-        <w:tc>
-          <w:tcPr>
-            <w:tcW w:w="7096" w:type="dxa"/>
-            <w:tcBorders/>
-          </w:tcPr>
-          <w:p>
-            <w:pPr>
-              <w:pStyle w:val="Normal"/>
-              <w:widowControl/>
-              <w:spacing w:lineRule="auto" w:line="240" w:before="20" w:after="20"/>
-              <w:jc w:val="left"/>
-              <w:rPr>
-                <w:rFonts w:cs=""/>
-                <w:kern w:val="0"/>
-                <w:szCs w:val="22"/>
-                <w:lang w:val="en-US" w:eastAsia="en-US" w:bidi="ar-SA"/>
-              </w:rPr>
-            </w:pPr>
-            <w:r>
-              <w:rPr>
-                <w:rFonts w:cs=""/>
-                <w:kern w:val="0"/>
-                <w:sz w:val="20"/>
-                <w:szCs w:val="22"/>
-                <w:lang w:val="en-US" w:eastAsia="en-US" w:bidi="ar-SA"/>
-              </w:rPr>
-              <w:t>The thickness of the line, as for any shape</w:t>
+              <w:t>Start line width, End line width</w:t>
+            </w:r>
+          </w:p>
+        </w:tc>
+        <w:tc>
+          <w:tcPr>
+            <w:tcW w:w="8148" w:type="dxa"/>
+            <w:tcBorders/>
+          </w:tcPr>
+          <w:p>
+            <w:pPr>
+              <w:pStyle w:val="Normal"/>
+              <w:widowControl/>
+              <w:spacing w:lineRule="auto" w:line="240" w:before="20" w:after="20"/>
+              <w:jc w:val="left"/>
+              <w:rPr>
+                <w:rFonts w:cs=""/>
+                <w:kern w:val="0"/>
+                <w:szCs w:val="22"/>
+                <w:lang w:val="en-US" w:eastAsia="en-US" w:bidi="ar-SA"/>
+              </w:rPr>
+            </w:pPr>
+            <w:r>
+              <w:rPr>
+                <w:rFonts w:cs=""/>
+                <w:kern w:val="0"/>
+                <w:sz w:val="20"/>
+                <w:szCs w:val="22"/>
+                <w:lang w:val="en-US" w:eastAsia="en-US" w:bidi="ar-SA"/>
+              </w:rPr>
+              <w:t>The thickness of the line at each end; it changes evenly between them. The start width is the Line width of the Line section. A line whose widths differ is drawn solid, not dashed</w:t>
             </w:r>
           </w:p>
         </w:tc>
@@ -7487,7 +7487,7 @@
         </w:trPr>
         <w:tc>
           <w:tcPr>
-            <w:tcW w:w="2264" w:type="dxa"/>
+            <w:tcW w:w="1212" w:type="dxa"/>
             <w:tcBorders/>
           </w:tcPr>
           <w:p>
@@ -7518,7 +7518,7 @@
         </w:tc>
         <w:tc>
           <w:tcPr>
-            <w:tcW w:w="7096" w:type="dxa"/>
+            <w:tcW w:w="8148" w:type="dxa"/>
             <w:tcBorders/>
           </w:tcPr>
           <w:p>
@@ -7553,7 +7553,7 @@
         </w:trPr>
         <w:tc>
           <w:tcPr>
-            <w:tcW w:w="2264" w:type="dxa"/>
+            <w:tcW w:w="1212" w:type="dxa"/>
             <w:tcBorders/>
           </w:tcPr>
           <w:p>
@@ -7584,7 +7584,7 @@
         </w:tc>
         <w:tc>
           <w:tcPr>
-            <w:tcW w:w="7096" w:type="dxa"/>
+            <w:tcW w:w="8148" w:type="dxa"/>
             <w:tcBorders/>
           </w:tcPr>
           <w:p>
@@ -7619,7 +7619,7 @@
         </w:trPr>
         <w:tc>
           <w:tcPr>
-            <w:tcW w:w="2264" w:type="dxa"/>
+            <w:tcW w:w="1212" w:type="dxa"/>
             <w:tcBorders/>
           </w:tcPr>
           <w:p>
@@ -7650,7 +7650,7 @@
         </w:tc>
         <w:tc>
           <w:tcPr>
-            <w:tcW w:w="7096" w:type="dxa"/>
+            <w:tcW w:w="8148" w:type="dxa"/>
             <w:tcBorders/>
           </w:tcPr>
           <w:p>
@@ -7826,16 +7826,13 @@
         <w:rPr/>
         <w:t>Keep objects inside the Screen frame, and group repeated symbols (a valve with its tag label) so they can be copied with their links.</w:t>
       </w:r>
-      <w:r>
-        <w:br w:type="page"/>
-      </w:r>
     </w:p>
     <w:p>
       <w:pPr>
         <w:pStyle w:val="Heading1"/>
         <w:rPr/>
       </w:pPr>
-      <w:bookmarkStart w:id="13" w:name="__RefHeading___Toc3814_31916387"/>
+      <w:bookmarkStart w:id="13" w:name="__RefHeading___Toc3814_4120085704"/>
       <w:bookmarkEnd w:id="13"/>
       <w:r>
         <w:rPr/>
@@ -8560,7 +8557,7 @@
         <w:pStyle w:val="Heading2"/>
         <w:rPr/>
       </w:pPr>
-      <w:bookmarkStart w:id="14" w:name="__RefHeading___Toc3816_31916387"/>
+      <w:bookmarkStart w:id="14" w:name="__RefHeading___Toc3816_4120085704"/>
       <w:bookmarkEnd w:id="14"/>
       <w:r>
         <w:rPr/>
@@ -8746,7 +8743,7 @@
         <w:pStyle w:val="Heading2"/>
         <w:rPr/>
       </w:pPr>
-      <w:bookmarkStart w:id="15" w:name="__RefHeading___Toc3818_31916387"/>
+      <w:bookmarkStart w:id="15" w:name="__RefHeading___Toc3818_4120085704"/>
       <w:bookmarkEnd w:id="15"/>
       <w:r>
         <w:rPr/>
@@ -8870,7 +8867,7 @@
         <w:pStyle w:val="Heading2"/>
         <w:rPr/>
       </w:pPr>
-      <w:bookmarkStart w:id="16" w:name="__RefHeading___Toc3820_31916387"/>
+      <w:bookmarkStart w:id="16" w:name="__RefHeading___Toc3820_4120085704"/>
       <w:bookmarkEnd w:id="16"/>
       <w:r>
         <w:rPr/>
@@ -8986,7 +8983,7 @@
         <w:pStyle w:val="Heading2"/>
         <w:rPr/>
       </w:pPr>
-      <w:bookmarkStart w:id="17" w:name="__RefHeading___Toc3822_31916387"/>
+      <w:bookmarkStart w:id="17" w:name="__RefHeading___Toc3822_4120085704"/>
       <w:bookmarkEnd w:id="17"/>
       <w:r>
         <w:rPr/>
@@ -9102,7 +9099,7 @@
         <w:pStyle w:val="Heading2"/>
         <w:rPr/>
       </w:pPr>
-      <w:bookmarkStart w:id="18" w:name="__RefHeading___Toc3824_31916387"/>
+      <w:bookmarkStart w:id="18" w:name="__RefHeading___Toc3824_4120085704"/>
       <w:bookmarkEnd w:id="18"/>
       <w:r>
         <w:rPr/>
@@ -9614,7 +9611,7 @@
         <w:pStyle w:val="Heading1"/>
         <w:rPr/>
       </w:pPr>
-      <w:bookmarkStart w:id="19" w:name="__RefHeading___Toc3826_31916387"/>
+      <w:bookmarkStart w:id="19" w:name="__RefHeading___Toc3826_4120085704"/>
       <w:bookmarkEnd w:id="19"/>
       <w:r>
         <w:rPr/>
@@ -10516,7 +10513,7 @@
         <w:pStyle w:val="Heading2"/>
         <w:rPr/>
       </w:pPr>
-      <w:bookmarkStart w:id="20" w:name="__RefHeading___Toc3828_31916387"/>
+      <w:bookmarkStart w:id="20" w:name="__RefHeading___Toc3828_4120085704"/>
       <w:bookmarkEnd w:id="20"/>
       <w:r>
         <w:rPr/>
@@ -10700,7 +10697,7 @@
         <w:pStyle w:val="Heading2"/>
         <w:rPr/>
       </w:pPr>
-      <w:bookmarkStart w:id="21" w:name="__RefHeading___Toc3830_31916387"/>
+      <w:bookmarkStart w:id="21" w:name="__RefHeading___Toc3830_4120085704"/>
       <w:bookmarkEnd w:id="21"/>
       <w:r>
         <w:rPr/>
@@ -10819,7 +10816,7 @@
         <w:pStyle w:val="Heading2"/>
         <w:rPr/>
       </w:pPr>
-      <w:bookmarkStart w:id="22" w:name="__RefHeading___Toc3832_31916387"/>
+      <w:bookmarkStart w:id="22" w:name="__RefHeading___Toc3832_4120085704"/>
       <w:bookmarkEnd w:id="22"/>
       <w:r>
         <w:rPr/>
@@ -14366,7 +14363,7 @@
         <w:pStyle w:val="Heading2"/>
         <w:rPr/>
       </w:pPr>
-      <w:bookmarkStart w:id="23" w:name="__RefHeading___Toc3834_31916387"/>
+      <w:bookmarkStart w:id="23" w:name="__RefHeading___Toc3834_4120085704"/>
       <w:bookmarkEnd w:id="23"/>
       <w:r>
         <w:rPr/>
@@ -15202,7 +15199,7 @@
         <w:pStyle w:val="Heading2"/>
         <w:rPr/>
       </w:pPr>
-      <w:bookmarkStart w:id="24" w:name="__RefHeading___Toc3836_31916387"/>
+      <w:bookmarkStart w:id="24" w:name="__RefHeading___Toc3836_4120085704"/>
       <w:bookmarkEnd w:id="24"/>
       <w:r>
         <w:rPr/>
@@ -15679,7 +15676,7 @@
         <w:pStyle w:val="Heading1"/>
         <w:rPr/>
       </w:pPr>
-      <w:bookmarkStart w:id="25" w:name="__RefHeading___Toc3838_31916387"/>
+      <w:bookmarkStart w:id="25" w:name="__RefHeading___Toc3838_4120085704"/>
       <w:bookmarkEnd w:id="25"/>
       <w:r>
         <w:rPr/>
@@ -15691,7 +15688,7 @@
         <w:pStyle w:val="Heading2"/>
         <w:rPr/>
       </w:pPr>
-      <w:bookmarkStart w:id="26" w:name="__RefHeading___Toc3840_31916387"/>
+      <w:bookmarkStart w:id="26" w:name="__RefHeading___Toc3840_4120085704"/>
       <w:bookmarkEnd w:id="26"/>
       <w:r>
         <w:rPr/>
@@ -15824,7 +15821,7 @@
         <w:pStyle w:val="Heading2"/>
         <w:rPr/>
       </w:pPr>
-      <w:bookmarkStart w:id="27" w:name="__RefHeading___Toc3842_31916387"/>
+      <w:bookmarkStart w:id="27" w:name="__RefHeading___Toc3842_4120085704"/>
       <w:bookmarkEnd w:id="27"/>
       <w:r>
         <w:rPr/>
@@ -16514,7 +16511,7 @@
         <w:pStyle w:val="Heading1"/>
         <w:rPr/>
       </w:pPr>
-      <w:bookmarkStart w:id="28" w:name="__RefHeading___Toc3844_31916387"/>
+      <w:bookmarkStart w:id="28" w:name="__RefHeading___Toc3844_4120085704"/>
       <w:bookmarkEnd w:id="28"/>
       <w:r>
         <w:rPr/>
@@ -16650,7 +16647,7 @@
         <w:pStyle w:val="Heading2"/>
         <w:rPr/>
       </w:pPr>
-      <w:bookmarkStart w:id="29" w:name="__RefHeading___Toc3846_31916387"/>
+      <w:bookmarkStart w:id="29" w:name="__RefHeading___Toc3846_4120085704"/>
       <w:bookmarkEnd w:id="29"/>
       <w:r>
         <w:rPr/>
@@ -18511,7 +18508,7 @@
         <w:pStyle w:val="Heading2"/>
         <w:rPr/>
       </w:pPr>
-      <w:bookmarkStart w:id="30" w:name="__RefHeading___Toc3848_31916387"/>
+      <w:bookmarkStart w:id="30" w:name="__RefHeading___Toc3848_4120085704"/>
       <w:bookmarkEnd w:id="30"/>
       <w:r>
         <w:rPr/>
@@ -19961,7 +19958,7 @@
         <w:pStyle w:val="Heading2"/>
         <w:rPr/>
       </w:pPr>
-      <w:bookmarkStart w:id="31" w:name="__RefHeading___Toc3850_31916387"/>
+      <w:bookmarkStart w:id="31" w:name="__RefHeading___Toc3850_4120085704"/>
       <w:bookmarkEnd w:id="31"/>
       <w:r>
         <w:rPr/>
@@ -20502,7 +20499,7 @@
         <w:pStyle w:val="Heading2"/>
         <w:rPr/>
       </w:pPr>
-      <w:bookmarkStart w:id="32" w:name="__RefHeading___Toc3852_31916387"/>
+      <w:bookmarkStart w:id="32" w:name="__RefHeading___Toc3852_4120085704"/>
       <w:bookmarkEnd w:id="32"/>
       <w:r>
         <w:rPr/>
@@ -20787,7 +20784,7 @@
         <w:pStyle w:val="Heading2"/>
         <w:rPr/>
       </w:pPr>
-      <w:bookmarkStart w:id="33" w:name="__RefHeading___Toc3854_31916387"/>
+      <w:bookmarkStart w:id="33" w:name="__RefHeading___Toc3854_4120085704"/>
       <w:bookmarkEnd w:id="33"/>
       <w:r>
         <w:rPr/>
@@ -20945,7 +20942,7 @@
         <w:pStyle w:val="Heading2"/>
         <w:rPr/>
       </w:pPr>
-      <w:bookmarkStart w:id="34" w:name="__RefHeading___Toc3856_31916387"/>
+      <w:bookmarkStart w:id="34" w:name="__RefHeading___Toc3856_4120085704"/>
       <w:bookmarkEnd w:id="34"/>
       <w:r>
         <w:rPr/>
@@ -21345,7 +21342,7 @@
         <w:pStyle w:val="Heading1"/>
         <w:rPr/>
       </w:pPr>
-      <w:bookmarkStart w:id="35" w:name="__RefHeading___Toc3858_31916387"/>
+      <w:bookmarkStart w:id="35" w:name="__RefHeading___Toc3858_4120085704"/>
       <w:bookmarkEnd w:id="35"/>
       <w:r>
         <w:rPr/>
@@ -21357,7 +21354,7 @@
         <w:pStyle w:val="Heading2"/>
         <w:rPr/>
       </w:pPr>
-      <w:bookmarkStart w:id="36" w:name="__RefHeading___Toc3860_31916387"/>
+      <w:bookmarkStart w:id="36" w:name="__RefHeading___Toc3860_4120085704"/>
       <w:bookmarkEnd w:id="36"/>
       <w:r>
         <w:rPr/>
@@ -21445,7 +21442,7 @@
         <w:pStyle w:val="Heading2"/>
         <w:rPr/>
       </w:pPr>
-      <w:bookmarkStart w:id="37" w:name="__RefHeading___Toc3862_31916387"/>
+      <w:bookmarkStart w:id="37" w:name="__RefHeading___Toc3862_4120085704"/>
       <w:bookmarkEnd w:id="37"/>
       <w:r>
         <w:rPr/>
@@ -21991,7 +21988,7 @@
         <w:pStyle w:val="Heading1"/>
         <w:rPr/>
       </w:pPr>
-      <w:bookmarkStart w:id="38" w:name="__RefHeading___Toc3864_31916387"/>
+      <w:bookmarkStart w:id="38" w:name="__RefHeading___Toc3864_4120085704"/>
       <w:bookmarkEnd w:id="38"/>
       <w:r>
         <w:rPr/>
@@ -22444,7 +22441,7 @@
         <w:pStyle w:val="Heading2"/>
         <w:rPr/>
       </w:pPr>
-      <w:bookmarkStart w:id="39" w:name="__RefHeading___Toc3866_31916387"/>
+      <w:bookmarkStart w:id="39" w:name="__RefHeading___Toc3866_4120085704"/>
       <w:bookmarkEnd w:id="39"/>
       <w:r>
         <w:rPr/>
@@ -22532,7 +22529,7 @@
         <w:pStyle w:val="Heading2"/>
         <w:rPr/>
       </w:pPr>
-      <w:bookmarkStart w:id="40" w:name="__RefHeading___Toc3868_31916387"/>
+      <w:bookmarkStart w:id="40" w:name="__RefHeading___Toc3868_4120085704"/>
       <w:bookmarkEnd w:id="40"/>
       <w:r>
         <w:rPr/>
@@ -22645,7 +22642,7 @@
         <w:pStyle w:val="Heading2"/>
         <w:rPr/>
       </w:pPr>
-      <w:bookmarkStart w:id="41" w:name="__RefHeading___Toc3870_31916387"/>
+      <w:bookmarkStart w:id="41" w:name="__RefHeading___Toc3870_4120085704"/>
       <w:bookmarkEnd w:id="41"/>
       <w:r>
         <w:rPr/>
@@ -22858,7 +22855,7 @@
         <w:pStyle w:val="Heading1"/>
         <w:rPr/>
       </w:pPr>
-      <w:bookmarkStart w:id="42" w:name="__RefHeading___Toc3872_31916387"/>
+      <w:bookmarkStart w:id="42" w:name="__RefHeading___Toc3872_4120085704"/>
       <w:bookmarkEnd w:id="42"/>
       <w:r>
         <w:rPr/>
@@ -23518,7 +23515,7 @@
         <w:pStyle w:val="Heading1"/>
         <w:rPr/>
       </w:pPr>
-      <w:bookmarkStart w:id="43" w:name="__RefHeading___Toc3874_31916387"/>
+      <w:bookmarkStart w:id="43" w:name="__RefHeading___Toc3874_4120085704"/>
       <w:bookmarkEnd w:id="43"/>
       <w:r>
         <w:rPr/>

</xml_diff>

<commit_message>
feat: flipping a group mirrors it as a whole
Co-Authored-By: Claude Opus 5.5 <noreply@anthropic.com>
</commit_message>
<xml_diff>
--- a/doc/Append-HMI-Studio-User-Manual.docx
+++ b/doc/Append-HMI-Studio-User-Manual.docx
@@ -283,7 +283,7 @@
             </w:rPr>
             <w:fldChar w:fldCharType="separate"/>
           </w:r>
-          <w:hyperlink w:anchor="__RefHeading___Toc3788_4120085704" w:tooltip="1 Introduction">
+          <w:hyperlink w:anchor="__RefHeading___Toc3795_1547890394" w:tooltip="1 Introduction">
             <w:r>
               <w:rPr>
                 <w:rStyle w:val="IndexLink"/>
@@ -304,7 +304,7 @@
             </w:tabs>
             <w:rPr/>
           </w:pPr>
-          <w:hyperlink w:anchor="__RefHeading___Toc3790_4120085704" w:tooltip="1.1 How an HMI application is organized">
+          <w:hyperlink w:anchor="__RefHeading___Toc3797_1547890394" w:tooltip="1.1 How an HMI application is organized">
             <w:r>
               <w:rPr>
                 <w:rStyle w:val="IndexLink"/>
@@ -325,7 +325,7 @@
             </w:tabs>
             <w:rPr/>
           </w:pPr>
-          <w:hyperlink w:anchor="__RefHeading___Toc3792_4120085704" w:tooltip="2 The Studio window">
+          <w:hyperlink w:anchor="__RefHeading___Toc3799_1547890394" w:tooltip="2 The Studio window">
             <w:r>
               <w:rPr>
                 <w:rStyle w:val="IndexLink"/>
@@ -346,7 +346,7 @@
             </w:tabs>
             <w:rPr/>
           </w:pPr>
-          <w:hyperlink w:anchor="__RefHeading___Toc3794_4120085704" w:tooltip="2.1 The HMI menu">
+          <w:hyperlink w:anchor="__RefHeading___Toc3801_1547890394" w:tooltip="2.1 The HMI menu">
             <w:r>
               <w:rPr>
                 <w:rStyle w:val="IndexLink"/>
@@ -367,7 +367,7 @@
             </w:tabs>
             <w:rPr/>
           </w:pPr>
-          <w:hyperlink w:anchor="__RefHeading___Toc3796_4120085704" w:tooltip="3 Application settings">
+          <w:hyperlink w:anchor="__RefHeading___Toc3803_1547890394" w:tooltip="3 Application settings">
             <w:r>
               <w:rPr>
                 <w:rStyle w:val="IndexLink"/>
@@ -388,7 +388,7 @@
             </w:tabs>
             <w:rPr/>
           </w:pPr>
-          <w:hyperlink w:anchor="__RefHeading___Toc3798_4120085704" w:tooltip="4 Devices">
+          <w:hyperlink w:anchor="__RefHeading___Toc3805_1547890394" w:tooltip="4 Devices">
             <w:r>
               <w:rPr>
                 <w:rStyle w:val="IndexLink"/>
@@ -409,7 +409,7 @@
             </w:tabs>
             <w:rPr/>
           </w:pPr>
-          <w:hyperlink w:anchor="__RefHeading___Toc3800_4120085704" w:tooltip="5 Tags">
+          <w:hyperlink w:anchor="__RefHeading___Toc3807_1547890394" w:tooltip="5 Tags">
             <w:r>
               <w:rPr>
                 <w:rStyle w:val="IndexLink"/>
@@ -430,7 +430,7 @@
             </w:tabs>
             <w:rPr/>
           </w:pPr>
-          <w:hyperlink w:anchor="__RefHeading___Toc3802_4120085704" w:tooltip="5.1 Tag fields">
+          <w:hyperlink w:anchor="__RefHeading___Toc3809_1547890394" w:tooltip="5.1 Tag fields">
             <w:r>
               <w:rPr>
                 <w:rStyle w:val="IndexLink"/>
@@ -451,7 +451,7 @@
             </w:tabs>
             <w:rPr/>
           </w:pPr>
-          <w:hyperlink w:anchor="__RefHeading___Toc3804_4120085704" w:tooltip="5.2 Alarms on a tag">
+          <w:hyperlink w:anchor="__RefHeading___Toc3811_1547890394" w:tooltip="5.2 Alarms on a tag">
             <w:r>
               <w:rPr>
                 <w:rStyle w:val="IndexLink"/>
@@ -472,7 +472,7 @@
             </w:tabs>
             <w:rPr/>
           </w:pPr>
-          <w:hyperlink w:anchor="__RefHeading___Toc3806_4120085704" w:tooltip="6 Screens and windows">
+          <w:hyperlink w:anchor="__RefHeading___Toc3813_1547890394" w:tooltip="6 Screens and windows">
             <w:r>
               <w:rPr>
                 <w:rStyle w:val="IndexLink"/>
@@ -493,7 +493,7 @@
             </w:tabs>
             <w:rPr/>
           </w:pPr>
-          <w:hyperlink w:anchor="__RefHeading___Toc3808_4120085704" w:tooltip="6.1 Window properties">
+          <w:hyperlink w:anchor="__RefHeading___Toc3815_1547890394" w:tooltip="6.1 Window properties">
             <w:r>
               <w:rPr>
                 <w:rStyle w:val="IndexLink"/>
@@ -514,7 +514,7 @@
             </w:tabs>
             <w:rPr/>
           </w:pPr>
-          <w:hyperlink w:anchor="__RefHeading___Toc3810_4120085704" w:tooltip="6.2 Navigation">
+          <w:hyperlink w:anchor="__RefHeading___Toc3817_1547890394" w:tooltip="6.2 Navigation">
             <w:r>
               <w:rPr>
                 <w:rStyle w:val="IndexLink"/>
@@ -535,7 +535,7 @@
             </w:tabs>
             <w:rPr/>
           </w:pPr>
-          <w:hyperlink w:anchor="__RefHeading___Toc3812_4120085704" w:tooltip="7 Drawing objects">
+          <w:hyperlink w:anchor="__RefHeading___Toc3819_1547890394" w:tooltip="7 Drawing objects">
             <w:r>
               <w:rPr>
                 <w:rStyle w:val="IndexLink"/>
@@ -556,7 +556,7 @@
             </w:tabs>
             <w:rPr/>
           </w:pPr>
-          <w:hyperlink w:anchor="__RefHeading___Toc3814_4120085704" w:tooltip="8 Animation links">
+          <w:hyperlink w:anchor="__RefHeading___Toc3821_1547890394" w:tooltip="8 Animation links">
             <w:r>
               <w:rPr>
                 <w:rStyle w:val="IndexLink"/>
@@ -577,7 +577,7 @@
             </w:tabs>
             <w:rPr/>
           </w:pPr>
-          <w:hyperlink w:anchor="__RefHeading___Toc3816_4120085704" w:tooltip="8.1 A valve: status color, fault blink and faceplate">
+          <w:hyperlink w:anchor="__RefHeading___Toc3823_1547890394" w:tooltip="8.1 A valve: status color, fault blink and faceplate">
             <w:r>
               <w:rPr>
                 <w:rStyle w:val="IndexLink"/>
@@ -598,7 +598,7 @@
             </w:tabs>
             <w:rPr/>
           </w:pPr>
-          <w:hyperlink w:anchor="__RefHeading___Toc3818_4120085704" w:tooltip="8.2 The weigh hopper: percent fill">
+          <w:hyperlink w:anchor="__RefHeading___Toc3825_1547890394" w:tooltip="8.2 The weigh hopper: percent fill">
             <w:r>
               <w:rPr>
                 <w:rStyle w:val="IndexLink"/>
@@ -619,7 +619,7 @@
             </w:tabs>
             <w:rPr/>
           </w:pPr>
-          <w:hyperlink w:anchor="__RefHeading___Toc3820_4120085704" w:tooltip="8.3 Hopper pressure: value display and alarm colors">
+          <w:hyperlink w:anchor="__RefHeading___Toc3827_1547890394" w:tooltip="8.3 Hopper pressure: value display and alarm colors">
             <w:r>
               <w:rPr>
                 <w:rStyle w:val="IndexLink"/>
@@ -640,7 +640,7 @@
             </w:tabs>
             <w:rPr/>
           </w:pPr>
-          <w:hyperlink w:anchor="__RefHeading___Toc3822_4120085704" w:tooltip="8.4 Setpoints: user input">
+          <w:hyperlink w:anchor="__RefHeading___Toc3829_1547890394" w:tooltip="8.4 Setpoints: user input">
             <w:r>
               <w:rPr>
                 <w:rStyle w:val="IndexLink"/>
@@ -661,7 +661,7 @@
             </w:tabs>
             <w:rPr/>
           </w:pPr>
-          <w:hyperlink w:anchor="__RefHeading___Toc3824_4120085704" w:tooltip="8.5 Commands: pushbutton and enable">
+          <w:hyperlink w:anchor="__RefHeading___Toc3831_1547890394" w:tooltip="8.5 Commands: pushbutton and enable">
             <w:r>
               <w:rPr>
                 <w:rStyle w:val="IndexLink"/>
@@ -682,7 +682,7 @@
             </w:tabs>
             <w:rPr/>
           </w:pPr>
-          <w:hyperlink w:anchor="__RefHeading___Toc3826_4120085704" w:tooltip="9 Expressions and scripts">
+          <w:hyperlink w:anchor="__RefHeading___Toc3833_1547890394" w:tooltip="9 Expressions and scripts">
             <w:r>
               <w:rPr>
                 <w:rStyle w:val="IndexLink"/>
@@ -703,7 +703,7 @@
             </w:tabs>
             <w:rPr/>
           </w:pPr>
-          <w:hyperlink w:anchor="__RefHeading___Toc3828_4120085704" w:tooltip="9.1 Window scripts">
+          <w:hyperlink w:anchor="__RefHeading___Toc3835_1547890394" w:tooltip="9.1 Window scripts">
             <w:r>
               <w:rPr>
                 <w:rStyle w:val="IndexLink"/>
@@ -724,7 +724,7 @@
             </w:tabs>
             <w:rPr/>
           </w:pPr>
-          <w:hyperlink w:anchor="__RefHeading___Toc3830_4120085704" w:tooltip="9.2 Action scripts">
+          <w:hyperlink w:anchor="__RefHeading___Toc3837_1547890394" w:tooltip="9.2 Action scripts">
             <w:r>
               <w:rPr>
                 <w:rStyle w:val="IndexLink"/>
@@ -745,7 +745,7 @@
             </w:tabs>
             <w:rPr/>
           </w:pPr>
-          <w:hyperlink w:anchor="__RefHeading___Toc3832_4120085704" w:tooltip="9.3 Function reference">
+          <w:hyperlink w:anchor="__RefHeading___Toc3839_1547890394" w:tooltip="9.3 Function reference">
             <w:r>
               <w:rPr>
                 <w:rStyle w:val="IndexLink"/>
@@ -766,7 +766,7 @@
             </w:tabs>
             <w:rPr/>
           </w:pPr>
-          <w:hyperlink w:anchor="__RefHeading___Toc3834_4120085704" w:tooltip="9.4 Indirect tags: one faceplate for every device">
+          <w:hyperlink w:anchor="__RefHeading___Toc3841_1547890394" w:tooltip="9.4 Indirect tags: one faceplate for every device">
             <w:r>
               <w:rPr>
                 <w:rStyle w:val="IndexLink"/>
@@ -787,7 +787,7 @@
             </w:tabs>
             <w:rPr/>
           </w:pPr>
-          <w:hyperlink w:anchor="__RefHeading___Toc3836_4120085704" w:tooltip="9.5 Opening windows from scripts: ShowWindow">
+          <w:hyperlink w:anchor="__RefHeading___Toc3843_1547890394" w:tooltip="9.5 Opening windows from scripts: ShowWindow">
             <w:r>
               <w:rPr>
                 <w:rStyle w:val="IndexLink"/>
@@ -808,7 +808,7 @@
             </w:tabs>
             <w:rPr/>
           </w:pPr>
-          <w:hyperlink w:anchor="__RefHeading___Toc3838_4120085704" w:tooltip="10 Alarms and security">
+          <w:hyperlink w:anchor="__RefHeading___Toc3845_1547890394" w:tooltip="10 Alarms and security">
             <w:r>
               <w:rPr>
                 <w:rStyle w:val="IndexLink"/>
@@ -829,7 +829,7 @@
             </w:tabs>
             <w:rPr/>
           </w:pPr>
-          <w:hyperlink w:anchor="__RefHeading___Toc3840_4120085704" w:tooltip="10.1 Alarms">
+          <w:hyperlink w:anchor="__RefHeading___Toc3847_1547890394" w:tooltip="10.1 Alarms">
             <w:r>
               <w:rPr>
                 <w:rStyle w:val="IndexLink"/>
@@ -850,7 +850,7 @@
             </w:tabs>
             <w:rPr/>
           </w:pPr>
-          <w:hyperlink w:anchor="__RefHeading___Toc3842_4120085704" w:tooltip="10.2 Users and access levels">
+          <w:hyperlink w:anchor="__RefHeading___Toc3849_1547890394" w:tooltip="10.2 Users and access levels">
             <w:r>
               <w:rPr>
                 <w:rStyle w:val="IndexLink"/>
@@ -871,7 +871,7 @@
             </w:tabs>
             <w:rPr/>
           </w:pPr>
-          <w:hyperlink w:anchor="__RefHeading___Toc3844_4120085704" w:tooltip="11 Recipes">
+          <w:hyperlink w:anchor="__RefHeading___Toc3851_1547890394" w:tooltip="11 Recipes">
             <w:r>
               <w:rPr>
                 <w:rStyle w:val="IndexLink"/>
@@ -892,7 +892,7 @@
             </w:tabs>
             <w:rPr/>
           </w:pPr>
-          <w:hyperlink w:anchor="__RefHeading___Toc3846_4120085704" w:tooltip="11.1 Recipe books">
+          <w:hyperlink w:anchor="__RefHeading___Toc3853_1547890394" w:tooltip="11.1 Recipe books">
             <w:r>
               <w:rPr>
                 <w:rStyle w:val="IndexLink"/>
@@ -913,7 +913,7 @@
             </w:tabs>
             <w:rPr/>
           </w:pPr>
-          <w:hyperlink w:anchor="__RefHeading___Toc3848_4120085704" w:tooltip="11.2 The Recipes screen">
+          <w:hyperlink w:anchor="__RefHeading___Toc3855_1547890394" w:tooltip="11.2 The Recipes screen">
             <w:r>
               <w:rPr>
                 <w:rStyle w:val="IndexLink"/>
@@ -934,7 +934,7 @@
             </w:tabs>
             <w:rPr/>
           </w:pPr>
-          <w:hyperlink w:anchor="__RefHeading___Toc3850_4120085704" w:tooltip="11.3 The Recipe List object">
+          <w:hyperlink w:anchor="__RefHeading___Toc3857_1547890394" w:tooltip="11.3 The Recipe List object">
             <w:r>
               <w:rPr>
                 <w:rStyle w:val="IndexLink"/>
@@ -955,7 +955,7 @@
             </w:tabs>
             <w:rPr/>
           </w:pPr>
-          <w:hyperlink w:anchor="__RefHeading___Toc3852_4120085704" w:tooltip="11.4 Selecting a recipe in a window">
+          <w:hyperlink w:anchor="__RefHeading___Toc3859_1547890394" w:tooltip="11.4 Selecting a recipe in a window">
             <w:r>
               <w:rPr>
                 <w:rStyle w:val="IndexLink"/>
@@ -976,7 +976,7 @@
             </w:tabs>
             <w:rPr/>
           </w:pPr>
-          <w:hyperlink w:anchor="__RefHeading___Toc3854_4120085704" w:tooltip="11.5 When a recipe function fails">
+          <w:hyperlink w:anchor="__RefHeading___Toc3861_1547890394" w:tooltip="11.5 When a recipe function fails">
             <w:r>
               <w:rPr>
                 <w:rStyle w:val="IndexLink"/>
@@ -997,7 +997,7 @@
             </w:tabs>
             <w:rPr/>
           </w:pPr>
-          <w:hyperlink w:anchor="__RefHeading___Toc3856_4120085704" w:tooltip="11.6 Where recipes are kept">
+          <w:hyperlink w:anchor="__RefHeading___Toc3863_1547890394" w:tooltip="11.6 Where recipes are kept">
             <w:r>
               <w:rPr>
                 <w:rStyle w:val="IndexLink"/>
@@ -1018,7 +1018,7 @@
             </w:tabs>
             <w:rPr/>
           </w:pPr>
-          <w:hyperlink w:anchor="__RefHeading___Toc3858_4120085704" w:tooltip="12 Testing">
+          <w:hyperlink w:anchor="__RefHeading___Toc3865_1547890394" w:tooltip="12 Testing">
             <w:r>
               <w:rPr>
                 <w:rStyle w:val="IndexLink"/>
@@ -1039,7 +1039,7 @@
             </w:tabs>
             <w:rPr/>
           </w:pPr>
-          <w:hyperlink w:anchor="__RefHeading___Toc3860_4120085704" w:tooltip="12.1 Validate">
+          <w:hyperlink w:anchor="__RefHeading___Toc3867_1547890394" w:tooltip="12.1 Validate">
             <w:r>
               <w:rPr>
                 <w:rStyle w:val="IndexLink"/>
@@ -1060,7 +1060,7 @@
             </w:tabs>
             <w:rPr/>
           </w:pPr>
-          <w:hyperlink w:anchor="__RefHeading___Toc3862_4120085704" w:tooltip="12.2 Run">
+          <w:hyperlink w:anchor="__RefHeading___Toc3869_1547890394" w:tooltip="12.2 Run">
             <w:r>
               <w:rPr>
                 <w:rStyle w:val="IndexLink"/>
@@ -1081,7 +1081,7 @@
             </w:tabs>
             <w:rPr/>
           </w:pPr>
-          <w:hyperlink w:anchor="__RefHeading___Toc3864_4120085704" w:tooltip="13 Deploying">
+          <w:hyperlink w:anchor="__RefHeading___Toc3871_1547890394" w:tooltip="13 Deploying">
             <w:r>
               <w:rPr>
                 <w:rStyle w:val="IndexLink"/>
@@ -1102,7 +1102,7 @@
             </w:tabs>
             <w:rPr/>
           </w:pPr>
-          <w:hyperlink w:anchor="__RefHeading___Toc3866_4120085704" w:tooltip="13.1 Publish">
+          <w:hyperlink w:anchor="__RefHeading___Toc3873_1547890394" w:tooltip="13.1 Publish">
             <w:r>
               <w:rPr>
                 <w:rStyle w:val="IndexLink"/>
@@ -1123,7 +1123,7 @@
             </w:tabs>
             <w:rPr/>
           </w:pPr>
-          <w:hyperlink w:anchor="__RefHeading___Toc3868_4120085704" w:tooltip="13.2 Append HMI Desktop">
+          <w:hyperlink w:anchor="__RefHeading___Toc3875_1547890394" w:tooltip="13.2 Append HMI Desktop">
             <w:r>
               <w:rPr>
                 <w:rStyle w:val="IndexLink"/>
@@ -1144,7 +1144,7 @@
             </w:tabs>
             <w:rPr/>
           </w:pPr>
-          <w:hyperlink w:anchor="__RefHeading___Toc3870_4120085704" w:tooltip="13.3 Append HMI Web">
+          <w:hyperlink w:anchor="__RefHeading___Toc3877_1547890394" w:tooltip="13.3 Append HMI Web">
             <w:r>
               <w:rPr>
                 <w:rStyle w:val="IndexLink"/>
@@ -1165,7 +1165,7 @@
             </w:tabs>
             <w:rPr/>
           </w:pPr>
-          <w:hyperlink w:anchor="__RefHeading___Toc3872_4120085704" w:tooltip="14 Tips and troubleshooting">
+          <w:hyperlink w:anchor="__RefHeading___Toc3879_1547890394" w:tooltip="14 Tips and troubleshooting">
             <w:r>
               <w:rPr>
                 <w:rStyle w:val="IndexLink"/>
@@ -1186,7 +1186,7 @@
             </w:tabs>
             <w:rPr/>
           </w:pPr>
-          <w:hyperlink w:anchor="__RefHeading___Toc3874_4120085704" w:tooltip="Appendix A Command-line automation">
+          <w:hyperlink w:anchor="__RefHeading___Toc3881_1547890394" w:tooltip="Appendix A Command-line automation">
             <w:r>
               <w:rPr>
                 <w:rStyle w:val="IndexLink"/>
@@ -1224,7 +1224,7 @@
         <w:spacing w:before="0" w:after="0"/>
         <w:rPr/>
       </w:pPr>
-      <w:bookmarkStart w:id="0" w:name="__RefHeading___Toc3788_4120085704"/>
+      <w:bookmarkStart w:id="0" w:name="__RefHeading___Toc3795_1547890394"/>
       <w:bookmarkEnd w:id="0"/>
       <w:r>
         <w:rPr/>
@@ -1925,7 +1925,7 @@
         <w:pStyle w:val="Heading2"/>
         <w:rPr/>
       </w:pPr>
-      <w:bookmarkStart w:id="1" w:name="__RefHeading___Toc3790_4120085704"/>
+      <w:bookmarkStart w:id="1" w:name="__RefHeading___Toc3797_1547890394"/>
       <w:bookmarkEnd w:id="1"/>
       <w:r>
         <w:rPr/>
@@ -2068,7 +2068,7 @@
         <w:pStyle w:val="Heading1"/>
         <w:rPr/>
       </w:pPr>
-      <w:bookmarkStart w:id="2" w:name="__RefHeading___Toc3792_4120085704"/>
+      <w:bookmarkStart w:id="2" w:name="__RefHeading___Toc3799_1547890394"/>
       <w:bookmarkEnd w:id="2"/>
       <w:r>
         <w:rPr/>
@@ -2646,7 +2646,7 @@
         <w:pStyle w:val="Heading2"/>
         <w:rPr/>
       </w:pPr>
-      <w:bookmarkStart w:id="3" w:name="__RefHeading___Toc3794_4120085704"/>
+      <w:bookmarkStart w:id="3" w:name="__RefHeading___Toc3801_1547890394"/>
       <w:bookmarkEnd w:id="3"/>
       <w:r>
         <w:rPr/>
@@ -3686,7 +3686,7 @@
         <w:pStyle w:val="Heading1"/>
         <w:rPr/>
       </w:pPr>
-      <w:bookmarkStart w:id="4" w:name="__RefHeading___Toc3796_4120085704"/>
+      <w:bookmarkStart w:id="4" w:name="__RefHeading___Toc3803_1547890394"/>
       <w:bookmarkEnd w:id="4"/>
       <w:r>
         <w:rPr/>
@@ -3971,7 +3971,7 @@
         <w:pStyle w:val="Heading1"/>
         <w:rPr/>
       </w:pPr>
-      <w:bookmarkStart w:id="5" w:name="__RefHeading___Toc3798_4120085704"/>
+      <w:bookmarkStart w:id="5" w:name="__RefHeading___Toc3805_1547890394"/>
       <w:bookmarkEnd w:id="5"/>
       <w:r>
         <w:rPr/>
@@ -4766,7 +4766,7 @@
         <w:pStyle w:val="Heading1"/>
         <w:rPr/>
       </w:pPr>
-      <w:bookmarkStart w:id="6" w:name="__RefHeading___Toc3800_4120085704"/>
+      <w:bookmarkStart w:id="6" w:name="__RefHeading___Toc3807_1547890394"/>
       <w:bookmarkEnd w:id="6"/>
       <w:r>
         <w:rPr/>
@@ -5597,7 +5597,7 @@
         <w:pStyle w:val="Heading2"/>
         <w:rPr/>
       </w:pPr>
-      <w:bookmarkStart w:id="7" w:name="__RefHeading___Toc3802_4120085704"/>
+      <w:bookmarkStart w:id="7" w:name="__RefHeading___Toc3809_1547890394"/>
       <w:bookmarkEnd w:id="7"/>
       <w:r>
         <w:rPr/>
@@ -6250,7 +6250,7 @@
         <w:pStyle w:val="Heading2"/>
         <w:rPr/>
       </w:pPr>
-      <w:bookmarkStart w:id="8" w:name="__RefHeading___Toc3804_4120085704"/>
+      <w:bookmarkStart w:id="8" w:name="__RefHeading___Toc3811_1547890394"/>
       <w:bookmarkEnd w:id="8"/>
       <w:r>
         <w:rPr/>
@@ -6385,7 +6385,7 @@
         <w:pStyle w:val="Heading1"/>
         <w:rPr/>
       </w:pPr>
-      <w:bookmarkStart w:id="9" w:name="__RefHeading___Toc3806_4120085704"/>
+      <w:bookmarkStart w:id="9" w:name="__RefHeading___Toc3813_1547890394"/>
       <w:bookmarkEnd w:id="9"/>
       <w:r>
         <w:rPr/>
@@ -6898,7 +6898,7 @@
         <w:pStyle w:val="Heading2"/>
         <w:rPr/>
       </w:pPr>
-      <w:bookmarkStart w:id="10" w:name="__RefHeading___Toc3808_4120085704"/>
+      <w:bookmarkStart w:id="10" w:name="__RefHeading___Toc3815_1547890394"/>
       <w:bookmarkEnd w:id="10"/>
       <w:r>
         <w:rPr/>
@@ -7060,7 +7060,7 @@
         <w:pStyle w:val="Heading2"/>
         <w:rPr/>
       </w:pPr>
-      <w:bookmarkStart w:id="11" w:name="__RefHeading___Toc3810_4120085704"/>
+      <w:bookmarkStart w:id="11" w:name="__RefHeading___Toc3817_1547890394"/>
       <w:bookmarkEnd w:id="11"/>
       <w:r>
         <w:rPr/>
@@ -7116,7 +7116,7 @@
         <w:pStyle w:val="Heading1"/>
         <w:rPr/>
       </w:pPr>
-      <w:bookmarkStart w:id="12" w:name="__RefHeading___Toc3812_4120085704"/>
+      <w:bookmarkStart w:id="12" w:name="__RefHeading___Toc3819_1547890394"/>
       <w:bookmarkEnd w:id="12"/>
       <w:r>
         <w:rPr/>
@@ -7829,10 +7829,50 @@
     </w:p>
     <w:p>
       <w:pPr>
+        <w:pStyle w:val="Normal"/>
+        <w:rPr/>
+      </w:pPr>
+      <w:r>
+        <w:rPr/>
+        <w:t xml:space="preserve">To mirror an object, select it and choose </w:t>
+      </w:r>
+      <w:r>
+        <w:rPr>
+          <w:b/>
+        </w:rPr>
+        <w:t>Arrange &gt; Direction &gt; Flip Horizontal</w:t>
+      </w:r>
+      <w:r>
+        <w:rPr/>
+        <w:t xml:space="preserve"> or </w:t>
+      </w:r>
+      <w:r>
+        <w:rPr>
+          <w:b/>
+        </w:rPr>
+        <w:t>Flip Vertical</w:t>
+      </w:r>
+      <w:r>
+        <w:rPr/>
+        <w:t xml:space="preserve">, or use the </w:t>
+      </w:r>
+      <w:r>
+        <w:rPr>
+          <w:b/>
+        </w:rPr>
+        <w:t>Flip</w:t>
+      </w:r>
+      <w:r>
+        <w:rPr/>
+        <w:t xml:space="preserve"> buttons on the Arrange tab. A group is mirrored as a whole about its center: every object in it, including groups inside it, moves to its mirrored place and is flipped itself, and lines and rotations follow, so a pump symbol that faces right faces left. Text stays readable.</w:t>
+      </w:r>
+    </w:p>
+    <w:p>
+      <w:pPr>
         <w:pStyle w:val="Heading1"/>
         <w:rPr/>
       </w:pPr>
-      <w:bookmarkStart w:id="13" w:name="__RefHeading___Toc3814_4120085704"/>
+      <w:bookmarkStart w:id="13" w:name="__RefHeading___Toc3821_1547890394"/>
       <w:bookmarkEnd w:id="13"/>
       <w:r>
         <w:rPr/>
@@ -8557,7 +8597,7 @@
         <w:pStyle w:val="Heading2"/>
         <w:rPr/>
       </w:pPr>
-      <w:bookmarkStart w:id="14" w:name="__RefHeading___Toc3816_4120085704"/>
+      <w:bookmarkStart w:id="14" w:name="__RefHeading___Toc3823_1547890394"/>
       <w:bookmarkEnd w:id="14"/>
       <w:r>
         <w:rPr/>
@@ -8743,7 +8783,7 @@
         <w:pStyle w:val="Heading2"/>
         <w:rPr/>
       </w:pPr>
-      <w:bookmarkStart w:id="15" w:name="__RefHeading___Toc3818_4120085704"/>
+      <w:bookmarkStart w:id="15" w:name="__RefHeading___Toc3825_1547890394"/>
       <w:bookmarkEnd w:id="15"/>
       <w:r>
         <w:rPr/>
@@ -8867,7 +8907,7 @@
         <w:pStyle w:val="Heading2"/>
         <w:rPr/>
       </w:pPr>
-      <w:bookmarkStart w:id="16" w:name="__RefHeading___Toc3820_4120085704"/>
+      <w:bookmarkStart w:id="16" w:name="__RefHeading___Toc3827_1547890394"/>
       <w:bookmarkEnd w:id="16"/>
       <w:r>
         <w:rPr/>
@@ -8983,7 +9023,7 @@
         <w:pStyle w:val="Heading2"/>
         <w:rPr/>
       </w:pPr>
-      <w:bookmarkStart w:id="17" w:name="__RefHeading___Toc3822_4120085704"/>
+      <w:bookmarkStart w:id="17" w:name="__RefHeading___Toc3829_1547890394"/>
       <w:bookmarkEnd w:id="17"/>
       <w:r>
         <w:rPr/>
@@ -9099,7 +9139,7 @@
         <w:pStyle w:val="Heading2"/>
         <w:rPr/>
       </w:pPr>
-      <w:bookmarkStart w:id="18" w:name="__RefHeading___Toc3824_4120085704"/>
+      <w:bookmarkStart w:id="18" w:name="__RefHeading___Toc3831_1547890394"/>
       <w:bookmarkEnd w:id="18"/>
       <w:r>
         <w:rPr/>
@@ -9611,7 +9651,7 @@
         <w:pStyle w:val="Heading1"/>
         <w:rPr/>
       </w:pPr>
-      <w:bookmarkStart w:id="19" w:name="__RefHeading___Toc3826_4120085704"/>
+      <w:bookmarkStart w:id="19" w:name="__RefHeading___Toc3833_1547890394"/>
       <w:bookmarkEnd w:id="19"/>
       <w:r>
         <w:rPr/>
@@ -10513,7 +10553,7 @@
         <w:pStyle w:val="Heading2"/>
         <w:rPr/>
       </w:pPr>
-      <w:bookmarkStart w:id="20" w:name="__RefHeading___Toc3828_4120085704"/>
+      <w:bookmarkStart w:id="20" w:name="__RefHeading___Toc3835_1547890394"/>
       <w:bookmarkEnd w:id="20"/>
       <w:r>
         <w:rPr/>
@@ -10697,7 +10737,7 @@
         <w:pStyle w:val="Heading2"/>
         <w:rPr/>
       </w:pPr>
-      <w:bookmarkStart w:id="21" w:name="__RefHeading___Toc3830_4120085704"/>
+      <w:bookmarkStart w:id="21" w:name="__RefHeading___Toc3837_1547890394"/>
       <w:bookmarkEnd w:id="21"/>
       <w:r>
         <w:rPr/>
@@ -10816,7 +10856,7 @@
         <w:pStyle w:val="Heading2"/>
         <w:rPr/>
       </w:pPr>
-      <w:bookmarkStart w:id="22" w:name="__RefHeading___Toc3832_4120085704"/>
+      <w:bookmarkStart w:id="22" w:name="__RefHeading___Toc3839_1547890394"/>
       <w:bookmarkEnd w:id="22"/>
       <w:r>
         <w:rPr/>
@@ -14363,7 +14403,7 @@
         <w:pStyle w:val="Heading2"/>
         <w:rPr/>
       </w:pPr>
-      <w:bookmarkStart w:id="23" w:name="__RefHeading___Toc3834_4120085704"/>
+      <w:bookmarkStart w:id="23" w:name="__RefHeading___Toc3841_1547890394"/>
       <w:bookmarkEnd w:id="23"/>
       <w:r>
         <w:rPr/>
@@ -15199,7 +15239,7 @@
         <w:pStyle w:val="Heading2"/>
         <w:rPr/>
       </w:pPr>
-      <w:bookmarkStart w:id="24" w:name="__RefHeading___Toc3836_4120085704"/>
+      <w:bookmarkStart w:id="24" w:name="__RefHeading___Toc3843_1547890394"/>
       <w:bookmarkEnd w:id="24"/>
       <w:r>
         <w:rPr/>
@@ -15676,7 +15716,7 @@
         <w:pStyle w:val="Heading1"/>
         <w:rPr/>
       </w:pPr>
-      <w:bookmarkStart w:id="25" w:name="__RefHeading___Toc3838_4120085704"/>
+      <w:bookmarkStart w:id="25" w:name="__RefHeading___Toc3845_1547890394"/>
       <w:bookmarkEnd w:id="25"/>
       <w:r>
         <w:rPr/>
@@ -15688,7 +15728,7 @@
         <w:pStyle w:val="Heading2"/>
         <w:rPr/>
       </w:pPr>
-      <w:bookmarkStart w:id="26" w:name="__RefHeading___Toc3840_4120085704"/>
+      <w:bookmarkStart w:id="26" w:name="__RefHeading___Toc3847_1547890394"/>
       <w:bookmarkEnd w:id="26"/>
       <w:r>
         <w:rPr/>
@@ -15821,7 +15861,7 @@
         <w:pStyle w:val="Heading2"/>
         <w:rPr/>
       </w:pPr>
-      <w:bookmarkStart w:id="27" w:name="__RefHeading___Toc3842_4120085704"/>
+      <w:bookmarkStart w:id="27" w:name="__RefHeading___Toc3849_1547890394"/>
       <w:bookmarkEnd w:id="27"/>
       <w:r>
         <w:rPr/>
@@ -16511,7 +16551,7 @@
         <w:pStyle w:val="Heading1"/>
         <w:rPr/>
       </w:pPr>
-      <w:bookmarkStart w:id="28" w:name="__RefHeading___Toc3844_4120085704"/>
+      <w:bookmarkStart w:id="28" w:name="__RefHeading___Toc3851_1547890394"/>
       <w:bookmarkEnd w:id="28"/>
       <w:r>
         <w:rPr/>
@@ -16647,7 +16687,7 @@
         <w:pStyle w:val="Heading2"/>
         <w:rPr/>
       </w:pPr>
-      <w:bookmarkStart w:id="29" w:name="__RefHeading___Toc3846_4120085704"/>
+      <w:bookmarkStart w:id="29" w:name="__RefHeading___Toc3853_1547890394"/>
       <w:bookmarkEnd w:id="29"/>
       <w:r>
         <w:rPr/>
@@ -18508,7 +18548,7 @@
         <w:pStyle w:val="Heading2"/>
         <w:rPr/>
       </w:pPr>
-      <w:bookmarkStart w:id="30" w:name="__RefHeading___Toc3848_4120085704"/>
+      <w:bookmarkStart w:id="30" w:name="__RefHeading___Toc3855_1547890394"/>
       <w:bookmarkEnd w:id="30"/>
       <w:r>
         <w:rPr/>
@@ -19958,7 +19998,7 @@
         <w:pStyle w:val="Heading2"/>
         <w:rPr/>
       </w:pPr>
-      <w:bookmarkStart w:id="31" w:name="__RefHeading___Toc3850_4120085704"/>
+      <w:bookmarkStart w:id="31" w:name="__RefHeading___Toc3857_1547890394"/>
       <w:bookmarkEnd w:id="31"/>
       <w:r>
         <w:rPr/>
@@ -20499,7 +20539,7 @@
         <w:pStyle w:val="Heading2"/>
         <w:rPr/>
       </w:pPr>
-      <w:bookmarkStart w:id="32" w:name="__RefHeading___Toc3852_4120085704"/>
+      <w:bookmarkStart w:id="32" w:name="__RefHeading___Toc3859_1547890394"/>
       <w:bookmarkEnd w:id="32"/>
       <w:r>
         <w:rPr/>
@@ -20784,7 +20824,7 @@
         <w:pStyle w:val="Heading2"/>
         <w:rPr/>
       </w:pPr>
-      <w:bookmarkStart w:id="33" w:name="__RefHeading___Toc3854_4120085704"/>
+      <w:bookmarkStart w:id="33" w:name="__RefHeading___Toc3861_1547890394"/>
       <w:bookmarkEnd w:id="33"/>
       <w:r>
         <w:rPr/>
@@ -20942,7 +20982,7 @@
         <w:pStyle w:val="Heading2"/>
         <w:rPr/>
       </w:pPr>
-      <w:bookmarkStart w:id="34" w:name="__RefHeading___Toc3856_4120085704"/>
+      <w:bookmarkStart w:id="34" w:name="__RefHeading___Toc3863_1547890394"/>
       <w:bookmarkEnd w:id="34"/>
       <w:r>
         <w:rPr/>
@@ -21342,7 +21382,7 @@
         <w:pStyle w:val="Heading1"/>
         <w:rPr/>
       </w:pPr>
-      <w:bookmarkStart w:id="35" w:name="__RefHeading___Toc3858_4120085704"/>
+      <w:bookmarkStart w:id="35" w:name="__RefHeading___Toc3865_1547890394"/>
       <w:bookmarkEnd w:id="35"/>
       <w:r>
         <w:rPr/>
@@ -21354,7 +21394,7 @@
         <w:pStyle w:val="Heading2"/>
         <w:rPr/>
       </w:pPr>
-      <w:bookmarkStart w:id="36" w:name="__RefHeading___Toc3860_4120085704"/>
+      <w:bookmarkStart w:id="36" w:name="__RefHeading___Toc3867_1547890394"/>
       <w:bookmarkEnd w:id="36"/>
       <w:r>
         <w:rPr/>
@@ -21442,7 +21482,7 @@
         <w:pStyle w:val="Heading2"/>
         <w:rPr/>
       </w:pPr>
-      <w:bookmarkStart w:id="37" w:name="__RefHeading___Toc3862_4120085704"/>
+      <w:bookmarkStart w:id="37" w:name="__RefHeading___Toc3869_1547890394"/>
       <w:bookmarkEnd w:id="37"/>
       <w:r>
         <w:rPr/>
@@ -21988,7 +22028,7 @@
         <w:pStyle w:val="Heading1"/>
         <w:rPr/>
       </w:pPr>
-      <w:bookmarkStart w:id="38" w:name="__RefHeading___Toc3864_4120085704"/>
+      <w:bookmarkStart w:id="38" w:name="__RefHeading___Toc3871_1547890394"/>
       <w:bookmarkEnd w:id="38"/>
       <w:r>
         <w:rPr/>
@@ -22441,7 +22481,7 @@
         <w:pStyle w:val="Heading2"/>
         <w:rPr/>
       </w:pPr>
-      <w:bookmarkStart w:id="39" w:name="__RefHeading___Toc3866_4120085704"/>
+      <w:bookmarkStart w:id="39" w:name="__RefHeading___Toc3873_1547890394"/>
       <w:bookmarkEnd w:id="39"/>
       <w:r>
         <w:rPr/>
@@ -22529,7 +22569,7 @@
         <w:pStyle w:val="Heading2"/>
         <w:rPr/>
       </w:pPr>
-      <w:bookmarkStart w:id="40" w:name="__RefHeading___Toc3868_4120085704"/>
+      <w:bookmarkStart w:id="40" w:name="__RefHeading___Toc3875_1547890394"/>
       <w:bookmarkEnd w:id="40"/>
       <w:r>
         <w:rPr/>
@@ -22642,7 +22682,7 @@
         <w:pStyle w:val="Heading2"/>
         <w:rPr/>
       </w:pPr>
-      <w:bookmarkStart w:id="41" w:name="__RefHeading___Toc3870_4120085704"/>
+      <w:bookmarkStart w:id="41" w:name="__RefHeading___Toc3877_1547890394"/>
       <w:bookmarkEnd w:id="41"/>
       <w:r>
         <w:rPr/>
@@ -22855,7 +22895,7 @@
         <w:pStyle w:val="Heading1"/>
         <w:rPr/>
       </w:pPr>
-      <w:bookmarkStart w:id="42" w:name="__RefHeading___Toc3872_4120085704"/>
+      <w:bookmarkStart w:id="42" w:name="__RefHeading___Toc3879_1547890394"/>
       <w:bookmarkEnd w:id="42"/>
       <w:r>
         <w:rPr/>
@@ -23515,7 +23555,7 @@
         <w:pStyle w:val="Heading1"/>
         <w:rPr/>
       </w:pPr>
-      <w:bookmarkStart w:id="43" w:name="__RefHeading___Toc3874_4120085704"/>
+      <w:bookmarkStart w:id="43" w:name="__RefHeading___Toc3881_1547890394"/>
       <w:bookmarkEnd w:id="43"/>
       <w:r>
         <w:rPr/>

</xml_diff>

<commit_message>
docs: PRINT SCREEN button on every LiquidWeighHMI screen; manual screenshots retaken
The header button that calls ScreenToPDF() is now PRINT SCREEN. The
manual's screenshots that show a screen header are retaken with it, the
manual describes the header, and the README and examples README list the
new features and the example's current contents.

Co-Authored-By: Claude Opus 5.5 <noreply@anthropic.com>
</commit_message>
<xml_diff>
--- a/doc/Append-HMI-Studio-User-Manual.docx
+++ b/doc/Append-HMI-Studio-User-Manual.docx
@@ -283,7 +283,7 @@
             </w:rPr>
             <w:fldChar w:fldCharType="separate"/>
           </w:r>
-          <w:hyperlink w:anchor="__RefHeading___Toc3853_1989417878" w:tooltip="1 Introduction">
+          <w:hyperlink w:anchor="__RefHeading___Toc3857_1542888776" w:tooltip="1 Introduction">
             <w:r>
               <w:rPr>
                 <w:rStyle w:val="IndexLink"/>
@@ -304,7 +304,7 @@
             </w:tabs>
             <w:rPr/>
           </w:pPr>
-          <w:hyperlink w:anchor="__RefHeading___Toc3855_1989417878" w:tooltip="1.1 How an HMI application is organized">
+          <w:hyperlink w:anchor="__RefHeading___Toc3859_1542888776" w:tooltip="1.1 How an HMI application is organized">
             <w:r>
               <w:rPr>
                 <w:rStyle w:val="IndexLink"/>
@@ -325,7 +325,7 @@
             </w:tabs>
             <w:rPr/>
           </w:pPr>
-          <w:hyperlink w:anchor="__RefHeading___Toc3857_1989417878" w:tooltip="2 The Studio window">
+          <w:hyperlink w:anchor="__RefHeading___Toc3861_1542888776" w:tooltip="2 The Studio window">
             <w:r>
               <w:rPr>
                 <w:rStyle w:val="IndexLink"/>
@@ -346,7 +346,7 @@
             </w:tabs>
             <w:rPr/>
           </w:pPr>
-          <w:hyperlink w:anchor="__RefHeading___Toc3859_1989417878" w:tooltip="2.1 The HMI menu">
+          <w:hyperlink w:anchor="__RefHeading___Toc3863_1542888776" w:tooltip="2.1 The HMI menu">
             <w:r>
               <w:rPr>
                 <w:rStyle w:val="IndexLink"/>
@@ -367,7 +367,7 @@
             </w:tabs>
             <w:rPr/>
           </w:pPr>
-          <w:hyperlink w:anchor="__RefHeading___Toc3861_1989417878" w:tooltip="3 Application settings">
+          <w:hyperlink w:anchor="__RefHeading___Toc3865_1542888776" w:tooltip="3 Application settings">
             <w:r>
               <w:rPr>
                 <w:rStyle w:val="IndexLink"/>
@@ -388,7 +388,7 @@
             </w:tabs>
             <w:rPr/>
           </w:pPr>
-          <w:hyperlink w:anchor="__RefHeading___Toc3863_1989417878" w:tooltip="4 Devices">
+          <w:hyperlink w:anchor="__RefHeading___Toc3867_1542888776" w:tooltip="4 Devices">
             <w:r>
               <w:rPr>
                 <w:rStyle w:val="IndexLink"/>
@@ -409,7 +409,7 @@
             </w:tabs>
             <w:rPr/>
           </w:pPr>
-          <w:hyperlink w:anchor="__RefHeading___Toc3865_1989417878" w:tooltip="5 Tags">
+          <w:hyperlink w:anchor="__RefHeading___Toc3869_1542888776" w:tooltip="5 Tags">
             <w:r>
               <w:rPr>
                 <w:rStyle w:val="IndexLink"/>
@@ -430,7 +430,7 @@
             </w:tabs>
             <w:rPr/>
           </w:pPr>
-          <w:hyperlink w:anchor="__RefHeading___Toc3867_1989417878" w:tooltip="5.1 Tag fields">
+          <w:hyperlink w:anchor="__RefHeading___Toc3871_1542888776" w:tooltip="5.1 Tag fields">
             <w:r>
               <w:rPr>
                 <w:rStyle w:val="IndexLink"/>
@@ -451,7 +451,7 @@
             </w:tabs>
             <w:rPr/>
           </w:pPr>
-          <w:hyperlink w:anchor="__RefHeading___Toc3869_1989417878" w:tooltip="5.2 Alarms on a tag">
+          <w:hyperlink w:anchor="__RefHeading___Toc3873_1542888776" w:tooltip="5.2 Alarms on a tag">
             <w:r>
               <w:rPr>
                 <w:rStyle w:val="IndexLink"/>
@@ -472,7 +472,7 @@
             </w:tabs>
             <w:rPr/>
           </w:pPr>
-          <w:hyperlink w:anchor="__RefHeading___Toc3871_1989417878" w:tooltip="6 Screens and windows">
+          <w:hyperlink w:anchor="__RefHeading___Toc3875_1542888776" w:tooltip="6 Screens and windows">
             <w:r>
               <w:rPr>
                 <w:rStyle w:val="IndexLink"/>
@@ -493,7 +493,7 @@
             </w:tabs>
             <w:rPr/>
           </w:pPr>
-          <w:hyperlink w:anchor="__RefHeading___Toc3873_1989417878" w:tooltip="6.1 Window properties">
+          <w:hyperlink w:anchor="__RefHeading___Toc3877_1542888776" w:tooltip="6.1 Window properties">
             <w:r>
               <w:rPr>
                 <w:rStyle w:val="IndexLink"/>
@@ -514,7 +514,7 @@
             </w:tabs>
             <w:rPr/>
           </w:pPr>
-          <w:hyperlink w:anchor="__RefHeading___Toc3875_1989417878" w:tooltip="6.2 Navigation">
+          <w:hyperlink w:anchor="__RefHeading___Toc3879_1542888776" w:tooltip="6.2 Navigation">
             <w:r>
               <w:rPr>
                 <w:rStyle w:val="IndexLink"/>
@@ -535,7 +535,7 @@
             </w:tabs>
             <w:rPr/>
           </w:pPr>
-          <w:hyperlink w:anchor="__RefHeading___Toc3877_1989417878" w:tooltip="7 Drawing objects">
+          <w:hyperlink w:anchor="__RefHeading___Toc3881_1542888776" w:tooltip="7 Drawing objects">
             <w:r>
               <w:rPr>
                 <w:rStyle w:val="IndexLink"/>
@@ -556,7 +556,7 @@
             </w:tabs>
             <w:rPr/>
           </w:pPr>
-          <w:hyperlink w:anchor="__RefHeading___Toc3879_1989417878" w:tooltip="8 Animation links">
+          <w:hyperlink w:anchor="__RefHeading___Toc3883_1542888776" w:tooltip="8 Animation links">
             <w:r>
               <w:rPr>
                 <w:rStyle w:val="IndexLink"/>
@@ -577,7 +577,7 @@
             </w:tabs>
             <w:rPr/>
           </w:pPr>
-          <w:hyperlink w:anchor="__RefHeading___Toc3881_1989417878" w:tooltip="8.1 A valve: status color, fault blink and faceplate">
+          <w:hyperlink w:anchor="__RefHeading___Toc3885_1542888776" w:tooltip="8.1 A valve: status color, fault blink and faceplate">
             <w:r>
               <w:rPr>
                 <w:rStyle w:val="IndexLink"/>
@@ -598,7 +598,7 @@
             </w:tabs>
             <w:rPr/>
           </w:pPr>
-          <w:hyperlink w:anchor="__RefHeading___Toc3883_1989417878" w:tooltip="8.2 The weigh hopper: percent fill">
+          <w:hyperlink w:anchor="__RefHeading___Toc3887_1542888776" w:tooltip="8.2 The weigh hopper: percent fill">
             <w:r>
               <w:rPr>
                 <w:rStyle w:val="IndexLink"/>
@@ -619,7 +619,7 @@
             </w:tabs>
             <w:rPr/>
           </w:pPr>
-          <w:hyperlink w:anchor="__RefHeading___Toc3885_1989417878" w:tooltip="8.3 Hopper pressure: value display and alarm colors">
+          <w:hyperlink w:anchor="__RefHeading___Toc3889_1542888776" w:tooltip="8.3 Hopper pressure: value display and alarm colors">
             <w:r>
               <w:rPr>
                 <w:rStyle w:val="IndexLink"/>
@@ -640,7 +640,7 @@
             </w:tabs>
             <w:rPr/>
           </w:pPr>
-          <w:hyperlink w:anchor="__RefHeading___Toc3887_1989417878" w:tooltip="8.4 Setpoints: user input">
+          <w:hyperlink w:anchor="__RefHeading___Toc3891_1542888776" w:tooltip="8.4 Setpoints: user input">
             <w:r>
               <w:rPr>
                 <w:rStyle w:val="IndexLink"/>
@@ -661,7 +661,7 @@
             </w:tabs>
             <w:rPr/>
           </w:pPr>
-          <w:hyperlink w:anchor="__RefHeading___Toc3889_1989417878" w:tooltip="8.5 Commands: pushbutton and enable">
+          <w:hyperlink w:anchor="__RefHeading___Toc3893_1542888776" w:tooltip="8.5 Commands: pushbutton and enable">
             <w:r>
               <w:rPr>
                 <w:rStyle w:val="IndexLink"/>
@@ -682,7 +682,7 @@
             </w:tabs>
             <w:rPr/>
           </w:pPr>
-          <w:hyperlink w:anchor="__RefHeading___Toc3891_1989417878" w:tooltip="9 Expressions and scripts">
+          <w:hyperlink w:anchor="__RefHeading___Toc3895_1542888776" w:tooltip="9 Expressions and scripts">
             <w:r>
               <w:rPr>
                 <w:rStyle w:val="IndexLink"/>
@@ -703,7 +703,7 @@
             </w:tabs>
             <w:rPr/>
           </w:pPr>
-          <w:hyperlink w:anchor="__RefHeading___Toc3893_1989417878" w:tooltip="9.1 Window scripts">
+          <w:hyperlink w:anchor="__RefHeading___Toc3897_1542888776" w:tooltip="9.1 Window scripts">
             <w:r>
               <w:rPr>
                 <w:rStyle w:val="IndexLink"/>
@@ -724,7 +724,7 @@
             </w:tabs>
             <w:rPr/>
           </w:pPr>
-          <w:hyperlink w:anchor="__RefHeading___Toc3895_1989417878" w:tooltip="9.2 Action scripts">
+          <w:hyperlink w:anchor="__RefHeading___Toc3899_1542888776" w:tooltip="9.2 Action scripts">
             <w:r>
               <w:rPr>
                 <w:rStyle w:val="IndexLink"/>
@@ -745,7 +745,7 @@
             </w:tabs>
             <w:rPr/>
           </w:pPr>
-          <w:hyperlink w:anchor="__RefHeading___Toc3897_1989417878" w:tooltip="9.3 Function reference">
+          <w:hyperlink w:anchor="__RefHeading___Toc3901_1542888776" w:tooltip="9.3 Function reference">
             <w:r>
               <w:rPr>
                 <w:rStyle w:val="IndexLink"/>
@@ -766,7 +766,7 @@
             </w:tabs>
             <w:rPr/>
           </w:pPr>
-          <w:hyperlink w:anchor="__RefHeading___Toc3899_1989417878" w:tooltip="9.4 Indirect tags: one faceplate for every device">
+          <w:hyperlink w:anchor="__RefHeading___Toc3903_1542888776" w:tooltip="9.4 Indirect tags: one faceplate for every device">
             <w:r>
               <w:rPr>
                 <w:rStyle w:val="IndexLink"/>
@@ -787,7 +787,7 @@
             </w:tabs>
             <w:rPr/>
           </w:pPr>
-          <w:hyperlink w:anchor="__RefHeading___Toc3901_1989417878" w:tooltip="9.5 Opening windows from scripts: ShowWindow">
+          <w:hyperlink w:anchor="__RefHeading___Toc3905_1542888776" w:tooltip="9.5 Opening windows from scripts: ShowWindow">
             <w:r>
               <w:rPr>
                 <w:rStyle w:val="IndexLink"/>
@@ -808,7 +808,7 @@
             </w:tabs>
             <w:rPr/>
           </w:pPr>
-          <w:hyperlink w:anchor="__RefHeading___Toc3903_1989417878" w:tooltip="9.6 Saving the screen as a PDF: ScreenToPDF">
+          <w:hyperlink w:anchor="__RefHeading___Toc3907_1542888776" w:tooltip="9.6 Saving the screen as a PDF: ScreenToPDF">
             <w:r>
               <w:rPr>
                 <w:rStyle w:val="IndexLink"/>
@@ -829,7 +829,7 @@
             </w:tabs>
             <w:rPr/>
           </w:pPr>
-          <w:hyperlink w:anchor="__RefHeading___Toc3905_1989417878" w:tooltip="10 Alarms and security">
+          <w:hyperlink w:anchor="__RefHeading___Toc3909_1542888776" w:tooltip="10 Alarms and security">
             <w:r>
               <w:rPr>
                 <w:rStyle w:val="IndexLink"/>
@@ -850,7 +850,7 @@
             </w:tabs>
             <w:rPr/>
           </w:pPr>
-          <w:hyperlink w:anchor="__RefHeading___Toc3907_1989417878" w:tooltip="10.1 Alarms">
+          <w:hyperlink w:anchor="__RefHeading___Toc3911_1542888776" w:tooltip="10.1 Alarms">
             <w:r>
               <w:rPr>
                 <w:rStyle w:val="IndexLink"/>
@@ -871,7 +871,7 @@
             </w:tabs>
             <w:rPr/>
           </w:pPr>
-          <w:hyperlink w:anchor="__RefHeading___Toc3909_1989417878" w:tooltip="10.2 Users and access levels">
+          <w:hyperlink w:anchor="__RefHeading___Toc3913_1542888776" w:tooltip="10.2 Users and access levels">
             <w:r>
               <w:rPr>
                 <w:rStyle w:val="IndexLink"/>
@@ -892,7 +892,7 @@
             </w:tabs>
             <w:rPr/>
           </w:pPr>
-          <w:hyperlink w:anchor="__RefHeading___Toc3911_1989417878" w:tooltip="11 Recipes">
+          <w:hyperlink w:anchor="__RefHeading___Toc3915_1542888776" w:tooltip="11 Recipes">
             <w:r>
               <w:rPr>
                 <w:rStyle w:val="IndexLink"/>
@@ -913,7 +913,7 @@
             </w:tabs>
             <w:rPr/>
           </w:pPr>
-          <w:hyperlink w:anchor="__RefHeading___Toc3913_1989417878" w:tooltip="11.1 Recipe books">
+          <w:hyperlink w:anchor="__RefHeading___Toc3917_1542888776" w:tooltip="11.1 Recipe books">
             <w:r>
               <w:rPr>
                 <w:rStyle w:val="IndexLink"/>
@@ -934,7 +934,7 @@
             </w:tabs>
             <w:rPr/>
           </w:pPr>
-          <w:hyperlink w:anchor="__RefHeading___Toc3915_1989417878" w:tooltip="11.2 The Recipes screen">
+          <w:hyperlink w:anchor="__RefHeading___Toc3919_1542888776" w:tooltip="11.2 The Recipes screen">
             <w:r>
               <w:rPr>
                 <w:rStyle w:val="IndexLink"/>
@@ -955,7 +955,7 @@
             </w:tabs>
             <w:rPr/>
           </w:pPr>
-          <w:hyperlink w:anchor="__RefHeading___Toc3917_1989417878" w:tooltip="11.3 The Recipe List object">
+          <w:hyperlink w:anchor="__RefHeading___Toc3921_1542888776" w:tooltip="11.3 The Recipe List object">
             <w:r>
               <w:rPr>
                 <w:rStyle w:val="IndexLink"/>
@@ -976,7 +976,7 @@
             </w:tabs>
             <w:rPr/>
           </w:pPr>
-          <w:hyperlink w:anchor="__RefHeading___Toc3919_1989417878" w:tooltip="11.4 Selecting a recipe in a window">
+          <w:hyperlink w:anchor="__RefHeading___Toc3923_1542888776" w:tooltip="11.4 Selecting a recipe in a window">
             <w:r>
               <w:rPr>
                 <w:rStyle w:val="IndexLink"/>
@@ -997,7 +997,7 @@
             </w:tabs>
             <w:rPr/>
           </w:pPr>
-          <w:hyperlink w:anchor="__RefHeading___Toc3921_1989417878" w:tooltip="11.5 When a recipe function fails">
+          <w:hyperlink w:anchor="__RefHeading___Toc3925_1542888776" w:tooltip="11.5 When a recipe function fails">
             <w:r>
               <w:rPr>
                 <w:rStyle w:val="IndexLink"/>
@@ -1018,7 +1018,7 @@
             </w:tabs>
             <w:rPr/>
           </w:pPr>
-          <w:hyperlink w:anchor="__RefHeading___Toc3923_1989417878" w:tooltip="11.6 Where recipes are kept">
+          <w:hyperlink w:anchor="__RefHeading___Toc3927_1542888776" w:tooltip="11.6 Where recipes are kept">
             <w:r>
               <w:rPr>
                 <w:rStyle w:val="IndexLink"/>
@@ -1039,7 +1039,7 @@
             </w:tabs>
             <w:rPr/>
           </w:pPr>
-          <w:hyperlink w:anchor="__RefHeading___Toc3925_1989417878" w:tooltip="12 Testing">
+          <w:hyperlink w:anchor="__RefHeading___Toc3929_1542888776" w:tooltip="12 Testing">
             <w:r>
               <w:rPr>
                 <w:rStyle w:val="IndexLink"/>
@@ -1060,7 +1060,7 @@
             </w:tabs>
             <w:rPr/>
           </w:pPr>
-          <w:hyperlink w:anchor="__RefHeading___Toc3927_1989417878" w:tooltip="12.1 Validate">
+          <w:hyperlink w:anchor="__RefHeading___Toc3931_1542888776" w:tooltip="12.1 Validate">
             <w:r>
               <w:rPr>
                 <w:rStyle w:val="IndexLink"/>
@@ -1081,7 +1081,7 @@
             </w:tabs>
             <w:rPr/>
           </w:pPr>
-          <w:hyperlink w:anchor="__RefHeading___Toc3929_1989417878" w:tooltip="12.2 Run">
+          <w:hyperlink w:anchor="__RefHeading___Toc3933_1542888776" w:tooltip="12.2 Run">
             <w:r>
               <w:rPr>
                 <w:rStyle w:val="IndexLink"/>
@@ -1102,7 +1102,7 @@
             </w:tabs>
             <w:rPr/>
           </w:pPr>
-          <w:hyperlink w:anchor="__RefHeading___Toc3931_1989417878" w:tooltip="13 Deploying">
+          <w:hyperlink w:anchor="__RefHeading___Toc3935_1542888776" w:tooltip="13 Deploying">
             <w:r>
               <w:rPr>
                 <w:rStyle w:val="IndexLink"/>
@@ -1123,7 +1123,7 @@
             </w:tabs>
             <w:rPr/>
           </w:pPr>
-          <w:hyperlink w:anchor="__RefHeading___Toc3933_1989417878" w:tooltip="13.1 Publish">
+          <w:hyperlink w:anchor="__RefHeading___Toc3937_1542888776" w:tooltip="13.1 Publish">
             <w:r>
               <w:rPr>
                 <w:rStyle w:val="IndexLink"/>
@@ -1131,7 +1131,7 @@
               </w:rPr>
               <w:t>13.1 Publish</w:t>
               <w:tab/>
-              <w:t>50</w:t>
+              <w:t>51</w:t>
             </w:r>
           </w:hyperlink>
         </w:p>
@@ -1144,7 +1144,7 @@
             </w:tabs>
             <w:rPr/>
           </w:pPr>
-          <w:hyperlink w:anchor="__RefHeading___Toc3935_1989417878" w:tooltip="13.2 Append HMI Desktop">
+          <w:hyperlink w:anchor="__RefHeading___Toc3939_1542888776" w:tooltip="13.2 Append HMI Desktop">
             <w:r>
               <w:rPr>
                 <w:rStyle w:val="IndexLink"/>
@@ -1152,7 +1152,7 @@
               </w:rPr>
               <w:t>13.2 Append HMI Desktop</w:t>
               <w:tab/>
-              <w:t>51</w:t>
+              <w:t>52</w:t>
             </w:r>
           </w:hyperlink>
         </w:p>
@@ -1165,7 +1165,7 @@
             </w:tabs>
             <w:rPr/>
           </w:pPr>
-          <w:hyperlink w:anchor="__RefHeading___Toc3937_1989417878" w:tooltip="13.3 Append HMI Web">
+          <w:hyperlink w:anchor="__RefHeading___Toc3941_1542888776" w:tooltip="13.3 Append HMI Web">
             <w:r>
               <w:rPr>
                 <w:rStyle w:val="IndexLink"/>
@@ -1186,7 +1186,7 @@
             </w:tabs>
             <w:rPr/>
           </w:pPr>
-          <w:hyperlink w:anchor="__RefHeading___Toc3939_1989417878" w:tooltip="14 Tips and troubleshooting">
+          <w:hyperlink w:anchor="__RefHeading___Toc3943_1542888776" w:tooltip="14 Tips and troubleshooting">
             <w:r>
               <w:rPr>
                 <w:rStyle w:val="IndexLink"/>
@@ -1207,7 +1207,7 @@
             </w:tabs>
             <w:rPr/>
           </w:pPr>
-          <w:hyperlink w:anchor="__RefHeading___Toc3941_1989417878" w:tooltip="Appendix A Command-line automation">
+          <w:hyperlink w:anchor="__RefHeading___Toc3945_1542888776" w:tooltip="Appendix A Command-line automation">
             <w:r>
               <w:rPr>
                 <w:rStyle w:val="IndexLink"/>
@@ -1245,7 +1245,7 @@
         <w:spacing w:before="0" w:after="0"/>
         <w:rPr/>
       </w:pPr>
-      <w:bookmarkStart w:id="0" w:name="__RefHeading___Toc3853_1989417878"/>
+      <w:bookmarkStart w:id="0" w:name="__RefHeading___Toc3857_1542888776"/>
       <w:bookmarkEnd w:id="0"/>
       <w:r>
         <w:rPr/>
@@ -1926,7 +1926,7 @@
                 <w:szCs w:val="22"/>
                 <w:lang w:val="en-US" w:eastAsia="en-US" w:bidi="ar-SA"/>
               </w:rPr>
-              <w:t>Window scripts that turn the sequence step number into text, and action scripts that call the login, recipe, indirect tag, ShowWindow and ScreenToPDF functions</w:t>
+              <w:t>Window scripts that turn the sequence step number into text, and action scripts that call the login, recipe, indirect tag, ShowWindow and ScreenToPDF functions (a PRINT SCREEN button on every screen)</w:t>
             </w:r>
           </w:p>
         </w:tc>
@@ -1946,7 +1946,7 @@
         <w:pStyle w:val="Heading2"/>
         <w:rPr/>
       </w:pPr>
-      <w:bookmarkStart w:id="1" w:name="__RefHeading___Toc3855_1989417878"/>
+      <w:bookmarkStart w:id="1" w:name="__RefHeading___Toc3859_1542888776"/>
       <w:bookmarkEnd w:id="1"/>
       <w:r>
         <w:rPr/>
@@ -2089,7 +2089,7 @@
         <w:pStyle w:val="Heading1"/>
         <w:rPr/>
       </w:pPr>
-      <w:bookmarkStart w:id="2" w:name="__RefHeading___Toc3857_1989417878"/>
+      <w:bookmarkStart w:id="2" w:name="__RefHeading___Toc3861_1542888776"/>
       <w:bookmarkEnd w:id="2"/>
       <w:r>
         <w:rPr/>
@@ -2667,7 +2667,7 @@
         <w:pStyle w:val="Heading2"/>
         <w:rPr/>
       </w:pPr>
-      <w:bookmarkStart w:id="3" w:name="__RefHeading___Toc3859_1989417878"/>
+      <w:bookmarkStart w:id="3" w:name="__RefHeading___Toc3863_1542888776"/>
       <w:bookmarkEnd w:id="3"/>
       <w:r>
         <w:rPr/>
@@ -3707,7 +3707,7 @@
         <w:pStyle w:val="Heading1"/>
         <w:rPr/>
       </w:pPr>
-      <w:bookmarkStart w:id="4" w:name="__RefHeading___Toc3861_1989417878"/>
+      <w:bookmarkStart w:id="4" w:name="__RefHeading___Toc3865_1542888776"/>
       <w:bookmarkEnd w:id="4"/>
       <w:r>
         <w:rPr/>
@@ -3992,7 +3992,7 @@
         <w:pStyle w:val="Heading1"/>
         <w:rPr/>
       </w:pPr>
-      <w:bookmarkStart w:id="5" w:name="__RefHeading___Toc3863_1989417878"/>
+      <w:bookmarkStart w:id="5" w:name="__RefHeading___Toc3867_1542888776"/>
       <w:bookmarkEnd w:id="5"/>
       <w:r>
         <w:rPr/>
@@ -4787,7 +4787,7 @@
         <w:pStyle w:val="Heading1"/>
         <w:rPr/>
       </w:pPr>
-      <w:bookmarkStart w:id="6" w:name="__RefHeading___Toc3865_1989417878"/>
+      <w:bookmarkStart w:id="6" w:name="__RefHeading___Toc3869_1542888776"/>
       <w:bookmarkEnd w:id="6"/>
       <w:r>
         <w:rPr/>
@@ -5618,7 +5618,7 @@
         <w:pStyle w:val="Heading2"/>
         <w:rPr/>
       </w:pPr>
-      <w:bookmarkStart w:id="7" w:name="__RefHeading___Toc3867_1989417878"/>
+      <w:bookmarkStart w:id="7" w:name="__RefHeading___Toc3871_1542888776"/>
       <w:bookmarkEnd w:id="7"/>
       <w:r>
         <w:rPr/>
@@ -6271,7 +6271,7 @@
         <w:pStyle w:val="Heading2"/>
         <w:rPr/>
       </w:pPr>
-      <w:bookmarkStart w:id="8" w:name="__RefHeading___Toc3869_1989417878"/>
+      <w:bookmarkStart w:id="8" w:name="__RefHeading___Toc3873_1542888776"/>
       <w:bookmarkEnd w:id="8"/>
       <w:r>
         <w:rPr/>
@@ -6406,7 +6406,7 @@
         <w:pStyle w:val="Heading1"/>
         <w:rPr/>
       </w:pPr>
-      <w:bookmarkStart w:id="9" w:name="__RefHeading___Toc3871_1989417878"/>
+      <w:bookmarkStart w:id="9" w:name="__RefHeading___Toc3875_1542888776"/>
       <w:bookmarkEnd w:id="9"/>
       <w:r>
         <w:rPr/>
@@ -6919,7 +6919,7 @@
         <w:pStyle w:val="Heading2"/>
         <w:rPr/>
       </w:pPr>
-      <w:bookmarkStart w:id="10" w:name="__RefHeading___Toc3873_1989417878"/>
+      <w:bookmarkStart w:id="10" w:name="__RefHeading___Toc3877_1542888776"/>
       <w:bookmarkEnd w:id="10"/>
       <w:r>
         <w:rPr/>
@@ -7081,7 +7081,7 @@
         <w:pStyle w:val="Heading2"/>
         <w:rPr/>
       </w:pPr>
-      <w:bookmarkStart w:id="11" w:name="__RefHeading___Toc3875_1989417878"/>
+      <w:bookmarkStart w:id="11" w:name="__RefHeading___Toc3879_1542888776"/>
       <w:bookmarkEnd w:id="11"/>
       <w:r>
         <w:rPr/>
@@ -7137,7 +7137,7 @@
         <w:pStyle w:val="Heading1"/>
         <w:rPr/>
       </w:pPr>
-      <w:bookmarkStart w:id="12" w:name="__RefHeading___Toc3877_1989417878"/>
+      <w:bookmarkStart w:id="12" w:name="__RefHeading___Toc3881_1542888776"/>
       <w:bookmarkEnd w:id="12"/>
       <w:r>
         <w:rPr/>
@@ -7893,7 +7893,7 @@
         <w:pStyle w:val="Heading1"/>
         <w:rPr/>
       </w:pPr>
-      <w:bookmarkStart w:id="13" w:name="__RefHeading___Toc3879_1989417878"/>
+      <w:bookmarkStart w:id="13" w:name="__RefHeading___Toc3883_1542888776"/>
       <w:bookmarkEnd w:id="13"/>
       <w:r>
         <w:rPr/>
@@ -8618,7 +8618,7 @@
         <w:pStyle w:val="Heading2"/>
         <w:rPr/>
       </w:pPr>
-      <w:bookmarkStart w:id="14" w:name="__RefHeading___Toc3881_1989417878"/>
+      <w:bookmarkStart w:id="14" w:name="__RefHeading___Toc3885_1542888776"/>
       <w:bookmarkEnd w:id="14"/>
       <w:r>
         <w:rPr/>
@@ -8804,7 +8804,7 @@
         <w:pStyle w:val="Heading2"/>
         <w:rPr/>
       </w:pPr>
-      <w:bookmarkStart w:id="15" w:name="__RefHeading___Toc3883_1989417878"/>
+      <w:bookmarkStart w:id="15" w:name="__RefHeading___Toc3887_1542888776"/>
       <w:bookmarkEnd w:id="15"/>
       <w:r>
         <w:rPr/>
@@ -8928,7 +8928,7 @@
         <w:pStyle w:val="Heading2"/>
         <w:rPr/>
       </w:pPr>
-      <w:bookmarkStart w:id="16" w:name="__RefHeading___Toc3885_1989417878"/>
+      <w:bookmarkStart w:id="16" w:name="__RefHeading___Toc3889_1542888776"/>
       <w:bookmarkEnd w:id="16"/>
       <w:r>
         <w:rPr/>
@@ -9044,7 +9044,7 @@
         <w:pStyle w:val="Heading2"/>
         <w:rPr/>
       </w:pPr>
-      <w:bookmarkStart w:id="17" w:name="__RefHeading___Toc3887_1989417878"/>
+      <w:bookmarkStart w:id="17" w:name="__RefHeading___Toc3891_1542888776"/>
       <w:bookmarkEnd w:id="17"/>
       <w:r>
         <w:rPr/>
@@ -9160,7 +9160,7 @@
         <w:pStyle w:val="Heading2"/>
         <w:rPr/>
       </w:pPr>
-      <w:bookmarkStart w:id="18" w:name="__RefHeading___Toc3889_1989417878"/>
+      <w:bookmarkStart w:id="18" w:name="__RefHeading___Toc3893_1542888776"/>
       <w:bookmarkEnd w:id="18"/>
       <w:r>
         <w:rPr/>
@@ -9672,7 +9672,7 @@
         <w:pStyle w:val="Heading1"/>
         <w:rPr/>
       </w:pPr>
-      <w:bookmarkStart w:id="19" w:name="__RefHeading___Toc3891_1989417878"/>
+      <w:bookmarkStart w:id="19" w:name="__RefHeading___Toc3895_1542888776"/>
       <w:bookmarkEnd w:id="19"/>
       <w:r>
         <w:rPr/>
@@ -10574,7 +10574,7 @@
         <w:pStyle w:val="Heading2"/>
         <w:rPr/>
       </w:pPr>
-      <w:bookmarkStart w:id="20" w:name="__RefHeading___Toc3893_1989417878"/>
+      <w:bookmarkStart w:id="20" w:name="__RefHeading___Toc3897_1542888776"/>
       <w:bookmarkEnd w:id="20"/>
       <w:r>
         <w:rPr/>
@@ -10758,7 +10758,7 @@
         <w:pStyle w:val="Heading2"/>
         <w:rPr/>
       </w:pPr>
-      <w:bookmarkStart w:id="21" w:name="__RefHeading___Toc3895_1989417878"/>
+      <w:bookmarkStart w:id="21" w:name="__RefHeading___Toc3899_1542888776"/>
       <w:bookmarkEnd w:id="21"/>
       <w:r>
         <w:rPr/>
@@ -10877,7 +10877,7 @@
         <w:pStyle w:val="Heading2"/>
         <w:rPr/>
       </w:pPr>
-      <w:bookmarkStart w:id="22" w:name="__RefHeading___Toc3897_1989417878"/>
+      <w:bookmarkStart w:id="22" w:name="__RefHeading___Toc3901_1542888776"/>
       <w:bookmarkEnd w:id="22"/>
       <w:r>
         <w:rPr/>
@@ -14663,7 +14663,7 @@
         <w:pStyle w:val="Heading2"/>
         <w:rPr/>
       </w:pPr>
-      <w:bookmarkStart w:id="23" w:name="__RefHeading___Toc3899_1989417878"/>
+      <w:bookmarkStart w:id="23" w:name="__RefHeading___Toc3903_1542888776"/>
       <w:bookmarkEnd w:id="23"/>
       <w:r>
         <w:rPr/>
@@ -15499,7 +15499,7 @@
         <w:pStyle w:val="Heading2"/>
         <w:rPr/>
       </w:pPr>
-      <w:bookmarkStart w:id="24" w:name="__RefHeading___Toc3901_1989417878"/>
+      <w:bookmarkStart w:id="24" w:name="__RefHeading___Toc3905_1542888776"/>
       <w:bookmarkEnd w:id="24"/>
       <w:r>
         <w:rPr/>
@@ -15976,7 +15976,7 @@
         <w:pStyle w:val="Heading2"/>
         <w:rPr/>
       </w:pPr>
-      <w:bookmarkStart w:id="25" w:name="__RefHeading___Toc3903_1989417878"/>
+      <w:bookmarkStart w:id="25" w:name="__RefHeading___Toc3907_1542888776"/>
       <w:bookmarkEnd w:id="25"/>
       <w:r>
         <w:rPr/>
@@ -16003,7 +16003,7 @@
         <w:rPr>
           <w:b/>
         </w:rPr>
-        <w:t>SAVE PDF</w:t>
+        <w:t>PRINT SCREEN</w:t>
       </w:r>
       <w:r>
         <w:rPr/>
@@ -16168,7 +16168,7 @@
         <w:pStyle w:val="Heading1"/>
         <w:rPr/>
       </w:pPr>
-      <w:bookmarkStart w:id="26" w:name="__RefHeading___Toc3905_1989417878"/>
+      <w:bookmarkStart w:id="26" w:name="__RefHeading___Toc3909_1542888776"/>
       <w:bookmarkEnd w:id="26"/>
       <w:r>
         <w:rPr/>
@@ -16183,7 +16183,7 @@
         <w:pStyle w:val="Heading2"/>
         <w:rPr/>
       </w:pPr>
-      <w:bookmarkStart w:id="27" w:name="__RefHeading___Toc3907_1989417878"/>
+      <w:bookmarkStart w:id="27" w:name="__RefHeading___Toc3911_1542888776"/>
       <w:bookmarkEnd w:id="27"/>
       <w:r>
         <w:rPr/>
@@ -16313,7 +16313,7 @@
         <w:pStyle w:val="Heading2"/>
         <w:rPr/>
       </w:pPr>
-      <w:bookmarkStart w:id="28" w:name="__RefHeading___Toc3909_1989417878"/>
+      <w:bookmarkStart w:id="28" w:name="__RefHeading___Toc3913_1542888776"/>
       <w:bookmarkEnd w:id="28"/>
       <w:r>
         <w:rPr/>
@@ -17003,7 +17003,7 @@
         <w:pStyle w:val="Heading1"/>
         <w:rPr/>
       </w:pPr>
-      <w:bookmarkStart w:id="29" w:name="__RefHeading___Toc3911_1989417878"/>
+      <w:bookmarkStart w:id="29" w:name="__RefHeading___Toc3915_1542888776"/>
       <w:bookmarkEnd w:id="29"/>
       <w:r>
         <w:rPr/>
@@ -17142,7 +17142,7 @@
         <w:pStyle w:val="Heading2"/>
         <w:rPr/>
       </w:pPr>
-      <w:bookmarkStart w:id="30" w:name="__RefHeading___Toc3913_1989417878"/>
+      <w:bookmarkStart w:id="30" w:name="__RefHeading___Toc3917_1542888776"/>
       <w:bookmarkEnd w:id="30"/>
       <w:r>
         <w:rPr/>
@@ -19003,7 +19003,7 @@
         <w:pStyle w:val="Heading2"/>
         <w:rPr/>
       </w:pPr>
-      <w:bookmarkStart w:id="31" w:name="__RefHeading___Toc3915_1989417878"/>
+      <w:bookmarkStart w:id="31" w:name="__RefHeading___Toc3919_1542888776"/>
       <w:bookmarkEnd w:id="31"/>
       <w:r>
         <w:rPr/>
@@ -20453,7 +20453,7 @@
         <w:pStyle w:val="Heading2"/>
         <w:rPr/>
       </w:pPr>
-      <w:bookmarkStart w:id="32" w:name="__RefHeading___Toc3917_1989417878"/>
+      <w:bookmarkStart w:id="32" w:name="__RefHeading___Toc3921_1542888776"/>
       <w:bookmarkEnd w:id="32"/>
       <w:r>
         <w:rPr/>
@@ -20994,7 +20994,7 @@
         <w:pStyle w:val="Heading2"/>
         <w:rPr/>
       </w:pPr>
-      <w:bookmarkStart w:id="33" w:name="__RefHeading___Toc3919_1989417878"/>
+      <w:bookmarkStart w:id="33" w:name="__RefHeading___Toc3923_1542888776"/>
       <w:bookmarkEnd w:id="33"/>
       <w:r>
         <w:rPr/>
@@ -21279,7 +21279,7 @@
         <w:pStyle w:val="Heading2"/>
         <w:rPr/>
       </w:pPr>
-      <w:bookmarkStart w:id="34" w:name="__RefHeading___Toc3921_1989417878"/>
+      <w:bookmarkStart w:id="34" w:name="__RefHeading___Toc3925_1542888776"/>
       <w:bookmarkEnd w:id="34"/>
       <w:r>
         <w:rPr/>
@@ -21437,7 +21437,7 @@
         <w:pStyle w:val="Heading2"/>
         <w:rPr/>
       </w:pPr>
-      <w:bookmarkStart w:id="35" w:name="__RefHeading___Toc3923_1989417878"/>
+      <w:bookmarkStart w:id="35" w:name="__RefHeading___Toc3927_1542888776"/>
       <w:bookmarkEnd w:id="35"/>
       <w:r>
         <w:rPr/>
@@ -21837,7 +21837,7 @@
         <w:pStyle w:val="Heading1"/>
         <w:rPr/>
       </w:pPr>
-      <w:bookmarkStart w:id="36" w:name="__RefHeading___Toc3925_1989417878"/>
+      <w:bookmarkStart w:id="36" w:name="__RefHeading___Toc3929_1542888776"/>
       <w:bookmarkEnd w:id="36"/>
       <w:r>
         <w:rPr/>
@@ -21849,7 +21849,7 @@
         <w:pStyle w:val="Heading2"/>
         <w:rPr/>
       </w:pPr>
-      <w:bookmarkStart w:id="37" w:name="__RefHeading___Toc3927_1989417878"/>
+      <w:bookmarkStart w:id="37" w:name="__RefHeading___Toc3931_1542888776"/>
       <w:bookmarkEnd w:id="37"/>
       <w:r>
         <w:rPr/>
@@ -21937,7 +21937,7 @@
         <w:pStyle w:val="Heading2"/>
         <w:rPr/>
       </w:pPr>
-      <w:bookmarkStart w:id="38" w:name="__RefHeading___Toc3929_1989417878"/>
+      <w:bookmarkStart w:id="38" w:name="__RefHeading___Toc3933_1542888776"/>
       <w:bookmarkEnd w:id="38"/>
       <w:r>
         <w:rPr/>
@@ -22037,7 +22037,27 @@
       </w:pPr>
       <w:r>
         <w:rPr/>
-        <w:t>The screens below were captured while LiquidWeighHMI ran against its controller, between batches.</w:t>
+        <w:t xml:space="preserve">The screens below were captured while LiquidWeighHMI ran against its controller, between batches. Every screen has the same header: the system name, the screen title, </w:t>
+      </w:r>
+      <w:r>
+        <w:rPr>
+          <w:b/>
+        </w:rPr>
+        <w:t>PRINT SCREEN</w:t>
+      </w:r>
+      <w:r>
+        <w:rPr/>
+        <w:t xml:space="preserve"> (saves the screen as a PDF, section 9.6), the PLC and simulation status, E-STOP, the sequence state, the number of active alarms, and the user with </w:t>
+      </w:r>
+      <w:r>
+        <w:rPr>
+          <w:b/>
+        </w:rPr>
+        <w:t>LOGIN</w:t>
+      </w:r>
+      <w:r>
+        <w:rPr/>
+        <w:t>.</w:t>
       </w:r>
     </w:p>
     <w:p>
@@ -22483,7 +22503,7 @@
         <w:pStyle w:val="Heading1"/>
         <w:rPr/>
       </w:pPr>
-      <w:bookmarkStart w:id="39" w:name="__RefHeading___Toc3931_1989417878"/>
+      <w:bookmarkStart w:id="39" w:name="__RefHeading___Toc3935_1542888776"/>
       <w:bookmarkEnd w:id="39"/>
       <w:r>
         <w:rPr/>
@@ -22930,13 +22950,16 @@
       <w:r>
         <w:rPr/>
       </w:r>
+      <w:r>
+        <w:br w:type="page"/>
+      </w:r>
     </w:p>
     <w:p>
       <w:pPr>
         <w:pStyle w:val="Heading2"/>
         <w:rPr/>
       </w:pPr>
-      <w:bookmarkStart w:id="40" w:name="__RefHeading___Toc3933_1989417878"/>
+      <w:bookmarkStart w:id="40" w:name="__RefHeading___Toc3937_1542888776"/>
       <w:bookmarkEnd w:id="40"/>
       <w:r>
         <w:rPr/>
@@ -23018,13 +23041,16 @@
         <w:rPr/>
         <w:t>Figure 42. The Publish dialog</w:t>
       </w:r>
+      <w:r>
+        <w:br w:type="page"/>
+      </w:r>
     </w:p>
     <w:p>
       <w:pPr>
         <w:pStyle w:val="Heading2"/>
         <w:rPr/>
       </w:pPr>
-      <w:bookmarkStart w:id="41" w:name="__RefHeading___Toc3935_1989417878"/>
+      <w:bookmarkStart w:id="41" w:name="__RefHeading___Toc3939_1542888776"/>
       <w:bookmarkEnd w:id="41"/>
       <w:r>
         <w:rPr/>
@@ -23137,7 +23163,7 @@
         <w:pStyle w:val="Heading2"/>
         <w:rPr/>
       </w:pPr>
-      <w:bookmarkStart w:id="42" w:name="__RefHeading___Toc3937_1989417878"/>
+      <w:bookmarkStart w:id="42" w:name="__RefHeading___Toc3941_1542888776"/>
       <w:bookmarkEnd w:id="42"/>
       <w:r>
         <w:rPr/>
@@ -23350,7 +23376,7 @@
         <w:pStyle w:val="Heading1"/>
         <w:rPr/>
       </w:pPr>
-      <w:bookmarkStart w:id="43" w:name="__RefHeading___Toc3939_1989417878"/>
+      <w:bookmarkStart w:id="43" w:name="__RefHeading___Toc3943_1542888776"/>
       <w:bookmarkEnd w:id="43"/>
       <w:r>
         <w:rPr/>
@@ -24010,7 +24036,7 @@
         <w:pStyle w:val="Heading1"/>
         <w:rPr/>
       </w:pPr>
-      <w:bookmarkStart w:id="44" w:name="__RefHeading___Toc3941_1989417878"/>
+      <w:bookmarkStart w:id="44" w:name="__RefHeading___Toc3945_1542888776"/>
       <w:bookmarkEnd w:id="44"/>
       <w:r>
         <w:rPr/>

</xml_diff>

<commit_message>
docs: manual rebuilt without chapter 10's heading alone on a page
Co-Authored-By: Claude Opus 5.5 <noreply@anthropic.com>
</commit_message>
<xml_diff>
--- a/doc/Append-HMI-Studio-User-Manual.docx
+++ b/doc/Append-HMI-Studio-User-Manual.docx
@@ -283,7 +283,7 @@
             </w:rPr>
             <w:fldChar w:fldCharType="separate"/>
           </w:r>
-          <w:hyperlink w:anchor="__RefHeading___Toc3857_1542888776" w:tooltip="1 Introduction">
+          <w:hyperlink w:anchor="__RefHeading___Toc3857_2503968041" w:tooltip="1 Introduction">
             <w:r>
               <w:rPr>
                 <w:rStyle w:val="IndexLink"/>
@@ -304,7 +304,7 @@
             </w:tabs>
             <w:rPr/>
           </w:pPr>
-          <w:hyperlink w:anchor="__RefHeading___Toc3859_1542888776" w:tooltip="1.1 How an HMI application is organized">
+          <w:hyperlink w:anchor="__RefHeading___Toc3859_2503968041" w:tooltip="1.1 How an HMI application is organized">
             <w:r>
               <w:rPr>
                 <w:rStyle w:val="IndexLink"/>
@@ -325,7 +325,7 @@
             </w:tabs>
             <w:rPr/>
           </w:pPr>
-          <w:hyperlink w:anchor="__RefHeading___Toc3861_1542888776" w:tooltip="2 The Studio window">
+          <w:hyperlink w:anchor="__RefHeading___Toc3861_2503968041" w:tooltip="2 The Studio window">
             <w:r>
               <w:rPr>
                 <w:rStyle w:val="IndexLink"/>
@@ -346,7 +346,7 @@
             </w:tabs>
             <w:rPr/>
           </w:pPr>
-          <w:hyperlink w:anchor="__RefHeading___Toc3863_1542888776" w:tooltip="2.1 The HMI menu">
+          <w:hyperlink w:anchor="__RefHeading___Toc3863_2503968041" w:tooltip="2.1 The HMI menu">
             <w:r>
               <w:rPr>
                 <w:rStyle w:val="IndexLink"/>
@@ -367,7 +367,7 @@
             </w:tabs>
             <w:rPr/>
           </w:pPr>
-          <w:hyperlink w:anchor="__RefHeading___Toc3865_1542888776" w:tooltip="3 Application settings">
+          <w:hyperlink w:anchor="__RefHeading___Toc3865_2503968041" w:tooltip="3 Application settings">
             <w:r>
               <w:rPr>
                 <w:rStyle w:val="IndexLink"/>
@@ -388,7 +388,7 @@
             </w:tabs>
             <w:rPr/>
           </w:pPr>
-          <w:hyperlink w:anchor="__RefHeading___Toc3867_1542888776" w:tooltip="4 Devices">
+          <w:hyperlink w:anchor="__RefHeading___Toc3867_2503968041" w:tooltip="4 Devices">
             <w:r>
               <w:rPr>
                 <w:rStyle w:val="IndexLink"/>
@@ -409,7 +409,7 @@
             </w:tabs>
             <w:rPr/>
           </w:pPr>
-          <w:hyperlink w:anchor="__RefHeading___Toc3869_1542888776" w:tooltip="5 Tags">
+          <w:hyperlink w:anchor="__RefHeading___Toc3869_2503968041" w:tooltip="5 Tags">
             <w:r>
               <w:rPr>
                 <w:rStyle w:val="IndexLink"/>
@@ -430,7 +430,7 @@
             </w:tabs>
             <w:rPr/>
           </w:pPr>
-          <w:hyperlink w:anchor="__RefHeading___Toc3871_1542888776" w:tooltip="5.1 Tag fields">
+          <w:hyperlink w:anchor="__RefHeading___Toc3871_2503968041" w:tooltip="5.1 Tag fields">
             <w:r>
               <w:rPr>
                 <w:rStyle w:val="IndexLink"/>
@@ -451,7 +451,7 @@
             </w:tabs>
             <w:rPr/>
           </w:pPr>
-          <w:hyperlink w:anchor="__RefHeading___Toc3873_1542888776" w:tooltip="5.2 Alarms on a tag">
+          <w:hyperlink w:anchor="__RefHeading___Toc3873_2503968041" w:tooltip="5.2 Alarms on a tag">
             <w:r>
               <w:rPr>
                 <w:rStyle w:val="IndexLink"/>
@@ -472,7 +472,7 @@
             </w:tabs>
             <w:rPr/>
           </w:pPr>
-          <w:hyperlink w:anchor="__RefHeading___Toc3875_1542888776" w:tooltip="6 Screens and windows">
+          <w:hyperlink w:anchor="__RefHeading___Toc3875_2503968041" w:tooltip="6 Screens and windows">
             <w:r>
               <w:rPr>
                 <w:rStyle w:val="IndexLink"/>
@@ -493,7 +493,7 @@
             </w:tabs>
             <w:rPr/>
           </w:pPr>
-          <w:hyperlink w:anchor="__RefHeading___Toc3877_1542888776" w:tooltip="6.1 Window properties">
+          <w:hyperlink w:anchor="__RefHeading___Toc3877_2503968041" w:tooltip="6.1 Window properties">
             <w:r>
               <w:rPr>
                 <w:rStyle w:val="IndexLink"/>
@@ -514,7 +514,7 @@
             </w:tabs>
             <w:rPr/>
           </w:pPr>
-          <w:hyperlink w:anchor="__RefHeading___Toc3879_1542888776" w:tooltip="6.2 Navigation">
+          <w:hyperlink w:anchor="__RefHeading___Toc3879_2503968041" w:tooltip="6.2 Navigation">
             <w:r>
               <w:rPr>
                 <w:rStyle w:val="IndexLink"/>
@@ -535,7 +535,7 @@
             </w:tabs>
             <w:rPr/>
           </w:pPr>
-          <w:hyperlink w:anchor="__RefHeading___Toc3881_1542888776" w:tooltip="7 Drawing objects">
+          <w:hyperlink w:anchor="__RefHeading___Toc3881_2503968041" w:tooltip="7 Drawing objects">
             <w:r>
               <w:rPr>
                 <w:rStyle w:val="IndexLink"/>
@@ -556,7 +556,7 @@
             </w:tabs>
             <w:rPr/>
           </w:pPr>
-          <w:hyperlink w:anchor="__RefHeading___Toc3883_1542888776" w:tooltip="8 Animation links">
+          <w:hyperlink w:anchor="__RefHeading___Toc3883_2503968041" w:tooltip="8 Animation links">
             <w:r>
               <w:rPr>
                 <w:rStyle w:val="IndexLink"/>
@@ -577,7 +577,7 @@
             </w:tabs>
             <w:rPr/>
           </w:pPr>
-          <w:hyperlink w:anchor="__RefHeading___Toc3885_1542888776" w:tooltip="8.1 A valve: status color, fault blink and faceplate">
+          <w:hyperlink w:anchor="__RefHeading___Toc3885_2503968041" w:tooltip="8.1 A valve: status color, fault blink and faceplate">
             <w:r>
               <w:rPr>
                 <w:rStyle w:val="IndexLink"/>
@@ -598,7 +598,7 @@
             </w:tabs>
             <w:rPr/>
           </w:pPr>
-          <w:hyperlink w:anchor="__RefHeading___Toc3887_1542888776" w:tooltip="8.2 The weigh hopper: percent fill">
+          <w:hyperlink w:anchor="__RefHeading___Toc3887_2503968041" w:tooltip="8.2 The weigh hopper: percent fill">
             <w:r>
               <w:rPr>
                 <w:rStyle w:val="IndexLink"/>
@@ -619,7 +619,7 @@
             </w:tabs>
             <w:rPr/>
           </w:pPr>
-          <w:hyperlink w:anchor="__RefHeading___Toc3889_1542888776" w:tooltip="8.3 Hopper pressure: value display and alarm colors">
+          <w:hyperlink w:anchor="__RefHeading___Toc3889_2503968041" w:tooltip="8.3 Hopper pressure: value display and alarm colors">
             <w:r>
               <w:rPr>
                 <w:rStyle w:val="IndexLink"/>
@@ -640,7 +640,7 @@
             </w:tabs>
             <w:rPr/>
           </w:pPr>
-          <w:hyperlink w:anchor="__RefHeading___Toc3891_1542888776" w:tooltip="8.4 Setpoints: user input">
+          <w:hyperlink w:anchor="__RefHeading___Toc3891_2503968041" w:tooltip="8.4 Setpoints: user input">
             <w:r>
               <w:rPr>
                 <w:rStyle w:val="IndexLink"/>
@@ -661,7 +661,7 @@
             </w:tabs>
             <w:rPr/>
           </w:pPr>
-          <w:hyperlink w:anchor="__RefHeading___Toc3893_1542888776" w:tooltip="8.5 Commands: pushbutton and enable">
+          <w:hyperlink w:anchor="__RefHeading___Toc3893_2503968041" w:tooltip="8.5 Commands: pushbutton and enable">
             <w:r>
               <w:rPr>
                 <w:rStyle w:val="IndexLink"/>
@@ -682,7 +682,7 @@
             </w:tabs>
             <w:rPr/>
           </w:pPr>
-          <w:hyperlink w:anchor="__RefHeading___Toc3895_1542888776" w:tooltip="9 Expressions and scripts">
+          <w:hyperlink w:anchor="__RefHeading___Toc3895_2503968041" w:tooltip="9 Expressions and scripts">
             <w:r>
               <w:rPr>
                 <w:rStyle w:val="IndexLink"/>
@@ -703,7 +703,7 @@
             </w:tabs>
             <w:rPr/>
           </w:pPr>
-          <w:hyperlink w:anchor="__RefHeading___Toc3897_1542888776" w:tooltip="9.1 Window scripts">
+          <w:hyperlink w:anchor="__RefHeading___Toc3897_2503968041" w:tooltip="9.1 Window scripts">
             <w:r>
               <w:rPr>
                 <w:rStyle w:val="IndexLink"/>
@@ -724,7 +724,7 @@
             </w:tabs>
             <w:rPr/>
           </w:pPr>
-          <w:hyperlink w:anchor="__RefHeading___Toc3899_1542888776" w:tooltip="9.2 Action scripts">
+          <w:hyperlink w:anchor="__RefHeading___Toc3899_2503968041" w:tooltip="9.2 Action scripts">
             <w:r>
               <w:rPr>
                 <w:rStyle w:val="IndexLink"/>
@@ -745,7 +745,7 @@
             </w:tabs>
             <w:rPr/>
           </w:pPr>
-          <w:hyperlink w:anchor="__RefHeading___Toc3901_1542888776" w:tooltip="9.3 Function reference">
+          <w:hyperlink w:anchor="__RefHeading___Toc3901_2503968041" w:tooltip="9.3 Function reference">
             <w:r>
               <w:rPr>
                 <w:rStyle w:val="IndexLink"/>
@@ -766,7 +766,7 @@
             </w:tabs>
             <w:rPr/>
           </w:pPr>
-          <w:hyperlink w:anchor="__RefHeading___Toc3903_1542888776" w:tooltip="9.4 Indirect tags: one faceplate for every device">
+          <w:hyperlink w:anchor="__RefHeading___Toc3903_2503968041" w:tooltip="9.4 Indirect tags: one faceplate for every device">
             <w:r>
               <w:rPr>
                 <w:rStyle w:val="IndexLink"/>
@@ -787,7 +787,7 @@
             </w:tabs>
             <w:rPr/>
           </w:pPr>
-          <w:hyperlink w:anchor="__RefHeading___Toc3905_1542888776" w:tooltip="9.5 Opening windows from scripts: ShowWindow">
+          <w:hyperlink w:anchor="__RefHeading___Toc3905_2503968041" w:tooltip="9.5 Opening windows from scripts: ShowWindow">
             <w:r>
               <w:rPr>
                 <w:rStyle w:val="IndexLink"/>
@@ -808,7 +808,7 @@
             </w:tabs>
             <w:rPr/>
           </w:pPr>
-          <w:hyperlink w:anchor="__RefHeading___Toc3907_1542888776" w:tooltip="9.6 Saving the screen as a PDF: ScreenToPDF">
+          <w:hyperlink w:anchor="__RefHeading___Toc3907_2503968041" w:tooltip="9.6 Saving the screen as a PDF: ScreenToPDF">
             <w:r>
               <w:rPr>
                 <w:rStyle w:val="IndexLink"/>
@@ -829,7 +829,7 @@
             </w:tabs>
             <w:rPr/>
           </w:pPr>
-          <w:hyperlink w:anchor="__RefHeading___Toc3909_1542888776" w:tooltip="10 Alarms and security">
+          <w:hyperlink w:anchor="__RefHeading___Toc3909_2503968041" w:tooltip="10 Alarms and security">
             <w:r>
               <w:rPr>
                 <w:rStyle w:val="IndexLink"/>
@@ -850,7 +850,7 @@
             </w:tabs>
             <w:rPr/>
           </w:pPr>
-          <w:hyperlink w:anchor="__RefHeading___Toc3911_1542888776" w:tooltip="10.1 Alarms">
+          <w:hyperlink w:anchor="__RefHeading___Toc3911_2503968041" w:tooltip="10.1 Alarms">
             <w:r>
               <w:rPr>
                 <w:rStyle w:val="IndexLink"/>
@@ -858,7 +858,7 @@
               </w:rPr>
               <w:t>10.1 Alarms</w:t>
               <w:tab/>
-              <w:t>36</w:t>
+              <w:t>35</w:t>
             </w:r>
           </w:hyperlink>
         </w:p>
@@ -871,7 +871,7 @@
             </w:tabs>
             <w:rPr/>
           </w:pPr>
-          <w:hyperlink w:anchor="__RefHeading___Toc3913_1542888776" w:tooltip="10.2 Users and access levels">
+          <w:hyperlink w:anchor="__RefHeading___Toc3913_2503968041" w:tooltip="10.2 Users and access levels">
             <w:r>
               <w:rPr>
                 <w:rStyle w:val="IndexLink"/>
@@ -879,7 +879,7 @@
               </w:rPr>
               <w:t>10.2 Users and access levels</w:t>
               <w:tab/>
-              <w:t>36</w:t>
+              <w:t>35</w:t>
             </w:r>
           </w:hyperlink>
         </w:p>
@@ -892,7 +892,7 @@
             </w:tabs>
             <w:rPr/>
           </w:pPr>
-          <w:hyperlink w:anchor="__RefHeading___Toc3915_1542888776" w:tooltip="11 Recipes">
+          <w:hyperlink w:anchor="__RefHeading___Toc3915_2503968041" w:tooltip="11 Recipes">
             <w:r>
               <w:rPr>
                 <w:rStyle w:val="IndexLink"/>
@@ -900,7 +900,7 @@
               </w:rPr>
               <w:t>11 Recipes</w:t>
               <w:tab/>
-              <w:t>37</w:t>
+              <w:t>36</w:t>
             </w:r>
           </w:hyperlink>
         </w:p>
@@ -913,7 +913,7 @@
             </w:tabs>
             <w:rPr/>
           </w:pPr>
-          <w:hyperlink w:anchor="__RefHeading___Toc3917_1542888776" w:tooltip="11.1 Recipe books">
+          <w:hyperlink w:anchor="__RefHeading___Toc3917_2503968041" w:tooltip="11.1 Recipe books">
             <w:r>
               <w:rPr>
                 <w:rStyle w:val="IndexLink"/>
@@ -921,7 +921,7 @@
               </w:rPr>
               <w:t>11.1 Recipe books</w:t>
               <w:tab/>
-              <w:t>38</w:t>
+              <w:t>37</w:t>
             </w:r>
           </w:hyperlink>
         </w:p>
@@ -934,7 +934,7 @@
             </w:tabs>
             <w:rPr/>
           </w:pPr>
-          <w:hyperlink w:anchor="__RefHeading___Toc3919_1542888776" w:tooltip="11.2 The Recipes screen">
+          <w:hyperlink w:anchor="__RefHeading___Toc3919_2503968041" w:tooltip="11.2 The Recipes screen">
             <w:r>
               <w:rPr>
                 <w:rStyle w:val="IndexLink"/>
@@ -942,7 +942,7 @@
               </w:rPr>
               <w:t>11.2 The Recipes screen</w:t>
               <w:tab/>
-              <w:t>40</w:t>
+              <w:t>39</w:t>
             </w:r>
           </w:hyperlink>
         </w:p>
@@ -955,7 +955,7 @@
             </w:tabs>
             <w:rPr/>
           </w:pPr>
-          <w:hyperlink w:anchor="__RefHeading___Toc3921_1542888776" w:tooltip="11.3 The Recipe List object">
+          <w:hyperlink w:anchor="__RefHeading___Toc3921_2503968041" w:tooltip="11.3 The Recipe List object">
             <w:r>
               <w:rPr>
                 <w:rStyle w:val="IndexLink"/>
@@ -963,7 +963,7 @@
               </w:rPr>
               <w:t>11.3 The Recipe List object</w:t>
               <w:tab/>
-              <w:t>42</w:t>
+              <w:t>41</w:t>
             </w:r>
           </w:hyperlink>
         </w:p>
@@ -976,7 +976,7 @@
             </w:tabs>
             <w:rPr/>
           </w:pPr>
-          <w:hyperlink w:anchor="__RefHeading___Toc3923_1542888776" w:tooltip="11.4 Selecting a recipe in a window">
+          <w:hyperlink w:anchor="__RefHeading___Toc3923_2503968041" w:tooltip="11.4 Selecting a recipe in a window">
             <w:r>
               <w:rPr>
                 <w:rStyle w:val="IndexLink"/>
@@ -984,7 +984,7 @@
               </w:rPr>
               <w:t>11.4 Selecting a recipe in a window</w:t>
               <w:tab/>
-              <w:t>43</w:t>
+              <w:t>42</w:t>
             </w:r>
           </w:hyperlink>
         </w:p>
@@ -997,7 +997,7 @@
             </w:tabs>
             <w:rPr/>
           </w:pPr>
-          <w:hyperlink w:anchor="__RefHeading___Toc3925_1542888776" w:tooltip="11.5 When a recipe function fails">
+          <w:hyperlink w:anchor="__RefHeading___Toc3925_2503968041" w:tooltip="11.5 When a recipe function fails">
             <w:r>
               <w:rPr>
                 <w:rStyle w:val="IndexLink"/>
@@ -1005,7 +1005,7 @@
               </w:rPr>
               <w:t>11.5 When a recipe function fails</w:t>
               <w:tab/>
-              <w:t>44</w:t>
+              <w:t>43</w:t>
             </w:r>
           </w:hyperlink>
         </w:p>
@@ -1018,7 +1018,7 @@
             </w:tabs>
             <w:rPr/>
           </w:pPr>
-          <w:hyperlink w:anchor="__RefHeading___Toc3927_1542888776" w:tooltip="11.6 Where recipes are kept">
+          <w:hyperlink w:anchor="__RefHeading___Toc3927_2503968041" w:tooltip="11.6 Where recipes are kept">
             <w:r>
               <w:rPr>
                 <w:rStyle w:val="IndexLink"/>
@@ -1026,7 +1026,7 @@
               </w:rPr>
               <w:t>11.6 Where recipes are kept</w:t>
               <w:tab/>
-              <w:t>44</w:t>
+              <w:t>43</w:t>
             </w:r>
           </w:hyperlink>
         </w:p>
@@ -1039,7 +1039,7 @@
             </w:tabs>
             <w:rPr/>
           </w:pPr>
-          <w:hyperlink w:anchor="__RefHeading___Toc3929_1542888776" w:tooltip="12 Testing">
+          <w:hyperlink w:anchor="__RefHeading___Toc3929_2503968041" w:tooltip="12 Testing">
             <w:r>
               <w:rPr>
                 <w:rStyle w:val="IndexLink"/>
@@ -1047,7 +1047,7 @@
               </w:rPr>
               <w:t>12 Testing</w:t>
               <w:tab/>
-              <w:t>45</w:t>
+              <w:t>44</w:t>
             </w:r>
           </w:hyperlink>
         </w:p>
@@ -1060,7 +1060,7 @@
             </w:tabs>
             <w:rPr/>
           </w:pPr>
-          <w:hyperlink w:anchor="__RefHeading___Toc3931_1542888776" w:tooltip="12.1 Validate">
+          <w:hyperlink w:anchor="__RefHeading___Toc3931_2503968041" w:tooltip="12.1 Validate">
             <w:r>
               <w:rPr>
                 <w:rStyle w:val="IndexLink"/>
@@ -1068,7 +1068,7 @@
               </w:rPr>
               <w:t>12.1 Validate</w:t>
               <w:tab/>
-              <w:t>45</w:t>
+              <w:t>44</w:t>
             </w:r>
           </w:hyperlink>
         </w:p>
@@ -1081,7 +1081,7 @@
             </w:tabs>
             <w:rPr/>
           </w:pPr>
-          <w:hyperlink w:anchor="__RefHeading___Toc3933_1542888776" w:tooltip="12.2 Run">
+          <w:hyperlink w:anchor="__RefHeading___Toc3933_2503968041" w:tooltip="12.2 Run">
             <w:r>
               <w:rPr>
                 <w:rStyle w:val="IndexLink"/>
@@ -1089,7 +1089,7 @@
               </w:rPr>
               <w:t>12.2 Run</w:t>
               <w:tab/>
-              <w:t>45</w:t>
+              <w:t>44</w:t>
             </w:r>
           </w:hyperlink>
         </w:p>
@@ -1102,7 +1102,7 @@
             </w:tabs>
             <w:rPr/>
           </w:pPr>
-          <w:hyperlink w:anchor="__RefHeading___Toc3935_1542888776" w:tooltip="13 Deploying">
+          <w:hyperlink w:anchor="__RefHeading___Toc3935_2503968041" w:tooltip="13 Deploying">
             <w:r>
               <w:rPr>
                 <w:rStyle w:val="IndexLink"/>
@@ -1110,7 +1110,7 @@
               </w:rPr>
               <w:t>13 Deploying</w:t>
               <w:tab/>
-              <w:t>50</w:t>
+              <w:t>49</w:t>
             </w:r>
           </w:hyperlink>
         </w:p>
@@ -1123,7 +1123,7 @@
             </w:tabs>
             <w:rPr/>
           </w:pPr>
-          <w:hyperlink w:anchor="__RefHeading___Toc3937_1542888776" w:tooltip="13.1 Publish">
+          <w:hyperlink w:anchor="__RefHeading___Toc3937_2503968041" w:tooltip="13.1 Publish">
             <w:r>
               <w:rPr>
                 <w:rStyle w:val="IndexLink"/>
@@ -1131,7 +1131,7 @@
               </w:rPr>
               <w:t>13.1 Publish</w:t>
               <w:tab/>
-              <w:t>51</w:t>
+              <w:t>50</w:t>
             </w:r>
           </w:hyperlink>
         </w:p>
@@ -1144,7 +1144,7 @@
             </w:tabs>
             <w:rPr/>
           </w:pPr>
-          <w:hyperlink w:anchor="__RefHeading___Toc3939_1542888776" w:tooltip="13.2 Append HMI Desktop">
+          <w:hyperlink w:anchor="__RefHeading___Toc3939_2503968041" w:tooltip="13.2 Append HMI Desktop">
             <w:r>
               <w:rPr>
                 <w:rStyle w:val="IndexLink"/>
@@ -1152,7 +1152,7 @@
               </w:rPr>
               <w:t>13.2 Append HMI Desktop</w:t>
               <w:tab/>
-              <w:t>52</w:t>
+              <w:t>51</w:t>
             </w:r>
           </w:hyperlink>
         </w:p>
@@ -1165,7 +1165,7 @@
             </w:tabs>
             <w:rPr/>
           </w:pPr>
-          <w:hyperlink w:anchor="__RefHeading___Toc3941_1542888776" w:tooltip="13.3 Append HMI Web">
+          <w:hyperlink w:anchor="__RefHeading___Toc3941_2503968041" w:tooltip="13.3 Append HMI Web">
             <w:r>
               <w:rPr>
                 <w:rStyle w:val="IndexLink"/>
@@ -1173,7 +1173,7 @@
               </w:rPr>
               <w:t>13.3 Append HMI Web</w:t>
               <w:tab/>
-              <w:t>52</w:t>
+              <w:t>51</w:t>
             </w:r>
           </w:hyperlink>
         </w:p>
@@ -1186,7 +1186,7 @@
             </w:tabs>
             <w:rPr/>
           </w:pPr>
-          <w:hyperlink w:anchor="__RefHeading___Toc3943_1542888776" w:tooltip="14 Tips and troubleshooting">
+          <w:hyperlink w:anchor="__RefHeading___Toc3943_2503968041" w:tooltip="14 Tips and troubleshooting">
             <w:r>
               <w:rPr>
                 <w:rStyle w:val="IndexLink"/>
@@ -1194,7 +1194,7 @@
               </w:rPr>
               <w:t>14 Tips and troubleshooting</w:t>
               <w:tab/>
-              <w:t>54</w:t>
+              <w:t>53</w:t>
             </w:r>
           </w:hyperlink>
         </w:p>
@@ -1207,7 +1207,7 @@
             </w:tabs>
             <w:rPr/>
           </w:pPr>
-          <w:hyperlink w:anchor="__RefHeading___Toc3945_1542888776" w:tooltip="Appendix A Command-line automation">
+          <w:hyperlink w:anchor="__RefHeading___Toc3945_2503968041" w:tooltip="Appendix A Command-line automation">
             <w:r>
               <w:rPr>
                 <w:rStyle w:val="IndexLink"/>
@@ -1215,7 +1215,7 @@
               </w:rPr>
               <w:t>Appendix A Command-line automation</w:t>
               <w:tab/>
-              <w:t>55</w:t>
+              <w:t>54</w:t>
             </w:r>
           </w:hyperlink>
           <w:r>
@@ -1245,7 +1245,7 @@
         <w:spacing w:before="0" w:after="0"/>
         <w:rPr/>
       </w:pPr>
-      <w:bookmarkStart w:id="0" w:name="__RefHeading___Toc3857_1542888776"/>
+      <w:bookmarkStart w:id="0" w:name="__RefHeading___Toc3857_2503968041"/>
       <w:bookmarkEnd w:id="0"/>
       <w:r>
         <w:rPr/>
@@ -1946,7 +1946,7 @@
         <w:pStyle w:val="Heading2"/>
         <w:rPr/>
       </w:pPr>
-      <w:bookmarkStart w:id="1" w:name="__RefHeading___Toc3859_1542888776"/>
+      <w:bookmarkStart w:id="1" w:name="__RefHeading___Toc3859_2503968041"/>
       <w:bookmarkEnd w:id="1"/>
       <w:r>
         <w:rPr/>
@@ -2089,7 +2089,7 @@
         <w:pStyle w:val="Heading1"/>
         <w:rPr/>
       </w:pPr>
-      <w:bookmarkStart w:id="2" w:name="__RefHeading___Toc3861_1542888776"/>
+      <w:bookmarkStart w:id="2" w:name="__RefHeading___Toc3861_2503968041"/>
       <w:bookmarkEnd w:id="2"/>
       <w:r>
         <w:rPr/>
@@ -2667,7 +2667,7 @@
         <w:pStyle w:val="Heading2"/>
         <w:rPr/>
       </w:pPr>
-      <w:bookmarkStart w:id="3" w:name="__RefHeading___Toc3863_1542888776"/>
+      <w:bookmarkStart w:id="3" w:name="__RefHeading___Toc3863_2503968041"/>
       <w:bookmarkEnd w:id="3"/>
       <w:r>
         <w:rPr/>
@@ -3707,7 +3707,7 @@
         <w:pStyle w:val="Heading1"/>
         <w:rPr/>
       </w:pPr>
-      <w:bookmarkStart w:id="4" w:name="__RefHeading___Toc3865_1542888776"/>
+      <w:bookmarkStart w:id="4" w:name="__RefHeading___Toc3865_2503968041"/>
       <w:bookmarkEnd w:id="4"/>
       <w:r>
         <w:rPr/>
@@ -3992,7 +3992,7 @@
         <w:pStyle w:val="Heading1"/>
         <w:rPr/>
       </w:pPr>
-      <w:bookmarkStart w:id="5" w:name="__RefHeading___Toc3867_1542888776"/>
+      <w:bookmarkStart w:id="5" w:name="__RefHeading___Toc3867_2503968041"/>
       <w:bookmarkEnd w:id="5"/>
       <w:r>
         <w:rPr/>
@@ -4787,7 +4787,7 @@
         <w:pStyle w:val="Heading1"/>
         <w:rPr/>
       </w:pPr>
-      <w:bookmarkStart w:id="6" w:name="__RefHeading___Toc3869_1542888776"/>
+      <w:bookmarkStart w:id="6" w:name="__RefHeading___Toc3869_2503968041"/>
       <w:bookmarkEnd w:id="6"/>
       <w:r>
         <w:rPr/>
@@ -5618,7 +5618,7 @@
         <w:pStyle w:val="Heading2"/>
         <w:rPr/>
       </w:pPr>
-      <w:bookmarkStart w:id="7" w:name="__RefHeading___Toc3871_1542888776"/>
+      <w:bookmarkStart w:id="7" w:name="__RefHeading___Toc3871_2503968041"/>
       <w:bookmarkEnd w:id="7"/>
       <w:r>
         <w:rPr/>
@@ -6271,7 +6271,7 @@
         <w:pStyle w:val="Heading2"/>
         <w:rPr/>
       </w:pPr>
-      <w:bookmarkStart w:id="8" w:name="__RefHeading___Toc3873_1542888776"/>
+      <w:bookmarkStart w:id="8" w:name="__RefHeading___Toc3873_2503968041"/>
       <w:bookmarkEnd w:id="8"/>
       <w:r>
         <w:rPr/>
@@ -6406,7 +6406,7 @@
         <w:pStyle w:val="Heading1"/>
         <w:rPr/>
       </w:pPr>
-      <w:bookmarkStart w:id="9" w:name="__RefHeading___Toc3875_1542888776"/>
+      <w:bookmarkStart w:id="9" w:name="__RefHeading___Toc3875_2503968041"/>
       <w:bookmarkEnd w:id="9"/>
       <w:r>
         <w:rPr/>
@@ -6919,7 +6919,7 @@
         <w:pStyle w:val="Heading2"/>
         <w:rPr/>
       </w:pPr>
-      <w:bookmarkStart w:id="10" w:name="__RefHeading___Toc3877_1542888776"/>
+      <w:bookmarkStart w:id="10" w:name="__RefHeading___Toc3877_2503968041"/>
       <w:bookmarkEnd w:id="10"/>
       <w:r>
         <w:rPr/>
@@ -7081,7 +7081,7 @@
         <w:pStyle w:val="Heading2"/>
         <w:rPr/>
       </w:pPr>
-      <w:bookmarkStart w:id="11" w:name="__RefHeading___Toc3879_1542888776"/>
+      <w:bookmarkStart w:id="11" w:name="__RefHeading___Toc3879_2503968041"/>
       <w:bookmarkEnd w:id="11"/>
       <w:r>
         <w:rPr/>
@@ -7137,7 +7137,7 @@
         <w:pStyle w:val="Heading1"/>
         <w:rPr/>
       </w:pPr>
-      <w:bookmarkStart w:id="12" w:name="__RefHeading___Toc3881_1542888776"/>
+      <w:bookmarkStart w:id="12" w:name="__RefHeading___Toc3881_2503968041"/>
       <w:bookmarkEnd w:id="12"/>
       <w:r>
         <w:rPr/>
@@ -7893,7 +7893,7 @@
         <w:pStyle w:val="Heading1"/>
         <w:rPr/>
       </w:pPr>
-      <w:bookmarkStart w:id="13" w:name="__RefHeading___Toc3883_1542888776"/>
+      <w:bookmarkStart w:id="13" w:name="__RefHeading___Toc3883_2503968041"/>
       <w:bookmarkEnd w:id="13"/>
       <w:r>
         <w:rPr/>
@@ -8618,7 +8618,7 @@
         <w:pStyle w:val="Heading2"/>
         <w:rPr/>
       </w:pPr>
-      <w:bookmarkStart w:id="14" w:name="__RefHeading___Toc3885_1542888776"/>
+      <w:bookmarkStart w:id="14" w:name="__RefHeading___Toc3885_2503968041"/>
       <w:bookmarkEnd w:id="14"/>
       <w:r>
         <w:rPr/>
@@ -8804,7 +8804,7 @@
         <w:pStyle w:val="Heading2"/>
         <w:rPr/>
       </w:pPr>
-      <w:bookmarkStart w:id="15" w:name="__RefHeading___Toc3887_1542888776"/>
+      <w:bookmarkStart w:id="15" w:name="__RefHeading___Toc3887_2503968041"/>
       <w:bookmarkEnd w:id="15"/>
       <w:r>
         <w:rPr/>
@@ -8928,7 +8928,7 @@
         <w:pStyle w:val="Heading2"/>
         <w:rPr/>
       </w:pPr>
-      <w:bookmarkStart w:id="16" w:name="__RefHeading___Toc3889_1542888776"/>
+      <w:bookmarkStart w:id="16" w:name="__RefHeading___Toc3889_2503968041"/>
       <w:bookmarkEnd w:id="16"/>
       <w:r>
         <w:rPr/>
@@ -9044,7 +9044,7 @@
         <w:pStyle w:val="Heading2"/>
         <w:rPr/>
       </w:pPr>
-      <w:bookmarkStart w:id="17" w:name="__RefHeading___Toc3891_1542888776"/>
+      <w:bookmarkStart w:id="17" w:name="__RefHeading___Toc3891_2503968041"/>
       <w:bookmarkEnd w:id="17"/>
       <w:r>
         <w:rPr/>
@@ -9160,7 +9160,7 @@
         <w:pStyle w:val="Heading2"/>
         <w:rPr/>
       </w:pPr>
-      <w:bookmarkStart w:id="18" w:name="__RefHeading___Toc3893_1542888776"/>
+      <w:bookmarkStart w:id="18" w:name="__RefHeading___Toc3893_2503968041"/>
       <w:bookmarkEnd w:id="18"/>
       <w:r>
         <w:rPr/>
@@ -9672,7 +9672,7 @@
         <w:pStyle w:val="Heading1"/>
         <w:rPr/>
       </w:pPr>
-      <w:bookmarkStart w:id="19" w:name="__RefHeading___Toc3895_1542888776"/>
+      <w:bookmarkStart w:id="19" w:name="__RefHeading___Toc3895_2503968041"/>
       <w:bookmarkEnd w:id="19"/>
       <w:r>
         <w:rPr/>
@@ -10574,7 +10574,7 @@
         <w:pStyle w:val="Heading2"/>
         <w:rPr/>
       </w:pPr>
-      <w:bookmarkStart w:id="20" w:name="__RefHeading___Toc3897_1542888776"/>
+      <w:bookmarkStart w:id="20" w:name="__RefHeading___Toc3897_2503968041"/>
       <w:bookmarkEnd w:id="20"/>
       <w:r>
         <w:rPr/>
@@ -10758,7 +10758,7 @@
         <w:pStyle w:val="Heading2"/>
         <w:rPr/>
       </w:pPr>
-      <w:bookmarkStart w:id="21" w:name="__RefHeading___Toc3899_1542888776"/>
+      <w:bookmarkStart w:id="21" w:name="__RefHeading___Toc3899_2503968041"/>
       <w:bookmarkEnd w:id="21"/>
       <w:r>
         <w:rPr/>
@@ -10877,7 +10877,7 @@
         <w:pStyle w:val="Heading2"/>
         <w:rPr/>
       </w:pPr>
-      <w:bookmarkStart w:id="22" w:name="__RefHeading___Toc3901_1542888776"/>
+      <w:bookmarkStart w:id="22" w:name="__RefHeading___Toc3901_2503968041"/>
       <w:bookmarkEnd w:id="22"/>
       <w:r>
         <w:rPr/>
@@ -14663,7 +14663,7 @@
         <w:pStyle w:val="Heading2"/>
         <w:rPr/>
       </w:pPr>
-      <w:bookmarkStart w:id="23" w:name="__RefHeading___Toc3903_1542888776"/>
+      <w:bookmarkStart w:id="23" w:name="__RefHeading___Toc3903_2503968041"/>
       <w:bookmarkEnd w:id="23"/>
       <w:r>
         <w:rPr/>
@@ -15499,7 +15499,7 @@
         <w:pStyle w:val="Heading2"/>
         <w:rPr/>
       </w:pPr>
-      <w:bookmarkStart w:id="24" w:name="__RefHeading___Toc3905_1542888776"/>
+      <w:bookmarkStart w:id="24" w:name="__RefHeading___Toc3905_2503968041"/>
       <w:bookmarkEnd w:id="24"/>
       <w:r>
         <w:rPr/>
@@ -15976,7 +15976,7 @@
         <w:pStyle w:val="Heading2"/>
         <w:rPr/>
       </w:pPr>
-      <w:bookmarkStart w:id="25" w:name="__RefHeading___Toc3907_1542888776"/>
+      <w:bookmarkStart w:id="25" w:name="__RefHeading___Toc3907_2503968041"/>
       <w:bookmarkEnd w:id="25"/>
       <w:r>
         <w:rPr/>
@@ -16168,22 +16168,19 @@
         <w:pStyle w:val="Heading1"/>
         <w:rPr/>
       </w:pPr>
-      <w:bookmarkStart w:id="26" w:name="__RefHeading___Toc3909_1542888776"/>
+      <w:bookmarkStart w:id="26" w:name="__RefHeading___Toc3909_2503968041"/>
       <w:bookmarkEnd w:id="26"/>
       <w:r>
         <w:rPr/>
         <w:t>10  Alarms and security</w:t>
       </w:r>
-      <w:r>
-        <w:br w:type="page"/>
-      </w:r>
     </w:p>
     <w:p>
       <w:pPr>
         <w:pStyle w:val="Heading2"/>
         <w:rPr/>
       </w:pPr>
-      <w:bookmarkStart w:id="27" w:name="__RefHeading___Toc3911_1542888776"/>
+      <w:bookmarkStart w:id="27" w:name="__RefHeading___Toc3911_2503968041"/>
       <w:bookmarkEnd w:id="27"/>
       <w:r>
         <w:rPr/>
@@ -16313,7 +16310,7 @@
         <w:pStyle w:val="Heading2"/>
         <w:rPr/>
       </w:pPr>
-      <w:bookmarkStart w:id="28" w:name="__RefHeading___Toc3913_1542888776"/>
+      <w:bookmarkStart w:id="28" w:name="__RefHeading___Toc3913_2503968041"/>
       <w:bookmarkEnd w:id="28"/>
       <w:r>
         <w:rPr/>
@@ -17003,7 +17000,7 @@
         <w:pStyle w:val="Heading1"/>
         <w:rPr/>
       </w:pPr>
-      <w:bookmarkStart w:id="29" w:name="__RefHeading___Toc3915_1542888776"/>
+      <w:bookmarkStart w:id="29" w:name="__RefHeading___Toc3915_2503968041"/>
       <w:bookmarkEnd w:id="29"/>
       <w:r>
         <w:rPr/>
@@ -17142,7 +17139,7 @@
         <w:pStyle w:val="Heading2"/>
         <w:rPr/>
       </w:pPr>
-      <w:bookmarkStart w:id="30" w:name="__RefHeading___Toc3917_1542888776"/>
+      <w:bookmarkStart w:id="30" w:name="__RefHeading___Toc3917_2503968041"/>
       <w:bookmarkEnd w:id="30"/>
       <w:r>
         <w:rPr/>
@@ -19003,7 +19000,7 @@
         <w:pStyle w:val="Heading2"/>
         <w:rPr/>
       </w:pPr>
-      <w:bookmarkStart w:id="31" w:name="__RefHeading___Toc3919_1542888776"/>
+      <w:bookmarkStart w:id="31" w:name="__RefHeading___Toc3919_2503968041"/>
       <w:bookmarkEnd w:id="31"/>
       <w:r>
         <w:rPr/>
@@ -20453,7 +20450,7 @@
         <w:pStyle w:val="Heading2"/>
         <w:rPr/>
       </w:pPr>
-      <w:bookmarkStart w:id="32" w:name="__RefHeading___Toc3921_1542888776"/>
+      <w:bookmarkStart w:id="32" w:name="__RefHeading___Toc3921_2503968041"/>
       <w:bookmarkEnd w:id="32"/>
       <w:r>
         <w:rPr/>
@@ -20994,7 +20991,7 @@
         <w:pStyle w:val="Heading2"/>
         <w:rPr/>
       </w:pPr>
-      <w:bookmarkStart w:id="33" w:name="__RefHeading___Toc3923_1542888776"/>
+      <w:bookmarkStart w:id="33" w:name="__RefHeading___Toc3923_2503968041"/>
       <w:bookmarkEnd w:id="33"/>
       <w:r>
         <w:rPr/>
@@ -21279,7 +21276,7 @@
         <w:pStyle w:val="Heading2"/>
         <w:rPr/>
       </w:pPr>
-      <w:bookmarkStart w:id="34" w:name="__RefHeading___Toc3925_1542888776"/>
+      <w:bookmarkStart w:id="34" w:name="__RefHeading___Toc3925_2503968041"/>
       <w:bookmarkEnd w:id="34"/>
       <w:r>
         <w:rPr/>
@@ -21437,7 +21434,7 @@
         <w:pStyle w:val="Heading2"/>
         <w:rPr/>
       </w:pPr>
-      <w:bookmarkStart w:id="35" w:name="__RefHeading___Toc3927_1542888776"/>
+      <w:bookmarkStart w:id="35" w:name="__RefHeading___Toc3927_2503968041"/>
       <w:bookmarkEnd w:id="35"/>
       <w:r>
         <w:rPr/>
@@ -21837,7 +21834,7 @@
         <w:pStyle w:val="Heading1"/>
         <w:rPr/>
       </w:pPr>
-      <w:bookmarkStart w:id="36" w:name="__RefHeading___Toc3929_1542888776"/>
+      <w:bookmarkStart w:id="36" w:name="__RefHeading___Toc3929_2503968041"/>
       <w:bookmarkEnd w:id="36"/>
       <w:r>
         <w:rPr/>
@@ -21849,7 +21846,7 @@
         <w:pStyle w:val="Heading2"/>
         <w:rPr/>
       </w:pPr>
-      <w:bookmarkStart w:id="37" w:name="__RefHeading___Toc3931_1542888776"/>
+      <w:bookmarkStart w:id="37" w:name="__RefHeading___Toc3931_2503968041"/>
       <w:bookmarkEnd w:id="37"/>
       <w:r>
         <w:rPr/>
@@ -21937,7 +21934,7 @@
         <w:pStyle w:val="Heading2"/>
         <w:rPr/>
       </w:pPr>
-      <w:bookmarkStart w:id="38" w:name="__RefHeading___Toc3933_1542888776"/>
+      <w:bookmarkStart w:id="38" w:name="__RefHeading___Toc3933_2503968041"/>
       <w:bookmarkEnd w:id="38"/>
       <w:r>
         <w:rPr/>
@@ -22503,7 +22500,7 @@
         <w:pStyle w:val="Heading1"/>
         <w:rPr/>
       </w:pPr>
-      <w:bookmarkStart w:id="39" w:name="__RefHeading___Toc3935_1542888776"/>
+      <w:bookmarkStart w:id="39" w:name="__RefHeading___Toc3935_2503968041"/>
       <w:bookmarkEnd w:id="39"/>
       <w:r>
         <w:rPr/>
@@ -22959,7 +22956,7 @@
         <w:pStyle w:val="Heading2"/>
         <w:rPr/>
       </w:pPr>
-      <w:bookmarkStart w:id="40" w:name="__RefHeading___Toc3937_1542888776"/>
+      <w:bookmarkStart w:id="40" w:name="__RefHeading___Toc3937_2503968041"/>
       <w:bookmarkEnd w:id="40"/>
       <w:r>
         <w:rPr/>
@@ -23050,7 +23047,7 @@
         <w:pStyle w:val="Heading2"/>
         <w:rPr/>
       </w:pPr>
-      <w:bookmarkStart w:id="41" w:name="__RefHeading___Toc3939_1542888776"/>
+      <w:bookmarkStart w:id="41" w:name="__RefHeading___Toc3939_2503968041"/>
       <w:bookmarkEnd w:id="41"/>
       <w:r>
         <w:rPr/>
@@ -23163,7 +23160,7 @@
         <w:pStyle w:val="Heading2"/>
         <w:rPr/>
       </w:pPr>
-      <w:bookmarkStart w:id="42" w:name="__RefHeading___Toc3941_1542888776"/>
+      <w:bookmarkStart w:id="42" w:name="__RefHeading___Toc3941_2503968041"/>
       <w:bookmarkEnd w:id="42"/>
       <w:r>
         <w:rPr/>
@@ -23376,7 +23373,7 @@
         <w:pStyle w:val="Heading1"/>
         <w:rPr/>
       </w:pPr>
-      <w:bookmarkStart w:id="43" w:name="__RefHeading___Toc3943_1542888776"/>
+      <w:bookmarkStart w:id="43" w:name="__RefHeading___Toc3943_2503968041"/>
       <w:bookmarkEnd w:id="43"/>
       <w:r>
         <w:rPr/>
@@ -24036,7 +24033,7 @@
         <w:pStyle w:val="Heading1"/>
         <w:rPr/>
       </w:pPr>
-      <w:bookmarkStart w:id="44" w:name="__RefHeading___Toc3945_1542888776"/>
+      <w:bookmarkStart w:id="44" w:name="__RefHeading___Toc3945_2503968041"/>
       <w:bookmarkEnd w:id="44"/>
       <w:r>
         <w:rPr/>
@@ -24574,7 +24571,7 @@
       <w:rPr>
         <w:sz w:val="18"/>
       </w:rPr>
-      <w:t>55</w:t>
+      <w:t>54</w:t>
     </w:r>
     <w:r>
       <w:rPr>

</xml_diff>

<commit_message>
docs: building HMI applications with AI agents, in the README and the manual
LiquidWeighHMI was written from scratch by an AI agent from the control
narrative, I/O list and electrical drawings, after it wrote the PLC
program; manual section 1.1 and the README describe the agent workflow and
the documentation written for agents.

Co-Authored-By: Claude Opus 5.5 <noreply@anthropic.com>
</commit_message>
<xml_diff>
--- a/doc/Append-HMI-Studio-User-Manual.docx
+++ b/doc/Append-HMI-Studio-User-Manual.docx
@@ -221,7 +221,7 @@
         <w:rPr>
           <w:sz w:val="22"/>
         </w:rPr>
-        <w:t>Version 1.2  ·  October 2026</w:t>
+        <w:t>Version 1.4  ·  October 2026</w:t>
         <w:br/>
         <w:t>Append Automation</w:t>
       </w:r>
@@ -283,7 +283,7 @@
             </w:rPr>
             <w:fldChar w:fldCharType="separate"/>
           </w:r>
-          <w:hyperlink w:anchor="__RefHeading___Toc4010_4006729438" w:tooltip="1 Introduction">
+          <w:hyperlink w:anchor="__RefHeading___Toc4243_2449894927" w:tooltip="1 Introduction">
             <w:r>
               <w:rPr>
                 <w:rStyle w:val="IndexLink"/>
@@ -304,15 +304,36 @@
             </w:tabs>
             <w:rPr/>
           </w:pPr>
-          <w:hyperlink w:anchor="__RefHeading___Toc4012_4006729438" w:tooltip="1.1 How an HMI application is organized">
+          <w:hyperlink w:anchor="__RefHeading___Toc4245_2449894927" w:tooltip="1.1 Building applications with an AI agent">
             <w:r>
               <w:rPr>
                 <w:rStyle w:val="IndexLink"/>
                 <w:webHidden/>
               </w:rPr>
-              <w:t>1.1 How an HMI application is organized</w:t>
+              <w:t>1.1 Building applications with an AI agent</w:t>
               <w:tab/>
-              <w:t>4</w:t>
+              <w:t>5</w:t>
+            </w:r>
+          </w:hyperlink>
+        </w:p>
+        <w:p>
+          <w:pPr>
+            <w:pStyle w:val="TOC2"/>
+            <w:tabs>
+              <w:tab w:val="clear" w:pos="9077"/>
+              <w:tab w:val="right" w:pos="9359" w:leader="dot"/>
+            </w:tabs>
+            <w:rPr/>
+          </w:pPr>
+          <w:hyperlink w:anchor="__RefHeading___Toc4247_2449894927" w:tooltip="1.2 How an HMI application is organized">
+            <w:r>
+              <w:rPr>
+                <w:rStyle w:val="IndexLink"/>
+                <w:webHidden/>
+              </w:rPr>
+              <w:t>1.2 How an HMI application is organized</w:t>
+              <w:tab/>
+              <w:t>6</w:t>
             </w:r>
           </w:hyperlink>
         </w:p>
@@ -325,7 +346,7 @@
             </w:tabs>
             <w:rPr/>
           </w:pPr>
-          <w:hyperlink w:anchor="__RefHeading___Toc4014_4006729438" w:tooltip="2 The Studio window">
+          <w:hyperlink w:anchor="__RefHeading___Toc4249_2449894927" w:tooltip="2 The Studio window">
             <w:r>
               <w:rPr>
                 <w:rStyle w:val="IndexLink"/>
@@ -333,7 +354,7 @@
               </w:rPr>
               <w:t>2 The Studio window</w:t>
               <w:tab/>
-              <w:t>5</w:t>
+              <w:t>7</w:t>
             </w:r>
           </w:hyperlink>
         </w:p>
@@ -346,7 +367,7 @@
             </w:tabs>
             <w:rPr/>
           </w:pPr>
-          <w:hyperlink w:anchor="__RefHeading___Toc4016_4006729438" w:tooltip="2.1 The HMI menu">
+          <w:hyperlink w:anchor="__RefHeading___Toc4251_2449894927" w:tooltip="2.1 The HMI menu">
             <w:r>
               <w:rPr>
                 <w:rStyle w:val="IndexLink"/>
@@ -354,7 +375,7 @@
               </w:rPr>
               <w:t>2.1 The HMI menu</w:t>
               <w:tab/>
-              <w:t>6</w:t>
+              <w:t>8</w:t>
             </w:r>
           </w:hyperlink>
         </w:p>
@@ -367,7 +388,7 @@
             </w:tabs>
             <w:rPr/>
           </w:pPr>
-          <w:hyperlink w:anchor="__RefHeading___Toc4018_4006729438" w:tooltip="3 Application settings">
+          <w:hyperlink w:anchor="__RefHeading___Toc4253_2449894927" w:tooltip="3 Application settings">
             <w:r>
               <w:rPr>
                 <w:rStyle w:val="IndexLink"/>
@@ -375,7 +396,7 @@
               </w:rPr>
               <w:t>3 Application settings</w:t>
               <w:tab/>
-              <w:t>7</w:t>
+              <w:t>9</w:t>
             </w:r>
           </w:hyperlink>
         </w:p>
@@ -388,7 +409,7 @@
             </w:tabs>
             <w:rPr/>
           </w:pPr>
-          <w:hyperlink w:anchor="__RefHeading___Toc4020_4006729438" w:tooltip="4 Devices">
+          <w:hyperlink w:anchor="__RefHeading___Toc4255_2449894927" w:tooltip="4 Devices">
             <w:r>
               <w:rPr>
                 <w:rStyle w:val="IndexLink"/>
@@ -396,7 +417,7 @@
               </w:rPr>
               <w:t>4 Devices</w:t>
               <w:tab/>
-              <w:t>9</w:t>
+              <w:t>11</w:t>
             </w:r>
           </w:hyperlink>
         </w:p>
@@ -409,7 +430,7 @@
             </w:tabs>
             <w:rPr/>
           </w:pPr>
-          <w:hyperlink w:anchor="__RefHeading___Toc4022_4006729438" w:tooltip="5 Tags">
+          <w:hyperlink w:anchor="__RefHeading___Toc4257_2449894927" w:tooltip="5 Tags">
             <w:r>
               <w:rPr>
                 <w:rStyle w:val="IndexLink"/>
@@ -417,7 +438,7 @@
               </w:rPr>
               <w:t>5 Tags</w:t>
               <w:tab/>
-              <w:t>10</w:t>
+              <w:t>12</w:t>
             </w:r>
           </w:hyperlink>
         </w:p>
@@ -430,7 +451,7 @@
             </w:tabs>
             <w:rPr/>
           </w:pPr>
-          <w:hyperlink w:anchor="__RefHeading___Toc4024_4006729438" w:tooltip="5.1 Tag fields">
+          <w:hyperlink w:anchor="__RefHeading___Toc4259_2449894927" w:tooltip="5.1 Tag fields">
             <w:r>
               <w:rPr>
                 <w:rStyle w:val="IndexLink"/>
@@ -438,7 +459,7 @@
               </w:rPr>
               <w:t>5.1 Tag fields</w:t>
               <w:tab/>
-              <w:t>11</w:t>
+              <w:t>13</w:t>
             </w:r>
           </w:hyperlink>
         </w:p>
@@ -451,7 +472,7 @@
             </w:tabs>
             <w:rPr/>
           </w:pPr>
-          <w:hyperlink w:anchor="__RefHeading___Toc4026_4006729438" w:tooltip="5.2 Alarms on a tag">
+          <w:hyperlink w:anchor="__RefHeading___Toc4261_2449894927" w:tooltip="5.2 Alarms on a tag">
             <w:r>
               <w:rPr>
                 <w:rStyle w:val="IndexLink"/>
@@ -459,7 +480,7 @@
               </w:rPr>
               <w:t>5.2 Alarms on a tag</w:t>
               <w:tab/>
-              <w:t>12</w:t>
+              <w:t>14</w:t>
             </w:r>
           </w:hyperlink>
         </w:p>
@@ -472,7 +493,7 @@
             </w:tabs>
             <w:rPr/>
           </w:pPr>
-          <w:hyperlink w:anchor="__RefHeading___Toc4028_4006729438" w:tooltip="6 Screens and windows">
+          <w:hyperlink w:anchor="__RefHeading___Toc4263_2449894927" w:tooltip="6 Screens and windows">
             <w:r>
               <w:rPr>
                 <w:rStyle w:val="IndexLink"/>
@@ -480,7 +501,7 @@
               </w:rPr>
               <w:t>6 Screens and windows</w:t>
               <w:tab/>
-              <w:t>13</w:t>
+              <w:t>15</w:t>
             </w:r>
           </w:hyperlink>
         </w:p>
@@ -493,7 +514,7 @@
             </w:tabs>
             <w:rPr/>
           </w:pPr>
-          <w:hyperlink w:anchor="__RefHeading___Toc4030_4006729438" w:tooltip="6.1 Window properties">
+          <w:hyperlink w:anchor="__RefHeading___Toc4265_2449894927" w:tooltip="6.1 Window properties">
             <w:r>
               <w:rPr>
                 <w:rStyle w:val="IndexLink"/>
@@ -501,7 +522,7 @@
               </w:rPr>
               <w:t>6.1 Window properties</w:t>
               <w:tab/>
-              <w:t>13</w:t>
+              <w:t>15</w:t>
             </w:r>
           </w:hyperlink>
         </w:p>
@@ -514,7 +535,7 @@
             </w:tabs>
             <w:rPr/>
           </w:pPr>
-          <w:hyperlink w:anchor="__RefHeading___Toc4032_4006729438" w:tooltip="6.2 Navigation">
+          <w:hyperlink w:anchor="__RefHeading___Toc4267_2449894927" w:tooltip="6.2 Navigation">
             <w:r>
               <w:rPr>
                 <w:rStyle w:val="IndexLink"/>
@@ -522,7 +543,7 @@
               </w:rPr>
               <w:t>6.2 Navigation</w:t>
               <w:tab/>
-              <w:t>15</w:t>
+              <w:t>17</w:t>
             </w:r>
           </w:hyperlink>
         </w:p>
@@ -535,7 +556,7 @@
             </w:tabs>
             <w:rPr/>
           </w:pPr>
-          <w:hyperlink w:anchor="__RefHeading___Toc4034_4006729438" w:tooltip="7 Drawing objects">
+          <w:hyperlink w:anchor="__RefHeading___Toc4269_2449894927" w:tooltip="7 Drawing objects">
             <w:r>
               <w:rPr>
                 <w:rStyle w:val="IndexLink"/>
@@ -543,7 +564,7 @@
               </w:rPr>
               <w:t>7 Drawing objects</w:t>
               <w:tab/>
-              <w:t>16</w:t>
+              <w:t>18</w:t>
             </w:r>
           </w:hyperlink>
         </w:p>
@@ -556,7 +577,7 @@
             </w:tabs>
             <w:rPr/>
           </w:pPr>
-          <w:hyperlink w:anchor="__RefHeading___Toc4036_4006729438" w:tooltip="8 Animation links">
+          <w:hyperlink w:anchor="__RefHeading___Toc4271_2449894927" w:tooltip="8 Animation links">
             <w:r>
               <w:rPr>
                 <w:rStyle w:val="IndexLink"/>
@@ -564,7 +585,7 @@
               </w:rPr>
               <w:t>8 Animation links</w:t>
               <w:tab/>
-              <w:t>17</w:t>
+              <w:t>19</w:t>
             </w:r>
           </w:hyperlink>
         </w:p>
@@ -577,7 +598,7 @@
             </w:tabs>
             <w:rPr/>
           </w:pPr>
-          <w:hyperlink w:anchor="__RefHeading___Toc4038_4006729438" w:tooltip="8.1 A valve: status color, fault blink and faceplate">
+          <w:hyperlink w:anchor="__RefHeading___Toc4273_2449894927" w:tooltip="8.1 A valve: status color, fault blink and faceplate">
             <w:r>
               <w:rPr>
                 <w:rStyle w:val="IndexLink"/>
@@ -585,7 +606,7 @@
               </w:rPr>
               <w:t>8.1 A valve: status color, fault blink and faceplate</w:t>
               <w:tab/>
-              <w:t>19</w:t>
+              <w:t>21</w:t>
             </w:r>
           </w:hyperlink>
         </w:p>
@@ -598,7 +619,7 @@
             </w:tabs>
             <w:rPr/>
           </w:pPr>
-          <w:hyperlink w:anchor="__RefHeading___Toc4040_4006729438" w:tooltip="8.2 The weigh hopper: percent fill">
+          <w:hyperlink w:anchor="__RefHeading___Toc4275_2449894927" w:tooltip="8.2 The weigh hopper: percent fill">
             <w:r>
               <w:rPr>
                 <w:rStyle w:val="IndexLink"/>
@@ -606,7 +627,7 @@
               </w:rPr>
               <w:t>8.2 The weigh hopper: percent fill</w:t>
               <w:tab/>
-              <w:t>20</w:t>
+              <w:t>22</w:t>
             </w:r>
           </w:hyperlink>
         </w:p>
@@ -619,7 +640,7 @@
             </w:tabs>
             <w:rPr/>
           </w:pPr>
-          <w:hyperlink w:anchor="__RefHeading___Toc4042_4006729438" w:tooltip="8.3 Hopper pressure: value display and alarm colors">
+          <w:hyperlink w:anchor="__RefHeading___Toc4277_2449894927" w:tooltip="8.3 Hopper pressure: value display and alarm colors">
             <w:r>
               <w:rPr>
                 <w:rStyle w:val="IndexLink"/>
@@ -627,7 +648,7 @@
               </w:rPr>
               <w:t>8.3 Hopper pressure: value display and alarm colors</w:t>
               <w:tab/>
-              <w:t>21</w:t>
+              <w:t>23</w:t>
             </w:r>
           </w:hyperlink>
         </w:p>
@@ -640,7 +661,7 @@
             </w:tabs>
             <w:rPr/>
           </w:pPr>
-          <w:hyperlink w:anchor="__RefHeading___Toc4044_4006729438" w:tooltip="8.4 Setpoints: user input">
+          <w:hyperlink w:anchor="__RefHeading___Toc4279_2449894927" w:tooltip="8.4 Setpoints: user input">
             <w:r>
               <w:rPr>
                 <w:rStyle w:val="IndexLink"/>
@@ -648,7 +669,7 @@
               </w:rPr>
               <w:t>8.4 Setpoints: user input</w:t>
               <w:tab/>
-              <w:t>22</w:t>
+              <w:t>24</w:t>
             </w:r>
           </w:hyperlink>
         </w:p>
@@ -661,7 +682,7 @@
             </w:tabs>
             <w:rPr/>
           </w:pPr>
-          <w:hyperlink w:anchor="__RefHeading___Toc4046_4006729438" w:tooltip="8.5 Commands: pushbutton and enable">
+          <w:hyperlink w:anchor="__RefHeading___Toc4281_2449894927" w:tooltip="8.5 Commands: pushbutton and enable">
             <w:r>
               <w:rPr>
                 <w:rStyle w:val="IndexLink"/>
@@ -669,7 +690,7 @@
               </w:rPr>
               <w:t>8.5 Commands: pushbutton and enable</w:t>
               <w:tab/>
-              <w:t>23</w:t>
+              <w:t>25</w:t>
             </w:r>
           </w:hyperlink>
         </w:p>
@@ -682,7 +703,7 @@
             </w:tabs>
             <w:rPr/>
           </w:pPr>
-          <w:hyperlink w:anchor="__RefHeading___Toc4048_4006729438" w:tooltip="9 Expressions and scripts">
+          <w:hyperlink w:anchor="__RefHeading___Toc4283_2449894927" w:tooltip="9 Expressions and scripts">
             <w:r>
               <w:rPr>
                 <w:rStyle w:val="IndexLink"/>
@@ -690,7 +711,7 @@
               </w:rPr>
               <w:t>9 Expressions and scripts</w:t>
               <w:tab/>
-              <w:t>24</w:t>
+              <w:t>26</w:t>
             </w:r>
           </w:hyperlink>
         </w:p>
@@ -703,7 +724,7 @@
             </w:tabs>
             <w:rPr/>
           </w:pPr>
-          <w:hyperlink w:anchor="__RefHeading___Toc4050_4006729438" w:tooltip="9.1 Window and application scripts">
+          <w:hyperlink w:anchor="__RefHeading___Toc4285_2449894927" w:tooltip="9.1 Window and application scripts">
             <w:r>
               <w:rPr>
                 <w:rStyle w:val="IndexLink"/>
@@ -711,7 +732,7 @@
               </w:rPr>
               <w:t>9.1 Window and application scripts</w:t>
               <w:tab/>
-              <w:t>24</w:t>
+              <w:t>26</w:t>
             </w:r>
           </w:hyperlink>
         </w:p>
@@ -724,7 +745,7 @@
             </w:tabs>
             <w:rPr/>
           </w:pPr>
-          <w:hyperlink w:anchor="__RefHeading___Toc4052_4006729438" w:tooltip="9.2 Action scripts">
+          <w:hyperlink w:anchor="__RefHeading___Toc4287_2449894927" w:tooltip="9.2 Action scripts">
             <w:r>
               <w:rPr>
                 <w:rStyle w:val="IndexLink"/>
@@ -732,7 +753,7 @@
               </w:rPr>
               <w:t>9.2 Action scripts</w:t>
               <w:tab/>
-              <w:t>28</w:t>
+              <w:t>30</w:t>
             </w:r>
           </w:hyperlink>
         </w:p>
@@ -745,7 +766,7 @@
             </w:tabs>
             <w:rPr/>
           </w:pPr>
-          <w:hyperlink w:anchor="__RefHeading___Toc4054_4006729438" w:tooltip="9.3 Function reference">
+          <w:hyperlink w:anchor="__RefHeading___Toc4289_2449894927" w:tooltip="9.3 Function reference">
             <w:r>
               <w:rPr>
                 <w:rStyle w:val="IndexLink"/>
@@ -753,7 +774,7 @@
               </w:rPr>
               <w:t>9.3 Function reference</w:t>
               <w:tab/>
-              <w:t>29</w:t>
+              <w:t>31</w:t>
             </w:r>
           </w:hyperlink>
         </w:p>
@@ -766,7 +787,7 @@
             </w:tabs>
             <w:rPr/>
           </w:pPr>
-          <w:hyperlink w:anchor="__RefHeading___Toc4056_4006729438" w:tooltip="9.4 Indirect tags: one faceplate for every device">
+          <w:hyperlink w:anchor="__RefHeading___Toc4291_2449894927" w:tooltip="9.4 Indirect tags: one faceplate for every device">
             <w:r>
               <w:rPr>
                 <w:rStyle w:val="IndexLink"/>
@@ -774,7 +795,7 @@
               </w:rPr>
               <w:t>9.4 Indirect tags: one faceplate for every device</w:t>
               <w:tab/>
-              <w:t>32</w:t>
+              <w:t>34</w:t>
             </w:r>
           </w:hyperlink>
         </w:p>
@@ -787,7 +808,7 @@
             </w:tabs>
             <w:rPr/>
           </w:pPr>
-          <w:hyperlink w:anchor="__RefHeading___Toc4058_4006729438" w:tooltip="9.5 Opening windows from scripts: ShowWindow">
+          <w:hyperlink w:anchor="__RefHeading___Toc4293_2449894927" w:tooltip="9.5 Opening windows from scripts: ShowWindow">
             <w:r>
               <w:rPr>
                 <w:rStyle w:val="IndexLink"/>
@@ -795,7 +816,7 @@
               </w:rPr>
               <w:t>9.5 Opening windows from scripts: ShowWindow</w:t>
               <w:tab/>
-              <w:t>33</w:t>
+              <w:t>35</w:t>
             </w:r>
           </w:hyperlink>
         </w:p>
@@ -808,7 +829,7 @@
             </w:tabs>
             <w:rPr/>
           </w:pPr>
-          <w:hyperlink w:anchor="__RefHeading___Toc4060_4006729438" w:tooltip="9.6 Saving the screen as a PDF: ScreenToPDF">
+          <w:hyperlink w:anchor="__RefHeading___Toc4295_2449894927" w:tooltip="9.6 Saving the screen as a PDF: ScreenToPDF">
             <w:r>
               <w:rPr>
                 <w:rStyle w:val="IndexLink"/>
@@ -816,7 +837,7 @@
               </w:rPr>
               <w:t>9.6 Saving the screen as a PDF: ScreenToPDF</w:t>
               <w:tab/>
-              <w:t>35</w:t>
+              <w:t>37</w:t>
             </w:r>
           </w:hyperlink>
         </w:p>
@@ -829,7 +850,7 @@
             </w:tabs>
             <w:rPr/>
           </w:pPr>
-          <w:hyperlink w:anchor="__RefHeading___Toc4062_4006729438" w:tooltip="9.7 Local variables: DIM">
+          <w:hyperlink w:anchor="__RefHeading___Toc4297_2449894927" w:tooltip="9.7 Local variables: DIM">
             <w:r>
               <w:rPr>
                 <w:rStyle w:val="IndexLink"/>
@@ -837,7 +858,7 @@
               </w:rPr>
               <w:t>9.7 Local variables: DIM</w:t>
               <w:tab/>
-              <w:t>37</w:t>
+              <w:t>39</w:t>
             </w:r>
           </w:hyperlink>
         </w:p>
@@ -850,7 +871,7 @@
             </w:tabs>
             <w:rPr/>
           </w:pPr>
-          <w:hyperlink w:anchor="__RefHeading___Toc4064_4006729438" w:tooltip="10 Alarms and security">
+          <w:hyperlink w:anchor="__RefHeading___Toc4299_2449894927" w:tooltip="10 Alarms and security">
             <w:r>
               <w:rPr>
                 <w:rStyle w:val="IndexLink"/>
@@ -858,7 +879,7 @@
               </w:rPr>
               <w:t>10 Alarms and security</w:t>
               <w:tab/>
-              <w:t>38</w:t>
+              <w:t>40</w:t>
             </w:r>
           </w:hyperlink>
         </w:p>
@@ -871,7 +892,7 @@
             </w:tabs>
             <w:rPr/>
           </w:pPr>
-          <w:hyperlink w:anchor="__RefHeading___Toc4066_4006729438" w:tooltip="10.1 Alarms">
+          <w:hyperlink w:anchor="__RefHeading___Toc4301_2449894927" w:tooltip="10.1 Alarms">
             <w:r>
               <w:rPr>
                 <w:rStyle w:val="IndexLink"/>
@@ -879,7 +900,7 @@
               </w:rPr>
               <w:t>10.1 Alarms</w:t>
               <w:tab/>
-              <w:t>38</w:t>
+              <w:t>40</w:t>
             </w:r>
           </w:hyperlink>
         </w:p>
@@ -892,7 +913,7 @@
             </w:tabs>
             <w:rPr/>
           </w:pPr>
-          <w:hyperlink w:anchor="__RefHeading___Toc4068_4006729438" w:tooltip="10.2 Users and access levels">
+          <w:hyperlink w:anchor="__RefHeading___Toc4303_2449894927" w:tooltip="10.2 Users and access levels">
             <w:r>
               <w:rPr>
                 <w:rStyle w:val="IndexLink"/>
@@ -900,7 +921,7 @@
               </w:rPr>
               <w:t>10.2 Users and access levels</w:t>
               <w:tab/>
-              <w:t>39</w:t>
+              <w:t>41</w:t>
             </w:r>
           </w:hyperlink>
         </w:p>
@@ -913,7 +934,7 @@
             </w:tabs>
             <w:rPr/>
           </w:pPr>
-          <w:hyperlink w:anchor="__RefHeading___Toc4070_4006729438" w:tooltip="11 Recipes">
+          <w:hyperlink w:anchor="__RefHeading___Toc4305_2449894927" w:tooltip="11 Recipes">
             <w:r>
               <w:rPr>
                 <w:rStyle w:val="IndexLink"/>
@@ -921,7 +942,7 @@
               </w:rPr>
               <w:t>11 Recipes</w:t>
               <w:tab/>
-              <w:t>40</w:t>
+              <w:t>42</w:t>
             </w:r>
           </w:hyperlink>
         </w:p>
@@ -934,7 +955,7 @@
             </w:tabs>
             <w:rPr/>
           </w:pPr>
-          <w:hyperlink w:anchor="__RefHeading___Toc4072_4006729438" w:tooltip="11.1 Recipe books">
+          <w:hyperlink w:anchor="__RefHeading___Toc4307_2449894927" w:tooltip="11.1 Recipe books">
             <w:r>
               <w:rPr>
                 <w:rStyle w:val="IndexLink"/>
@@ -942,7 +963,7 @@
               </w:rPr>
               <w:t>11.1 Recipe books</w:t>
               <w:tab/>
-              <w:t>40</w:t>
+              <w:t>42</w:t>
             </w:r>
           </w:hyperlink>
         </w:p>
@@ -955,7 +976,7 @@
             </w:tabs>
             <w:rPr/>
           </w:pPr>
-          <w:hyperlink w:anchor="__RefHeading___Toc4074_4006729438" w:tooltip="11.2 The Recipes screen">
+          <w:hyperlink w:anchor="__RefHeading___Toc4309_2449894927" w:tooltip="11.2 The Recipes screen">
             <w:r>
               <w:rPr>
                 <w:rStyle w:val="IndexLink"/>
@@ -963,7 +984,7 @@
               </w:rPr>
               <w:t>11.2 The Recipes screen</w:t>
               <w:tab/>
-              <w:t>43</w:t>
+              <w:t>45</w:t>
             </w:r>
           </w:hyperlink>
         </w:p>
@@ -976,7 +997,7 @@
             </w:tabs>
             <w:rPr/>
           </w:pPr>
-          <w:hyperlink w:anchor="__RefHeading___Toc4076_4006729438" w:tooltip="11.3 The Recipe List object">
+          <w:hyperlink w:anchor="__RefHeading___Toc4311_2449894927" w:tooltip="11.3 The Recipe List object">
             <w:r>
               <w:rPr>
                 <w:rStyle w:val="IndexLink"/>
@@ -984,7 +1005,7 @@
               </w:rPr>
               <w:t>11.3 The Recipe List object</w:t>
               <w:tab/>
-              <w:t>45</w:t>
+              <w:t>47</w:t>
             </w:r>
           </w:hyperlink>
         </w:p>
@@ -997,7 +1018,7 @@
             </w:tabs>
             <w:rPr/>
           </w:pPr>
-          <w:hyperlink w:anchor="__RefHeading___Toc4078_4006729438" w:tooltip="11.4 Selecting a recipe in a window">
+          <w:hyperlink w:anchor="__RefHeading___Toc4313_2449894927" w:tooltip="11.4 Selecting a recipe in a window">
             <w:r>
               <w:rPr>
                 <w:rStyle w:val="IndexLink"/>
@@ -1005,7 +1026,7 @@
               </w:rPr>
               <w:t>11.4 Selecting a recipe in a window</w:t>
               <w:tab/>
-              <w:t>46</w:t>
+              <w:t>48</w:t>
             </w:r>
           </w:hyperlink>
         </w:p>
@@ -1018,7 +1039,7 @@
             </w:tabs>
             <w:rPr/>
           </w:pPr>
-          <w:hyperlink w:anchor="__RefHeading___Toc4080_4006729438" w:tooltip="11.5 When a recipe function fails">
+          <w:hyperlink w:anchor="__RefHeading___Toc4315_2449894927" w:tooltip="11.5 When a recipe function fails">
             <w:r>
               <w:rPr>
                 <w:rStyle w:val="IndexLink"/>
@@ -1026,7 +1047,7 @@
               </w:rPr>
               <w:t>11.5 When a recipe function fails</w:t>
               <w:tab/>
-              <w:t>47</w:t>
+              <w:t>49</w:t>
             </w:r>
           </w:hyperlink>
         </w:p>
@@ -1039,7 +1060,7 @@
             </w:tabs>
             <w:rPr/>
           </w:pPr>
-          <w:hyperlink w:anchor="__RefHeading___Toc4082_4006729438" w:tooltip="11.6 Where recipes are kept">
+          <w:hyperlink w:anchor="__RefHeading___Toc4317_2449894927" w:tooltip="11.6 Where recipes are kept">
             <w:r>
               <w:rPr>
                 <w:rStyle w:val="IndexLink"/>
@@ -1047,7 +1068,7 @@
               </w:rPr>
               <w:t>11.6 Where recipes are kept</w:t>
               <w:tab/>
-              <w:t>47</w:t>
+              <w:t>49</w:t>
             </w:r>
           </w:hyperlink>
         </w:p>
@@ -1060,7 +1081,7 @@
             </w:tabs>
             <w:rPr/>
           </w:pPr>
-          <w:hyperlink w:anchor="__RefHeading___Toc4084_4006729438" w:tooltip="12 Testing">
+          <w:hyperlink w:anchor="__RefHeading___Toc4319_2449894927" w:tooltip="12 Testing">
             <w:r>
               <w:rPr>
                 <w:rStyle w:val="IndexLink"/>
@@ -1068,7 +1089,7 @@
               </w:rPr>
               <w:t>12 Testing</w:t>
               <w:tab/>
-              <w:t>48</w:t>
+              <w:t>50</w:t>
             </w:r>
           </w:hyperlink>
         </w:p>
@@ -1081,7 +1102,7 @@
             </w:tabs>
             <w:rPr/>
           </w:pPr>
-          <w:hyperlink w:anchor="__RefHeading___Toc4086_4006729438" w:tooltip="12.1 Validate">
+          <w:hyperlink w:anchor="__RefHeading___Toc4321_2449894927" w:tooltip="12.1 Validate">
             <w:r>
               <w:rPr>
                 <w:rStyle w:val="IndexLink"/>
@@ -1089,7 +1110,7 @@
               </w:rPr>
               <w:t>12.1 Validate</w:t>
               <w:tab/>
-              <w:t>48</w:t>
+              <w:t>50</w:t>
             </w:r>
           </w:hyperlink>
         </w:p>
@@ -1102,7 +1123,7 @@
             </w:tabs>
             <w:rPr/>
           </w:pPr>
-          <w:hyperlink w:anchor="__RefHeading___Toc4088_4006729438" w:tooltip="12.2 Run">
+          <w:hyperlink w:anchor="__RefHeading___Toc4323_2449894927" w:tooltip="12.2 Run">
             <w:r>
               <w:rPr>
                 <w:rStyle w:val="IndexLink"/>
@@ -1110,7 +1131,7 @@
               </w:rPr>
               <w:t>12.2 Run</w:t>
               <w:tab/>
-              <w:t>48</w:t>
+              <w:t>50</w:t>
             </w:r>
           </w:hyperlink>
         </w:p>
@@ -1123,7 +1144,7 @@
             </w:tabs>
             <w:rPr/>
           </w:pPr>
-          <w:hyperlink w:anchor="__RefHeading___Toc4090_4006729438" w:tooltip="13 Deploying">
+          <w:hyperlink w:anchor="__RefHeading___Toc4325_2449894927" w:tooltip="13 Deploying">
             <w:r>
               <w:rPr>
                 <w:rStyle w:val="IndexLink"/>
@@ -1131,7 +1152,7 @@
               </w:rPr>
               <w:t>13 Deploying</w:t>
               <w:tab/>
-              <w:t>53</w:t>
+              <w:t>55</w:t>
             </w:r>
           </w:hyperlink>
         </w:p>
@@ -1144,7 +1165,7 @@
             </w:tabs>
             <w:rPr/>
           </w:pPr>
-          <w:hyperlink w:anchor="__RefHeading___Toc4092_4006729438" w:tooltip="13.1 Publish">
+          <w:hyperlink w:anchor="__RefHeading___Toc4327_2449894927" w:tooltip="13.1 Publish">
             <w:r>
               <w:rPr>
                 <w:rStyle w:val="IndexLink"/>
@@ -1152,7 +1173,7 @@
               </w:rPr>
               <w:t>13.1 Publish</w:t>
               <w:tab/>
-              <w:t>54</w:t>
+              <w:t>56</w:t>
             </w:r>
           </w:hyperlink>
         </w:p>
@@ -1165,7 +1186,7 @@
             </w:tabs>
             <w:rPr/>
           </w:pPr>
-          <w:hyperlink w:anchor="__RefHeading___Toc4094_4006729438" w:tooltip="13.2 Append HMI Desktop">
+          <w:hyperlink w:anchor="__RefHeading___Toc4329_2449894927" w:tooltip="13.2 Append HMI Desktop">
             <w:r>
               <w:rPr>
                 <w:rStyle w:val="IndexLink"/>
@@ -1173,7 +1194,7 @@
               </w:rPr>
               <w:t>13.2 Append HMI Desktop</w:t>
               <w:tab/>
-              <w:t>55</w:t>
+              <w:t>57</w:t>
             </w:r>
           </w:hyperlink>
         </w:p>
@@ -1186,7 +1207,7 @@
             </w:tabs>
             <w:rPr/>
           </w:pPr>
-          <w:hyperlink w:anchor="__RefHeading___Toc4096_4006729438" w:tooltip="13.3 Append HMI Web">
+          <w:hyperlink w:anchor="__RefHeading___Toc4331_2449894927" w:tooltip="13.3 Append HMI Web">
             <w:r>
               <w:rPr>
                 <w:rStyle w:val="IndexLink"/>
@@ -1194,7 +1215,7 @@
               </w:rPr>
               <w:t>13.3 Append HMI Web</w:t>
               <w:tab/>
-              <w:t>55</w:t>
+              <w:t>57</w:t>
             </w:r>
           </w:hyperlink>
         </w:p>
@@ -1207,7 +1228,7 @@
             </w:tabs>
             <w:rPr/>
           </w:pPr>
-          <w:hyperlink w:anchor="__RefHeading___Toc4098_4006729438" w:tooltip="14 Tips and troubleshooting">
+          <w:hyperlink w:anchor="__RefHeading___Toc4333_2449894927" w:tooltip="14 Tips and troubleshooting">
             <w:r>
               <w:rPr>
                 <w:rStyle w:val="IndexLink"/>
@@ -1215,7 +1236,7 @@
               </w:rPr>
               <w:t>14 Tips and troubleshooting</w:t>
               <w:tab/>
-              <w:t>57</w:t>
+              <w:t>59</w:t>
             </w:r>
           </w:hyperlink>
         </w:p>
@@ -1228,7 +1249,7 @@
             </w:tabs>
             <w:rPr/>
           </w:pPr>
-          <w:hyperlink w:anchor="__RefHeading___Toc4100_4006729438" w:tooltip="Appendix A Command-line automation">
+          <w:hyperlink w:anchor="__RefHeading___Toc4335_2449894927" w:tooltip="Appendix A Command-line automation">
             <w:r>
               <w:rPr>
                 <w:rStyle w:val="IndexLink"/>
@@ -1236,7 +1257,7 @@
               </w:rPr>
               <w:t>Appendix A Command-line automation</w:t>
               <w:tab/>
-              <w:t>58</w:t>
+              <w:t>60</w:t>
             </w:r>
           </w:hyperlink>
           <w:r>
@@ -1266,7 +1287,7 @@
         <w:spacing w:before="0" w:after="0"/>
         <w:rPr/>
       </w:pPr>
-      <w:bookmarkStart w:id="0" w:name="__RefHeading___Toc4010_4006729438"/>
+      <w:bookmarkStart w:id="0" w:name="__RefHeading___Toc4243_2449894927"/>
       <w:bookmarkEnd w:id="0"/>
       <w:r>
         <w:rPr/>
@@ -1291,6 +1312,26 @@
       <w:r>
         <w:rPr/>
         <w:t>, the operator interface of a liquid weigh-up system that meters three plasticizers into a weigh hopper and discharges each batch to a mixer.</w:t>
+      </w:r>
+    </w:p>
+    <w:p>
+      <w:pPr>
+        <w:pStyle w:val="Normal"/>
+        <w:rPr/>
+      </w:pPr>
+      <w:r>
+        <w:rPr/>
+        <w:t xml:space="preserve">What sets Append HMI Studio apart is that it is made to be used by </w:t>
+      </w:r>
+      <w:r>
+        <w:rPr>
+          <w:b/>
+        </w:rPr>
+        <w:t>AI agents</w:t>
+      </w:r>
+      <w:r>
+        <w:rPr/>
+        <w:t xml:space="preserve"> as well as by people. An agent can build a complete, good-looking and working HMI application from the documents a project already has: the functional description or control narrative, the PLC program and the electrical drawings. The example in this manual was built that way: an AI agent wrote LiquidWeighHMI from scratch, and wrote its PLC program too (section 1.1).</w:t>
       </w:r>
     </w:p>
     <w:p>
@@ -1917,6 +1958,72 @@
                 <w:szCs w:val="22"/>
                 <w:lang w:val="en-US" w:eastAsia="en-US" w:bidi="ar-SA"/>
               </w:rPr>
+              <w:t>Built by</w:t>
+            </w:r>
+          </w:p>
+        </w:tc>
+        <w:tc>
+          <w:tcPr>
+            <w:tcW w:w="7633" w:type="dxa"/>
+            <w:tcBorders/>
+          </w:tcPr>
+          <w:p>
+            <w:pPr>
+              <w:pStyle w:val="Normal"/>
+              <w:widowControl/>
+              <w:spacing w:lineRule="auto" w:line="240" w:before="20" w:after="20"/>
+              <w:jc w:val="left"/>
+              <w:rPr>
+                <w:rFonts w:cs=""/>
+                <w:kern w:val="0"/>
+                <w:szCs w:val="22"/>
+                <w:lang w:val="en-US" w:eastAsia="en-US" w:bidi="ar-SA"/>
+              </w:rPr>
+            </w:pPr>
+            <w:r>
+              <w:rPr>
+                <w:rFonts w:cs=""/>
+                <w:kern w:val="0"/>
+                <w:sz w:val="20"/>
+                <w:szCs w:val="22"/>
+                <w:lang w:val="en-US" w:eastAsia="en-US" w:bidi="ar-SA"/>
+              </w:rPr>
+              <w:t>An AI agent, from the control narrative, the I/O list and the electrical drawings, after it had written the PLC program (section 1.1)</w:t>
+            </w:r>
+          </w:p>
+        </w:tc>
+      </w:tr>
+      <w:tr>
+        <w:trPr>
+          <w:cantSplit w:val="true"/>
+        </w:trPr>
+        <w:tc>
+          <w:tcPr>
+            <w:tcW w:w="1727" w:type="dxa"/>
+            <w:tcBorders/>
+          </w:tcPr>
+          <w:p>
+            <w:pPr>
+              <w:pStyle w:val="Normal"/>
+              <w:widowControl/>
+              <w:spacing w:lineRule="auto" w:line="240" w:before="20" w:after="20"/>
+              <w:jc w:val="left"/>
+              <w:rPr>
+                <w:rFonts w:cs=""/>
+                <w:kern w:val="0"/>
+                <w:szCs w:val="22"/>
+                <w:lang w:val="en-US" w:eastAsia="en-US" w:bidi="ar-SA"/>
+              </w:rPr>
+            </w:pPr>
+            <w:r>
+              <w:rPr>
+                <w:rFonts w:cs=""/>
+                <w:b/>
+                <w:kern w:val="0"/>
+                <w:sz w:val="20"/>
+                <w:szCs w:val="22"/>
+                <w:lang w:val="en-US" w:eastAsia="en-US" w:bidi="ar-SA"/>
+              </w:rPr>
               <w:t>Scripts</w:t>
             </w:r>
           </w:p>
@@ -1961,17 +2068,1210 @@
       <w:r>
         <w:rPr/>
       </w:r>
+      <w:r>
+        <w:br w:type="page"/>
+      </w:r>
     </w:p>
     <w:p>
       <w:pPr>
         <w:pStyle w:val="Heading2"/>
         <w:rPr/>
       </w:pPr>
-      <w:bookmarkStart w:id="1" w:name="__RefHeading___Toc4012_4006729438"/>
+      <w:bookmarkStart w:id="1" w:name="__RefHeading___Toc4245_2449894927"/>
       <w:bookmarkEnd w:id="1"/>
       <w:r>
         <w:rPr/>
-        <w:t>1.1  How an HMI application is organized</w:t>
+        <w:t>1.1  Building applications with an AI agent</w:t>
+      </w:r>
+    </w:p>
+    <w:p>
+      <w:pPr>
+        <w:pStyle w:val="Normal"/>
+        <w:rPr/>
+      </w:pPr>
+      <w:r>
+        <w:rPr/>
+        <w:t>Most HMI packages can only be driven through their own screens, one dialog at a time. Append HMI Studio also has a complete command-line interface and documentation written for AI agents, so an agent such as Claude Code can do the whole job: read the project documents, design the screens, build and validate the project, look at its own work, correct it and publish the installer.</w:t>
+      </w:r>
+    </w:p>
+    <w:p>
+      <w:pPr>
+        <w:pStyle w:val="Normal"/>
+        <w:rPr/>
+      </w:pPr>
+      <w:r>
+        <w:rPr>
+          <w:b/>
+        </w:rPr>
+        <w:t>LiquidWeighHMI was written from scratch by an AI agent.</w:t>
+      </w:r>
+      <w:r>
+        <w:rPr/>
+        <w:t xml:space="preserve"> It was given three documents and no HMI to start from:</w:t>
+      </w:r>
+    </w:p>
+    <w:p>
+      <w:pPr>
+        <w:pStyle w:val="ListBullet"/>
+        <w:numPr>
+          <w:ilvl w:val="0"/>
+          <w:numId w:val="1"/>
+        </w:numPr>
+        <w:rPr/>
+      </w:pPr>
+      <w:r>
+        <w:rPr>
+          <w:b/>
+        </w:rPr>
+        <w:t>The control narrative:</w:t>
+      </w:r>
+      <w:r>
+        <w:rPr/>
+        <w:t xml:space="preserve"> a short description of the liquid weigh-up system and how it should operate.</w:t>
+      </w:r>
+    </w:p>
+    <w:p>
+      <w:pPr>
+        <w:pStyle w:val="ListBullet"/>
+        <w:numPr>
+          <w:ilvl w:val="0"/>
+          <w:numId w:val="1"/>
+        </w:numPr>
+        <w:rPr/>
+      </w:pPr>
+      <w:r>
+        <w:rPr>
+          <w:b/>
+        </w:rPr>
+        <w:t>The I/O list:</w:t>
+      </w:r>
+      <w:r>
+        <w:rPr/>
+        <w:t xml:space="preserve"> a spreadsheet of the field devices and their I/O points.</w:t>
+      </w:r>
+    </w:p>
+    <w:p>
+      <w:pPr>
+        <w:pStyle w:val="ListBullet"/>
+        <w:numPr>
+          <w:ilvl w:val="0"/>
+          <w:numId w:val="1"/>
+        </w:numPr>
+        <w:rPr/>
+      </w:pPr>
+      <w:r>
+        <w:rPr>
+          <w:b/>
+        </w:rPr>
+        <w:t>The electrical drawings:</w:t>
+      </w:r>
+      <w:r>
+        <w:rPr/>
+        <w:t xml:space="preserve"> a scanned PDF with no text layer, which the agent read as images, including the I/O and P&amp;ID sheets.</w:t>
+      </w:r>
+    </w:p>
+    <w:p>
+      <w:pPr>
+        <w:pStyle w:val="Normal"/>
+        <w:rPr/>
+      </w:pPr>
+      <w:r>
+        <w:rPr/>
+        <w:t>There was no PLC program either: the agent wrote that first. From the same documents it wrote the ControlLogix program: 13 ladder routines for the sequence, recipe, interlocks, valves, pumps, alarms and a simulation of the process. It then checked the program with a static checker and a ladder simulator of its own, which ran full batches and scenario tests and found a real bug before the program ever reached a controller. Along the way it found and reported places where the I/O list disagreed with the drawings. Only then did it design the HMI, with every I/O tag addressed to the program's real tag paths.</w:t>
+      </w:r>
+    </w:p>
+    <w:p>
+      <w:pPr>
+        <w:pStyle w:val="Normal"/>
+        <w:rPr/>
+      </w:pPr>
+      <w:r>
+        <w:rPr/>
+        <w:t xml:space="preserve">The result is the application this manual describes: 419 PLC tags, eight screens, a faceplate shared by 14 devices, alarms, users with access levels and recipes, in a consistent visual style. The engineer's part was to supply the documents, review the screens and ask for changes, mostly fine points of layout such as how pipes meet the valve symbols. The same agent later turned the PLC program into the application scripts of </w:t>
+      </w:r>
+      <w:r>
+        <w:rPr>
+          <w:b/>
+        </w:rPr>
+        <w:t>LiquidWeighHMISim</w:t>
+      </w:r>
+      <w:r>
+        <w:rPr/>
+        <w:t>, the version of the example that runs without a PLC (section 9.1).</w:t>
+      </w:r>
+    </w:p>
+    <w:p>
+      <w:pPr>
+        <w:pStyle w:val="Caption"/>
+        <w:keepNext w:val="true"/>
+        <w:rPr/>
+      </w:pPr>
+      <w:r>
+        <w:rPr/>
+        <w:t>Table 2. How an AI agent builds an application</w:t>
+      </w:r>
+    </w:p>
+    <w:tbl>
+      <w:tblPr>
+        <w:tblStyle w:val="TableGrid"/>
+        <w:tblW w:w="9360" w:type="dxa"/>
+        <w:jc w:val="left"/>
+        <w:tblInd w:w="0" w:type="dxa"/>
+        <w:tblLayout w:type="fixed"/>
+        <w:tblCellMar>
+          <w:top w:w="57" w:type="dxa"/>
+          <w:left w:w="180" w:type="dxa"/>
+          <w:bottom w:w="57" w:type="dxa"/>
+          <w:right w:w="180" w:type="dxa"/>
+        </w:tblCellMar>
+        <w:tblLook w:val="04a0" w:noHBand="0" w:noVBand="1" w:firstColumn="1" w:lastRow="0" w:lastColumn="0" w:firstRow="1"/>
+      </w:tblPr>
+      <w:tblGrid>
+        <w:gridCol w:w="1389"/>
+        <w:gridCol w:w="7971"/>
+      </w:tblGrid>
+      <w:tr>
+        <w:trPr>
+          <w:tblHeader w:val="true"/>
+          <w:cantSplit w:val="true"/>
+        </w:trPr>
+        <w:tc>
+          <w:tcPr>
+            <w:tcW w:w="1389" w:type="dxa"/>
+            <w:tcBorders/>
+            <w:shd w:color="auto" w:fill="D9E2EC" w:val="clear"/>
+          </w:tcPr>
+          <w:p>
+            <w:pPr>
+              <w:pStyle w:val="Normal"/>
+              <w:widowControl/>
+              <w:spacing w:lineRule="auto" w:line="240" w:before="20" w:after="20"/>
+              <w:jc w:val="left"/>
+              <w:rPr>
+                <w:rFonts w:cs=""/>
+                <w:kern w:val="0"/>
+                <w:szCs w:val="22"/>
+                <w:lang w:val="en-US" w:eastAsia="en-US" w:bidi="ar-SA"/>
+              </w:rPr>
+            </w:pPr>
+            <w:r>
+              <w:rPr>
+                <w:rFonts w:cs=""/>
+                <w:b/>
+                <w:kern w:val="0"/>
+                <w:sz w:val="20"/>
+                <w:szCs w:val="22"/>
+                <w:lang w:val="en-US" w:eastAsia="en-US" w:bidi="ar-SA"/>
+              </w:rPr>
+              <w:t>Step</w:t>
+            </w:r>
+          </w:p>
+        </w:tc>
+        <w:tc>
+          <w:tcPr>
+            <w:tcW w:w="7971" w:type="dxa"/>
+            <w:tcBorders/>
+            <w:shd w:color="auto" w:fill="D9E2EC" w:val="clear"/>
+          </w:tcPr>
+          <w:p>
+            <w:pPr>
+              <w:pStyle w:val="Normal"/>
+              <w:widowControl/>
+              <w:spacing w:lineRule="auto" w:line="240" w:before="20" w:after="20"/>
+              <w:jc w:val="left"/>
+              <w:rPr>
+                <w:rFonts w:cs=""/>
+                <w:kern w:val="0"/>
+                <w:szCs w:val="22"/>
+                <w:lang w:val="en-US" w:eastAsia="en-US" w:bidi="ar-SA"/>
+              </w:rPr>
+            </w:pPr>
+            <w:r>
+              <w:rPr>
+                <w:rFonts w:cs=""/>
+                <w:b/>
+                <w:kern w:val="0"/>
+                <w:sz w:val="20"/>
+                <w:szCs w:val="22"/>
+                <w:lang w:val="en-US" w:eastAsia="en-US" w:bidi="ar-SA"/>
+              </w:rPr>
+              <w:t>What the agent does</w:t>
+            </w:r>
+          </w:p>
+        </w:tc>
+      </w:tr>
+      <w:tr>
+        <w:trPr>
+          <w:cantSplit w:val="true"/>
+        </w:trPr>
+        <w:tc>
+          <w:tcPr>
+            <w:tcW w:w="1389" w:type="dxa"/>
+            <w:tcBorders/>
+          </w:tcPr>
+          <w:p>
+            <w:pPr>
+              <w:pStyle w:val="Normal"/>
+              <w:widowControl/>
+              <w:spacing w:lineRule="auto" w:line="240" w:before="20" w:after="20"/>
+              <w:jc w:val="left"/>
+              <w:rPr>
+                <w:rFonts w:cs=""/>
+                <w:kern w:val="0"/>
+                <w:szCs w:val="22"/>
+                <w:lang w:val="en-US" w:eastAsia="en-US" w:bidi="ar-SA"/>
+              </w:rPr>
+            </w:pPr>
+            <w:r>
+              <w:rPr>
+                <w:rFonts w:cs=""/>
+                <w:b/>
+                <w:kern w:val="0"/>
+                <w:sz w:val="20"/>
+                <w:szCs w:val="22"/>
+                <w:lang w:val="en-US" w:eastAsia="en-US" w:bidi="ar-SA"/>
+              </w:rPr>
+              <w:t>Understand</w:t>
+            </w:r>
+          </w:p>
+        </w:tc>
+        <w:tc>
+          <w:tcPr>
+            <w:tcW w:w="7971" w:type="dxa"/>
+            <w:tcBorders/>
+          </w:tcPr>
+          <w:p>
+            <w:pPr>
+              <w:pStyle w:val="Normal"/>
+              <w:widowControl/>
+              <w:spacing w:lineRule="auto" w:line="240" w:before="20" w:after="20"/>
+              <w:jc w:val="left"/>
+              <w:rPr>
+                <w:rFonts w:cs=""/>
+                <w:kern w:val="0"/>
+                <w:szCs w:val="22"/>
+                <w:lang w:val="en-US" w:eastAsia="en-US" w:bidi="ar-SA"/>
+              </w:rPr>
+            </w:pPr>
+            <w:r>
+              <w:rPr>
+                <w:rFonts w:cs=""/>
+                <w:kern w:val="0"/>
+                <w:sz w:val="20"/>
+                <w:szCs w:val="22"/>
+                <w:lang w:val="en-US" w:eastAsia="en-US" w:bidi="ar-SA"/>
+              </w:rPr>
+              <w:t>Reads the functional description, the PLC program (or writes it) and the drawings, and lists the tags, devices and screens</w:t>
+            </w:r>
+          </w:p>
+        </w:tc>
+      </w:tr>
+      <w:tr>
+        <w:trPr>
+          <w:cantSplit w:val="true"/>
+        </w:trPr>
+        <w:tc>
+          <w:tcPr>
+            <w:tcW w:w="1389" w:type="dxa"/>
+            <w:tcBorders/>
+          </w:tcPr>
+          <w:p>
+            <w:pPr>
+              <w:pStyle w:val="Normal"/>
+              <w:widowControl/>
+              <w:spacing w:lineRule="auto" w:line="240" w:before="20" w:after="20"/>
+              <w:jc w:val="left"/>
+              <w:rPr>
+                <w:rFonts w:cs=""/>
+                <w:kern w:val="0"/>
+                <w:szCs w:val="22"/>
+                <w:lang w:val="en-US" w:eastAsia="en-US" w:bidi="ar-SA"/>
+              </w:rPr>
+            </w:pPr>
+            <w:r>
+              <w:rPr>
+                <w:rFonts w:cs=""/>
+                <w:b/>
+                <w:kern w:val="0"/>
+                <w:sz w:val="20"/>
+                <w:szCs w:val="22"/>
+                <w:lang w:val="en-US" w:eastAsia="en-US" w:bidi="ar-SA"/>
+              </w:rPr>
+              <w:t>Describe</w:t>
+            </w:r>
+          </w:p>
+        </w:tc>
+        <w:tc>
+          <w:tcPr>
+            <w:tcW w:w="7971" w:type="dxa"/>
+            <w:tcBorders/>
+          </w:tcPr>
+          <w:p>
+            <w:pPr>
+              <w:pStyle w:val="Normal"/>
+              <w:widowControl/>
+              <w:spacing w:lineRule="auto" w:line="240" w:before="20" w:after="20"/>
+              <w:jc w:val="left"/>
+              <w:rPr>
+                <w:rFonts w:cs=""/>
+                <w:kern w:val="0"/>
+                <w:szCs w:val="22"/>
+                <w:lang w:val="en-US" w:eastAsia="en-US" w:bidi="ar-SA"/>
+              </w:rPr>
+            </w:pPr>
+            <w:r>
+              <w:rPr>
+                <w:rFonts w:cs=""/>
+                <w:kern w:val="0"/>
+                <w:sz w:val="20"/>
+                <w:szCs w:val="22"/>
+                <w:lang w:val="en-US" w:eastAsia="en-US" w:bidi="ar-SA"/>
+              </w:rPr>
+              <w:t>Writes the application as a JSON spec, usually generated by a small script so every screen shares the same building blocks</w:t>
+            </w:r>
+          </w:p>
+        </w:tc>
+      </w:tr>
+      <w:tr>
+        <w:trPr>
+          <w:cantSplit w:val="true"/>
+        </w:trPr>
+        <w:tc>
+          <w:tcPr>
+            <w:tcW w:w="1389" w:type="dxa"/>
+            <w:tcBorders/>
+          </w:tcPr>
+          <w:p>
+            <w:pPr>
+              <w:pStyle w:val="Normal"/>
+              <w:widowControl/>
+              <w:spacing w:lineRule="auto" w:line="240" w:before="20" w:after="20"/>
+              <w:jc w:val="left"/>
+              <w:rPr>
+                <w:rFonts w:cs=""/>
+                <w:kern w:val="0"/>
+                <w:szCs w:val="22"/>
+                <w:lang w:val="en-US" w:eastAsia="en-US" w:bidi="ar-SA"/>
+              </w:rPr>
+            </w:pPr>
+            <w:r>
+              <w:rPr>
+                <w:rFonts w:cs=""/>
+                <w:b/>
+                <w:kern w:val="0"/>
+                <w:sz w:val="20"/>
+                <w:szCs w:val="22"/>
+                <w:lang w:val="en-US" w:eastAsia="en-US" w:bidi="ar-SA"/>
+              </w:rPr>
+              <w:t>Build</w:t>
+            </w:r>
+          </w:p>
+        </w:tc>
+        <w:tc>
+          <w:tcPr>
+            <w:tcW w:w="7971" w:type="dxa"/>
+            <w:tcBorders/>
+          </w:tcPr>
+          <w:p>
+            <w:pPr>
+              <w:pStyle w:val="Normal"/>
+              <w:widowControl/>
+              <w:spacing w:lineRule="auto" w:line="240" w:before="20" w:after="20"/>
+              <w:jc w:val="left"/>
+              <w:rPr>
+                <w:rFonts w:cs=""/>
+                <w:kern w:val="0"/>
+                <w:szCs w:val="22"/>
+                <w:lang w:val="en-US" w:eastAsia="en-US" w:bidi="ar-SA"/>
+              </w:rPr>
+            </w:pPr>
+            <w:r>
+              <w:rPr>
+                <w:rFonts w:cs="" w:ascii="Consolas" w:hAnsi="Consolas"/>
+                <w:kern w:val="0"/>
+                <w:sz w:val="20"/>
+                <w:szCs w:val="22"/>
+                <w:lang w:val="en-US" w:eastAsia="en-US" w:bidi="ar-SA"/>
+              </w:rPr>
+              <w:t>--hmi-build</w:t>
+            </w:r>
+            <w:r>
+              <w:rPr>
+                <w:rFonts w:cs=""/>
+                <w:kern w:val="0"/>
+                <w:sz w:val="20"/>
+                <w:szCs w:val="22"/>
+                <w:lang w:val="en-US" w:eastAsia="en-US" w:bidi="ar-SA"/>
+              </w:rPr>
+              <w:t xml:space="preserve"> turns the spec into a project; spec errors and </w:t>
+            </w:r>
+            <w:r>
+              <w:rPr>
+                <w:rFonts w:cs="" w:ascii="Consolas" w:hAnsi="Consolas"/>
+                <w:kern w:val="0"/>
+                <w:sz w:val="20"/>
+                <w:szCs w:val="22"/>
+                <w:lang w:val="en-US" w:eastAsia="en-US" w:bidi="ar-SA"/>
+              </w:rPr>
+              <w:t>PROBLEM</w:t>
+            </w:r>
+            <w:r>
+              <w:rPr>
+                <w:rFonts w:cs=""/>
+                <w:kern w:val="0"/>
+                <w:sz w:val="20"/>
+                <w:szCs w:val="22"/>
+                <w:lang w:val="en-US" w:eastAsia="en-US" w:bidi="ar-SA"/>
+              </w:rPr>
+              <w:t xml:space="preserve"> lines name exactly what to fix</w:t>
+            </w:r>
+          </w:p>
+        </w:tc>
+      </w:tr>
+      <w:tr>
+        <w:trPr>
+          <w:cantSplit w:val="true"/>
+        </w:trPr>
+        <w:tc>
+          <w:tcPr>
+            <w:tcW w:w="1389" w:type="dxa"/>
+            <w:tcBorders/>
+          </w:tcPr>
+          <w:p>
+            <w:pPr>
+              <w:pStyle w:val="Normal"/>
+              <w:widowControl/>
+              <w:spacing w:lineRule="auto" w:line="240" w:before="20" w:after="20"/>
+              <w:jc w:val="left"/>
+              <w:rPr>
+                <w:rFonts w:cs=""/>
+                <w:kern w:val="0"/>
+                <w:szCs w:val="22"/>
+                <w:lang w:val="en-US" w:eastAsia="en-US" w:bidi="ar-SA"/>
+              </w:rPr>
+            </w:pPr>
+            <w:r>
+              <w:rPr>
+                <w:rFonts w:cs=""/>
+                <w:b/>
+                <w:kern w:val="0"/>
+                <w:sz w:val="20"/>
+                <w:szCs w:val="22"/>
+                <w:lang w:val="en-US" w:eastAsia="en-US" w:bidi="ar-SA"/>
+              </w:rPr>
+              <w:t>Check</w:t>
+            </w:r>
+          </w:p>
+        </w:tc>
+        <w:tc>
+          <w:tcPr>
+            <w:tcW w:w="7971" w:type="dxa"/>
+            <w:tcBorders/>
+          </w:tcPr>
+          <w:p>
+            <w:pPr>
+              <w:pStyle w:val="Normal"/>
+              <w:widowControl/>
+              <w:spacing w:lineRule="auto" w:line="240" w:before="20" w:after="20"/>
+              <w:jc w:val="left"/>
+              <w:rPr>
+                <w:rFonts w:cs=""/>
+                <w:kern w:val="0"/>
+                <w:szCs w:val="22"/>
+                <w:lang w:val="en-US" w:eastAsia="en-US" w:bidi="ar-SA"/>
+              </w:rPr>
+            </w:pPr>
+            <w:r>
+              <w:rPr>
+                <w:rFonts w:cs="" w:ascii="Consolas" w:hAnsi="Consolas"/>
+                <w:kern w:val="0"/>
+                <w:sz w:val="20"/>
+                <w:szCs w:val="22"/>
+                <w:lang w:val="en-US" w:eastAsia="en-US" w:bidi="ar-SA"/>
+              </w:rPr>
+              <w:t>--hmi-check</w:t>
+            </w:r>
+            <w:r>
+              <w:rPr>
+                <w:rFonts w:cs=""/>
+                <w:kern w:val="0"/>
+                <w:sz w:val="20"/>
+                <w:szCs w:val="22"/>
+                <w:lang w:val="en-US" w:eastAsia="en-US" w:bidi="ar-SA"/>
+              </w:rPr>
+              <w:t xml:space="preserve"> validates every expression, script, window reference and PLC address</w:t>
+            </w:r>
+          </w:p>
+        </w:tc>
+      </w:tr>
+      <w:tr>
+        <w:trPr>
+          <w:cantSplit w:val="true"/>
+        </w:trPr>
+        <w:tc>
+          <w:tcPr>
+            <w:tcW w:w="1389" w:type="dxa"/>
+            <w:tcBorders/>
+          </w:tcPr>
+          <w:p>
+            <w:pPr>
+              <w:pStyle w:val="Normal"/>
+              <w:widowControl/>
+              <w:spacing w:lineRule="auto" w:line="240" w:before="20" w:after="20"/>
+              <w:jc w:val="left"/>
+              <w:rPr>
+                <w:rFonts w:cs=""/>
+                <w:kern w:val="0"/>
+                <w:szCs w:val="22"/>
+                <w:lang w:val="en-US" w:eastAsia="en-US" w:bidi="ar-SA"/>
+              </w:rPr>
+            </w:pPr>
+            <w:r>
+              <w:rPr>
+                <w:rFonts w:cs=""/>
+                <w:b/>
+                <w:kern w:val="0"/>
+                <w:sz w:val="20"/>
+                <w:szCs w:val="22"/>
+                <w:lang w:val="en-US" w:eastAsia="en-US" w:bidi="ar-SA"/>
+              </w:rPr>
+              <w:t>Look</w:t>
+            </w:r>
+          </w:p>
+        </w:tc>
+        <w:tc>
+          <w:tcPr>
+            <w:tcW w:w="7971" w:type="dxa"/>
+            <w:tcBorders/>
+          </w:tcPr>
+          <w:p>
+            <w:pPr>
+              <w:pStyle w:val="Normal"/>
+              <w:widowControl/>
+              <w:spacing w:lineRule="auto" w:line="240" w:before="20" w:after="20"/>
+              <w:jc w:val="left"/>
+              <w:rPr>
+                <w:rFonts w:cs=""/>
+                <w:kern w:val="0"/>
+                <w:szCs w:val="22"/>
+                <w:lang w:val="en-US" w:eastAsia="en-US" w:bidi="ar-SA"/>
+              </w:rPr>
+            </w:pPr>
+            <w:r>
+              <w:rPr>
+                <w:rFonts w:cs="" w:ascii="Consolas" w:hAnsi="Consolas"/>
+                <w:kern w:val="0"/>
+                <w:sz w:val="20"/>
+                <w:szCs w:val="22"/>
+                <w:lang w:val="en-US" w:eastAsia="en-US" w:bidi="ar-SA"/>
+              </w:rPr>
+              <w:t>--hmi-render</w:t>
+            </w:r>
+            <w:r>
+              <w:rPr>
+                <w:rFonts w:cs=""/>
+                <w:kern w:val="0"/>
+                <w:sz w:val="20"/>
+                <w:szCs w:val="22"/>
+                <w:lang w:val="en-US" w:eastAsia="en-US" w:bidi="ar-SA"/>
+              </w:rPr>
+              <w:t xml:space="preserve"> draws every screen to PNG, so the agent can see its own layout and correct it</w:t>
+            </w:r>
+          </w:p>
+        </w:tc>
+      </w:tr>
+      <w:tr>
+        <w:trPr>
+          <w:cantSplit w:val="true"/>
+        </w:trPr>
+        <w:tc>
+          <w:tcPr>
+            <w:tcW w:w="1389" w:type="dxa"/>
+            <w:tcBorders/>
+          </w:tcPr>
+          <w:p>
+            <w:pPr>
+              <w:pStyle w:val="Normal"/>
+              <w:widowControl/>
+              <w:spacing w:lineRule="auto" w:line="240" w:before="20" w:after="20"/>
+              <w:jc w:val="left"/>
+              <w:rPr>
+                <w:rFonts w:cs=""/>
+                <w:kern w:val="0"/>
+                <w:szCs w:val="22"/>
+                <w:lang w:val="en-US" w:eastAsia="en-US" w:bidi="ar-SA"/>
+              </w:rPr>
+            </w:pPr>
+            <w:r>
+              <w:rPr>
+                <w:rFonts w:cs=""/>
+                <w:b/>
+                <w:kern w:val="0"/>
+                <w:sz w:val="20"/>
+                <w:szCs w:val="22"/>
+                <w:lang w:val="en-US" w:eastAsia="en-US" w:bidi="ar-SA"/>
+              </w:rPr>
+              <w:t>Change</w:t>
+            </w:r>
+          </w:p>
+        </w:tc>
+        <w:tc>
+          <w:tcPr>
+            <w:tcW w:w="7971" w:type="dxa"/>
+            <w:tcBorders/>
+          </w:tcPr>
+          <w:p>
+            <w:pPr>
+              <w:pStyle w:val="Normal"/>
+              <w:widowControl/>
+              <w:spacing w:lineRule="auto" w:line="240" w:before="20" w:after="20"/>
+              <w:jc w:val="left"/>
+              <w:rPr>
+                <w:rFonts w:cs=""/>
+                <w:kern w:val="0"/>
+                <w:szCs w:val="22"/>
+                <w:lang w:val="en-US" w:eastAsia="en-US" w:bidi="ar-SA"/>
+              </w:rPr>
+            </w:pPr>
+            <w:r>
+              <w:rPr>
+                <w:rFonts w:cs="" w:ascii="Consolas" w:hAnsi="Consolas"/>
+                <w:kern w:val="0"/>
+                <w:sz w:val="20"/>
+                <w:szCs w:val="22"/>
+                <w:lang w:val="en-US" w:eastAsia="en-US" w:bidi="ar-SA"/>
+              </w:rPr>
+              <w:t>--hmi-dump</w:t>
+            </w:r>
+            <w:r>
+              <w:rPr>
+                <w:rFonts w:cs=""/>
+                <w:kern w:val="0"/>
+                <w:sz w:val="20"/>
+                <w:szCs w:val="22"/>
+                <w:lang w:val="en-US" w:eastAsia="en-US" w:bidi="ar-SA"/>
+              </w:rPr>
+              <w:t xml:space="preserve"> writes a project, including the engineer's own edits in the Studio, back out as JSON without losing anything</w:t>
+            </w:r>
+          </w:p>
+        </w:tc>
+      </w:tr>
+      <w:tr>
+        <w:trPr>
+          <w:cantSplit w:val="true"/>
+        </w:trPr>
+        <w:tc>
+          <w:tcPr>
+            <w:tcW w:w="1389" w:type="dxa"/>
+            <w:tcBorders/>
+          </w:tcPr>
+          <w:p>
+            <w:pPr>
+              <w:pStyle w:val="Normal"/>
+              <w:widowControl/>
+              <w:spacing w:lineRule="auto" w:line="240" w:before="20" w:after="20"/>
+              <w:jc w:val="left"/>
+              <w:rPr>
+                <w:rFonts w:cs=""/>
+                <w:kern w:val="0"/>
+                <w:szCs w:val="22"/>
+                <w:lang w:val="en-US" w:eastAsia="en-US" w:bidi="ar-SA"/>
+              </w:rPr>
+            </w:pPr>
+            <w:r>
+              <w:rPr>
+                <w:rFonts w:cs=""/>
+                <w:b/>
+                <w:kern w:val="0"/>
+                <w:sz w:val="20"/>
+                <w:szCs w:val="22"/>
+                <w:lang w:val="en-US" w:eastAsia="en-US" w:bidi="ar-SA"/>
+              </w:rPr>
+              <w:t>Deliver</w:t>
+            </w:r>
+          </w:p>
+        </w:tc>
+        <w:tc>
+          <w:tcPr>
+            <w:tcW w:w="7971" w:type="dxa"/>
+            <w:tcBorders/>
+          </w:tcPr>
+          <w:p>
+            <w:pPr>
+              <w:pStyle w:val="Normal"/>
+              <w:widowControl/>
+              <w:spacing w:lineRule="auto" w:line="240" w:before="20" w:after="20"/>
+              <w:jc w:val="left"/>
+              <w:rPr>
+                <w:rFonts w:cs=""/>
+                <w:kern w:val="0"/>
+                <w:szCs w:val="22"/>
+                <w:lang w:val="en-US" w:eastAsia="en-US" w:bidi="ar-SA"/>
+              </w:rPr>
+            </w:pPr>
+            <w:r>
+              <w:rPr>
+                <w:rFonts w:cs="" w:ascii="Consolas" w:hAnsi="Consolas"/>
+                <w:kern w:val="0"/>
+                <w:sz w:val="20"/>
+                <w:szCs w:val="22"/>
+                <w:lang w:val="en-US" w:eastAsia="en-US" w:bidi="ar-SA"/>
+              </w:rPr>
+              <w:t>--hmi-publish</w:t>
+            </w:r>
+            <w:r>
+              <w:rPr>
+                <w:rFonts w:cs=""/>
+                <w:kern w:val="0"/>
+                <w:sz w:val="20"/>
+                <w:szCs w:val="22"/>
+                <w:lang w:val="en-US" w:eastAsia="en-US" w:bidi="ar-SA"/>
+              </w:rPr>
+              <w:t xml:space="preserve"> builds the Windows installer for the operator station</w:t>
+            </w:r>
+          </w:p>
+        </w:tc>
+      </w:tr>
+    </w:tbl>
+    <w:p>
+      <w:pPr>
+        <w:pStyle w:val="Normal"/>
+        <w:rPr/>
+      </w:pPr>
+      <w:r>
+        <w:rPr/>
+      </w:r>
+    </w:p>
+    <w:p>
+      <w:pPr>
+        <w:pStyle w:val="Normal"/>
+        <w:rPr/>
+      </w:pPr>
+      <w:r>
+        <w:rPr>
+          <w:b/>
+        </w:rPr>
+        <w:t>Documentation ready for agents.</w:t>
+      </w:r>
+      <w:r>
+        <w:rPr/>
+        <w:t xml:space="preserve"> Everything an agent needs is written down in a form it can use without guessing, so it can produce good-looking, working applications with very little intervention:</w:t>
+      </w:r>
+    </w:p>
+    <w:p>
+      <w:pPr>
+        <w:pStyle w:val="Caption"/>
+        <w:keepNext w:val="true"/>
+        <w:rPr/>
+      </w:pPr>
+      <w:r>
+        <w:rPr/>
+        <w:t>Table 3. Documentation for AI agents</w:t>
+      </w:r>
+    </w:p>
+    <w:tbl>
+      <w:tblPr>
+        <w:tblStyle w:val="TableGrid"/>
+        <w:tblW w:w="9360" w:type="dxa"/>
+        <w:jc w:val="left"/>
+        <w:tblInd w:w="0" w:type="dxa"/>
+        <w:tblLayout w:type="fixed"/>
+        <w:tblCellMar>
+          <w:top w:w="57" w:type="dxa"/>
+          <w:left w:w="180" w:type="dxa"/>
+          <w:bottom w:w="57" w:type="dxa"/>
+          <w:right w:w="180" w:type="dxa"/>
+        </w:tblCellMar>
+        <w:tblLook w:val="04a0" w:noHBand="0" w:noVBand="1" w:firstColumn="1" w:lastRow="0" w:lastColumn="0" w:firstRow="1"/>
+      </w:tblPr>
+      <w:tblGrid>
+        <w:gridCol w:w="3190"/>
+        <w:gridCol w:w="6170"/>
+      </w:tblGrid>
+      <w:tr>
+        <w:trPr>
+          <w:tblHeader w:val="true"/>
+          <w:cantSplit w:val="true"/>
+        </w:trPr>
+        <w:tc>
+          <w:tcPr>
+            <w:tcW w:w="3190" w:type="dxa"/>
+            <w:tcBorders/>
+            <w:shd w:color="auto" w:fill="D9E2EC" w:val="clear"/>
+          </w:tcPr>
+          <w:p>
+            <w:pPr>
+              <w:pStyle w:val="Normal"/>
+              <w:widowControl/>
+              <w:spacing w:lineRule="auto" w:line="240" w:before="20" w:after="20"/>
+              <w:jc w:val="left"/>
+              <w:rPr>
+                <w:rFonts w:cs=""/>
+                <w:kern w:val="0"/>
+                <w:szCs w:val="22"/>
+                <w:lang w:val="en-US" w:eastAsia="en-US" w:bidi="ar-SA"/>
+              </w:rPr>
+            </w:pPr>
+            <w:r>
+              <w:rPr>
+                <w:rFonts w:cs=""/>
+                <w:b/>
+                <w:kern w:val="0"/>
+                <w:sz w:val="20"/>
+                <w:szCs w:val="22"/>
+                <w:lang w:val="en-US" w:eastAsia="en-US" w:bidi="ar-SA"/>
+              </w:rPr>
+              <w:t>Document</w:t>
+            </w:r>
+          </w:p>
+        </w:tc>
+        <w:tc>
+          <w:tcPr>
+            <w:tcW w:w="6170" w:type="dxa"/>
+            <w:tcBorders/>
+            <w:shd w:color="auto" w:fill="D9E2EC" w:val="clear"/>
+          </w:tcPr>
+          <w:p>
+            <w:pPr>
+              <w:pStyle w:val="Normal"/>
+              <w:widowControl/>
+              <w:spacing w:lineRule="auto" w:line="240" w:before="20" w:after="20"/>
+              <w:jc w:val="left"/>
+              <w:rPr>
+                <w:rFonts w:cs=""/>
+                <w:kern w:val="0"/>
+                <w:szCs w:val="22"/>
+                <w:lang w:val="en-US" w:eastAsia="en-US" w:bidi="ar-SA"/>
+              </w:rPr>
+            </w:pPr>
+            <w:r>
+              <w:rPr>
+                <w:rFonts w:cs=""/>
+                <w:b/>
+                <w:kern w:val="0"/>
+                <w:sz w:val="20"/>
+                <w:szCs w:val="22"/>
+                <w:lang w:val="en-US" w:eastAsia="en-US" w:bidi="ar-SA"/>
+              </w:rPr>
+              <w:t>What it gives the agent</w:t>
+            </w:r>
+          </w:p>
+        </w:tc>
+      </w:tr>
+      <w:tr>
+        <w:trPr>
+          <w:cantSplit w:val="true"/>
+        </w:trPr>
+        <w:tc>
+          <w:tcPr>
+            <w:tcW w:w="3190" w:type="dxa"/>
+            <w:tcBorders/>
+          </w:tcPr>
+          <w:p>
+            <w:pPr>
+              <w:pStyle w:val="Normal"/>
+              <w:widowControl/>
+              <w:spacing w:lineRule="auto" w:line="240" w:before="20" w:after="20"/>
+              <w:jc w:val="left"/>
+              <w:rPr>
+                <w:rFonts w:cs=""/>
+                <w:kern w:val="0"/>
+                <w:szCs w:val="22"/>
+                <w:lang w:val="en-US" w:eastAsia="en-US" w:bidi="ar-SA"/>
+              </w:rPr>
+            </w:pPr>
+            <w:r>
+              <w:rPr>
+                <w:rFonts w:cs=""/>
+                <w:b/>
+                <w:kern w:val="0"/>
+                <w:sz w:val="20"/>
+                <w:szCs w:val="22"/>
+                <w:lang w:val="en-US" w:eastAsia="en-US" w:bidi="ar-SA"/>
+              </w:rPr>
+              <w:t>Append HMI Studio skill</w:t>
+            </w:r>
+          </w:p>
+        </w:tc>
+        <w:tc>
+          <w:tcPr>
+            <w:tcW w:w="6170" w:type="dxa"/>
+            <w:tcBorders/>
+          </w:tcPr>
+          <w:p>
+            <w:pPr>
+              <w:pStyle w:val="Normal"/>
+              <w:widowControl/>
+              <w:spacing w:lineRule="auto" w:line="240" w:before="20" w:after="20"/>
+              <w:jc w:val="left"/>
+              <w:rPr>
+                <w:rFonts w:cs=""/>
+                <w:kern w:val="0"/>
+                <w:szCs w:val="22"/>
+                <w:lang w:val="en-US" w:eastAsia="en-US" w:bidi="ar-SA"/>
+              </w:rPr>
+            </w:pPr>
+            <w:r>
+              <w:rPr>
+                <w:rFonts w:cs=""/>
+                <w:kern w:val="0"/>
+                <w:sz w:val="20"/>
+                <w:szCs w:val="22"/>
+                <w:lang w:val="en-US" w:eastAsia="en-US" w:bidi="ar-SA"/>
+              </w:rPr>
+              <w:t>A Claude Code skill (</w:t>
+            </w:r>
+            <w:r>
+              <w:rPr>
+                <w:rFonts w:cs="" w:ascii="Consolas" w:hAnsi="Consolas"/>
+                <w:kern w:val="0"/>
+                <w:sz w:val="20"/>
+                <w:szCs w:val="22"/>
+                <w:lang w:val="en-US" w:eastAsia="en-US" w:bidi="ar-SA"/>
+              </w:rPr>
+              <w:t>.claude/skills/append-hmi-studio</w:t>
+            </w:r>
+            <w:r>
+              <w:rPr>
+                <w:rFonts w:cs=""/>
+                <w:kern w:val="0"/>
+                <w:sz w:val="20"/>
+                <w:szCs w:val="22"/>
+                <w:lang w:val="en-US" w:eastAsia="en-US" w:bidi="ar-SA"/>
+              </w:rPr>
+              <w:t>): the workflow, the rules that matter and good screen practice: palette, text sizes, navigation and alarms</w:t>
+            </w:r>
+          </w:p>
+        </w:tc>
+      </w:tr>
+      <w:tr>
+        <w:trPr>
+          <w:cantSplit w:val="true"/>
+        </w:trPr>
+        <w:tc>
+          <w:tcPr>
+            <w:tcW w:w="3190" w:type="dxa"/>
+            <w:tcBorders/>
+          </w:tcPr>
+          <w:p>
+            <w:pPr>
+              <w:pStyle w:val="Normal"/>
+              <w:widowControl/>
+              <w:spacing w:lineRule="auto" w:line="240" w:before="20" w:after="20"/>
+              <w:jc w:val="left"/>
+              <w:rPr>
+                <w:rFonts w:cs=""/>
+                <w:kern w:val="0"/>
+                <w:szCs w:val="22"/>
+                <w:lang w:val="en-US" w:eastAsia="en-US" w:bidi="ar-SA"/>
+              </w:rPr>
+            </w:pPr>
+            <w:r>
+              <w:rPr>
+                <w:rFonts w:cs=""/>
+                <w:b/>
+                <w:kern w:val="0"/>
+                <w:sz w:val="20"/>
+                <w:szCs w:val="22"/>
+                <w:lang w:val="en-US" w:eastAsia="en-US" w:bidi="ar-SA"/>
+              </w:rPr>
+              <w:t>HMI_AUTOMATION.md</w:t>
+            </w:r>
+          </w:p>
+        </w:tc>
+        <w:tc>
+          <w:tcPr>
+            <w:tcW w:w="6170" w:type="dxa"/>
+            <w:tcBorders/>
+          </w:tcPr>
+          <w:p>
+            <w:pPr>
+              <w:pStyle w:val="Normal"/>
+              <w:widowControl/>
+              <w:spacing w:lineRule="auto" w:line="240" w:before="20" w:after="20"/>
+              <w:jc w:val="left"/>
+              <w:rPr>
+                <w:rFonts w:cs=""/>
+                <w:kern w:val="0"/>
+                <w:szCs w:val="22"/>
+                <w:lang w:val="en-US" w:eastAsia="en-US" w:bidi="ar-SA"/>
+              </w:rPr>
+            </w:pPr>
+            <w:r>
+              <w:rPr>
+                <w:rFonts w:cs=""/>
+                <w:kern w:val="0"/>
+                <w:sz w:val="20"/>
+                <w:szCs w:val="22"/>
+                <w:lang w:val="en-US" w:eastAsia="en-US" w:bidi="ar-SA"/>
+              </w:rPr>
+              <w:t>Every command and exit code, every field of the JSON spec, every object and animation link type, and the expression and script syntax</w:t>
+            </w:r>
+          </w:p>
+        </w:tc>
+      </w:tr>
+      <w:tr>
+        <w:trPr>
+          <w:cantSplit w:val="true"/>
+        </w:trPr>
+        <w:tc>
+          <w:tcPr>
+            <w:tcW w:w="3190" w:type="dxa"/>
+            <w:tcBorders/>
+          </w:tcPr>
+          <w:p>
+            <w:pPr>
+              <w:pStyle w:val="Normal"/>
+              <w:widowControl/>
+              <w:spacing w:lineRule="auto" w:line="240" w:before="20" w:after="20"/>
+              <w:jc w:val="left"/>
+              <w:rPr>
+                <w:rFonts w:cs=""/>
+                <w:kern w:val="0"/>
+                <w:szCs w:val="22"/>
+                <w:lang w:val="en-US" w:eastAsia="en-US" w:bidi="ar-SA"/>
+              </w:rPr>
+            </w:pPr>
+            <w:r>
+              <w:rPr>
+                <w:rFonts w:cs=""/>
+                <w:b/>
+                <w:kern w:val="0"/>
+                <w:sz w:val="20"/>
+                <w:szCs w:val="22"/>
+                <w:lang w:val="en-US" w:eastAsia="en-US" w:bidi="ar-SA"/>
+              </w:rPr>
+              <w:t>HMI_ALARMS.md, HMI_SECURITY.md, HMI_RECIPES.md, HMI_INDIRECT.md</w:t>
+            </w:r>
+          </w:p>
+        </w:tc>
+        <w:tc>
+          <w:tcPr>
+            <w:tcW w:w="6170" w:type="dxa"/>
+            <w:tcBorders/>
+          </w:tcPr>
+          <w:p>
+            <w:pPr>
+              <w:pStyle w:val="Normal"/>
+              <w:widowControl/>
+              <w:spacing w:lineRule="auto" w:line="240" w:before="20" w:after="20"/>
+              <w:jc w:val="left"/>
+              <w:rPr>
+                <w:rFonts w:cs=""/>
+                <w:kern w:val="0"/>
+                <w:szCs w:val="22"/>
+                <w:lang w:val="en-US" w:eastAsia="en-US" w:bidi="ar-SA"/>
+              </w:rPr>
+            </w:pPr>
+            <w:r>
+              <w:rPr>
+                <w:rFonts w:cs=""/>
+                <w:kern w:val="0"/>
+                <w:sz w:val="20"/>
+                <w:szCs w:val="22"/>
+                <w:lang w:val="en-US" w:eastAsia="en-US" w:bidi="ar-SA"/>
+              </w:rPr>
+              <w:t>How alarms, users and access levels, recipes and indirect tags behave, with their spec fields and script functions</w:t>
+            </w:r>
+          </w:p>
+        </w:tc>
+      </w:tr>
+      <w:tr>
+        <w:trPr>
+          <w:cantSplit w:val="true"/>
+        </w:trPr>
+        <w:tc>
+          <w:tcPr>
+            <w:tcW w:w="3190" w:type="dxa"/>
+            <w:tcBorders/>
+          </w:tcPr>
+          <w:p>
+            <w:pPr>
+              <w:pStyle w:val="Normal"/>
+              <w:widowControl/>
+              <w:spacing w:lineRule="auto" w:line="240" w:before="20" w:after="20"/>
+              <w:jc w:val="left"/>
+              <w:rPr>
+                <w:rFonts w:cs=""/>
+                <w:kern w:val="0"/>
+                <w:szCs w:val="22"/>
+                <w:lang w:val="en-US" w:eastAsia="en-US" w:bidi="ar-SA"/>
+              </w:rPr>
+            </w:pPr>
+            <w:r>
+              <w:rPr>
+                <w:rFonts w:cs=""/>
+                <w:b/>
+                <w:kern w:val="0"/>
+                <w:sz w:val="20"/>
+                <w:szCs w:val="22"/>
+                <w:lang w:val="en-US" w:eastAsia="en-US" w:bidi="ar-SA"/>
+              </w:rPr>
+              <w:t>example-spec.json</w:t>
+            </w:r>
+          </w:p>
+        </w:tc>
+        <w:tc>
+          <w:tcPr>
+            <w:tcW w:w="6170" w:type="dxa"/>
+            <w:tcBorders/>
+          </w:tcPr>
+          <w:p>
+            <w:pPr>
+              <w:pStyle w:val="Normal"/>
+              <w:widowControl/>
+              <w:spacing w:lineRule="auto" w:line="240" w:before="20" w:after="20"/>
+              <w:jc w:val="left"/>
+              <w:rPr>
+                <w:rFonts w:cs=""/>
+                <w:kern w:val="0"/>
+                <w:szCs w:val="22"/>
+                <w:lang w:val="en-US" w:eastAsia="en-US" w:bidi="ar-SA"/>
+              </w:rPr>
+            </w:pPr>
+            <w:r>
+              <w:rPr>
+                <w:rFonts w:cs=""/>
+                <w:kern w:val="0"/>
+                <w:sz w:val="20"/>
+                <w:szCs w:val="22"/>
+                <w:lang w:val="en-US" w:eastAsia="en-US" w:bidi="ar-SA"/>
+              </w:rPr>
+              <w:t>A complete small application to start from</w:t>
+            </w:r>
+          </w:p>
+        </w:tc>
+      </w:tr>
+    </w:tbl>
+    <w:p>
+      <w:pPr>
+        <w:pStyle w:val="Normal"/>
+        <w:rPr/>
+      </w:pPr>
+      <w:r>
+        <w:rPr/>
+      </w:r>
+    </w:p>
+    <w:p>
+      <w:pPr>
+        <w:pStyle w:val="Normal"/>
+        <w:rPr/>
+      </w:pPr>
+      <w:r>
+        <w:rPr/>
+        <w:t>Appendix A lists the command-line modes. A person can open anything an agent builds in the Studio and carry on by hand, and the agent picks up those changes the next time it dumps the project.</w:t>
+      </w:r>
+    </w:p>
+    <w:p>
+      <w:pPr>
+        <w:pStyle w:val="Heading2"/>
+        <w:rPr/>
+      </w:pPr>
+      <w:bookmarkStart w:id="2" w:name="__RefHeading___Toc4247_2449894927"/>
+      <w:bookmarkEnd w:id="2"/>
+      <w:r>
+        <w:rPr/>
+        <w:t>1.2  How an HMI application is organized</w:t>
       </w:r>
     </w:p>
     <w:p>
@@ -2110,8 +3410,8 @@
         <w:pStyle w:val="Heading1"/>
         <w:rPr/>
       </w:pPr>
-      <w:bookmarkStart w:id="2" w:name="__RefHeading___Toc4014_4006729438"/>
-      <w:bookmarkEnd w:id="2"/>
+      <w:bookmarkStart w:id="3" w:name="__RefHeading___Toc4249_2449894927"/>
+      <w:bookmarkEnd w:id="3"/>
       <w:r>
         <w:rPr/>
         <w:t>2  The Studio window</w:t>
@@ -2185,7 +3485,7 @@
       </w:pPr>
       <w:r>
         <w:rPr/>
-        <w:t>Table 2. Parts of the Studio window</w:t>
+        <w:t>Table 4. Parts of the Studio window</w:t>
       </w:r>
     </w:p>
     <w:tbl>
@@ -2688,8 +3988,8 @@
         <w:pStyle w:val="Heading2"/>
         <w:rPr/>
       </w:pPr>
-      <w:bookmarkStart w:id="3" w:name="__RefHeading___Toc4016_4006729438"/>
-      <w:bookmarkEnd w:id="3"/>
+      <w:bookmarkStart w:id="4" w:name="__RefHeading___Toc4251_2449894927"/>
+      <w:bookmarkEnd w:id="4"/>
       <w:r>
         <w:rPr/>
         <w:t>2.1  The HMI menu</w:t>
@@ -2763,7 +4063,7 @@
       </w:pPr>
       <w:r>
         <w:rPr/>
-        <w:t>Table 3. HMI menu commands</w:t>
+        <w:t>Table 5. HMI menu commands</w:t>
       </w:r>
     </w:p>
     <w:tbl>
@@ -3728,8 +5028,8 @@
         <w:pStyle w:val="Heading1"/>
         <w:rPr/>
       </w:pPr>
-      <w:bookmarkStart w:id="4" w:name="__RefHeading___Toc4018_4006729438"/>
-      <w:bookmarkEnd w:id="4"/>
+      <w:bookmarkStart w:id="5" w:name="__RefHeading___Toc4253_2449894927"/>
+      <w:bookmarkEnd w:id="5"/>
       <w:r>
         <w:rPr/>
         <w:t>3  Application settings</w:t>
@@ -4060,8 +5360,8 @@
         <w:pStyle w:val="Heading1"/>
         <w:rPr/>
       </w:pPr>
-      <w:bookmarkStart w:id="5" w:name="__RefHeading___Toc4020_4006729438"/>
-      <w:bookmarkEnd w:id="5"/>
+      <w:bookmarkStart w:id="6" w:name="__RefHeading___Toc4255_2449894927"/>
+      <w:bookmarkEnd w:id="6"/>
       <w:r>
         <w:rPr/>
         <w:t>4  Devices</w:t>
@@ -4295,7 +5595,7 @@
       </w:pPr>
       <w:r>
         <w:rPr/>
-        <w:t>Table 4. Protocols and address examples</w:t>
+        <w:t>Table 6. Protocols and address examples</w:t>
       </w:r>
     </w:p>
     <w:tbl>
@@ -4855,8 +6155,8 @@
         <w:pStyle w:val="Heading1"/>
         <w:rPr/>
       </w:pPr>
-      <w:bookmarkStart w:id="6" w:name="__RefHeading___Toc4022_4006729438"/>
-      <w:bookmarkEnd w:id="6"/>
+      <w:bookmarkStart w:id="7" w:name="__RefHeading___Toc4257_2449894927"/>
+      <w:bookmarkEnd w:id="7"/>
       <w:r>
         <w:rPr/>
         <w:t>5  Tags</w:t>
@@ -4970,7 +6270,7 @@
       </w:pPr>
       <w:r>
         <w:rPr/>
-        <w:t>Table 5. Tag types</w:t>
+        <w:t>Table 7. Tag types</w:t>
       </w:r>
     </w:p>
     <w:tbl>
@@ -5686,8 +6986,8 @@
         <w:pStyle w:val="Heading2"/>
         <w:rPr/>
       </w:pPr>
-      <w:bookmarkStart w:id="7" w:name="__RefHeading___Toc4024_4006729438"/>
-      <w:bookmarkEnd w:id="7"/>
+      <w:bookmarkStart w:id="8" w:name="__RefHeading___Toc4259_2449894927"/>
+      <w:bookmarkEnd w:id="8"/>
       <w:r>
         <w:rPr/>
         <w:t>5.1  Tag fields</w:t>
@@ -5701,7 +7001,7 @@
       </w:pPr>
       <w:r>
         <w:rPr/>
-        <w:t>Table 6. Tag fields</w:t>
+        <w:t>Table 8. Tag fields</w:t>
       </w:r>
     </w:p>
     <w:tbl>
@@ -6339,8 +7639,8 @@
         <w:pStyle w:val="Heading2"/>
         <w:rPr/>
       </w:pPr>
-      <w:bookmarkStart w:id="8" w:name="__RefHeading___Toc4026_4006729438"/>
-      <w:bookmarkEnd w:id="8"/>
+      <w:bookmarkStart w:id="9" w:name="__RefHeading___Toc4261_2449894927"/>
+      <w:bookmarkEnd w:id="9"/>
       <w:r>
         <w:rPr/>
         <w:t>5.2  Alarms on a tag</w:t>
@@ -6474,8 +7774,8 @@
         <w:pStyle w:val="Heading1"/>
         <w:rPr/>
       </w:pPr>
-      <w:bookmarkStart w:id="9" w:name="__RefHeading___Toc4028_4006729438"/>
-      <w:bookmarkEnd w:id="9"/>
+      <w:bookmarkStart w:id="10" w:name="__RefHeading___Toc4263_2449894927"/>
+      <w:bookmarkEnd w:id="10"/>
       <w:r>
         <w:rPr/>
         <w:t>6  Screens and windows</w:t>
@@ -6559,7 +7859,7 @@
       </w:pPr>
       <w:r>
         <w:rPr/>
-        <w:t>Table 7. Window types</w:t>
+        <w:t>Table 9. Window types</w:t>
       </w:r>
     </w:p>
     <w:tbl>
@@ -6987,8 +8287,8 @@
         <w:pStyle w:val="Heading2"/>
         <w:rPr/>
       </w:pPr>
-      <w:bookmarkStart w:id="10" w:name="__RefHeading___Toc4030_4006729438"/>
-      <w:bookmarkEnd w:id="10"/>
+      <w:bookmarkStart w:id="11" w:name="__RefHeading___Toc4265_2449894927"/>
+      <w:bookmarkEnd w:id="11"/>
       <w:r>
         <w:rPr/>
         <w:t>6.1  Window properties</w:t>
@@ -7149,8 +8449,8 @@
         <w:pStyle w:val="Heading2"/>
         <w:rPr/>
       </w:pPr>
-      <w:bookmarkStart w:id="11" w:name="__RefHeading___Toc4032_4006729438"/>
-      <w:bookmarkEnd w:id="11"/>
+      <w:bookmarkStart w:id="12" w:name="__RefHeading___Toc4267_2449894927"/>
+      <w:bookmarkEnd w:id="12"/>
       <w:r>
         <w:rPr/>
         <w:t>6.2  Navigation</w:t>
@@ -7205,8 +8505,8 @@
         <w:pStyle w:val="Heading1"/>
         <w:rPr/>
       </w:pPr>
-      <w:bookmarkStart w:id="12" w:name="__RefHeading___Toc4034_4006729438"/>
-      <w:bookmarkEnd w:id="12"/>
+      <w:bookmarkStart w:id="13" w:name="__RefHeading___Toc4269_2449894927"/>
+      <w:bookmarkEnd w:id="13"/>
       <w:r>
         <w:rPr/>
         <w:t>7  Drawing objects</w:t>
@@ -7346,7 +8646,7 @@
       </w:pPr>
       <w:r>
         <w:rPr/>
-        <w:t>Table 8. Arc settings (Style tab, Arc section)</w:t>
+        <w:t>Table 10. Arc settings (Style tab, Arc section)</w:t>
       </w:r>
     </w:p>
     <w:tbl>
@@ -7961,8 +9261,8 @@
         <w:pStyle w:val="Heading1"/>
         <w:rPr/>
       </w:pPr>
-      <w:bookmarkStart w:id="13" w:name="__RefHeading___Toc4036_4006729438"/>
-      <w:bookmarkEnd w:id="13"/>
+      <w:bookmarkStart w:id="14" w:name="__RefHeading___Toc4271_2449894927"/>
+      <w:bookmarkEnd w:id="14"/>
       <w:r>
         <w:rPr/>
         <w:t>8  Animation links</w:t>
@@ -8056,7 +9356,7 @@
       </w:pPr>
       <w:r>
         <w:rPr/>
-        <w:t>Table 9. Animation link families</w:t>
+        <w:t>Table 11. Animation link families</w:t>
       </w:r>
     </w:p>
     <w:tbl>
@@ -8686,8 +9986,8 @@
         <w:pStyle w:val="Heading2"/>
         <w:rPr/>
       </w:pPr>
-      <w:bookmarkStart w:id="14" w:name="__RefHeading___Toc4038_4006729438"/>
-      <w:bookmarkEnd w:id="14"/>
+      <w:bookmarkStart w:id="15" w:name="__RefHeading___Toc4273_2449894927"/>
+      <w:bookmarkEnd w:id="15"/>
       <w:r>
         <w:rPr/>
         <w:t>8.1  A valve: status color, fault blink and faceplate</w:t>
@@ -8872,8 +10172,8 @@
         <w:pStyle w:val="Heading2"/>
         <w:rPr/>
       </w:pPr>
-      <w:bookmarkStart w:id="15" w:name="__RefHeading___Toc4040_4006729438"/>
-      <w:bookmarkEnd w:id="15"/>
+      <w:bookmarkStart w:id="16" w:name="__RefHeading___Toc4275_2449894927"/>
+      <w:bookmarkEnd w:id="16"/>
       <w:r>
         <w:rPr/>
         <w:t>8.2  The weigh hopper: percent fill</w:t>
@@ -8996,8 +10296,8 @@
         <w:pStyle w:val="Heading2"/>
         <w:rPr/>
       </w:pPr>
-      <w:bookmarkStart w:id="16" w:name="__RefHeading___Toc4042_4006729438"/>
-      <w:bookmarkEnd w:id="16"/>
+      <w:bookmarkStart w:id="17" w:name="__RefHeading___Toc4277_2449894927"/>
+      <w:bookmarkEnd w:id="17"/>
       <w:r>
         <w:rPr/>
         <w:t>8.3  Hopper pressure: value display and alarm colors</w:t>
@@ -9112,8 +10412,8 @@
         <w:pStyle w:val="Heading2"/>
         <w:rPr/>
       </w:pPr>
-      <w:bookmarkStart w:id="17" w:name="__RefHeading___Toc4044_4006729438"/>
-      <w:bookmarkEnd w:id="17"/>
+      <w:bookmarkStart w:id="18" w:name="__RefHeading___Toc4279_2449894927"/>
+      <w:bookmarkEnd w:id="18"/>
       <w:r>
         <w:rPr/>
         <w:t>8.4  Setpoints: user input</w:t>
@@ -9228,8 +10528,8 @@
         <w:pStyle w:val="Heading2"/>
         <w:rPr/>
       </w:pPr>
-      <w:bookmarkStart w:id="18" w:name="__RefHeading___Toc4046_4006729438"/>
-      <w:bookmarkEnd w:id="18"/>
+      <w:bookmarkStart w:id="19" w:name="__RefHeading___Toc4281_2449894927"/>
+      <w:bookmarkEnd w:id="19"/>
       <w:r>
         <w:rPr/>
         <w:t>8.5  Commands: pushbutton and enable</w:t>
@@ -9366,7 +10666,7 @@
       </w:pPr>
       <w:r>
         <w:rPr/>
-        <w:t>Table 10. Pushbutton actions</w:t>
+        <w:t>Table 12. Pushbutton actions</w:t>
       </w:r>
     </w:p>
     <w:tbl>
@@ -9740,8 +11040,8 @@
         <w:pStyle w:val="Heading1"/>
         <w:rPr/>
       </w:pPr>
-      <w:bookmarkStart w:id="19" w:name="__RefHeading___Toc4048_4006729438"/>
-      <w:bookmarkEnd w:id="19"/>
+      <w:bookmarkStart w:id="20" w:name="__RefHeading___Toc4283_2449894927"/>
+      <w:bookmarkEnd w:id="20"/>
       <w:r>
         <w:rPr/>
         <w:t>9  Expressions and scripts</w:t>
@@ -9765,7 +11065,7 @@
       </w:pPr>
       <w:r>
         <w:rPr/>
-        <w:t>Table 11. Expression syntax</w:t>
+        <w:t>Table 13. Expression syntax</w:t>
       </w:r>
     </w:p>
     <w:tbl>
@@ -10271,7 +11571,7 @@
       </w:pPr>
       <w:r>
         <w:rPr/>
-        <w:t>Table 12. System tags</w:t>
+        <w:t>Table 14. System tags</w:t>
       </w:r>
     </w:p>
     <w:tbl>
@@ -10708,8 +12008,8 @@
         <w:pStyle w:val="Heading2"/>
         <w:rPr/>
       </w:pPr>
-      <w:bookmarkStart w:id="20" w:name="__RefHeading___Toc4050_4006729438"/>
-      <w:bookmarkEnd w:id="20"/>
+      <w:bookmarkStart w:id="21" w:name="__RefHeading___Toc4285_2449894927"/>
+      <w:bookmarkEnd w:id="21"/>
       <w:r>
         <w:rPr/>
         <w:t>9.1  Window and application scripts</w:t>
@@ -11110,8 +12410,8 @@
         <w:pStyle w:val="Heading2"/>
         <w:rPr/>
       </w:pPr>
-      <w:bookmarkStart w:id="21" w:name="__RefHeading___Toc4052_4006729438"/>
-      <w:bookmarkEnd w:id="21"/>
+      <w:bookmarkStart w:id="22" w:name="__RefHeading___Toc4287_2449894927"/>
+      <w:bookmarkEnd w:id="22"/>
       <w:r>
         <w:rPr/>
         <w:t>9.2  Action scripts</w:t>
@@ -11229,8 +12529,8 @@
         <w:pStyle w:val="Heading2"/>
         <w:rPr/>
       </w:pPr>
-      <w:bookmarkStart w:id="22" w:name="__RefHeading___Toc4054_4006729438"/>
-      <w:bookmarkEnd w:id="22"/>
+      <w:bookmarkStart w:id="23" w:name="__RefHeading___Toc4289_2449894927"/>
+      <w:bookmarkEnd w:id="23"/>
       <w:r>
         <w:rPr/>
         <w:t>9.3  Function reference</w:t>
@@ -11361,7 +12661,7 @@
       </w:pPr>
       <w:r>
         <w:rPr/>
-        <w:t>Table 13. Math and text functions (links and scripts)</w:t>
+        <w:t>Table 15. Math and text functions (links and scripts)</w:t>
       </w:r>
     </w:p>
     <w:tbl>
@@ -12530,7 +13830,7 @@
       </w:pPr>
       <w:r>
         <w:rPr/>
-        <w:t>Table 14. Security functions (scripts only)</w:t>
+        <w:t>Table 16. Security functions (scripts only)</w:t>
       </w:r>
     </w:p>
     <w:tbl>
@@ -13193,7 +14493,7 @@
       </w:pPr>
       <w:r>
         <w:rPr/>
-        <w:t>Table 15. Indirect tag function (scripts only)</w:t>
+        <w:t>Table 17. Indirect tag function (scripts only)</w:t>
       </w:r>
     </w:p>
     <w:tbl>
@@ -13452,7 +14752,7 @@
       </w:pPr>
       <w:r>
         <w:rPr/>
-        <w:t>Table 16. Window function (scripts only)</w:t>
+        <w:t>Table 18. Window function (scripts only)</w:t>
       </w:r>
     </w:p>
     <w:tbl>
@@ -13693,7 +14993,7 @@
       </w:pPr>
       <w:r>
         <w:rPr/>
-        <w:t>Table 17. Screen function (scripts only)</w:t>
+        <w:t>Table 19. Screen function (scripts only)</w:t>
       </w:r>
     </w:p>
     <w:tbl>
@@ -13974,7 +15274,7 @@
       </w:pPr>
       <w:r>
         <w:rPr/>
-        <w:t>Table 18. Recipe functions (scripts only)</w:t>
+        <w:t>Table 20. Recipe functions (scripts only)</w:t>
       </w:r>
     </w:p>
     <w:tbl>
@@ -15015,8 +16315,8 @@
         <w:pStyle w:val="Heading2"/>
         <w:rPr/>
       </w:pPr>
-      <w:bookmarkStart w:id="23" w:name="__RefHeading___Toc4056_4006729438"/>
-      <w:bookmarkEnd w:id="23"/>
+      <w:bookmarkStart w:id="24" w:name="__RefHeading___Toc4291_2449894927"/>
+      <w:bookmarkEnd w:id="24"/>
       <w:r>
         <w:rPr/>
         <w:t>9.4  Indirect tags: one faceplate for every device</w:t>
@@ -15851,8 +17151,8 @@
         <w:pStyle w:val="Heading2"/>
         <w:rPr/>
       </w:pPr>
-      <w:bookmarkStart w:id="24" w:name="__RefHeading___Toc4058_4006729438"/>
-      <w:bookmarkEnd w:id="24"/>
+      <w:bookmarkStart w:id="25" w:name="__RefHeading___Toc4293_2449894927"/>
+      <w:bookmarkEnd w:id="25"/>
       <w:r>
         <w:rPr/>
         <w:t>9.5  Opening windows from scripts: ShowWindow</w:t>
@@ -16328,8 +17628,8 @@
         <w:pStyle w:val="Heading2"/>
         <w:rPr/>
       </w:pPr>
-      <w:bookmarkStart w:id="25" w:name="__RefHeading___Toc4060_4006729438"/>
-      <w:bookmarkEnd w:id="25"/>
+      <w:bookmarkStart w:id="26" w:name="__RefHeading___Toc4295_2449894927"/>
+      <w:bookmarkEnd w:id="26"/>
       <w:r>
         <w:rPr/>
         <w:t>9.6  Saving the screen as a PDF: ScreenToPDF</w:t>
@@ -16520,8 +17820,8 @@
         <w:pStyle w:val="Heading2"/>
         <w:rPr/>
       </w:pPr>
-      <w:bookmarkStart w:id="26" w:name="__RefHeading___Toc4062_4006729438"/>
-      <w:bookmarkEnd w:id="26"/>
+      <w:bookmarkStart w:id="27" w:name="__RefHeading___Toc4297_2449894927"/>
+      <w:bookmarkEnd w:id="27"/>
       <w:r>
         <w:rPr/>
         <w:t>9.7  Local variables: DIM</w:t>
@@ -16695,7 +17995,7 @@
       </w:pPr>
       <w:r>
         <w:rPr/>
-        <w:t>Table 19. Local variable types</w:t>
+        <w:t>Table 21. Local variable types</w:t>
       </w:r>
     </w:p>
     <w:tbl>
@@ -17206,8 +18506,8 @@
         <w:pStyle w:val="Heading1"/>
         <w:rPr/>
       </w:pPr>
-      <w:bookmarkStart w:id="27" w:name="__RefHeading___Toc4064_4006729438"/>
-      <w:bookmarkEnd w:id="27"/>
+      <w:bookmarkStart w:id="28" w:name="__RefHeading___Toc4299_2449894927"/>
+      <w:bookmarkEnd w:id="28"/>
       <w:r>
         <w:rPr/>
         <w:t>10  Alarms and security</w:t>
@@ -17218,8 +18518,8 @@
         <w:pStyle w:val="Heading2"/>
         <w:rPr/>
       </w:pPr>
-      <w:bookmarkStart w:id="28" w:name="__RefHeading___Toc4066_4006729438"/>
-      <w:bookmarkEnd w:id="28"/>
+      <w:bookmarkStart w:id="29" w:name="__RefHeading___Toc4301_2449894927"/>
+      <w:bookmarkEnd w:id="29"/>
       <w:r>
         <w:rPr/>
         <w:t>10.1  Alarms</w:t>
@@ -17351,8 +18651,8 @@
         <w:pStyle w:val="Heading2"/>
         <w:rPr/>
       </w:pPr>
-      <w:bookmarkStart w:id="29" w:name="__RefHeading___Toc4068_4006729438"/>
-      <w:bookmarkEnd w:id="29"/>
+      <w:bookmarkStart w:id="30" w:name="__RefHeading___Toc4303_2449894927"/>
+      <w:bookmarkEnd w:id="30"/>
       <w:r>
         <w:rPr/>
         <w:t>10.2  Users and access levels</w:t>
@@ -17446,7 +18746,7 @@
       </w:pPr>
       <w:r>
         <w:rPr/>
-        <w:t>Table 20. LiquidWeighHMI users</w:t>
+        <w:t>Table 22. LiquidWeighHMI users</w:t>
       </w:r>
     </w:p>
     <w:tbl>
@@ -18041,8 +19341,8 @@
         <w:pStyle w:val="Heading1"/>
         <w:rPr/>
       </w:pPr>
-      <w:bookmarkStart w:id="30" w:name="__RefHeading___Toc4070_4006729438"/>
-      <w:bookmarkEnd w:id="30"/>
+      <w:bookmarkStart w:id="31" w:name="__RefHeading___Toc4305_2449894927"/>
+      <w:bookmarkEnd w:id="31"/>
       <w:r>
         <w:rPr/>
         <w:t>11  Recipes</w:t>
@@ -18177,8 +19477,8 @@
         <w:pStyle w:val="Heading2"/>
         <w:rPr/>
       </w:pPr>
-      <w:bookmarkStart w:id="31" w:name="__RefHeading___Toc4072_4006729438"/>
-      <w:bookmarkEnd w:id="31"/>
+      <w:bookmarkStart w:id="32" w:name="__RefHeading___Toc4307_2449894927"/>
+      <w:bookmarkEnd w:id="32"/>
       <w:r>
         <w:rPr/>
         <w:t>11.1  Recipe books</w:t>
@@ -18432,7 +19732,7 @@
       </w:pPr>
       <w:r>
         <w:rPr/>
-        <w:t>Table 21. The tags of the Plasticizer Blends book</w:t>
+        <w:t>Table 23. The tags of the Plasticizer Blends book</w:t>
       </w:r>
     </w:p>
     <w:tbl>
@@ -19049,7 +20349,7 @@
       </w:pPr>
       <w:r>
         <w:rPr/>
-        <w:t>Table 22. LiquidWeighHMI's starting recipes</w:t>
+        <w:t>Table 24. LiquidWeighHMI's starting recipes</w:t>
       </w:r>
     </w:p>
     <w:tbl>
@@ -20038,8 +21338,8 @@
         <w:pStyle w:val="Heading2"/>
         <w:rPr/>
       </w:pPr>
-      <w:bookmarkStart w:id="32" w:name="__RefHeading___Toc4074_4006729438"/>
-      <w:bookmarkEnd w:id="32"/>
+      <w:bookmarkStart w:id="33" w:name="__RefHeading___Toc4309_2449894927"/>
+      <w:bookmarkEnd w:id="33"/>
       <w:r>
         <w:rPr/>
         <w:t>11.2  The Recipes screen</w:t>
@@ -20225,7 +21525,7 @@
       </w:pPr>
       <w:r>
         <w:rPr/>
-        <w:t>Table 23. The Recipes screen's buttons</w:t>
+        <w:t>Table 25. The Recipes screen's buttons</w:t>
       </w:r>
     </w:p>
     <w:tbl>
@@ -21488,8 +22788,8 @@
         <w:pStyle w:val="Heading2"/>
         <w:rPr/>
       </w:pPr>
-      <w:bookmarkStart w:id="33" w:name="__RefHeading___Toc4076_4006729438"/>
-      <w:bookmarkEnd w:id="33"/>
+      <w:bookmarkStart w:id="34" w:name="__RefHeading___Toc4311_2449894927"/>
+      <w:bookmarkEnd w:id="34"/>
       <w:r>
         <w:rPr/>
         <w:t>11.3  The Recipe List object</w:t>
@@ -21579,7 +22879,7 @@
       </w:pPr>
       <w:r>
         <w:rPr/>
-        <w:t>Table 24. Recipe List settings</w:t>
+        <w:t>Table 26. Recipe List settings</w:t>
       </w:r>
     </w:p>
     <w:tbl>
@@ -22029,8 +23329,8 @@
         <w:pStyle w:val="Heading2"/>
         <w:rPr/>
       </w:pPr>
-      <w:bookmarkStart w:id="34" w:name="__RefHeading___Toc4078_4006729438"/>
-      <w:bookmarkEnd w:id="34"/>
+      <w:bookmarkStart w:id="35" w:name="__RefHeading___Toc4313_2449894927"/>
+      <w:bookmarkEnd w:id="35"/>
       <w:r>
         <w:rPr/>
         <w:t>11.4  Selecting a recipe in a window</w:t>
@@ -22314,8 +23614,8 @@
         <w:pStyle w:val="Heading2"/>
         <w:rPr/>
       </w:pPr>
-      <w:bookmarkStart w:id="35" w:name="__RefHeading___Toc4080_4006729438"/>
-      <w:bookmarkEnd w:id="35"/>
+      <w:bookmarkStart w:id="36" w:name="__RefHeading___Toc4315_2449894927"/>
+      <w:bookmarkEnd w:id="36"/>
       <w:r>
         <w:rPr/>
         <w:t>11.5  When a recipe function fails</w:t>
@@ -22472,8 +23772,8 @@
         <w:pStyle w:val="Heading2"/>
         <w:rPr/>
       </w:pPr>
-      <w:bookmarkStart w:id="36" w:name="__RefHeading___Toc4082_4006729438"/>
-      <w:bookmarkEnd w:id="36"/>
+      <w:bookmarkStart w:id="37" w:name="__RefHeading___Toc4317_2449894927"/>
+      <w:bookmarkEnd w:id="37"/>
       <w:r>
         <w:rPr/>
         <w:t>11.6  Where recipes are kept</w:t>
@@ -22497,7 +23797,7 @@
       </w:pPr>
       <w:r>
         <w:rPr/>
-        <w:t>Table 25. Where saved recipes are kept</w:t>
+        <w:t>Table 27. Where saved recipes are kept</w:t>
       </w:r>
     </w:p>
     <w:tbl>
@@ -22872,8 +24172,8 @@
         <w:pStyle w:val="Heading1"/>
         <w:rPr/>
       </w:pPr>
-      <w:bookmarkStart w:id="37" w:name="__RefHeading___Toc4084_4006729438"/>
-      <w:bookmarkEnd w:id="37"/>
+      <w:bookmarkStart w:id="38" w:name="__RefHeading___Toc4319_2449894927"/>
+      <w:bookmarkEnd w:id="38"/>
       <w:r>
         <w:rPr/>
         <w:t>12  Testing</w:t>
@@ -22884,8 +24184,8 @@
         <w:pStyle w:val="Heading2"/>
         <w:rPr/>
       </w:pPr>
-      <w:bookmarkStart w:id="38" w:name="__RefHeading___Toc4086_4006729438"/>
-      <w:bookmarkEnd w:id="38"/>
+      <w:bookmarkStart w:id="39" w:name="__RefHeading___Toc4321_2449894927"/>
+      <w:bookmarkEnd w:id="39"/>
       <w:r>
         <w:rPr/>
         <w:t>12.1  Validate</w:t>
@@ -22972,8 +24272,8 @@
         <w:pStyle w:val="Heading2"/>
         <w:rPr/>
       </w:pPr>
-      <w:bookmarkStart w:id="39" w:name="__RefHeading___Toc4088_4006729438"/>
-      <w:bookmarkEnd w:id="39"/>
+      <w:bookmarkStart w:id="40" w:name="__RefHeading___Toc4323_2449894927"/>
+      <w:bookmarkEnd w:id="40"/>
       <w:r>
         <w:rPr/>
         <w:t>12.2  Run</w:t>
@@ -23538,8 +24838,8 @@
         <w:pStyle w:val="Heading1"/>
         <w:rPr/>
       </w:pPr>
-      <w:bookmarkStart w:id="40" w:name="__RefHeading___Toc4090_4006729438"/>
-      <w:bookmarkEnd w:id="40"/>
+      <w:bookmarkStart w:id="41" w:name="__RefHeading___Toc4325_2449894927"/>
+      <w:bookmarkEnd w:id="41"/>
       <w:r>
         <w:rPr/>
         <w:t>13  Deploying</w:t>
@@ -23563,7 +24863,7 @@
       </w:pPr>
       <w:r>
         <w:rPr/>
-        <w:t>Table 26. Deployment options</w:t>
+        <w:t>Table 28. Deployment options</w:t>
       </w:r>
     </w:p>
     <w:tbl>
@@ -23994,8 +25294,8 @@
         <w:pStyle w:val="Heading2"/>
         <w:rPr/>
       </w:pPr>
-      <w:bookmarkStart w:id="41" w:name="__RefHeading___Toc4092_4006729438"/>
-      <w:bookmarkEnd w:id="41"/>
+      <w:bookmarkStart w:id="42" w:name="__RefHeading___Toc4327_2449894927"/>
+      <w:bookmarkEnd w:id="42"/>
       <w:r>
         <w:rPr/>
         <w:t>13.1  Publish</w:t>
@@ -24085,8 +25385,8 @@
         <w:pStyle w:val="Heading2"/>
         <w:rPr/>
       </w:pPr>
-      <w:bookmarkStart w:id="42" w:name="__RefHeading___Toc4094_4006729438"/>
-      <w:bookmarkEnd w:id="42"/>
+      <w:bookmarkStart w:id="43" w:name="__RefHeading___Toc4329_2449894927"/>
+      <w:bookmarkEnd w:id="43"/>
       <w:r>
         <w:rPr/>
         <w:t>13.2  Append HMI Desktop</w:t>
@@ -24198,8 +25498,8 @@
         <w:pStyle w:val="Heading2"/>
         <w:rPr/>
       </w:pPr>
-      <w:bookmarkStart w:id="43" w:name="__RefHeading___Toc4096_4006729438"/>
-      <w:bookmarkEnd w:id="43"/>
+      <w:bookmarkStart w:id="44" w:name="__RefHeading___Toc4331_2449894927"/>
+      <w:bookmarkEnd w:id="44"/>
       <w:r>
         <w:rPr/>
         <w:t>13.3  Append HMI Web</w:t>
@@ -24411,8 +25711,8 @@
         <w:pStyle w:val="Heading1"/>
         <w:rPr/>
       </w:pPr>
-      <w:bookmarkStart w:id="44" w:name="__RefHeading___Toc4098_4006729438"/>
-      <w:bookmarkEnd w:id="44"/>
+      <w:bookmarkStart w:id="45" w:name="__RefHeading___Toc4333_2449894927"/>
+      <w:bookmarkEnd w:id="45"/>
       <w:r>
         <w:rPr/>
         <w:t>14  Tips and troubleshooting</w:t>
@@ -24426,7 +25726,7 @@
       </w:pPr>
       <w:r>
         <w:rPr/>
-        <w:t>Table 27. Common problems</w:t>
+        <w:t>Table 29. Common problems</w:t>
       </w:r>
     </w:p>
     <w:tbl>
@@ -25071,8 +26371,8 @@
         <w:pStyle w:val="Heading1"/>
         <w:rPr/>
       </w:pPr>
-      <w:bookmarkStart w:id="45" w:name="__RefHeading___Toc4100_4006729438"/>
-      <w:bookmarkEnd w:id="45"/>
+      <w:bookmarkStart w:id="46" w:name="__RefHeading___Toc4335_2449894927"/>
+      <w:bookmarkEnd w:id="46"/>
       <w:r>
         <w:rPr/>
         <w:t>Appendix A  Command-line automation</w:t>
@@ -25085,7 +26385,7 @@
       </w:pPr>
       <w:r>
         <w:rPr/>
-        <w:t>Append HMI Studio can build, check, render and publish applications without its window, for scripting and for AI agents:</w:t>
+        <w:t>Append HMI Studio can build, check, render and publish applications without its window, for scripting and for AI agents (section 1.1):</w:t>
       </w:r>
     </w:p>
     <w:p>
@@ -25096,7 +26396,7 @@
       </w:pPr>
       <w:r>
         <w:rPr/>
-        <w:t>Table 28. Command-line modes</w:t>
+        <w:t>Table 30. Command-line modes</w:t>
       </w:r>
     </w:p>
     <w:tbl>
@@ -25539,7 +26839,18 @@
       </w:pPr>
       <w:r>
         <w:rPr/>
-        <w:t>The JSON format is documented in doc/HMI_AUTOMATION.md in the Append HMI Studio repository.</w:t>
+        <w:t xml:space="preserve">Exit code 0 means no problems, 2 means the project was written but has problems (each printed as a </w:t>
+      </w:r>
+      <w:r>
+        <w:rPr>
+          <w:rFonts w:ascii="Consolas" w:hAnsi="Consolas"/>
+          <w:sz w:val="19"/>
+        </w:rPr>
+        <w:t>PROBLEM</w:t>
+      </w:r>
+      <w:r>
+        <w:rPr/>
+        <w:t xml:space="preserve"> line), and 1 means it failed. The JSON format is documented in doc/HMI_AUTOMATION.md in the Append HMI Studio repository, and the Claude Code skill in .claude/skills/append-hmi-studio teaches an agent the whole workflow.</w:t>
       </w:r>
     </w:p>
     <w:sectPr>
@@ -25609,7 +26920,7 @@
       <w:rPr>
         <w:sz w:val="18"/>
       </w:rPr>
-      <w:t>58</w:t>
+      <w:t>60</w:t>
     </w:r>
     <w:r>
       <w:rPr>

</xml_diff>

<commit_message>
docs: the database figures from the installed Windows build
The three new figures were taken on Linux while the chapter was written.
Retaken on the Windows test box from the 1.7.0 install: the Database dialog
on its Data Sources and Bind Lists tabs, and the Batch History screen of
LiquidWeighHMISim after four simulated batches, at the size the manual's
other run screens use.

Co-Authored-By: Claude Opus 5 <noreply@anthropic.com>
</commit_message>
<xml_diff>
--- a/doc/Append-HMI-Studio-User-Manual.docx
+++ b/doc/Append-HMI-Studio-User-Manual.docx
@@ -283,7 +283,7 @@
             </w:rPr>
             <w:fldChar w:fldCharType="separate"/>
           </w:r>
-          <w:hyperlink w:anchor="__RefHeading___Toc6593_1652293764" w:tooltip="1 Introduction">
+          <w:hyperlink w:anchor="__RefHeading___Toc6593_4031843506" w:tooltip="1 Introduction">
             <w:r>
               <w:rPr>
                 <w:rStyle w:val="IndexLink"/>
@@ -304,7 +304,7 @@
             </w:tabs>
             <w:rPr/>
           </w:pPr>
-          <w:hyperlink w:anchor="__RefHeading___Toc6595_1652293764" w:tooltip="1.1 Building applications with an AI agent">
+          <w:hyperlink w:anchor="__RefHeading___Toc6595_4031843506" w:tooltip="1.1 Building applications with an AI agent">
             <w:r>
               <w:rPr>
                 <w:rStyle w:val="IndexLink"/>
@@ -325,7 +325,7 @@
             </w:tabs>
             <w:rPr/>
           </w:pPr>
-          <w:hyperlink w:anchor="__RefHeading___Toc6597_1652293764" w:tooltip="1.2 How an HMI application is organized">
+          <w:hyperlink w:anchor="__RefHeading___Toc6597_4031843506" w:tooltip="1.2 How an HMI application is organized">
             <w:r>
               <w:rPr>
                 <w:rStyle w:val="IndexLink"/>
@@ -346,7 +346,7 @@
             </w:tabs>
             <w:rPr/>
           </w:pPr>
-          <w:hyperlink w:anchor="__RefHeading___Toc6599_1652293764" w:tooltip="2 The Studio window">
+          <w:hyperlink w:anchor="__RefHeading___Toc6599_4031843506" w:tooltip="2 The Studio window">
             <w:r>
               <w:rPr>
                 <w:rStyle w:val="IndexLink"/>
@@ -367,7 +367,7 @@
             </w:tabs>
             <w:rPr/>
           </w:pPr>
-          <w:hyperlink w:anchor="__RefHeading___Toc6601_1652293764" w:tooltip="2.1 The HMI menu">
+          <w:hyperlink w:anchor="__RefHeading___Toc6601_4031843506" w:tooltip="2.1 The HMI menu">
             <w:r>
               <w:rPr>
                 <w:rStyle w:val="IndexLink"/>
@@ -388,7 +388,7 @@
             </w:tabs>
             <w:rPr/>
           </w:pPr>
-          <w:hyperlink w:anchor="__RefHeading___Toc6603_1652293764" w:tooltip="3 Application settings">
+          <w:hyperlink w:anchor="__RefHeading___Toc6603_4031843506" w:tooltip="3 Application settings">
             <w:r>
               <w:rPr>
                 <w:rStyle w:val="IndexLink"/>
@@ -409,7 +409,7 @@
             </w:tabs>
             <w:rPr/>
           </w:pPr>
-          <w:hyperlink w:anchor="__RefHeading___Toc6605_1652293764" w:tooltip="4 Devices">
+          <w:hyperlink w:anchor="__RefHeading___Toc6605_4031843506" w:tooltip="4 Devices">
             <w:r>
               <w:rPr>
                 <w:rStyle w:val="IndexLink"/>
@@ -430,7 +430,7 @@
             </w:tabs>
             <w:rPr/>
           </w:pPr>
-          <w:hyperlink w:anchor="__RefHeading___Toc6607_1652293764" w:tooltip="5 Tags">
+          <w:hyperlink w:anchor="__RefHeading___Toc6607_4031843506" w:tooltip="5 Tags">
             <w:r>
               <w:rPr>
                 <w:rStyle w:val="IndexLink"/>
@@ -451,7 +451,7 @@
             </w:tabs>
             <w:rPr/>
           </w:pPr>
-          <w:hyperlink w:anchor="__RefHeading___Toc6609_1652293764" w:tooltip="5.1 Tag fields">
+          <w:hyperlink w:anchor="__RefHeading___Toc6609_4031843506" w:tooltip="5.1 Tag fields">
             <w:r>
               <w:rPr>
                 <w:rStyle w:val="IndexLink"/>
@@ -472,7 +472,7 @@
             </w:tabs>
             <w:rPr/>
           </w:pPr>
-          <w:hyperlink w:anchor="__RefHeading___Toc6611_1652293764" w:tooltip="5.2 Alarms on a tag">
+          <w:hyperlink w:anchor="__RefHeading___Toc6611_4031843506" w:tooltip="5.2 Alarms on a tag">
             <w:r>
               <w:rPr>
                 <w:rStyle w:val="IndexLink"/>
@@ -493,7 +493,7 @@
             </w:tabs>
             <w:rPr/>
           </w:pPr>
-          <w:hyperlink w:anchor="__RefHeading___Toc6613_1652293764" w:tooltip="5.3 Renaming, and finding and replacing tag references">
+          <w:hyperlink w:anchor="__RefHeading___Toc6613_4031843506" w:tooltip="5.3 Renaming, and finding and replacing tag references">
             <w:r>
               <w:rPr>
                 <w:rStyle w:val="IndexLink"/>
@@ -514,7 +514,7 @@
             </w:tabs>
             <w:rPr/>
           </w:pPr>
-          <w:hyperlink w:anchor="__RefHeading___Toc6615_1652293764" w:tooltip="6 Screens and windows">
+          <w:hyperlink w:anchor="__RefHeading___Toc6615_4031843506" w:tooltip="6 Screens and windows">
             <w:r>
               <w:rPr>
                 <w:rStyle w:val="IndexLink"/>
@@ -535,7 +535,7 @@
             </w:tabs>
             <w:rPr/>
           </w:pPr>
-          <w:hyperlink w:anchor="__RefHeading___Toc6617_1652293764" w:tooltip="6.1 Window properties">
+          <w:hyperlink w:anchor="__RefHeading___Toc6617_4031843506" w:tooltip="6.1 Window properties">
             <w:r>
               <w:rPr>
                 <w:rStyle w:val="IndexLink"/>
@@ -556,7 +556,7 @@
             </w:tabs>
             <w:rPr/>
           </w:pPr>
-          <w:hyperlink w:anchor="__RefHeading___Toc6619_1652293764" w:tooltip="6.2 The header, the navigation bar and the screens">
+          <w:hyperlink w:anchor="__RefHeading___Toc6619_4031843506" w:tooltip="6.2 The header, the navigation bar and the screens">
             <w:r>
               <w:rPr>
                 <w:rStyle w:val="IndexLink"/>
@@ -577,7 +577,7 @@
             </w:tabs>
             <w:rPr/>
           </w:pPr>
-          <w:hyperlink w:anchor="__RefHeading___Toc6621_1652293764" w:tooltip="7 Drawing objects">
+          <w:hyperlink w:anchor="__RefHeading___Toc6621_4031843506" w:tooltip="7 Drawing objects">
             <w:r>
               <w:rPr>
                 <w:rStyle w:val="IndexLink"/>
@@ -598,7 +598,7 @@
             </w:tabs>
             <w:rPr/>
           </w:pPr>
-          <w:hyperlink w:anchor="__RefHeading___Toc6623_1652293764" w:tooltip="8 Animation links">
+          <w:hyperlink w:anchor="__RefHeading___Toc6623_4031843506" w:tooltip="8 Animation links">
             <w:r>
               <w:rPr>
                 <w:rStyle w:val="IndexLink"/>
@@ -619,7 +619,7 @@
             </w:tabs>
             <w:rPr/>
           </w:pPr>
-          <w:hyperlink w:anchor="__RefHeading___Toc6625_1652293764" w:tooltip="8.1 A valve: status color, fault blink and faceplate">
+          <w:hyperlink w:anchor="__RefHeading___Toc6625_4031843506" w:tooltip="8.1 A valve: status color, fault blink and faceplate">
             <w:r>
               <w:rPr>
                 <w:rStyle w:val="IndexLink"/>
@@ -640,7 +640,7 @@
             </w:tabs>
             <w:rPr/>
           </w:pPr>
-          <w:hyperlink w:anchor="__RefHeading___Toc6627_1652293764" w:tooltip="8.2 The weigh hopper: percent fill">
+          <w:hyperlink w:anchor="__RefHeading___Toc6627_4031843506" w:tooltip="8.2 The weigh hopper: percent fill">
             <w:r>
               <w:rPr>
                 <w:rStyle w:val="IndexLink"/>
@@ -661,7 +661,7 @@
             </w:tabs>
             <w:rPr/>
           </w:pPr>
-          <w:hyperlink w:anchor="__RefHeading___Toc6629_1652293764" w:tooltip="8.3 Hopper pressure: value display and alarm colors">
+          <w:hyperlink w:anchor="__RefHeading___Toc6629_4031843506" w:tooltip="8.3 Hopper pressure: value display and alarm colors">
             <w:r>
               <w:rPr>
                 <w:rStyle w:val="IndexLink"/>
@@ -682,7 +682,7 @@
             </w:tabs>
             <w:rPr/>
           </w:pPr>
-          <w:hyperlink w:anchor="__RefHeading___Toc6631_1652293764" w:tooltip="8.4 Setpoints: user input">
+          <w:hyperlink w:anchor="__RefHeading___Toc6631_4031843506" w:tooltip="8.4 Setpoints: user input">
             <w:r>
               <w:rPr>
                 <w:rStyle w:val="IndexLink"/>
@@ -703,7 +703,7 @@
             </w:tabs>
             <w:rPr/>
           </w:pPr>
-          <w:hyperlink w:anchor="__RefHeading___Toc6633_1652293764" w:tooltip="8.5 Commands: pushbutton and enable">
+          <w:hyperlink w:anchor="__RefHeading___Toc6633_4031843506" w:tooltip="8.5 Commands: pushbutton and enable">
             <w:r>
               <w:rPr>
                 <w:rStyle w:val="IndexLink"/>
@@ -724,7 +724,7 @@
             </w:tabs>
             <w:rPr/>
           </w:pPr>
-          <w:hyperlink w:anchor="__RefHeading___Toc6635_1652293764" w:tooltip="9 Expressions and scripts">
+          <w:hyperlink w:anchor="__RefHeading___Toc6635_4031843506" w:tooltip="9 Expressions and scripts">
             <w:r>
               <w:rPr>
                 <w:rStyle w:val="IndexLink"/>
@@ -745,7 +745,7 @@
             </w:tabs>
             <w:rPr/>
           </w:pPr>
-          <w:hyperlink w:anchor="__RefHeading___Toc6637_1652293764" w:tooltip="9.1 Window and application scripts">
+          <w:hyperlink w:anchor="__RefHeading___Toc6637_4031843506" w:tooltip="9.1 Window and application scripts">
             <w:r>
               <w:rPr>
                 <w:rStyle w:val="IndexLink"/>
@@ -766,7 +766,7 @@
             </w:tabs>
             <w:rPr/>
           </w:pPr>
-          <w:hyperlink w:anchor="__RefHeading___Toc6639_1652293764" w:tooltip="9.2 Action scripts">
+          <w:hyperlink w:anchor="__RefHeading___Toc6639_4031843506" w:tooltip="9.2 Action scripts">
             <w:r>
               <w:rPr>
                 <w:rStyle w:val="IndexLink"/>
@@ -787,7 +787,7 @@
             </w:tabs>
             <w:rPr/>
           </w:pPr>
-          <w:hyperlink w:anchor="__RefHeading___Toc6641_1652293764" w:tooltip="9.3 Function reference">
+          <w:hyperlink w:anchor="__RefHeading___Toc6641_4031843506" w:tooltip="9.3 Function reference">
             <w:r>
               <w:rPr>
                 <w:rStyle w:val="IndexLink"/>
@@ -808,7 +808,7 @@
             </w:tabs>
             <w:rPr/>
           </w:pPr>
-          <w:hyperlink w:anchor="__RefHeading___Toc6643_1652293764" w:tooltip="9.4 Indirect tags: one faceplate for every device">
+          <w:hyperlink w:anchor="__RefHeading___Toc6643_4031843506" w:tooltip="9.4 Indirect tags: one faceplate for every device">
             <w:r>
               <w:rPr>
                 <w:rStyle w:val="IndexLink"/>
@@ -829,7 +829,7 @@
             </w:tabs>
             <w:rPr/>
           </w:pPr>
-          <w:hyperlink w:anchor="__RefHeading___Toc6645_1652293764" w:tooltip="9.5 Opening windows from scripts: ShowWindow">
+          <w:hyperlink w:anchor="__RefHeading___Toc6645_4031843506" w:tooltip="9.5 Opening windows from scripts: ShowWindow">
             <w:r>
               <w:rPr>
                 <w:rStyle w:val="IndexLink"/>
@@ -850,7 +850,7 @@
             </w:tabs>
             <w:rPr/>
           </w:pPr>
-          <w:hyperlink w:anchor="__RefHeading___Toc6647_1652293764" w:tooltip="9.6 Saving the screen as a PDF: ScreenToPDF">
+          <w:hyperlink w:anchor="__RefHeading___Toc6647_4031843506" w:tooltip="9.6 Saving the screen as a PDF: ScreenToPDF">
             <w:r>
               <w:rPr>
                 <w:rStyle w:val="IndexLink"/>
@@ -871,7 +871,7 @@
             </w:tabs>
             <w:rPr/>
           </w:pPr>
-          <w:hyperlink w:anchor="__RefHeading___Toc6649_1652293764" w:tooltip="9.7 Local variables: DIM">
+          <w:hyperlink w:anchor="__RefHeading___Toc6649_4031843506" w:tooltip="9.7 Local variables: DIM">
             <w:r>
               <w:rPr>
                 <w:rStyle w:val="IndexLink"/>
@@ -892,7 +892,7 @@
             </w:tabs>
             <w:rPr/>
           </w:pPr>
-          <w:hyperlink w:anchor="__RefHeading___Toc6651_1652293764" w:tooltip="9.8 QuickFunctions">
+          <w:hyperlink w:anchor="__RefHeading___Toc6651_4031843506" w:tooltip="9.8 QuickFunctions">
             <w:r>
               <w:rPr>
                 <w:rStyle w:val="IndexLink"/>
@@ -913,7 +913,7 @@
             </w:tabs>
             <w:rPr/>
           </w:pPr>
-          <w:hyperlink w:anchor="__RefHeading___Toc6653_1652293764" w:tooltip="10 Alarms and security">
+          <w:hyperlink w:anchor="__RefHeading___Toc6653_4031843506" w:tooltip="10 Alarms and security">
             <w:r>
               <w:rPr>
                 <w:rStyle w:val="IndexLink"/>
@@ -934,7 +934,7 @@
             </w:tabs>
             <w:rPr/>
           </w:pPr>
-          <w:hyperlink w:anchor="__RefHeading___Toc6655_1652293764" w:tooltip="10.1 Alarms">
+          <w:hyperlink w:anchor="__RefHeading___Toc6655_4031843506" w:tooltip="10.1 Alarms">
             <w:r>
               <w:rPr>
                 <w:rStyle w:val="IndexLink"/>
@@ -955,7 +955,7 @@
             </w:tabs>
             <w:rPr/>
           </w:pPr>
-          <w:hyperlink w:anchor="__RefHeading___Toc6657_1652293764" w:tooltip="10.2 Users and access levels">
+          <w:hyperlink w:anchor="__RefHeading___Toc6657_4031843506" w:tooltip="10.2 Users and access levels">
             <w:r>
               <w:rPr>
                 <w:rStyle w:val="IndexLink"/>
@@ -976,7 +976,7 @@
             </w:tabs>
             <w:rPr/>
           </w:pPr>
-          <w:hyperlink w:anchor="__RefHeading___Toc6659_1652293764" w:tooltip="11 Recipes">
+          <w:hyperlink w:anchor="__RefHeading___Toc6659_4031843506" w:tooltip="11 Recipes">
             <w:r>
               <w:rPr>
                 <w:rStyle w:val="IndexLink"/>
@@ -997,7 +997,7 @@
             </w:tabs>
             <w:rPr/>
           </w:pPr>
-          <w:hyperlink w:anchor="__RefHeading___Toc6661_1652293764" w:tooltip="11.1 Recipe books">
+          <w:hyperlink w:anchor="__RefHeading___Toc6661_4031843506" w:tooltip="11.1 Recipe books">
             <w:r>
               <w:rPr>
                 <w:rStyle w:val="IndexLink"/>
@@ -1018,7 +1018,7 @@
             </w:tabs>
             <w:rPr/>
           </w:pPr>
-          <w:hyperlink w:anchor="__RefHeading___Toc6663_1652293764" w:tooltip="11.2 The Recipes screen">
+          <w:hyperlink w:anchor="__RefHeading___Toc6663_4031843506" w:tooltip="11.2 The Recipes screen">
             <w:r>
               <w:rPr>
                 <w:rStyle w:val="IndexLink"/>
@@ -1039,7 +1039,7 @@
             </w:tabs>
             <w:rPr/>
           </w:pPr>
-          <w:hyperlink w:anchor="__RefHeading___Toc6665_1652293764" w:tooltip="11.3 The Recipe List object">
+          <w:hyperlink w:anchor="__RefHeading___Toc6665_4031843506" w:tooltip="11.3 The Recipe List object">
             <w:r>
               <w:rPr>
                 <w:rStyle w:val="IndexLink"/>
@@ -1060,7 +1060,7 @@
             </w:tabs>
             <w:rPr/>
           </w:pPr>
-          <w:hyperlink w:anchor="__RefHeading___Toc6667_1652293764" w:tooltip="11.4 Selecting a recipe in a window">
+          <w:hyperlink w:anchor="__RefHeading___Toc6667_4031843506" w:tooltip="11.4 Selecting a recipe in a window">
             <w:r>
               <w:rPr>
                 <w:rStyle w:val="IndexLink"/>
@@ -1081,7 +1081,7 @@
             </w:tabs>
             <w:rPr/>
           </w:pPr>
-          <w:hyperlink w:anchor="__RefHeading___Toc6669_1652293764" w:tooltip="11.5 When a recipe function fails">
+          <w:hyperlink w:anchor="__RefHeading___Toc6669_4031843506" w:tooltip="11.5 When a recipe function fails">
             <w:r>
               <w:rPr>
                 <w:rStyle w:val="IndexLink"/>
@@ -1102,7 +1102,7 @@
             </w:tabs>
             <w:rPr/>
           </w:pPr>
-          <w:hyperlink w:anchor="__RefHeading___Toc6671_1652293764" w:tooltip="11.6 Where recipes are kept">
+          <w:hyperlink w:anchor="__RefHeading___Toc6671_4031843506" w:tooltip="11.6 Where recipes are kept">
             <w:r>
               <w:rPr>
                 <w:rStyle w:val="IndexLink"/>
@@ -1123,7 +1123,7 @@
             </w:tabs>
             <w:rPr/>
           </w:pPr>
-          <w:hyperlink w:anchor="__RefHeading___Toc6673_1652293764" w:tooltip="12 Trends">
+          <w:hyperlink w:anchor="__RefHeading___Toc6673_4031843506" w:tooltip="12 Trends">
             <w:r>
               <w:rPr>
                 <w:rStyle w:val="IndexLink"/>
@@ -1144,7 +1144,7 @@
             </w:tabs>
             <w:rPr/>
           </w:pPr>
-          <w:hyperlink w:anchor="__RefHeading___Toc6675_1652293764" w:tooltip="12.1 The Trend object">
+          <w:hyperlink w:anchor="__RefHeading___Toc6675_4031843506" w:tooltip="12.1 The Trend object">
             <w:r>
               <w:rPr>
                 <w:rStyle w:val="IndexLink"/>
@@ -1165,7 +1165,7 @@
             </w:tabs>
             <w:rPr/>
           </w:pPr>
-          <w:hyperlink w:anchor="__RefHeading___Toc6677_1652293764" w:tooltip="12.2 Pens and their ranges">
+          <w:hyperlink w:anchor="__RefHeading___Toc6677_4031843506" w:tooltip="12.2 Pens and their ranges">
             <w:r>
               <w:rPr>
                 <w:rStyle w:val="IndexLink"/>
@@ -1186,7 +1186,7 @@
             </w:tabs>
             <w:rPr/>
           </w:pPr>
-          <w:hyperlink w:anchor="__RefHeading___Toc6679_1652293764" w:tooltip="12.3 The Trends screen">
+          <w:hyperlink w:anchor="__RefHeading___Toc6679_4031843506" w:tooltip="12.3 The Trends screen">
             <w:r>
               <w:rPr>
                 <w:rStyle w:val="IndexLink"/>
@@ -1207,7 +1207,7 @@
             </w:tabs>
             <w:rPr/>
           </w:pPr>
-          <w:hyperlink w:anchor="__RefHeading___Toc6681_1652293764" w:tooltip="12.4 Scrolling through the history">
+          <w:hyperlink w:anchor="__RefHeading___Toc6681_4031843506" w:tooltip="12.4 Scrolling through the history">
             <w:r>
               <w:rPr>
                 <w:rStyle w:val="IndexLink"/>
@@ -1228,7 +1228,7 @@
             </w:tabs>
             <w:rPr/>
           </w:pPr>
-          <w:hyperlink w:anchor="__RefHeading___Toc6683_1652293764" w:tooltip="12.5 Recording and where the history is kept">
+          <w:hyperlink w:anchor="__RefHeading___Toc6683_4031843506" w:tooltip="12.5 Recording and where the history is kept">
             <w:r>
               <w:rPr>
                 <w:rStyle w:val="IndexLink"/>
@@ -1249,7 +1249,7 @@
             </w:tabs>
             <w:rPr/>
           </w:pPr>
-          <w:hyperlink w:anchor="__RefHeading___Toc6685_1652293764" w:tooltip="13 Databases">
+          <w:hyperlink w:anchor="__RefHeading___Toc6685_4031843506" w:tooltip="13 Databases">
             <w:r>
               <w:rPr>
                 <w:rStyle w:val="IndexLink"/>
@@ -1270,7 +1270,7 @@
             </w:tabs>
             <w:rPr/>
           </w:pPr>
-          <w:hyperlink w:anchor="__RefHeading___Toc6687_1652293764" w:tooltip="13.1 Data sources">
+          <w:hyperlink w:anchor="__RefHeading___Toc6687_4031843506" w:tooltip="13.1 Data sources">
             <w:r>
               <w:rPr>
                 <w:rStyle w:val="IndexLink"/>
@@ -1291,7 +1291,7 @@
             </w:tabs>
             <w:rPr/>
           </w:pPr>
-          <w:hyperlink w:anchor="__RefHeading___Toc6689_1652293764" w:tooltip="13.2 Bind lists">
+          <w:hyperlink w:anchor="__RefHeading___Toc6689_4031843506" w:tooltip="13.2 Bind lists">
             <w:r>
               <w:rPr>
                 <w:rStyle w:val="IndexLink"/>
@@ -1312,7 +1312,7 @@
             </w:tabs>
             <w:rPr/>
           </w:pPr>
-          <w:hyperlink w:anchor="__RefHeading___Toc6691_1652293764" w:tooltip="13.3 Table templates and queries">
+          <w:hyperlink w:anchor="__RefHeading___Toc6691_4031843506" w:tooltip="13.3 Table templates and queries">
             <w:r>
               <w:rPr>
                 <w:rStyle w:val="IndexLink"/>
@@ -1333,7 +1333,7 @@
             </w:tabs>
             <w:rPr/>
           </w:pPr>
-          <w:hyperlink w:anchor="__RefHeading___Toc6693_1652293764" w:tooltip="13.4 The script functions">
+          <w:hyperlink w:anchor="__RefHeading___Toc6693_4031843506" w:tooltip="13.4 The script functions">
             <w:r>
               <w:rPr>
                 <w:rStyle w:val="IndexLink"/>
@@ -1354,7 +1354,7 @@
             </w:tabs>
             <w:rPr/>
           </w:pPr>
-          <w:hyperlink w:anchor="__RefHeading___Toc6695_1652293764" w:tooltip="13.5 The batch log in LiquidWeighHMI">
+          <w:hyperlink w:anchor="__RefHeading___Toc6695_4031843506" w:tooltip="13.5 The batch log in LiquidWeighHMI">
             <w:r>
               <w:rPr>
                 <w:rStyle w:val="IndexLink"/>
@@ -1375,7 +1375,7 @@
             </w:tabs>
             <w:rPr/>
           </w:pPr>
-          <w:hyperlink w:anchor="__RefHeading___Toc6697_1652293764" w:tooltip="13.6 Where the rows are kept">
+          <w:hyperlink w:anchor="__RefHeading___Toc6697_4031843506" w:tooltip="13.6 Where the rows are kept">
             <w:r>
               <w:rPr>
                 <w:rStyle w:val="IndexLink"/>
@@ -1396,7 +1396,7 @@
             </w:tabs>
             <w:rPr/>
           </w:pPr>
-          <w:hyperlink w:anchor="__RefHeading___Toc6699_1652293764" w:tooltip="14 Testing">
+          <w:hyperlink w:anchor="__RefHeading___Toc6699_4031843506" w:tooltip="14 Testing">
             <w:r>
               <w:rPr>
                 <w:rStyle w:val="IndexLink"/>
@@ -1417,7 +1417,7 @@
             </w:tabs>
             <w:rPr/>
           </w:pPr>
-          <w:hyperlink w:anchor="__RefHeading___Toc6701_1652293764" w:tooltip="14.1 Validate">
+          <w:hyperlink w:anchor="__RefHeading___Toc6701_4031843506" w:tooltip="14.1 Validate">
             <w:r>
               <w:rPr>
                 <w:rStyle w:val="IndexLink"/>
@@ -1438,7 +1438,7 @@
             </w:tabs>
             <w:rPr/>
           </w:pPr>
-          <w:hyperlink w:anchor="__RefHeading___Toc6703_1652293764" w:tooltip="14.2 Run">
+          <w:hyperlink w:anchor="__RefHeading___Toc6703_4031843506" w:tooltip="14.2 Run">
             <w:r>
               <w:rPr>
                 <w:rStyle w:val="IndexLink"/>
@@ -1459,7 +1459,7 @@
             </w:tabs>
             <w:rPr/>
           </w:pPr>
-          <w:hyperlink w:anchor="__RefHeading___Toc6705_1652293764" w:tooltip="15 Deploying">
+          <w:hyperlink w:anchor="__RefHeading___Toc6705_4031843506" w:tooltip="15 Deploying">
             <w:r>
               <w:rPr>
                 <w:rStyle w:val="IndexLink"/>
@@ -1480,7 +1480,7 @@
             </w:tabs>
             <w:rPr/>
           </w:pPr>
-          <w:hyperlink w:anchor="__RefHeading___Toc6707_1652293764" w:tooltip="15.1 Publish">
+          <w:hyperlink w:anchor="__RefHeading___Toc6707_4031843506" w:tooltip="15.1 Publish">
             <w:r>
               <w:rPr>
                 <w:rStyle w:val="IndexLink"/>
@@ -1501,7 +1501,7 @@
             </w:tabs>
             <w:rPr/>
           </w:pPr>
-          <w:hyperlink w:anchor="__RefHeading___Toc6709_1652293764" w:tooltip="15.2 Append HMI Desktop">
+          <w:hyperlink w:anchor="__RefHeading___Toc6709_4031843506" w:tooltip="15.2 Append HMI Desktop">
             <w:r>
               <w:rPr>
                 <w:rStyle w:val="IndexLink"/>
@@ -1522,7 +1522,7 @@
             </w:tabs>
             <w:rPr/>
           </w:pPr>
-          <w:hyperlink w:anchor="__RefHeading___Toc6711_1652293764" w:tooltip="15.3 Append HMI Web">
+          <w:hyperlink w:anchor="__RefHeading___Toc6711_4031843506" w:tooltip="15.3 Append HMI Web">
             <w:r>
               <w:rPr>
                 <w:rStyle w:val="IndexLink"/>
@@ -1543,7 +1543,7 @@
             </w:tabs>
             <w:rPr/>
           </w:pPr>
-          <w:hyperlink w:anchor="__RefHeading___Toc6713_1652293764" w:tooltip="16 Tips and troubleshooting">
+          <w:hyperlink w:anchor="__RefHeading___Toc6713_4031843506" w:tooltip="16 Tips and troubleshooting">
             <w:r>
               <w:rPr>
                 <w:rStyle w:val="IndexLink"/>
@@ -1564,7 +1564,7 @@
             </w:tabs>
             <w:rPr/>
           </w:pPr>
-          <w:hyperlink w:anchor="__RefHeading___Toc6715_1652293764" w:tooltip="Appendix A Command-line automation">
+          <w:hyperlink w:anchor="__RefHeading___Toc6715_4031843506" w:tooltip="Appendix A Command-line automation">
             <w:r>
               <w:rPr>
                 <w:rStyle w:val="IndexLink"/>
@@ -1602,7 +1602,7 @@
         <w:spacing w:before="0" w:after="0"/>
         <w:rPr/>
       </w:pPr>
-      <w:bookmarkStart w:id="0" w:name="__RefHeading___Toc6593_1652293764"/>
+      <w:bookmarkStart w:id="0" w:name="__RefHeading___Toc6593_4031843506"/>
       <w:bookmarkEnd w:id="0"/>
       <w:r>
         <w:rPr/>
@@ -2458,7 +2458,7 @@
         <w:pStyle w:val="Heading2"/>
         <w:rPr/>
       </w:pPr>
-      <w:bookmarkStart w:id="1" w:name="__RefHeading___Toc6595_1652293764"/>
+      <w:bookmarkStart w:id="1" w:name="__RefHeading___Toc6595_4031843506"/>
       <w:bookmarkEnd w:id="1"/>
       <w:r>
         <w:rPr/>
@@ -3648,7 +3648,7 @@
         <w:pStyle w:val="Heading2"/>
         <w:rPr/>
       </w:pPr>
-      <w:bookmarkStart w:id="2" w:name="__RefHeading___Toc6597_1652293764"/>
+      <w:bookmarkStart w:id="2" w:name="__RefHeading___Toc6597_4031843506"/>
       <w:bookmarkEnd w:id="2"/>
       <w:r>
         <w:rPr/>
@@ -3791,7 +3791,7 @@
         <w:pStyle w:val="Heading1"/>
         <w:rPr/>
       </w:pPr>
-      <w:bookmarkStart w:id="3" w:name="__RefHeading___Toc6599_1652293764"/>
+      <w:bookmarkStart w:id="3" w:name="__RefHeading___Toc6599_4031843506"/>
       <w:bookmarkEnd w:id="3"/>
       <w:r>
         <w:rPr/>
@@ -4369,7 +4369,7 @@
         <w:pStyle w:val="Heading2"/>
         <w:rPr/>
       </w:pPr>
-      <w:bookmarkStart w:id="4" w:name="__RefHeading___Toc6601_1652293764"/>
+      <w:bookmarkStart w:id="4" w:name="__RefHeading___Toc6601_4031843506"/>
       <w:bookmarkEnd w:id="4"/>
       <w:r>
         <w:rPr/>
@@ -5409,7 +5409,7 @@
         <w:pStyle w:val="Heading1"/>
         <w:rPr/>
       </w:pPr>
-      <w:bookmarkStart w:id="5" w:name="__RefHeading___Toc6603_1652293764"/>
+      <w:bookmarkStart w:id="5" w:name="__RefHeading___Toc6603_4031843506"/>
       <w:bookmarkEnd w:id="5"/>
       <w:r>
         <w:rPr/>
@@ -5741,7 +5741,7 @@
         <w:pStyle w:val="Heading1"/>
         <w:rPr/>
       </w:pPr>
-      <w:bookmarkStart w:id="6" w:name="__RefHeading___Toc6605_1652293764"/>
+      <w:bookmarkStart w:id="6" w:name="__RefHeading___Toc6605_4031843506"/>
       <w:bookmarkEnd w:id="6"/>
       <w:r>
         <w:rPr/>
@@ -6536,7 +6536,7 @@
         <w:pStyle w:val="Heading1"/>
         <w:rPr/>
       </w:pPr>
-      <w:bookmarkStart w:id="7" w:name="__RefHeading___Toc6607_1652293764"/>
+      <w:bookmarkStart w:id="7" w:name="__RefHeading___Toc6607_4031843506"/>
       <w:bookmarkEnd w:id="7"/>
       <w:r>
         <w:rPr/>
@@ -7367,7 +7367,7 @@
         <w:pStyle w:val="Heading2"/>
         <w:rPr/>
       </w:pPr>
-      <w:bookmarkStart w:id="8" w:name="__RefHeading___Toc6609_1652293764"/>
+      <w:bookmarkStart w:id="8" w:name="__RefHeading___Toc6609_4031843506"/>
       <w:bookmarkEnd w:id="8"/>
       <w:r>
         <w:rPr/>
@@ -8017,7 +8017,7 @@
         <w:pStyle w:val="Heading2"/>
         <w:rPr/>
       </w:pPr>
-      <w:bookmarkStart w:id="9" w:name="__RefHeading___Toc6611_1652293764"/>
+      <w:bookmarkStart w:id="9" w:name="__RefHeading___Toc6611_4031843506"/>
       <w:bookmarkEnd w:id="9"/>
       <w:r>
         <w:rPr/>
@@ -8149,7 +8149,7 @@
         <w:pStyle w:val="Heading2"/>
         <w:rPr/>
       </w:pPr>
-      <w:bookmarkStart w:id="10" w:name="__RefHeading___Toc6613_1652293764"/>
+      <w:bookmarkStart w:id="10" w:name="__RefHeading___Toc6613_4031843506"/>
       <w:bookmarkEnd w:id="10"/>
       <w:r>
         <w:rPr/>
@@ -8279,7 +8279,7 @@
         <w:pStyle w:val="Heading1"/>
         <w:rPr/>
       </w:pPr>
-      <w:bookmarkStart w:id="11" w:name="__RefHeading___Toc6615_1652293764"/>
+      <w:bookmarkStart w:id="11" w:name="__RefHeading___Toc6615_4031843506"/>
       <w:bookmarkEnd w:id="11"/>
       <w:r>
         <w:rPr/>
@@ -8792,7 +8792,7 @@
         <w:pStyle w:val="Heading2"/>
         <w:rPr/>
       </w:pPr>
-      <w:bookmarkStart w:id="12" w:name="__RefHeading___Toc6617_1652293764"/>
+      <w:bookmarkStart w:id="12" w:name="__RefHeading___Toc6617_4031843506"/>
       <w:bookmarkEnd w:id="12"/>
       <w:r>
         <w:rPr/>
@@ -8954,7 +8954,7 @@
         <w:pStyle w:val="Heading2"/>
         <w:rPr/>
       </w:pPr>
-      <w:bookmarkStart w:id="13" w:name="__RefHeading___Toc6619_1652293764"/>
+      <w:bookmarkStart w:id="13" w:name="__RefHeading___Toc6619_4031843506"/>
       <w:bookmarkEnd w:id="13"/>
       <w:r>
         <w:rPr/>
@@ -9126,7 +9126,7 @@
         <w:pStyle w:val="Heading1"/>
         <w:rPr/>
       </w:pPr>
-      <w:bookmarkStart w:id="14" w:name="__RefHeading___Toc6621_1652293764"/>
+      <w:bookmarkStart w:id="14" w:name="__RefHeading___Toc6621_4031843506"/>
       <w:bookmarkEnd w:id="14"/>
       <w:r>
         <w:rPr/>
@@ -9892,7 +9892,7 @@
         <w:pStyle w:val="Heading1"/>
         <w:rPr/>
       </w:pPr>
-      <w:bookmarkStart w:id="15" w:name="__RefHeading___Toc6623_1652293764"/>
+      <w:bookmarkStart w:id="15" w:name="__RefHeading___Toc6623_4031843506"/>
       <w:bookmarkEnd w:id="15"/>
       <w:r>
         <w:rPr/>
@@ -10617,7 +10617,7 @@
         <w:pStyle w:val="Heading2"/>
         <w:rPr/>
       </w:pPr>
-      <w:bookmarkStart w:id="16" w:name="__RefHeading___Toc6625_1652293764"/>
+      <w:bookmarkStart w:id="16" w:name="__RefHeading___Toc6625_4031843506"/>
       <w:bookmarkEnd w:id="16"/>
       <w:r>
         <w:rPr/>
@@ -10803,7 +10803,7 @@
         <w:pStyle w:val="Heading2"/>
         <w:rPr/>
       </w:pPr>
-      <w:bookmarkStart w:id="17" w:name="__RefHeading___Toc6627_1652293764"/>
+      <w:bookmarkStart w:id="17" w:name="__RefHeading___Toc6627_4031843506"/>
       <w:bookmarkEnd w:id="17"/>
       <w:r>
         <w:rPr/>
@@ -10924,7 +10924,7 @@
         <w:pStyle w:val="Heading2"/>
         <w:rPr/>
       </w:pPr>
-      <w:bookmarkStart w:id="18" w:name="__RefHeading___Toc6629_1652293764"/>
+      <w:bookmarkStart w:id="18" w:name="__RefHeading___Toc6629_4031843506"/>
       <w:bookmarkEnd w:id="18"/>
       <w:r>
         <w:rPr/>
@@ -11040,7 +11040,7 @@
         <w:pStyle w:val="Heading2"/>
         <w:rPr/>
       </w:pPr>
-      <w:bookmarkStart w:id="19" w:name="__RefHeading___Toc6631_1652293764"/>
+      <w:bookmarkStart w:id="19" w:name="__RefHeading___Toc6631_4031843506"/>
       <w:bookmarkEnd w:id="19"/>
       <w:r>
         <w:rPr/>
@@ -11156,7 +11156,7 @@
         <w:pStyle w:val="Heading2"/>
         <w:rPr/>
       </w:pPr>
-      <w:bookmarkStart w:id="20" w:name="__RefHeading___Toc6633_1652293764"/>
+      <w:bookmarkStart w:id="20" w:name="__RefHeading___Toc6633_4031843506"/>
       <w:bookmarkEnd w:id="20"/>
       <w:r>
         <w:rPr/>
@@ -11668,7 +11668,7 @@
         <w:pStyle w:val="Heading1"/>
         <w:rPr/>
       </w:pPr>
-      <w:bookmarkStart w:id="21" w:name="__RefHeading___Toc6635_1652293764"/>
+      <w:bookmarkStart w:id="21" w:name="__RefHeading___Toc6635_4031843506"/>
       <w:bookmarkEnd w:id="21"/>
       <w:r>
         <w:rPr/>
@@ -12847,7 +12847,7 @@
         <w:pStyle w:val="Heading2"/>
         <w:rPr/>
       </w:pPr>
-      <w:bookmarkStart w:id="22" w:name="__RefHeading___Toc6637_1652293764"/>
+      <w:bookmarkStart w:id="22" w:name="__RefHeading___Toc6637_4031843506"/>
       <w:bookmarkEnd w:id="22"/>
       <w:r>
         <w:rPr/>
@@ -13259,7 +13259,7 @@
         <w:pStyle w:val="Heading2"/>
         <w:rPr/>
       </w:pPr>
-      <w:bookmarkStart w:id="23" w:name="__RefHeading___Toc6639_1652293764"/>
+      <w:bookmarkStart w:id="23" w:name="__RefHeading___Toc6639_4031843506"/>
       <w:bookmarkEnd w:id="23"/>
       <w:r>
         <w:rPr/>
@@ -13378,7 +13378,7 @@
         <w:pStyle w:val="Heading2"/>
         <w:rPr/>
       </w:pPr>
-      <w:bookmarkStart w:id="24" w:name="__RefHeading___Toc6641_1652293764"/>
+      <w:bookmarkStart w:id="24" w:name="__RefHeading___Toc6641_4031843506"/>
       <w:bookmarkEnd w:id="24"/>
       <w:r>
         <w:rPr/>
@@ -19743,7 +19743,7 @@
         <w:pStyle w:val="Heading2"/>
         <w:rPr/>
       </w:pPr>
-      <w:bookmarkStart w:id="25" w:name="__RefHeading___Toc6643_1652293764"/>
+      <w:bookmarkStart w:id="25" w:name="__RefHeading___Toc6643_4031843506"/>
       <w:bookmarkEnd w:id="25"/>
       <w:r>
         <w:rPr/>
@@ -20579,7 +20579,7 @@
         <w:pStyle w:val="Heading2"/>
         <w:rPr/>
       </w:pPr>
-      <w:bookmarkStart w:id="26" w:name="__RefHeading___Toc6645_1652293764"/>
+      <w:bookmarkStart w:id="26" w:name="__RefHeading___Toc6645_4031843506"/>
       <w:bookmarkEnd w:id="26"/>
       <w:r>
         <w:rPr/>
@@ -21062,7 +21062,7 @@
         <w:pStyle w:val="Heading2"/>
         <w:rPr/>
       </w:pPr>
-      <w:bookmarkStart w:id="27" w:name="__RefHeading___Toc6647_1652293764"/>
+      <w:bookmarkStart w:id="27" w:name="__RefHeading___Toc6647_4031843506"/>
       <w:bookmarkEnd w:id="27"/>
       <w:r>
         <w:rPr/>
@@ -21254,7 +21254,7 @@
         <w:pStyle w:val="Heading2"/>
         <w:rPr/>
       </w:pPr>
-      <w:bookmarkStart w:id="28" w:name="__RefHeading___Toc6649_1652293764"/>
+      <w:bookmarkStart w:id="28" w:name="__RefHeading___Toc6649_4031843506"/>
       <w:bookmarkEnd w:id="28"/>
       <w:r>
         <w:rPr/>
@@ -21940,7 +21940,7 @@
         <w:pStyle w:val="Heading2"/>
         <w:rPr/>
       </w:pPr>
-      <w:bookmarkStart w:id="29" w:name="__RefHeading___Toc6651_1652293764"/>
+      <w:bookmarkStart w:id="29" w:name="__RefHeading___Toc6651_4031843506"/>
       <w:bookmarkEnd w:id="29"/>
       <w:r>
         <w:rPr/>
@@ -22694,7 +22694,7 @@
         <w:pStyle w:val="Heading1"/>
         <w:rPr/>
       </w:pPr>
-      <w:bookmarkStart w:id="30" w:name="__RefHeading___Toc6653_1652293764"/>
+      <w:bookmarkStart w:id="30" w:name="__RefHeading___Toc6653_4031843506"/>
       <w:bookmarkEnd w:id="30"/>
       <w:r>
         <w:rPr/>
@@ -22706,7 +22706,7 @@
         <w:pStyle w:val="Heading2"/>
         <w:rPr/>
       </w:pPr>
-      <w:bookmarkStart w:id="31" w:name="__RefHeading___Toc6655_1652293764"/>
+      <w:bookmarkStart w:id="31" w:name="__RefHeading___Toc6655_4031843506"/>
       <w:bookmarkEnd w:id="31"/>
       <w:r>
         <w:rPr/>
@@ -22836,7 +22836,7 @@
         <w:pStyle w:val="Heading2"/>
         <w:rPr/>
       </w:pPr>
-      <w:bookmarkStart w:id="32" w:name="__RefHeading___Toc6657_1652293764"/>
+      <w:bookmarkStart w:id="32" w:name="__RefHeading___Toc6657_4031843506"/>
       <w:bookmarkEnd w:id="32"/>
       <w:r>
         <w:rPr/>
@@ -23526,7 +23526,7 @@
         <w:pStyle w:val="Heading1"/>
         <w:rPr/>
       </w:pPr>
-      <w:bookmarkStart w:id="33" w:name="__RefHeading___Toc6659_1652293764"/>
+      <w:bookmarkStart w:id="33" w:name="__RefHeading___Toc6659_4031843506"/>
       <w:bookmarkEnd w:id="33"/>
       <w:r>
         <w:rPr/>
@@ -23665,7 +23665,7 @@
         <w:pStyle w:val="Heading2"/>
         <w:rPr/>
       </w:pPr>
-      <w:bookmarkStart w:id="34" w:name="__RefHeading___Toc6661_1652293764"/>
+      <w:bookmarkStart w:id="34" w:name="__RefHeading___Toc6661_4031843506"/>
       <w:bookmarkEnd w:id="34"/>
       <w:r>
         <w:rPr/>
@@ -25526,7 +25526,7 @@
         <w:pStyle w:val="Heading2"/>
         <w:rPr/>
       </w:pPr>
-      <w:bookmarkStart w:id="35" w:name="__RefHeading___Toc6663_1652293764"/>
+      <w:bookmarkStart w:id="35" w:name="__RefHeading___Toc6663_4031843506"/>
       <w:bookmarkEnd w:id="35"/>
       <w:r>
         <w:rPr/>
@@ -26976,7 +26976,7 @@
         <w:pStyle w:val="Heading2"/>
         <w:rPr/>
       </w:pPr>
-      <w:bookmarkStart w:id="36" w:name="__RefHeading___Toc6665_1652293764"/>
+      <w:bookmarkStart w:id="36" w:name="__RefHeading___Toc6665_4031843506"/>
       <w:bookmarkEnd w:id="36"/>
       <w:r>
         <w:rPr/>
@@ -27517,7 +27517,7 @@
         <w:pStyle w:val="Heading2"/>
         <w:rPr/>
       </w:pPr>
-      <w:bookmarkStart w:id="37" w:name="__RefHeading___Toc6667_1652293764"/>
+      <w:bookmarkStart w:id="37" w:name="__RefHeading___Toc6667_4031843506"/>
       <w:bookmarkEnd w:id="37"/>
       <w:r>
         <w:rPr/>
@@ -27802,7 +27802,7 @@
         <w:pStyle w:val="Heading2"/>
         <w:rPr/>
       </w:pPr>
-      <w:bookmarkStart w:id="38" w:name="__RefHeading___Toc6669_1652293764"/>
+      <w:bookmarkStart w:id="38" w:name="__RefHeading___Toc6669_4031843506"/>
       <w:bookmarkEnd w:id="38"/>
       <w:r>
         <w:rPr/>
@@ -27960,7 +27960,7 @@
         <w:pStyle w:val="Heading2"/>
         <w:rPr/>
       </w:pPr>
-      <w:bookmarkStart w:id="39" w:name="__RefHeading___Toc6671_1652293764"/>
+      <w:bookmarkStart w:id="39" w:name="__RefHeading___Toc6671_4031843506"/>
       <w:bookmarkEnd w:id="39"/>
       <w:r>
         <w:rPr/>
@@ -28360,7 +28360,7 @@
         <w:pStyle w:val="Heading1"/>
         <w:rPr/>
       </w:pPr>
-      <w:bookmarkStart w:id="40" w:name="__RefHeading___Toc6673_1652293764"/>
+      <w:bookmarkStart w:id="40" w:name="__RefHeading___Toc6673_4031843506"/>
       <w:bookmarkEnd w:id="40"/>
       <w:r>
         <w:rPr/>
@@ -28392,7 +28392,7 @@
         <w:pStyle w:val="Heading2"/>
         <w:rPr/>
       </w:pPr>
-      <w:bookmarkStart w:id="41" w:name="__RefHeading___Toc6675_1652293764"/>
+      <w:bookmarkStart w:id="41" w:name="__RefHeading___Toc6675_4031843506"/>
       <w:bookmarkEnd w:id="41"/>
       <w:r>
         <w:rPr/>
@@ -29597,7 +29597,7 @@
         <w:pStyle w:val="Heading2"/>
         <w:rPr/>
       </w:pPr>
-      <w:bookmarkStart w:id="42" w:name="__RefHeading___Toc6677_1652293764"/>
+      <w:bookmarkStart w:id="42" w:name="__RefHeading___Toc6677_4031843506"/>
       <w:bookmarkEnd w:id="42"/>
       <w:r>
         <w:rPr/>
@@ -30980,7 +30980,7 @@
         <w:pStyle w:val="Heading2"/>
         <w:rPr/>
       </w:pPr>
-      <w:bookmarkStart w:id="43" w:name="__RefHeading___Toc6679_1652293764"/>
+      <w:bookmarkStart w:id="43" w:name="__RefHeading___Toc6679_4031843506"/>
       <w:bookmarkEnd w:id="43"/>
       <w:r>
         <w:rPr/>
@@ -31566,7 +31566,7 @@
         <w:pStyle w:val="Heading2"/>
         <w:rPr/>
       </w:pPr>
-      <w:bookmarkStart w:id="44" w:name="__RefHeading___Toc6681_1652293764"/>
+      <w:bookmarkStart w:id="44" w:name="__RefHeading___Toc6681_4031843506"/>
       <w:bookmarkEnd w:id="44"/>
       <w:r>
         <w:rPr/>
@@ -31661,7 +31661,7 @@
         <w:pStyle w:val="Heading2"/>
         <w:rPr/>
       </w:pPr>
-      <w:bookmarkStart w:id="45" w:name="__RefHeading___Toc6683_1652293764"/>
+      <w:bookmarkStart w:id="45" w:name="__RefHeading___Toc6683_4031843506"/>
       <w:bookmarkEnd w:id="45"/>
       <w:r>
         <w:rPr/>
@@ -32115,7 +32115,7 @@
         <w:pStyle w:val="Heading1"/>
         <w:rPr/>
       </w:pPr>
-      <w:bookmarkStart w:id="46" w:name="__RefHeading___Toc6685_1652293764"/>
+      <w:bookmarkStart w:id="46" w:name="__RefHeading___Toc6685_4031843506"/>
       <w:bookmarkEnd w:id="46"/>
       <w:r>
         <w:rPr/>
@@ -32223,7 +32223,7 @@
         <w:rPr/>
         <w:drawing>
           <wp:inline distT="0" distB="0" distL="0" distR="0">
-            <wp:extent cx="4206240" cy="3173095"/>
+            <wp:extent cx="4206240" cy="3154680"/>
             <wp:effectExtent l="0" t="0" r="0" b="0"/>
             <wp:docPr id="38" name="Picture 38"/>
             <wp:cNvGraphicFramePr>
@@ -32247,7 +32247,7 @@
                   <pic:spPr bwMode="auto">
                     <a:xfrm>
                       <a:off x="0" y="0"/>
-                      <a:ext cx="4206240" cy="3173095"/>
+                      <a:ext cx="4206240" cy="3154680"/>
                     </a:xfrm>
                     <a:prstGeom prst="rect">
                       <a:avLst/>
@@ -32280,7 +32280,7 @@
         <w:pStyle w:val="Heading2"/>
         <w:rPr/>
       </w:pPr>
-      <w:bookmarkStart w:id="47" w:name="__RefHeading___Toc6687_1652293764"/>
+      <w:bookmarkStart w:id="47" w:name="__RefHeading___Toc6687_4031843506"/>
       <w:bookmarkEnd w:id="47"/>
       <w:r>
         <w:rPr/>
@@ -33397,7 +33397,7 @@
         <w:pStyle w:val="Heading2"/>
         <w:rPr/>
       </w:pPr>
-      <w:bookmarkStart w:id="48" w:name="__RefHeading___Toc6689_1652293764"/>
+      <w:bookmarkStart w:id="48" w:name="__RefHeading___Toc6689_4031843506"/>
       <w:bookmarkEnd w:id="48"/>
       <w:r>
         <w:rPr/>
@@ -33445,7 +33445,7 @@
         <w:rPr/>
         <w:drawing>
           <wp:inline distT="0" distB="0" distL="0" distR="0">
-            <wp:extent cx="4206240" cy="3173095"/>
+            <wp:extent cx="4206240" cy="3154680"/>
             <wp:effectExtent l="0" t="0" r="0" b="0"/>
             <wp:docPr id="39" name="Picture 39"/>
             <wp:cNvGraphicFramePr>
@@ -33469,7 +33469,7 @@
                   <pic:spPr bwMode="auto">
                     <a:xfrm>
                       <a:off x="0" y="0"/>
-                      <a:ext cx="4206240" cy="3173095"/>
+                      <a:ext cx="4206240" cy="3154680"/>
                     </a:xfrm>
                     <a:prstGeom prst="rect">
                       <a:avLst/>
@@ -33631,7 +33631,7 @@
         <w:pStyle w:val="Heading2"/>
         <w:rPr/>
       </w:pPr>
-      <w:bookmarkStart w:id="49" w:name="__RefHeading___Toc6691_1652293764"/>
+      <w:bookmarkStart w:id="49" w:name="__RefHeading___Toc6691_4031843506"/>
       <w:bookmarkEnd w:id="49"/>
       <w:r>
         <w:rPr/>
@@ -34448,7 +34448,7 @@
         <w:pStyle w:val="Heading2"/>
         <w:rPr/>
       </w:pPr>
-      <w:bookmarkStart w:id="50" w:name="__RefHeading___Toc6693_1652293764"/>
+      <w:bookmarkStart w:id="50" w:name="__RefHeading___Toc6693_4031843506"/>
       <w:bookmarkEnd w:id="50"/>
       <w:r>
         <w:rPr/>
@@ -36144,7 +36144,7 @@
         <w:pStyle w:val="Heading2"/>
         <w:rPr/>
       </w:pPr>
-      <w:bookmarkStart w:id="51" w:name="__RefHeading___Toc6695_1652293764"/>
+      <w:bookmarkStart w:id="51" w:name="__RefHeading___Toc6695_4031843506"/>
       <w:bookmarkEnd w:id="51"/>
       <w:r>
         <w:rPr/>
@@ -36780,7 +36780,7 @@
         <w:rPr/>
         <w:drawing>
           <wp:inline distT="0" distB="0" distL="0" distR="0">
-            <wp:extent cx="5943600" cy="3346450"/>
+            <wp:extent cx="5943600" cy="3342005"/>
             <wp:effectExtent l="0" t="0" r="0" b="0"/>
             <wp:docPr id="40" name="Picture 40"/>
             <wp:cNvGraphicFramePr>
@@ -36804,7 +36804,7 @@
                   <pic:spPr bwMode="auto">
                     <a:xfrm>
                       <a:off x="0" y="0"/>
-                      <a:ext cx="5943600" cy="3346450"/>
+                      <a:ext cx="5943600" cy="3342005"/>
                     </a:xfrm>
                     <a:prstGeom prst="rect">
                       <a:avLst/>
@@ -36844,7 +36844,7 @@
         <w:pStyle w:val="Heading2"/>
         <w:rPr/>
       </w:pPr>
-      <w:bookmarkStart w:id="52" w:name="__RefHeading___Toc6697_1652293764"/>
+      <w:bookmarkStart w:id="52" w:name="__RefHeading___Toc6697_4031843506"/>
       <w:bookmarkEnd w:id="52"/>
       <w:r>
         <w:rPr/>
@@ -37202,7 +37202,7 @@
         <w:pStyle w:val="Heading1"/>
         <w:rPr/>
       </w:pPr>
-      <w:bookmarkStart w:id="53" w:name="__RefHeading___Toc6699_1652293764"/>
+      <w:bookmarkStart w:id="53" w:name="__RefHeading___Toc6699_4031843506"/>
       <w:bookmarkEnd w:id="53"/>
       <w:r>
         <w:rPr/>
@@ -37214,7 +37214,7 @@
         <w:pStyle w:val="Heading2"/>
         <w:rPr/>
       </w:pPr>
-      <w:bookmarkStart w:id="54" w:name="__RefHeading___Toc6701_1652293764"/>
+      <w:bookmarkStart w:id="54" w:name="__RefHeading___Toc6701_4031843506"/>
       <w:bookmarkEnd w:id="54"/>
       <w:r>
         <w:rPr/>
@@ -37305,7 +37305,7 @@
         <w:pStyle w:val="Heading2"/>
         <w:rPr/>
       </w:pPr>
-      <w:bookmarkStart w:id="55" w:name="__RefHeading___Toc6703_1652293764"/>
+      <w:bookmarkStart w:id="55" w:name="__RefHeading___Toc6703_4031843506"/>
       <w:bookmarkEnd w:id="55"/>
       <w:r>
         <w:rPr/>
@@ -37871,7 +37871,7 @@
         <w:pStyle w:val="Heading1"/>
         <w:rPr/>
       </w:pPr>
-      <w:bookmarkStart w:id="56" w:name="__RefHeading___Toc6705_1652293764"/>
+      <w:bookmarkStart w:id="56" w:name="__RefHeading___Toc6705_4031843506"/>
       <w:bookmarkEnd w:id="56"/>
       <w:r>
         <w:rPr/>
@@ -38327,7 +38327,7 @@
         <w:pStyle w:val="Heading2"/>
         <w:rPr/>
       </w:pPr>
-      <w:bookmarkStart w:id="57" w:name="__RefHeading___Toc6707_1652293764"/>
+      <w:bookmarkStart w:id="57" w:name="__RefHeading___Toc6707_4031843506"/>
       <w:bookmarkEnd w:id="57"/>
       <w:r>
         <w:rPr/>
@@ -38418,7 +38418,7 @@
         <w:pStyle w:val="Heading2"/>
         <w:rPr/>
       </w:pPr>
-      <w:bookmarkStart w:id="58" w:name="__RefHeading___Toc6709_1652293764"/>
+      <w:bookmarkStart w:id="58" w:name="__RefHeading___Toc6709_4031843506"/>
       <w:bookmarkEnd w:id="58"/>
       <w:r>
         <w:rPr/>
@@ -38531,7 +38531,7 @@
         <w:pStyle w:val="Heading2"/>
         <w:rPr/>
       </w:pPr>
-      <w:bookmarkStart w:id="59" w:name="__RefHeading___Toc6711_1652293764"/>
+      <w:bookmarkStart w:id="59" w:name="__RefHeading___Toc6711_4031843506"/>
       <w:bookmarkEnd w:id="59"/>
       <w:r>
         <w:rPr/>
@@ -38744,7 +38744,7 @@
         <w:pStyle w:val="Heading1"/>
         <w:rPr/>
       </w:pPr>
-      <w:bookmarkStart w:id="60" w:name="__RefHeading___Toc6713_1652293764"/>
+      <w:bookmarkStart w:id="60" w:name="__RefHeading___Toc6713_4031843506"/>
       <w:bookmarkEnd w:id="60"/>
       <w:r>
         <w:rPr/>
@@ -39536,7 +39536,7 @@
         <w:pStyle w:val="Heading1"/>
         <w:rPr/>
       </w:pPr>
-      <w:bookmarkStart w:id="61" w:name="__RefHeading___Toc6715_1652293764"/>
+      <w:bookmarkStart w:id="61" w:name="__RefHeading___Toc6715_4031843506"/>
       <w:bookmarkEnd w:id="61"/>
       <w:r>
         <w:rPr/>

</xml_diff>

<commit_message>
docs: rebuild the manual with the layering note
Chapter 8 now says objects can be layered freely and what a touch does when
one covers another. All table and pagination rules pass, in portrait.

Co-Authored-By: Claude Opus 5 <noreply@anthropic.com>
</commit_message>
<xml_diff>
--- a/doc/Append-HMI-Studio-User-Manual.docx
+++ b/doc/Append-HMI-Studio-User-Manual.docx
@@ -283,7 +283,7 @@
             </w:rPr>
             <w:fldChar w:fldCharType="separate"/>
           </w:r>
-          <w:hyperlink w:anchor="__RefHeading___Toc6593_4031843506" w:tooltip="1 Introduction">
+          <w:hyperlink w:anchor="__RefHeading___Toc6599_531561125" w:tooltip="1 Introduction">
             <w:r>
               <w:rPr>
                 <w:rStyle w:val="IndexLink"/>
@@ -304,7 +304,7 @@
             </w:tabs>
             <w:rPr/>
           </w:pPr>
-          <w:hyperlink w:anchor="__RefHeading___Toc6595_4031843506" w:tooltip="1.1 Building applications with an AI agent">
+          <w:hyperlink w:anchor="__RefHeading___Toc6601_531561125" w:tooltip="1.1 Building applications with an AI agent">
             <w:r>
               <w:rPr>
                 <w:rStyle w:val="IndexLink"/>
@@ -325,7 +325,7 @@
             </w:tabs>
             <w:rPr/>
           </w:pPr>
-          <w:hyperlink w:anchor="__RefHeading___Toc6597_4031843506" w:tooltip="1.2 How an HMI application is organized">
+          <w:hyperlink w:anchor="__RefHeading___Toc6603_531561125" w:tooltip="1.2 How an HMI application is organized">
             <w:r>
               <w:rPr>
                 <w:rStyle w:val="IndexLink"/>
@@ -346,7 +346,7 @@
             </w:tabs>
             <w:rPr/>
           </w:pPr>
-          <w:hyperlink w:anchor="__RefHeading___Toc6599_4031843506" w:tooltip="2 The Studio window">
+          <w:hyperlink w:anchor="__RefHeading___Toc6605_531561125" w:tooltip="2 The Studio window">
             <w:r>
               <w:rPr>
                 <w:rStyle w:val="IndexLink"/>
@@ -367,7 +367,7 @@
             </w:tabs>
             <w:rPr/>
           </w:pPr>
-          <w:hyperlink w:anchor="__RefHeading___Toc6601_4031843506" w:tooltip="2.1 The HMI menu">
+          <w:hyperlink w:anchor="__RefHeading___Toc6607_531561125" w:tooltip="2.1 The HMI menu">
             <w:r>
               <w:rPr>
                 <w:rStyle w:val="IndexLink"/>
@@ -388,7 +388,7 @@
             </w:tabs>
             <w:rPr/>
           </w:pPr>
-          <w:hyperlink w:anchor="__RefHeading___Toc6603_4031843506" w:tooltip="3 Application settings">
+          <w:hyperlink w:anchor="__RefHeading___Toc6609_531561125" w:tooltip="3 Application settings">
             <w:r>
               <w:rPr>
                 <w:rStyle w:val="IndexLink"/>
@@ -409,7 +409,7 @@
             </w:tabs>
             <w:rPr/>
           </w:pPr>
-          <w:hyperlink w:anchor="__RefHeading___Toc6605_4031843506" w:tooltip="4 Devices">
+          <w:hyperlink w:anchor="__RefHeading___Toc6611_531561125" w:tooltip="4 Devices">
             <w:r>
               <w:rPr>
                 <w:rStyle w:val="IndexLink"/>
@@ -430,7 +430,7 @@
             </w:tabs>
             <w:rPr/>
           </w:pPr>
-          <w:hyperlink w:anchor="__RefHeading___Toc6607_4031843506" w:tooltip="5 Tags">
+          <w:hyperlink w:anchor="__RefHeading___Toc6613_531561125" w:tooltip="5 Tags">
             <w:r>
               <w:rPr>
                 <w:rStyle w:val="IndexLink"/>
@@ -451,7 +451,7 @@
             </w:tabs>
             <w:rPr/>
           </w:pPr>
-          <w:hyperlink w:anchor="__RefHeading___Toc6609_4031843506" w:tooltip="5.1 Tag fields">
+          <w:hyperlink w:anchor="__RefHeading___Toc6615_531561125" w:tooltip="5.1 Tag fields">
             <w:r>
               <w:rPr>
                 <w:rStyle w:val="IndexLink"/>
@@ -472,7 +472,7 @@
             </w:tabs>
             <w:rPr/>
           </w:pPr>
-          <w:hyperlink w:anchor="__RefHeading___Toc6611_4031843506" w:tooltip="5.2 Alarms on a tag">
+          <w:hyperlink w:anchor="__RefHeading___Toc6617_531561125" w:tooltip="5.2 Alarms on a tag">
             <w:r>
               <w:rPr>
                 <w:rStyle w:val="IndexLink"/>
@@ -493,7 +493,7 @@
             </w:tabs>
             <w:rPr/>
           </w:pPr>
-          <w:hyperlink w:anchor="__RefHeading___Toc6613_4031843506" w:tooltip="5.3 Renaming, and finding and replacing tag references">
+          <w:hyperlink w:anchor="__RefHeading___Toc6619_531561125" w:tooltip="5.3 Renaming, and finding and replacing tag references">
             <w:r>
               <w:rPr>
                 <w:rStyle w:val="IndexLink"/>
@@ -514,7 +514,7 @@
             </w:tabs>
             <w:rPr/>
           </w:pPr>
-          <w:hyperlink w:anchor="__RefHeading___Toc6615_4031843506" w:tooltip="6 Screens and windows">
+          <w:hyperlink w:anchor="__RefHeading___Toc6621_531561125" w:tooltip="6 Screens and windows">
             <w:r>
               <w:rPr>
                 <w:rStyle w:val="IndexLink"/>
@@ -535,7 +535,7 @@
             </w:tabs>
             <w:rPr/>
           </w:pPr>
-          <w:hyperlink w:anchor="__RefHeading___Toc6617_4031843506" w:tooltip="6.1 Window properties">
+          <w:hyperlink w:anchor="__RefHeading___Toc6623_531561125" w:tooltip="6.1 Window properties">
             <w:r>
               <w:rPr>
                 <w:rStyle w:val="IndexLink"/>
@@ -556,7 +556,7 @@
             </w:tabs>
             <w:rPr/>
           </w:pPr>
-          <w:hyperlink w:anchor="__RefHeading___Toc6619_4031843506" w:tooltip="6.2 The header, the navigation bar and the screens">
+          <w:hyperlink w:anchor="__RefHeading___Toc6625_531561125" w:tooltip="6.2 The header, the navigation bar and the screens">
             <w:r>
               <w:rPr>
                 <w:rStyle w:val="IndexLink"/>
@@ -577,7 +577,7 @@
             </w:tabs>
             <w:rPr/>
           </w:pPr>
-          <w:hyperlink w:anchor="__RefHeading___Toc6621_4031843506" w:tooltip="7 Drawing objects">
+          <w:hyperlink w:anchor="__RefHeading___Toc6627_531561125" w:tooltip="7 Drawing objects">
             <w:r>
               <w:rPr>
                 <w:rStyle w:val="IndexLink"/>
@@ -598,7 +598,7 @@
             </w:tabs>
             <w:rPr/>
           </w:pPr>
-          <w:hyperlink w:anchor="__RefHeading___Toc6623_4031843506" w:tooltip="8 Animation links">
+          <w:hyperlink w:anchor="__RefHeading___Toc6629_531561125" w:tooltip="8 Animation links">
             <w:r>
               <w:rPr>
                 <w:rStyle w:val="IndexLink"/>
@@ -619,7 +619,7 @@
             </w:tabs>
             <w:rPr/>
           </w:pPr>
-          <w:hyperlink w:anchor="__RefHeading___Toc6625_4031843506" w:tooltip="8.1 A valve: status color, fault blink and faceplate">
+          <w:hyperlink w:anchor="__RefHeading___Toc6631_531561125" w:tooltip="8.1 A valve: status color, fault blink and faceplate">
             <w:r>
               <w:rPr>
                 <w:rStyle w:val="IndexLink"/>
@@ -640,7 +640,7 @@
             </w:tabs>
             <w:rPr/>
           </w:pPr>
-          <w:hyperlink w:anchor="__RefHeading___Toc6627_4031843506" w:tooltip="8.2 The weigh hopper: percent fill">
+          <w:hyperlink w:anchor="__RefHeading___Toc6633_531561125" w:tooltip="8.2 The weigh hopper: percent fill">
             <w:r>
               <w:rPr>
                 <w:rStyle w:val="IndexLink"/>
@@ -661,7 +661,7 @@
             </w:tabs>
             <w:rPr/>
           </w:pPr>
-          <w:hyperlink w:anchor="__RefHeading___Toc6629_4031843506" w:tooltip="8.3 Hopper pressure: value display and alarm colors">
+          <w:hyperlink w:anchor="__RefHeading___Toc6635_531561125" w:tooltip="8.3 Hopper pressure: value display and alarm colors">
             <w:r>
               <w:rPr>
                 <w:rStyle w:val="IndexLink"/>
@@ -669,7 +669,7 @@
               </w:rPr>
               <w:t>8.3 Hopper pressure: value display and alarm colors</w:t>
               <w:tab/>
-              <w:t>25</w:t>
+              <w:t>26</w:t>
             </w:r>
           </w:hyperlink>
         </w:p>
@@ -682,7 +682,7 @@
             </w:tabs>
             <w:rPr/>
           </w:pPr>
-          <w:hyperlink w:anchor="__RefHeading___Toc6631_4031843506" w:tooltip="8.4 Setpoints: user input">
+          <w:hyperlink w:anchor="__RefHeading___Toc6637_531561125" w:tooltip="8.4 Setpoints: user input">
             <w:r>
               <w:rPr>
                 <w:rStyle w:val="IndexLink"/>
@@ -690,7 +690,7 @@
               </w:rPr>
               <w:t>8.4 Setpoints: user input</w:t>
               <w:tab/>
-              <w:t>26</w:t>
+              <w:t>27</w:t>
             </w:r>
           </w:hyperlink>
         </w:p>
@@ -703,7 +703,7 @@
             </w:tabs>
             <w:rPr/>
           </w:pPr>
-          <w:hyperlink w:anchor="__RefHeading___Toc6633_4031843506" w:tooltip="8.5 Commands: pushbutton and enable">
+          <w:hyperlink w:anchor="__RefHeading___Toc6639_531561125" w:tooltip="8.5 Commands: pushbutton and enable">
             <w:r>
               <w:rPr>
                 <w:rStyle w:val="IndexLink"/>
@@ -711,7 +711,7 @@
               </w:rPr>
               <w:t>8.5 Commands: pushbutton and enable</w:t>
               <w:tab/>
-              <w:t>27</w:t>
+              <w:t>28</w:t>
             </w:r>
           </w:hyperlink>
         </w:p>
@@ -724,7 +724,7 @@
             </w:tabs>
             <w:rPr/>
           </w:pPr>
-          <w:hyperlink w:anchor="__RefHeading___Toc6635_4031843506" w:tooltip="9 Expressions and scripts">
+          <w:hyperlink w:anchor="__RefHeading___Toc6641_531561125" w:tooltip="9 Expressions and scripts">
             <w:r>
               <w:rPr>
                 <w:rStyle w:val="IndexLink"/>
@@ -732,7 +732,7 @@
               </w:rPr>
               <w:t>9 Expressions and scripts</w:t>
               <w:tab/>
-              <w:t>28</w:t>
+              <w:t>29</w:t>
             </w:r>
           </w:hyperlink>
         </w:p>
@@ -745,7 +745,7 @@
             </w:tabs>
             <w:rPr/>
           </w:pPr>
-          <w:hyperlink w:anchor="__RefHeading___Toc6637_4031843506" w:tooltip="9.1 Window and application scripts">
+          <w:hyperlink w:anchor="__RefHeading___Toc6643_531561125" w:tooltip="9.1 Window and application scripts">
             <w:r>
               <w:rPr>
                 <w:rStyle w:val="IndexLink"/>
@@ -753,7 +753,7 @@
               </w:rPr>
               <w:t>9.1 Window and application scripts</w:t>
               <w:tab/>
-              <w:t>29</w:t>
+              <w:t>30</w:t>
             </w:r>
           </w:hyperlink>
         </w:p>
@@ -766,7 +766,7 @@
             </w:tabs>
             <w:rPr/>
           </w:pPr>
-          <w:hyperlink w:anchor="__RefHeading___Toc6639_4031843506" w:tooltip="9.2 Action scripts">
+          <w:hyperlink w:anchor="__RefHeading___Toc6645_531561125" w:tooltip="9.2 Action scripts">
             <w:r>
               <w:rPr>
                 <w:rStyle w:val="IndexLink"/>
@@ -774,7 +774,7 @@
               </w:rPr>
               <w:t>9.2 Action scripts</w:t>
               <w:tab/>
-              <w:t>33</w:t>
+              <w:t>34</w:t>
             </w:r>
           </w:hyperlink>
         </w:p>
@@ -787,7 +787,7 @@
             </w:tabs>
             <w:rPr/>
           </w:pPr>
-          <w:hyperlink w:anchor="__RefHeading___Toc6641_4031843506" w:tooltip="9.3 Function reference">
+          <w:hyperlink w:anchor="__RefHeading___Toc6647_531561125" w:tooltip="9.3 Function reference">
             <w:r>
               <w:rPr>
                 <w:rStyle w:val="IndexLink"/>
@@ -795,7 +795,7 @@
               </w:rPr>
               <w:t>9.3 Function reference</w:t>
               <w:tab/>
-              <w:t>34</w:t>
+              <w:t>35</w:t>
             </w:r>
           </w:hyperlink>
         </w:p>
@@ -808,7 +808,7 @@
             </w:tabs>
             <w:rPr/>
           </w:pPr>
-          <w:hyperlink w:anchor="__RefHeading___Toc6643_4031843506" w:tooltip="9.4 Indirect tags: one faceplate for every device">
+          <w:hyperlink w:anchor="__RefHeading___Toc6649_531561125" w:tooltip="9.4 Indirect tags: one faceplate for every device">
             <w:r>
               <w:rPr>
                 <w:rStyle w:val="IndexLink"/>
@@ -816,7 +816,7 @@
               </w:rPr>
               <w:t>9.4 Indirect tags: one faceplate for every device</w:t>
               <w:tab/>
-              <w:t>39</w:t>
+              <w:t>40</w:t>
             </w:r>
           </w:hyperlink>
         </w:p>
@@ -829,7 +829,7 @@
             </w:tabs>
             <w:rPr/>
           </w:pPr>
-          <w:hyperlink w:anchor="__RefHeading___Toc6645_4031843506" w:tooltip="9.5 Opening windows from scripts: ShowWindow">
+          <w:hyperlink w:anchor="__RefHeading___Toc6651_531561125" w:tooltip="9.5 Opening windows from scripts: ShowWindow">
             <w:r>
               <w:rPr>
                 <w:rStyle w:val="IndexLink"/>
@@ -837,7 +837,7 @@
               </w:rPr>
               <w:t>9.5 Opening windows from scripts: ShowWindow</w:t>
               <w:tab/>
-              <w:t>40</w:t>
+              <w:t>41</w:t>
             </w:r>
           </w:hyperlink>
         </w:p>
@@ -850,7 +850,7 @@
             </w:tabs>
             <w:rPr/>
           </w:pPr>
-          <w:hyperlink w:anchor="__RefHeading___Toc6647_4031843506" w:tooltip="9.6 Saving the screen as a PDF: ScreenToPDF">
+          <w:hyperlink w:anchor="__RefHeading___Toc6653_531561125" w:tooltip="9.6 Saving the screen as a PDF: ScreenToPDF">
             <w:r>
               <w:rPr>
                 <w:rStyle w:val="IndexLink"/>
@@ -858,7 +858,7 @@
               </w:rPr>
               <w:t>9.6 Saving the screen as a PDF: ScreenToPDF</w:t>
               <w:tab/>
-              <w:t>43</w:t>
+              <w:t>44</w:t>
             </w:r>
           </w:hyperlink>
         </w:p>
@@ -871,7 +871,7 @@
             </w:tabs>
             <w:rPr/>
           </w:pPr>
-          <w:hyperlink w:anchor="__RefHeading___Toc6649_4031843506" w:tooltip="9.7 Local variables: DIM">
+          <w:hyperlink w:anchor="__RefHeading___Toc6655_531561125" w:tooltip="9.7 Local variables: DIM">
             <w:r>
               <w:rPr>
                 <w:rStyle w:val="IndexLink"/>
@@ -879,7 +879,7 @@
               </w:rPr>
               <w:t>9.7 Local variables: DIM</w:t>
               <w:tab/>
-              <w:t>44</w:t>
+              <w:t>45</w:t>
             </w:r>
           </w:hyperlink>
         </w:p>
@@ -892,7 +892,7 @@
             </w:tabs>
             <w:rPr/>
           </w:pPr>
-          <w:hyperlink w:anchor="__RefHeading___Toc6651_4031843506" w:tooltip="9.8 QuickFunctions">
+          <w:hyperlink w:anchor="__RefHeading___Toc6657_531561125" w:tooltip="9.8 QuickFunctions">
             <w:r>
               <w:rPr>
                 <w:rStyle w:val="IndexLink"/>
@@ -900,7 +900,7 @@
               </w:rPr>
               <w:t>9.8 QuickFunctions</w:t>
               <w:tab/>
-              <w:t>45</w:t>
+              <w:t>46</w:t>
             </w:r>
           </w:hyperlink>
         </w:p>
@@ -913,7 +913,7 @@
             </w:tabs>
             <w:rPr/>
           </w:pPr>
-          <w:hyperlink w:anchor="__RefHeading___Toc6653_4031843506" w:tooltip="10 Alarms and security">
+          <w:hyperlink w:anchor="__RefHeading___Toc6659_531561125" w:tooltip="10 Alarms and security">
             <w:r>
               <w:rPr>
                 <w:rStyle w:val="IndexLink"/>
@@ -921,7 +921,7 @@
               </w:rPr>
               <w:t>10 Alarms and security</w:t>
               <w:tab/>
-              <w:t>47</w:t>
+              <w:t>48</w:t>
             </w:r>
           </w:hyperlink>
         </w:p>
@@ -934,7 +934,7 @@
             </w:tabs>
             <w:rPr/>
           </w:pPr>
-          <w:hyperlink w:anchor="__RefHeading___Toc6655_4031843506" w:tooltip="10.1 Alarms">
+          <w:hyperlink w:anchor="__RefHeading___Toc6661_531561125" w:tooltip="10.1 Alarms">
             <w:r>
               <w:rPr>
                 <w:rStyle w:val="IndexLink"/>
@@ -942,7 +942,7 @@
               </w:rPr>
               <w:t>10.1 Alarms</w:t>
               <w:tab/>
-              <w:t>47</w:t>
+              <w:t>48</w:t>
             </w:r>
           </w:hyperlink>
         </w:p>
@@ -955,7 +955,7 @@
             </w:tabs>
             <w:rPr/>
           </w:pPr>
-          <w:hyperlink w:anchor="__RefHeading___Toc6657_4031843506" w:tooltip="10.2 Users and access levels">
+          <w:hyperlink w:anchor="__RefHeading___Toc6663_531561125" w:tooltip="10.2 Users and access levels">
             <w:r>
               <w:rPr>
                 <w:rStyle w:val="IndexLink"/>
@@ -963,7 +963,7 @@
               </w:rPr>
               <w:t>10.2 Users and access levels</w:t>
               <w:tab/>
-              <w:t>47</w:t>
+              <w:t>48</w:t>
             </w:r>
           </w:hyperlink>
         </w:p>
@@ -976,7 +976,7 @@
             </w:tabs>
             <w:rPr/>
           </w:pPr>
-          <w:hyperlink w:anchor="__RefHeading___Toc6659_4031843506" w:tooltip="11 Recipes">
+          <w:hyperlink w:anchor="__RefHeading___Toc6665_531561125" w:tooltip="11 Recipes">
             <w:r>
               <w:rPr>
                 <w:rStyle w:val="IndexLink"/>
@@ -984,7 +984,7 @@
               </w:rPr>
               <w:t>11 Recipes</w:t>
               <w:tab/>
-              <w:t>48</w:t>
+              <w:t>49</w:t>
             </w:r>
           </w:hyperlink>
         </w:p>
@@ -997,7 +997,7 @@
             </w:tabs>
             <w:rPr/>
           </w:pPr>
-          <w:hyperlink w:anchor="__RefHeading___Toc6661_4031843506" w:tooltip="11.1 Recipe books">
+          <w:hyperlink w:anchor="__RefHeading___Toc6667_531561125" w:tooltip="11.1 Recipe books">
             <w:r>
               <w:rPr>
                 <w:rStyle w:val="IndexLink"/>
@@ -1005,7 +1005,7 @@
               </w:rPr>
               <w:t>11.1 Recipe books</w:t>
               <w:tab/>
-              <w:t>49</w:t>
+              <w:t>50</w:t>
             </w:r>
           </w:hyperlink>
         </w:p>
@@ -1018,7 +1018,7 @@
             </w:tabs>
             <w:rPr/>
           </w:pPr>
-          <w:hyperlink w:anchor="__RefHeading___Toc6663_4031843506" w:tooltip="11.2 The Recipes screen">
+          <w:hyperlink w:anchor="__RefHeading___Toc6669_531561125" w:tooltip="11.2 The Recipes screen">
             <w:r>
               <w:rPr>
                 <w:rStyle w:val="IndexLink"/>
@@ -1026,7 +1026,7 @@
               </w:rPr>
               <w:t>11.2 The Recipes screen</w:t>
               <w:tab/>
-              <w:t>51</w:t>
+              <w:t>52</w:t>
             </w:r>
           </w:hyperlink>
         </w:p>
@@ -1039,7 +1039,7 @@
             </w:tabs>
             <w:rPr/>
           </w:pPr>
-          <w:hyperlink w:anchor="__RefHeading___Toc6665_4031843506" w:tooltip="11.3 The Recipe List object">
+          <w:hyperlink w:anchor="__RefHeading___Toc6671_531561125" w:tooltip="11.3 The Recipe List object">
             <w:r>
               <w:rPr>
                 <w:rStyle w:val="IndexLink"/>
@@ -1047,7 +1047,7 @@
               </w:rPr>
               <w:t>11.3 The Recipe List object</w:t>
               <w:tab/>
-              <w:t>53</w:t>
+              <w:t>54</w:t>
             </w:r>
           </w:hyperlink>
         </w:p>
@@ -1060,7 +1060,7 @@
             </w:tabs>
             <w:rPr/>
           </w:pPr>
-          <w:hyperlink w:anchor="__RefHeading___Toc6667_4031843506" w:tooltip="11.4 Selecting a recipe in a window">
+          <w:hyperlink w:anchor="__RefHeading___Toc6673_531561125" w:tooltip="11.4 Selecting a recipe in a window">
             <w:r>
               <w:rPr>
                 <w:rStyle w:val="IndexLink"/>
@@ -1068,7 +1068,7 @@
               </w:rPr>
               <w:t>11.4 Selecting a recipe in a window</w:t>
               <w:tab/>
-              <w:t>54</w:t>
+              <w:t>55</w:t>
             </w:r>
           </w:hyperlink>
         </w:p>
@@ -1081,7 +1081,7 @@
             </w:tabs>
             <w:rPr/>
           </w:pPr>
-          <w:hyperlink w:anchor="__RefHeading___Toc6669_4031843506" w:tooltip="11.5 When a recipe function fails">
+          <w:hyperlink w:anchor="__RefHeading___Toc6675_531561125" w:tooltip="11.5 When a recipe function fails">
             <w:r>
               <w:rPr>
                 <w:rStyle w:val="IndexLink"/>
@@ -1089,7 +1089,7 @@
               </w:rPr>
               <w:t>11.5 When a recipe function fails</w:t>
               <w:tab/>
-              <w:t>55</w:t>
+              <w:t>56</w:t>
             </w:r>
           </w:hyperlink>
         </w:p>
@@ -1102,7 +1102,7 @@
             </w:tabs>
             <w:rPr/>
           </w:pPr>
-          <w:hyperlink w:anchor="__RefHeading___Toc6671_4031843506" w:tooltip="11.6 Where recipes are kept">
+          <w:hyperlink w:anchor="__RefHeading___Toc6677_531561125" w:tooltip="11.6 Where recipes are kept">
             <w:r>
               <w:rPr>
                 <w:rStyle w:val="IndexLink"/>
@@ -1110,7 +1110,7 @@
               </w:rPr>
               <w:t>11.6 Where recipes are kept</w:t>
               <w:tab/>
-              <w:t>55</w:t>
+              <w:t>56</w:t>
             </w:r>
           </w:hyperlink>
         </w:p>
@@ -1123,7 +1123,7 @@
             </w:tabs>
             <w:rPr/>
           </w:pPr>
-          <w:hyperlink w:anchor="__RefHeading___Toc6673_4031843506" w:tooltip="12 Trends">
+          <w:hyperlink w:anchor="__RefHeading___Toc6679_531561125" w:tooltip="12 Trends">
             <w:r>
               <w:rPr>
                 <w:rStyle w:val="IndexLink"/>
@@ -1131,7 +1131,7 @@
               </w:rPr>
               <w:t>12 Trends</w:t>
               <w:tab/>
-              <w:t>56</w:t>
+              <w:t>57</w:t>
             </w:r>
           </w:hyperlink>
         </w:p>
@@ -1144,7 +1144,7 @@
             </w:tabs>
             <w:rPr/>
           </w:pPr>
-          <w:hyperlink w:anchor="__RefHeading___Toc6675_4031843506" w:tooltip="12.1 The Trend object">
+          <w:hyperlink w:anchor="__RefHeading___Toc6681_531561125" w:tooltip="12.1 The Trend object">
             <w:r>
               <w:rPr>
                 <w:rStyle w:val="IndexLink"/>
@@ -1152,7 +1152,7 @@
               </w:rPr>
               <w:t>12.1 The Trend object</w:t>
               <w:tab/>
-              <w:t>56</w:t>
+              <w:t>57</w:t>
             </w:r>
           </w:hyperlink>
         </w:p>
@@ -1165,7 +1165,7 @@
             </w:tabs>
             <w:rPr/>
           </w:pPr>
-          <w:hyperlink w:anchor="__RefHeading___Toc6677_4031843506" w:tooltip="12.2 Pens and their ranges">
+          <w:hyperlink w:anchor="__RefHeading___Toc6683_531561125" w:tooltip="12.2 Pens and their ranges">
             <w:r>
               <w:rPr>
                 <w:rStyle w:val="IndexLink"/>
@@ -1173,7 +1173,7 @@
               </w:rPr>
               <w:t>12.2 Pens and their ranges</w:t>
               <w:tab/>
-              <w:t>57</w:t>
+              <w:t>58</w:t>
             </w:r>
           </w:hyperlink>
         </w:p>
@@ -1186,7 +1186,7 @@
             </w:tabs>
             <w:rPr/>
           </w:pPr>
-          <w:hyperlink w:anchor="__RefHeading___Toc6679_4031843506" w:tooltip="12.3 The Trends screen">
+          <w:hyperlink w:anchor="__RefHeading___Toc6685_531561125" w:tooltip="12.3 The Trends screen">
             <w:r>
               <w:rPr>
                 <w:rStyle w:val="IndexLink"/>
@@ -1194,7 +1194,7 @@
               </w:rPr>
               <w:t>12.3 The Trends screen</w:t>
               <w:tab/>
-              <w:t>58</w:t>
+              <w:t>59</w:t>
             </w:r>
           </w:hyperlink>
         </w:p>
@@ -1207,7 +1207,7 @@
             </w:tabs>
             <w:rPr/>
           </w:pPr>
-          <w:hyperlink w:anchor="__RefHeading___Toc6681_4031843506" w:tooltip="12.4 Scrolling through the history">
+          <w:hyperlink w:anchor="__RefHeading___Toc6687_531561125" w:tooltip="12.4 Scrolling through the history">
             <w:r>
               <w:rPr>
                 <w:rStyle w:val="IndexLink"/>
@@ -1215,7 +1215,7 @@
               </w:rPr>
               <w:t>12.4 Scrolling through the history</w:t>
               <w:tab/>
-              <w:t>59</w:t>
+              <w:t>60</w:t>
             </w:r>
           </w:hyperlink>
         </w:p>
@@ -1228,7 +1228,7 @@
             </w:tabs>
             <w:rPr/>
           </w:pPr>
-          <w:hyperlink w:anchor="__RefHeading___Toc6683_4031843506" w:tooltip="12.5 Recording and where the history is kept">
+          <w:hyperlink w:anchor="__RefHeading___Toc6689_531561125" w:tooltip="12.5 Recording and where the history is kept">
             <w:r>
               <w:rPr>
                 <w:rStyle w:val="IndexLink"/>
@@ -1236,7 +1236,7 @@
               </w:rPr>
               <w:t>12.5 Recording and where the history is kept</w:t>
               <w:tab/>
-              <w:t>60</w:t>
+              <w:t>61</w:t>
             </w:r>
           </w:hyperlink>
         </w:p>
@@ -1249,7 +1249,7 @@
             </w:tabs>
             <w:rPr/>
           </w:pPr>
-          <w:hyperlink w:anchor="__RefHeading___Toc6685_4031843506" w:tooltip="13 Databases">
+          <w:hyperlink w:anchor="__RefHeading___Toc6691_531561125" w:tooltip="13 Databases">
             <w:r>
               <w:rPr>
                 <w:rStyle w:val="IndexLink"/>
@@ -1257,7 +1257,7 @@
               </w:rPr>
               <w:t>13 Databases</w:t>
               <w:tab/>
-              <w:t>61</w:t>
+              <w:t>62</w:t>
             </w:r>
           </w:hyperlink>
         </w:p>
@@ -1270,7 +1270,7 @@
             </w:tabs>
             <w:rPr/>
           </w:pPr>
-          <w:hyperlink w:anchor="__RefHeading___Toc6687_4031843506" w:tooltip="13.1 Data sources">
+          <w:hyperlink w:anchor="__RefHeading___Toc6693_531561125" w:tooltip="13.1 Data sources">
             <w:r>
               <w:rPr>
                 <w:rStyle w:val="IndexLink"/>
@@ -1278,7 +1278,7 @@
               </w:rPr>
               <w:t>13.1 Data sources</w:t>
               <w:tab/>
-              <w:t>62</w:t>
+              <w:t>63</w:t>
             </w:r>
           </w:hyperlink>
         </w:p>
@@ -1291,7 +1291,7 @@
             </w:tabs>
             <w:rPr/>
           </w:pPr>
-          <w:hyperlink w:anchor="__RefHeading___Toc6689_4031843506" w:tooltip="13.2 Bind lists">
+          <w:hyperlink w:anchor="__RefHeading___Toc6695_531561125" w:tooltip="13.2 Bind lists">
             <w:r>
               <w:rPr>
                 <w:rStyle w:val="IndexLink"/>
@@ -1299,7 +1299,7 @@
               </w:rPr>
               <w:t>13.2 Bind lists</w:t>
               <w:tab/>
-              <w:t>63</w:t>
+              <w:t>64</w:t>
             </w:r>
           </w:hyperlink>
         </w:p>
@@ -1312,7 +1312,7 @@
             </w:tabs>
             <w:rPr/>
           </w:pPr>
-          <w:hyperlink w:anchor="__RefHeading___Toc6691_4031843506" w:tooltip="13.3 Table templates and queries">
+          <w:hyperlink w:anchor="__RefHeading___Toc6697_531561125" w:tooltip="13.3 Table templates and queries">
             <w:r>
               <w:rPr>
                 <w:rStyle w:val="IndexLink"/>
@@ -1320,7 +1320,7 @@
               </w:rPr>
               <w:t>13.3 Table templates and queries</w:t>
               <w:tab/>
-              <w:t>64</w:t>
+              <w:t>65</w:t>
             </w:r>
           </w:hyperlink>
         </w:p>
@@ -1333,7 +1333,7 @@
             </w:tabs>
             <w:rPr/>
           </w:pPr>
-          <w:hyperlink w:anchor="__RefHeading___Toc6693_4031843506" w:tooltip="13.4 The script functions">
+          <w:hyperlink w:anchor="__RefHeading___Toc6699_531561125" w:tooltip="13.4 The script functions">
             <w:r>
               <w:rPr>
                 <w:rStyle w:val="IndexLink"/>
@@ -1341,7 +1341,7 @@
               </w:rPr>
               <w:t>13.4 The script functions</w:t>
               <w:tab/>
-              <w:t>65</w:t>
+              <w:t>66</w:t>
             </w:r>
           </w:hyperlink>
         </w:p>
@@ -1354,7 +1354,7 @@
             </w:tabs>
             <w:rPr/>
           </w:pPr>
-          <w:hyperlink w:anchor="__RefHeading___Toc6695_4031843506" w:tooltip="13.5 The batch log in LiquidWeighHMI">
+          <w:hyperlink w:anchor="__RefHeading___Toc6701_531561125" w:tooltip="13.5 The batch log in LiquidWeighHMI">
             <w:r>
               <w:rPr>
                 <w:rStyle w:val="IndexLink"/>
@@ -1362,7 +1362,7 @@
               </w:rPr>
               <w:t>13.5 The batch log in LiquidWeighHMI</w:t>
               <w:tab/>
-              <w:t>67</w:t>
+              <w:t>68</w:t>
             </w:r>
           </w:hyperlink>
         </w:p>
@@ -1375,7 +1375,7 @@
             </w:tabs>
             <w:rPr/>
           </w:pPr>
-          <w:hyperlink w:anchor="__RefHeading___Toc6697_4031843506" w:tooltip="13.6 Where the rows are kept">
+          <w:hyperlink w:anchor="__RefHeading___Toc6703_531561125" w:tooltip="13.6 Where the rows are kept">
             <w:r>
               <w:rPr>
                 <w:rStyle w:val="IndexLink"/>
@@ -1383,7 +1383,7 @@
               </w:rPr>
               <w:t>13.6 Where the rows are kept</w:t>
               <w:tab/>
-              <w:t>68</w:t>
+              <w:t>69</w:t>
             </w:r>
           </w:hyperlink>
         </w:p>
@@ -1396,7 +1396,7 @@
             </w:tabs>
             <w:rPr/>
           </w:pPr>
-          <w:hyperlink w:anchor="__RefHeading___Toc6699_4031843506" w:tooltip="14 Testing">
+          <w:hyperlink w:anchor="__RefHeading___Toc6705_531561125" w:tooltip="14 Testing">
             <w:r>
               <w:rPr>
                 <w:rStyle w:val="IndexLink"/>
@@ -1404,7 +1404,7 @@
               </w:rPr>
               <w:t>14 Testing</w:t>
               <w:tab/>
-              <w:t>69</w:t>
+              <w:t>70</w:t>
             </w:r>
           </w:hyperlink>
         </w:p>
@@ -1417,7 +1417,7 @@
             </w:tabs>
             <w:rPr/>
           </w:pPr>
-          <w:hyperlink w:anchor="__RefHeading___Toc6701_4031843506" w:tooltip="14.1 Validate">
+          <w:hyperlink w:anchor="__RefHeading___Toc6707_531561125" w:tooltip="14.1 Validate">
             <w:r>
               <w:rPr>
                 <w:rStyle w:val="IndexLink"/>
@@ -1425,7 +1425,7 @@
               </w:rPr>
               <w:t>14.1 Validate</w:t>
               <w:tab/>
-              <w:t>69</w:t>
+              <w:t>70</w:t>
             </w:r>
           </w:hyperlink>
         </w:p>
@@ -1438,7 +1438,7 @@
             </w:tabs>
             <w:rPr/>
           </w:pPr>
-          <w:hyperlink w:anchor="__RefHeading___Toc6703_4031843506" w:tooltip="14.2 Run">
+          <w:hyperlink w:anchor="__RefHeading___Toc6709_531561125" w:tooltip="14.2 Run">
             <w:r>
               <w:rPr>
                 <w:rStyle w:val="IndexLink"/>
@@ -1446,7 +1446,7 @@
               </w:rPr>
               <w:t>14.2 Run</w:t>
               <w:tab/>
-              <w:t>70</w:t>
+              <w:t>71</w:t>
             </w:r>
           </w:hyperlink>
         </w:p>
@@ -1459,7 +1459,7 @@
             </w:tabs>
             <w:rPr/>
           </w:pPr>
-          <w:hyperlink w:anchor="__RefHeading___Toc6705_4031843506" w:tooltip="15 Deploying">
+          <w:hyperlink w:anchor="__RefHeading___Toc6711_531561125" w:tooltip="15 Deploying">
             <w:r>
               <w:rPr>
                 <w:rStyle w:val="IndexLink"/>
@@ -1467,7 +1467,7 @@
               </w:rPr>
               <w:t>15 Deploying</w:t>
               <w:tab/>
-              <w:t>74</w:t>
+              <w:t>75</w:t>
             </w:r>
           </w:hyperlink>
         </w:p>
@@ -1480,7 +1480,7 @@
             </w:tabs>
             <w:rPr/>
           </w:pPr>
-          <w:hyperlink w:anchor="__RefHeading___Toc6707_4031843506" w:tooltip="15.1 Publish">
+          <w:hyperlink w:anchor="__RefHeading___Toc6713_531561125" w:tooltip="15.1 Publish">
             <w:r>
               <w:rPr>
                 <w:rStyle w:val="IndexLink"/>
@@ -1488,7 +1488,7 @@
               </w:rPr>
               <w:t>15.1 Publish</w:t>
               <w:tab/>
-              <w:t>75</w:t>
+              <w:t>76</w:t>
             </w:r>
           </w:hyperlink>
         </w:p>
@@ -1501,7 +1501,7 @@
             </w:tabs>
             <w:rPr/>
           </w:pPr>
-          <w:hyperlink w:anchor="__RefHeading___Toc6709_4031843506" w:tooltip="15.2 Append HMI Desktop">
+          <w:hyperlink w:anchor="__RefHeading___Toc6715_531561125" w:tooltip="15.2 Append HMI Desktop">
             <w:r>
               <w:rPr>
                 <w:rStyle w:val="IndexLink"/>
@@ -1509,7 +1509,7 @@
               </w:rPr>
               <w:t>15.2 Append HMI Desktop</w:t>
               <w:tab/>
-              <w:t>76</w:t>
+              <w:t>77</w:t>
             </w:r>
           </w:hyperlink>
         </w:p>
@@ -1522,7 +1522,7 @@
             </w:tabs>
             <w:rPr/>
           </w:pPr>
-          <w:hyperlink w:anchor="__RefHeading___Toc6711_4031843506" w:tooltip="15.3 Append HMI Web">
+          <w:hyperlink w:anchor="__RefHeading___Toc6717_531561125" w:tooltip="15.3 Append HMI Web">
             <w:r>
               <w:rPr>
                 <w:rStyle w:val="IndexLink"/>
@@ -1530,7 +1530,7 @@
               </w:rPr>
               <w:t>15.3 Append HMI Web</w:t>
               <w:tab/>
-              <w:t>76</w:t>
+              <w:t>77</w:t>
             </w:r>
           </w:hyperlink>
         </w:p>
@@ -1543,7 +1543,7 @@
             </w:tabs>
             <w:rPr/>
           </w:pPr>
-          <w:hyperlink w:anchor="__RefHeading___Toc6713_4031843506" w:tooltip="16 Tips and troubleshooting">
+          <w:hyperlink w:anchor="__RefHeading___Toc6719_531561125" w:tooltip="16 Tips and troubleshooting">
             <w:r>
               <w:rPr>
                 <w:rStyle w:val="IndexLink"/>
@@ -1551,7 +1551,7 @@
               </w:rPr>
               <w:t>16 Tips and troubleshooting</w:t>
               <w:tab/>
-              <w:t>78</w:t>
+              <w:t>79</w:t>
             </w:r>
           </w:hyperlink>
         </w:p>
@@ -1564,7 +1564,7 @@
             </w:tabs>
             <w:rPr/>
           </w:pPr>
-          <w:hyperlink w:anchor="__RefHeading___Toc6715_4031843506" w:tooltip="Appendix A Command-line automation">
+          <w:hyperlink w:anchor="__RefHeading___Toc6721_531561125" w:tooltip="Appendix A Command-line automation">
             <w:r>
               <w:rPr>
                 <w:rStyle w:val="IndexLink"/>
@@ -1572,7 +1572,7 @@
               </w:rPr>
               <w:t>Appendix A Command-line automation</w:t>
               <w:tab/>
-              <w:t>79</w:t>
+              <w:t>80</w:t>
             </w:r>
           </w:hyperlink>
           <w:r>
@@ -1602,7 +1602,7 @@
         <w:spacing w:before="0" w:after="0"/>
         <w:rPr/>
       </w:pPr>
-      <w:bookmarkStart w:id="0" w:name="__RefHeading___Toc6593_4031843506"/>
+      <w:bookmarkStart w:id="0" w:name="__RefHeading___Toc6599_531561125"/>
       <w:bookmarkEnd w:id="0"/>
       <w:r>
         <w:rPr/>
@@ -2458,7 +2458,7 @@
         <w:pStyle w:val="Heading2"/>
         <w:rPr/>
       </w:pPr>
-      <w:bookmarkStart w:id="1" w:name="__RefHeading___Toc6595_4031843506"/>
+      <w:bookmarkStart w:id="1" w:name="__RefHeading___Toc6601_531561125"/>
       <w:bookmarkEnd w:id="1"/>
       <w:r>
         <w:rPr/>
@@ -3648,7 +3648,7 @@
         <w:pStyle w:val="Heading2"/>
         <w:rPr/>
       </w:pPr>
-      <w:bookmarkStart w:id="2" w:name="__RefHeading___Toc6597_4031843506"/>
+      <w:bookmarkStart w:id="2" w:name="__RefHeading___Toc6603_531561125"/>
       <w:bookmarkEnd w:id="2"/>
       <w:r>
         <w:rPr/>
@@ -3791,7 +3791,7 @@
         <w:pStyle w:val="Heading1"/>
         <w:rPr/>
       </w:pPr>
-      <w:bookmarkStart w:id="3" w:name="__RefHeading___Toc6599_4031843506"/>
+      <w:bookmarkStart w:id="3" w:name="__RefHeading___Toc6605_531561125"/>
       <w:bookmarkEnd w:id="3"/>
       <w:r>
         <w:rPr/>
@@ -4369,7 +4369,7 @@
         <w:pStyle w:val="Heading2"/>
         <w:rPr/>
       </w:pPr>
-      <w:bookmarkStart w:id="4" w:name="__RefHeading___Toc6601_4031843506"/>
+      <w:bookmarkStart w:id="4" w:name="__RefHeading___Toc6607_531561125"/>
       <w:bookmarkEnd w:id="4"/>
       <w:r>
         <w:rPr/>
@@ -5409,7 +5409,7 @@
         <w:pStyle w:val="Heading1"/>
         <w:rPr/>
       </w:pPr>
-      <w:bookmarkStart w:id="5" w:name="__RefHeading___Toc6603_4031843506"/>
+      <w:bookmarkStart w:id="5" w:name="__RefHeading___Toc6609_531561125"/>
       <w:bookmarkEnd w:id="5"/>
       <w:r>
         <w:rPr/>
@@ -5741,7 +5741,7 @@
         <w:pStyle w:val="Heading1"/>
         <w:rPr/>
       </w:pPr>
-      <w:bookmarkStart w:id="6" w:name="__RefHeading___Toc6605_4031843506"/>
+      <w:bookmarkStart w:id="6" w:name="__RefHeading___Toc6611_531561125"/>
       <w:bookmarkEnd w:id="6"/>
       <w:r>
         <w:rPr/>
@@ -6536,7 +6536,7 @@
         <w:pStyle w:val="Heading1"/>
         <w:rPr/>
       </w:pPr>
-      <w:bookmarkStart w:id="7" w:name="__RefHeading___Toc6607_4031843506"/>
+      <w:bookmarkStart w:id="7" w:name="__RefHeading___Toc6613_531561125"/>
       <w:bookmarkEnd w:id="7"/>
       <w:r>
         <w:rPr/>
@@ -7367,7 +7367,7 @@
         <w:pStyle w:val="Heading2"/>
         <w:rPr/>
       </w:pPr>
-      <w:bookmarkStart w:id="8" w:name="__RefHeading___Toc6609_4031843506"/>
+      <w:bookmarkStart w:id="8" w:name="__RefHeading___Toc6615_531561125"/>
       <w:bookmarkEnd w:id="8"/>
       <w:r>
         <w:rPr/>
@@ -8017,7 +8017,7 @@
         <w:pStyle w:val="Heading2"/>
         <w:rPr/>
       </w:pPr>
-      <w:bookmarkStart w:id="9" w:name="__RefHeading___Toc6611_4031843506"/>
+      <w:bookmarkStart w:id="9" w:name="__RefHeading___Toc6617_531561125"/>
       <w:bookmarkEnd w:id="9"/>
       <w:r>
         <w:rPr/>
@@ -8149,7 +8149,7 @@
         <w:pStyle w:val="Heading2"/>
         <w:rPr/>
       </w:pPr>
-      <w:bookmarkStart w:id="10" w:name="__RefHeading___Toc6613_4031843506"/>
+      <w:bookmarkStart w:id="10" w:name="__RefHeading___Toc6619_531561125"/>
       <w:bookmarkEnd w:id="10"/>
       <w:r>
         <w:rPr/>
@@ -8279,7 +8279,7 @@
         <w:pStyle w:val="Heading1"/>
         <w:rPr/>
       </w:pPr>
-      <w:bookmarkStart w:id="11" w:name="__RefHeading___Toc6615_4031843506"/>
+      <w:bookmarkStart w:id="11" w:name="__RefHeading___Toc6621_531561125"/>
       <w:bookmarkEnd w:id="11"/>
       <w:r>
         <w:rPr/>
@@ -8792,7 +8792,7 @@
         <w:pStyle w:val="Heading2"/>
         <w:rPr/>
       </w:pPr>
-      <w:bookmarkStart w:id="12" w:name="__RefHeading___Toc6617_4031843506"/>
+      <w:bookmarkStart w:id="12" w:name="__RefHeading___Toc6623_531561125"/>
       <w:bookmarkEnd w:id="12"/>
       <w:r>
         <w:rPr/>
@@ -8954,7 +8954,7 @@
         <w:pStyle w:val="Heading2"/>
         <w:rPr/>
       </w:pPr>
-      <w:bookmarkStart w:id="13" w:name="__RefHeading___Toc6619_4031843506"/>
+      <w:bookmarkStart w:id="13" w:name="__RefHeading___Toc6625_531561125"/>
       <w:bookmarkEnd w:id="13"/>
       <w:r>
         <w:rPr/>
@@ -9126,7 +9126,7 @@
         <w:pStyle w:val="Heading1"/>
         <w:rPr/>
       </w:pPr>
-      <w:bookmarkStart w:id="14" w:name="__RefHeading___Toc6621_4031843506"/>
+      <w:bookmarkStart w:id="14" w:name="__RefHeading___Toc6627_531561125"/>
       <w:bookmarkEnd w:id="14"/>
       <w:r>
         <w:rPr/>
@@ -9892,7 +9892,7 @@
         <w:pStyle w:val="Heading1"/>
         <w:rPr/>
       </w:pPr>
-      <w:bookmarkStart w:id="15" w:name="__RefHeading___Toc6623_4031843506"/>
+      <w:bookmarkStart w:id="15" w:name="__RefHeading___Toc6629_531561125"/>
       <w:bookmarkEnd w:id="15"/>
       <w:r>
         <w:rPr/>
@@ -10614,10 +10614,48 @@
     </w:p>
     <w:p>
       <w:pPr>
+        <w:pStyle w:val="Normal"/>
+        <w:ind w:left="360"/>
+        <w:rPr/>
+      </w:pPr>
+      <w:r>
+        <w:rPr>
+          <w:b/>
+          <w:color w:val="1F5F99"/>
+        </w:rPr>
+        <w:t xml:space="preserve">Note: </w:t>
+      </w:r>
+      <w:r>
+        <w:rPr/>
+        <w:t xml:space="preserve">Objects can be layered freely. A touch goes to the topmost object that has a touch link, and an object drawn over it with no touch link of its own — a label, a panel, a pipe, the unfilled outline over a Percent Fill shape — is seen through, with the pointing hand showing over it as well. A touch link on a group covers everything in the group. An object that does have a touch link keeps the touch even while its </w:t>
+      </w:r>
+      <w:r>
+        <w:rPr>
+          <w:b/>
+        </w:rPr>
+        <w:t>Enable when</w:t>
+      </w:r>
+      <w:r>
+        <w:rPr/>
+        <w:t xml:space="preserve"> condition or an </w:t>
+      </w:r>
+      <w:r>
+        <w:rPr>
+          <w:b/>
+        </w:rPr>
+        <w:t>Enable</w:t>
+      </w:r>
+      <w:r>
+        <w:rPr/>
+        <w:t xml:space="preserve"> link blocks it, so a button the operator may not use does nothing.</w:t>
+      </w:r>
+    </w:p>
+    <w:p>
+      <w:pPr>
         <w:pStyle w:val="Heading2"/>
         <w:rPr/>
       </w:pPr>
-      <w:bookmarkStart w:id="16" w:name="__RefHeading___Toc6625_4031843506"/>
+      <w:bookmarkStart w:id="16" w:name="__RefHeading___Toc6631_531561125"/>
       <w:bookmarkEnd w:id="16"/>
       <w:r>
         <w:rPr/>
@@ -10803,7 +10841,7 @@
         <w:pStyle w:val="Heading2"/>
         <w:rPr/>
       </w:pPr>
-      <w:bookmarkStart w:id="17" w:name="__RefHeading___Toc6627_4031843506"/>
+      <w:bookmarkStart w:id="17" w:name="__RefHeading___Toc6633_531561125"/>
       <w:bookmarkEnd w:id="17"/>
       <w:r>
         <w:rPr/>
@@ -10918,13 +10956,16 @@
         <w:rPr/>
         <w:t>Percent Fill draws only the filled part of the object, outline included. Place an identical shape with no fill on top as the vessel outline, as LiquidWeighHMI does.</w:t>
       </w:r>
+      <w:r>
+        <w:br w:type="page"/>
+      </w:r>
     </w:p>
     <w:p>
       <w:pPr>
         <w:pStyle w:val="Heading2"/>
         <w:rPr/>
       </w:pPr>
-      <w:bookmarkStart w:id="18" w:name="__RefHeading___Toc6629_4031843506"/>
+      <w:bookmarkStart w:id="18" w:name="__RefHeading___Toc6635_531561125"/>
       <w:bookmarkEnd w:id="18"/>
       <w:r>
         <w:rPr/>
@@ -11040,7 +11081,7 @@
         <w:pStyle w:val="Heading2"/>
         <w:rPr/>
       </w:pPr>
-      <w:bookmarkStart w:id="19" w:name="__RefHeading___Toc6631_4031843506"/>
+      <w:bookmarkStart w:id="19" w:name="__RefHeading___Toc6637_531561125"/>
       <w:bookmarkEnd w:id="19"/>
       <w:r>
         <w:rPr/>
@@ -11156,7 +11197,7 @@
         <w:pStyle w:val="Heading2"/>
         <w:rPr/>
       </w:pPr>
-      <w:bookmarkStart w:id="20" w:name="__RefHeading___Toc6633_4031843506"/>
+      <w:bookmarkStart w:id="20" w:name="__RefHeading___Toc6639_531561125"/>
       <w:bookmarkEnd w:id="20"/>
       <w:r>
         <w:rPr/>
@@ -11668,7 +11709,7 @@
         <w:pStyle w:val="Heading1"/>
         <w:rPr/>
       </w:pPr>
-      <w:bookmarkStart w:id="21" w:name="__RefHeading___Toc6635_4031843506"/>
+      <w:bookmarkStart w:id="21" w:name="__RefHeading___Toc6641_531561125"/>
       <w:bookmarkEnd w:id="21"/>
       <w:r>
         <w:rPr/>
@@ -12847,7 +12888,7 @@
         <w:pStyle w:val="Heading2"/>
         <w:rPr/>
       </w:pPr>
-      <w:bookmarkStart w:id="22" w:name="__RefHeading___Toc6637_4031843506"/>
+      <w:bookmarkStart w:id="22" w:name="__RefHeading___Toc6643_531561125"/>
       <w:bookmarkEnd w:id="22"/>
       <w:r>
         <w:rPr/>
@@ -13259,7 +13300,7 @@
         <w:pStyle w:val="Heading2"/>
         <w:rPr/>
       </w:pPr>
-      <w:bookmarkStart w:id="23" w:name="__RefHeading___Toc6639_4031843506"/>
+      <w:bookmarkStart w:id="23" w:name="__RefHeading___Toc6645_531561125"/>
       <w:bookmarkEnd w:id="23"/>
       <w:r>
         <w:rPr/>
@@ -13378,7 +13419,7 @@
         <w:pStyle w:val="Heading2"/>
         <w:rPr/>
       </w:pPr>
-      <w:bookmarkStart w:id="24" w:name="__RefHeading___Toc6641_4031843506"/>
+      <w:bookmarkStart w:id="24" w:name="__RefHeading___Toc6647_531561125"/>
       <w:bookmarkEnd w:id="24"/>
       <w:r>
         <w:rPr/>
@@ -19743,7 +19784,7 @@
         <w:pStyle w:val="Heading2"/>
         <w:rPr/>
       </w:pPr>
-      <w:bookmarkStart w:id="25" w:name="__RefHeading___Toc6643_4031843506"/>
+      <w:bookmarkStart w:id="25" w:name="__RefHeading___Toc6649_531561125"/>
       <w:bookmarkEnd w:id="25"/>
       <w:r>
         <w:rPr/>
@@ -20579,7 +20620,7 @@
         <w:pStyle w:val="Heading2"/>
         <w:rPr/>
       </w:pPr>
-      <w:bookmarkStart w:id="26" w:name="__RefHeading___Toc6645_4031843506"/>
+      <w:bookmarkStart w:id="26" w:name="__RefHeading___Toc6651_531561125"/>
       <w:bookmarkEnd w:id="26"/>
       <w:r>
         <w:rPr/>
@@ -21062,7 +21103,7 @@
         <w:pStyle w:val="Heading2"/>
         <w:rPr/>
       </w:pPr>
-      <w:bookmarkStart w:id="27" w:name="__RefHeading___Toc6647_4031843506"/>
+      <w:bookmarkStart w:id="27" w:name="__RefHeading___Toc6653_531561125"/>
       <w:bookmarkEnd w:id="27"/>
       <w:r>
         <w:rPr/>
@@ -21254,7 +21295,7 @@
         <w:pStyle w:val="Heading2"/>
         <w:rPr/>
       </w:pPr>
-      <w:bookmarkStart w:id="28" w:name="__RefHeading___Toc6649_4031843506"/>
+      <w:bookmarkStart w:id="28" w:name="__RefHeading___Toc6655_531561125"/>
       <w:bookmarkEnd w:id="28"/>
       <w:r>
         <w:rPr/>
@@ -21940,7 +21981,7 @@
         <w:pStyle w:val="Heading2"/>
         <w:rPr/>
       </w:pPr>
-      <w:bookmarkStart w:id="29" w:name="__RefHeading___Toc6651_4031843506"/>
+      <w:bookmarkStart w:id="29" w:name="__RefHeading___Toc6657_531561125"/>
       <w:bookmarkEnd w:id="29"/>
       <w:r>
         <w:rPr/>
@@ -22694,7 +22735,7 @@
         <w:pStyle w:val="Heading1"/>
         <w:rPr/>
       </w:pPr>
-      <w:bookmarkStart w:id="30" w:name="__RefHeading___Toc6653_4031843506"/>
+      <w:bookmarkStart w:id="30" w:name="__RefHeading___Toc6659_531561125"/>
       <w:bookmarkEnd w:id="30"/>
       <w:r>
         <w:rPr/>
@@ -22706,7 +22747,7 @@
         <w:pStyle w:val="Heading2"/>
         <w:rPr/>
       </w:pPr>
-      <w:bookmarkStart w:id="31" w:name="__RefHeading___Toc6655_4031843506"/>
+      <w:bookmarkStart w:id="31" w:name="__RefHeading___Toc6661_531561125"/>
       <w:bookmarkEnd w:id="31"/>
       <w:r>
         <w:rPr/>
@@ -22836,7 +22877,7 @@
         <w:pStyle w:val="Heading2"/>
         <w:rPr/>
       </w:pPr>
-      <w:bookmarkStart w:id="32" w:name="__RefHeading___Toc6657_4031843506"/>
+      <w:bookmarkStart w:id="32" w:name="__RefHeading___Toc6663_531561125"/>
       <w:bookmarkEnd w:id="32"/>
       <w:r>
         <w:rPr/>
@@ -23526,7 +23567,7 @@
         <w:pStyle w:val="Heading1"/>
         <w:rPr/>
       </w:pPr>
-      <w:bookmarkStart w:id="33" w:name="__RefHeading___Toc6659_4031843506"/>
+      <w:bookmarkStart w:id="33" w:name="__RefHeading___Toc6665_531561125"/>
       <w:bookmarkEnd w:id="33"/>
       <w:r>
         <w:rPr/>
@@ -23665,7 +23706,7 @@
         <w:pStyle w:val="Heading2"/>
         <w:rPr/>
       </w:pPr>
-      <w:bookmarkStart w:id="34" w:name="__RefHeading___Toc6661_4031843506"/>
+      <w:bookmarkStart w:id="34" w:name="__RefHeading___Toc6667_531561125"/>
       <w:bookmarkEnd w:id="34"/>
       <w:r>
         <w:rPr/>
@@ -25526,7 +25567,7 @@
         <w:pStyle w:val="Heading2"/>
         <w:rPr/>
       </w:pPr>
-      <w:bookmarkStart w:id="35" w:name="__RefHeading___Toc6663_4031843506"/>
+      <w:bookmarkStart w:id="35" w:name="__RefHeading___Toc6669_531561125"/>
       <w:bookmarkEnd w:id="35"/>
       <w:r>
         <w:rPr/>
@@ -26976,7 +27017,7 @@
         <w:pStyle w:val="Heading2"/>
         <w:rPr/>
       </w:pPr>
-      <w:bookmarkStart w:id="36" w:name="__RefHeading___Toc6665_4031843506"/>
+      <w:bookmarkStart w:id="36" w:name="__RefHeading___Toc6671_531561125"/>
       <w:bookmarkEnd w:id="36"/>
       <w:r>
         <w:rPr/>
@@ -27517,7 +27558,7 @@
         <w:pStyle w:val="Heading2"/>
         <w:rPr/>
       </w:pPr>
-      <w:bookmarkStart w:id="37" w:name="__RefHeading___Toc6667_4031843506"/>
+      <w:bookmarkStart w:id="37" w:name="__RefHeading___Toc6673_531561125"/>
       <w:bookmarkEnd w:id="37"/>
       <w:r>
         <w:rPr/>
@@ -27802,7 +27843,7 @@
         <w:pStyle w:val="Heading2"/>
         <w:rPr/>
       </w:pPr>
-      <w:bookmarkStart w:id="38" w:name="__RefHeading___Toc6669_4031843506"/>
+      <w:bookmarkStart w:id="38" w:name="__RefHeading___Toc6675_531561125"/>
       <w:bookmarkEnd w:id="38"/>
       <w:r>
         <w:rPr/>
@@ -27960,7 +28001,7 @@
         <w:pStyle w:val="Heading2"/>
         <w:rPr/>
       </w:pPr>
-      <w:bookmarkStart w:id="39" w:name="__RefHeading___Toc6671_4031843506"/>
+      <w:bookmarkStart w:id="39" w:name="__RefHeading___Toc6677_531561125"/>
       <w:bookmarkEnd w:id="39"/>
       <w:r>
         <w:rPr/>
@@ -28360,7 +28401,7 @@
         <w:pStyle w:val="Heading1"/>
         <w:rPr/>
       </w:pPr>
-      <w:bookmarkStart w:id="40" w:name="__RefHeading___Toc6673_4031843506"/>
+      <w:bookmarkStart w:id="40" w:name="__RefHeading___Toc6679_531561125"/>
       <w:bookmarkEnd w:id="40"/>
       <w:r>
         <w:rPr/>
@@ -28392,7 +28433,7 @@
         <w:pStyle w:val="Heading2"/>
         <w:rPr/>
       </w:pPr>
-      <w:bookmarkStart w:id="41" w:name="__RefHeading___Toc6675_4031843506"/>
+      <w:bookmarkStart w:id="41" w:name="__RefHeading___Toc6681_531561125"/>
       <w:bookmarkEnd w:id="41"/>
       <w:r>
         <w:rPr/>
@@ -29597,7 +29638,7 @@
         <w:pStyle w:val="Heading2"/>
         <w:rPr/>
       </w:pPr>
-      <w:bookmarkStart w:id="42" w:name="__RefHeading___Toc6677_4031843506"/>
+      <w:bookmarkStart w:id="42" w:name="__RefHeading___Toc6683_531561125"/>
       <w:bookmarkEnd w:id="42"/>
       <w:r>
         <w:rPr/>
@@ -30980,7 +31021,7 @@
         <w:pStyle w:val="Heading2"/>
         <w:rPr/>
       </w:pPr>
-      <w:bookmarkStart w:id="43" w:name="__RefHeading___Toc6679_4031843506"/>
+      <w:bookmarkStart w:id="43" w:name="__RefHeading___Toc6685_531561125"/>
       <w:bookmarkEnd w:id="43"/>
       <w:r>
         <w:rPr/>
@@ -31566,7 +31607,7 @@
         <w:pStyle w:val="Heading2"/>
         <w:rPr/>
       </w:pPr>
-      <w:bookmarkStart w:id="44" w:name="__RefHeading___Toc6681_4031843506"/>
+      <w:bookmarkStart w:id="44" w:name="__RefHeading___Toc6687_531561125"/>
       <w:bookmarkEnd w:id="44"/>
       <w:r>
         <w:rPr/>
@@ -31661,7 +31702,7 @@
         <w:pStyle w:val="Heading2"/>
         <w:rPr/>
       </w:pPr>
-      <w:bookmarkStart w:id="45" w:name="__RefHeading___Toc6683_4031843506"/>
+      <w:bookmarkStart w:id="45" w:name="__RefHeading___Toc6689_531561125"/>
       <w:bookmarkEnd w:id="45"/>
       <w:r>
         <w:rPr/>
@@ -32115,7 +32156,7 @@
         <w:pStyle w:val="Heading1"/>
         <w:rPr/>
       </w:pPr>
-      <w:bookmarkStart w:id="46" w:name="__RefHeading___Toc6685_4031843506"/>
+      <w:bookmarkStart w:id="46" w:name="__RefHeading___Toc6691_531561125"/>
       <w:bookmarkEnd w:id="46"/>
       <w:r>
         <w:rPr/>
@@ -32280,7 +32321,7 @@
         <w:pStyle w:val="Heading2"/>
         <w:rPr/>
       </w:pPr>
-      <w:bookmarkStart w:id="47" w:name="__RefHeading___Toc6687_4031843506"/>
+      <w:bookmarkStart w:id="47" w:name="__RefHeading___Toc6693_531561125"/>
       <w:bookmarkEnd w:id="47"/>
       <w:r>
         <w:rPr/>
@@ -33397,7 +33438,7 @@
         <w:pStyle w:val="Heading2"/>
         <w:rPr/>
       </w:pPr>
-      <w:bookmarkStart w:id="48" w:name="__RefHeading___Toc6689_4031843506"/>
+      <w:bookmarkStart w:id="48" w:name="__RefHeading___Toc6695_531561125"/>
       <w:bookmarkEnd w:id="48"/>
       <w:r>
         <w:rPr/>
@@ -33631,7 +33672,7 @@
         <w:pStyle w:val="Heading2"/>
         <w:rPr/>
       </w:pPr>
-      <w:bookmarkStart w:id="49" w:name="__RefHeading___Toc6691_4031843506"/>
+      <w:bookmarkStart w:id="49" w:name="__RefHeading___Toc6697_531561125"/>
       <w:bookmarkEnd w:id="49"/>
       <w:r>
         <w:rPr/>
@@ -34448,7 +34489,7 @@
         <w:pStyle w:val="Heading2"/>
         <w:rPr/>
       </w:pPr>
-      <w:bookmarkStart w:id="50" w:name="__RefHeading___Toc6693_4031843506"/>
+      <w:bookmarkStart w:id="50" w:name="__RefHeading___Toc6699_531561125"/>
       <w:bookmarkEnd w:id="50"/>
       <w:r>
         <w:rPr/>
@@ -36144,7 +36185,7 @@
         <w:pStyle w:val="Heading2"/>
         <w:rPr/>
       </w:pPr>
-      <w:bookmarkStart w:id="51" w:name="__RefHeading___Toc6695_4031843506"/>
+      <w:bookmarkStart w:id="51" w:name="__RefHeading___Toc6701_531561125"/>
       <w:bookmarkEnd w:id="51"/>
       <w:r>
         <w:rPr/>
@@ -36844,7 +36885,7 @@
         <w:pStyle w:val="Heading2"/>
         <w:rPr/>
       </w:pPr>
-      <w:bookmarkStart w:id="52" w:name="__RefHeading___Toc6697_4031843506"/>
+      <w:bookmarkStart w:id="52" w:name="__RefHeading___Toc6703_531561125"/>
       <w:bookmarkEnd w:id="52"/>
       <w:r>
         <w:rPr/>
@@ -37202,7 +37243,7 @@
         <w:pStyle w:val="Heading1"/>
         <w:rPr/>
       </w:pPr>
-      <w:bookmarkStart w:id="53" w:name="__RefHeading___Toc6699_4031843506"/>
+      <w:bookmarkStart w:id="53" w:name="__RefHeading___Toc6705_531561125"/>
       <w:bookmarkEnd w:id="53"/>
       <w:r>
         <w:rPr/>
@@ -37214,7 +37255,7 @@
         <w:pStyle w:val="Heading2"/>
         <w:rPr/>
       </w:pPr>
-      <w:bookmarkStart w:id="54" w:name="__RefHeading___Toc6701_4031843506"/>
+      <w:bookmarkStart w:id="54" w:name="__RefHeading___Toc6707_531561125"/>
       <w:bookmarkEnd w:id="54"/>
       <w:r>
         <w:rPr/>
@@ -37305,7 +37346,7 @@
         <w:pStyle w:val="Heading2"/>
         <w:rPr/>
       </w:pPr>
-      <w:bookmarkStart w:id="55" w:name="__RefHeading___Toc6703_4031843506"/>
+      <w:bookmarkStart w:id="55" w:name="__RefHeading___Toc6709_531561125"/>
       <w:bookmarkEnd w:id="55"/>
       <w:r>
         <w:rPr/>
@@ -37871,7 +37912,7 @@
         <w:pStyle w:val="Heading1"/>
         <w:rPr/>
       </w:pPr>
-      <w:bookmarkStart w:id="56" w:name="__RefHeading___Toc6705_4031843506"/>
+      <w:bookmarkStart w:id="56" w:name="__RefHeading___Toc6711_531561125"/>
       <w:bookmarkEnd w:id="56"/>
       <w:r>
         <w:rPr/>
@@ -38327,7 +38368,7 @@
         <w:pStyle w:val="Heading2"/>
         <w:rPr/>
       </w:pPr>
-      <w:bookmarkStart w:id="57" w:name="__RefHeading___Toc6707_4031843506"/>
+      <w:bookmarkStart w:id="57" w:name="__RefHeading___Toc6713_531561125"/>
       <w:bookmarkEnd w:id="57"/>
       <w:r>
         <w:rPr/>
@@ -38418,7 +38459,7 @@
         <w:pStyle w:val="Heading2"/>
         <w:rPr/>
       </w:pPr>
-      <w:bookmarkStart w:id="58" w:name="__RefHeading___Toc6709_4031843506"/>
+      <w:bookmarkStart w:id="58" w:name="__RefHeading___Toc6715_531561125"/>
       <w:bookmarkEnd w:id="58"/>
       <w:r>
         <w:rPr/>
@@ -38531,7 +38572,7 @@
         <w:pStyle w:val="Heading2"/>
         <w:rPr/>
       </w:pPr>
-      <w:bookmarkStart w:id="59" w:name="__RefHeading___Toc6711_4031843506"/>
+      <w:bookmarkStart w:id="59" w:name="__RefHeading___Toc6717_531561125"/>
       <w:bookmarkEnd w:id="59"/>
       <w:r>
         <w:rPr/>
@@ -38744,7 +38785,7 @@
         <w:pStyle w:val="Heading1"/>
         <w:rPr/>
       </w:pPr>
-      <w:bookmarkStart w:id="60" w:name="__RefHeading___Toc6713_4031843506"/>
+      <w:bookmarkStart w:id="60" w:name="__RefHeading___Toc6719_531561125"/>
       <w:bookmarkEnd w:id="60"/>
       <w:r>
         <w:rPr/>
@@ -39536,7 +39577,7 @@
         <w:pStyle w:val="Heading1"/>
         <w:rPr/>
       </w:pPr>
-      <w:bookmarkStart w:id="61" w:name="__RefHeading___Toc6715_4031843506"/>
+      <w:bookmarkStart w:id="61" w:name="__RefHeading___Toc6721_531561125"/>
       <w:bookmarkEnd w:id="61"/>
       <w:r>
         <w:rPr/>
@@ -40085,7 +40126,7 @@
       <w:rPr>
         <w:sz w:val="18"/>
       </w:rPr>
-      <w:t>79</w:t>
+      <w:t>80</w:t>
     </w:r>
     <w:r>
       <w:rPr>

</xml_diff>

<commit_message>
docs: the manual covers the title bar, movable popups and View > Reset
Section 6.1 gains the title bar settings table and what moving a popup
does, with its figure retaken from the installed 1.10.0 build; chapter 3
notes that View > Reset brings the whole screen area back; chapter 2's
palette row names the List Box, which it had missed.

Co-Authored-By: Claude Opus 5 <noreply@anthropic.com>
</commit_message>
<xml_diff>
--- a/doc/Append-HMI-Studio-User-Manual.docx
+++ b/doc/Append-HMI-Studio-User-Manual.docx
@@ -283,7 +283,7 @@
             </w:rPr>
             <w:fldChar w:fldCharType="separate"/>
           </w:r>
-          <w:hyperlink w:anchor="__RefHeading___Toc7437_2860942839" w:tooltip="1 Introduction">
+          <w:hyperlink w:anchor="__RefHeading___Toc7583_1630158169" w:tooltip="1 Introduction">
             <w:r>
               <w:rPr>
                 <w:rStyle w:val="IndexLink"/>
@@ -304,7 +304,7 @@
             </w:tabs>
             <w:rPr/>
           </w:pPr>
-          <w:hyperlink w:anchor="__RefHeading___Toc7439_2860942839" w:tooltip="1.1 Building applications with an AI agent">
+          <w:hyperlink w:anchor="__RefHeading___Toc7585_1630158169" w:tooltip="1.1 Building applications with an AI agent">
             <w:r>
               <w:rPr>
                 <w:rStyle w:val="IndexLink"/>
@@ -325,7 +325,7 @@
             </w:tabs>
             <w:rPr/>
           </w:pPr>
-          <w:hyperlink w:anchor="__RefHeading___Toc7441_2860942839" w:tooltip="1.2 How an HMI application is organized">
+          <w:hyperlink w:anchor="__RefHeading___Toc7587_1630158169" w:tooltip="1.2 How an HMI application is organized">
             <w:r>
               <w:rPr>
                 <w:rStyle w:val="IndexLink"/>
@@ -346,7 +346,7 @@
             </w:tabs>
             <w:rPr/>
           </w:pPr>
-          <w:hyperlink w:anchor="__RefHeading___Toc7443_2860942839" w:tooltip="2 The Studio window">
+          <w:hyperlink w:anchor="__RefHeading___Toc7589_1630158169" w:tooltip="2 The Studio window">
             <w:r>
               <w:rPr>
                 <w:rStyle w:val="IndexLink"/>
@@ -367,7 +367,7 @@
             </w:tabs>
             <w:rPr/>
           </w:pPr>
-          <w:hyperlink w:anchor="__RefHeading___Toc7445_2860942839" w:tooltip="2.1 The HMI menu">
+          <w:hyperlink w:anchor="__RefHeading___Toc7591_1630158169" w:tooltip="2.1 The HMI menu">
             <w:r>
               <w:rPr>
                 <w:rStyle w:val="IndexLink"/>
@@ -388,7 +388,7 @@
             </w:tabs>
             <w:rPr/>
           </w:pPr>
-          <w:hyperlink w:anchor="__RefHeading___Toc7447_2860942839" w:tooltip="3 Application settings">
+          <w:hyperlink w:anchor="__RefHeading___Toc7593_1630158169" w:tooltip="3 Application settings">
             <w:r>
               <w:rPr>
                 <w:rStyle w:val="IndexLink"/>
@@ -409,7 +409,7 @@
             </w:tabs>
             <w:rPr/>
           </w:pPr>
-          <w:hyperlink w:anchor="__RefHeading___Toc7449_2860942839" w:tooltip="4 Devices">
+          <w:hyperlink w:anchor="__RefHeading___Toc7595_1630158169" w:tooltip="4 Devices">
             <w:r>
               <w:rPr>
                 <w:rStyle w:val="IndexLink"/>
@@ -430,7 +430,7 @@
             </w:tabs>
             <w:rPr/>
           </w:pPr>
-          <w:hyperlink w:anchor="__RefHeading___Toc7451_2860942839" w:tooltip="5 Tags">
+          <w:hyperlink w:anchor="__RefHeading___Toc7597_1630158169" w:tooltip="5 Tags">
             <w:r>
               <w:rPr>
                 <w:rStyle w:val="IndexLink"/>
@@ -451,7 +451,7 @@
             </w:tabs>
             <w:rPr/>
           </w:pPr>
-          <w:hyperlink w:anchor="__RefHeading___Toc7453_2860942839" w:tooltip="5.1 Tag fields">
+          <w:hyperlink w:anchor="__RefHeading___Toc7599_1630158169" w:tooltip="5.1 Tag fields">
             <w:r>
               <w:rPr>
                 <w:rStyle w:val="IndexLink"/>
@@ -472,7 +472,7 @@
             </w:tabs>
             <w:rPr/>
           </w:pPr>
-          <w:hyperlink w:anchor="__RefHeading___Toc7455_2860942839" w:tooltip="5.2 Alarms on a tag">
+          <w:hyperlink w:anchor="__RefHeading___Toc7601_1630158169" w:tooltip="5.2 Alarms on a tag">
             <w:r>
               <w:rPr>
                 <w:rStyle w:val="IndexLink"/>
@@ -493,7 +493,7 @@
             </w:tabs>
             <w:rPr/>
           </w:pPr>
-          <w:hyperlink w:anchor="__RefHeading___Toc7457_2860942839" w:tooltip="5.3 Renaming, and finding and replacing tag references">
+          <w:hyperlink w:anchor="__RefHeading___Toc7603_1630158169" w:tooltip="5.3 Renaming, and finding and replacing tag references">
             <w:r>
               <w:rPr>
                 <w:rStyle w:val="IndexLink"/>
@@ -514,7 +514,7 @@
             </w:tabs>
             <w:rPr/>
           </w:pPr>
-          <w:hyperlink w:anchor="__RefHeading___Toc7459_2860942839" w:tooltip="6 Screens and windows">
+          <w:hyperlink w:anchor="__RefHeading___Toc7605_1630158169" w:tooltip="6 Screens and windows">
             <w:r>
               <w:rPr>
                 <w:rStyle w:val="IndexLink"/>
@@ -535,7 +535,7 @@
             </w:tabs>
             <w:rPr/>
           </w:pPr>
-          <w:hyperlink w:anchor="__RefHeading___Toc7461_2860942839" w:tooltip="6.1 Window properties">
+          <w:hyperlink w:anchor="__RefHeading___Toc7607_1630158169" w:tooltip="6.1 Window properties">
             <w:r>
               <w:rPr>
                 <w:rStyle w:val="IndexLink"/>
@@ -556,7 +556,7 @@
             </w:tabs>
             <w:rPr/>
           </w:pPr>
-          <w:hyperlink w:anchor="__RefHeading___Toc7463_2860942839" w:tooltip="6.2 The header, the navigation bar and the screens">
+          <w:hyperlink w:anchor="__RefHeading___Toc7609_1630158169" w:tooltip="6.2 The header, the navigation bar and the screens">
             <w:r>
               <w:rPr>
                 <w:rStyle w:val="IndexLink"/>
@@ -564,7 +564,7 @@
               </w:rPr>
               <w:t>6.2 The header, the navigation bar and the screens</w:t>
               <w:tab/>
-              <w:t>19</w:t>
+              <w:t>20</w:t>
             </w:r>
           </w:hyperlink>
         </w:p>
@@ -577,7 +577,7 @@
             </w:tabs>
             <w:rPr/>
           </w:pPr>
-          <w:hyperlink w:anchor="__RefHeading___Toc7465_2860942839" w:tooltip="7 Drawing objects">
+          <w:hyperlink w:anchor="__RefHeading___Toc7611_1630158169" w:tooltip="7 Drawing objects">
             <w:r>
               <w:rPr>
                 <w:rStyle w:val="IndexLink"/>
@@ -585,7 +585,7 @@
               </w:rPr>
               <w:t>7 Drawing objects</w:t>
               <w:tab/>
-              <w:t>20</w:t>
+              <w:t>21</w:t>
             </w:r>
           </w:hyperlink>
         </w:p>
@@ -598,7 +598,7 @@
             </w:tabs>
             <w:rPr/>
           </w:pPr>
-          <w:hyperlink w:anchor="__RefHeading___Toc7467_2860942839" w:tooltip="8 Animation links">
+          <w:hyperlink w:anchor="__RefHeading___Toc7613_1630158169" w:tooltip="8 Animation links">
             <w:r>
               <w:rPr>
                 <w:rStyle w:val="IndexLink"/>
@@ -606,7 +606,7 @@
               </w:rPr>
               <w:t>8 Animation links</w:t>
               <w:tab/>
-              <w:t>21</w:t>
+              <w:t>22</w:t>
             </w:r>
           </w:hyperlink>
         </w:p>
@@ -619,7 +619,7 @@
             </w:tabs>
             <w:rPr/>
           </w:pPr>
-          <w:hyperlink w:anchor="__RefHeading___Toc7469_2860942839" w:tooltip="8.1 A valve: status color, fault blink and faceplate">
+          <w:hyperlink w:anchor="__RefHeading___Toc7615_1630158169" w:tooltip="8.1 A valve: status color, fault blink and faceplate">
             <w:r>
               <w:rPr>
                 <w:rStyle w:val="IndexLink"/>
@@ -627,7 +627,7 @@
               </w:rPr>
               <w:t>8.1 A valve: status color, fault blink and faceplate</w:t>
               <w:tab/>
-              <w:t>23</w:t>
+              <w:t>24</w:t>
             </w:r>
           </w:hyperlink>
         </w:p>
@@ -640,7 +640,7 @@
             </w:tabs>
             <w:rPr/>
           </w:pPr>
-          <w:hyperlink w:anchor="__RefHeading___Toc7471_2860942839" w:tooltip="8.2 The weigh hopper: percent fill">
+          <w:hyperlink w:anchor="__RefHeading___Toc7617_1630158169" w:tooltip="8.2 The weigh hopper: percent fill">
             <w:r>
               <w:rPr>
                 <w:rStyle w:val="IndexLink"/>
@@ -648,7 +648,7 @@
               </w:rPr>
               <w:t>8.2 The weigh hopper: percent fill</w:t>
               <w:tab/>
-              <w:t>24</w:t>
+              <w:t>25</w:t>
             </w:r>
           </w:hyperlink>
         </w:p>
@@ -661,7 +661,7 @@
             </w:tabs>
             <w:rPr/>
           </w:pPr>
-          <w:hyperlink w:anchor="__RefHeading___Toc7473_2860942839" w:tooltip="8.3 Hopper pressure: value display and alarm colors">
+          <w:hyperlink w:anchor="__RefHeading___Toc7619_1630158169" w:tooltip="8.3 Hopper pressure: value display and alarm colors">
             <w:r>
               <w:rPr>
                 <w:rStyle w:val="IndexLink"/>
@@ -669,7 +669,7 @@
               </w:rPr>
               <w:t>8.3 Hopper pressure: value display and alarm colors</w:t>
               <w:tab/>
-              <w:t>26</w:t>
+              <w:t>27</w:t>
             </w:r>
           </w:hyperlink>
         </w:p>
@@ -682,7 +682,7 @@
             </w:tabs>
             <w:rPr/>
           </w:pPr>
-          <w:hyperlink w:anchor="__RefHeading___Toc7475_2860942839" w:tooltip="8.4 Setpoints: user input">
+          <w:hyperlink w:anchor="__RefHeading___Toc7621_1630158169" w:tooltip="8.4 Setpoints: user input">
             <w:r>
               <w:rPr>
                 <w:rStyle w:val="IndexLink"/>
@@ -690,7 +690,7 @@
               </w:rPr>
               <w:t>8.4 Setpoints: user input</w:t>
               <w:tab/>
-              <w:t>27</w:t>
+              <w:t>28</w:t>
             </w:r>
           </w:hyperlink>
         </w:p>
@@ -703,7 +703,7 @@
             </w:tabs>
             <w:rPr/>
           </w:pPr>
-          <w:hyperlink w:anchor="__RefHeading___Toc7477_2860942839" w:tooltip="8.5 Commands: pushbutton and enable">
+          <w:hyperlink w:anchor="__RefHeading___Toc7623_1630158169" w:tooltip="8.5 Commands: pushbutton and enable">
             <w:r>
               <w:rPr>
                 <w:rStyle w:val="IndexLink"/>
@@ -711,7 +711,7 @@
               </w:rPr>
               <w:t>8.5 Commands: pushbutton and enable</w:t>
               <w:tab/>
-              <w:t>28</w:t>
+              <w:t>29</w:t>
             </w:r>
           </w:hyperlink>
         </w:p>
@@ -724,7 +724,7 @@
             </w:tabs>
             <w:rPr/>
           </w:pPr>
-          <w:hyperlink w:anchor="__RefHeading___Toc7479_2860942839" w:tooltip="9 Expressions and scripts">
+          <w:hyperlink w:anchor="__RefHeading___Toc7625_1630158169" w:tooltip="9 Expressions and scripts">
             <w:r>
               <w:rPr>
                 <w:rStyle w:val="IndexLink"/>
@@ -732,7 +732,7 @@
               </w:rPr>
               <w:t>9 Expressions and scripts</w:t>
               <w:tab/>
-              <w:t>29</w:t>
+              <w:t>30</w:t>
             </w:r>
           </w:hyperlink>
         </w:p>
@@ -745,7 +745,7 @@
             </w:tabs>
             <w:rPr/>
           </w:pPr>
-          <w:hyperlink w:anchor="__RefHeading___Toc7481_2860942839" w:tooltip="9.1 Window and application scripts">
+          <w:hyperlink w:anchor="__RefHeading___Toc7627_1630158169" w:tooltip="9.1 Window and application scripts">
             <w:r>
               <w:rPr>
                 <w:rStyle w:val="IndexLink"/>
@@ -753,7 +753,7 @@
               </w:rPr>
               <w:t>9.1 Window and application scripts</w:t>
               <w:tab/>
-              <w:t>30</w:t>
+              <w:t>31</w:t>
             </w:r>
           </w:hyperlink>
         </w:p>
@@ -766,7 +766,7 @@
             </w:tabs>
             <w:rPr/>
           </w:pPr>
-          <w:hyperlink w:anchor="__RefHeading___Toc7483_2860942839" w:tooltip="9.2 Action scripts">
+          <w:hyperlink w:anchor="__RefHeading___Toc7629_1630158169" w:tooltip="9.2 Action scripts">
             <w:r>
               <w:rPr>
                 <w:rStyle w:val="IndexLink"/>
@@ -774,7 +774,7 @@
               </w:rPr>
               <w:t>9.2 Action scripts</w:t>
               <w:tab/>
-              <w:t>34</w:t>
+              <w:t>35</w:t>
             </w:r>
           </w:hyperlink>
         </w:p>
@@ -787,7 +787,7 @@
             </w:tabs>
             <w:rPr/>
           </w:pPr>
-          <w:hyperlink w:anchor="__RefHeading___Toc7485_2860942839" w:tooltip="9.3 Function reference">
+          <w:hyperlink w:anchor="__RefHeading___Toc7631_1630158169" w:tooltip="9.3 Function reference">
             <w:r>
               <w:rPr>
                 <w:rStyle w:val="IndexLink"/>
@@ -795,7 +795,7 @@
               </w:rPr>
               <w:t>9.3 Function reference</w:t>
               <w:tab/>
-              <w:t>35</w:t>
+              <w:t>36</w:t>
             </w:r>
           </w:hyperlink>
         </w:p>
@@ -808,7 +808,7 @@
             </w:tabs>
             <w:rPr/>
           </w:pPr>
-          <w:hyperlink w:anchor="__RefHeading___Toc7487_2860942839" w:tooltip="9.4 Indirect tags: one faceplate for every device">
+          <w:hyperlink w:anchor="__RefHeading___Toc7633_1630158169" w:tooltip="9.4 Indirect tags: one faceplate for every device">
             <w:r>
               <w:rPr>
                 <w:rStyle w:val="IndexLink"/>
@@ -816,7 +816,7 @@
               </w:rPr>
               <w:t>9.4 Indirect tags: one faceplate for every device</w:t>
               <w:tab/>
-              <w:t>40</w:t>
+              <w:t>41</w:t>
             </w:r>
           </w:hyperlink>
         </w:p>
@@ -829,7 +829,7 @@
             </w:tabs>
             <w:rPr/>
           </w:pPr>
-          <w:hyperlink w:anchor="__RefHeading___Toc7489_2860942839" w:tooltip="9.5 Opening windows from scripts: ShowWindow">
+          <w:hyperlink w:anchor="__RefHeading___Toc7635_1630158169" w:tooltip="9.5 Opening windows from scripts: ShowWindow">
             <w:r>
               <w:rPr>
                 <w:rStyle w:val="IndexLink"/>
@@ -837,7 +837,7 @@
               </w:rPr>
               <w:t>9.5 Opening windows from scripts: ShowWindow</w:t>
               <w:tab/>
-              <w:t>42</w:t>
+              <w:t>43</w:t>
             </w:r>
           </w:hyperlink>
         </w:p>
@@ -850,7 +850,7 @@
             </w:tabs>
             <w:rPr/>
           </w:pPr>
-          <w:hyperlink w:anchor="__RefHeading___Toc7491_2860942839" w:tooltip="9.6 Saving the screen as a PDF: ScreenToPDF">
+          <w:hyperlink w:anchor="__RefHeading___Toc7637_1630158169" w:tooltip="9.6 Saving the screen as a PDF: ScreenToPDF">
             <w:r>
               <w:rPr>
                 <w:rStyle w:val="IndexLink"/>
@@ -858,7 +858,7 @@
               </w:rPr>
               <w:t>9.6 Saving the screen as a PDF: ScreenToPDF</w:t>
               <w:tab/>
-              <w:t>45</w:t>
+              <w:t>46</w:t>
             </w:r>
           </w:hyperlink>
         </w:p>
@@ -871,7 +871,7 @@
             </w:tabs>
             <w:rPr/>
           </w:pPr>
-          <w:hyperlink w:anchor="__RefHeading___Toc7493_2860942839" w:tooltip="9.7 Local variables: DIM">
+          <w:hyperlink w:anchor="__RefHeading___Toc7639_1630158169" w:tooltip="9.7 Local variables: DIM">
             <w:r>
               <w:rPr>
                 <w:rStyle w:val="IndexLink"/>
@@ -879,7 +879,7 @@
               </w:rPr>
               <w:t>9.7 Local variables: DIM</w:t>
               <w:tab/>
-              <w:t>46</w:t>
+              <w:t>47</w:t>
             </w:r>
           </w:hyperlink>
         </w:p>
@@ -892,7 +892,7 @@
             </w:tabs>
             <w:rPr/>
           </w:pPr>
-          <w:hyperlink w:anchor="__RefHeading___Toc7495_2860942839" w:tooltip="9.8 QuickFunctions">
+          <w:hyperlink w:anchor="__RefHeading___Toc7641_1630158169" w:tooltip="9.8 QuickFunctions">
             <w:r>
               <w:rPr>
                 <w:rStyle w:val="IndexLink"/>
@@ -900,7 +900,7 @@
               </w:rPr>
               <w:t>9.8 QuickFunctions</w:t>
               <w:tab/>
-              <w:t>47</w:t>
+              <w:t>48</w:t>
             </w:r>
           </w:hyperlink>
         </w:p>
@@ -913,7 +913,7 @@
             </w:tabs>
             <w:rPr/>
           </w:pPr>
-          <w:hyperlink w:anchor="__RefHeading___Toc7497_2860942839" w:tooltip="10 Alarms and security">
+          <w:hyperlink w:anchor="__RefHeading___Toc7643_1630158169" w:tooltip="10 Alarms and security">
             <w:r>
               <w:rPr>
                 <w:rStyle w:val="IndexLink"/>
@@ -921,7 +921,7 @@
               </w:rPr>
               <w:t>10 Alarms and security</w:t>
               <w:tab/>
-              <w:t>49</w:t>
+              <w:t>50</w:t>
             </w:r>
           </w:hyperlink>
         </w:p>
@@ -934,7 +934,7 @@
             </w:tabs>
             <w:rPr/>
           </w:pPr>
-          <w:hyperlink w:anchor="__RefHeading___Toc7499_2860942839" w:tooltip="10.1 Alarms">
+          <w:hyperlink w:anchor="__RefHeading___Toc7645_1630158169" w:tooltip="10.1 Alarms">
             <w:r>
               <w:rPr>
                 <w:rStyle w:val="IndexLink"/>
@@ -942,7 +942,7 @@
               </w:rPr>
               <w:t>10.1 Alarms</w:t>
               <w:tab/>
-              <w:t>49</w:t>
+              <w:t>50</w:t>
             </w:r>
           </w:hyperlink>
         </w:p>
@@ -955,7 +955,7 @@
             </w:tabs>
             <w:rPr/>
           </w:pPr>
-          <w:hyperlink w:anchor="__RefHeading___Toc7501_2860942839" w:tooltip="10.2 Users and access levels">
+          <w:hyperlink w:anchor="__RefHeading___Toc7647_1630158169" w:tooltip="10.2 Users and access levels">
             <w:r>
               <w:rPr>
                 <w:rStyle w:val="IndexLink"/>
@@ -963,7 +963,7 @@
               </w:rPr>
               <w:t>10.2 Users and access levels</w:t>
               <w:tab/>
-              <w:t>50</w:t>
+              <w:t>51</w:t>
             </w:r>
           </w:hyperlink>
         </w:p>
@@ -976,7 +976,7 @@
             </w:tabs>
             <w:rPr/>
           </w:pPr>
-          <w:hyperlink w:anchor="__RefHeading___Toc7503_2860942839" w:tooltip="11 Recipes">
+          <w:hyperlink w:anchor="__RefHeading___Toc7649_1630158169" w:tooltip="11 Recipes">
             <w:r>
               <w:rPr>
                 <w:rStyle w:val="IndexLink"/>
@@ -984,7 +984,7 @@
               </w:rPr>
               <w:t>11 Recipes</w:t>
               <w:tab/>
-              <w:t>51</w:t>
+              <w:t>52</w:t>
             </w:r>
           </w:hyperlink>
         </w:p>
@@ -997,7 +997,7 @@
             </w:tabs>
             <w:rPr/>
           </w:pPr>
-          <w:hyperlink w:anchor="__RefHeading___Toc7505_2860942839" w:tooltip="11.1 Recipe books">
+          <w:hyperlink w:anchor="__RefHeading___Toc7651_1630158169" w:tooltip="11.1 Recipe books">
             <w:r>
               <w:rPr>
                 <w:rStyle w:val="IndexLink"/>
@@ -1005,7 +1005,7 @@
               </w:rPr>
               <w:t>11.1 Recipe books</w:t>
               <w:tab/>
-              <w:t>52</w:t>
+              <w:t>53</w:t>
             </w:r>
           </w:hyperlink>
         </w:p>
@@ -1018,7 +1018,7 @@
             </w:tabs>
             <w:rPr/>
           </w:pPr>
-          <w:hyperlink w:anchor="__RefHeading___Toc7507_2860942839" w:tooltip="11.2 The Recipes screen">
+          <w:hyperlink w:anchor="__RefHeading___Toc7653_1630158169" w:tooltip="11.2 The Recipes screen">
             <w:r>
               <w:rPr>
                 <w:rStyle w:val="IndexLink"/>
@@ -1026,7 +1026,7 @@
               </w:rPr>
               <w:t>11.2 The Recipes screen</w:t>
               <w:tab/>
-              <w:t>54</w:t>
+              <w:t>55</w:t>
             </w:r>
           </w:hyperlink>
         </w:p>
@@ -1039,7 +1039,7 @@
             </w:tabs>
             <w:rPr/>
           </w:pPr>
-          <w:hyperlink w:anchor="__RefHeading___Toc7509_2860942839" w:tooltip="11.3 The Recipe List object">
+          <w:hyperlink w:anchor="__RefHeading___Toc7655_1630158169" w:tooltip="11.3 The Recipe List object">
             <w:r>
               <w:rPr>
                 <w:rStyle w:val="IndexLink"/>
@@ -1047,7 +1047,7 @@
               </w:rPr>
               <w:t>11.3 The Recipe List object</w:t>
               <w:tab/>
-              <w:t>56</w:t>
+              <w:t>57</w:t>
             </w:r>
           </w:hyperlink>
         </w:p>
@@ -1060,7 +1060,7 @@
             </w:tabs>
             <w:rPr/>
           </w:pPr>
-          <w:hyperlink w:anchor="__RefHeading___Toc7511_2860942839" w:tooltip="11.4 Selecting a recipe in a window">
+          <w:hyperlink w:anchor="__RefHeading___Toc7657_1630158169" w:tooltip="11.4 Selecting a recipe in a window">
             <w:r>
               <w:rPr>
                 <w:rStyle w:val="IndexLink"/>
@@ -1068,7 +1068,7 @@
               </w:rPr>
               <w:t>11.4 Selecting a recipe in a window</w:t>
               <w:tab/>
-              <w:t>57</w:t>
+              <w:t>58</w:t>
             </w:r>
           </w:hyperlink>
         </w:p>
@@ -1081,7 +1081,7 @@
             </w:tabs>
             <w:rPr/>
           </w:pPr>
-          <w:hyperlink w:anchor="__RefHeading___Toc7513_2860942839" w:tooltip="11.5 When a recipe function fails">
+          <w:hyperlink w:anchor="__RefHeading___Toc7659_1630158169" w:tooltip="11.5 When a recipe function fails">
             <w:r>
               <w:rPr>
                 <w:rStyle w:val="IndexLink"/>
@@ -1089,7 +1089,7 @@
               </w:rPr>
               <w:t>11.5 When a recipe function fails</w:t>
               <w:tab/>
-              <w:t>58</w:t>
+              <w:t>59</w:t>
             </w:r>
           </w:hyperlink>
         </w:p>
@@ -1102,7 +1102,7 @@
             </w:tabs>
             <w:rPr/>
           </w:pPr>
-          <w:hyperlink w:anchor="__RefHeading___Toc7515_2860942839" w:tooltip="11.6 Where recipes are kept">
+          <w:hyperlink w:anchor="__RefHeading___Toc7661_1630158169" w:tooltip="11.6 Where recipes are kept">
             <w:r>
               <w:rPr>
                 <w:rStyle w:val="IndexLink"/>
@@ -1110,7 +1110,7 @@
               </w:rPr>
               <w:t>11.6 Where recipes are kept</w:t>
               <w:tab/>
-              <w:t>59</w:t>
+              <w:t>60</w:t>
             </w:r>
           </w:hyperlink>
         </w:p>
@@ -1123,7 +1123,7 @@
             </w:tabs>
             <w:rPr/>
           </w:pPr>
-          <w:hyperlink w:anchor="__RefHeading___Toc7517_2860942839" w:tooltip="12 Trends">
+          <w:hyperlink w:anchor="__RefHeading___Toc7663_1630158169" w:tooltip="12 Trends">
             <w:r>
               <w:rPr>
                 <w:rStyle w:val="IndexLink"/>
@@ -1131,7 +1131,7 @@
               </w:rPr>
               <w:t>12 Trends</w:t>
               <w:tab/>
-              <w:t>59</w:t>
+              <w:t>60</w:t>
             </w:r>
           </w:hyperlink>
         </w:p>
@@ -1144,7 +1144,7 @@
             </w:tabs>
             <w:rPr/>
           </w:pPr>
-          <w:hyperlink w:anchor="__RefHeading___Toc7519_2860942839" w:tooltip="12.1 The Trend object">
+          <w:hyperlink w:anchor="__RefHeading___Toc7665_1630158169" w:tooltip="12.1 The Trend object">
             <w:r>
               <w:rPr>
                 <w:rStyle w:val="IndexLink"/>
@@ -1152,7 +1152,7 @@
               </w:rPr>
               <w:t>12.1 The Trend object</w:t>
               <w:tab/>
-              <w:t>59</w:t>
+              <w:t>60</w:t>
             </w:r>
           </w:hyperlink>
         </w:p>
@@ -1165,7 +1165,7 @@
             </w:tabs>
             <w:rPr/>
           </w:pPr>
-          <w:hyperlink w:anchor="__RefHeading___Toc7521_2860942839" w:tooltip="12.2 Pens and their ranges">
+          <w:hyperlink w:anchor="__RefHeading___Toc7667_1630158169" w:tooltip="12.2 Pens and their ranges">
             <w:r>
               <w:rPr>
                 <w:rStyle w:val="IndexLink"/>
@@ -1173,7 +1173,7 @@
               </w:rPr>
               <w:t>12.2 Pens and their ranges</w:t>
               <w:tab/>
-              <w:t>61</w:t>
+              <w:t>62</w:t>
             </w:r>
           </w:hyperlink>
         </w:p>
@@ -1186,7 +1186,7 @@
             </w:tabs>
             <w:rPr/>
           </w:pPr>
-          <w:hyperlink w:anchor="__RefHeading___Toc7523_2860942839" w:tooltip="12.3 The Trends screen">
+          <w:hyperlink w:anchor="__RefHeading___Toc7669_1630158169" w:tooltip="12.3 The Trends screen">
             <w:r>
               <w:rPr>
                 <w:rStyle w:val="IndexLink"/>
@@ -1194,7 +1194,7 @@
               </w:rPr>
               <w:t>12.3 The Trends screen</w:t>
               <w:tab/>
-              <w:t>62</w:t>
+              <w:t>63</w:t>
             </w:r>
           </w:hyperlink>
         </w:p>
@@ -1207,7 +1207,7 @@
             </w:tabs>
             <w:rPr/>
           </w:pPr>
-          <w:hyperlink w:anchor="__RefHeading___Toc7525_2860942839" w:tooltip="12.4 Scrolling through the history">
+          <w:hyperlink w:anchor="__RefHeading___Toc7671_1630158169" w:tooltip="12.4 Scrolling through the history">
             <w:r>
               <w:rPr>
                 <w:rStyle w:val="IndexLink"/>
@@ -1215,7 +1215,7 @@
               </w:rPr>
               <w:t>12.4 Scrolling through the history</w:t>
               <w:tab/>
-              <w:t>63</w:t>
+              <w:t>64</w:t>
             </w:r>
           </w:hyperlink>
         </w:p>
@@ -1228,7 +1228,7 @@
             </w:tabs>
             <w:rPr/>
           </w:pPr>
-          <w:hyperlink w:anchor="__RefHeading___Toc7527_2860942839" w:tooltip="12.5 Recording and where the history is kept">
+          <w:hyperlink w:anchor="__RefHeading___Toc7673_1630158169" w:tooltip="12.5 Recording and where the history is kept">
             <w:r>
               <w:rPr>
                 <w:rStyle w:val="IndexLink"/>
@@ -1236,7 +1236,7 @@
               </w:rPr>
               <w:t>12.5 Recording and where the history is kept</w:t>
               <w:tab/>
-              <w:t>64</w:t>
+              <w:t>65</w:t>
             </w:r>
           </w:hyperlink>
         </w:p>
@@ -1249,7 +1249,7 @@
             </w:tabs>
             <w:rPr/>
           </w:pPr>
-          <w:hyperlink w:anchor="__RefHeading___Toc7529_2860942839" w:tooltip="13 Databases">
+          <w:hyperlink w:anchor="__RefHeading___Toc7675_1630158169" w:tooltip="13 Databases">
             <w:r>
               <w:rPr>
                 <w:rStyle w:val="IndexLink"/>
@@ -1257,7 +1257,7 @@
               </w:rPr>
               <w:t>13 Databases</w:t>
               <w:tab/>
-              <w:t>65</w:t>
+              <w:t>66</w:t>
             </w:r>
           </w:hyperlink>
         </w:p>
@@ -1270,7 +1270,7 @@
             </w:tabs>
             <w:rPr/>
           </w:pPr>
-          <w:hyperlink w:anchor="__RefHeading___Toc7531_2860942839" w:tooltip="13.1 Data sources">
+          <w:hyperlink w:anchor="__RefHeading___Toc7677_1630158169" w:tooltip="13.1 Data sources">
             <w:r>
               <w:rPr>
                 <w:rStyle w:val="IndexLink"/>
@@ -1278,7 +1278,7 @@
               </w:rPr>
               <w:t>13.1 Data sources</w:t>
               <w:tab/>
-              <w:t>66</w:t>
+              <w:t>67</w:t>
             </w:r>
           </w:hyperlink>
         </w:p>
@@ -1291,7 +1291,7 @@
             </w:tabs>
             <w:rPr/>
           </w:pPr>
-          <w:hyperlink w:anchor="__RefHeading___Toc7533_2860942839" w:tooltip="13.2 Bind lists">
+          <w:hyperlink w:anchor="__RefHeading___Toc7679_1630158169" w:tooltip="13.2 Bind lists">
             <w:r>
               <w:rPr>
                 <w:rStyle w:val="IndexLink"/>
@@ -1299,7 +1299,7 @@
               </w:rPr>
               <w:t>13.2 Bind lists</w:t>
               <w:tab/>
-              <w:t>67</w:t>
+              <w:t>68</w:t>
             </w:r>
           </w:hyperlink>
         </w:p>
@@ -1312,7 +1312,7 @@
             </w:tabs>
             <w:rPr/>
           </w:pPr>
-          <w:hyperlink w:anchor="__RefHeading___Toc7535_2860942839" w:tooltip="13.3 Table templates and queries">
+          <w:hyperlink w:anchor="__RefHeading___Toc7681_1630158169" w:tooltip="13.3 Table templates and queries">
             <w:r>
               <w:rPr>
                 <w:rStyle w:val="IndexLink"/>
@@ -1320,7 +1320,7 @@
               </w:rPr>
               <w:t>13.3 Table templates and queries</w:t>
               <w:tab/>
-              <w:t>68</w:t>
+              <w:t>69</w:t>
             </w:r>
           </w:hyperlink>
         </w:p>
@@ -1333,7 +1333,7 @@
             </w:tabs>
             <w:rPr/>
           </w:pPr>
-          <w:hyperlink w:anchor="__RefHeading___Toc7537_2860942839" w:tooltip="13.4 The script functions">
+          <w:hyperlink w:anchor="__RefHeading___Toc7683_1630158169" w:tooltip="13.4 The script functions">
             <w:r>
               <w:rPr>
                 <w:rStyle w:val="IndexLink"/>
@@ -1341,7 +1341,7 @@
               </w:rPr>
               <w:t>13.4 The script functions</w:t>
               <w:tab/>
-              <w:t>69</w:t>
+              <w:t>70</w:t>
             </w:r>
           </w:hyperlink>
         </w:p>
@@ -1354,7 +1354,7 @@
             </w:tabs>
             <w:rPr/>
           </w:pPr>
-          <w:hyperlink w:anchor="__RefHeading___Toc7539_2860942839" w:tooltip="13.5 The batch log in LiquidWeighHMI">
+          <w:hyperlink w:anchor="__RefHeading___Toc7685_1630158169" w:tooltip="13.5 The batch log in LiquidWeighHMI">
             <w:r>
               <w:rPr>
                 <w:rStyle w:val="IndexLink"/>
@@ -1362,7 +1362,7 @@
               </w:rPr>
               <w:t>13.5 The batch log in LiquidWeighHMI</w:t>
               <w:tab/>
-              <w:t>71</w:t>
+              <w:t>72</w:t>
             </w:r>
           </w:hyperlink>
         </w:p>
@@ -1375,7 +1375,7 @@
             </w:tabs>
             <w:rPr/>
           </w:pPr>
-          <w:hyperlink w:anchor="__RefHeading___Toc7541_2860942839" w:tooltip="13.6 Where the rows are kept">
+          <w:hyperlink w:anchor="__RefHeading___Toc7687_1630158169" w:tooltip="13.6 Where the rows are kept">
             <w:r>
               <w:rPr>
                 <w:rStyle w:val="IndexLink"/>
@@ -1383,7 +1383,7 @@
               </w:rPr>
               <w:t>13.6 Where the rows are kept</w:t>
               <w:tab/>
-              <w:t>72</w:t>
+              <w:t>73</w:t>
             </w:r>
           </w:hyperlink>
         </w:p>
@@ -1396,7 +1396,7 @@
             </w:tabs>
             <w:rPr/>
           </w:pPr>
-          <w:hyperlink w:anchor="__RefHeading___Toc7543_2860942839" w:tooltip="14 List boxes">
+          <w:hyperlink w:anchor="__RefHeading___Toc7689_1630158169" w:tooltip="14 List boxes">
             <w:r>
               <w:rPr>
                 <w:rStyle w:val="IndexLink"/>
@@ -1404,7 +1404,7 @@
               </w:rPr>
               <w:t>14 List boxes</w:t>
               <w:tab/>
-              <w:t>73</w:t>
+              <w:t>74</w:t>
             </w:r>
           </w:hyperlink>
         </w:p>
@@ -1417,7 +1417,7 @@
             </w:tabs>
             <w:rPr/>
           </w:pPr>
-          <w:hyperlink w:anchor="__RefHeading___Toc7545_2860942839" w:tooltip="14.1 The List Box object">
+          <w:hyperlink w:anchor="__RefHeading___Toc7691_1630158169" w:tooltip="14.1 The List Box object">
             <w:r>
               <w:rPr>
                 <w:rStyle w:val="IndexLink"/>
@@ -1425,7 +1425,7 @@
               </w:rPr>
               <w:t>14.1 The List Box object</w:t>
               <w:tab/>
-              <w:t>73</w:t>
+              <w:t>74</w:t>
             </w:r>
           </w:hyperlink>
         </w:p>
@@ -1438,7 +1438,7 @@
             </w:tabs>
             <w:rPr/>
           </w:pPr>
-          <w:hyperlink w:anchor="__RefHeading___Toc7547_2860942839" w:tooltip="14.2 Filling and working the list from scripts">
+          <w:hyperlink w:anchor="__RefHeading___Toc7693_1630158169" w:tooltip="14.2 Filling and working the list from scripts">
             <w:r>
               <w:rPr>
                 <w:rStyle w:val="IndexLink"/>
@@ -1446,7 +1446,7 @@
               </w:rPr>
               <w:t>14.2 Filling and working the list from scripts</w:t>
               <w:tab/>
-              <w:t>76</w:t>
+              <w:t>77</w:t>
             </w:r>
           </w:hyperlink>
         </w:p>
@@ -1459,7 +1459,7 @@
             </w:tabs>
             <w:rPr/>
           </w:pPr>
-          <w:hyperlink w:anchor="__RefHeading___Toc7549_2860942839" w:tooltip="14.3 The list belongs to the application, not to a window">
+          <w:hyperlink w:anchor="__RefHeading___Toc7695_1630158169" w:tooltip="14.3 The list belongs to the application, not to a window">
             <w:r>
               <w:rPr>
                 <w:rStyle w:val="IndexLink"/>
@@ -1467,7 +1467,7 @@
               </w:rPr>
               <w:t>14.3 The list belongs to the application, not to a window</w:t>
               <w:tab/>
-              <w:t>77</w:t>
+              <w:t>78</w:t>
             </w:r>
           </w:hyperlink>
         </w:p>
@@ -1480,7 +1480,7 @@
             </w:tabs>
             <w:rPr/>
           </w:pPr>
-          <w:hyperlink w:anchor="__RefHeading___Toc7551_2860942839" w:tooltip="14.4 A list filled from a database">
+          <w:hyperlink w:anchor="__RefHeading___Toc7697_1630158169" w:tooltip="14.4 A list filled from a database">
             <w:r>
               <w:rPr>
                 <w:rStyle w:val="IndexLink"/>
@@ -1488,7 +1488,7 @@
               </w:rPr>
               <w:t>14.4 A list filled from a database</w:t>
               <w:tab/>
-              <w:t>77</w:t>
+              <w:t>78</w:t>
             </w:r>
           </w:hyperlink>
         </w:p>
@@ -1501,7 +1501,7 @@
             </w:tabs>
             <w:rPr/>
           </w:pPr>
-          <w:hyperlink w:anchor="__RefHeading___Toc7553_2860942839" w:tooltip="15 Testing">
+          <w:hyperlink w:anchor="__RefHeading___Toc7699_1630158169" w:tooltip="15 Testing">
             <w:r>
               <w:rPr>
                 <w:rStyle w:val="IndexLink"/>
@@ -1509,7 +1509,7 @@
               </w:rPr>
               <w:t>15 Testing</w:t>
               <w:tab/>
-              <w:t>78</w:t>
+              <w:t>79</w:t>
             </w:r>
           </w:hyperlink>
         </w:p>
@@ -1522,7 +1522,7 @@
             </w:tabs>
             <w:rPr/>
           </w:pPr>
-          <w:hyperlink w:anchor="__RefHeading___Toc7555_2860942839" w:tooltip="15.1 Validate">
+          <w:hyperlink w:anchor="__RefHeading___Toc7701_1630158169" w:tooltip="15.1 Validate">
             <w:r>
               <w:rPr>
                 <w:rStyle w:val="IndexLink"/>
@@ -1530,7 +1530,7 @@
               </w:rPr>
               <w:t>15.1 Validate</w:t>
               <w:tab/>
-              <w:t>78</w:t>
+              <w:t>79</w:t>
             </w:r>
           </w:hyperlink>
         </w:p>
@@ -1543,7 +1543,7 @@
             </w:tabs>
             <w:rPr/>
           </w:pPr>
-          <w:hyperlink w:anchor="__RefHeading___Toc7557_2860942839" w:tooltip="15.2 Run">
+          <w:hyperlink w:anchor="__RefHeading___Toc7703_1630158169" w:tooltip="15.2 Run">
             <w:r>
               <w:rPr>
                 <w:rStyle w:val="IndexLink"/>
@@ -1551,7 +1551,7 @@
               </w:rPr>
               <w:t>15.2 Run</w:t>
               <w:tab/>
-              <w:t>79</w:t>
+              <w:t>80</w:t>
             </w:r>
           </w:hyperlink>
         </w:p>
@@ -1564,7 +1564,7 @@
             </w:tabs>
             <w:rPr/>
           </w:pPr>
-          <w:hyperlink w:anchor="__RefHeading___Toc7559_2860942839" w:tooltip="16 Deploying">
+          <w:hyperlink w:anchor="__RefHeading___Toc7705_1630158169" w:tooltip="16 Deploying">
             <w:r>
               <w:rPr>
                 <w:rStyle w:val="IndexLink"/>
@@ -1572,7 +1572,7 @@
               </w:rPr>
               <w:t>16 Deploying</w:t>
               <w:tab/>
-              <w:t>83</w:t>
+              <w:t>84</w:t>
             </w:r>
           </w:hyperlink>
         </w:p>
@@ -1585,7 +1585,7 @@
             </w:tabs>
             <w:rPr/>
           </w:pPr>
-          <w:hyperlink w:anchor="__RefHeading___Toc7561_2860942839" w:tooltip="16.1 Publish">
+          <w:hyperlink w:anchor="__RefHeading___Toc7707_1630158169" w:tooltip="16.1 Publish">
             <w:r>
               <w:rPr>
                 <w:rStyle w:val="IndexLink"/>
@@ -1593,7 +1593,7 @@
               </w:rPr>
               <w:t>16.1 Publish</w:t>
               <w:tab/>
-              <w:t>84</w:t>
+              <w:t>85</w:t>
             </w:r>
           </w:hyperlink>
         </w:p>
@@ -1606,7 +1606,7 @@
             </w:tabs>
             <w:rPr/>
           </w:pPr>
-          <w:hyperlink w:anchor="__RefHeading___Toc7563_2860942839" w:tooltip="16.2 Append HMI Desktop">
+          <w:hyperlink w:anchor="__RefHeading___Toc7709_1630158169" w:tooltip="16.2 Append HMI Desktop">
             <w:r>
               <w:rPr>
                 <w:rStyle w:val="IndexLink"/>
@@ -1614,7 +1614,7 @@
               </w:rPr>
               <w:t>16.2 Append HMI Desktop</w:t>
               <w:tab/>
-              <w:t>85</w:t>
+              <w:t>86</w:t>
             </w:r>
           </w:hyperlink>
         </w:p>
@@ -1627,7 +1627,7 @@
             </w:tabs>
             <w:rPr/>
           </w:pPr>
-          <w:hyperlink w:anchor="__RefHeading___Toc7565_2860942839" w:tooltip="16.3 Append HMI Web">
+          <w:hyperlink w:anchor="__RefHeading___Toc7711_1630158169" w:tooltip="16.3 Append HMI Web">
             <w:r>
               <w:rPr>
                 <w:rStyle w:val="IndexLink"/>
@@ -1635,7 +1635,7 @@
               </w:rPr>
               <w:t>16.3 Append HMI Web</w:t>
               <w:tab/>
-              <w:t>85</w:t>
+              <w:t>86</w:t>
             </w:r>
           </w:hyperlink>
         </w:p>
@@ -1648,7 +1648,7 @@
             </w:tabs>
             <w:rPr/>
           </w:pPr>
-          <w:hyperlink w:anchor="__RefHeading___Toc7567_2860942839" w:tooltip="17 Tips and troubleshooting">
+          <w:hyperlink w:anchor="__RefHeading___Toc7713_1630158169" w:tooltip="17 Tips and troubleshooting">
             <w:r>
               <w:rPr>
                 <w:rStyle w:val="IndexLink"/>
@@ -1656,7 +1656,7 @@
               </w:rPr>
               <w:t>17 Tips and troubleshooting</w:t>
               <w:tab/>
-              <w:t>87</w:t>
+              <w:t>88</w:t>
             </w:r>
           </w:hyperlink>
         </w:p>
@@ -1669,7 +1669,7 @@
             </w:tabs>
             <w:rPr/>
           </w:pPr>
-          <w:hyperlink w:anchor="__RefHeading___Toc7569_2860942839" w:tooltip="Appendix A Command-line automation">
+          <w:hyperlink w:anchor="__RefHeading___Toc7715_1630158169" w:tooltip="Appendix A Command-line automation">
             <w:r>
               <w:rPr>
                 <w:rStyle w:val="IndexLink"/>
@@ -1677,7 +1677,7 @@
               </w:rPr>
               <w:t>Appendix A Command-line automation</w:t>
               <w:tab/>
-              <w:t>88</w:t>
+              <w:t>89</w:t>
             </w:r>
           </w:hyperlink>
           <w:r>
@@ -1707,7 +1707,7 @@
         <w:spacing w:before="0" w:after="0"/>
         <w:rPr/>
       </w:pPr>
-      <w:bookmarkStart w:id="0" w:name="__RefHeading___Toc7437_2860942839"/>
+      <w:bookmarkStart w:id="0" w:name="__RefHeading___Toc7583_1630158169"/>
       <w:bookmarkEnd w:id="0"/>
       <w:r>
         <w:rPr/>
@@ -2563,7 +2563,7 @@
         <w:pStyle w:val="Heading2"/>
         <w:rPr/>
       </w:pPr>
-      <w:bookmarkStart w:id="1" w:name="__RefHeading___Toc7439_2860942839"/>
+      <w:bookmarkStart w:id="1" w:name="__RefHeading___Toc7585_1630158169"/>
       <w:bookmarkEnd w:id="1"/>
       <w:r>
         <w:rPr/>
@@ -3753,7 +3753,7 @@
         <w:pStyle w:val="Heading2"/>
         <w:rPr/>
       </w:pPr>
-      <w:bookmarkStart w:id="2" w:name="__RefHeading___Toc7441_2860942839"/>
+      <w:bookmarkStart w:id="2" w:name="__RefHeading___Toc7587_1630158169"/>
       <w:bookmarkEnd w:id="2"/>
       <w:r>
         <w:rPr/>
@@ -3896,7 +3896,7 @@
         <w:pStyle w:val="Heading1"/>
         <w:rPr/>
       </w:pPr>
-      <w:bookmarkStart w:id="3" w:name="__RefHeading___Toc7443_2860942839"/>
+      <w:bookmarkStart w:id="3" w:name="__RefHeading___Toc7589_1630158169"/>
       <w:bookmarkEnd w:id="3"/>
       <w:r>
         <w:rPr/>
@@ -4256,7 +4256,7 @@
                 <w:szCs w:val="22"/>
                 <w:lang w:val="en-US" w:eastAsia="en-US" w:bidi="ar-SA"/>
               </w:rPr>
-              <w:t>Shape libraries (General, Misc, Advanced and more under More Shapes, including the P&amp;ID libraries) and the HMI palette with the Alarm List, Alarm History, Recipe List and Trend objects</w:t>
+              <w:t>Shape libraries (General, Misc, Advanced and more under More Shapes, including the P&amp;ID libraries) and the HMI palette with the Alarm List, Alarm History, Recipe List, Trend and List Box objects</w:t>
             </w:r>
           </w:p>
         </w:tc>
@@ -4474,7 +4474,7 @@
         <w:pStyle w:val="Heading2"/>
         <w:rPr/>
       </w:pPr>
-      <w:bookmarkStart w:id="4" w:name="__RefHeading___Toc7445_2860942839"/>
+      <w:bookmarkStart w:id="4" w:name="__RefHeading___Toc7591_1630158169"/>
       <w:bookmarkEnd w:id="4"/>
       <w:r>
         <w:rPr/>
@@ -5514,7 +5514,7 @@
         <w:pStyle w:val="Heading1"/>
         <w:rPr/>
       </w:pPr>
-      <w:bookmarkStart w:id="5" w:name="__RefHeading___Toc7447_2860942839"/>
+      <w:bookmarkStart w:id="5" w:name="__RefHeading___Toc7593_1630158169"/>
       <w:bookmarkEnd w:id="5"/>
       <w:r>
         <w:rPr/>
@@ -5644,6 +5644,34 @@
     <w:p>
       <w:pPr>
         <w:pStyle w:val="Normal"/>
+        <w:ind w:left="360"/>
+        <w:rPr/>
+      </w:pPr>
+      <w:r>
+        <w:rPr>
+          <w:b/>
+          <w:color w:val="1F5F99"/>
+        </w:rPr>
+        <w:t xml:space="preserve">Note: </w:t>
+      </w:r>
+      <w:r>
+        <w:rPr/>
+        <w:t xml:space="preserve">After zooming or scrolling around a large page, </w:t>
+      </w:r>
+      <w:r>
+        <w:rPr>
+          <w:b/>
+        </w:rPr>
+        <w:t>View &gt; Reset</w:t>
+      </w:r>
+      <w:r>
+        <w:rPr/>
+        <w:t xml:space="preserve"> brings the whole screen area back: it is centered in the window and scaled to fit, never larger than life. Pressing Enter with nothing selected does the same.</w:t>
+      </w:r>
+    </w:p>
+    <w:p>
+      <w:pPr>
+        <w:pStyle w:val="Normal"/>
         <w:keepNext w:val="true"/>
         <w:jc w:val="center"/>
         <w:rPr/>
@@ -5846,7 +5874,7 @@
         <w:pStyle w:val="Heading1"/>
         <w:rPr/>
       </w:pPr>
-      <w:bookmarkStart w:id="6" w:name="__RefHeading___Toc7449_2860942839"/>
+      <w:bookmarkStart w:id="6" w:name="__RefHeading___Toc7595_1630158169"/>
       <w:bookmarkEnd w:id="6"/>
       <w:r>
         <w:rPr/>
@@ -6641,7 +6669,7 @@
         <w:pStyle w:val="Heading1"/>
         <w:rPr/>
       </w:pPr>
-      <w:bookmarkStart w:id="7" w:name="__RefHeading___Toc7451_2860942839"/>
+      <w:bookmarkStart w:id="7" w:name="__RefHeading___Toc7597_1630158169"/>
       <w:bookmarkEnd w:id="7"/>
       <w:r>
         <w:rPr/>
@@ -7472,7 +7500,7 @@
         <w:pStyle w:val="Heading2"/>
         <w:rPr/>
       </w:pPr>
-      <w:bookmarkStart w:id="8" w:name="__RefHeading___Toc7453_2860942839"/>
+      <w:bookmarkStart w:id="8" w:name="__RefHeading___Toc7599_1630158169"/>
       <w:bookmarkEnd w:id="8"/>
       <w:r>
         <w:rPr/>
@@ -8122,7 +8150,7 @@
         <w:pStyle w:val="Heading2"/>
         <w:rPr/>
       </w:pPr>
-      <w:bookmarkStart w:id="9" w:name="__RefHeading___Toc7455_2860942839"/>
+      <w:bookmarkStart w:id="9" w:name="__RefHeading___Toc7601_1630158169"/>
       <w:bookmarkEnd w:id="9"/>
       <w:r>
         <w:rPr/>
@@ -8254,7 +8282,7 @@
         <w:pStyle w:val="Heading2"/>
         <w:rPr/>
       </w:pPr>
-      <w:bookmarkStart w:id="10" w:name="__RefHeading___Toc7457_2860942839"/>
+      <w:bookmarkStart w:id="10" w:name="__RefHeading___Toc7603_1630158169"/>
       <w:bookmarkEnd w:id="10"/>
       <w:r>
         <w:rPr/>
@@ -8384,7 +8412,7 @@
         <w:pStyle w:val="Heading1"/>
         <w:rPr/>
       </w:pPr>
-      <w:bookmarkStart w:id="11" w:name="__RefHeading___Toc7459_2860942839"/>
+      <w:bookmarkStart w:id="11" w:name="__RefHeading___Toc7605_1630158169"/>
       <w:bookmarkEnd w:id="11"/>
       <w:r>
         <w:rPr/>
@@ -8897,7 +8925,7 @@
         <w:pStyle w:val="Heading2"/>
         <w:rPr/>
       </w:pPr>
-      <w:bookmarkStart w:id="12" w:name="__RefHeading___Toc7461_2860942839"/>
+      <w:bookmarkStart w:id="12" w:name="__RefHeading___Toc7607_1630158169"/>
       <w:bookmarkEnd w:id="12"/>
       <w:r>
         <w:rPr/>
@@ -8921,7 +8949,7 @@
       </w:r>
       <w:r>
         <w:rPr/>
-        <w:t>. The Device Faceplate is a popup with a title bar, 460 × 560 pixels at 730, 150 on the screen. The preview shows where it appears.</w:t>
+        <w:t>. The Device Faceplate is a popup with a title bar, 460 × 560 pixels at 730, 150 on the screen, and the operator may move it. Further down the dialog, a preview shows where it falls on the screen, and the window's scripts follow it.</w:t>
       </w:r>
     </w:p>
     <w:p>
@@ -8935,7 +8963,7 @@
         <w:rPr/>
         <w:drawing>
           <wp:inline distT="0" distB="0" distL="0" distR="0">
-            <wp:extent cx="4023360" cy="6685915"/>
+            <wp:extent cx="4023360" cy="6205220"/>
             <wp:effectExtent l="0" t="0" r="0" b="0"/>
             <wp:docPr id="10" name="Picture 10"/>
             <wp:cNvGraphicFramePr>
@@ -8959,7 +8987,7 @@
                   <pic:spPr bwMode="auto">
                     <a:xfrm>
                       <a:off x="0" y="0"/>
-                      <a:ext cx="4023360" cy="6685915"/>
+                      <a:ext cx="4023360" cy="6205220"/>
                     </a:xfrm>
                     <a:prstGeom prst="rect">
                       <a:avLst/>
@@ -8982,6 +9010,748 @@
       <w:r>
         <w:rPr/>
         <w:t>Figure 9. Window Properties of the Device Faceplate popup</w:t>
+      </w:r>
+    </w:p>
+    <w:p>
+      <w:pPr>
+        <w:pStyle w:val="Normal"/>
+        <w:rPr/>
+      </w:pPr>
+      <w:r>
+        <w:rPr>
+          <w:b/>
+        </w:rPr>
+        <w:t>Title bar</w:t>
+      </w:r>
+      <w:r>
+        <w:rPr/>
+        <w:t xml:space="preserve"> draws a bar across the top of the window with its name and a close button. The bar is part of the window's height, as it is on the panel, so a 560 pixel window with a 24 pixel bar leaves 536 pixels of the page below it. What the bar looks like is yours to set:</w:t>
+      </w:r>
+    </w:p>
+    <w:p>
+      <w:pPr>
+        <w:pStyle w:val="Caption"/>
+        <w:keepNext w:val="true"/>
+        <w:rPr/>
+      </w:pPr>
+      <w:r>
+        <w:rPr/>
+        <w:t>Table 10. Title bar settings</w:t>
+      </w:r>
+    </w:p>
+    <w:tbl>
+      <w:tblPr>
+        <w:tblStyle w:val="TableGrid"/>
+        <w:tblW w:w="9360" w:type="dxa"/>
+        <w:jc w:val="left"/>
+        <w:tblInd w:w="0" w:type="dxa"/>
+        <w:tblLayout w:type="fixed"/>
+        <w:tblCellMar>
+          <w:top w:w="57" w:type="dxa"/>
+          <w:left w:w="180" w:type="dxa"/>
+          <w:bottom w:w="57" w:type="dxa"/>
+          <w:right w:w="180" w:type="dxa"/>
+        </w:tblCellMar>
+        <w:tblLook w:val="04a0" w:noHBand="0" w:noVBand="1" w:firstColumn="1" w:lastRow="0" w:lastColumn="0" w:firstRow="1"/>
+      </w:tblPr>
+      <w:tblGrid>
+        <w:gridCol w:w="1629"/>
+        <w:gridCol w:w="1545"/>
+        <w:gridCol w:w="6186"/>
+      </w:tblGrid>
+      <w:tr>
+        <w:trPr>
+          <w:tblHeader w:val="true"/>
+          <w:cantSplit w:val="true"/>
+        </w:trPr>
+        <w:tc>
+          <w:tcPr>
+            <w:tcW w:w="1629" w:type="dxa"/>
+            <w:tcBorders/>
+            <w:shd w:color="auto" w:fill="D9E2EC" w:val="clear"/>
+          </w:tcPr>
+          <w:p>
+            <w:pPr>
+              <w:pStyle w:val="Normal"/>
+              <w:widowControl/>
+              <w:spacing w:lineRule="auto" w:line="240" w:before="20" w:after="20"/>
+              <w:jc w:val="left"/>
+              <w:rPr>
+                <w:rFonts w:cs=""/>
+                <w:kern w:val="0"/>
+                <w:szCs w:val="22"/>
+                <w:lang w:val="en-US" w:eastAsia="en-US" w:bidi="ar-SA"/>
+              </w:rPr>
+            </w:pPr>
+            <w:r>
+              <w:rPr>
+                <w:rFonts w:cs=""/>
+                <w:b/>
+                <w:kern w:val="0"/>
+                <w:sz w:val="20"/>
+                <w:szCs w:val="22"/>
+                <w:lang w:val="en-US" w:eastAsia="en-US" w:bidi="ar-SA"/>
+              </w:rPr>
+              <w:t>Setting</w:t>
+            </w:r>
+          </w:p>
+        </w:tc>
+        <w:tc>
+          <w:tcPr>
+            <w:tcW w:w="1545" w:type="dxa"/>
+            <w:tcBorders/>
+            <w:shd w:color="auto" w:fill="D9E2EC" w:val="clear"/>
+          </w:tcPr>
+          <w:p>
+            <w:pPr>
+              <w:pStyle w:val="Normal"/>
+              <w:widowControl/>
+              <w:spacing w:lineRule="auto" w:line="240" w:before="20" w:after="20"/>
+              <w:jc w:val="left"/>
+              <w:rPr>
+                <w:rFonts w:cs=""/>
+                <w:kern w:val="0"/>
+                <w:szCs w:val="22"/>
+                <w:lang w:val="en-US" w:eastAsia="en-US" w:bidi="ar-SA"/>
+              </w:rPr>
+            </w:pPr>
+            <w:r>
+              <w:rPr>
+                <w:rFonts w:cs=""/>
+                <w:b/>
+                <w:kern w:val="0"/>
+                <w:sz w:val="20"/>
+                <w:szCs w:val="22"/>
+                <w:lang w:val="en-US" w:eastAsia="en-US" w:bidi="ar-SA"/>
+              </w:rPr>
+              <w:t>Default</w:t>
+            </w:r>
+          </w:p>
+        </w:tc>
+        <w:tc>
+          <w:tcPr>
+            <w:tcW w:w="6186" w:type="dxa"/>
+            <w:tcBorders/>
+            <w:shd w:color="auto" w:fill="D9E2EC" w:val="clear"/>
+          </w:tcPr>
+          <w:p>
+            <w:pPr>
+              <w:pStyle w:val="Normal"/>
+              <w:widowControl/>
+              <w:spacing w:lineRule="auto" w:line="240" w:before="20" w:after="20"/>
+              <w:jc w:val="left"/>
+              <w:rPr>
+                <w:rFonts w:cs=""/>
+                <w:kern w:val="0"/>
+                <w:szCs w:val="22"/>
+                <w:lang w:val="en-US" w:eastAsia="en-US" w:bidi="ar-SA"/>
+              </w:rPr>
+            </w:pPr>
+            <w:r>
+              <w:rPr>
+                <w:rFonts w:cs=""/>
+                <w:b/>
+                <w:kern w:val="0"/>
+                <w:sz w:val="20"/>
+                <w:szCs w:val="22"/>
+                <w:lang w:val="en-US" w:eastAsia="en-US" w:bidi="ar-SA"/>
+              </w:rPr>
+              <w:t>Meaning</w:t>
+            </w:r>
+          </w:p>
+        </w:tc>
+      </w:tr>
+      <w:tr>
+        <w:trPr>
+          <w:cantSplit w:val="true"/>
+        </w:trPr>
+        <w:tc>
+          <w:tcPr>
+            <w:tcW w:w="1629" w:type="dxa"/>
+            <w:tcBorders/>
+          </w:tcPr>
+          <w:p>
+            <w:pPr>
+              <w:pStyle w:val="Normal"/>
+              <w:widowControl/>
+              <w:spacing w:lineRule="auto" w:line="240" w:before="20" w:after="20"/>
+              <w:jc w:val="left"/>
+              <w:rPr>
+                <w:rFonts w:cs=""/>
+                <w:kern w:val="0"/>
+                <w:szCs w:val="22"/>
+                <w:lang w:val="en-US" w:eastAsia="en-US" w:bidi="ar-SA"/>
+              </w:rPr>
+            </w:pPr>
+            <w:r>
+              <w:rPr>
+                <w:rFonts w:cs=""/>
+                <w:b/>
+                <w:kern w:val="0"/>
+                <w:sz w:val="20"/>
+                <w:szCs w:val="22"/>
+                <w:lang w:val="en-US" w:eastAsia="en-US" w:bidi="ar-SA"/>
+              </w:rPr>
+              <w:t>Height</w:t>
+            </w:r>
+          </w:p>
+        </w:tc>
+        <w:tc>
+          <w:tcPr>
+            <w:tcW w:w="1545" w:type="dxa"/>
+            <w:tcBorders/>
+          </w:tcPr>
+          <w:p>
+            <w:pPr>
+              <w:pStyle w:val="Normal"/>
+              <w:widowControl/>
+              <w:spacing w:lineRule="auto" w:line="240" w:before="20" w:after="20"/>
+              <w:jc w:val="left"/>
+              <w:rPr>
+                <w:rFonts w:cs=""/>
+                <w:kern w:val="0"/>
+                <w:szCs w:val="22"/>
+                <w:lang w:val="en-US" w:eastAsia="en-US" w:bidi="ar-SA"/>
+              </w:rPr>
+            </w:pPr>
+            <w:r>
+              <w:rPr>
+                <w:rFonts w:cs=""/>
+                <w:kern w:val="0"/>
+                <w:sz w:val="20"/>
+                <w:szCs w:val="22"/>
+                <w:lang w:val="en-US" w:eastAsia="en-US" w:bidi="ar-SA"/>
+              </w:rPr>
+              <w:t>24 px</w:t>
+            </w:r>
+          </w:p>
+        </w:tc>
+        <w:tc>
+          <w:tcPr>
+            <w:tcW w:w="6186" w:type="dxa"/>
+            <w:tcBorders/>
+          </w:tcPr>
+          <w:p>
+            <w:pPr>
+              <w:pStyle w:val="Normal"/>
+              <w:widowControl/>
+              <w:spacing w:lineRule="auto" w:line="240" w:before="20" w:after="20"/>
+              <w:jc w:val="left"/>
+              <w:rPr>
+                <w:rFonts w:cs=""/>
+                <w:kern w:val="0"/>
+                <w:szCs w:val="22"/>
+                <w:lang w:val="en-US" w:eastAsia="en-US" w:bidi="ar-SA"/>
+              </w:rPr>
+            </w:pPr>
+            <w:r>
+              <w:rPr>
+                <w:rFonts w:cs=""/>
+                <w:kern w:val="0"/>
+                <w:sz w:val="20"/>
+                <w:szCs w:val="22"/>
+                <w:lang w:val="en-US" w:eastAsia="en-US" w:bidi="ar-SA"/>
+              </w:rPr>
+              <w:t>The height of the bar, 8 to 400, and never taller than the window</w:t>
+            </w:r>
+          </w:p>
+        </w:tc>
+      </w:tr>
+      <w:tr>
+        <w:trPr>
+          <w:cantSplit w:val="true"/>
+        </w:trPr>
+        <w:tc>
+          <w:tcPr>
+            <w:tcW w:w="1629" w:type="dxa"/>
+            <w:tcBorders/>
+          </w:tcPr>
+          <w:p>
+            <w:pPr>
+              <w:pStyle w:val="Normal"/>
+              <w:widowControl/>
+              <w:spacing w:lineRule="auto" w:line="240" w:before="20" w:after="20"/>
+              <w:jc w:val="left"/>
+              <w:rPr>
+                <w:rFonts w:cs=""/>
+                <w:kern w:val="0"/>
+                <w:szCs w:val="22"/>
+                <w:lang w:val="en-US" w:eastAsia="en-US" w:bidi="ar-SA"/>
+              </w:rPr>
+            </w:pPr>
+            <w:r>
+              <w:rPr>
+                <w:rFonts w:cs=""/>
+                <w:b/>
+                <w:kern w:val="0"/>
+                <w:sz w:val="20"/>
+                <w:szCs w:val="22"/>
+                <w:lang w:val="en-US" w:eastAsia="en-US" w:bidi="ar-SA"/>
+              </w:rPr>
+              <w:t>Font, Font size</w:t>
+            </w:r>
+          </w:p>
+        </w:tc>
+        <w:tc>
+          <w:tcPr>
+            <w:tcW w:w="1545" w:type="dxa"/>
+            <w:tcBorders/>
+          </w:tcPr>
+          <w:p>
+            <w:pPr>
+              <w:pStyle w:val="Normal"/>
+              <w:widowControl/>
+              <w:spacing w:lineRule="auto" w:line="240" w:before="20" w:after="20"/>
+              <w:jc w:val="left"/>
+              <w:rPr>
+                <w:rFonts w:cs=""/>
+                <w:kern w:val="0"/>
+                <w:szCs w:val="22"/>
+                <w:lang w:val="en-US" w:eastAsia="en-US" w:bidi="ar-SA"/>
+              </w:rPr>
+            </w:pPr>
+            <w:r>
+              <w:rPr>
+                <w:rFonts w:cs=""/>
+                <w:kern w:val="0"/>
+                <w:sz w:val="20"/>
+                <w:szCs w:val="22"/>
+                <w:lang w:val="en-US" w:eastAsia="en-US" w:bidi="ar-SA"/>
+              </w:rPr>
+              <w:t>built-in, 13 px</w:t>
+            </w:r>
+          </w:p>
+        </w:tc>
+        <w:tc>
+          <w:tcPr>
+            <w:tcW w:w="6186" w:type="dxa"/>
+            <w:tcBorders/>
+          </w:tcPr>
+          <w:p>
+            <w:pPr>
+              <w:pStyle w:val="Normal"/>
+              <w:widowControl/>
+              <w:spacing w:lineRule="auto" w:line="240" w:before="20" w:after="20"/>
+              <w:jc w:val="left"/>
+              <w:rPr>
+                <w:rFonts w:cs=""/>
+                <w:kern w:val="0"/>
+                <w:szCs w:val="22"/>
+                <w:lang w:val="en-US" w:eastAsia="en-US" w:bidi="ar-SA"/>
+              </w:rPr>
+            </w:pPr>
+            <w:r>
+              <w:rPr>
+                <w:rFonts w:cs=""/>
+                <w:kern w:val="0"/>
+                <w:sz w:val="20"/>
+                <w:szCs w:val="22"/>
+                <w:lang w:val="en-US" w:eastAsia="en-US" w:bidi="ar-SA"/>
+              </w:rPr>
+              <w:t>The title's font and size, 6 to 72; the size scales with the screen like everything else</w:t>
+            </w:r>
+          </w:p>
+        </w:tc>
+      </w:tr>
+      <w:tr>
+        <w:trPr>
+          <w:cantSplit w:val="true"/>
+        </w:trPr>
+        <w:tc>
+          <w:tcPr>
+            <w:tcW w:w="1629" w:type="dxa"/>
+            <w:tcBorders/>
+          </w:tcPr>
+          <w:p>
+            <w:pPr>
+              <w:pStyle w:val="Normal"/>
+              <w:widowControl/>
+              <w:spacing w:lineRule="auto" w:line="240" w:before="20" w:after="20"/>
+              <w:jc w:val="left"/>
+              <w:rPr>
+                <w:rFonts w:cs=""/>
+                <w:kern w:val="0"/>
+                <w:szCs w:val="22"/>
+                <w:lang w:val="en-US" w:eastAsia="en-US" w:bidi="ar-SA"/>
+              </w:rPr>
+            </w:pPr>
+            <w:r>
+              <w:rPr>
+                <w:rFonts w:cs=""/>
+                <w:b/>
+                <w:kern w:val="0"/>
+                <w:sz w:val="20"/>
+                <w:szCs w:val="22"/>
+                <w:lang w:val="en-US" w:eastAsia="en-US" w:bidi="ar-SA"/>
+              </w:rPr>
+              <w:t>Text color</w:t>
+            </w:r>
+          </w:p>
+        </w:tc>
+        <w:tc>
+          <w:tcPr>
+            <w:tcW w:w="1545" w:type="dxa"/>
+            <w:tcBorders/>
+          </w:tcPr>
+          <w:p>
+            <w:pPr>
+              <w:pStyle w:val="Normal"/>
+              <w:widowControl/>
+              <w:spacing w:lineRule="auto" w:line="240" w:before="20" w:after="20"/>
+              <w:jc w:val="left"/>
+              <w:rPr>
+                <w:rFonts w:cs=""/>
+                <w:kern w:val="0"/>
+                <w:szCs w:val="22"/>
+                <w:lang w:val="en-US" w:eastAsia="en-US" w:bidi="ar-SA"/>
+              </w:rPr>
+            </w:pPr>
+            <w:r>
+              <w:rPr>
+                <w:rFonts w:cs=""/>
+                <w:kern w:val="0"/>
+                <w:sz w:val="20"/>
+                <w:szCs w:val="22"/>
+                <w:lang w:val="en-US" w:eastAsia="en-US" w:bidi="ar-SA"/>
+              </w:rPr>
+              <w:t>white</w:t>
+            </w:r>
+          </w:p>
+        </w:tc>
+        <w:tc>
+          <w:tcPr>
+            <w:tcW w:w="6186" w:type="dxa"/>
+            <w:tcBorders/>
+          </w:tcPr>
+          <w:p>
+            <w:pPr>
+              <w:pStyle w:val="Normal"/>
+              <w:widowControl/>
+              <w:spacing w:lineRule="auto" w:line="240" w:before="20" w:after="20"/>
+              <w:jc w:val="left"/>
+              <w:rPr>
+                <w:rFonts w:cs=""/>
+                <w:kern w:val="0"/>
+                <w:szCs w:val="22"/>
+                <w:lang w:val="en-US" w:eastAsia="en-US" w:bidi="ar-SA"/>
+              </w:rPr>
+            </w:pPr>
+            <w:r>
+              <w:rPr>
+                <w:rFonts w:cs=""/>
+                <w:kern w:val="0"/>
+                <w:sz w:val="20"/>
+                <w:szCs w:val="22"/>
+                <w:lang w:val="en-US" w:eastAsia="en-US" w:bidi="ar-SA"/>
+              </w:rPr>
+              <w:t>The title and the close button</w:t>
+            </w:r>
+          </w:p>
+        </w:tc>
+      </w:tr>
+      <w:tr>
+        <w:trPr>
+          <w:cantSplit w:val="true"/>
+        </w:trPr>
+        <w:tc>
+          <w:tcPr>
+            <w:tcW w:w="1629" w:type="dxa"/>
+            <w:tcBorders/>
+          </w:tcPr>
+          <w:p>
+            <w:pPr>
+              <w:pStyle w:val="Normal"/>
+              <w:widowControl/>
+              <w:spacing w:lineRule="auto" w:line="240" w:before="20" w:after="20"/>
+              <w:jc w:val="left"/>
+              <w:rPr>
+                <w:rFonts w:cs=""/>
+                <w:kern w:val="0"/>
+                <w:szCs w:val="22"/>
+                <w:lang w:val="en-US" w:eastAsia="en-US" w:bidi="ar-SA"/>
+              </w:rPr>
+            </w:pPr>
+            <w:r>
+              <w:rPr>
+                <w:rFonts w:cs=""/>
+                <w:b/>
+                <w:kern w:val="0"/>
+                <w:sz w:val="20"/>
+                <w:szCs w:val="22"/>
+                <w:lang w:val="en-US" w:eastAsia="en-US" w:bidi="ar-SA"/>
+              </w:rPr>
+              <w:t>Background</w:t>
+            </w:r>
+          </w:p>
+        </w:tc>
+        <w:tc>
+          <w:tcPr>
+            <w:tcW w:w="1545" w:type="dxa"/>
+            <w:tcBorders/>
+          </w:tcPr>
+          <w:p>
+            <w:pPr>
+              <w:pStyle w:val="Normal"/>
+              <w:widowControl/>
+              <w:spacing w:lineRule="auto" w:line="240" w:before="20" w:after="20"/>
+              <w:jc w:val="left"/>
+              <w:rPr>
+                <w:rFonts w:cs=""/>
+                <w:kern w:val="0"/>
+                <w:szCs w:val="22"/>
+                <w:lang w:val="en-US" w:eastAsia="en-US" w:bidi="ar-SA"/>
+              </w:rPr>
+            </w:pPr>
+            <w:r>
+              <w:rPr>
+                <w:rFonts w:cs=""/>
+                <w:kern w:val="0"/>
+                <w:sz w:val="20"/>
+                <w:szCs w:val="22"/>
+                <w:lang w:val="en-US" w:eastAsia="en-US" w:bidi="ar-SA"/>
+              </w:rPr>
+              <w:t>dark blue</w:t>
+            </w:r>
+          </w:p>
+        </w:tc>
+        <w:tc>
+          <w:tcPr>
+            <w:tcW w:w="6186" w:type="dxa"/>
+            <w:tcBorders/>
+          </w:tcPr>
+          <w:p>
+            <w:pPr>
+              <w:pStyle w:val="Normal"/>
+              <w:widowControl/>
+              <w:spacing w:lineRule="auto" w:line="240" w:before="20" w:after="20"/>
+              <w:jc w:val="left"/>
+              <w:rPr>
+                <w:rFonts w:cs=""/>
+                <w:kern w:val="0"/>
+                <w:szCs w:val="22"/>
+                <w:lang w:val="en-US" w:eastAsia="en-US" w:bidi="ar-SA"/>
+              </w:rPr>
+            </w:pPr>
+            <w:r>
+              <w:rPr>
+                <w:rFonts w:cs=""/>
+                <w:kern w:val="0"/>
+                <w:sz w:val="20"/>
+                <w:szCs w:val="22"/>
+                <w:lang w:val="en-US" w:eastAsia="en-US" w:bidi="ar-SA"/>
+              </w:rPr>
+              <w:t>The bar itself</w:t>
+            </w:r>
+          </w:p>
+        </w:tc>
+      </w:tr>
+      <w:tr>
+        <w:trPr>
+          <w:cantSplit w:val="true"/>
+        </w:trPr>
+        <w:tc>
+          <w:tcPr>
+            <w:tcW w:w="1629" w:type="dxa"/>
+            <w:tcBorders/>
+          </w:tcPr>
+          <w:p>
+            <w:pPr>
+              <w:pStyle w:val="Normal"/>
+              <w:widowControl/>
+              <w:spacing w:lineRule="auto" w:line="240" w:before="20" w:after="20"/>
+              <w:jc w:val="left"/>
+              <w:rPr>
+                <w:rFonts w:cs=""/>
+                <w:kern w:val="0"/>
+                <w:szCs w:val="22"/>
+                <w:lang w:val="en-US" w:eastAsia="en-US" w:bidi="ar-SA"/>
+              </w:rPr>
+            </w:pPr>
+            <w:r>
+              <w:rPr>
+                <w:rFonts w:cs=""/>
+                <w:b/>
+                <w:kern w:val="0"/>
+                <w:sz w:val="20"/>
+                <w:szCs w:val="22"/>
+                <w:lang w:val="en-US" w:eastAsia="en-US" w:bidi="ar-SA"/>
+              </w:rPr>
+              <w:t>Movable</w:t>
+            </w:r>
+          </w:p>
+        </w:tc>
+        <w:tc>
+          <w:tcPr>
+            <w:tcW w:w="1545" w:type="dxa"/>
+            <w:tcBorders/>
+          </w:tcPr>
+          <w:p>
+            <w:pPr>
+              <w:pStyle w:val="Normal"/>
+              <w:widowControl/>
+              <w:spacing w:lineRule="auto" w:line="240" w:before="20" w:after="20"/>
+              <w:jc w:val="left"/>
+              <w:rPr>
+                <w:rFonts w:cs=""/>
+                <w:kern w:val="0"/>
+                <w:szCs w:val="22"/>
+                <w:lang w:val="en-US" w:eastAsia="en-US" w:bidi="ar-SA"/>
+              </w:rPr>
+            </w:pPr>
+            <w:r>
+              <w:rPr>
+                <w:rFonts w:cs=""/>
+                <w:kern w:val="0"/>
+                <w:sz w:val="20"/>
+                <w:szCs w:val="22"/>
+                <w:lang w:val="en-US" w:eastAsia="en-US" w:bidi="ar-SA"/>
+              </w:rPr>
+              <w:t>off</w:t>
+            </w:r>
+          </w:p>
+        </w:tc>
+        <w:tc>
+          <w:tcPr>
+            <w:tcW w:w="6186" w:type="dxa"/>
+            <w:tcBorders/>
+          </w:tcPr>
+          <w:p>
+            <w:pPr>
+              <w:pStyle w:val="Normal"/>
+              <w:widowControl/>
+              <w:spacing w:lineRule="auto" w:line="240" w:before="20" w:after="20"/>
+              <w:jc w:val="left"/>
+              <w:rPr>
+                <w:rFonts w:cs=""/>
+                <w:kern w:val="0"/>
+                <w:szCs w:val="22"/>
+                <w:lang w:val="en-US" w:eastAsia="en-US" w:bidi="ar-SA"/>
+              </w:rPr>
+            </w:pPr>
+            <w:r>
+              <w:rPr>
+                <w:rFonts w:cs=""/>
+                <w:kern w:val="0"/>
+                <w:sz w:val="20"/>
+                <w:szCs w:val="22"/>
+                <w:lang w:val="en-US" w:eastAsia="en-US" w:bidi="ar-SA"/>
+              </w:rPr>
+              <w:t>The operator may move the window at run time (below)</w:t>
+            </w:r>
+          </w:p>
+        </w:tc>
+      </w:tr>
+    </w:tbl>
+    <w:p>
+      <w:pPr>
+        <w:pStyle w:val="Normal"/>
+        <w:rPr/>
+      </w:pPr>
+      <w:r>
+        <w:rPr/>
+      </w:r>
+    </w:p>
+    <w:p>
+      <w:pPr>
+        <w:pStyle w:val="Normal"/>
+        <w:rPr/>
+      </w:pPr>
+      <w:r>
+        <w:rPr/>
+        <w:t>An empty font or color keeps the built-in one, so a window built before these settings existed looks exactly as it did, and setting one of them changes only that one.</w:t>
+      </w:r>
+    </w:p>
+    <w:p>
+      <w:pPr>
+        <w:pStyle w:val="Normal"/>
+        <w:rPr/>
+      </w:pPr>
+      <w:r>
+        <w:rPr>
+          <w:b/>
+        </w:rPr>
+        <w:t>Movable</w:t>
+      </w:r>
+      <w:r>
+        <w:rPr/>
+        <w:t xml:space="preserve"> lets the operator move the window while the application runs, by dragging its title bar with a mouse or a finger. It is offered for </w:t>
+      </w:r>
+      <w:r>
+        <w:rPr>
+          <w:b/>
+        </w:rPr>
+        <w:t>Popup</w:t>
+      </w:r>
+      <w:r>
+        <w:rPr/>
+        <w:t xml:space="preserve"> windows: a popup is the window that lands over the part of the plant the operator is watching, and the one worth sliding aside. LiquidWeighHMI's Device Faceplate is movable, so a faceplate covering the vessel behind it can be pushed out of the way.</w:t>
+      </w:r>
+    </w:p>
+    <w:p>
+      <w:pPr>
+        <w:pStyle w:val="ListBullet"/>
+        <w:numPr>
+          <w:ilvl w:val="0"/>
+          <w:numId w:val="1"/>
+        </w:numPr>
+        <w:rPr/>
+      </w:pPr>
+      <w:r>
+        <w:rPr/>
+        <w:t>The window moves; what it shows does not. It keeps showing the same part of its page.</w:t>
+      </w:r>
+    </w:p>
+    <w:p>
+      <w:pPr>
+        <w:pStyle w:val="ListBullet"/>
+        <w:numPr>
+          <w:ilvl w:val="0"/>
+          <w:numId w:val="1"/>
+        </w:numPr>
+        <w:rPr/>
+      </w:pPr>
+      <w:r>
+        <w:rPr/>
+        <w:t>A window may hang off the edge of the screen, but not out of reach: a strip of it stays on screen, and the title bar never leaves it.</w:t>
+      </w:r>
+    </w:p>
+    <w:p>
+      <w:pPr>
+        <w:pStyle w:val="ListBullet"/>
+        <w:numPr>
+          <w:ilvl w:val="0"/>
+          <w:numId w:val="1"/>
+        </w:numPr>
+        <w:rPr/>
+      </w:pPr>
+      <w:r>
+        <w:rPr/>
+        <w:t xml:space="preserve">Nothing is remembered. Close the window and open it again and it is back where it is defined, or where the </w:t>
+      </w:r>
+      <w:r>
+        <w:rPr>
+          <w:rFonts w:ascii="Consolas" w:hAnsi="Consolas"/>
+          <w:sz w:val="19"/>
+        </w:rPr>
+        <w:t>ShowWindow</w:t>
+      </w:r>
+      <w:r>
+        <w:rPr/>
+        <w:t xml:space="preserve"> call puts it (section 9.5).</w:t>
+      </w:r>
+    </w:p>
+    <w:p>
+      <w:pPr>
+        <w:pStyle w:val="ListBullet"/>
+        <w:numPr>
+          <w:ilvl w:val="0"/>
+          <w:numId w:val="1"/>
+        </w:numPr>
+        <w:rPr/>
+      </w:pPr>
+      <w:r>
+        <w:rPr/>
+        <w:t>The project is not changed: where the operator drags a window is not a design change.</w:t>
       </w:r>
     </w:p>
     <w:p>
@@ -9059,7 +9829,7 @@
         <w:pStyle w:val="Heading2"/>
         <w:rPr/>
       </w:pPr>
-      <w:bookmarkStart w:id="13" w:name="__RefHeading___Toc7463_2860942839"/>
+      <w:bookmarkStart w:id="13" w:name="__RefHeading___Toc7609_1630158169"/>
       <w:bookmarkEnd w:id="13"/>
       <w:r>
         <w:rPr/>
@@ -9231,7 +10001,7 @@
         <w:pStyle w:val="Heading1"/>
         <w:rPr/>
       </w:pPr>
-      <w:bookmarkStart w:id="14" w:name="__RefHeading___Toc7465_2860942839"/>
+      <w:bookmarkStart w:id="14" w:name="__RefHeading___Toc7611_1630158169"/>
       <w:bookmarkEnd w:id="14"/>
       <w:r>
         <w:rPr/>
@@ -9372,7 +10142,7 @@
       </w:pPr>
       <w:r>
         <w:rPr/>
-        <w:t>Table 10. Arc settings (Style tab, Arc section)</w:t>
+        <w:t>Table 11. Arc settings (Style tab, Arc section)</w:t>
       </w:r>
     </w:p>
     <w:tbl>
@@ -10007,7 +10777,7 @@
         <w:pStyle w:val="Heading1"/>
         <w:rPr/>
       </w:pPr>
-      <w:bookmarkStart w:id="15" w:name="__RefHeading___Toc7467_2860942839"/>
+      <w:bookmarkStart w:id="15" w:name="__RefHeading___Toc7613_1630158169"/>
       <w:bookmarkEnd w:id="15"/>
       <w:r>
         <w:rPr/>
@@ -10102,7 +10872,7 @@
       </w:pPr>
       <w:r>
         <w:rPr/>
-        <w:t>Table 11. Animation link families</w:t>
+        <w:t>Table 12. Animation link families</w:t>
       </w:r>
     </w:p>
     <w:tbl>
@@ -10770,7 +11540,7 @@
         <w:pStyle w:val="Heading2"/>
         <w:rPr/>
       </w:pPr>
-      <w:bookmarkStart w:id="16" w:name="__RefHeading___Toc7469_2860942839"/>
+      <w:bookmarkStart w:id="16" w:name="__RefHeading___Toc7615_1630158169"/>
       <w:bookmarkEnd w:id="16"/>
       <w:r>
         <w:rPr/>
@@ -10956,7 +11726,7 @@
         <w:pStyle w:val="Heading2"/>
         <w:rPr/>
       </w:pPr>
-      <w:bookmarkStart w:id="17" w:name="__RefHeading___Toc7471_2860942839"/>
+      <w:bookmarkStart w:id="17" w:name="__RefHeading___Toc7617_1630158169"/>
       <w:bookmarkEnd w:id="17"/>
       <w:r>
         <w:rPr/>
@@ -11080,7 +11850,7 @@
         <w:pStyle w:val="Heading2"/>
         <w:rPr/>
       </w:pPr>
-      <w:bookmarkStart w:id="18" w:name="__RefHeading___Toc7473_2860942839"/>
+      <w:bookmarkStart w:id="18" w:name="__RefHeading___Toc7619_1630158169"/>
       <w:bookmarkEnd w:id="18"/>
       <w:r>
         <w:rPr/>
@@ -11196,7 +11966,7 @@
         <w:pStyle w:val="Heading2"/>
         <w:rPr/>
       </w:pPr>
-      <w:bookmarkStart w:id="19" w:name="__RefHeading___Toc7475_2860942839"/>
+      <w:bookmarkStart w:id="19" w:name="__RefHeading___Toc7621_1630158169"/>
       <w:bookmarkEnd w:id="19"/>
       <w:r>
         <w:rPr/>
@@ -11312,7 +12082,7 @@
         <w:pStyle w:val="Heading2"/>
         <w:rPr/>
       </w:pPr>
-      <w:bookmarkStart w:id="20" w:name="__RefHeading___Toc7477_2860942839"/>
+      <w:bookmarkStart w:id="20" w:name="__RefHeading___Toc7623_1630158169"/>
       <w:bookmarkEnd w:id="20"/>
       <w:r>
         <w:rPr/>
@@ -11450,7 +12220,7 @@
       </w:pPr>
       <w:r>
         <w:rPr/>
-        <w:t>Table 12. Pushbutton actions</w:t>
+        <w:t>Table 13. Pushbutton actions</w:t>
       </w:r>
     </w:p>
     <w:tbl>
@@ -11824,7 +12594,7 @@
         <w:pStyle w:val="Heading1"/>
         <w:rPr/>
       </w:pPr>
-      <w:bookmarkStart w:id="21" w:name="__RefHeading___Toc7479_2860942839"/>
+      <w:bookmarkStart w:id="21" w:name="__RefHeading___Toc7625_1630158169"/>
       <w:bookmarkEnd w:id="21"/>
       <w:r>
         <w:rPr/>
@@ -11849,7 +12619,7 @@
       </w:pPr>
       <w:r>
         <w:rPr/>
-        <w:t>Table 13. Expression syntax</w:t>
+        <w:t>Table 14. Expression syntax</w:t>
       </w:r>
     </w:p>
     <w:tbl>
@@ -12355,7 +13125,7 @@
       </w:pPr>
       <w:r>
         <w:rPr/>
-        <w:t>Table 14. System tags</w:t>
+        <w:t>Table 15. System tags</w:t>
       </w:r>
     </w:p>
     <w:tbl>
@@ -13003,7 +13773,7 @@
         <w:pStyle w:val="Heading2"/>
         <w:rPr/>
       </w:pPr>
-      <w:bookmarkStart w:id="22" w:name="__RefHeading___Toc7481_2860942839"/>
+      <w:bookmarkStart w:id="22" w:name="__RefHeading___Toc7627_1630158169"/>
       <w:bookmarkEnd w:id="22"/>
       <w:r>
         <w:rPr/>
@@ -13415,7 +14185,7 @@
         <w:pStyle w:val="Heading2"/>
         <w:rPr/>
       </w:pPr>
-      <w:bookmarkStart w:id="23" w:name="__RefHeading___Toc7483_2860942839"/>
+      <w:bookmarkStart w:id="23" w:name="__RefHeading___Toc7629_1630158169"/>
       <w:bookmarkEnd w:id="23"/>
       <w:r>
         <w:rPr/>
@@ -13534,7 +14304,7 @@
         <w:pStyle w:val="Heading2"/>
         <w:rPr/>
       </w:pPr>
-      <w:bookmarkStart w:id="24" w:name="__RefHeading___Toc7485_2860942839"/>
+      <w:bookmarkStart w:id="24" w:name="__RefHeading___Toc7631_1630158169"/>
       <w:bookmarkEnd w:id="24"/>
       <w:r>
         <w:rPr/>
@@ -13666,7 +14436,7 @@
       </w:pPr>
       <w:r>
         <w:rPr/>
-        <w:t>Table 15. Math and text functions (links and scripts)</w:t>
+        <w:t>Table 16. Math and text functions (links and scripts)</w:t>
       </w:r>
     </w:p>
     <w:tbl>
@@ -14845,7 +15615,7 @@
       </w:pPr>
       <w:r>
         <w:rPr/>
-        <w:t>Table 16. Text functions (links and scripts)</w:t>
+        <w:t>Table 17. Text functions (links and scripts)</w:t>
       </w:r>
     </w:p>
     <w:tbl>
@@ -15994,7 +16764,7 @@
       </w:pPr>
       <w:r>
         <w:rPr/>
-        <w:t>Table 17. Security functions (scripts only)</w:t>
+        <w:t>Table 18. Security functions (scripts only)</w:t>
       </w:r>
     </w:p>
     <w:tbl>
@@ -16657,7 +17427,7 @@
       </w:pPr>
       <w:r>
         <w:rPr/>
-        <w:t>Table 18. Indirect tag function (scripts only)</w:t>
+        <w:t>Table 19. Indirect tag function (scripts only)</w:t>
       </w:r>
     </w:p>
     <w:tbl>
@@ -16916,7 +17686,7 @@
       </w:pPr>
       <w:r>
         <w:rPr/>
-        <w:t>Table 19. Window function (scripts only)</w:t>
+        <w:t>Table 20. Window function (scripts only)</w:t>
       </w:r>
     </w:p>
     <w:tbl>
@@ -17157,7 +17927,7 @@
       </w:pPr>
       <w:r>
         <w:rPr/>
-        <w:t>Table 20. Screen function (scripts only)</w:t>
+        <w:t>Table 21. Screen function (scripts only)</w:t>
       </w:r>
     </w:p>
     <w:tbl>
@@ -17438,7 +18208,7 @@
       </w:pPr>
       <w:r>
         <w:rPr/>
-        <w:t>Table 21. Recipe functions (scripts only)</w:t>
+        <w:t>Table 22. Recipe functions (scripts only)</w:t>
       </w:r>
     </w:p>
     <w:tbl>
@@ -18511,7 +19281,7 @@
       </w:pPr>
       <w:r>
         <w:rPr/>
-        <w:t>Table 22. Trend functions (scripts only)</w:t>
+        <w:t>Table 23. Trend functions (scripts only)</w:t>
       </w:r>
     </w:p>
     <w:tbl>
@@ -19164,7 +19934,7 @@
       </w:pPr>
       <w:r>
         <w:rPr/>
-        <w:t>Table 23. Database functions (scripts only)</w:t>
+        <w:t>Table 24. Database functions (scripts only)</w:t>
       </w:r>
     </w:p>
     <w:tbl>
@@ -19930,7 +20700,7 @@
       </w:pPr>
       <w:r>
         <w:rPr/>
-        <w:t>Table 24. List functions (scripts only)</w:t>
+        <w:t>Table 25. List functions (scripts only)</w:t>
       </w:r>
     </w:p>
     <w:tbl>
@@ -20658,7 +21428,7 @@
         <w:pStyle w:val="Heading2"/>
         <w:rPr/>
       </w:pPr>
-      <w:bookmarkStart w:id="25" w:name="__RefHeading___Toc7487_2860942839"/>
+      <w:bookmarkStart w:id="25" w:name="__RefHeading___Toc7633_1630158169"/>
       <w:bookmarkEnd w:id="25"/>
       <w:r>
         <w:rPr/>
@@ -21497,7 +22267,7 @@
         <w:pStyle w:val="Heading2"/>
         <w:rPr/>
       </w:pPr>
-      <w:bookmarkStart w:id="26" w:name="__RefHeading___Toc7489_2860942839"/>
+      <w:bookmarkStart w:id="26" w:name="__RefHeading___Toc7635_1630158169"/>
       <w:bookmarkEnd w:id="26"/>
       <w:r>
         <w:rPr/>
@@ -21983,7 +22753,7 @@
         <w:pStyle w:val="Heading2"/>
         <w:rPr/>
       </w:pPr>
-      <w:bookmarkStart w:id="27" w:name="__RefHeading___Toc7491_2860942839"/>
+      <w:bookmarkStart w:id="27" w:name="__RefHeading___Toc7637_1630158169"/>
       <w:bookmarkEnd w:id="27"/>
       <w:r>
         <w:rPr/>
@@ -22175,7 +22945,7 @@
         <w:pStyle w:val="Heading2"/>
         <w:rPr/>
       </w:pPr>
-      <w:bookmarkStart w:id="28" w:name="__RefHeading___Toc7493_2860942839"/>
+      <w:bookmarkStart w:id="28" w:name="__RefHeading___Toc7639_1630158169"/>
       <w:bookmarkEnd w:id="28"/>
       <w:r>
         <w:rPr/>
@@ -22350,7 +23120,7 @@
       </w:pPr>
       <w:r>
         <w:rPr/>
-        <w:t>Table 25. Local variable types</w:t>
+        <w:t>Table 26. Local variable types</w:t>
       </w:r>
     </w:p>
     <w:tbl>
@@ -22861,7 +23631,7 @@
         <w:pStyle w:val="Heading2"/>
         <w:rPr/>
       </w:pPr>
-      <w:bookmarkStart w:id="29" w:name="__RefHeading___Toc7495_2860942839"/>
+      <w:bookmarkStart w:id="29" w:name="__RefHeading___Toc7641_1630158169"/>
       <w:bookmarkEnd w:id="29"/>
       <w:r>
         <w:rPr/>
@@ -23044,7 +23814,7 @@
       </w:pPr>
       <w:r>
         <w:rPr/>
-        <w:t>Table 26. What a QuickFunction may do</w:t>
+        <w:t>Table 27. What a QuickFunction may do</w:t>
       </w:r>
     </w:p>
     <w:tbl>
@@ -23615,7 +24385,7 @@
         <w:pStyle w:val="Heading1"/>
         <w:rPr/>
       </w:pPr>
-      <w:bookmarkStart w:id="30" w:name="__RefHeading___Toc7497_2860942839"/>
+      <w:bookmarkStart w:id="30" w:name="__RefHeading___Toc7643_1630158169"/>
       <w:bookmarkEnd w:id="30"/>
       <w:r>
         <w:rPr/>
@@ -23627,7 +24397,7 @@
         <w:pStyle w:val="Heading2"/>
         <w:rPr/>
       </w:pPr>
-      <w:bookmarkStart w:id="31" w:name="__RefHeading___Toc7499_2860942839"/>
+      <w:bookmarkStart w:id="31" w:name="__RefHeading___Toc7645_1630158169"/>
       <w:bookmarkEnd w:id="31"/>
       <w:r>
         <w:rPr/>
@@ -23895,7 +24665,7 @@
       </w:pPr>
       <w:r>
         <w:rPr/>
-        <w:t>Table 27. What an alarm object colors</w:t>
+        <w:t>Table 28. What an alarm object colors</w:t>
       </w:r>
     </w:p>
     <w:tbl>
@@ -24958,7 +25728,7 @@
         <w:pStyle w:val="Heading2"/>
         <w:rPr/>
       </w:pPr>
-      <w:bookmarkStart w:id="32" w:name="__RefHeading___Toc7501_2860942839"/>
+      <w:bookmarkStart w:id="32" w:name="__RefHeading___Toc7647_1630158169"/>
       <w:bookmarkEnd w:id="32"/>
       <w:r>
         <w:rPr/>
@@ -25053,7 +25823,7 @@
       </w:pPr>
       <w:r>
         <w:rPr/>
-        <w:t>Table 28. LiquidWeighHMI users</w:t>
+        <w:t>Table 29. LiquidWeighHMI users</w:t>
       </w:r>
     </w:p>
     <w:tbl>
@@ -25648,7 +26418,7 @@
         <w:pStyle w:val="Heading1"/>
         <w:rPr/>
       </w:pPr>
-      <w:bookmarkStart w:id="33" w:name="__RefHeading___Toc7503_2860942839"/>
+      <w:bookmarkStart w:id="33" w:name="__RefHeading___Toc7649_1630158169"/>
       <w:bookmarkEnd w:id="33"/>
       <w:r>
         <w:rPr/>
@@ -25787,7 +26557,7 @@
         <w:pStyle w:val="Heading2"/>
         <w:rPr/>
       </w:pPr>
-      <w:bookmarkStart w:id="34" w:name="__RefHeading___Toc7505_2860942839"/>
+      <w:bookmarkStart w:id="34" w:name="__RefHeading___Toc7651_1630158169"/>
       <w:bookmarkEnd w:id="34"/>
       <w:r>
         <w:rPr/>
@@ -26042,7 +26812,7 @@
       </w:pPr>
       <w:r>
         <w:rPr/>
-        <w:t>Table 29. The tags of the Plasticizer Blends book</w:t>
+        <w:t>Table 30. The tags of the Plasticizer Blends book</w:t>
       </w:r>
     </w:p>
     <w:tbl>
@@ -26659,7 +27429,7 @@
       </w:pPr>
       <w:r>
         <w:rPr/>
-        <w:t>Table 30. LiquidWeighHMI's starting recipes</w:t>
+        <w:t>Table 31. LiquidWeighHMI's starting recipes</w:t>
       </w:r>
     </w:p>
     <w:tbl>
@@ -27648,7 +28418,7 @@
         <w:pStyle w:val="Heading2"/>
         <w:rPr/>
       </w:pPr>
-      <w:bookmarkStart w:id="35" w:name="__RefHeading___Toc7507_2860942839"/>
+      <w:bookmarkStart w:id="35" w:name="__RefHeading___Toc7653_1630158169"/>
       <w:bookmarkEnd w:id="35"/>
       <w:r>
         <w:rPr/>
@@ -27835,7 +28605,7 @@
       </w:pPr>
       <w:r>
         <w:rPr/>
-        <w:t>Table 31. The Recipes screen's buttons</w:t>
+        <w:t>Table 32. The Recipes screen's buttons</w:t>
       </w:r>
     </w:p>
     <w:tbl>
@@ -29098,7 +29868,7 @@
         <w:pStyle w:val="Heading2"/>
         <w:rPr/>
       </w:pPr>
-      <w:bookmarkStart w:id="36" w:name="__RefHeading___Toc7509_2860942839"/>
+      <w:bookmarkStart w:id="36" w:name="__RefHeading___Toc7655_1630158169"/>
       <w:bookmarkEnd w:id="36"/>
       <w:r>
         <w:rPr/>
@@ -29189,7 +29959,7 @@
       </w:pPr>
       <w:r>
         <w:rPr/>
-        <w:t>Table 32. Recipe List settings</w:t>
+        <w:t>Table 33. Recipe List settings</w:t>
       </w:r>
     </w:p>
     <w:tbl>
@@ -29808,7 +30578,7 @@
         <w:pStyle w:val="Heading2"/>
         <w:rPr/>
       </w:pPr>
-      <w:bookmarkStart w:id="37" w:name="__RefHeading___Toc7511_2860942839"/>
+      <w:bookmarkStart w:id="37" w:name="__RefHeading___Toc7657_1630158169"/>
       <w:bookmarkEnd w:id="37"/>
       <w:r>
         <w:rPr/>
@@ -30090,7 +30860,7 @@
         <w:pStyle w:val="Heading2"/>
         <w:rPr/>
       </w:pPr>
-      <w:bookmarkStart w:id="38" w:name="__RefHeading___Toc7513_2860942839"/>
+      <w:bookmarkStart w:id="38" w:name="__RefHeading___Toc7659_1630158169"/>
       <w:bookmarkEnd w:id="38"/>
       <w:r>
         <w:rPr/>
@@ -30251,7 +31021,7 @@
         <w:pStyle w:val="Heading2"/>
         <w:rPr/>
       </w:pPr>
-      <w:bookmarkStart w:id="39" w:name="__RefHeading___Toc7515_2860942839"/>
+      <w:bookmarkStart w:id="39" w:name="__RefHeading___Toc7661_1630158169"/>
       <w:bookmarkEnd w:id="39"/>
       <w:r>
         <w:rPr/>
@@ -30276,7 +31046,7 @@
       </w:pPr>
       <w:r>
         <w:rPr/>
-        <w:t>Table 33. Where saved recipes are kept</w:t>
+        <w:t>Table 34. Where saved recipes are kept</w:t>
       </w:r>
     </w:p>
     <w:tbl>
@@ -30651,7 +31421,7 @@
         <w:pStyle w:val="Heading1"/>
         <w:rPr/>
       </w:pPr>
-      <w:bookmarkStart w:id="40" w:name="__RefHeading___Toc7517_2860942839"/>
+      <w:bookmarkStart w:id="40" w:name="__RefHeading___Toc7663_1630158169"/>
       <w:bookmarkEnd w:id="40"/>
       <w:r>
         <w:rPr/>
@@ -30683,7 +31453,7 @@
         <w:pStyle w:val="Heading2"/>
         <w:rPr/>
       </w:pPr>
-      <w:bookmarkStart w:id="41" w:name="__RefHeading___Toc7519_2860942839"/>
+      <w:bookmarkStart w:id="41" w:name="__RefHeading___Toc7665_1630158169"/>
       <w:bookmarkEnd w:id="41"/>
       <w:r>
         <w:rPr/>
@@ -30768,7 +31538,7 @@
       </w:pPr>
       <w:r>
         <w:rPr/>
-        <w:t>Table 34. Trend settings</w:t>
+        <w:t>Table 35. Trend settings</w:t>
       </w:r>
     </w:p>
     <w:tbl>
@@ -31888,7 +32658,7 @@
         <w:pStyle w:val="Heading2"/>
         <w:rPr/>
       </w:pPr>
-      <w:bookmarkStart w:id="42" w:name="__RefHeading___Toc7521_2860942839"/>
+      <w:bookmarkStart w:id="42" w:name="__RefHeading___Toc7667_1630158169"/>
       <w:bookmarkEnd w:id="42"/>
       <w:r>
         <w:rPr/>
@@ -31963,7 +32733,7 @@
       </w:pPr>
       <w:r>
         <w:rPr/>
-        <w:t>Table 35. The pens of LiquidWeighHMI's trend</w:t>
+        <w:t>Table 36. The pens of LiquidWeighHMI's trend</w:t>
       </w:r>
     </w:p>
     <w:tbl>
@@ -33274,7 +34044,7 @@
         <w:pStyle w:val="Heading2"/>
         <w:rPr/>
       </w:pPr>
-      <w:bookmarkStart w:id="43" w:name="__RefHeading___Toc7523_2860942839"/>
+      <w:bookmarkStart w:id="43" w:name="__RefHeading___Toc7669_1630158169"/>
       <w:bookmarkEnd w:id="43"/>
       <w:r>
         <w:rPr/>
@@ -33379,7 +34149,7 @@
       </w:pPr>
       <w:r>
         <w:rPr/>
-        <w:t>Table 36. The Trends screen's buttons</w:t>
+        <w:t>Table 37. The Trends screen's buttons</w:t>
       </w:r>
     </w:p>
     <w:tbl>
@@ -33860,7 +34630,7 @@
         <w:pStyle w:val="Heading2"/>
         <w:rPr/>
       </w:pPr>
-      <w:bookmarkStart w:id="44" w:name="__RefHeading___Toc7525_2860942839"/>
+      <w:bookmarkStart w:id="44" w:name="__RefHeading___Toc7671_1630158169"/>
       <w:bookmarkEnd w:id="44"/>
       <w:r>
         <w:rPr/>
@@ -33955,7 +34725,7 @@
         <w:pStyle w:val="Heading2"/>
         <w:rPr/>
       </w:pPr>
-      <w:bookmarkStart w:id="45" w:name="__RefHeading___Toc7527_2860942839"/>
+      <w:bookmarkStart w:id="45" w:name="__RefHeading___Toc7673_1630158169"/>
       <w:bookmarkEnd w:id="45"/>
       <w:r>
         <w:rPr/>
@@ -34091,7 +34861,7 @@
       </w:pPr>
       <w:r>
         <w:rPr/>
-        <w:t>Table 37. Where the trend history is kept</w:t>
+        <w:t>Table 38. Where the trend history is kept</w:t>
       </w:r>
     </w:p>
     <w:tbl>
@@ -34409,7 +35179,7 @@
         <w:pStyle w:val="Heading1"/>
         <w:rPr/>
       </w:pPr>
-      <w:bookmarkStart w:id="46" w:name="__RefHeading___Toc7529_2860942839"/>
+      <w:bookmarkStart w:id="46" w:name="__RefHeading___Toc7675_1630158169"/>
       <w:bookmarkEnd w:id="46"/>
       <w:r>
         <w:rPr/>
@@ -34574,7 +35344,7 @@
         <w:pStyle w:val="Heading2"/>
         <w:rPr/>
       </w:pPr>
-      <w:bookmarkStart w:id="47" w:name="__RefHeading___Toc7531_2860942839"/>
+      <w:bookmarkStart w:id="47" w:name="__RefHeading___Toc7677_1630158169"/>
       <w:bookmarkEnd w:id="47"/>
       <w:r>
         <w:rPr/>
@@ -34610,7 +35380,7 @@
       </w:pPr>
       <w:r>
         <w:rPr/>
-        <w:t>Table 38. Data source settings</w:t>
+        <w:t>Table 39. Data source settings</w:t>
       </w:r>
     </w:p>
     <w:tbl>
@@ -35691,7 +36461,7 @@
         <w:pStyle w:val="Heading2"/>
         <w:rPr/>
       </w:pPr>
-      <w:bookmarkStart w:id="48" w:name="__RefHeading___Toc7533_2860942839"/>
+      <w:bookmarkStart w:id="48" w:name="__RefHeading___Toc7679_1630158169"/>
       <w:bookmarkEnd w:id="48"/>
       <w:r>
         <w:rPr/>
@@ -35925,7 +36695,7 @@
         <w:pStyle w:val="Heading2"/>
         <w:rPr/>
       </w:pPr>
-      <w:bookmarkStart w:id="49" w:name="__RefHeading___Toc7535_2860942839"/>
+      <w:bookmarkStart w:id="49" w:name="__RefHeading___Toc7681_1630158169"/>
       <w:bookmarkEnd w:id="49"/>
       <w:r>
         <w:rPr/>
@@ -35971,7 +36741,7 @@
       </w:pPr>
       <w:r>
         <w:rPr/>
-        <w:t>Table 39. Column types</w:t>
+        <w:t>Table 40. Column types</w:t>
       </w:r>
     </w:p>
     <w:tbl>
@@ -36742,7 +37512,7 @@
         <w:pStyle w:val="Heading2"/>
         <w:rPr/>
       </w:pPr>
-      <w:bookmarkStart w:id="50" w:name="__RefHeading___Toc7537_2860942839"/>
+      <w:bookmarkStart w:id="50" w:name="__RefHeading___Toc7683_1630158169"/>
       <w:bookmarkEnd w:id="50"/>
       <w:r>
         <w:rPr/>
@@ -36895,7 +37665,7 @@
       </w:pPr>
       <w:r>
         <w:rPr/>
-        <w:t>Table 40. Connecting</w:t>
+        <w:t>Table 41. Connecting</w:t>
       </w:r>
     </w:p>
     <w:tbl>
@@ -37137,7 +37907,7 @@
       </w:pPr>
       <w:r>
         <w:rPr/>
-        <w:t>Table 41. Reading rows</w:t>
+        <w:t>Table 42. Reading rows</w:t>
       </w:r>
     </w:p>
     <w:tbl>
@@ -37577,7 +38347,7 @@
       </w:pPr>
       <w:r>
         <w:rPr/>
-        <w:t>Table 42. Writing rows and tables</w:t>
+        <w:t>Table 43. Writing rows and tables</w:t>
       </w:r>
     </w:p>
     <w:tbl>
@@ -38438,7 +39208,7 @@
         <w:pStyle w:val="Heading2"/>
         <w:rPr/>
       </w:pPr>
-      <w:bookmarkStart w:id="51" w:name="__RefHeading___Toc7539_2860942839"/>
+      <w:bookmarkStart w:id="51" w:name="__RefHeading___Toc7685_1630158169"/>
       <w:bookmarkEnd w:id="51"/>
       <w:r>
         <w:rPr/>
@@ -39138,7 +39908,7 @@
         <w:pStyle w:val="Heading2"/>
         <w:rPr/>
       </w:pPr>
-      <w:bookmarkStart w:id="52" w:name="__RefHeading___Toc7541_2860942839"/>
+      <w:bookmarkStart w:id="52" w:name="__RefHeading___Toc7687_1630158169"/>
       <w:bookmarkEnd w:id="52"/>
       <w:r>
         <w:rPr/>
@@ -39163,7 +39933,7 @@
       </w:pPr>
       <w:r>
         <w:rPr/>
-        <w:t>Table 43. Where a SQLite file is kept</w:t>
+        <w:t>Table 44. Where a SQLite file is kept</w:t>
       </w:r>
     </w:p>
     <w:tbl>
@@ -39496,7 +40266,7 @@
         <w:pStyle w:val="Heading1"/>
         <w:rPr/>
       </w:pPr>
-      <w:bookmarkStart w:id="53" w:name="__RefHeading___Toc7543_2860942839"/>
+      <w:bookmarkStart w:id="53" w:name="__RefHeading___Toc7689_1630158169"/>
       <w:bookmarkEnd w:id="53"/>
       <w:r>
         <w:rPr/>
@@ -39528,7 +40298,7 @@
         <w:pStyle w:val="Heading2"/>
         <w:rPr/>
       </w:pPr>
-      <w:bookmarkStart w:id="54" w:name="__RefHeading___Toc7545_2860942839"/>
+      <w:bookmarkStart w:id="54" w:name="__RefHeading___Toc7691_1630158169"/>
       <w:bookmarkEnd w:id="54"/>
       <w:r>
         <w:rPr/>
@@ -39623,7 +40393,7 @@
       </w:pPr>
       <w:r>
         <w:rPr/>
-        <w:t>Table 44. List Box settings</w:t>
+        <w:t>Table 45. List Box settings</w:t>
       </w:r>
     </w:p>
     <w:tbl>
@@ -40852,7 +41622,7 @@
         <w:pStyle w:val="Heading2"/>
         <w:rPr/>
       </w:pPr>
-      <w:bookmarkStart w:id="55" w:name="__RefHeading___Toc7547_2860942839"/>
+      <w:bookmarkStart w:id="55" w:name="__RefHeading___Toc7693_1630158169"/>
       <w:bookmarkEnd w:id="55"/>
       <w:r>
         <w:rPr/>
@@ -40877,7 +41647,7 @@
       </w:pPr>
       <w:r>
         <w:rPr/>
-        <w:t>Table 45. List functions (scripts only)</w:t>
+        <w:t>Table 46. List functions (scripts only)</w:t>
       </w:r>
     </w:p>
     <w:tbl>
@@ -41587,7 +42357,7 @@
         <w:pStyle w:val="Heading2"/>
         <w:rPr/>
       </w:pPr>
-      <w:bookmarkStart w:id="56" w:name="__RefHeading___Toc7549_2860942839"/>
+      <w:bookmarkStart w:id="56" w:name="__RefHeading___Toc7695_1630158169"/>
       <w:bookmarkEnd w:id="56"/>
       <w:r>
         <w:rPr/>
@@ -41639,7 +42409,7 @@
         <w:pStyle w:val="Heading2"/>
         <w:rPr/>
       </w:pPr>
-      <w:bookmarkStart w:id="57" w:name="__RefHeading___Toc7551_2860942839"/>
+      <w:bookmarkStart w:id="57" w:name="__RefHeading___Toc7697_1630158169"/>
       <w:bookmarkEnd w:id="57"/>
       <w:r>
         <w:rPr/>
@@ -41922,7 +42692,7 @@
         <w:pStyle w:val="Heading1"/>
         <w:rPr/>
       </w:pPr>
-      <w:bookmarkStart w:id="58" w:name="__RefHeading___Toc7553_2860942839"/>
+      <w:bookmarkStart w:id="58" w:name="__RefHeading___Toc7699_1630158169"/>
       <w:bookmarkEnd w:id="58"/>
       <w:r>
         <w:rPr/>
@@ -41934,7 +42704,7 @@
         <w:pStyle w:val="Heading2"/>
         <w:rPr/>
       </w:pPr>
-      <w:bookmarkStart w:id="59" w:name="__RefHeading___Toc7555_2860942839"/>
+      <w:bookmarkStart w:id="59" w:name="__RefHeading___Toc7701_1630158169"/>
       <w:bookmarkEnd w:id="59"/>
       <w:r>
         <w:rPr/>
@@ -42022,7 +42792,7 @@
         <w:pStyle w:val="Heading2"/>
         <w:rPr/>
       </w:pPr>
-      <w:bookmarkStart w:id="60" w:name="__RefHeading___Toc7557_2860942839"/>
+      <w:bookmarkStart w:id="60" w:name="__RefHeading___Toc7703_1630158169"/>
       <w:bookmarkEnd w:id="60"/>
       <w:r>
         <w:rPr/>
@@ -42588,7 +43358,7 @@
         <w:pStyle w:val="Heading1"/>
         <w:rPr/>
       </w:pPr>
-      <w:bookmarkStart w:id="61" w:name="__RefHeading___Toc7559_2860942839"/>
+      <w:bookmarkStart w:id="61" w:name="__RefHeading___Toc7705_1630158169"/>
       <w:bookmarkEnd w:id="61"/>
       <w:r>
         <w:rPr/>
@@ -42613,7 +43383,7 @@
       </w:pPr>
       <w:r>
         <w:rPr/>
-        <w:t>Table 46. Deployment options</w:t>
+        <w:t>Table 47. Deployment options</w:t>
       </w:r>
     </w:p>
     <w:tbl>
@@ -43044,7 +43814,7 @@
         <w:pStyle w:val="Heading2"/>
         <w:rPr/>
       </w:pPr>
-      <w:bookmarkStart w:id="62" w:name="__RefHeading___Toc7561_2860942839"/>
+      <w:bookmarkStart w:id="62" w:name="__RefHeading___Toc7707_1630158169"/>
       <w:bookmarkEnd w:id="62"/>
       <w:r>
         <w:rPr/>
@@ -43135,7 +43905,7 @@
         <w:pStyle w:val="Heading2"/>
         <w:rPr/>
       </w:pPr>
-      <w:bookmarkStart w:id="63" w:name="__RefHeading___Toc7563_2860942839"/>
+      <w:bookmarkStart w:id="63" w:name="__RefHeading___Toc7709_1630158169"/>
       <w:bookmarkEnd w:id="63"/>
       <w:r>
         <w:rPr/>
@@ -43248,7 +44018,7 @@
         <w:pStyle w:val="Heading2"/>
         <w:rPr/>
       </w:pPr>
-      <w:bookmarkStart w:id="64" w:name="__RefHeading___Toc7565_2860942839"/>
+      <w:bookmarkStart w:id="64" w:name="__RefHeading___Toc7711_1630158169"/>
       <w:bookmarkEnd w:id="64"/>
       <w:r>
         <w:rPr/>
@@ -43461,7 +44231,7 @@
         <w:pStyle w:val="Heading1"/>
         <w:rPr/>
       </w:pPr>
-      <w:bookmarkStart w:id="65" w:name="__RefHeading___Toc7567_2860942839"/>
+      <w:bookmarkStart w:id="65" w:name="__RefHeading___Toc7713_1630158169"/>
       <w:bookmarkEnd w:id="65"/>
       <w:r>
         <w:rPr/>
@@ -43476,7 +44246,7 @@
       </w:pPr>
       <w:r>
         <w:rPr/>
-        <w:t>Table 47. Common problems</w:t>
+        <w:t>Table 48. Common problems</w:t>
       </w:r>
     </w:p>
     <w:tbl>
@@ -44253,7 +45023,7 @@
         <w:pStyle w:val="Heading1"/>
         <w:rPr/>
       </w:pPr>
-      <w:bookmarkStart w:id="66" w:name="__RefHeading___Toc7569_2860942839"/>
+      <w:bookmarkStart w:id="66" w:name="__RefHeading___Toc7715_1630158169"/>
       <w:bookmarkEnd w:id="66"/>
       <w:r>
         <w:rPr/>
@@ -44278,7 +45048,7 @@
       </w:pPr>
       <w:r>
         <w:rPr/>
-        <w:t>Table 48. Command-line modes</w:t>
+        <w:t>Table 49. Command-line modes</w:t>
       </w:r>
     </w:p>
     <w:tbl>
@@ -44802,7 +45572,7 @@
       <w:rPr>
         <w:sz w:val="18"/>
       </w:rPr>
-      <w:t>88</w:t>
+      <w:t>89</w:t>
     </w:r>
     <w:r>
       <w:rPr>

</xml_diff>

<commit_message>
feat: a touch background color in Application Settings (drawio 3a2e51633)
One color for the whole application, which every object with a touch
animation is drawn in while the operator holds it down, so a touch panel
answers a press. Unset by default; an object the operator may not use
just now is left alone, and letting go puts the object's own color back.

LiquidWeighHMI and its simulator use a light blue, #4fc3f7, which is
what the manual's chapter 3 and 8.5 now describe. The two Application
Settings figures are to be retaken with the rest in the release pass.

Co-Authored-By: Claude Opus 5 <noreply@anthropic.com>
</commit_message>
<xml_diff>
--- a/doc/Append-HMI-Studio-User-Manual.docx
+++ b/doc/Append-HMI-Studio-User-Manual.docx
@@ -283,7 +283,7 @@
             </w:rPr>
             <w:fldChar w:fldCharType="separate"/>
           </w:r>
-          <w:hyperlink w:anchor="__RefHeading___Toc8134_602959473" w:tooltip="1 Introduction">
+          <w:hyperlink w:anchor="__RefHeading___Toc8142_2384007457" w:tooltip="1 Introduction">
             <w:r>
               <w:rPr>
                 <w:rStyle w:val="IndexLink"/>
@@ -304,7 +304,7 @@
             </w:tabs>
             <w:rPr/>
           </w:pPr>
-          <w:hyperlink w:anchor="__RefHeading___Toc8136_602959473" w:tooltip="1.1 Building applications with an AI agent">
+          <w:hyperlink w:anchor="__RefHeading___Toc8144_2384007457" w:tooltip="1.1 Building applications with an AI agent">
             <w:r>
               <w:rPr>
                 <w:rStyle w:val="IndexLink"/>
@@ -325,7 +325,7 @@
             </w:tabs>
             <w:rPr/>
           </w:pPr>
-          <w:hyperlink w:anchor="__RefHeading___Toc8138_602959473" w:tooltip="1.2 How an HMI application is organized">
+          <w:hyperlink w:anchor="__RefHeading___Toc8146_2384007457" w:tooltip="1.2 How an HMI application is organized">
             <w:r>
               <w:rPr>
                 <w:rStyle w:val="IndexLink"/>
@@ -346,7 +346,7 @@
             </w:tabs>
             <w:rPr/>
           </w:pPr>
-          <w:hyperlink w:anchor="__RefHeading___Toc8140_602959473" w:tooltip="2 The Studio window">
+          <w:hyperlink w:anchor="__RefHeading___Toc8148_2384007457" w:tooltip="2 The Studio window">
             <w:r>
               <w:rPr>
                 <w:rStyle w:val="IndexLink"/>
@@ -367,7 +367,7 @@
             </w:tabs>
             <w:rPr/>
           </w:pPr>
-          <w:hyperlink w:anchor="__RefHeading___Toc8142_602959473" w:tooltip="2.1 The HMI menu">
+          <w:hyperlink w:anchor="__RefHeading___Toc8150_2384007457" w:tooltip="2.1 The HMI menu">
             <w:r>
               <w:rPr>
                 <w:rStyle w:val="IndexLink"/>
@@ -388,7 +388,7 @@
             </w:tabs>
             <w:rPr/>
           </w:pPr>
-          <w:hyperlink w:anchor="__RefHeading___Toc8144_602959473" w:tooltip="3 Application settings">
+          <w:hyperlink w:anchor="__RefHeading___Toc8152_2384007457" w:tooltip="3 Application settings">
             <w:r>
               <w:rPr>
                 <w:rStyle w:val="IndexLink"/>
@@ -409,7 +409,7 @@
             </w:tabs>
             <w:rPr/>
           </w:pPr>
-          <w:hyperlink w:anchor="__RefHeading___Toc8146_602959473" w:tooltip="4 Devices">
+          <w:hyperlink w:anchor="__RefHeading___Toc8154_2384007457" w:tooltip="4 Devices">
             <w:r>
               <w:rPr>
                 <w:rStyle w:val="IndexLink"/>
@@ -430,7 +430,7 @@
             </w:tabs>
             <w:rPr/>
           </w:pPr>
-          <w:hyperlink w:anchor="__RefHeading___Toc8148_602959473" w:tooltip="5 Tags">
+          <w:hyperlink w:anchor="__RefHeading___Toc8156_2384007457" w:tooltip="5 Tags">
             <w:r>
               <w:rPr>
                 <w:rStyle w:val="IndexLink"/>
@@ -451,7 +451,7 @@
             </w:tabs>
             <w:rPr/>
           </w:pPr>
-          <w:hyperlink w:anchor="__RefHeading___Toc8150_602959473" w:tooltip="5.1 Tag fields">
+          <w:hyperlink w:anchor="__RefHeading___Toc8158_2384007457" w:tooltip="5.1 Tag fields">
             <w:r>
               <w:rPr>
                 <w:rStyle w:val="IndexLink"/>
@@ -472,7 +472,7 @@
             </w:tabs>
             <w:rPr/>
           </w:pPr>
-          <w:hyperlink w:anchor="__RefHeading___Toc8152_602959473" w:tooltip="5.2 Alarms on a tag">
+          <w:hyperlink w:anchor="__RefHeading___Toc8160_2384007457" w:tooltip="5.2 Alarms on a tag">
             <w:r>
               <w:rPr>
                 <w:rStyle w:val="IndexLink"/>
@@ -493,7 +493,7 @@
             </w:tabs>
             <w:rPr/>
           </w:pPr>
-          <w:hyperlink w:anchor="__RefHeading___Toc8154_602959473" w:tooltip="5.3 Renaming, and finding and replacing tag references">
+          <w:hyperlink w:anchor="__RefHeading___Toc8162_2384007457" w:tooltip="5.3 Renaming, and finding and replacing tag references">
             <w:r>
               <w:rPr>
                 <w:rStyle w:val="IndexLink"/>
@@ -514,7 +514,7 @@
             </w:tabs>
             <w:rPr/>
           </w:pPr>
-          <w:hyperlink w:anchor="__RefHeading___Toc8156_602959473" w:tooltip="6 Screens and windows">
+          <w:hyperlink w:anchor="__RefHeading___Toc8164_2384007457" w:tooltip="6 Screens and windows">
             <w:r>
               <w:rPr>
                 <w:rStyle w:val="IndexLink"/>
@@ -535,7 +535,7 @@
             </w:tabs>
             <w:rPr/>
           </w:pPr>
-          <w:hyperlink w:anchor="__RefHeading___Toc8158_602959473" w:tooltip="6.1 Window properties">
+          <w:hyperlink w:anchor="__RefHeading___Toc8166_2384007457" w:tooltip="6.1 Window properties">
             <w:r>
               <w:rPr>
                 <w:rStyle w:val="IndexLink"/>
@@ -556,7 +556,7 @@
             </w:tabs>
             <w:rPr/>
           </w:pPr>
-          <w:hyperlink w:anchor="__RefHeading___Toc8160_602959473" w:tooltip="6.2 The header, the navigation bar and the screens">
+          <w:hyperlink w:anchor="__RefHeading___Toc8168_2384007457" w:tooltip="6.2 The header, the navigation bar and the screens">
             <w:r>
               <w:rPr>
                 <w:rStyle w:val="IndexLink"/>
@@ -577,7 +577,7 @@
             </w:tabs>
             <w:rPr/>
           </w:pPr>
-          <w:hyperlink w:anchor="__RefHeading___Toc8162_602959473" w:tooltip="7 Drawing objects">
+          <w:hyperlink w:anchor="__RefHeading___Toc8170_2384007457" w:tooltip="7 Drawing objects">
             <w:r>
               <w:rPr>
                 <w:rStyle w:val="IndexLink"/>
@@ -598,7 +598,7 @@
             </w:tabs>
             <w:rPr/>
           </w:pPr>
-          <w:hyperlink w:anchor="__RefHeading___Toc8164_602959473" w:tooltip="8 Animation links">
+          <w:hyperlink w:anchor="__RefHeading___Toc8172_2384007457" w:tooltip="8 Animation links">
             <w:r>
               <w:rPr>
                 <w:rStyle w:val="IndexLink"/>
@@ -619,7 +619,7 @@
             </w:tabs>
             <w:rPr/>
           </w:pPr>
-          <w:hyperlink w:anchor="__RefHeading___Toc8166_602959473" w:tooltip="8.1 A valve: status color, fault blink and faceplate">
+          <w:hyperlink w:anchor="__RefHeading___Toc8174_2384007457" w:tooltip="8.1 A valve: status color, fault blink and faceplate">
             <w:r>
               <w:rPr>
                 <w:rStyle w:val="IndexLink"/>
@@ -640,7 +640,7 @@
             </w:tabs>
             <w:rPr/>
           </w:pPr>
-          <w:hyperlink w:anchor="__RefHeading___Toc8168_602959473" w:tooltip="8.2 The weigh hopper: percent fill">
+          <w:hyperlink w:anchor="__RefHeading___Toc8176_2384007457" w:tooltip="8.2 The weigh hopper: percent fill">
             <w:r>
               <w:rPr>
                 <w:rStyle w:val="IndexLink"/>
@@ -661,7 +661,7 @@
             </w:tabs>
             <w:rPr/>
           </w:pPr>
-          <w:hyperlink w:anchor="__RefHeading___Toc8170_602959473" w:tooltip="8.3 Hopper pressure: value display and alarm colors">
+          <w:hyperlink w:anchor="__RefHeading___Toc8178_2384007457" w:tooltip="8.3 Hopper pressure: value display and alarm colors">
             <w:r>
               <w:rPr>
                 <w:rStyle w:val="IndexLink"/>
@@ -682,7 +682,7 @@
             </w:tabs>
             <w:rPr/>
           </w:pPr>
-          <w:hyperlink w:anchor="__RefHeading___Toc8172_602959473" w:tooltip="8.4 Setpoints: user input">
+          <w:hyperlink w:anchor="__RefHeading___Toc8180_2384007457" w:tooltip="8.4 Setpoints: user input">
             <w:r>
               <w:rPr>
                 <w:rStyle w:val="IndexLink"/>
@@ -703,7 +703,7 @@
             </w:tabs>
             <w:rPr/>
           </w:pPr>
-          <w:hyperlink w:anchor="__RefHeading___Toc8174_602959473" w:tooltip="8.5 Commands: pushbutton and enable">
+          <w:hyperlink w:anchor="__RefHeading___Toc8182_2384007457" w:tooltip="8.5 Commands: pushbutton and enable">
             <w:r>
               <w:rPr>
                 <w:rStyle w:val="IndexLink"/>
@@ -724,7 +724,7 @@
             </w:tabs>
             <w:rPr/>
           </w:pPr>
-          <w:hyperlink w:anchor="__RefHeading___Toc8176_602959473" w:tooltip="9 Expressions and scripts">
+          <w:hyperlink w:anchor="__RefHeading___Toc8184_2384007457" w:tooltip="9 Expressions and scripts">
             <w:r>
               <w:rPr>
                 <w:rStyle w:val="IndexLink"/>
@@ -745,7 +745,7 @@
             </w:tabs>
             <w:rPr/>
           </w:pPr>
-          <w:hyperlink w:anchor="__RefHeading___Toc8178_602959473" w:tooltip="9.1 Window and application scripts">
+          <w:hyperlink w:anchor="__RefHeading___Toc8186_2384007457" w:tooltip="9.1 Window and application scripts">
             <w:r>
               <w:rPr>
                 <w:rStyle w:val="IndexLink"/>
@@ -753,7 +753,7 @@
               </w:rPr>
               <w:t>9.1 Window and application scripts</w:t>
               <w:tab/>
-              <w:t>33</w:t>
+              <w:t>32</w:t>
             </w:r>
           </w:hyperlink>
         </w:p>
@@ -766,7 +766,7 @@
             </w:tabs>
             <w:rPr/>
           </w:pPr>
-          <w:hyperlink w:anchor="__RefHeading___Toc8180_602959473" w:tooltip="9.2 Action scripts">
+          <w:hyperlink w:anchor="__RefHeading___Toc8188_2384007457" w:tooltip="9.2 Action scripts">
             <w:r>
               <w:rPr>
                 <w:rStyle w:val="IndexLink"/>
@@ -774,7 +774,7 @@
               </w:rPr>
               <w:t>9.2 Action scripts</w:t>
               <w:tab/>
-              <w:t>37</w:t>
+              <w:t>36</w:t>
             </w:r>
           </w:hyperlink>
         </w:p>
@@ -787,7 +787,7 @@
             </w:tabs>
             <w:rPr/>
           </w:pPr>
-          <w:hyperlink w:anchor="__RefHeading___Toc8182_602959473" w:tooltip="9.3 Function reference">
+          <w:hyperlink w:anchor="__RefHeading___Toc8190_2384007457" w:tooltip="9.3 Function reference">
             <w:r>
               <w:rPr>
                 <w:rStyle w:val="IndexLink"/>
@@ -795,7 +795,7 @@
               </w:rPr>
               <w:t>9.3 Function reference</w:t>
               <w:tab/>
-              <w:t>38</w:t>
+              <w:t>37</w:t>
             </w:r>
           </w:hyperlink>
         </w:p>
@@ -808,7 +808,7 @@
             </w:tabs>
             <w:rPr/>
           </w:pPr>
-          <w:hyperlink w:anchor="__RefHeading___Toc8184_602959473" w:tooltip="9.4 Indirect tags: one faceplate for every device">
+          <w:hyperlink w:anchor="__RefHeading___Toc8192_2384007457" w:tooltip="9.4 Indirect tags: one faceplate for every device">
             <w:r>
               <w:rPr>
                 <w:rStyle w:val="IndexLink"/>
@@ -816,7 +816,7 @@
               </w:rPr>
               <w:t>9.4 Indirect tags: one faceplate for every device</w:t>
               <w:tab/>
-              <w:t>44</w:t>
+              <w:t>43</w:t>
             </w:r>
           </w:hyperlink>
         </w:p>
@@ -829,7 +829,7 @@
             </w:tabs>
             <w:rPr/>
           </w:pPr>
-          <w:hyperlink w:anchor="__RefHeading___Toc8186_602959473" w:tooltip="9.5 Opening windows from scripts: ShowWindow">
+          <w:hyperlink w:anchor="__RefHeading___Toc8194_2384007457" w:tooltip="9.5 Opening windows from scripts: ShowWindow">
             <w:r>
               <w:rPr>
                 <w:rStyle w:val="IndexLink"/>
@@ -837,7 +837,7 @@
               </w:rPr>
               <w:t>9.5 Opening windows from scripts: ShowWindow</w:t>
               <w:tab/>
-              <w:t>46</w:t>
+              <w:t>45</w:t>
             </w:r>
           </w:hyperlink>
         </w:p>
@@ -850,7 +850,7 @@
             </w:tabs>
             <w:rPr/>
           </w:pPr>
-          <w:hyperlink w:anchor="__RefHeading___Toc8188_602959473" w:tooltip="9.6 Saving the screen as a PDF: ScreenToPDF">
+          <w:hyperlink w:anchor="__RefHeading___Toc8196_2384007457" w:tooltip="9.6 Saving the screen as a PDF: ScreenToPDF">
             <w:r>
               <w:rPr>
                 <w:rStyle w:val="IndexLink"/>
@@ -858,7 +858,7 @@
               </w:rPr>
               <w:t>9.6 Saving the screen as a PDF: ScreenToPDF</w:t>
               <w:tab/>
-              <w:t>49</w:t>
+              <w:t>48</w:t>
             </w:r>
           </w:hyperlink>
         </w:p>
@@ -871,7 +871,7 @@
             </w:tabs>
             <w:rPr/>
           </w:pPr>
-          <w:hyperlink w:anchor="__RefHeading___Toc8190_602959473" w:tooltip="9.7 Local variables: DIM">
+          <w:hyperlink w:anchor="__RefHeading___Toc8198_2384007457" w:tooltip="9.7 Local variables: DIM">
             <w:r>
               <w:rPr>
                 <w:rStyle w:val="IndexLink"/>
@@ -879,7 +879,7 @@
               </w:rPr>
               <w:t>9.7 Local variables: DIM</w:t>
               <w:tab/>
-              <w:t>50</w:t>
+              <w:t>49</w:t>
             </w:r>
           </w:hyperlink>
         </w:p>
@@ -892,7 +892,7 @@
             </w:tabs>
             <w:rPr/>
           </w:pPr>
-          <w:hyperlink w:anchor="__RefHeading___Toc8192_602959473" w:tooltip="9.8 QuickFunctions">
+          <w:hyperlink w:anchor="__RefHeading___Toc8200_2384007457" w:tooltip="9.8 QuickFunctions">
             <w:r>
               <w:rPr>
                 <w:rStyle w:val="IndexLink"/>
@@ -900,7 +900,7 @@
               </w:rPr>
               <w:t>9.8 QuickFunctions</w:t>
               <w:tab/>
-              <w:t>51</w:t>
+              <w:t>50</w:t>
             </w:r>
           </w:hyperlink>
         </w:p>
@@ -913,7 +913,7 @@
             </w:tabs>
             <w:rPr/>
           </w:pPr>
-          <w:hyperlink w:anchor="__RefHeading___Toc8194_602959473" w:tooltip="10 Alarms and security">
+          <w:hyperlink w:anchor="__RefHeading___Toc8202_2384007457" w:tooltip="10 Alarms and security">
             <w:r>
               <w:rPr>
                 <w:rStyle w:val="IndexLink"/>
@@ -921,7 +921,7 @@
               </w:rPr>
               <w:t>10 Alarms and security</w:t>
               <w:tab/>
-              <w:t>53</w:t>
+              <w:t>52</w:t>
             </w:r>
           </w:hyperlink>
         </w:p>
@@ -934,7 +934,7 @@
             </w:tabs>
             <w:rPr/>
           </w:pPr>
-          <w:hyperlink w:anchor="__RefHeading___Toc8196_602959473" w:tooltip="10.1 Alarms">
+          <w:hyperlink w:anchor="__RefHeading___Toc8204_2384007457" w:tooltip="10.1 Alarms">
             <w:r>
               <w:rPr>
                 <w:rStyle w:val="IndexLink"/>
@@ -942,7 +942,7 @@
               </w:rPr>
               <w:t>10.1 Alarms</w:t>
               <w:tab/>
-              <w:t>53</w:t>
+              <w:t>52</w:t>
             </w:r>
           </w:hyperlink>
         </w:p>
@@ -955,7 +955,7 @@
             </w:tabs>
             <w:rPr/>
           </w:pPr>
-          <w:hyperlink w:anchor="__RefHeading___Toc8198_602959473" w:tooltip="10.2 Users and access levels">
+          <w:hyperlink w:anchor="__RefHeading___Toc8206_2384007457" w:tooltip="10.2 Users and access levels">
             <w:r>
               <w:rPr>
                 <w:rStyle w:val="IndexLink"/>
@@ -963,7 +963,7 @@
               </w:rPr>
               <w:t>10.2 Users and access levels</w:t>
               <w:tab/>
-              <w:t>54</w:t>
+              <w:t>53</w:t>
             </w:r>
           </w:hyperlink>
         </w:p>
@@ -976,7 +976,7 @@
             </w:tabs>
             <w:rPr/>
           </w:pPr>
-          <w:hyperlink w:anchor="__RefHeading___Toc8200_602959473" w:tooltip="11 Recipes">
+          <w:hyperlink w:anchor="__RefHeading___Toc8208_2384007457" w:tooltip="11 Recipes">
             <w:r>
               <w:rPr>
                 <w:rStyle w:val="IndexLink"/>
@@ -984,7 +984,7 @@
               </w:rPr>
               <w:t>11 Recipes</w:t>
               <w:tab/>
-              <w:t>55</w:t>
+              <w:t>54</w:t>
             </w:r>
           </w:hyperlink>
         </w:p>
@@ -997,7 +997,7 @@
             </w:tabs>
             <w:rPr/>
           </w:pPr>
-          <w:hyperlink w:anchor="__RefHeading___Toc8202_602959473" w:tooltip="11.1 Recipe books">
+          <w:hyperlink w:anchor="__RefHeading___Toc8210_2384007457" w:tooltip="11.1 Recipe books">
             <w:r>
               <w:rPr>
                 <w:rStyle w:val="IndexLink"/>
@@ -1005,7 +1005,7 @@
               </w:rPr>
               <w:t>11.1 Recipe books</w:t>
               <w:tab/>
-              <w:t>56</w:t>
+              <w:t>55</w:t>
             </w:r>
           </w:hyperlink>
         </w:p>
@@ -1018,7 +1018,7 @@
             </w:tabs>
             <w:rPr/>
           </w:pPr>
-          <w:hyperlink w:anchor="__RefHeading___Toc8204_602959473" w:tooltip="11.2 The Recipes screen">
+          <w:hyperlink w:anchor="__RefHeading___Toc8212_2384007457" w:tooltip="11.2 The Recipes screen">
             <w:r>
               <w:rPr>
                 <w:rStyle w:val="IndexLink"/>
@@ -1026,7 +1026,7 @@
               </w:rPr>
               <w:t>11.2 The Recipes screen</w:t>
               <w:tab/>
-              <w:t>58</w:t>
+              <w:t>57</w:t>
             </w:r>
           </w:hyperlink>
         </w:p>
@@ -1039,7 +1039,7 @@
             </w:tabs>
             <w:rPr/>
           </w:pPr>
-          <w:hyperlink w:anchor="__RefHeading___Toc8206_602959473" w:tooltip="11.3 The Recipe List object">
+          <w:hyperlink w:anchor="__RefHeading___Toc8214_2384007457" w:tooltip="11.3 The Recipe List object">
             <w:r>
               <w:rPr>
                 <w:rStyle w:val="IndexLink"/>
@@ -1047,7 +1047,7 @@
               </w:rPr>
               <w:t>11.3 The Recipe List object</w:t>
               <w:tab/>
-              <w:t>60</w:t>
+              <w:t>59</w:t>
             </w:r>
           </w:hyperlink>
         </w:p>
@@ -1060,7 +1060,7 @@
             </w:tabs>
             <w:rPr/>
           </w:pPr>
-          <w:hyperlink w:anchor="__RefHeading___Toc8208_602959473" w:tooltip="11.4 Selecting a recipe in a window">
+          <w:hyperlink w:anchor="__RefHeading___Toc8216_2384007457" w:tooltip="11.4 Selecting a recipe in a window">
             <w:r>
               <w:rPr>
                 <w:rStyle w:val="IndexLink"/>
@@ -1068,7 +1068,7 @@
               </w:rPr>
               <w:t>11.4 Selecting a recipe in a window</w:t>
               <w:tab/>
-              <w:t>61</w:t>
+              <w:t>60</w:t>
             </w:r>
           </w:hyperlink>
         </w:p>
@@ -1081,7 +1081,7 @@
             </w:tabs>
             <w:rPr/>
           </w:pPr>
-          <w:hyperlink w:anchor="__RefHeading___Toc8210_602959473" w:tooltip="11.5 When a recipe function fails">
+          <w:hyperlink w:anchor="__RefHeading___Toc8218_2384007457" w:tooltip="11.5 When a recipe function fails">
             <w:r>
               <w:rPr>
                 <w:rStyle w:val="IndexLink"/>
@@ -1089,7 +1089,7 @@
               </w:rPr>
               <w:t>11.5 When a recipe function fails</w:t>
               <w:tab/>
-              <w:t>62</w:t>
+              <w:t>61</w:t>
             </w:r>
           </w:hyperlink>
         </w:p>
@@ -1102,7 +1102,7 @@
             </w:tabs>
             <w:rPr/>
           </w:pPr>
-          <w:hyperlink w:anchor="__RefHeading___Toc8212_602959473" w:tooltip="11.6 Where recipes are kept">
+          <w:hyperlink w:anchor="__RefHeading___Toc8220_2384007457" w:tooltip="11.6 Where recipes are kept">
             <w:r>
               <w:rPr>
                 <w:rStyle w:val="IndexLink"/>
@@ -1110,7 +1110,7 @@
               </w:rPr>
               <w:t>11.6 Where recipes are kept</w:t>
               <w:tab/>
-              <w:t>63</w:t>
+              <w:t>62</w:t>
             </w:r>
           </w:hyperlink>
         </w:p>
@@ -1123,7 +1123,7 @@
             </w:tabs>
             <w:rPr/>
           </w:pPr>
-          <w:hyperlink w:anchor="__RefHeading___Toc8214_602959473" w:tooltip="12 Trends">
+          <w:hyperlink w:anchor="__RefHeading___Toc8222_2384007457" w:tooltip="12 Trends">
             <w:r>
               <w:rPr>
                 <w:rStyle w:val="IndexLink"/>
@@ -1131,7 +1131,7 @@
               </w:rPr>
               <w:t>12 Trends</w:t>
               <w:tab/>
-              <w:t>63</w:t>
+              <w:t>62</w:t>
             </w:r>
           </w:hyperlink>
         </w:p>
@@ -1144,7 +1144,7 @@
             </w:tabs>
             <w:rPr/>
           </w:pPr>
-          <w:hyperlink w:anchor="__RefHeading___Toc8216_602959473" w:tooltip="12.1 The Trend object">
+          <w:hyperlink w:anchor="__RefHeading___Toc8224_2384007457" w:tooltip="12.1 The Trend object">
             <w:r>
               <w:rPr>
                 <w:rStyle w:val="IndexLink"/>
@@ -1152,7 +1152,7 @@
               </w:rPr>
               <w:t>12.1 The Trend object</w:t>
               <w:tab/>
-              <w:t>63</w:t>
+              <w:t>62</w:t>
             </w:r>
           </w:hyperlink>
         </w:p>
@@ -1165,7 +1165,7 @@
             </w:tabs>
             <w:rPr/>
           </w:pPr>
-          <w:hyperlink w:anchor="__RefHeading___Toc8218_602959473" w:tooltip="12.2 Pens and their ranges">
+          <w:hyperlink w:anchor="__RefHeading___Toc8226_2384007457" w:tooltip="12.2 Pens and their ranges">
             <w:r>
               <w:rPr>
                 <w:rStyle w:val="IndexLink"/>
@@ -1173,7 +1173,7 @@
               </w:rPr>
               <w:t>12.2 Pens and their ranges</w:t>
               <w:tab/>
-              <w:t>65</w:t>
+              <w:t>64</w:t>
             </w:r>
           </w:hyperlink>
         </w:p>
@@ -1186,7 +1186,7 @@
             </w:tabs>
             <w:rPr/>
           </w:pPr>
-          <w:hyperlink w:anchor="__RefHeading___Toc8220_602959473" w:tooltip="12.3 The Trends screen">
+          <w:hyperlink w:anchor="__RefHeading___Toc8228_2384007457" w:tooltip="12.3 The Trends screen">
             <w:r>
               <w:rPr>
                 <w:rStyle w:val="IndexLink"/>
@@ -1194,7 +1194,7 @@
               </w:rPr>
               <w:t>12.3 The Trends screen</w:t>
               <w:tab/>
-              <w:t>66</w:t>
+              <w:t>65</w:t>
             </w:r>
           </w:hyperlink>
         </w:p>
@@ -1207,7 +1207,7 @@
             </w:tabs>
             <w:rPr/>
           </w:pPr>
-          <w:hyperlink w:anchor="__RefHeading___Toc8222_602959473" w:tooltip="12.4 Scrolling through the history">
+          <w:hyperlink w:anchor="__RefHeading___Toc8230_2384007457" w:tooltip="12.4 Scrolling through the history">
             <w:r>
               <w:rPr>
                 <w:rStyle w:val="IndexLink"/>
@@ -1215,7 +1215,7 @@
               </w:rPr>
               <w:t>12.4 Scrolling through the history</w:t>
               <w:tab/>
-              <w:t>67</w:t>
+              <w:t>66</w:t>
             </w:r>
           </w:hyperlink>
         </w:p>
@@ -1228,7 +1228,7 @@
             </w:tabs>
             <w:rPr/>
           </w:pPr>
-          <w:hyperlink w:anchor="__RefHeading___Toc8224_602959473" w:tooltip="12.5 Recording and where the history is kept">
+          <w:hyperlink w:anchor="__RefHeading___Toc8232_2384007457" w:tooltip="12.5 Recording and where the history is kept">
             <w:r>
               <w:rPr>
                 <w:rStyle w:val="IndexLink"/>
@@ -1236,7 +1236,7 @@
               </w:rPr>
               <w:t>12.5 Recording and where the history is kept</w:t>
               <w:tab/>
-              <w:t>68</w:t>
+              <w:t>67</w:t>
             </w:r>
           </w:hyperlink>
         </w:p>
@@ -1249,7 +1249,7 @@
             </w:tabs>
             <w:rPr/>
           </w:pPr>
-          <w:hyperlink w:anchor="__RefHeading___Toc8226_602959473" w:tooltip="13 Databases">
+          <w:hyperlink w:anchor="__RefHeading___Toc8234_2384007457" w:tooltip="13 Databases">
             <w:r>
               <w:rPr>
                 <w:rStyle w:val="IndexLink"/>
@@ -1257,7 +1257,7 @@
               </w:rPr>
               <w:t>13 Databases</w:t>
               <w:tab/>
-              <w:t>69</w:t>
+              <w:t>68</w:t>
             </w:r>
           </w:hyperlink>
         </w:p>
@@ -1270,7 +1270,7 @@
             </w:tabs>
             <w:rPr/>
           </w:pPr>
-          <w:hyperlink w:anchor="__RefHeading___Toc8228_602959473" w:tooltip="13.1 Data sources">
+          <w:hyperlink w:anchor="__RefHeading___Toc8236_2384007457" w:tooltip="13.1 Data sources">
             <w:r>
               <w:rPr>
                 <w:rStyle w:val="IndexLink"/>
@@ -1278,7 +1278,7 @@
               </w:rPr>
               <w:t>13.1 Data sources</w:t>
               <w:tab/>
-              <w:t>70</w:t>
+              <w:t>69</w:t>
             </w:r>
           </w:hyperlink>
         </w:p>
@@ -1291,7 +1291,7 @@
             </w:tabs>
             <w:rPr/>
           </w:pPr>
-          <w:hyperlink w:anchor="__RefHeading___Toc8230_602959473" w:tooltip="13.2 Bind lists">
+          <w:hyperlink w:anchor="__RefHeading___Toc8238_2384007457" w:tooltip="13.2 Bind lists">
             <w:r>
               <w:rPr>
                 <w:rStyle w:val="IndexLink"/>
@@ -1299,7 +1299,7 @@
               </w:rPr>
               <w:t>13.2 Bind lists</w:t>
               <w:tab/>
-              <w:t>71</w:t>
+              <w:t>70</w:t>
             </w:r>
           </w:hyperlink>
         </w:p>
@@ -1312,7 +1312,7 @@
             </w:tabs>
             <w:rPr/>
           </w:pPr>
-          <w:hyperlink w:anchor="__RefHeading___Toc8232_602959473" w:tooltip="13.3 Table templates and queries">
+          <w:hyperlink w:anchor="__RefHeading___Toc8240_2384007457" w:tooltip="13.3 Table templates and queries">
             <w:r>
               <w:rPr>
                 <w:rStyle w:val="IndexLink"/>
@@ -1320,7 +1320,7 @@
               </w:rPr>
               <w:t>13.3 Table templates and queries</w:t>
               <w:tab/>
-              <w:t>72</w:t>
+              <w:t>71</w:t>
             </w:r>
           </w:hyperlink>
         </w:p>
@@ -1333,7 +1333,7 @@
             </w:tabs>
             <w:rPr/>
           </w:pPr>
-          <w:hyperlink w:anchor="__RefHeading___Toc8234_602959473" w:tooltip="13.4 The script functions">
+          <w:hyperlink w:anchor="__RefHeading___Toc8242_2384007457" w:tooltip="13.4 The script functions">
             <w:r>
               <w:rPr>
                 <w:rStyle w:val="IndexLink"/>
@@ -1341,7 +1341,7 @@
               </w:rPr>
               <w:t>13.4 The script functions</w:t>
               <w:tab/>
-              <w:t>73</w:t>
+              <w:t>72</w:t>
             </w:r>
           </w:hyperlink>
         </w:p>
@@ -1354,7 +1354,7 @@
             </w:tabs>
             <w:rPr/>
           </w:pPr>
-          <w:hyperlink w:anchor="__RefHeading___Toc8236_602959473" w:tooltip="13.5 The batch log in LiquidWeighHMI">
+          <w:hyperlink w:anchor="__RefHeading___Toc8244_2384007457" w:tooltip="13.5 The batch log in LiquidWeighHMI">
             <w:r>
               <w:rPr>
                 <w:rStyle w:val="IndexLink"/>
@@ -1362,7 +1362,7 @@
               </w:rPr>
               <w:t>13.5 The batch log in LiquidWeighHMI</w:t>
               <w:tab/>
-              <w:t>75</w:t>
+              <w:t>74</w:t>
             </w:r>
           </w:hyperlink>
         </w:p>
@@ -1375,7 +1375,7 @@
             </w:tabs>
             <w:rPr/>
           </w:pPr>
-          <w:hyperlink w:anchor="__RefHeading___Toc8238_602959473" w:tooltip="13.6 Where the rows are kept">
+          <w:hyperlink w:anchor="__RefHeading___Toc8246_2384007457" w:tooltip="13.6 Where the rows are kept">
             <w:r>
               <w:rPr>
                 <w:rStyle w:val="IndexLink"/>
@@ -1383,7 +1383,7 @@
               </w:rPr>
               <w:t>13.6 Where the rows are kept</w:t>
               <w:tab/>
-              <w:t>76</w:t>
+              <w:t>75</w:t>
             </w:r>
           </w:hyperlink>
         </w:p>
@@ -1396,7 +1396,7 @@
             </w:tabs>
             <w:rPr/>
           </w:pPr>
-          <w:hyperlink w:anchor="__RefHeading___Toc8240_602959473" w:tooltip="14 List boxes">
+          <w:hyperlink w:anchor="__RefHeading___Toc8248_2384007457" w:tooltip="14 List boxes">
             <w:r>
               <w:rPr>
                 <w:rStyle w:val="IndexLink"/>
@@ -1404,7 +1404,7 @@
               </w:rPr>
               <w:t>14 List boxes</w:t>
               <w:tab/>
-              <w:t>77</w:t>
+              <w:t>76</w:t>
             </w:r>
           </w:hyperlink>
         </w:p>
@@ -1417,7 +1417,7 @@
             </w:tabs>
             <w:rPr/>
           </w:pPr>
-          <w:hyperlink w:anchor="__RefHeading___Toc8242_602959473" w:tooltip="14.1 The List Box object">
+          <w:hyperlink w:anchor="__RefHeading___Toc8250_2384007457" w:tooltip="14.1 The List Box object">
             <w:r>
               <w:rPr>
                 <w:rStyle w:val="IndexLink"/>
@@ -1425,7 +1425,7 @@
               </w:rPr>
               <w:t>14.1 The List Box object</w:t>
               <w:tab/>
-              <w:t>77</w:t>
+              <w:t>76</w:t>
             </w:r>
           </w:hyperlink>
         </w:p>
@@ -1438,7 +1438,7 @@
             </w:tabs>
             <w:rPr/>
           </w:pPr>
-          <w:hyperlink w:anchor="__RefHeading___Toc8244_602959473" w:tooltip="14.2 Filling and working the list from scripts">
+          <w:hyperlink w:anchor="__RefHeading___Toc8252_2384007457" w:tooltip="14.2 Filling and working the list from scripts">
             <w:r>
               <w:rPr>
                 <w:rStyle w:val="IndexLink"/>
@@ -1446,7 +1446,7 @@
               </w:rPr>
               <w:t>14.2 Filling and working the list from scripts</w:t>
               <w:tab/>
-              <w:t>80</w:t>
+              <w:t>79</w:t>
             </w:r>
           </w:hyperlink>
         </w:p>
@@ -1459,7 +1459,7 @@
             </w:tabs>
             <w:rPr/>
           </w:pPr>
-          <w:hyperlink w:anchor="__RefHeading___Toc8246_602959473" w:tooltip="14.3 The list belongs to the application, not to a window">
+          <w:hyperlink w:anchor="__RefHeading___Toc8254_2384007457" w:tooltip="14.3 The list belongs to the application, not to a window">
             <w:r>
               <w:rPr>
                 <w:rStyle w:val="IndexLink"/>
@@ -1467,7 +1467,7 @@
               </w:rPr>
               <w:t>14.3 The list belongs to the application, not to a window</w:t>
               <w:tab/>
-              <w:t>81</w:t>
+              <w:t>80</w:t>
             </w:r>
           </w:hyperlink>
         </w:p>
@@ -1480,7 +1480,7 @@
             </w:tabs>
             <w:rPr/>
           </w:pPr>
-          <w:hyperlink w:anchor="__RefHeading___Toc8248_602959473" w:tooltip="14.4 A list filled from a database">
+          <w:hyperlink w:anchor="__RefHeading___Toc8256_2384007457" w:tooltip="14.4 A list filled from a database">
             <w:r>
               <w:rPr>
                 <w:rStyle w:val="IndexLink"/>
@@ -1488,7 +1488,7 @@
               </w:rPr>
               <w:t>14.4 A list filled from a database</w:t>
               <w:tab/>
-              <w:t>81</w:t>
+              <w:t>80</w:t>
             </w:r>
           </w:hyperlink>
         </w:p>
@@ -1501,7 +1501,7 @@
             </w:tabs>
             <w:rPr/>
           </w:pPr>
-          <w:hyperlink w:anchor="__RefHeading___Toc8250_602959473" w:tooltip="15 Testing">
+          <w:hyperlink w:anchor="__RefHeading___Toc8258_2384007457" w:tooltip="15 Testing">
             <w:r>
               <w:rPr>
                 <w:rStyle w:val="IndexLink"/>
@@ -1509,7 +1509,7 @@
               </w:rPr>
               <w:t>15 Testing</w:t>
               <w:tab/>
-              <w:t>82</w:t>
+              <w:t>81</w:t>
             </w:r>
           </w:hyperlink>
         </w:p>
@@ -1522,7 +1522,7 @@
             </w:tabs>
             <w:rPr/>
           </w:pPr>
-          <w:hyperlink w:anchor="__RefHeading___Toc8252_602959473" w:tooltip="15.1 Validate">
+          <w:hyperlink w:anchor="__RefHeading___Toc8260_2384007457" w:tooltip="15.1 Validate">
             <w:r>
               <w:rPr>
                 <w:rStyle w:val="IndexLink"/>
@@ -1530,7 +1530,7 @@
               </w:rPr>
               <w:t>15.1 Validate</w:t>
               <w:tab/>
-              <w:t>82</w:t>
+              <w:t>81</w:t>
             </w:r>
           </w:hyperlink>
         </w:p>
@@ -1543,7 +1543,7 @@
             </w:tabs>
             <w:rPr/>
           </w:pPr>
-          <w:hyperlink w:anchor="__RefHeading___Toc8254_602959473" w:tooltip="15.2 Run">
+          <w:hyperlink w:anchor="__RefHeading___Toc8262_2384007457" w:tooltip="15.2 Run">
             <w:r>
               <w:rPr>
                 <w:rStyle w:val="IndexLink"/>
@@ -1551,7 +1551,7 @@
               </w:rPr>
               <w:t>15.2 Run</w:t>
               <w:tab/>
-              <w:t>83</w:t>
+              <w:t>82</w:t>
             </w:r>
           </w:hyperlink>
         </w:p>
@@ -1564,7 +1564,7 @@
             </w:tabs>
             <w:rPr/>
           </w:pPr>
-          <w:hyperlink w:anchor="__RefHeading___Toc8256_602959473" w:tooltip="16 Deploying">
+          <w:hyperlink w:anchor="__RefHeading___Toc8264_2384007457" w:tooltip="16 Deploying">
             <w:r>
               <w:rPr>
                 <w:rStyle w:val="IndexLink"/>
@@ -1572,7 +1572,7 @@
               </w:rPr>
               <w:t>16 Deploying</w:t>
               <w:tab/>
-              <w:t>87</w:t>
+              <w:t>86</w:t>
             </w:r>
           </w:hyperlink>
         </w:p>
@@ -1585,7 +1585,7 @@
             </w:tabs>
             <w:rPr/>
           </w:pPr>
-          <w:hyperlink w:anchor="__RefHeading___Toc8258_602959473" w:tooltip="16.1 Publish">
+          <w:hyperlink w:anchor="__RefHeading___Toc8266_2384007457" w:tooltip="16.1 Publish">
             <w:r>
               <w:rPr>
                 <w:rStyle w:val="IndexLink"/>
@@ -1593,7 +1593,7 @@
               </w:rPr>
               <w:t>16.1 Publish</w:t>
               <w:tab/>
-              <w:t>88</w:t>
+              <w:t>87</w:t>
             </w:r>
           </w:hyperlink>
         </w:p>
@@ -1606,7 +1606,7 @@
             </w:tabs>
             <w:rPr/>
           </w:pPr>
-          <w:hyperlink w:anchor="__RefHeading___Toc8260_602959473" w:tooltip="16.2 Append HMI Desktop">
+          <w:hyperlink w:anchor="__RefHeading___Toc8268_2384007457" w:tooltip="16.2 Append HMI Desktop">
             <w:r>
               <w:rPr>
                 <w:rStyle w:val="IndexLink"/>
@@ -1614,7 +1614,7 @@
               </w:rPr>
               <w:t>16.2 Append HMI Desktop</w:t>
               <w:tab/>
-              <w:t>89</w:t>
+              <w:t>88</w:t>
             </w:r>
           </w:hyperlink>
         </w:p>
@@ -1627,7 +1627,7 @@
             </w:tabs>
             <w:rPr/>
           </w:pPr>
-          <w:hyperlink w:anchor="__RefHeading___Toc8262_602959473" w:tooltip="16.3 Append HMI Web">
+          <w:hyperlink w:anchor="__RefHeading___Toc8270_2384007457" w:tooltip="16.3 Append HMI Web">
             <w:r>
               <w:rPr>
                 <w:rStyle w:val="IndexLink"/>
@@ -1635,7 +1635,7 @@
               </w:rPr>
               <w:t>16.3 Append HMI Web</w:t>
               <w:tab/>
-              <w:t>89</w:t>
+              <w:t>88</w:t>
             </w:r>
           </w:hyperlink>
         </w:p>
@@ -1648,7 +1648,7 @@
             </w:tabs>
             <w:rPr/>
           </w:pPr>
-          <w:hyperlink w:anchor="__RefHeading___Toc8264_602959473" w:tooltip="17 Tips and troubleshooting">
+          <w:hyperlink w:anchor="__RefHeading___Toc8272_2384007457" w:tooltip="17 Tips and troubleshooting">
             <w:r>
               <w:rPr>
                 <w:rStyle w:val="IndexLink"/>
@@ -1656,7 +1656,7 @@
               </w:rPr>
               <w:t>17 Tips and troubleshooting</w:t>
               <w:tab/>
-              <w:t>91</w:t>
+              <w:t>90</w:t>
             </w:r>
           </w:hyperlink>
         </w:p>
@@ -1669,7 +1669,7 @@
             </w:tabs>
             <w:rPr/>
           </w:pPr>
-          <w:hyperlink w:anchor="__RefHeading___Toc8266_602959473" w:tooltip="Appendix A Command-line automation">
+          <w:hyperlink w:anchor="__RefHeading___Toc8274_2384007457" w:tooltip="Appendix A Command-line automation">
             <w:r>
               <w:rPr>
                 <w:rStyle w:val="IndexLink"/>
@@ -1677,7 +1677,7 @@
               </w:rPr>
               <w:t>Appendix A Command-line automation</w:t>
               <w:tab/>
-              <w:t>92</w:t>
+              <w:t>91</w:t>
             </w:r>
           </w:hyperlink>
           <w:r>
@@ -1707,7 +1707,7 @@
         <w:spacing w:before="0" w:after="0"/>
         <w:rPr/>
       </w:pPr>
-      <w:bookmarkStart w:id="0" w:name="__RefHeading___Toc8134_602959473"/>
+      <w:bookmarkStart w:id="0" w:name="__RefHeading___Toc8142_2384007457"/>
       <w:bookmarkEnd w:id="0"/>
       <w:r>
         <w:rPr/>
@@ -2563,7 +2563,7 @@
         <w:pStyle w:val="Heading2"/>
         <w:rPr/>
       </w:pPr>
-      <w:bookmarkStart w:id="1" w:name="__RefHeading___Toc8136_602959473"/>
+      <w:bookmarkStart w:id="1" w:name="__RefHeading___Toc8144_2384007457"/>
       <w:bookmarkEnd w:id="1"/>
       <w:r>
         <w:rPr/>
@@ -3753,7 +3753,7 @@
         <w:pStyle w:val="Heading2"/>
         <w:rPr/>
       </w:pPr>
-      <w:bookmarkStart w:id="2" w:name="__RefHeading___Toc8138_602959473"/>
+      <w:bookmarkStart w:id="2" w:name="__RefHeading___Toc8146_2384007457"/>
       <w:bookmarkEnd w:id="2"/>
       <w:r>
         <w:rPr/>
@@ -3896,7 +3896,7 @@
         <w:pStyle w:val="Heading1"/>
         <w:rPr/>
       </w:pPr>
-      <w:bookmarkStart w:id="3" w:name="__RefHeading___Toc8140_602959473"/>
+      <w:bookmarkStart w:id="3" w:name="__RefHeading___Toc8148_2384007457"/>
       <w:bookmarkEnd w:id="3"/>
       <w:r>
         <w:rPr/>
@@ -4474,7 +4474,7 @@
         <w:pStyle w:val="Heading2"/>
         <w:rPr/>
       </w:pPr>
-      <w:bookmarkStart w:id="4" w:name="__RefHeading___Toc8142_602959473"/>
+      <w:bookmarkStart w:id="4" w:name="__RefHeading___Toc8150_2384007457"/>
       <w:bookmarkEnd w:id="4"/>
       <w:r>
         <w:rPr/>
@@ -4568,8 +4568,8 @@
         <w:tblLook w:val="04a0" w:noHBand="0" w:noVBand="1" w:firstColumn="1" w:lastRow="0" w:lastColumn="0" w:firstRow="1"/>
       </w:tblPr>
       <w:tblGrid>
-        <w:gridCol w:w="2702"/>
-        <w:gridCol w:w="6658"/>
+        <w:gridCol w:w="2482"/>
+        <w:gridCol w:w="6878"/>
       </w:tblGrid>
       <w:tr>
         <w:trPr>
@@ -4578,7 +4578,7 @@
         </w:trPr>
         <w:tc>
           <w:tcPr>
-            <w:tcW w:w="2702" w:type="dxa"/>
+            <w:tcW w:w="2482" w:type="dxa"/>
             <w:tcBorders/>
             <w:shd w:color="auto" w:fill="D9E2EC" w:val="clear"/>
           </w:tcPr>
@@ -4610,7 +4610,7 @@
         </w:tc>
         <w:tc>
           <w:tcPr>
-            <w:tcW w:w="6658" w:type="dxa"/>
+            <w:tcW w:w="6878" w:type="dxa"/>
             <w:tcBorders/>
             <w:shd w:color="auto" w:fill="D9E2EC" w:val="clear"/>
           </w:tcPr>
@@ -4647,7 +4647,7 @@
         </w:trPr>
         <w:tc>
           <w:tcPr>
-            <w:tcW w:w="2702" w:type="dxa"/>
+            <w:tcW w:w="2482" w:type="dxa"/>
             <w:tcBorders/>
           </w:tcPr>
           <w:p>
@@ -4678,7 +4678,7 @@
         </w:tc>
         <w:tc>
           <w:tcPr>
-            <w:tcW w:w="6658" w:type="dxa"/>
+            <w:tcW w:w="6878" w:type="dxa"/>
             <w:tcBorders/>
           </w:tcPr>
           <w:p>
@@ -4713,7 +4713,7 @@
         </w:trPr>
         <w:tc>
           <w:tcPr>
-            <w:tcW w:w="2702" w:type="dxa"/>
+            <w:tcW w:w="2482" w:type="dxa"/>
             <w:tcBorders/>
           </w:tcPr>
           <w:p>
@@ -4744,7 +4744,7 @@
         </w:tc>
         <w:tc>
           <w:tcPr>
-            <w:tcW w:w="6658" w:type="dxa"/>
+            <w:tcW w:w="6878" w:type="dxa"/>
             <w:tcBorders/>
           </w:tcPr>
           <w:p>
@@ -4779,7 +4779,7 @@
         </w:trPr>
         <w:tc>
           <w:tcPr>
-            <w:tcW w:w="2702" w:type="dxa"/>
+            <w:tcW w:w="2482" w:type="dxa"/>
             <w:tcBorders/>
           </w:tcPr>
           <w:p>
@@ -4810,7 +4810,7 @@
         </w:tc>
         <w:tc>
           <w:tcPr>
-            <w:tcW w:w="6658" w:type="dxa"/>
+            <w:tcW w:w="6878" w:type="dxa"/>
             <w:tcBorders/>
           </w:tcPr>
           <w:p>
@@ -4845,7 +4845,7 @@
         </w:trPr>
         <w:tc>
           <w:tcPr>
-            <w:tcW w:w="2702" w:type="dxa"/>
+            <w:tcW w:w="2482" w:type="dxa"/>
             <w:tcBorders/>
           </w:tcPr>
           <w:p>
@@ -4876,7 +4876,7 @@
         </w:tc>
         <w:tc>
           <w:tcPr>
-            <w:tcW w:w="6658" w:type="dxa"/>
+            <w:tcW w:w="6878" w:type="dxa"/>
             <w:tcBorders/>
           </w:tcPr>
           <w:p>
@@ -4911,7 +4911,7 @@
         </w:trPr>
         <w:tc>
           <w:tcPr>
-            <w:tcW w:w="2702" w:type="dxa"/>
+            <w:tcW w:w="2482" w:type="dxa"/>
             <w:tcBorders/>
           </w:tcPr>
           <w:p>
@@ -4942,31 +4942,31 @@
         </w:tc>
         <w:tc>
           <w:tcPr>
-            <w:tcW w:w="6658" w:type="dxa"/>
-            <w:tcBorders/>
-          </w:tcPr>
-          <w:p>
-            <w:pPr>
-              <w:pStyle w:val="Normal"/>
-              <w:widowControl/>
-              <w:spacing w:lineRule="auto" w:line="240" w:before="20" w:after="20"/>
-              <w:jc w:val="left"/>
-              <w:rPr>
-                <w:rFonts w:cs=""/>
-                <w:kern w:val="0"/>
-                <w:szCs w:val="22"/>
-                <w:lang w:val="en-US" w:eastAsia="en-US" w:bidi="ar-SA"/>
-              </w:rPr>
-            </w:pPr>
-            <w:r>
-              <w:rPr>
-                <w:rFonts w:cs=""/>
-                <w:kern w:val="0"/>
-                <w:sz w:val="20"/>
-                <w:szCs w:val="22"/>
-                <w:lang w:val="en-US" w:eastAsia="en-US" w:bidi="ar-SA"/>
-              </w:rPr>
-              <w:t>Target screen, start-up windows, runtime, security and application scripts (chapter 3)</w:t>
+            <w:tcW w:w="6878" w:type="dxa"/>
+            <w:tcBorders/>
+          </w:tcPr>
+          <w:p>
+            <w:pPr>
+              <w:pStyle w:val="Normal"/>
+              <w:widowControl/>
+              <w:spacing w:lineRule="auto" w:line="240" w:before="20" w:after="20"/>
+              <w:jc w:val="left"/>
+              <w:rPr>
+                <w:rFonts w:cs=""/>
+                <w:kern w:val="0"/>
+                <w:szCs w:val="22"/>
+                <w:lang w:val="en-US" w:eastAsia="en-US" w:bidi="ar-SA"/>
+              </w:rPr>
+            </w:pPr>
+            <w:r>
+              <w:rPr>
+                <w:rFonts w:cs=""/>
+                <w:kern w:val="0"/>
+                <w:sz w:val="20"/>
+                <w:szCs w:val="22"/>
+                <w:lang w:val="en-US" w:eastAsia="en-US" w:bidi="ar-SA"/>
+              </w:rPr>
+              <w:t>Target screen, start-up windows, touch color, runtime, security and application scripts (chapter 3)</w:t>
             </w:r>
           </w:p>
         </w:tc>
@@ -4977,7 +4977,7 @@
         </w:trPr>
         <w:tc>
           <w:tcPr>
-            <w:tcW w:w="2702" w:type="dxa"/>
+            <w:tcW w:w="2482" w:type="dxa"/>
             <w:tcBorders/>
           </w:tcPr>
           <w:p>
@@ -5008,7 +5008,7 @@
         </w:tc>
         <w:tc>
           <w:tcPr>
-            <w:tcW w:w="6658" w:type="dxa"/>
+            <w:tcW w:w="6878" w:type="dxa"/>
             <w:tcBorders/>
           </w:tcPr>
           <w:p>
@@ -5043,7 +5043,7 @@
         </w:trPr>
         <w:tc>
           <w:tcPr>
-            <w:tcW w:w="2702" w:type="dxa"/>
+            <w:tcW w:w="2482" w:type="dxa"/>
             <w:tcBorders/>
           </w:tcPr>
           <w:p>
@@ -5074,7 +5074,7 @@
         </w:tc>
         <w:tc>
           <w:tcPr>
-            <w:tcW w:w="6658" w:type="dxa"/>
+            <w:tcW w:w="6878" w:type="dxa"/>
             <w:tcBorders/>
           </w:tcPr>
           <w:p>
@@ -5109,7 +5109,7 @@
         </w:trPr>
         <w:tc>
           <w:tcPr>
-            <w:tcW w:w="2702" w:type="dxa"/>
+            <w:tcW w:w="2482" w:type="dxa"/>
             <w:tcBorders/>
           </w:tcPr>
           <w:p>
@@ -5140,7 +5140,7 @@
         </w:tc>
         <w:tc>
           <w:tcPr>
-            <w:tcW w:w="6658" w:type="dxa"/>
+            <w:tcW w:w="6878" w:type="dxa"/>
             <w:tcBorders/>
           </w:tcPr>
           <w:p>
@@ -5175,7 +5175,7 @@
         </w:trPr>
         <w:tc>
           <w:tcPr>
-            <w:tcW w:w="2702" w:type="dxa"/>
+            <w:tcW w:w="2482" w:type="dxa"/>
             <w:tcBorders/>
           </w:tcPr>
           <w:p>
@@ -5206,7 +5206,7 @@
         </w:tc>
         <w:tc>
           <w:tcPr>
-            <w:tcW w:w="6658" w:type="dxa"/>
+            <w:tcW w:w="6878" w:type="dxa"/>
             <w:tcBorders/>
           </w:tcPr>
           <w:p>
@@ -5241,7 +5241,7 @@
         </w:trPr>
         <w:tc>
           <w:tcPr>
-            <w:tcW w:w="2702" w:type="dxa"/>
+            <w:tcW w:w="2482" w:type="dxa"/>
             <w:tcBorders/>
           </w:tcPr>
           <w:p>
@@ -5272,7 +5272,7 @@
         </w:tc>
         <w:tc>
           <w:tcPr>
-            <w:tcW w:w="6658" w:type="dxa"/>
+            <w:tcW w:w="6878" w:type="dxa"/>
             <w:tcBorders/>
           </w:tcPr>
           <w:p>
@@ -5307,7 +5307,7 @@
         </w:trPr>
         <w:tc>
           <w:tcPr>
-            <w:tcW w:w="2702" w:type="dxa"/>
+            <w:tcW w:w="2482" w:type="dxa"/>
             <w:tcBorders/>
           </w:tcPr>
           <w:p>
@@ -5338,7 +5338,7 @@
         </w:tc>
         <w:tc>
           <w:tcPr>
-            <w:tcW w:w="6658" w:type="dxa"/>
+            <w:tcW w:w="6878" w:type="dxa"/>
             <w:tcBorders/>
           </w:tcPr>
           <w:p>
@@ -5373,7 +5373,7 @@
         </w:trPr>
         <w:tc>
           <w:tcPr>
-            <w:tcW w:w="2702" w:type="dxa"/>
+            <w:tcW w:w="2482" w:type="dxa"/>
             <w:tcBorders/>
           </w:tcPr>
           <w:p>
@@ -5404,7 +5404,7 @@
         </w:tc>
         <w:tc>
           <w:tcPr>
-            <w:tcW w:w="6658" w:type="dxa"/>
+            <w:tcW w:w="6878" w:type="dxa"/>
             <w:tcBorders/>
           </w:tcPr>
           <w:p>
@@ -5439,7 +5439,7 @@
         </w:trPr>
         <w:tc>
           <w:tcPr>
-            <w:tcW w:w="2702" w:type="dxa"/>
+            <w:tcW w:w="2482" w:type="dxa"/>
             <w:tcBorders/>
           </w:tcPr>
           <w:p>
@@ -5470,7 +5470,7 @@
         </w:tc>
         <w:tc>
           <w:tcPr>
-            <w:tcW w:w="6658" w:type="dxa"/>
+            <w:tcW w:w="6878" w:type="dxa"/>
             <w:tcBorders/>
           </w:tcPr>
           <w:p>
@@ -5514,7 +5514,7 @@
         <w:pStyle w:val="Heading1"/>
         <w:rPr/>
       </w:pPr>
-      <w:bookmarkStart w:id="5" w:name="__RefHeading___Toc8144_602959473"/>
+      <w:bookmarkStart w:id="5" w:name="__RefHeading___Toc8152_2384007457"/>
       <w:bookmarkEnd w:id="5"/>
       <w:r>
         <w:rPr/>
@@ -5726,7 +5726,7 @@
       </w:pPr>
       <w:r>
         <w:rPr/>
-        <w:t>Figure 4. Application Settings: runtime, security and scripts</w:t>
+        <w:t>Figure 4. Application Settings: the touch color, runtime, security and scripts</w:t>
       </w:r>
     </w:p>
     <w:p>
@@ -5742,41 +5742,21 @@
         <w:rPr>
           <w:b/>
         </w:rPr>
-        <w:t>Window</w:t>
-      </w:r>
-      <w:r>
-        <w:rPr/>
-        <w:t xml:space="preserve">: how a published application runs on the target PC: </w:t>
+        <w:t>Touch background color</w:t>
+      </w:r>
+      <w:r>
+        <w:rPr/>
+        <w:t xml:space="preserve">: the color an object is drawn in while the operator holds it down, so a touch screen with no click to feel still answers every press. It applies to every object that has a touch animation, and only while the touch would do something: an object the operator may not use just now is left alone. </w:t>
       </w:r>
       <w:r>
         <w:rPr>
           <w:b/>
         </w:rPr>
-        <w:t>Kiosk</w:t>
-      </w:r>
-      <w:r>
-        <w:rPr/>
-        <w:t xml:space="preserve"> (full screen, locked, taskbar hidden), </w:t>
-      </w:r>
-      <w:r>
-        <w:rPr>
-          <w:b/>
-        </w:rPr>
-        <w:t>Full screen</w:t>
-      </w:r>
-      <w:r>
-        <w:rPr/>
-        <w:t xml:space="preserve">, or a </w:t>
-      </w:r>
-      <w:r>
-        <w:rPr>
-          <w:b/>
-        </w:rPr>
-        <w:t>window</w:t>
-      </w:r>
-      <w:r>
-        <w:rPr/>
-        <w:t xml:space="preserve"> at the target resolution. LiquidWeighHMI uses Full screen.</w:t>
+        <w:t>Default</w:t>
+      </w:r>
+      <w:r>
+        <w:rPr/>
+        <w:t xml:space="preserve"> sets no color, and a press changes nothing. LiquidWeighHMI uses a light blue.</w:t>
       </w:r>
     </w:p>
     <w:p>
@@ -5792,11 +5772,41 @@
         <w:rPr>
           <w:b/>
         </w:rPr>
-        <w:t>Exit</w:t>
-      </w:r>
-      <w:r>
-        <w:rPr/>
-        <w:t>: the exit shortcut Ctrl+Alt+Shift+Q; the shortcut followed by a password; or never (the PC must be shut down to stop it).</w:t>
+        <w:t>Window</w:t>
+      </w:r>
+      <w:r>
+        <w:rPr/>
+        <w:t xml:space="preserve">: how a published application runs on the target PC: </w:t>
+      </w:r>
+      <w:r>
+        <w:rPr>
+          <w:b/>
+        </w:rPr>
+        <w:t>Kiosk</w:t>
+      </w:r>
+      <w:r>
+        <w:rPr/>
+        <w:t xml:space="preserve"> (full screen, locked, taskbar hidden), </w:t>
+      </w:r>
+      <w:r>
+        <w:rPr>
+          <w:b/>
+        </w:rPr>
+        <w:t>Full screen</w:t>
+      </w:r>
+      <w:r>
+        <w:rPr/>
+        <w:t xml:space="preserve">, or a </w:t>
+      </w:r>
+      <w:r>
+        <w:rPr>
+          <w:b/>
+        </w:rPr>
+        <w:t>window</w:t>
+      </w:r>
+      <w:r>
+        <w:rPr/>
+        <w:t xml:space="preserve"> at the target resolution. LiquidWeighHMI uses Full screen.</w:t>
       </w:r>
     </w:p>
     <w:p>
@@ -5812,11 +5822,11 @@
         <w:rPr>
           <w:b/>
         </w:rPr>
-        <w:t>Log out after (min)</w:t>
-      </w:r>
-      <w:r>
-        <w:rPr/>
-        <w:t>: logs the operator out after this many minutes without a touch or key press. 0 never logs out.</w:t>
+        <w:t>Exit</w:t>
+      </w:r>
+      <w:r>
+        <w:rPr/>
+        <w:t>: the exit shortcut Ctrl+Alt+Shift+Q; the shortcut followed by a password; or never (the PC must be shut down to stop it).</w:t>
       </w:r>
     </w:p>
     <w:p>
@@ -5832,6 +5842,26 @@
         <w:rPr>
           <w:b/>
         </w:rPr>
+        <w:t>Log out after (min)</w:t>
+      </w:r>
+      <w:r>
+        <w:rPr/>
+        <w:t>: logs the operator out after this many minutes without a touch or key press. 0 never logs out.</w:t>
+      </w:r>
+    </w:p>
+    <w:p>
+      <w:pPr>
+        <w:pStyle w:val="ListBullet"/>
+        <w:numPr>
+          <w:ilvl w:val="0"/>
+          <w:numId w:val="1"/>
+        </w:numPr>
+        <w:rPr/>
+      </w:pPr>
+      <w:r>
+        <w:rPr>
+          <w:b/>
+        </w:rPr>
         <w:t>Scripts</w:t>
       </w:r>
       <w:r>
@@ -5874,7 +5904,7 @@
         <w:pStyle w:val="Heading1"/>
         <w:rPr/>
       </w:pPr>
-      <w:bookmarkStart w:id="6" w:name="__RefHeading___Toc8146_602959473"/>
+      <w:bookmarkStart w:id="6" w:name="__RefHeading___Toc8154_2384007457"/>
       <w:bookmarkEnd w:id="6"/>
       <w:r>
         <w:rPr/>
@@ -6669,7 +6699,7 @@
         <w:pStyle w:val="Heading1"/>
         <w:rPr/>
       </w:pPr>
-      <w:bookmarkStart w:id="7" w:name="__RefHeading___Toc8148_602959473"/>
+      <w:bookmarkStart w:id="7" w:name="__RefHeading___Toc8156_2384007457"/>
       <w:bookmarkEnd w:id="7"/>
       <w:r>
         <w:rPr/>
@@ -7520,7 +7550,7 @@
         <w:pStyle w:val="Heading2"/>
         <w:rPr/>
       </w:pPr>
-      <w:bookmarkStart w:id="8" w:name="__RefHeading___Toc8150_602959473"/>
+      <w:bookmarkStart w:id="8" w:name="__RefHeading___Toc8158_2384007457"/>
       <w:bookmarkEnd w:id="8"/>
       <w:r>
         <w:rPr/>
@@ -8170,7 +8200,7 @@
         <w:pStyle w:val="Heading2"/>
         <w:rPr/>
       </w:pPr>
-      <w:bookmarkStart w:id="9" w:name="__RefHeading___Toc8152_602959473"/>
+      <w:bookmarkStart w:id="9" w:name="__RefHeading___Toc8160_2384007457"/>
       <w:bookmarkEnd w:id="9"/>
       <w:r>
         <w:rPr/>
@@ -8302,7 +8332,7 @@
         <w:pStyle w:val="Heading2"/>
         <w:rPr/>
       </w:pPr>
-      <w:bookmarkStart w:id="10" w:name="__RefHeading___Toc8154_602959473"/>
+      <w:bookmarkStart w:id="10" w:name="__RefHeading___Toc8162_2384007457"/>
       <w:bookmarkEnd w:id="10"/>
       <w:r>
         <w:rPr/>
@@ -8432,7 +8462,7 @@
         <w:pStyle w:val="Heading1"/>
         <w:rPr/>
       </w:pPr>
-      <w:bookmarkStart w:id="11" w:name="__RefHeading___Toc8156_602959473"/>
+      <w:bookmarkStart w:id="11" w:name="__RefHeading___Toc8164_2384007457"/>
       <w:bookmarkEnd w:id="11"/>
       <w:r>
         <w:rPr/>
@@ -8945,7 +8975,7 @@
         <w:pStyle w:val="Heading2"/>
         <w:rPr/>
       </w:pPr>
-      <w:bookmarkStart w:id="12" w:name="__RefHeading___Toc8158_602959473"/>
+      <w:bookmarkStart w:id="12" w:name="__RefHeading___Toc8166_2384007457"/>
       <w:bookmarkEnd w:id="12"/>
       <w:r>
         <w:rPr/>
@@ -9849,7 +9879,7 @@
         <w:pStyle w:val="Heading2"/>
         <w:rPr/>
       </w:pPr>
-      <w:bookmarkStart w:id="13" w:name="__RefHeading___Toc8160_602959473"/>
+      <w:bookmarkStart w:id="13" w:name="__RefHeading___Toc8168_2384007457"/>
       <w:bookmarkEnd w:id="13"/>
       <w:r>
         <w:rPr/>
@@ -10021,7 +10051,7 @@
         <w:pStyle w:val="Heading1"/>
         <w:rPr/>
       </w:pPr>
-      <w:bookmarkStart w:id="14" w:name="__RefHeading___Toc8162_602959473"/>
+      <w:bookmarkStart w:id="14" w:name="__RefHeading___Toc8170_2384007457"/>
       <w:bookmarkEnd w:id="14"/>
       <w:r>
         <w:rPr/>
@@ -10797,7 +10827,7 @@
         <w:pStyle w:val="Heading1"/>
         <w:rPr/>
       </w:pPr>
-      <w:bookmarkStart w:id="15" w:name="__RefHeading___Toc8164_602959473"/>
+      <w:bookmarkStart w:id="15" w:name="__RefHeading___Toc8172_2384007457"/>
       <w:bookmarkEnd w:id="15"/>
       <w:r>
         <w:rPr/>
@@ -11560,7 +11590,7 @@
         <w:pStyle w:val="Heading2"/>
         <w:rPr/>
       </w:pPr>
-      <w:bookmarkStart w:id="16" w:name="__RefHeading___Toc8166_602959473"/>
+      <w:bookmarkStart w:id="16" w:name="__RefHeading___Toc8174_2384007457"/>
       <w:bookmarkEnd w:id="16"/>
       <w:r>
         <w:rPr/>
@@ -11746,7 +11776,7 @@
         <w:pStyle w:val="Heading2"/>
         <w:rPr/>
       </w:pPr>
-      <w:bookmarkStart w:id="17" w:name="__RefHeading___Toc8168_602959473"/>
+      <w:bookmarkStart w:id="17" w:name="__RefHeading___Toc8176_2384007457"/>
       <w:bookmarkEnd w:id="17"/>
       <w:r>
         <w:rPr/>
@@ -11870,7 +11900,7 @@
         <w:pStyle w:val="Heading2"/>
         <w:rPr/>
       </w:pPr>
-      <w:bookmarkStart w:id="18" w:name="__RefHeading___Toc8170_602959473"/>
+      <w:bookmarkStart w:id="18" w:name="__RefHeading___Toc8178_2384007457"/>
       <w:bookmarkEnd w:id="18"/>
       <w:r>
         <w:rPr/>
@@ -11986,7 +12016,7 @@
         <w:pStyle w:val="Heading2"/>
         <w:rPr/>
       </w:pPr>
-      <w:bookmarkStart w:id="19" w:name="__RefHeading___Toc8172_602959473"/>
+      <w:bookmarkStart w:id="19" w:name="__RefHeading___Toc8180_2384007457"/>
       <w:bookmarkEnd w:id="19"/>
       <w:r>
         <w:rPr/>
@@ -12175,7 +12205,7 @@
         <w:pStyle w:val="Heading2"/>
         <w:rPr/>
       </w:pPr>
-      <w:bookmarkStart w:id="20" w:name="__RefHeading___Toc8174_602959473"/>
+      <w:bookmarkStart w:id="20" w:name="__RefHeading___Toc8182_2384007457"/>
       <w:bookmarkEnd w:id="20"/>
       <w:r>
         <w:rPr/>
@@ -12678,6 +12708,34 @@
       <w:r>
         <w:rPr/>
       </w:r>
+    </w:p>
+    <w:p>
+      <w:pPr>
+        <w:pStyle w:val="Normal"/>
+        <w:ind w:left="360"/>
+        <w:rPr/>
+      </w:pPr>
+      <w:r>
+        <w:rPr>
+          <w:b/>
+          <w:color w:val="1F5F99"/>
+        </w:rPr>
+        <w:t xml:space="preserve">Note: </w:t>
+      </w:r>
+      <w:r>
+        <w:rPr/>
+        <w:t xml:space="preserve">A </w:t>
+      </w:r>
+      <w:r>
+        <w:rPr>
+          <w:b/>
+        </w:rPr>
+        <w:t>Touch background color</w:t>
+      </w:r>
+      <w:r>
+        <w:rPr/>
+        <w:t xml:space="preserve"> in Application Settings (chapter 3) draws every object with a touch animation in one color while the operator holds it down, which is the feedback a touch screen cannot give by feel. It is one setting for the whole application, so no button needs anything of its own.</w:t>
+      </w:r>
       <w:r>
         <w:br w:type="page"/>
       </w:r>
@@ -12687,7 +12745,7 @@
         <w:pStyle w:val="Heading1"/>
         <w:rPr/>
       </w:pPr>
-      <w:bookmarkStart w:id="21" w:name="__RefHeading___Toc8176_602959473"/>
+      <w:bookmarkStart w:id="21" w:name="__RefHeading___Toc8184_2384007457"/>
       <w:bookmarkEnd w:id="21"/>
       <w:r>
         <w:rPr/>
@@ -14049,16 +14107,13 @@
       <w:r>
         <w:rPr/>
       </w:r>
-      <w:r>
-        <w:br w:type="page"/>
-      </w:r>
     </w:p>
     <w:p>
       <w:pPr>
         <w:pStyle w:val="Heading2"/>
         <w:rPr/>
       </w:pPr>
-      <w:bookmarkStart w:id="22" w:name="__RefHeading___Toc8178_602959473"/>
+      <w:bookmarkStart w:id="22" w:name="__RefHeading___Toc8186_2384007457"/>
       <w:bookmarkEnd w:id="22"/>
       <w:r>
         <w:rPr/>
@@ -14470,7 +14525,7 @@
         <w:pStyle w:val="Heading2"/>
         <w:rPr/>
       </w:pPr>
-      <w:bookmarkStart w:id="23" w:name="__RefHeading___Toc8180_602959473"/>
+      <w:bookmarkStart w:id="23" w:name="__RefHeading___Toc8188_2384007457"/>
       <w:bookmarkEnd w:id="23"/>
       <w:r>
         <w:rPr/>
@@ -14589,7 +14644,7 @@
         <w:pStyle w:val="Heading2"/>
         <w:rPr/>
       </w:pPr>
-      <w:bookmarkStart w:id="24" w:name="__RefHeading___Toc8182_602959473"/>
+      <w:bookmarkStart w:id="24" w:name="__RefHeading___Toc8190_2384007457"/>
       <w:bookmarkEnd w:id="24"/>
       <w:r>
         <w:rPr/>
@@ -24200,7 +24255,7 @@
         <w:pStyle w:val="Heading2"/>
         <w:rPr/>
       </w:pPr>
-      <w:bookmarkStart w:id="25" w:name="__RefHeading___Toc8184_602959473"/>
+      <w:bookmarkStart w:id="25" w:name="__RefHeading___Toc8192_2384007457"/>
       <w:bookmarkEnd w:id="25"/>
       <w:r>
         <w:rPr/>
@@ -25039,7 +25094,7 @@
         <w:pStyle w:val="Heading2"/>
         <w:rPr/>
       </w:pPr>
-      <w:bookmarkStart w:id="26" w:name="__RefHeading___Toc8186_602959473"/>
+      <w:bookmarkStart w:id="26" w:name="__RefHeading___Toc8194_2384007457"/>
       <w:bookmarkEnd w:id="26"/>
       <w:r>
         <w:rPr/>
@@ -25525,7 +25580,7 @@
         <w:pStyle w:val="Heading2"/>
         <w:rPr/>
       </w:pPr>
-      <w:bookmarkStart w:id="27" w:name="__RefHeading___Toc8188_602959473"/>
+      <w:bookmarkStart w:id="27" w:name="__RefHeading___Toc8196_2384007457"/>
       <w:bookmarkEnd w:id="27"/>
       <w:r>
         <w:rPr/>
@@ -25717,7 +25772,7 @@
         <w:pStyle w:val="Heading2"/>
         <w:rPr/>
       </w:pPr>
-      <w:bookmarkStart w:id="28" w:name="__RefHeading___Toc8190_602959473"/>
+      <w:bookmarkStart w:id="28" w:name="__RefHeading___Toc8198_2384007457"/>
       <w:bookmarkEnd w:id="28"/>
       <w:r>
         <w:rPr/>
@@ -26403,7 +26458,7 @@
         <w:pStyle w:val="Heading2"/>
         <w:rPr/>
       </w:pPr>
-      <w:bookmarkStart w:id="29" w:name="__RefHeading___Toc8192_602959473"/>
+      <w:bookmarkStart w:id="29" w:name="__RefHeading___Toc8200_2384007457"/>
       <w:bookmarkEnd w:id="29"/>
       <w:r>
         <w:rPr/>
@@ -27157,7 +27212,7 @@
         <w:pStyle w:val="Heading1"/>
         <w:rPr/>
       </w:pPr>
-      <w:bookmarkStart w:id="30" w:name="__RefHeading___Toc8194_602959473"/>
+      <w:bookmarkStart w:id="30" w:name="__RefHeading___Toc8202_2384007457"/>
       <w:bookmarkEnd w:id="30"/>
       <w:r>
         <w:rPr/>
@@ -27169,7 +27224,7 @@
         <w:pStyle w:val="Heading2"/>
         <w:rPr/>
       </w:pPr>
-      <w:bookmarkStart w:id="31" w:name="__RefHeading___Toc8196_602959473"/>
+      <w:bookmarkStart w:id="31" w:name="__RefHeading___Toc8204_2384007457"/>
       <w:bookmarkEnd w:id="31"/>
       <w:r>
         <w:rPr/>
@@ -28500,7 +28555,7 @@
         <w:pStyle w:val="Heading2"/>
         <w:rPr/>
       </w:pPr>
-      <w:bookmarkStart w:id="32" w:name="__RefHeading___Toc8198_602959473"/>
+      <w:bookmarkStart w:id="32" w:name="__RefHeading___Toc8206_2384007457"/>
       <w:bookmarkEnd w:id="32"/>
       <w:r>
         <w:rPr/>
@@ -29190,7 +29245,7 @@
         <w:pStyle w:val="Heading1"/>
         <w:rPr/>
       </w:pPr>
-      <w:bookmarkStart w:id="33" w:name="__RefHeading___Toc8200_602959473"/>
+      <w:bookmarkStart w:id="33" w:name="__RefHeading___Toc8208_2384007457"/>
       <w:bookmarkEnd w:id="33"/>
       <w:r>
         <w:rPr/>
@@ -29329,7 +29384,7 @@
         <w:pStyle w:val="Heading2"/>
         <w:rPr/>
       </w:pPr>
-      <w:bookmarkStart w:id="34" w:name="__RefHeading___Toc8202_602959473"/>
+      <w:bookmarkStart w:id="34" w:name="__RefHeading___Toc8210_2384007457"/>
       <w:bookmarkEnd w:id="34"/>
       <w:r>
         <w:rPr/>
@@ -31190,7 +31245,7 @@
         <w:pStyle w:val="Heading2"/>
         <w:rPr/>
       </w:pPr>
-      <w:bookmarkStart w:id="35" w:name="__RefHeading___Toc8204_602959473"/>
+      <w:bookmarkStart w:id="35" w:name="__RefHeading___Toc8212_2384007457"/>
       <w:bookmarkEnd w:id="35"/>
       <w:r>
         <w:rPr/>
@@ -32640,7 +32695,7 @@
         <w:pStyle w:val="Heading2"/>
         <w:rPr/>
       </w:pPr>
-      <w:bookmarkStart w:id="36" w:name="__RefHeading___Toc8206_602959473"/>
+      <w:bookmarkStart w:id="36" w:name="__RefHeading___Toc8214_2384007457"/>
       <w:bookmarkEnd w:id="36"/>
       <w:r>
         <w:rPr/>
@@ -33350,7 +33405,7 @@
         <w:pStyle w:val="Heading2"/>
         <w:rPr/>
       </w:pPr>
-      <w:bookmarkStart w:id="37" w:name="__RefHeading___Toc8208_602959473"/>
+      <w:bookmarkStart w:id="37" w:name="__RefHeading___Toc8216_2384007457"/>
       <w:bookmarkEnd w:id="37"/>
       <w:r>
         <w:rPr/>
@@ -33632,7 +33687,7 @@
         <w:pStyle w:val="Heading2"/>
         <w:rPr/>
       </w:pPr>
-      <w:bookmarkStart w:id="38" w:name="__RefHeading___Toc8210_602959473"/>
+      <w:bookmarkStart w:id="38" w:name="__RefHeading___Toc8218_2384007457"/>
       <w:bookmarkEnd w:id="38"/>
       <w:r>
         <w:rPr/>
@@ -33793,7 +33848,7 @@
         <w:pStyle w:val="Heading2"/>
         <w:rPr/>
       </w:pPr>
-      <w:bookmarkStart w:id="39" w:name="__RefHeading___Toc8212_602959473"/>
+      <w:bookmarkStart w:id="39" w:name="__RefHeading___Toc8220_2384007457"/>
       <w:bookmarkEnd w:id="39"/>
       <w:r>
         <w:rPr/>
@@ -34193,7 +34248,7 @@
         <w:pStyle w:val="Heading1"/>
         <w:rPr/>
       </w:pPr>
-      <w:bookmarkStart w:id="40" w:name="__RefHeading___Toc8214_602959473"/>
+      <w:bookmarkStart w:id="40" w:name="__RefHeading___Toc8222_2384007457"/>
       <w:bookmarkEnd w:id="40"/>
       <w:r>
         <w:rPr/>
@@ -34225,7 +34280,7 @@
         <w:pStyle w:val="Heading2"/>
         <w:rPr/>
       </w:pPr>
-      <w:bookmarkStart w:id="41" w:name="__RefHeading___Toc8216_602959473"/>
+      <w:bookmarkStart w:id="41" w:name="__RefHeading___Toc8224_2384007457"/>
       <w:bookmarkEnd w:id="41"/>
       <w:r>
         <w:rPr/>
@@ -35430,7 +35485,7 @@
         <w:pStyle w:val="Heading2"/>
         <w:rPr/>
       </w:pPr>
-      <w:bookmarkStart w:id="42" w:name="__RefHeading___Toc8218_602959473"/>
+      <w:bookmarkStart w:id="42" w:name="__RefHeading___Toc8226_2384007457"/>
       <w:bookmarkEnd w:id="42"/>
       <w:r>
         <w:rPr/>
@@ -36816,7 +36871,7 @@
         <w:pStyle w:val="Heading2"/>
         <w:rPr/>
       </w:pPr>
-      <w:bookmarkStart w:id="43" w:name="__RefHeading___Toc8220_602959473"/>
+      <w:bookmarkStart w:id="43" w:name="__RefHeading___Toc8228_2384007457"/>
       <w:bookmarkEnd w:id="43"/>
       <w:r>
         <w:rPr/>
@@ -37402,7 +37457,7 @@
         <w:pStyle w:val="Heading2"/>
         <w:rPr/>
       </w:pPr>
-      <w:bookmarkStart w:id="44" w:name="__RefHeading___Toc8222_602959473"/>
+      <w:bookmarkStart w:id="44" w:name="__RefHeading___Toc8230_2384007457"/>
       <w:bookmarkEnd w:id="44"/>
       <w:r>
         <w:rPr/>
@@ -37497,7 +37552,7 @@
         <w:pStyle w:val="Heading2"/>
         <w:rPr/>
       </w:pPr>
-      <w:bookmarkStart w:id="45" w:name="__RefHeading___Toc8224_602959473"/>
+      <w:bookmarkStart w:id="45" w:name="__RefHeading___Toc8232_2384007457"/>
       <w:bookmarkEnd w:id="45"/>
       <w:r>
         <w:rPr/>
@@ -37951,7 +38006,7 @@
         <w:pStyle w:val="Heading1"/>
         <w:rPr/>
       </w:pPr>
-      <w:bookmarkStart w:id="46" w:name="__RefHeading___Toc8226_602959473"/>
+      <w:bookmarkStart w:id="46" w:name="__RefHeading___Toc8234_2384007457"/>
       <w:bookmarkEnd w:id="46"/>
       <w:r>
         <w:rPr/>
@@ -38116,7 +38171,7 @@
         <w:pStyle w:val="Heading2"/>
         <w:rPr/>
       </w:pPr>
-      <w:bookmarkStart w:id="47" w:name="__RefHeading___Toc8228_602959473"/>
+      <w:bookmarkStart w:id="47" w:name="__RefHeading___Toc8236_2384007457"/>
       <w:bookmarkEnd w:id="47"/>
       <w:r>
         <w:rPr/>
@@ -39233,7 +39288,7 @@
         <w:pStyle w:val="Heading2"/>
         <w:rPr/>
       </w:pPr>
-      <w:bookmarkStart w:id="48" w:name="__RefHeading___Toc8230_602959473"/>
+      <w:bookmarkStart w:id="48" w:name="__RefHeading___Toc8238_2384007457"/>
       <w:bookmarkEnd w:id="48"/>
       <w:r>
         <w:rPr/>
@@ -39467,7 +39522,7 @@
         <w:pStyle w:val="Heading2"/>
         <w:rPr/>
       </w:pPr>
-      <w:bookmarkStart w:id="49" w:name="__RefHeading___Toc8232_602959473"/>
+      <w:bookmarkStart w:id="49" w:name="__RefHeading___Toc8240_2384007457"/>
       <w:bookmarkEnd w:id="49"/>
       <w:r>
         <w:rPr/>
@@ -40284,7 +40339,7 @@
         <w:pStyle w:val="Heading2"/>
         <w:rPr/>
       </w:pPr>
-      <w:bookmarkStart w:id="50" w:name="__RefHeading___Toc8234_602959473"/>
+      <w:bookmarkStart w:id="50" w:name="__RefHeading___Toc8242_2384007457"/>
       <w:bookmarkEnd w:id="50"/>
       <w:r>
         <w:rPr/>
@@ -41980,7 +42035,7 @@
         <w:pStyle w:val="Heading2"/>
         <w:rPr/>
       </w:pPr>
-      <w:bookmarkStart w:id="51" w:name="__RefHeading___Toc8236_602959473"/>
+      <w:bookmarkStart w:id="51" w:name="__RefHeading___Toc8244_2384007457"/>
       <w:bookmarkEnd w:id="51"/>
       <w:r>
         <w:rPr/>
@@ -42680,7 +42735,7 @@
         <w:pStyle w:val="Heading2"/>
         <w:rPr/>
       </w:pPr>
-      <w:bookmarkStart w:id="52" w:name="__RefHeading___Toc8238_602959473"/>
+      <w:bookmarkStart w:id="52" w:name="__RefHeading___Toc8246_2384007457"/>
       <w:bookmarkEnd w:id="52"/>
       <w:r>
         <w:rPr/>
@@ -43038,7 +43093,7 @@
         <w:pStyle w:val="Heading1"/>
         <w:rPr/>
       </w:pPr>
-      <w:bookmarkStart w:id="53" w:name="__RefHeading___Toc8240_602959473"/>
+      <w:bookmarkStart w:id="53" w:name="__RefHeading___Toc8248_2384007457"/>
       <w:bookmarkEnd w:id="53"/>
       <w:r>
         <w:rPr/>
@@ -43070,7 +43125,7 @@
         <w:pStyle w:val="Heading2"/>
         <w:rPr/>
       </w:pPr>
-      <w:bookmarkStart w:id="54" w:name="__RefHeading___Toc8242_602959473"/>
+      <w:bookmarkStart w:id="54" w:name="__RefHeading___Toc8250_2384007457"/>
       <w:bookmarkEnd w:id="54"/>
       <w:r>
         <w:rPr/>
@@ -44394,7 +44449,7 @@
         <w:pStyle w:val="Heading2"/>
         <w:rPr/>
       </w:pPr>
-      <w:bookmarkStart w:id="55" w:name="__RefHeading___Toc8244_602959473"/>
+      <w:bookmarkStart w:id="55" w:name="__RefHeading___Toc8252_2384007457"/>
       <w:bookmarkEnd w:id="55"/>
       <w:r>
         <w:rPr/>
@@ -45129,7 +45184,7 @@
         <w:pStyle w:val="Heading2"/>
         <w:rPr/>
       </w:pPr>
-      <w:bookmarkStart w:id="56" w:name="__RefHeading___Toc8246_602959473"/>
+      <w:bookmarkStart w:id="56" w:name="__RefHeading___Toc8254_2384007457"/>
       <w:bookmarkEnd w:id="56"/>
       <w:r>
         <w:rPr/>
@@ -45181,7 +45236,7 @@
         <w:pStyle w:val="Heading2"/>
         <w:rPr/>
       </w:pPr>
-      <w:bookmarkStart w:id="57" w:name="__RefHeading___Toc8248_602959473"/>
+      <w:bookmarkStart w:id="57" w:name="__RefHeading___Toc8256_2384007457"/>
       <w:bookmarkEnd w:id="57"/>
       <w:r>
         <w:rPr/>
@@ -45464,7 +45519,7 @@
         <w:pStyle w:val="Heading1"/>
         <w:rPr/>
       </w:pPr>
-      <w:bookmarkStart w:id="58" w:name="__RefHeading___Toc8250_602959473"/>
+      <w:bookmarkStart w:id="58" w:name="__RefHeading___Toc8258_2384007457"/>
       <w:bookmarkEnd w:id="58"/>
       <w:r>
         <w:rPr/>
@@ -45476,7 +45531,7 @@
         <w:pStyle w:val="Heading2"/>
         <w:rPr/>
       </w:pPr>
-      <w:bookmarkStart w:id="59" w:name="__RefHeading___Toc8252_602959473"/>
+      <w:bookmarkStart w:id="59" w:name="__RefHeading___Toc8260_2384007457"/>
       <w:bookmarkEnd w:id="59"/>
       <w:r>
         <w:rPr/>
@@ -45564,7 +45619,7 @@
         <w:pStyle w:val="Heading2"/>
         <w:rPr/>
       </w:pPr>
-      <w:bookmarkStart w:id="60" w:name="__RefHeading___Toc8254_602959473"/>
+      <w:bookmarkStart w:id="60" w:name="__RefHeading___Toc8262_2384007457"/>
       <w:bookmarkEnd w:id="60"/>
       <w:r>
         <w:rPr/>
@@ -46130,7 +46185,7 @@
         <w:pStyle w:val="Heading1"/>
         <w:rPr/>
       </w:pPr>
-      <w:bookmarkStart w:id="61" w:name="__RefHeading___Toc8256_602959473"/>
+      <w:bookmarkStart w:id="61" w:name="__RefHeading___Toc8264_2384007457"/>
       <w:bookmarkEnd w:id="61"/>
       <w:r>
         <w:rPr/>
@@ -46586,7 +46641,7 @@
         <w:pStyle w:val="Heading2"/>
         <w:rPr/>
       </w:pPr>
-      <w:bookmarkStart w:id="62" w:name="__RefHeading___Toc8258_602959473"/>
+      <w:bookmarkStart w:id="62" w:name="__RefHeading___Toc8266_2384007457"/>
       <w:bookmarkEnd w:id="62"/>
       <w:r>
         <w:rPr/>
@@ -46677,7 +46732,7 @@
         <w:pStyle w:val="Heading2"/>
         <w:rPr/>
       </w:pPr>
-      <w:bookmarkStart w:id="63" w:name="__RefHeading___Toc8260_602959473"/>
+      <w:bookmarkStart w:id="63" w:name="__RefHeading___Toc8268_2384007457"/>
       <w:bookmarkEnd w:id="63"/>
       <w:r>
         <w:rPr/>
@@ -46790,7 +46845,7 @@
         <w:pStyle w:val="Heading2"/>
         <w:rPr/>
       </w:pPr>
-      <w:bookmarkStart w:id="64" w:name="__RefHeading___Toc8262_602959473"/>
+      <w:bookmarkStart w:id="64" w:name="__RefHeading___Toc8270_2384007457"/>
       <w:bookmarkEnd w:id="64"/>
       <w:r>
         <w:rPr/>
@@ -47003,7 +47058,7 @@
         <w:pStyle w:val="Heading1"/>
         <w:rPr/>
       </w:pPr>
-      <w:bookmarkStart w:id="65" w:name="__RefHeading___Toc8264_602959473"/>
+      <w:bookmarkStart w:id="65" w:name="__RefHeading___Toc8272_2384007457"/>
       <w:bookmarkEnd w:id="65"/>
       <w:r>
         <w:rPr/>
@@ -47795,7 +47850,7 @@
         <w:pStyle w:val="Heading1"/>
         <w:rPr/>
       </w:pPr>
-      <w:bookmarkStart w:id="66" w:name="__RefHeading___Toc8266_602959473"/>
+      <w:bookmarkStart w:id="66" w:name="__RefHeading___Toc8274_2384007457"/>
       <w:bookmarkEnd w:id="66"/>
       <w:r>
         <w:rPr/>
@@ -48344,7 +48399,7 @@
       <w:rPr>
         <w:sz w:val="18"/>
       </w:rPr>
-      <w:t>92</w:t>
+      <w:t>91</w:t>
     </w:r>
     <w:r>
       <w:rPr>

</xml_diff>

<commit_message>
docs: the manual's figures from the installed 1.11.0 Windows build
Application Settings has a Touch section, so both of its figures were
retaken -- the second one scrolled so Touch is at the top, which its
caption now names -- along with the Tag Dictionary, which lists the
system tags, and the on-screen keyboard at its new key size.

Co-Authored-By: Claude Opus 5 <noreply@anthropic.com>
</commit_message>
<xml_diff>
--- a/doc/Append-HMI-Studio-User-Manual.docx
+++ b/doc/Append-HMI-Studio-User-Manual.docx
@@ -283,7 +283,7 @@
             </w:rPr>
             <w:fldChar w:fldCharType="separate"/>
           </w:r>
-          <w:hyperlink w:anchor="__RefHeading___Toc8142_2384007457" w:tooltip="1 Introduction">
+          <w:hyperlink w:anchor="__RefHeading___Toc8142_4193108665" w:tooltip="1 Introduction">
             <w:r>
               <w:rPr>
                 <w:rStyle w:val="IndexLink"/>
@@ -304,7 +304,7 @@
             </w:tabs>
             <w:rPr/>
           </w:pPr>
-          <w:hyperlink w:anchor="__RefHeading___Toc8144_2384007457" w:tooltip="1.1 Building applications with an AI agent">
+          <w:hyperlink w:anchor="__RefHeading___Toc8144_4193108665" w:tooltip="1.1 Building applications with an AI agent">
             <w:r>
               <w:rPr>
                 <w:rStyle w:val="IndexLink"/>
@@ -325,7 +325,7 @@
             </w:tabs>
             <w:rPr/>
           </w:pPr>
-          <w:hyperlink w:anchor="__RefHeading___Toc8146_2384007457" w:tooltip="1.2 How an HMI application is organized">
+          <w:hyperlink w:anchor="__RefHeading___Toc8146_4193108665" w:tooltip="1.2 How an HMI application is organized">
             <w:r>
               <w:rPr>
                 <w:rStyle w:val="IndexLink"/>
@@ -346,7 +346,7 @@
             </w:tabs>
             <w:rPr/>
           </w:pPr>
-          <w:hyperlink w:anchor="__RefHeading___Toc8148_2384007457" w:tooltip="2 The Studio window">
+          <w:hyperlink w:anchor="__RefHeading___Toc8148_4193108665" w:tooltip="2 The Studio window">
             <w:r>
               <w:rPr>
                 <w:rStyle w:val="IndexLink"/>
@@ -367,7 +367,7 @@
             </w:tabs>
             <w:rPr/>
           </w:pPr>
-          <w:hyperlink w:anchor="__RefHeading___Toc8150_2384007457" w:tooltip="2.1 The HMI menu">
+          <w:hyperlink w:anchor="__RefHeading___Toc8150_4193108665" w:tooltip="2.1 The HMI menu">
             <w:r>
               <w:rPr>
                 <w:rStyle w:val="IndexLink"/>
@@ -388,7 +388,7 @@
             </w:tabs>
             <w:rPr/>
           </w:pPr>
-          <w:hyperlink w:anchor="__RefHeading___Toc8152_2384007457" w:tooltip="3 Application settings">
+          <w:hyperlink w:anchor="__RefHeading___Toc8152_4193108665" w:tooltip="3 Application settings">
             <w:r>
               <w:rPr>
                 <w:rStyle w:val="IndexLink"/>
@@ -409,7 +409,7 @@
             </w:tabs>
             <w:rPr/>
           </w:pPr>
-          <w:hyperlink w:anchor="__RefHeading___Toc8154_2384007457" w:tooltip="4 Devices">
+          <w:hyperlink w:anchor="__RefHeading___Toc8154_4193108665" w:tooltip="4 Devices">
             <w:r>
               <w:rPr>
                 <w:rStyle w:val="IndexLink"/>
@@ -430,7 +430,7 @@
             </w:tabs>
             <w:rPr/>
           </w:pPr>
-          <w:hyperlink w:anchor="__RefHeading___Toc8156_2384007457" w:tooltip="5 Tags">
+          <w:hyperlink w:anchor="__RefHeading___Toc8156_4193108665" w:tooltip="5 Tags">
             <w:r>
               <w:rPr>
                 <w:rStyle w:val="IndexLink"/>
@@ -451,7 +451,7 @@
             </w:tabs>
             <w:rPr/>
           </w:pPr>
-          <w:hyperlink w:anchor="__RefHeading___Toc8158_2384007457" w:tooltip="5.1 Tag fields">
+          <w:hyperlink w:anchor="__RefHeading___Toc8158_4193108665" w:tooltip="5.1 Tag fields">
             <w:r>
               <w:rPr>
                 <w:rStyle w:val="IndexLink"/>
@@ -472,7 +472,7 @@
             </w:tabs>
             <w:rPr/>
           </w:pPr>
-          <w:hyperlink w:anchor="__RefHeading___Toc8160_2384007457" w:tooltip="5.2 Alarms on a tag">
+          <w:hyperlink w:anchor="__RefHeading___Toc8160_4193108665" w:tooltip="5.2 Alarms on a tag">
             <w:r>
               <w:rPr>
                 <w:rStyle w:val="IndexLink"/>
@@ -493,7 +493,7 @@
             </w:tabs>
             <w:rPr/>
           </w:pPr>
-          <w:hyperlink w:anchor="__RefHeading___Toc8162_2384007457" w:tooltip="5.3 Renaming, and finding and replacing tag references">
+          <w:hyperlink w:anchor="__RefHeading___Toc8162_4193108665" w:tooltip="5.3 Renaming, and finding and replacing tag references">
             <w:r>
               <w:rPr>
                 <w:rStyle w:val="IndexLink"/>
@@ -514,7 +514,7 @@
             </w:tabs>
             <w:rPr/>
           </w:pPr>
-          <w:hyperlink w:anchor="__RefHeading___Toc8164_2384007457" w:tooltip="6 Screens and windows">
+          <w:hyperlink w:anchor="__RefHeading___Toc8164_4193108665" w:tooltip="6 Screens and windows">
             <w:r>
               <w:rPr>
                 <w:rStyle w:val="IndexLink"/>
@@ -535,7 +535,7 @@
             </w:tabs>
             <w:rPr/>
           </w:pPr>
-          <w:hyperlink w:anchor="__RefHeading___Toc8166_2384007457" w:tooltip="6.1 Window properties">
+          <w:hyperlink w:anchor="__RefHeading___Toc8166_4193108665" w:tooltip="6.1 Window properties">
             <w:r>
               <w:rPr>
                 <w:rStyle w:val="IndexLink"/>
@@ -556,7 +556,7 @@
             </w:tabs>
             <w:rPr/>
           </w:pPr>
-          <w:hyperlink w:anchor="__RefHeading___Toc8168_2384007457" w:tooltip="6.2 The header, the navigation bar and the screens">
+          <w:hyperlink w:anchor="__RefHeading___Toc8168_4193108665" w:tooltip="6.2 The header, the navigation bar and the screens">
             <w:r>
               <w:rPr>
                 <w:rStyle w:val="IndexLink"/>
@@ -577,7 +577,7 @@
             </w:tabs>
             <w:rPr/>
           </w:pPr>
-          <w:hyperlink w:anchor="__RefHeading___Toc8170_2384007457" w:tooltip="7 Drawing objects">
+          <w:hyperlink w:anchor="__RefHeading___Toc8170_4193108665" w:tooltip="7 Drawing objects">
             <w:r>
               <w:rPr>
                 <w:rStyle w:val="IndexLink"/>
@@ -598,7 +598,7 @@
             </w:tabs>
             <w:rPr/>
           </w:pPr>
-          <w:hyperlink w:anchor="__RefHeading___Toc8172_2384007457" w:tooltip="8 Animation links">
+          <w:hyperlink w:anchor="__RefHeading___Toc8172_4193108665" w:tooltip="8 Animation links">
             <w:r>
               <w:rPr>
                 <w:rStyle w:val="IndexLink"/>
@@ -619,7 +619,7 @@
             </w:tabs>
             <w:rPr/>
           </w:pPr>
-          <w:hyperlink w:anchor="__RefHeading___Toc8174_2384007457" w:tooltip="8.1 A valve: status color, fault blink and faceplate">
+          <w:hyperlink w:anchor="__RefHeading___Toc8174_4193108665" w:tooltip="8.1 A valve: status color, fault blink and faceplate">
             <w:r>
               <w:rPr>
                 <w:rStyle w:val="IndexLink"/>
@@ -640,7 +640,7 @@
             </w:tabs>
             <w:rPr/>
           </w:pPr>
-          <w:hyperlink w:anchor="__RefHeading___Toc8176_2384007457" w:tooltip="8.2 The weigh hopper: percent fill">
+          <w:hyperlink w:anchor="__RefHeading___Toc8176_4193108665" w:tooltip="8.2 The weigh hopper: percent fill">
             <w:r>
               <w:rPr>
                 <w:rStyle w:val="IndexLink"/>
@@ -661,7 +661,7 @@
             </w:tabs>
             <w:rPr/>
           </w:pPr>
-          <w:hyperlink w:anchor="__RefHeading___Toc8178_2384007457" w:tooltip="8.3 Hopper pressure: value display and alarm colors">
+          <w:hyperlink w:anchor="__RefHeading___Toc8178_4193108665" w:tooltip="8.3 Hopper pressure: value display and alarm colors">
             <w:r>
               <w:rPr>
                 <w:rStyle w:val="IndexLink"/>
@@ -682,7 +682,7 @@
             </w:tabs>
             <w:rPr/>
           </w:pPr>
-          <w:hyperlink w:anchor="__RefHeading___Toc8180_2384007457" w:tooltip="8.4 Setpoints: user input">
+          <w:hyperlink w:anchor="__RefHeading___Toc8180_4193108665" w:tooltip="8.4 Setpoints: user input">
             <w:r>
               <w:rPr>
                 <w:rStyle w:val="IndexLink"/>
@@ -703,7 +703,7 @@
             </w:tabs>
             <w:rPr/>
           </w:pPr>
-          <w:hyperlink w:anchor="__RefHeading___Toc8182_2384007457" w:tooltip="8.5 Commands: pushbutton and enable">
+          <w:hyperlink w:anchor="__RefHeading___Toc8182_4193108665" w:tooltip="8.5 Commands: pushbutton and enable">
             <w:r>
               <w:rPr>
                 <w:rStyle w:val="IndexLink"/>
@@ -724,7 +724,7 @@
             </w:tabs>
             <w:rPr/>
           </w:pPr>
-          <w:hyperlink w:anchor="__RefHeading___Toc8184_2384007457" w:tooltip="9 Expressions and scripts">
+          <w:hyperlink w:anchor="__RefHeading___Toc8184_4193108665" w:tooltip="9 Expressions and scripts">
             <w:r>
               <w:rPr>
                 <w:rStyle w:val="IndexLink"/>
@@ -745,7 +745,7 @@
             </w:tabs>
             <w:rPr/>
           </w:pPr>
-          <w:hyperlink w:anchor="__RefHeading___Toc8186_2384007457" w:tooltip="9.1 Window and application scripts">
+          <w:hyperlink w:anchor="__RefHeading___Toc8186_4193108665" w:tooltip="9.1 Window and application scripts">
             <w:r>
               <w:rPr>
                 <w:rStyle w:val="IndexLink"/>
@@ -766,7 +766,7 @@
             </w:tabs>
             <w:rPr/>
           </w:pPr>
-          <w:hyperlink w:anchor="__RefHeading___Toc8188_2384007457" w:tooltip="9.2 Action scripts">
+          <w:hyperlink w:anchor="__RefHeading___Toc8188_4193108665" w:tooltip="9.2 Action scripts">
             <w:r>
               <w:rPr>
                 <w:rStyle w:val="IndexLink"/>
@@ -787,7 +787,7 @@
             </w:tabs>
             <w:rPr/>
           </w:pPr>
-          <w:hyperlink w:anchor="__RefHeading___Toc8190_2384007457" w:tooltip="9.3 Function reference">
+          <w:hyperlink w:anchor="__RefHeading___Toc8190_4193108665" w:tooltip="9.3 Function reference">
             <w:r>
               <w:rPr>
                 <w:rStyle w:val="IndexLink"/>
@@ -808,7 +808,7 @@
             </w:tabs>
             <w:rPr/>
           </w:pPr>
-          <w:hyperlink w:anchor="__RefHeading___Toc8192_2384007457" w:tooltip="9.4 Indirect tags: one faceplate for every device">
+          <w:hyperlink w:anchor="__RefHeading___Toc8192_4193108665" w:tooltip="9.4 Indirect tags: one faceplate for every device">
             <w:r>
               <w:rPr>
                 <w:rStyle w:val="IndexLink"/>
@@ -829,7 +829,7 @@
             </w:tabs>
             <w:rPr/>
           </w:pPr>
-          <w:hyperlink w:anchor="__RefHeading___Toc8194_2384007457" w:tooltip="9.5 Opening windows from scripts: ShowWindow">
+          <w:hyperlink w:anchor="__RefHeading___Toc8194_4193108665" w:tooltip="9.5 Opening windows from scripts: ShowWindow">
             <w:r>
               <w:rPr>
                 <w:rStyle w:val="IndexLink"/>
@@ -850,7 +850,7 @@
             </w:tabs>
             <w:rPr/>
           </w:pPr>
-          <w:hyperlink w:anchor="__RefHeading___Toc8196_2384007457" w:tooltip="9.6 Saving the screen as a PDF: ScreenToPDF">
+          <w:hyperlink w:anchor="__RefHeading___Toc8196_4193108665" w:tooltip="9.6 Saving the screen as a PDF: ScreenToPDF">
             <w:r>
               <w:rPr>
                 <w:rStyle w:val="IndexLink"/>
@@ -871,7 +871,7 @@
             </w:tabs>
             <w:rPr/>
           </w:pPr>
-          <w:hyperlink w:anchor="__RefHeading___Toc8198_2384007457" w:tooltip="9.7 Local variables: DIM">
+          <w:hyperlink w:anchor="__RefHeading___Toc8198_4193108665" w:tooltip="9.7 Local variables: DIM">
             <w:r>
               <w:rPr>
                 <w:rStyle w:val="IndexLink"/>
@@ -892,7 +892,7 @@
             </w:tabs>
             <w:rPr/>
           </w:pPr>
-          <w:hyperlink w:anchor="__RefHeading___Toc8200_2384007457" w:tooltip="9.8 QuickFunctions">
+          <w:hyperlink w:anchor="__RefHeading___Toc8200_4193108665" w:tooltip="9.8 QuickFunctions">
             <w:r>
               <w:rPr>
                 <w:rStyle w:val="IndexLink"/>
@@ -913,7 +913,7 @@
             </w:tabs>
             <w:rPr/>
           </w:pPr>
-          <w:hyperlink w:anchor="__RefHeading___Toc8202_2384007457" w:tooltip="10 Alarms and security">
+          <w:hyperlink w:anchor="__RefHeading___Toc8202_4193108665" w:tooltip="10 Alarms and security">
             <w:r>
               <w:rPr>
                 <w:rStyle w:val="IndexLink"/>
@@ -934,7 +934,7 @@
             </w:tabs>
             <w:rPr/>
           </w:pPr>
-          <w:hyperlink w:anchor="__RefHeading___Toc8204_2384007457" w:tooltip="10.1 Alarms">
+          <w:hyperlink w:anchor="__RefHeading___Toc8204_4193108665" w:tooltip="10.1 Alarms">
             <w:r>
               <w:rPr>
                 <w:rStyle w:val="IndexLink"/>
@@ -955,7 +955,7 @@
             </w:tabs>
             <w:rPr/>
           </w:pPr>
-          <w:hyperlink w:anchor="__RefHeading___Toc8206_2384007457" w:tooltip="10.2 Users and access levels">
+          <w:hyperlink w:anchor="__RefHeading___Toc8206_4193108665" w:tooltip="10.2 Users and access levels">
             <w:r>
               <w:rPr>
                 <w:rStyle w:val="IndexLink"/>
@@ -976,7 +976,7 @@
             </w:tabs>
             <w:rPr/>
           </w:pPr>
-          <w:hyperlink w:anchor="__RefHeading___Toc8208_2384007457" w:tooltip="11 Recipes">
+          <w:hyperlink w:anchor="__RefHeading___Toc8208_4193108665" w:tooltip="11 Recipes">
             <w:r>
               <w:rPr>
                 <w:rStyle w:val="IndexLink"/>
@@ -997,7 +997,7 @@
             </w:tabs>
             <w:rPr/>
           </w:pPr>
-          <w:hyperlink w:anchor="__RefHeading___Toc8210_2384007457" w:tooltip="11.1 Recipe books">
+          <w:hyperlink w:anchor="__RefHeading___Toc8210_4193108665" w:tooltip="11.1 Recipe books">
             <w:r>
               <w:rPr>
                 <w:rStyle w:val="IndexLink"/>
@@ -1018,7 +1018,7 @@
             </w:tabs>
             <w:rPr/>
           </w:pPr>
-          <w:hyperlink w:anchor="__RefHeading___Toc8212_2384007457" w:tooltip="11.2 The Recipes screen">
+          <w:hyperlink w:anchor="__RefHeading___Toc8212_4193108665" w:tooltip="11.2 The Recipes screen">
             <w:r>
               <w:rPr>
                 <w:rStyle w:val="IndexLink"/>
@@ -1039,7 +1039,7 @@
             </w:tabs>
             <w:rPr/>
           </w:pPr>
-          <w:hyperlink w:anchor="__RefHeading___Toc8214_2384007457" w:tooltip="11.3 The Recipe List object">
+          <w:hyperlink w:anchor="__RefHeading___Toc8214_4193108665" w:tooltip="11.3 The Recipe List object">
             <w:r>
               <w:rPr>
                 <w:rStyle w:val="IndexLink"/>
@@ -1060,7 +1060,7 @@
             </w:tabs>
             <w:rPr/>
           </w:pPr>
-          <w:hyperlink w:anchor="__RefHeading___Toc8216_2384007457" w:tooltip="11.4 Selecting a recipe in a window">
+          <w:hyperlink w:anchor="__RefHeading___Toc8216_4193108665" w:tooltip="11.4 Selecting a recipe in a window">
             <w:r>
               <w:rPr>
                 <w:rStyle w:val="IndexLink"/>
@@ -1081,7 +1081,7 @@
             </w:tabs>
             <w:rPr/>
           </w:pPr>
-          <w:hyperlink w:anchor="__RefHeading___Toc8218_2384007457" w:tooltip="11.5 When a recipe function fails">
+          <w:hyperlink w:anchor="__RefHeading___Toc8218_4193108665" w:tooltip="11.5 When a recipe function fails">
             <w:r>
               <w:rPr>
                 <w:rStyle w:val="IndexLink"/>
@@ -1102,7 +1102,7 @@
             </w:tabs>
             <w:rPr/>
           </w:pPr>
-          <w:hyperlink w:anchor="__RefHeading___Toc8220_2384007457" w:tooltip="11.6 Where recipes are kept">
+          <w:hyperlink w:anchor="__RefHeading___Toc8220_4193108665" w:tooltip="11.6 Where recipes are kept">
             <w:r>
               <w:rPr>
                 <w:rStyle w:val="IndexLink"/>
@@ -1123,7 +1123,7 @@
             </w:tabs>
             <w:rPr/>
           </w:pPr>
-          <w:hyperlink w:anchor="__RefHeading___Toc8222_2384007457" w:tooltip="12 Trends">
+          <w:hyperlink w:anchor="__RefHeading___Toc8222_4193108665" w:tooltip="12 Trends">
             <w:r>
               <w:rPr>
                 <w:rStyle w:val="IndexLink"/>
@@ -1144,7 +1144,7 @@
             </w:tabs>
             <w:rPr/>
           </w:pPr>
-          <w:hyperlink w:anchor="__RefHeading___Toc8224_2384007457" w:tooltip="12.1 The Trend object">
+          <w:hyperlink w:anchor="__RefHeading___Toc8224_4193108665" w:tooltip="12.1 The Trend object">
             <w:r>
               <w:rPr>
                 <w:rStyle w:val="IndexLink"/>
@@ -1165,7 +1165,7 @@
             </w:tabs>
             <w:rPr/>
           </w:pPr>
-          <w:hyperlink w:anchor="__RefHeading___Toc8226_2384007457" w:tooltip="12.2 Pens and their ranges">
+          <w:hyperlink w:anchor="__RefHeading___Toc8226_4193108665" w:tooltip="12.2 Pens and their ranges">
             <w:r>
               <w:rPr>
                 <w:rStyle w:val="IndexLink"/>
@@ -1186,7 +1186,7 @@
             </w:tabs>
             <w:rPr/>
           </w:pPr>
-          <w:hyperlink w:anchor="__RefHeading___Toc8228_2384007457" w:tooltip="12.3 The Trends screen">
+          <w:hyperlink w:anchor="__RefHeading___Toc8228_4193108665" w:tooltip="12.3 The Trends screen">
             <w:r>
               <w:rPr>
                 <w:rStyle w:val="IndexLink"/>
@@ -1207,7 +1207,7 @@
             </w:tabs>
             <w:rPr/>
           </w:pPr>
-          <w:hyperlink w:anchor="__RefHeading___Toc8230_2384007457" w:tooltip="12.4 Scrolling through the history">
+          <w:hyperlink w:anchor="__RefHeading___Toc8230_4193108665" w:tooltip="12.4 Scrolling through the history">
             <w:r>
               <w:rPr>
                 <w:rStyle w:val="IndexLink"/>
@@ -1228,7 +1228,7 @@
             </w:tabs>
             <w:rPr/>
           </w:pPr>
-          <w:hyperlink w:anchor="__RefHeading___Toc8232_2384007457" w:tooltip="12.5 Recording and where the history is kept">
+          <w:hyperlink w:anchor="__RefHeading___Toc8232_4193108665" w:tooltip="12.5 Recording and where the history is kept">
             <w:r>
               <w:rPr>
                 <w:rStyle w:val="IndexLink"/>
@@ -1249,7 +1249,7 @@
             </w:tabs>
             <w:rPr/>
           </w:pPr>
-          <w:hyperlink w:anchor="__RefHeading___Toc8234_2384007457" w:tooltip="13 Databases">
+          <w:hyperlink w:anchor="__RefHeading___Toc8234_4193108665" w:tooltip="13 Databases">
             <w:r>
               <w:rPr>
                 <w:rStyle w:val="IndexLink"/>
@@ -1270,7 +1270,7 @@
             </w:tabs>
             <w:rPr/>
           </w:pPr>
-          <w:hyperlink w:anchor="__RefHeading___Toc8236_2384007457" w:tooltip="13.1 Data sources">
+          <w:hyperlink w:anchor="__RefHeading___Toc8236_4193108665" w:tooltip="13.1 Data sources">
             <w:r>
               <w:rPr>
                 <w:rStyle w:val="IndexLink"/>
@@ -1291,7 +1291,7 @@
             </w:tabs>
             <w:rPr/>
           </w:pPr>
-          <w:hyperlink w:anchor="__RefHeading___Toc8238_2384007457" w:tooltip="13.2 Bind lists">
+          <w:hyperlink w:anchor="__RefHeading___Toc8238_4193108665" w:tooltip="13.2 Bind lists">
             <w:r>
               <w:rPr>
                 <w:rStyle w:val="IndexLink"/>
@@ -1312,7 +1312,7 @@
             </w:tabs>
             <w:rPr/>
           </w:pPr>
-          <w:hyperlink w:anchor="__RefHeading___Toc8240_2384007457" w:tooltip="13.3 Table templates and queries">
+          <w:hyperlink w:anchor="__RefHeading___Toc8240_4193108665" w:tooltip="13.3 Table templates and queries">
             <w:r>
               <w:rPr>
                 <w:rStyle w:val="IndexLink"/>
@@ -1333,7 +1333,7 @@
             </w:tabs>
             <w:rPr/>
           </w:pPr>
-          <w:hyperlink w:anchor="__RefHeading___Toc8242_2384007457" w:tooltip="13.4 The script functions">
+          <w:hyperlink w:anchor="__RefHeading___Toc8242_4193108665" w:tooltip="13.4 The script functions">
             <w:r>
               <w:rPr>
                 <w:rStyle w:val="IndexLink"/>
@@ -1354,7 +1354,7 @@
             </w:tabs>
             <w:rPr/>
           </w:pPr>
-          <w:hyperlink w:anchor="__RefHeading___Toc8244_2384007457" w:tooltip="13.5 The batch log in LiquidWeighHMI">
+          <w:hyperlink w:anchor="__RefHeading___Toc8244_4193108665" w:tooltip="13.5 The batch log in LiquidWeighHMI">
             <w:r>
               <w:rPr>
                 <w:rStyle w:val="IndexLink"/>
@@ -1375,7 +1375,7 @@
             </w:tabs>
             <w:rPr/>
           </w:pPr>
-          <w:hyperlink w:anchor="__RefHeading___Toc8246_2384007457" w:tooltip="13.6 Where the rows are kept">
+          <w:hyperlink w:anchor="__RefHeading___Toc8246_4193108665" w:tooltip="13.6 Where the rows are kept">
             <w:r>
               <w:rPr>
                 <w:rStyle w:val="IndexLink"/>
@@ -1396,7 +1396,7 @@
             </w:tabs>
             <w:rPr/>
           </w:pPr>
-          <w:hyperlink w:anchor="__RefHeading___Toc8248_2384007457" w:tooltip="14 List boxes">
+          <w:hyperlink w:anchor="__RefHeading___Toc8248_4193108665" w:tooltip="14 List boxes">
             <w:r>
               <w:rPr>
                 <w:rStyle w:val="IndexLink"/>
@@ -1417,7 +1417,7 @@
             </w:tabs>
             <w:rPr/>
           </w:pPr>
-          <w:hyperlink w:anchor="__RefHeading___Toc8250_2384007457" w:tooltip="14.1 The List Box object">
+          <w:hyperlink w:anchor="__RefHeading___Toc8250_4193108665" w:tooltip="14.1 The List Box object">
             <w:r>
               <w:rPr>
                 <w:rStyle w:val="IndexLink"/>
@@ -1438,7 +1438,7 @@
             </w:tabs>
             <w:rPr/>
           </w:pPr>
-          <w:hyperlink w:anchor="__RefHeading___Toc8252_2384007457" w:tooltip="14.2 Filling and working the list from scripts">
+          <w:hyperlink w:anchor="__RefHeading___Toc8252_4193108665" w:tooltip="14.2 Filling and working the list from scripts">
             <w:r>
               <w:rPr>
                 <w:rStyle w:val="IndexLink"/>
@@ -1459,7 +1459,7 @@
             </w:tabs>
             <w:rPr/>
           </w:pPr>
-          <w:hyperlink w:anchor="__RefHeading___Toc8254_2384007457" w:tooltip="14.3 The list belongs to the application, not to a window">
+          <w:hyperlink w:anchor="__RefHeading___Toc8254_4193108665" w:tooltip="14.3 The list belongs to the application, not to a window">
             <w:r>
               <w:rPr>
                 <w:rStyle w:val="IndexLink"/>
@@ -1480,7 +1480,7 @@
             </w:tabs>
             <w:rPr/>
           </w:pPr>
-          <w:hyperlink w:anchor="__RefHeading___Toc8256_2384007457" w:tooltip="14.4 A list filled from a database">
+          <w:hyperlink w:anchor="__RefHeading___Toc8256_4193108665" w:tooltip="14.4 A list filled from a database">
             <w:r>
               <w:rPr>
                 <w:rStyle w:val="IndexLink"/>
@@ -1501,7 +1501,7 @@
             </w:tabs>
             <w:rPr/>
           </w:pPr>
-          <w:hyperlink w:anchor="__RefHeading___Toc8258_2384007457" w:tooltip="15 Testing">
+          <w:hyperlink w:anchor="__RefHeading___Toc8258_4193108665" w:tooltip="15 Testing">
             <w:r>
               <w:rPr>
                 <w:rStyle w:val="IndexLink"/>
@@ -1522,7 +1522,7 @@
             </w:tabs>
             <w:rPr/>
           </w:pPr>
-          <w:hyperlink w:anchor="__RefHeading___Toc8260_2384007457" w:tooltip="15.1 Validate">
+          <w:hyperlink w:anchor="__RefHeading___Toc8260_4193108665" w:tooltip="15.1 Validate">
             <w:r>
               <w:rPr>
                 <w:rStyle w:val="IndexLink"/>
@@ -1543,7 +1543,7 @@
             </w:tabs>
             <w:rPr/>
           </w:pPr>
-          <w:hyperlink w:anchor="__RefHeading___Toc8262_2384007457" w:tooltip="15.2 Run">
+          <w:hyperlink w:anchor="__RefHeading___Toc8262_4193108665" w:tooltip="15.2 Run">
             <w:r>
               <w:rPr>
                 <w:rStyle w:val="IndexLink"/>
@@ -1564,7 +1564,7 @@
             </w:tabs>
             <w:rPr/>
           </w:pPr>
-          <w:hyperlink w:anchor="__RefHeading___Toc8264_2384007457" w:tooltip="16 Deploying">
+          <w:hyperlink w:anchor="__RefHeading___Toc8264_4193108665" w:tooltip="16 Deploying">
             <w:r>
               <w:rPr>
                 <w:rStyle w:val="IndexLink"/>
@@ -1585,7 +1585,7 @@
             </w:tabs>
             <w:rPr/>
           </w:pPr>
-          <w:hyperlink w:anchor="__RefHeading___Toc8266_2384007457" w:tooltip="16.1 Publish">
+          <w:hyperlink w:anchor="__RefHeading___Toc8266_4193108665" w:tooltip="16.1 Publish">
             <w:r>
               <w:rPr>
                 <w:rStyle w:val="IndexLink"/>
@@ -1606,7 +1606,7 @@
             </w:tabs>
             <w:rPr/>
           </w:pPr>
-          <w:hyperlink w:anchor="__RefHeading___Toc8268_2384007457" w:tooltip="16.2 Append HMI Desktop">
+          <w:hyperlink w:anchor="__RefHeading___Toc8268_4193108665" w:tooltip="16.2 Append HMI Desktop">
             <w:r>
               <w:rPr>
                 <w:rStyle w:val="IndexLink"/>
@@ -1627,7 +1627,7 @@
             </w:tabs>
             <w:rPr/>
           </w:pPr>
-          <w:hyperlink w:anchor="__RefHeading___Toc8270_2384007457" w:tooltip="16.3 Append HMI Web">
+          <w:hyperlink w:anchor="__RefHeading___Toc8270_4193108665" w:tooltip="16.3 Append HMI Web">
             <w:r>
               <w:rPr>
                 <w:rStyle w:val="IndexLink"/>
@@ -1648,7 +1648,7 @@
             </w:tabs>
             <w:rPr/>
           </w:pPr>
-          <w:hyperlink w:anchor="__RefHeading___Toc8272_2384007457" w:tooltip="17 Tips and troubleshooting">
+          <w:hyperlink w:anchor="__RefHeading___Toc8272_4193108665" w:tooltip="17 Tips and troubleshooting">
             <w:r>
               <w:rPr>
                 <w:rStyle w:val="IndexLink"/>
@@ -1669,7 +1669,7 @@
             </w:tabs>
             <w:rPr/>
           </w:pPr>
-          <w:hyperlink w:anchor="__RefHeading___Toc8274_2384007457" w:tooltip="Appendix A Command-line automation">
+          <w:hyperlink w:anchor="__RefHeading___Toc8274_4193108665" w:tooltip="Appendix A Command-line automation">
             <w:r>
               <w:rPr>
                 <w:rStyle w:val="IndexLink"/>
@@ -1707,7 +1707,7 @@
         <w:spacing w:before="0" w:after="0"/>
         <w:rPr/>
       </w:pPr>
-      <w:bookmarkStart w:id="0" w:name="__RefHeading___Toc8142_2384007457"/>
+      <w:bookmarkStart w:id="0" w:name="__RefHeading___Toc8142_4193108665"/>
       <w:bookmarkEnd w:id="0"/>
       <w:r>
         <w:rPr/>
@@ -2563,7 +2563,7 @@
         <w:pStyle w:val="Heading2"/>
         <w:rPr/>
       </w:pPr>
-      <w:bookmarkStart w:id="1" w:name="__RefHeading___Toc8144_2384007457"/>
+      <w:bookmarkStart w:id="1" w:name="__RefHeading___Toc8144_4193108665"/>
       <w:bookmarkEnd w:id="1"/>
       <w:r>
         <w:rPr/>
@@ -3753,7 +3753,7 @@
         <w:pStyle w:val="Heading2"/>
         <w:rPr/>
       </w:pPr>
-      <w:bookmarkStart w:id="2" w:name="__RefHeading___Toc8146_2384007457"/>
+      <w:bookmarkStart w:id="2" w:name="__RefHeading___Toc8146_4193108665"/>
       <w:bookmarkEnd w:id="2"/>
       <w:r>
         <w:rPr/>
@@ -3896,7 +3896,7 @@
         <w:pStyle w:val="Heading1"/>
         <w:rPr/>
       </w:pPr>
-      <w:bookmarkStart w:id="3" w:name="__RefHeading___Toc8148_2384007457"/>
+      <w:bookmarkStart w:id="3" w:name="__RefHeading___Toc8148_4193108665"/>
       <w:bookmarkEnd w:id="3"/>
       <w:r>
         <w:rPr/>
@@ -4474,7 +4474,7 @@
         <w:pStyle w:val="Heading2"/>
         <w:rPr/>
       </w:pPr>
-      <w:bookmarkStart w:id="4" w:name="__RefHeading___Toc8150_2384007457"/>
+      <w:bookmarkStart w:id="4" w:name="__RefHeading___Toc8150_4193108665"/>
       <w:bookmarkEnd w:id="4"/>
       <w:r>
         <w:rPr/>
@@ -5514,7 +5514,7 @@
         <w:pStyle w:val="Heading1"/>
         <w:rPr/>
       </w:pPr>
-      <w:bookmarkStart w:id="5" w:name="__RefHeading___Toc8152_2384007457"/>
+      <w:bookmarkStart w:id="5" w:name="__RefHeading___Toc8152_4193108665"/>
       <w:bookmarkEnd w:id="5"/>
       <w:r>
         <w:rPr/>
@@ -5552,7 +5552,7 @@
         <w:rPr/>
         <w:drawing>
           <wp:inline distT="0" distB="0" distL="0" distR="0">
-            <wp:extent cx="4206240" cy="5907405"/>
+            <wp:extent cx="4206240" cy="5945505"/>
             <wp:effectExtent l="0" t="0" r="0" b="0"/>
             <wp:docPr id="4" name="Picture 4"/>
             <wp:cNvGraphicFramePr>
@@ -5576,7 +5576,7 @@
                   <pic:spPr bwMode="auto">
                     <a:xfrm>
                       <a:off x="0" y="0"/>
-                      <a:ext cx="4206240" cy="5907405"/>
+                      <a:ext cx="4206240" cy="5945505"/>
                     </a:xfrm>
                     <a:prstGeom prst="rect">
                       <a:avLst/>
@@ -5680,7 +5680,7 @@
         <w:rPr/>
         <w:drawing>
           <wp:inline distT="0" distB="0" distL="0" distR="0">
-            <wp:extent cx="4206240" cy="5907405"/>
+            <wp:extent cx="4206240" cy="5945505"/>
             <wp:effectExtent l="0" t="0" r="0" b="0"/>
             <wp:docPr id="5" name="Picture 5"/>
             <wp:cNvGraphicFramePr>
@@ -5704,7 +5704,7 @@
                   <pic:spPr bwMode="auto">
                     <a:xfrm>
                       <a:off x="0" y="0"/>
-                      <a:ext cx="4206240" cy="5907405"/>
+                      <a:ext cx="4206240" cy="5945505"/>
                     </a:xfrm>
                     <a:prstGeom prst="rect">
                       <a:avLst/>
@@ -5904,7 +5904,7 @@
         <w:pStyle w:val="Heading1"/>
         <w:rPr/>
       </w:pPr>
-      <w:bookmarkStart w:id="6" w:name="__RefHeading___Toc8154_2384007457"/>
+      <w:bookmarkStart w:id="6" w:name="__RefHeading___Toc8154_4193108665"/>
       <w:bookmarkEnd w:id="6"/>
       <w:r>
         <w:rPr/>
@@ -6699,7 +6699,7 @@
         <w:pStyle w:val="Heading1"/>
         <w:rPr/>
       </w:pPr>
-      <w:bookmarkStart w:id="7" w:name="__RefHeading___Toc8156_2384007457"/>
+      <w:bookmarkStart w:id="7" w:name="__RefHeading___Toc8156_4193108665"/>
       <w:bookmarkEnd w:id="7"/>
       <w:r>
         <w:rPr/>
@@ -7550,7 +7550,7 @@
         <w:pStyle w:val="Heading2"/>
         <w:rPr/>
       </w:pPr>
-      <w:bookmarkStart w:id="8" w:name="__RefHeading___Toc8158_2384007457"/>
+      <w:bookmarkStart w:id="8" w:name="__RefHeading___Toc8158_4193108665"/>
       <w:bookmarkEnd w:id="8"/>
       <w:r>
         <w:rPr/>
@@ -8200,7 +8200,7 @@
         <w:pStyle w:val="Heading2"/>
         <w:rPr/>
       </w:pPr>
-      <w:bookmarkStart w:id="9" w:name="__RefHeading___Toc8160_2384007457"/>
+      <w:bookmarkStart w:id="9" w:name="__RefHeading___Toc8160_4193108665"/>
       <w:bookmarkEnd w:id="9"/>
       <w:r>
         <w:rPr/>
@@ -8332,7 +8332,7 @@
         <w:pStyle w:val="Heading2"/>
         <w:rPr/>
       </w:pPr>
-      <w:bookmarkStart w:id="10" w:name="__RefHeading___Toc8162_2384007457"/>
+      <w:bookmarkStart w:id="10" w:name="__RefHeading___Toc8162_4193108665"/>
       <w:bookmarkEnd w:id="10"/>
       <w:r>
         <w:rPr/>
@@ -8462,7 +8462,7 @@
         <w:pStyle w:val="Heading1"/>
         <w:rPr/>
       </w:pPr>
-      <w:bookmarkStart w:id="11" w:name="__RefHeading___Toc8164_2384007457"/>
+      <w:bookmarkStart w:id="11" w:name="__RefHeading___Toc8164_4193108665"/>
       <w:bookmarkEnd w:id="11"/>
       <w:r>
         <w:rPr/>
@@ -8975,7 +8975,7 @@
         <w:pStyle w:val="Heading2"/>
         <w:rPr/>
       </w:pPr>
-      <w:bookmarkStart w:id="12" w:name="__RefHeading___Toc8166_2384007457"/>
+      <w:bookmarkStart w:id="12" w:name="__RefHeading___Toc8166_4193108665"/>
       <w:bookmarkEnd w:id="12"/>
       <w:r>
         <w:rPr/>
@@ -9879,7 +9879,7 @@
         <w:pStyle w:val="Heading2"/>
         <w:rPr/>
       </w:pPr>
-      <w:bookmarkStart w:id="13" w:name="__RefHeading___Toc8168_2384007457"/>
+      <w:bookmarkStart w:id="13" w:name="__RefHeading___Toc8168_4193108665"/>
       <w:bookmarkEnd w:id="13"/>
       <w:r>
         <w:rPr/>
@@ -10051,7 +10051,7 @@
         <w:pStyle w:val="Heading1"/>
         <w:rPr/>
       </w:pPr>
-      <w:bookmarkStart w:id="14" w:name="__RefHeading___Toc8170_2384007457"/>
+      <w:bookmarkStart w:id="14" w:name="__RefHeading___Toc8170_4193108665"/>
       <w:bookmarkEnd w:id="14"/>
       <w:r>
         <w:rPr/>
@@ -10827,7 +10827,7 @@
         <w:pStyle w:val="Heading1"/>
         <w:rPr/>
       </w:pPr>
-      <w:bookmarkStart w:id="15" w:name="__RefHeading___Toc8172_2384007457"/>
+      <w:bookmarkStart w:id="15" w:name="__RefHeading___Toc8172_4193108665"/>
       <w:bookmarkEnd w:id="15"/>
       <w:r>
         <w:rPr/>
@@ -11590,7 +11590,7 @@
         <w:pStyle w:val="Heading2"/>
         <w:rPr/>
       </w:pPr>
-      <w:bookmarkStart w:id="16" w:name="__RefHeading___Toc8174_2384007457"/>
+      <w:bookmarkStart w:id="16" w:name="__RefHeading___Toc8174_4193108665"/>
       <w:bookmarkEnd w:id="16"/>
       <w:r>
         <w:rPr/>
@@ -11776,7 +11776,7 @@
         <w:pStyle w:val="Heading2"/>
         <w:rPr/>
       </w:pPr>
-      <w:bookmarkStart w:id="17" w:name="__RefHeading___Toc8176_2384007457"/>
+      <w:bookmarkStart w:id="17" w:name="__RefHeading___Toc8176_4193108665"/>
       <w:bookmarkEnd w:id="17"/>
       <w:r>
         <w:rPr/>
@@ -11900,7 +11900,7 @@
         <w:pStyle w:val="Heading2"/>
         <w:rPr/>
       </w:pPr>
-      <w:bookmarkStart w:id="18" w:name="__RefHeading___Toc8178_2384007457"/>
+      <w:bookmarkStart w:id="18" w:name="__RefHeading___Toc8178_4193108665"/>
       <w:bookmarkEnd w:id="18"/>
       <w:r>
         <w:rPr/>
@@ -12016,7 +12016,7 @@
         <w:pStyle w:val="Heading2"/>
         <w:rPr/>
       </w:pPr>
-      <w:bookmarkStart w:id="19" w:name="__RefHeading___Toc8180_2384007457"/>
+      <w:bookmarkStart w:id="19" w:name="__RefHeading___Toc8180_4193108665"/>
       <w:bookmarkEnd w:id="19"/>
       <w:r>
         <w:rPr/>
@@ -12205,7 +12205,7 @@
         <w:pStyle w:val="Heading2"/>
         <w:rPr/>
       </w:pPr>
-      <w:bookmarkStart w:id="20" w:name="__RefHeading___Toc8182_2384007457"/>
+      <w:bookmarkStart w:id="20" w:name="__RefHeading___Toc8182_4193108665"/>
       <w:bookmarkEnd w:id="20"/>
       <w:r>
         <w:rPr/>
@@ -12745,7 +12745,7 @@
         <w:pStyle w:val="Heading1"/>
         <w:rPr/>
       </w:pPr>
-      <w:bookmarkStart w:id="21" w:name="__RefHeading___Toc8184_2384007457"/>
+      <w:bookmarkStart w:id="21" w:name="__RefHeading___Toc8184_4193108665"/>
       <w:bookmarkEnd w:id="21"/>
       <w:r>
         <w:rPr/>
@@ -14113,7 +14113,7 @@
         <w:pStyle w:val="Heading2"/>
         <w:rPr/>
       </w:pPr>
-      <w:bookmarkStart w:id="22" w:name="__RefHeading___Toc8186_2384007457"/>
+      <w:bookmarkStart w:id="22" w:name="__RefHeading___Toc8186_4193108665"/>
       <w:bookmarkEnd w:id="22"/>
       <w:r>
         <w:rPr/>
@@ -14525,7 +14525,7 @@
         <w:pStyle w:val="Heading2"/>
         <w:rPr/>
       </w:pPr>
-      <w:bookmarkStart w:id="23" w:name="__RefHeading___Toc8188_2384007457"/>
+      <w:bookmarkStart w:id="23" w:name="__RefHeading___Toc8188_4193108665"/>
       <w:bookmarkEnd w:id="23"/>
       <w:r>
         <w:rPr/>
@@ -14644,7 +14644,7 @@
         <w:pStyle w:val="Heading2"/>
         <w:rPr/>
       </w:pPr>
-      <w:bookmarkStart w:id="24" w:name="__RefHeading___Toc8190_2384007457"/>
+      <w:bookmarkStart w:id="24" w:name="__RefHeading___Toc8190_4193108665"/>
       <w:bookmarkEnd w:id="24"/>
       <w:r>
         <w:rPr/>
@@ -24255,7 +24255,7 @@
         <w:pStyle w:val="Heading2"/>
         <w:rPr/>
       </w:pPr>
-      <w:bookmarkStart w:id="25" w:name="__RefHeading___Toc8192_2384007457"/>
+      <w:bookmarkStart w:id="25" w:name="__RefHeading___Toc8192_4193108665"/>
       <w:bookmarkEnd w:id="25"/>
       <w:r>
         <w:rPr/>
@@ -25094,7 +25094,7 @@
         <w:pStyle w:val="Heading2"/>
         <w:rPr/>
       </w:pPr>
-      <w:bookmarkStart w:id="26" w:name="__RefHeading___Toc8194_2384007457"/>
+      <w:bookmarkStart w:id="26" w:name="__RefHeading___Toc8194_4193108665"/>
       <w:bookmarkEnd w:id="26"/>
       <w:r>
         <w:rPr/>
@@ -25580,7 +25580,7 @@
         <w:pStyle w:val="Heading2"/>
         <w:rPr/>
       </w:pPr>
-      <w:bookmarkStart w:id="27" w:name="__RefHeading___Toc8196_2384007457"/>
+      <w:bookmarkStart w:id="27" w:name="__RefHeading___Toc8196_4193108665"/>
       <w:bookmarkEnd w:id="27"/>
       <w:r>
         <w:rPr/>
@@ -25772,7 +25772,7 @@
         <w:pStyle w:val="Heading2"/>
         <w:rPr/>
       </w:pPr>
-      <w:bookmarkStart w:id="28" w:name="__RefHeading___Toc8198_2384007457"/>
+      <w:bookmarkStart w:id="28" w:name="__RefHeading___Toc8198_4193108665"/>
       <w:bookmarkEnd w:id="28"/>
       <w:r>
         <w:rPr/>
@@ -26458,7 +26458,7 @@
         <w:pStyle w:val="Heading2"/>
         <w:rPr/>
       </w:pPr>
-      <w:bookmarkStart w:id="29" w:name="__RefHeading___Toc8200_2384007457"/>
+      <w:bookmarkStart w:id="29" w:name="__RefHeading___Toc8200_4193108665"/>
       <w:bookmarkEnd w:id="29"/>
       <w:r>
         <w:rPr/>
@@ -27212,7 +27212,7 @@
         <w:pStyle w:val="Heading1"/>
         <w:rPr/>
       </w:pPr>
-      <w:bookmarkStart w:id="30" w:name="__RefHeading___Toc8202_2384007457"/>
+      <w:bookmarkStart w:id="30" w:name="__RefHeading___Toc8202_4193108665"/>
       <w:bookmarkEnd w:id="30"/>
       <w:r>
         <w:rPr/>
@@ -27224,7 +27224,7 @@
         <w:pStyle w:val="Heading2"/>
         <w:rPr/>
       </w:pPr>
-      <w:bookmarkStart w:id="31" w:name="__RefHeading___Toc8204_2384007457"/>
+      <w:bookmarkStart w:id="31" w:name="__RefHeading___Toc8204_4193108665"/>
       <w:bookmarkEnd w:id="31"/>
       <w:r>
         <w:rPr/>
@@ -28555,7 +28555,7 @@
         <w:pStyle w:val="Heading2"/>
         <w:rPr/>
       </w:pPr>
-      <w:bookmarkStart w:id="32" w:name="__RefHeading___Toc8206_2384007457"/>
+      <w:bookmarkStart w:id="32" w:name="__RefHeading___Toc8206_4193108665"/>
       <w:bookmarkEnd w:id="32"/>
       <w:r>
         <w:rPr/>
@@ -29245,7 +29245,7 @@
         <w:pStyle w:val="Heading1"/>
         <w:rPr/>
       </w:pPr>
-      <w:bookmarkStart w:id="33" w:name="__RefHeading___Toc8208_2384007457"/>
+      <w:bookmarkStart w:id="33" w:name="__RefHeading___Toc8208_4193108665"/>
       <w:bookmarkEnd w:id="33"/>
       <w:r>
         <w:rPr/>
@@ -29384,7 +29384,7 @@
         <w:pStyle w:val="Heading2"/>
         <w:rPr/>
       </w:pPr>
-      <w:bookmarkStart w:id="34" w:name="__RefHeading___Toc8210_2384007457"/>
+      <w:bookmarkStart w:id="34" w:name="__RefHeading___Toc8210_4193108665"/>
       <w:bookmarkEnd w:id="34"/>
       <w:r>
         <w:rPr/>
@@ -31245,7 +31245,7 @@
         <w:pStyle w:val="Heading2"/>
         <w:rPr/>
       </w:pPr>
-      <w:bookmarkStart w:id="35" w:name="__RefHeading___Toc8212_2384007457"/>
+      <w:bookmarkStart w:id="35" w:name="__RefHeading___Toc8212_4193108665"/>
       <w:bookmarkEnd w:id="35"/>
       <w:r>
         <w:rPr/>
@@ -32695,7 +32695,7 @@
         <w:pStyle w:val="Heading2"/>
         <w:rPr/>
       </w:pPr>
-      <w:bookmarkStart w:id="36" w:name="__RefHeading___Toc8214_2384007457"/>
+      <w:bookmarkStart w:id="36" w:name="__RefHeading___Toc8214_4193108665"/>
       <w:bookmarkEnd w:id="36"/>
       <w:r>
         <w:rPr/>
@@ -33405,7 +33405,7 @@
         <w:pStyle w:val="Heading2"/>
         <w:rPr/>
       </w:pPr>
-      <w:bookmarkStart w:id="37" w:name="__RefHeading___Toc8216_2384007457"/>
+      <w:bookmarkStart w:id="37" w:name="__RefHeading___Toc8216_4193108665"/>
       <w:bookmarkEnd w:id="37"/>
       <w:r>
         <w:rPr/>
@@ -33687,7 +33687,7 @@
         <w:pStyle w:val="Heading2"/>
         <w:rPr/>
       </w:pPr>
-      <w:bookmarkStart w:id="38" w:name="__RefHeading___Toc8218_2384007457"/>
+      <w:bookmarkStart w:id="38" w:name="__RefHeading___Toc8218_4193108665"/>
       <w:bookmarkEnd w:id="38"/>
       <w:r>
         <w:rPr/>
@@ -33848,7 +33848,7 @@
         <w:pStyle w:val="Heading2"/>
         <w:rPr/>
       </w:pPr>
-      <w:bookmarkStart w:id="39" w:name="__RefHeading___Toc8220_2384007457"/>
+      <w:bookmarkStart w:id="39" w:name="__RefHeading___Toc8220_4193108665"/>
       <w:bookmarkEnd w:id="39"/>
       <w:r>
         <w:rPr/>
@@ -34248,7 +34248,7 @@
         <w:pStyle w:val="Heading1"/>
         <w:rPr/>
       </w:pPr>
-      <w:bookmarkStart w:id="40" w:name="__RefHeading___Toc8222_2384007457"/>
+      <w:bookmarkStart w:id="40" w:name="__RefHeading___Toc8222_4193108665"/>
       <w:bookmarkEnd w:id="40"/>
       <w:r>
         <w:rPr/>
@@ -34280,7 +34280,7 @@
         <w:pStyle w:val="Heading2"/>
         <w:rPr/>
       </w:pPr>
-      <w:bookmarkStart w:id="41" w:name="__RefHeading___Toc8224_2384007457"/>
+      <w:bookmarkStart w:id="41" w:name="__RefHeading___Toc8224_4193108665"/>
       <w:bookmarkEnd w:id="41"/>
       <w:r>
         <w:rPr/>
@@ -35485,7 +35485,7 @@
         <w:pStyle w:val="Heading2"/>
         <w:rPr/>
       </w:pPr>
-      <w:bookmarkStart w:id="42" w:name="__RefHeading___Toc8226_2384007457"/>
+      <w:bookmarkStart w:id="42" w:name="__RefHeading___Toc8226_4193108665"/>
       <w:bookmarkEnd w:id="42"/>
       <w:r>
         <w:rPr/>
@@ -36871,7 +36871,7 @@
         <w:pStyle w:val="Heading2"/>
         <w:rPr/>
       </w:pPr>
-      <w:bookmarkStart w:id="43" w:name="__RefHeading___Toc8228_2384007457"/>
+      <w:bookmarkStart w:id="43" w:name="__RefHeading___Toc8228_4193108665"/>
       <w:bookmarkEnd w:id="43"/>
       <w:r>
         <w:rPr/>
@@ -37457,7 +37457,7 @@
         <w:pStyle w:val="Heading2"/>
         <w:rPr/>
       </w:pPr>
-      <w:bookmarkStart w:id="44" w:name="__RefHeading___Toc8230_2384007457"/>
+      <w:bookmarkStart w:id="44" w:name="__RefHeading___Toc8230_4193108665"/>
       <w:bookmarkEnd w:id="44"/>
       <w:r>
         <w:rPr/>
@@ -37552,7 +37552,7 @@
         <w:pStyle w:val="Heading2"/>
         <w:rPr/>
       </w:pPr>
-      <w:bookmarkStart w:id="45" w:name="__RefHeading___Toc8232_2384007457"/>
+      <w:bookmarkStart w:id="45" w:name="__RefHeading___Toc8232_4193108665"/>
       <w:bookmarkEnd w:id="45"/>
       <w:r>
         <w:rPr/>
@@ -38006,7 +38006,7 @@
         <w:pStyle w:val="Heading1"/>
         <w:rPr/>
       </w:pPr>
-      <w:bookmarkStart w:id="46" w:name="__RefHeading___Toc8234_2384007457"/>
+      <w:bookmarkStart w:id="46" w:name="__RefHeading___Toc8234_4193108665"/>
       <w:bookmarkEnd w:id="46"/>
       <w:r>
         <w:rPr/>
@@ -38171,7 +38171,7 @@
         <w:pStyle w:val="Heading2"/>
         <w:rPr/>
       </w:pPr>
-      <w:bookmarkStart w:id="47" w:name="__RefHeading___Toc8236_2384007457"/>
+      <w:bookmarkStart w:id="47" w:name="__RefHeading___Toc8236_4193108665"/>
       <w:bookmarkEnd w:id="47"/>
       <w:r>
         <w:rPr/>
@@ -39288,7 +39288,7 @@
         <w:pStyle w:val="Heading2"/>
         <w:rPr/>
       </w:pPr>
-      <w:bookmarkStart w:id="48" w:name="__RefHeading___Toc8238_2384007457"/>
+      <w:bookmarkStart w:id="48" w:name="__RefHeading___Toc8238_4193108665"/>
       <w:bookmarkEnd w:id="48"/>
       <w:r>
         <w:rPr/>
@@ -39522,7 +39522,7 @@
         <w:pStyle w:val="Heading2"/>
         <w:rPr/>
       </w:pPr>
-      <w:bookmarkStart w:id="49" w:name="__RefHeading___Toc8240_2384007457"/>
+      <w:bookmarkStart w:id="49" w:name="__RefHeading___Toc8240_4193108665"/>
       <w:bookmarkEnd w:id="49"/>
       <w:r>
         <w:rPr/>
@@ -40339,7 +40339,7 @@
         <w:pStyle w:val="Heading2"/>
         <w:rPr/>
       </w:pPr>
-      <w:bookmarkStart w:id="50" w:name="__RefHeading___Toc8242_2384007457"/>
+      <w:bookmarkStart w:id="50" w:name="__RefHeading___Toc8242_4193108665"/>
       <w:bookmarkEnd w:id="50"/>
       <w:r>
         <w:rPr/>
@@ -42035,7 +42035,7 @@
         <w:pStyle w:val="Heading2"/>
         <w:rPr/>
       </w:pPr>
-      <w:bookmarkStart w:id="51" w:name="__RefHeading___Toc8244_2384007457"/>
+      <w:bookmarkStart w:id="51" w:name="__RefHeading___Toc8244_4193108665"/>
       <w:bookmarkEnd w:id="51"/>
       <w:r>
         <w:rPr/>
@@ -42735,7 +42735,7 @@
         <w:pStyle w:val="Heading2"/>
         <w:rPr/>
       </w:pPr>
-      <w:bookmarkStart w:id="52" w:name="__RefHeading___Toc8246_2384007457"/>
+      <w:bookmarkStart w:id="52" w:name="__RefHeading___Toc8246_4193108665"/>
       <w:bookmarkEnd w:id="52"/>
       <w:r>
         <w:rPr/>
@@ -43093,7 +43093,7 @@
         <w:pStyle w:val="Heading1"/>
         <w:rPr/>
       </w:pPr>
-      <w:bookmarkStart w:id="53" w:name="__RefHeading___Toc8248_2384007457"/>
+      <w:bookmarkStart w:id="53" w:name="__RefHeading___Toc8248_4193108665"/>
       <w:bookmarkEnd w:id="53"/>
       <w:r>
         <w:rPr/>
@@ -43125,7 +43125,7 @@
         <w:pStyle w:val="Heading2"/>
         <w:rPr/>
       </w:pPr>
-      <w:bookmarkStart w:id="54" w:name="__RefHeading___Toc8250_2384007457"/>
+      <w:bookmarkStart w:id="54" w:name="__RefHeading___Toc8250_4193108665"/>
       <w:bookmarkEnd w:id="54"/>
       <w:r>
         <w:rPr/>
@@ -44449,7 +44449,7 @@
         <w:pStyle w:val="Heading2"/>
         <w:rPr/>
       </w:pPr>
-      <w:bookmarkStart w:id="55" w:name="__RefHeading___Toc8252_2384007457"/>
+      <w:bookmarkStart w:id="55" w:name="__RefHeading___Toc8252_4193108665"/>
       <w:bookmarkEnd w:id="55"/>
       <w:r>
         <w:rPr/>
@@ -45184,7 +45184,7 @@
         <w:pStyle w:val="Heading2"/>
         <w:rPr/>
       </w:pPr>
-      <w:bookmarkStart w:id="56" w:name="__RefHeading___Toc8254_2384007457"/>
+      <w:bookmarkStart w:id="56" w:name="__RefHeading___Toc8254_4193108665"/>
       <w:bookmarkEnd w:id="56"/>
       <w:r>
         <w:rPr/>
@@ -45236,7 +45236,7 @@
         <w:pStyle w:val="Heading2"/>
         <w:rPr/>
       </w:pPr>
-      <w:bookmarkStart w:id="57" w:name="__RefHeading___Toc8256_2384007457"/>
+      <w:bookmarkStart w:id="57" w:name="__RefHeading___Toc8256_4193108665"/>
       <w:bookmarkEnd w:id="57"/>
       <w:r>
         <w:rPr/>
@@ -45519,7 +45519,7 @@
         <w:pStyle w:val="Heading1"/>
         <w:rPr/>
       </w:pPr>
-      <w:bookmarkStart w:id="58" w:name="__RefHeading___Toc8258_2384007457"/>
+      <w:bookmarkStart w:id="58" w:name="__RefHeading___Toc8258_4193108665"/>
       <w:bookmarkEnd w:id="58"/>
       <w:r>
         <w:rPr/>
@@ -45531,7 +45531,7 @@
         <w:pStyle w:val="Heading2"/>
         <w:rPr/>
       </w:pPr>
-      <w:bookmarkStart w:id="59" w:name="__RefHeading___Toc8260_2384007457"/>
+      <w:bookmarkStart w:id="59" w:name="__RefHeading___Toc8260_4193108665"/>
       <w:bookmarkEnd w:id="59"/>
       <w:r>
         <w:rPr/>
@@ -45619,7 +45619,7 @@
         <w:pStyle w:val="Heading2"/>
         <w:rPr/>
       </w:pPr>
-      <w:bookmarkStart w:id="60" w:name="__RefHeading___Toc8262_2384007457"/>
+      <w:bookmarkStart w:id="60" w:name="__RefHeading___Toc8262_4193108665"/>
       <w:bookmarkEnd w:id="60"/>
       <w:r>
         <w:rPr/>
@@ -46185,7 +46185,7 @@
         <w:pStyle w:val="Heading1"/>
         <w:rPr/>
       </w:pPr>
-      <w:bookmarkStart w:id="61" w:name="__RefHeading___Toc8264_2384007457"/>
+      <w:bookmarkStart w:id="61" w:name="__RefHeading___Toc8264_4193108665"/>
       <w:bookmarkEnd w:id="61"/>
       <w:r>
         <w:rPr/>
@@ -46641,7 +46641,7 @@
         <w:pStyle w:val="Heading2"/>
         <w:rPr/>
       </w:pPr>
-      <w:bookmarkStart w:id="62" w:name="__RefHeading___Toc8266_2384007457"/>
+      <w:bookmarkStart w:id="62" w:name="__RefHeading___Toc8266_4193108665"/>
       <w:bookmarkEnd w:id="62"/>
       <w:r>
         <w:rPr/>
@@ -46732,7 +46732,7 @@
         <w:pStyle w:val="Heading2"/>
         <w:rPr/>
       </w:pPr>
-      <w:bookmarkStart w:id="63" w:name="__RefHeading___Toc8268_2384007457"/>
+      <w:bookmarkStart w:id="63" w:name="__RefHeading___Toc8268_4193108665"/>
       <w:bookmarkEnd w:id="63"/>
       <w:r>
         <w:rPr/>
@@ -46845,7 +46845,7 @@
         <w:pStyle w:val="Heading2"/>
         <w:rPr/>
       </w:pPr>
-      <w:bookmarkStart w:id="64" w:name="__RefHeading___Toc8270_2384007457"/>
+      <w:bookmarkStart w:id="64" w:name="__RefHeading___Toc8270_4193108665"/>
       <w:bookmarkEnd w:id="64"/>
       <w:r>
         <w:rPr/>
@@ -47058,7 +47058,7 @@
         <w:pStyle w:val="Heading1"/>
         <w:rPr/>
       </w:pPr>
-      <w:bookmarkStart w:id="65" w:name="__RefHeading___Toc8272_2384007457"/>
+      <w:bookmarkStart w:id="65" w:name="__RefHeading___Toc8272_4193108665"/>
       <w:bookmarkEnd w:id="65"/>
       <w:r>
         <w:rPr/>
@@ -47850,7 +47850,7 @@
         <w:pStyle w:val="Heading1"/>
         <w:rPr/>
       </w:pPr>
-      <w:bookmarkStart w:id="66" w:name="__RefHeading___Toc8274_2384007457"/>
+      <w:bookmarkStart w:id="66" w:name="__RefHeading___Toc8274_4193108665"/>
       <w:bookmarkEnd w:id="66"/>
       <w:r>
         <w:rPr/>

</xml_diff>

<commit_message>
docs: the manual's Application Settings figure from the installed 1.12.0 build
The Runtime hint in that dialog now names the new Close the window normally
setting, so the figure was retaken on the Windows box from the installed
1.12.0 editor, and the manual rebuilt around it.

Co-Authored-By: Claude Opus 5 <noreply@anthropic.com>
</commit_message>
<xml_diff>
--- a/doc/Append-HMI-Studio-User-Manual.docx
+++ b/doc/Append-HMI-Studio-User-Manual.docx
@@ -283,7 +283,7 @@
             </w:rPr>
             <w:fldChar w:fldCharType="separate"/>
           </w:r>
-          <w:hyperlink w:anchor="__RefHeading___Toc8142_4193108665" w:tooltip="1 Introduction">
+          <w:hyperlink w:anchor="__RefHeading___Toc8142_355266826" w:tooltip="1 Introduction">
             <w:r>
               <w:rPr>
                 <w:rStyle w:val="IndexLink"/>
@@ -304,7 +304,7 @@
             </w:tabs>
             <w:rPr/>
           </w:pPr>
-          <w:hyperlink w:anchor="__RefHeading___Toc8144_4193108665" w:tooltip="1.1 Building applications with an AI agent">
+          <w:hyperlink w:anchor="__RefHeading___Toc8144_355266826" w:tooltip="1.1 Building applications with an AI agent">
             <w:r>
               <w:rPr>
                 <w:rStyle w:val="IndexLink"/>
@@ -325,7 +325,7 @@
             </w:tabs>
             <w:rPr/>
           </w:pPr>
-          <w:hyperlink w:anchor="__RefHeading___Toc8146_4193108665" w:tooltip="1.2 How an HMI application is organized">
+          <w:hyperlink w:anchor="__RefHeading___Toc8146_355266826" w:tooltip="1.2 How an HMI application is organized">
             <w:r>
               <w:rPr>
                 <w:rStyle w:val="IndexLink"/>
@@ -346,7 +346,7 @@
             </w:tabs>
             <w:rPr/>
           </w:pPr>
-          <w:hyperlink w:anchor="__RefHeading___Toc8148_4193108665" w:tooltip="2 The Studio window">
+          <w:hyperlink w:anchor="__RefHeading___Toc8148_355266826" w:tooltip="2 The Studio window">
             <w:r>
               <w:rPr>
                 <w:rStyle w:val="IndexLink"/>
@@ -367,7 +367,7 @@
             </w:tabs>
             <w:rPr/>
           </w:pPr>
-          <w:hyperlink w:anchor="__RefHeading___Toc8150_4193108665" w:tooltip="2.1 The HMI menu">
+          <w:hyperlink w:anchor="__RefHeading___Toc8150_355266826" w:tooltip="2.1 The HMI menu">
             <w:r>
               <w:rPr>
                 <w:rStyle w:val="IndexLink"/>
@@ -388,7 +388,7 @@
             </w:tabs>
             <w:rPr/>
           </w:pPr>
-          <w:hyperlink w:anchor="__RefHeading___Toc8152_4193108665" w:tooltip="3 Application settings">
+          <w:hyperlink w:anchor="__RefHeading___Toc8152_355266826" w:tooltip="3 Application settings">
             <w:r>
               <w:rPr>
                 <w:rStyle w:val="IndexLink"/>
@@ -409,7 +409,7 @@
             </w:tabs>
             <w:rPr/>
           </w:pPr>
-          <w:hyperlink w:anchor="__RefHeading___Toc8154_4193108665" w:tooltip="4 Devices">
+          <w:hyperlink w:anchor="__RefHeading___Toc8154_355266826" w:tooltip="4 Devices">
             <w:r>
               <w:rPr>
                 <w:rStyle w:val="IndexLink"/>
@@ -430,7 +430,7 @@
             </w:tabs>
             <w:rPr/>
           </w:pPr>
-          <w:hyperlink w:anchor="__RefHeading___Toc8156_4193108665" w:tooltip="5 Tags">
+          <w:hyperlink w:anchor="__RefHeading___Toc8156_355266826" w:tooltip="5 Tags">
             <w:r>
               <w:rPr>
                 <w:rStyle w:val="IndexLink"/>
@@ -451,7 +451,7 @@
             </w:tabs>
             <w:rPr/>
           </w:pPr>
-          <w:hyperlink w:anchor="__RefHeading___Toc8158_4193108665" w:tooltip="5.1 Tag fields">
+          <w:hyperlink w:anchor="__RefHeading___Toc8158_355266826" w:tooltip="5.1 Tag fields">
             <w:r>
               <w:rPr>
                 <w:rStyle w:val="IndexLink"/>
@@ -472,7 +472,7 @@
             </w:tabs>
             <w:rPr/>
           </w:pPr>
-          <w:hyperlink w:anchor="__RefHeading___Toc8160_4193108665" w:tooltip="5.2 Alarms on a tag">
+          <w:hyperlink w:anchor="__RefHeading___Toc8160_355266826" w:tooltip="5.2 Alarms on a tag">
             <w:r>
               <w:rPr>
                 <w:rStyle w:val="IndexLink"/>
@@ -493,7 +493,7 @@
             </w:tabs>
             <w:rPr/>
           </w:pPr>
-          <w:hyperlink w:anchor="__RefHeading___Toc8162_4193108665" w:tooltip="5.3 Renaming, and finding and replacing tag references">
+          <w:hyperlink w:anchor="__RefHeading___Toc8162_355266826" w:tooltip="5.3 Renaming, and finding and replacing tag references">
             <w:r>
               <w:rPr>
                 <w:rStyle w:val="IndexLink"/>
@@ -514,7 +514,7 @@
             </w:tabs>
             <w:rPr/>
           </w:pPr>
-          <w:hyperlink w:anchor="__RefHeading___Toc8164_4193108665" w:tooltip="6 Screens and windows">
+          <w:hyperlink w:anchor="__RefHeading___Toc8164_355266826" w:tooltip="6 Screens and windows">
             <w:r>
               <w:rPr>
                 <w:rStyle w:val="IndexLink"/>
@@ -535,7 +535,7 @@
             </w:tabs>
             <w:rPr/>
           </w:pPr>
-          <w:hyperlink w:anchor="__RefHeading___Toc8166_4193108665" w:tooltip="6.1 Window properties">
+          <w:hyperlink w:anchor="__RefHeading___Toc8166_355266826" w:tooltip="6.1 Window properties">
             <w:r>
               <w:rPr>
                 <w:rStyle w:val="IndexLink"/>
@@ -556,7 +556,7 @@
             </w:tabs>
             <w:rPr/>
           </w:pPr>
-          <w:hyperlink w:anchor="__RefHeading___Toc8168_4193108665" w:tooltip="6.2 The header, the navigation bar and the screens">
+          <w:hyperlink w:anchor="__RefHeading___Toc8168_355266826" w:tooltip="6.2 The header, the navigation bar and the screens">
             <w:r>
               <w:rPr>
                 <w:rStyle w:val="IndexLink"/>
@@ -577,7 +577,7 @@
             </w:tabs>
             <w:rPr/>
           </w:pPr>
-          <w:hyperlink w:anchor="__RefHeading___Toc8170_4193108665" w:tooltip="7 Drawing objects">
+          <w:hyperlink w:anchor="__RefHeading___Toc8170_355266826" w:tooltip="7 Drawing objects">
             <w:r>
               <w:rPr>
                 <w:rStyle w:val="IndexLink"/>
@@ -598,7 +598,7 @@
             </w:tabs>
             <w:rPr/>
           </w:pPr>
-          <w:hyperlink w:anchor="__RefHeading___Toc8172_4193108665" w:tooltip="8 Animation links">
+          <w:hyperlink w:anchor="__RefHeading___Toc8172_355266826" w:tooltip="8 Animation links">
             <w:r>
               <w:rPr>
                 <w:rStyle w:val="IndexLink"/>
@@ -619,7 +619,7 @@
             </w:tabs>
             <w:rPr/>
           </w:pPr>
-          <w:hyperlink w:anchor="__RefHeading___Toc8174_4193108665" w:tooltip="8.1 A valve: status color, fault blink and faceplate">
+          <w:hyperlink w:anchor="__RefHeading___Toc8174_355266826" w:tooltip="8.1 A valve: status color, fault blink and faceplate">
             <w:r>
               <w:rPr>
                 <w:rStyle w:val="IndexLink"/>
@@ -640,7 +640,7 @@
             </w:tabs>
             <w:rPr/>
           </w:pPr>
-          <w:hyperlink w:anchor="__RefHeading___Toc8176_4193108665" w:tooltip="8.2 The weigh hopper: percent fill">
+          <w:hyperlink w:anchor="__RefHeading___Toc8176_355266826" w:tooltip="8.2 The weigh hopper: percent fill">
             <w:r>
               <w:rPr>
                 <w:rStyle w:val="IndexLink"/>
@@ -661,7 +661,7 @@
             </w:tabs>
             <w:rPr/>
           </w:pPr>
-          <w:hyperlink w:anchor="__RefHeading___Toc8178_4193108665" w:tooltip="8.3 Hopper pressure: value display and alarm colors">
+          <w:hyperlink w:anchor="__RefHeading___Toc8178_355266826" w:tooltip="8.3 Hopper pressure: value display and alarm colors">
             <w:r>
               <w:rPr>
                 <w:rStyle w:val="IndexLink"/>
@@ -682,7 +682,7 @@
             </w:tabs>
             <w:rPr/>
           </w:pPr>
-          <w:hyperlink w:anchor="__RefHeading___Toc8180_4193108665" w:tooltip="8.4 Setpoints: user input">
+          <w:hyperlink w:anchor="__RefHeading___Toc8180_355266826" w:tooltip="8.4 Setpoints: user input">
             <w:r>
               <w:rPr>
                 <w:rStyle w:val="IndexLink"/>
@@ -703,7 +703,7 @@
             </w:tabs>
             <w:rPr/>
           </w:pPr>
-          <w:hyperlink w:anchor="__RefHeading___Toc8182_4193108665" w:tooltip="8.5 Commands: pushbutton and enable">
+          <w:hyperlink w:anchor="__RefHeading___Toc8182_355266826" w:tooltip="8.5 Commands: pushbutton and enable">
             <w:r>
               <w:rPr>
                 <w:rStyle w:val="IndexLink"/>
@@ -724,7 +724,7 @@
             </w:tabs>
             <w:rPr/>
           </w:pPr>
-          <w:hyperlink w:anchor="__RefHeading___Toc8184_4193108665" w:tooltip="9 Expressions and scripts">
+          <w:hyperlink w:anchor="__RefHeading___Toc8184_355266826" w:tooltip="9 Expressions and scripts">
             <w:r>
               <w:rPr>
                 <w:rStyle w:val="IndexLink"/>
@@ -745,7 +745,7 @@
             </w:tabs>
             <w:rPr/>
           </w:pPr>
-          <w:hyperlink w:anchor="__RefHeading___Toc8186_4193108665" w:tooltip="9.1 Window and application scripts">
+          <w:hyperlink w:anchor="__RefHeading___Toc8186_355266826" w:tooltip="9.1 Window and application scripts">
             <w:r>
               <w:rPr>
                 <w:rStyle w:val="IndexLink"/>
@@ -766,7 +766,7 @@
             </w:tabs>
             <w:rPr/>
           </w:pPr>
-          <w:hyperlink w:anchor="__RefHeading___Toc8188_4193108665" w:tooltip="9.2 Action scripts">
+          <w:hyperlink w:anchor="__RefHeading___Toc8188_355266826" w:tooltip="9.2 Action scripts">
             <w:r>
               <w:rPr>
                 <w:rStyle w:val="IndexLink"/>
@@ -787,7 +787,7 @@
             </w:tabs>
             <w:rPr/>
           </w:pPr>
-          <w:hyperlink w:anchor="__RefHeading___Toc8190_4193108665" w:tooltip="9.3 Function reference">
+          <w:hyperlink w:anchor="__RefHeading___Toc8190_355266826" w:tooltip="9.3 Function reference">
             <w:r>
               <w:rPr>
                 <w:rStyle w:val="IndexLink"/>
@@ -808,7 +808,7 @@
             </w:tabs>
             <w:rPr/>
           </w:pPr>
-          <w:hyperlink w:anchor="__RefHeading___Toc8192_4193108665" w:tooltip="9.4 Indirect tags: one faceplate for every device">
+          <w:hyperlink w:anchor="__RefHeading___Toc8192_355266826" w:tooltip="9.4 Indirect tags: one faceplate for every device">
             <w:r>
               <w:rPr>
                 <w:rStyle w:val="IndexLink"/>
@@ -829,7 +829,7 @@
             </w:tabs>
             <w:rPr/>
           </w:pPr>
-          <w:hyperlink w:anchor="__RefHeading___Toc8194_4193108665" w:tooltip="9.5 Opening windows from scripts: ShowWindow">
+          <w:hyperlink w:anchor="__RefHeading___Toc8194_355266826" w:tooltip="9.5 Opening windows from scripts: ShowWindow">
             <w:r>
               <w:rPr>
                 <w:rStyle w:val="IndexLink"/>
@@ -850,7 +850,7 @@
             </w:tabs>
             <w:rPr/>
           </w:pPr>
-          <w:hyperlink w:anchor="__RefHeading___Toc8196_4193108665" w:tooltip="9.6 Saving the screen as a PDF: ScreenToPDF">
+          <w:hyperlink w:anchor="__RefHeading___Toc8196_355266826" w:tooltip="9.6 Saving the screen as a PDF: ScreenToPDF">
             <w:r>
               <w:rPr>
                 <w:rStyle w:val="IndexLink"/>
@@ -871,7 +871,7 @@
             </w:tabs>
             <w:rPr/>
           </w:pPr>
-          <w:hyperlink w:anchor="__RefHeading___Toc8198_4193108665" w:tooltip="9.7 Local variables: DIM">
+          <w:hyperlink w:anchor="__RefHeading___Toc8198_355266826" w:tooltip="9.7 Local variables: DIM">
             <w:r>
               <w:rPr>
                 <w:rStyle w:val="IndexLink"/>
@@ -892,7 +892,7 @@
             </w:tabs>
             <w:rPr/>
           </w:pPr>
-          <w:hyperlink w:anchor="__RefHeading___Toc8200_4193108665" w:tooltip="9.8 QuickFunctions">
+          <w:hyperlink w:anchor="__RefHeading___Toc8200_355266826" w:tooltip="9.8 QuickFunctions">
             <w:r>
               <w:rPr>
                 <w:rStyle w:val="IndexLink"/>
@@ -913,7 +913,7 @@
             </w:tabs>
             <w:rPr/>
           </w:pPr>
-          <w:hyperlink w:anchor="__RefHeading___Toc8202_4193108665" w:tooltip="10 Alarms and security">
+          <w:hyperlink w:anchor="__RefHeading___Toc8202_355266826" w:tooltip="10 Alarms and security">
             <w:r>
               <w:rPr>
                 <w:rStyle w:val="IndexLink"/>
@@ -934,7 +934,7 @@
             </w:tabs>
             <w:rPr/>
           </w:pPr>
-          <w:hyperlink w:anchor="__RefHeading___Toc8204_4193108665" w:tooltip="10.1 Alarms">
+          <w:hyperlink w:anchor="__RefHeading___Toc8204_355266826" w:tooltip="10.1 Alarms">
             <w:r>
               <w:rPr>
                 <w:rStyle w:val="IndexLink"/>
@@ -955,7 +955,7 @@
             </w:tabs>
             <w:rPr/>
           </w:pPr>
-          <w:hyperlink w:anchor="__RefHeading___Toc8206_4193108665" w:tooltip="10.2 Users and access levels">
+          <w:hyperlink w:anchor="__RefHeading___Toc8206_355266826" w:tooltip="10.2 Users and access levels">
             <w:r>
               <w:rPr>
                 <w:rStyle w:val="IndexLink"/>
@@ -976,7 +976,7 @@
             </w:tabs>
             <w:rPr/>
           </w:pPr>
-          <w:hyperlink w:anchor="__RefHeading___Toc8208_4193108665" w:tooltip="11 Recipes">
+          <w:hyperlink w:anchor="__RefHeading___Toc8208_355266826" w:tooltip="11 Recipes">
             <w:r>
               <w:rPr>
                 <w:rStyle w:val="IndexLink"/>
@@ -997,7 +997,7 @@
             </w:tabs>
             <w:rPr/>
           </w:pPr>
-          <w:hyperlink w:anchor="__RefHeading___Toc8210_4193108665" w:tooltip="11.1 Recipe books">
+          <w:hyperlink w:anchor="__RefHeading___Toc8210_355266826" w:tooltip="11.1 Recipe books">
             <w:r>
               <w:rPr>
                 <w:rStyle w:val="IndexLink"/>
@@ -1018,7 +1018,7 @@
             </w:tabs>
             <w:rPr/>
           </w:pPr>
-          <w:hyperlink w:anchor="__RefHeading___Toc8212_4193108665" w:tooltip="11.2 The Recipes screen">
+          <w:hyperlink w:anchor="__RefHeading___Toc8212_355266826" w:tooltip="11.2 The Recipes screen">
             <w:r>
               <w:rPr>
                 <w:rStyle w:val="IndexLink"/>
@@ -1039,7 +1039,7 @@
             </w:tabs>
             <w:rPr/>
           </w:pPr>
-          <w:hyperlink w:anchor="__RefHeading___Toc8214_4193108665" w:tooltip="11.3 The Recipe List object">
+          <w:hyperlink w:anchor="__RefHeading___Toc8214_355266826" w:tooltip="11.3 The Recipe List object">
             <w:r>
               <w:rPr>
                 <w:rStyle w:val="IndexLink"/>
@@ -1060,7 +1060,7 @@
             </w:tabs>
             <w:rPr/>
           </w:pPr>
-          <w:hyperlink w:anchor="__RefHeading___Toc8216_4193108665" w:tooltip="11.4 Selecting a recipe in a window">
+          <w:hyperlink w:anchor="__RefHeading___Toc8216_355266826" w:tooltip="11.4 Selecting a recipe in a window">
             <w:r>
               <w:rPr>
                 <w:rStyle w:val="IndexLink"/>
@@ -1081,7 +1081,7 @@
             </w:tabs>
             <w:rPr/>
           </w:pPr>
-          <w:hyperlink w:anchor="__RefHeading___Toc8218_4193108665" w:tooltip="11.5 When a recipe function fails">
+          <w:hyperlink w:anchor="__RefHeading___Toc8218_355266826" w:tooltip="11.5 When a recipe function fails">
             <w:r>
               <w:rPr>
                 <w:rStyle w:val="IndexLink"/>
@@ -1102,7 +1102,7 @@
             </w:tabs>
             <w:rPr/>
           </w:pPr>
-          <w:hyperlink w:anchor="__RefHeading___Toc8220_4193108665" w:tooltip="11.6 Where recipes are kept">
+          <w:hyperlink w:anchor="__RefHeading___Toc8220_355266826" w:tooltip="11.6 Where recipes are kept">
             <w:r>
               <w:rPr>
                 <w:rStyle w:val="IndexLink"/>
@@ -1123,7 +1123,7 @@
             </w:tabs>
             <w:rPr/>
           </w:pPr>
-          <w:hyperlink w:anchor="__RefHeading___Toc8222_4193108665" w:tooltip="12 Trends">
+          <w:hyperlink w:anchor="__RefHeading___Toc8222_355266826" w:tooltip="12 Trends">
             <w:r>
               <w:rPr>
                 <w:rStyle w:val="IndexLink"/>
@@ -1144,7 +1144,7 @@
             </w:tabs>
             <w:rPr/>
           </w:pPr>
-          <w:hyperlink w:anchor="__RefHeading___Toc8224_4193108665" w:tooltip="12.1 The Trend object">
+          <w:hyperlink w:anchor="__RefHeading___Toc8224_355266826" w:tooltip="12.1 The Trend object">
             <w:r>
               <w:rPr>
                 <w:rStyle w:val="IndexLink"/>
@@ -1165,7 +1165,7 @@
             </w:tabs>
             <w:rPr/>
           </w:pPr>
-          <w:hyperlink w:anchor="__RefHeading___Toc8226_4193108665" w:tooltip="12.2 Pens and their ranges">
+          <w:hyperlink w:anchor="__RefHeading___Toc8226_355266826" w:tooltip="12.2 Pens and their ranges">
             <w:r>
               <w:rPr>
                 <w:rStyle w:val="IndexLink"/>
@@ -1186,7 +1186,7 @@
             </w:tabs>
             <w:rPr/>
           </w:pPr>
-          <w:hyperlink w:anchor="__RefHeading___Toc8228_4193108665" w:tooltip="12.3 The Trends screen">
+          <w:hyperlink w:anchor="__RefHeading___Toc8228_355266826" w:tooltip="12.3 The Trends screen">
             <w:r>
               <w:rPr>
                 <w:rStyle w:val="IndexLink"/>
@@ -1207,7 +1207,7 @@
             </w:tabs>
             <w:rPr/>
           </w:pPr>
-          <w:hyperlink w:anchor="__RefHeading___Toc8230_4193108665" w:tooltip="12.4 Scrolling through the history">
+          <w:hyperlink w:anchor="__RefHeading___Toc8230_355266826" w:tooltip="12.4 Scrolling through the history">
             <w:r>
               <w:rPr>
                 <w:rStyle w:val="IndexLink"/>
@@ -1228,7 +1228,7 @@
             </w:tabs>
             <w:rPr/>
           </w:pPr>
-          <w:hyperlink w:anchor="__RefHeading___Toc8232_4193108665" w:tooltip="12.5 Recording and where the history is kept">
+          <w:hyperlink w:anchor="__RefHeading___Toc8232_355266826" w:tooltip="12.5 Recording and where the history is kept">
             <w:r>
               <w:rPr>
                 <w:rStyle w:val="IndexLink"/>
@@ -1249,7 +1249,7 @@
             </w:tabs>
             <w:rPr/>
           </w:pPr>
-          <w:hyperlink w:anchor="__RefHeading___Toc8234_4193108665" w:tooltip="13 Databases">
+          <w:hyperlink w:anchor="__RefHeading___Toc8234_355266826" w:tooltip="13 Databases">
             <w:r>
               <w:rPr>
                 <w:rStyle w:val="IndexLink"/>
@@ -1270,7 +1270,7 @@
             </w:tabs>
             <w:rPr/>
           </w:pPr>
-          <w:hyperlink w:anchor="__RefHeading___Toc8236_4193108665" w:tooltip="13.1 Data sources">
+          <w:hyperlink w:anchor="__RefHeading___Toc8236_355266826" w:tooltip="13.1 Data sources">
             <w:r>
               <w:rPr>
                 <w:rStyle w:val="IndexLink"/>
@@ -1291,7 +1291,7 @@
             </w:tabs>
             <w:rPr/>
           </w:pPr>
-          <w:hyperlink w:anchor="__RefHeading___Toc8238_4193108665" w:tooltip="13.2 Bind lists">
+          <w:hyperlink w:anchor="__RefHeading___Toc8238_355266826" w:tooltip="13.2 Bind lists">
             <w:r>
               <w:rPr>
                 <w:rStyle w:val="IndexLink"/>
@@ -1312,7 +1312,7 @@
             </w:tabs>
             <w:rPr/>
           </w:pPr>
-          <w:hyperlink w:anchor="__RefHeading___Toc8240_4193108665" w:tooltip="13.3 Table templates and queries">
+          <w:hyperlink w:anchor="__RefHeading___Toc8240_355266826" w:tooltip="13.3 Table templates and queries">
             <w:r>
               <w:rPr>
                 <w:rStyle w:val="IndexLink"/>
@@ -1333,7 +1333,7 @@
             </w:tabs>
             <w:rPr/>
           </w:pPr>
-          <w:hyperlink w:anchor="__RefHeading___Toc8242_4193108665" w:tooltip="13.4 The script functions">
+          <w:hyperlink w:anchor="__RefHeading___Toc8242_355266826" w:tooltip="13.4 The script functions">
             <w:r>
               <w:rPr>
                 <w:rStyle w:val="IndexLink"/>
@@ -1354,7 +1354,7 @@
             </w:tabs>
             <w:rPr/>
           </w:pPr>
-          <w:hyperlink w:anchor="__RefHeading___Toc8244_4193108665" w:tooltip="13.5 The batch log in LiquidWeighHMI">
+          <w:hyperlink w:anchor="__RefHeading___Toc8244_355266826" w:tooltip="13.5 The batch log in LiquidWeighHMI">
             <w:r>
               <w:rPr>
                 <w:rStyle w:val="IndexLink"/>
@@ -1375,7 +1375,7 @@
             </w:tabs>
             <w:rPr/>
           </w:pPr>
-          <w:hyperlink w:anchor="__RefHeading___Toc8246_4193108665" w:tooltip="13.6 Where the rows are kept">
+          <w:hyperlink w:anchor="__RefHeading___Toc8246_355266826" w:tooltip="13.6 Where the rows are kept">
             <w:r>
               <w:rPr>
                 <w:rStyle w:val="IndexLink"/>
@@ -1396,7 +1396,7 @@
             </w:tabs>
             <w:rPr/>
           </w:pPr>
-          <w:hyperlink w:anchor="__RefHeading___Toc8248_4193108665" w:tooltip="14 List boxes">
+          <w:hyperlink w:anchor="__RefHeading___Toc8248_355266826" w:tooltip="14 List boxes">
             <w:r>
               <w:rPr>
                 <w:rStyle w:val="IndexLink"/>
@@ -1417,7 +1417,7 @@
             </w:tabs>
             <w:rPr/>
           </w:pPr>
-          <w:hyperlink w:anchor="__RefHeading___Toc8250_4193108665" w:tooltip="14.1 The List Box object">
+          <w:hyperlink w:anchor="__RefHeading___Toc8250_355266826" w:tooltip="14.1 The List Box object">
             <w:r>
               <w:rPr>
                 <w:rStyle w:val="IndexLink"/>
@@ -1438,7 +1438,7 @@
             </w:tabs>
             <w:rPr/>
           </w:pPr>
-          <w:hyperlink w:anchor="__RefHeading___Toc8252_4193108665" w:tooltip="14.2 Filling and working the list from scripts">
+          <w:hyperlink w:anchor="__RefHeading___Toc8252_355266826" w:tooltip="14.2 Filling and working the list from scripts">
             <w:r>
               <w:rPr>
                 <w:rStyle w:val="IndexLink"/>
@@ -1459,7 +1459,7 @@
             </w:tabs>
             <w:rPr/>
           </w:pPr>
-          <w:hyperlink w:anchor="__RefHeading___Toc8254_4193108665" w:tooltip="14.3 The list belongs to the application, not to a window">
+          <w:hyperlink w:anchor="__RefHeading___Toc8254_355266826" w:tooltip="14.3 The list belongs to the application, not to a window">
             <w:r>
               <w:rPr>
                 <w:rStyle w:val="IndexLink"/>
@@ -1480,7 +1480,7 @@
             </w:tabs>
             <w:rPr/>
           </w:pPr>
-          <w:hyperlink w:anchor="__RefHeading___Toc8256_4193108665" w:tooltip="14.4 A list filled from a database">
+          <w:hyperlink w:anchor="__RefHeading___Toc8256_355266826" w:tooltip="14.4 A list filled from a database">
             <w:r>
               <w:rPr>
                 <w:rStyle w:val="IndexLink"/>
@@ -1501,7 +1501,7 @@
             </w:tabs>
             <w:rPr/>
           </w:pPr>
-          <w:hyperlink w:anchor="__RefHeading___Toc8258_4193108665" w:tooltip="15 Testing">
+          <w:hyperlink w:anchor="__RefHeading___Toc8258_355266826" w:tooltip="15 Testing">
             <w:r>
               <w:rPr>
                 <w:rStyle w:val="IndexLink"/>
@@ -1522,7 +1522,7 @@
             </w:tabs>
             <w:rPr/>
           </w:pPr>
-          <w:hyperlink w:anchor="__RefHeading___Toc8260_4193108665" w:tooltip="15.1 Validate">
+          <w:hyperlink w:anchor="__RefHeading___Toc8260_355266826" w:tooltip="15.1 Validate">
             <w:r>
               <w:rPr>
                 <w:rStyle w:val="IndexLink"/>
@@ -1543,7 +1543,7 @@
             </w:tabs>
             <w:rPr/>
           </w:pPr>
-          <w:hyperlink w:anchor="__RefHeading___Toc8262_4193108665" w:tooltip="15.2 Run">
+          <w:hyperlink w:anchor="__RefHeading___Toc8262_355266826" w:tooltip="15.2 Run">
             <w:r>
               <w:rPr>
                 <w:rStyle w:val="IndexLink"/>
@@ -1564,7 +1564,7 @@
             </w:tabs>
             <w:rPr/>
           </w:pPr>
-          <w:hyperlink w:anchor="__RefHeading___Toc8264_4193108665" w:tooltip="16 Deploying">
+          <w:hyperlink w:anchor="__RefHeading___Toc8264_355266826" w:tooltip="16 Deploying">
             <w:r>
               <w:rPr>
                 <w:rStyle w:val="IndexLink"/>
@@ -1585,7 +1585,7 @@
             </w:tabs>
             <w:rPr/>
           </w:pPr>
-          <w:hyperlink w:anchor="__RefHeading___Toc8266_4193108665" w:tooltip="16.1 Publish">
+          <w:hyperlink w:anchor="__RefHeading___Toc8266_355266826" w:tooltip="16.1 Publish">
             <w:r>
               <w:rPr>
                 <w:rStyle w:val="IndexLink"/>
@@ -1606,7 +1606,7 @@
             </w:tabs>
             <w:rPr/>
           </w:pPr>
-          <w:hyperlink w:anchor="__RefHeading___Toc8268_4193108665" w:tooltip="16.2 Append HMI Desktop">
+          <w:hyperlink w:anchor="__RefHeading___Toc8268_355266826" w:tooltip="16.2 Append HMI Desktop">
             <w:r>
               <w:rPr>
                 <w:rStyle w:val="IndexLink"/>
@@ -1627,7 +1627,7 @@
             </w:tabs>
             <w:rPr/>
           </w:pPr>
-          <w:hyperlink w:anchor="__RefHeading___Toc8270_4193108665" w:tooltip="16.3 Append HMI Web">
+          <w:hyperlink w:anchor="__RefHeading___Toc8270_355266826" w:tooltip="16.3 Append HMI Web">
             <w:r>
               <w:rPr>
                 <w:rStyle w:val="IndexLink"/>
@@ -1648,7 +1648,7 @@
             </w:tabs>
             <w:rPr/>
           </w:pPr>
-          <w:hyperlink w:anchor="__RefHeading___Toc8272_4193108665" w:tooltip="17 Tips and troubleshooting">
+          <w:hyperlink w:anchor="__RefHeading___Toc8272_355266826" w:tooltip="17 Tips and troubleshooting">
             <w:r>
               <w:rPr>
                 <w:rStyle w:val="IndexLink"/>
@@ -1669,7 +1669,7 @@
             </w:tabs>
             <w:rPr/>
           </w:pPr>
-          <w:hyperlink w:anchor="__RefHeading___Toc8274_4193108665" w:tooltip="Appendix A Command-line automation">
+          <w:hyperlink w:anchor="__RefHeading___Toc8274_355266826" w:tooltip="Appendix A Command-line automation">
             <w:r>
               <w:rPr>
                 <w:rStyle w:val="IndexLink"/>
@@ -1707,7 +1707,7 @@
         <w:spacing w:before="0" w:after="0"/>
         <w:rPr/>
       </w:pPr>
-      <w:bookmarkStart w:id="0" w:name="__RefHeading___Toc8142_4193108665"/>
+      <w:bookmarkStart w:id="0" w:name="__RefHeading___Toc8142_355266826"/>
       <w:bookmarkEnd w:id="0"/>
       <w:r>
         <w:rPr/>
@@ -2563,7 +2563,7 @@
         <w:pStyle w:val="Heading2"/>
         <w:rPr/>
       </w:pPr>
-      <w:bookmarkStart w:id="1" w:name="__RefHeading___Toc8144_4193108665"/>
+      <w:bookmarkStart w:id="1" w:name="__RefHeading___Toc8144_355266826"/>
       <w:bookmarkEnd w:id="1"/>
       <w:r>
         <w:rPr/>
@@ -3753,7 +3753,7 @@
         <w:pStyle w:val="Heading2"/>
         <w:rPr/>
       </w:pPr>
-      <w:bookmarkStart w:id="2" w:name="__RefHeading___Toc8146_4193108665"/>
+      <w:bookmarkStart w:id="2" w:name="__RefHeading___Toc8146_355266826"/>
       <w:bookmarkEnd w:id="2"/>
       <w:r>
         <w:rPr/>
@@ -3896,7 +3896,7 @@
         <w:pStyle w:val="Heading1"/>
         <w:rPr/>
       </w:pPr>
-      <w:bookmarkStart w:id="3" w:name="__RefHeading___Toc8148_4193108665"/>
+      <w:bookmarkStart w:id="3" w:name="__RefHeading___Toc8148_355266826"/>
       <w:bookmarkEnd w:id="3"/>
       <w:r>
         <w:rPr/>
@@ -4474,7 +4474,7 @@
         <w:pStyle w:val="Heading2"/>
         <w:rPr/>
       </w:pPr>
-      <w:bookmarkStart w:id="4" w:name="__RefHeading___Toc8150_4193108665"/>
+      <w:bookmarkStart w:id="4" w:name="__RefHeading___Toc8150_355266826"/>
       <w:bookmarkEnd w:id="4"/>
       <w:r>
         <w:rPr/>
@@ -5514,7 +5514,7 @@
         <w:pStyle w:val="Heading1"/>
         <w:rPr/>
       </w:pPr>
-      <w:bookmarkStart w:id="5" w:name="__RefHeading___Toc8152_4193108665"/>
+      <w:bookmarkStart w:id="5" w:name="__RefHeading___Toc8152_355266826"/>
       <w:bookmarkEnd w:id="5"/>
       <w:r>
         <w:rPr/>
@@ -5826,7 +5826,7 @@
       </w:r>
       <w:r>
         <w:rPr/>
-        <w:t>: the exit shortcut Ctrl+Alt+Shift+Q; the shortcut followed by a password; or never (the PC must be shut down to stop it).</w:t>
+        <w:t>: the exit shortcut Ctrl+Alt+Shift+Q; closing the window normally, as any program is closed, with its close button or Alt+F4; the shortcut followed by a password; or never (the PC must be shut down to stop it). The shortcut works in every setting but the last, and however the application is closed it stops its Run first, so the On shutdown script and the last retentive save always run.</w:t>
       </w:r>
     </w:p>
     <w:p>
@@ -5904,7 +5904,7 @@
         <w:pStyle w:val="Heading1"/>
         <w:rPr/>
       </w:pPr>
-      <w:bookmarkStart w:id="6" w:name="__RefHeading___Toc8154_4193108665"/>
+      <w:bookmarkStart w:id="6" w:name="__RefHeading___Toc8154_355266826"/>
       <w:bookmarkEnd w:id="6"/>
       <w:r>
         <w:rPr/>
@@ -6699,7 +6699,7 @@
         <w:pStyle w:val="Heading1"/>
         <w:rPr/>
       </w:pPr>
-      <w:bookmarkStart w:id="7" w:name="__RefHeading___Toc8156_4193108665"/>
+      <w:bookmarkStart w:id="7" w:name="__RefHeading___Toc8156_355266826"/>
       <w:bookmarkEnd w:id="7"/>
       <w:r>
         <w:rPr/>
@@ -7550,7 +7550,7 @@
         <w:pStyle w:val="Heading2"/>
         <w:rPr/>
       </w:pPr>
-      <w:bookmarkStart w:id="8" w:name="__RefHeading___Toc8158_4193108665"/>
+      <w:bookmarkStart w:id="8" w:name="__RefHeading___Toc8158_355266826"/>
       <w:bookmarkEnd w:id="8"/>
       <w:r>
         <w:rPr/>
@@ -8200,7 +8200,7 @@
         <w:pStyle w:val="Heading2"/>
         <w:rPr/>
       </w:pPr>
-      <w:bookmarkStart w:id="9" w:name="__RefHeading___Toc8160_4193108665"/>
+      <w:bookmarkStart w:id="9" w:name="__RefHeading___Toc8160_355266826"/>
       <w:bookmarkEnd w:id="9"/>
       <w:r>
         <w:rPr/>
@@ -8332,7 +8332,7 @@
         <w:pStyle w:val="Heading2"/>
         <w:rPr/>
       </w:pPr>
-      <w:bookmarkStart w:id="10" w:name="__RefHeading___Toc8162_4193108665"/>
+      <w:bookmarkStart w:id="10" w:name="__RefHeading___Toc8162_355266826"/>
       <w:bookmarkEnd w:id="10"/>
       <w:r>
         <w:rPr/>
@@ -8462,7 +8462,7 @@
         <w:pStyle w:val="Heading1"/>
         <w:rPr/>
       </w:pPr>
-      <w:bookmarkStart w:id="11" w:name="__RefHeading___Toc8164_4193108665"/>
+      <w:bookmarkStart w:id="11" w:name="__RefHeading___Toc8164_355266826"/>
       <w:bookmarkEnd w:id="11"/>
       <w:r>
         <w:rPr/>
@@ -8975,7 +8975,7 @@
         <w:pStyle w:val="Heading2"/>
         <w:rPr/>
       </w:pPr>
-      <w:bookmarkStart w:id="12" w:name="__RefHeading___Toc8166_4193108665"/>
+      <w:bookmarkStart w:id="12" w:name="__RefHeading___Toc8166_355266826"/>
       <w:bookmarkEnd w:id="12"/>
       <w:r>
         <w:rPr/>
@@ -9879,7 +9879,7 @@
         <w:pStyle w:val="Heading2"/>
         <w:rPr/>
       </w:pPr>
-      <w:bookmarkStart w:id="13" w:name="__RefHeading___Toc8168_4193108665"/>
+      <w:bookmarkStart w:id="13" w:name="__RefHeading___Toc8168_355266826"/>
       <w:bookmarkEnd w:id="13"/>
       <w:r>
         <w:rPr/>
@@ -10051,7 +10051,7 @@
         <w:pStyle w:val="Heading1"/>
         <w:rPr/>
       </w:pPr>
-      <w:bookmarkStart w:id="14" w:name="__RefHeading___Toc8170_4193108665"/>
+      <w:bookmarkStart w:id="14" w:name="__RefHeading___Toc8170_355266826"/>
       <w:bookmarkEnd w:id="14"/>
       <w:r>
         <w:rPr/>
@@ -10827,7 +10827,7 @@
         <w:pStyle w:val="Heading1"/>
         <w:rPr/>
       </w:pPr>
-      <w:bookmarkStart w:id="15" w:name="__RefHeading___Toc8172_4193108665"/>
+      <w:bookmarkStart w:id="15" w:name="__RefHeading___Toc8172_355266826"/>
       <w:bookmarkEnd w:id="15"/>
       <w:r>
         <w:rPr/>
@@ -11590,7 +11590,7 @@
         <w:pStyle w:val="Heading2"/>
         <w:rPr/>
       </w:pPr>
-      <w:bookmarkStart w:id="16" w:name="__RefHeading___Toc8174_4193108665"/>
+      <w:bookmarkStart w:id="16" w:name="__RefHeading___Toc8174_355266826"/>
       <w:bookmarkEnd w:id="16"/>
       <w:r>
         <w:rPr/>
@@ -11776,7 +11776,7 @@
         <w:pStyle w:val="Heading2"/>
         <w:rPr/>
       </w:pPr>
-      <w:bookmarkStart w:id="17" w:name="__RefHeading___Toc8176_4193108665"/>
+      <w:bookmarkStart w:id="17" w:name="__RefHeading___Toc8176_355266826"/>
       <w:bookmarkEnd w:id="17"/>
       <w:r>
         <w:rPr/>
@@ -11900,7 +11900,7 @@
         <w:pStyle w:val="Heading2"/>
         <w:rPr/>
       </w:pPr>
-      <w:bookmarkStart w:id="18" w:name="__RefHeading___Toc8178_4193108665"/>
+      <w:bookmarkStart w:id="18" w:name="__RefHeading___Toc8178_355266826"/>
       <w:bookmarkEnd w:id="18"/>
       <w:r>
         <w:rPr/>
@@ -12016,7 +12016,7 @@
         <w:pStyle w:val="Heading2"/>
         <w:rPr/>
       </w:pPr>
-      <w:bookmarkStart w:id="19" w:name="__RefHeading___Toc8180_4193108665"/>
+      <w:bookmarkStart w:id="19" w:name="__RefHeading___Toc8180_355266826"/>
       <w:bookmarkEnd w:id="19"/>
       <w:r>
         <w:rPr/>
@@ -12205,7 +12205,7 @@
         <w:pStyle w:val="Heading2"/>
         <w:rPr/>
       </w:pPr>
-      <w:bookmarkStart w:id="20" w:name="__RefHeading___Toc8182_4193108665"/>
+      <w:bookmarkStart w:id="20" w:name="__RefHeading___Toc8182_355266826"/>
       <w:bookmarkEnd w:id="20"/>
       <w:r>
         <w:rPr/>
@@ -12745,7 +12745,7 @@
         <w:pStyle w:val="Heading1"/>
         <w:rPr/>
       </w:pPr>
-      <w:bookmarkStart w:id="21" w:name="__RefHeading___Toc8184_4193108665"/>
+      <w:bookmarkStart w:id="21" w:name="__RefHeading___Toc8184_355266826"/>
       <w:bookmarkEnd w:id="21"/>
       <w:r>
         <w:rPr/>
@@ -14113,7 +14113,7 @@
         <w:pStyle w:val="Heading2"/>
         <w:rPr/>
       </w:pPr>
-      <w:bookmarkStart w:id="22" w:name="__RefHeading___Toc8186_4193108665"/>
+      <w:bookmarkStart w:id="22" w:name="__RefHeading___Toc8186_355266826"/>
       <w:bookmarkEnd w:id="22"/>
       <w:r>
         <w:rPr/>
@@ -14525,7 +14525,7 @@
         <w:pStyle w:val="Heading2"/>
         <w:rPr/>
       </w:pPr>
-      <w:bookmarkStart w:id="23" w:name="__RefHeading___Toc8188_4193108665"/>
+      <w:bookmarkStart w:id="23" w:name="__RefHeading___Toc8188_355266826"/>
       <w:bookmarkEnd w:id="23"/>
       <w:r>
         <w:rPr/>
@@ -14644,7 +14644,7 @@
         <w:pStyle w:val="Heading2"/>
         <w:rPr/>
       </w:pPr>
-      <w:bookmarkStart w:id="24" w:name="__RefHeading___Toc8190_4193108665"/>
+      <w:bookmarkStart w:id="24" w:name="__RefHeading___Toc8190_355266826"/>
       <w:bookmarkEnd w:id="24"/>
       <w:r>
         <w:rPr/>
@@ -24255,7 +24255,7 @@
         <w:pStyle w:val="Heading2"/>
         <w:rPr/>
       </w:pPr>
-      <w:bookmarkStart w:id="25" w:name="__RefHeading___Toc8192_4193108665"/>
+      <w:bookmarkStart w:id="25" w:name="__RefHeading___Toc8192_355266826"/>
       <w:bookmarkEnd w:id="25"/>
       <w:r>
         <w:rPr/>
@@ -25094,7 +25094,7 @@
         <w:pStyle w:val="Heading2"/>
         <w:rPr/>
       </w:pPr>
-      <w:bookmarkStart w:id="26" w:name="__RefHeading___Toc8194_4193108665"/>
+      <w:bookmarkStart w:id="26" w:name="__RefHeading___Toc8194_355266826"/>
       <w:bookmarkEnd w:id="26"/>
       <w:r>
         <w:rPr/>
@@ -25580,7 +25580,7 @@
         <w:pStyle w:val="Heading2"/>
         <w:rPr/>
       </w:pPr>
-      <w:bookmarkStart w:id="27" w:name="__RefHeading___Toc8196_4193108665"/>
+      <w:bookmarkStart w:id="27" w:name="__RefHeading___Toc8196_355266826"/>
       <w:bookmarkEnd w:id="27"/>
       <w:r>
         <w:rPr/>
@@ -25772,7 +25772,7 @@
         <w:pStyle w:val="Heading2"/>
         <w:rPr/>
       </w:pPr>
-      <w:bookmarkStart w:id="28" w:name="__RefHeading___Toc8198_4193108665"/>
+      <w:bookmarkStart w:id="28" w:name="__RefHeading___Toc8198_355266826"/>
       <w:bookmarkEnd w:id="28"/>
       <w:r>
         <w:rPr/>
@@ -26458,7 +26458,7 @@
         <w:pStyle w:val="Heading2"/>
         <w:rPr/>
       </w:pPr>
-      <w:bookmarkStart w:id="29" w:name="__RefHeading___Toc8200_4193108665"/>
+      <w:bookmarkStart w:id="29" w:name="__RefHeading___Toc8200_355266826"/>
       <w:bookmarkEnd w:id="29"/>
       <w:r>
         <w:rPr/>
@@ -27212,7 +27212,7 @@
         <w:pStyle w:val="Heading1"/>
         <w:rPr/>
       </w:pPr>
-      <w:bookmarkStart w:id="30" w:name="__RefHeading___Toc8202_4193108665"/>
+      <w:bookmarkStart w:id="30" w:name="__RefHeading___Toc8202_355266826"/>
       <w:bookmarkEnd w:id="30"/>
       <w:r>
         <w:rPr/>
@@ -27224,7 +27224,7 @@
         <w:pStyle w:val="Heading2"/>
         <w:rPr/>
       </w:pPr>
-      <w:bookmarkStart w:id="31" w:name="__RefHeading___Toc8204_4193108665"/>
+      <w:bookmarkStart w:id="31" w:name="__RefHeading___Toc8204_355266826"/>
       <w:bookmarkEnd w:id="31"/>
       <w:r>
         <w:rPr/>
@@ -28555,7 +28555,7 @@
         <w:pStyle w:val="Heading2"/>
         <w:rPr/>
       </w:pPr>
-      <w:bookmarkStart w:id="32" w:name="__RefHeading___Toc8206_4193108665"/>
+      <w:bookmarkStart w:id="32" w:name="__RefHeading___Toc8206_355266826"/>
       <w:bookmarkEnd w:id="32"/>
       <w:r>
         <w:rPr/>
@@ -29245,7 +29245,7 @@
         <w:pStyle w:val="Heading1"/>
         <w:rPr/>
       </w:pPr>
-      <w:bookmarkStart w:id="33" w:name="__RefHeading___Toc8208_4193108665"/>
+      <w:bookmarkStart w:id="33" w:name="__RefHeading___Toc8208_355266826"/>
       <w:bookmarkEnd w:id="33"/>
       <w:r>
         <w:rPr/>
@@ -29384,7 +29384,7 @@
         <w:pStyle w:val="Heading2"/>
         <w:rPr/>
       </w:pPr>
-      <w:bookmarkStart w:id="34" w:name="__RefHeading___Toc8210_4193108665"/>
+      <w:bookmarkStart w:id="34" w:name="__RefHeading___Toc8210_355266826"/>
       <w:bookmarkEnd w:id="34"/>
       <w:r>
         <w:rPr/>
@@ -31245,7 +31245,7 @@
         <w:pStyle w:val="Heading2"/>
         <w:rPr/>
       </w:pPr>
-      <w:bookmarkStart w:id="35" w:name="__RefHeading___Toc8212_4193108665"/>
+      <w:bookmarkStart w:id="35" w:name="__RefHeading___Toc8212_355266826"/>
       <w:bookmarkEnd w:id="35"/>
       <w:r>
         <w:rPr/>
@@ -32695,7 +32695,7 @@
         <w:pStyle w:val="Heading2"/>
         <w:rPr/>
       </w:pPr>
-      <w:bookmarkStart w:id="36" w:name="__RefHeading___Toc8214_4193108665"/>
+      <w:bookmarkStart w:id="36" w:name="__RefHeading___Toc8214_355266826"/>
       <w:bookmarkEnd w:id="36"/>
       <w:r>
         <w:rPr/>
@@ -33405,7 +33405,7 @@
         <w:pStyle w:val="Heading2"/>
         <w:rPr/>
       </w:pPr>
-      <w:bookmarkStart w:id="37" w:name="__RefHeading___Toc8216_4193108665"/>
+      <w:bookmarkStart w:id="37" w:name="__RefHeading___Toc8216_355266826"/>
       <w:bookmarkEnd w:id="37"/>
       <w:r>
         <w:rPr/>
@@ -33687,7 +33687,7 @@
         <w:pStyle w:val="Heading2"/>
         <w:rPr/>
       </w:pPr>
-      <w:bookmarkStart w:id="38" w:name="__RefHeading___Toc8218_4193108665"/>
+      <w:bookmarkStart w:id="38" w:name="__RefHeading___Toc8218_355266826"/>
       <w:bookmarkEnd w:id="38"/>
       <w:r>
         <w:rPr/>
@@ -33848,7 +33848,7 @@
         <w:pStyle w:val="Heading2"/>
         <w:rPr/>
       </w:pPr>
-      <w:bookmarkStart w:id="39" w:name="__RefHeading___Toc8220_4193108665"/>
+      <w:bookmarkStart w:id="39" w:name="__RefHeading___Toc8220_355266826"/>
       <w:bookmarkEnd w:id="39"/>
       <w:r>
         <w:rPr/>
@@ -34248,7 +34248,7 @@
         <w:pStyle w:val="Heading1"/>
         <w:rPr/>
       </w:pPr>
-      <w:bookmarkStart w:id="40" w:name="__RefHeading___Toc8222_4193108665"/>
+      <w:bookmarkStart w:id="40" w:name="__RefHeading___Toc8222_355266826"/>
       <w:bookmarkEnd w:id="40"/>
       <w:r>
         <w:rPr/>
@@ -34280,7 +34280,7 @@
         <w:pStyle w:val="Heading2"/>
         <w:rPr/>
       </w:pPr>
-      <w:bookmarkStart w:id="41" w:name="__RefHeading___Toc8224_4193108665"/>
+      <w:bookmarkStart w:id="41" w:name="__RefHeading___Toc8224_355266826"/>
       <w:bookmarkEnd w:id="41"/>
       <w:r>
         <w:rPr/>
@@ -35485,7 +35485,7 @@
         <w:pStyle w:val="Heading2"/>
         <w:rPr/>
       </w:pPr>
-      <w:bookmarkStart w:id="42" w:name="__RefHeading___Toc8226_4193108665"/>
+      <w:bookmarkStart w:id="42" w:name="__RefHeading___Toc8226_355266826"/>
       <w:bookmarkEnd w:id="42"/>
       <w:r>
         <w:rPr/>
@@ -36871,7 +36871,7 @@
         <w:pStyle w:val="Heading2"/>
         <w:rPr/>
       </w:pPr>
-      <w:bookmarkStart w:id="43" w:name="__RefHeading___Toc8228_4193108665"/>
+      <w:bookmarkStart w:id="43" w:name="__RefHeading___Toc8228_355266826"/>
       <w:bookmarkEnd w:id="43"/>
       <w:r>
         <w:rPr/>
@@ -37457,7 +37457,7 @@
         <w:pStyle w:val="Heading2"/>
         <w:rPr/>
       </w:pPr>
-      <w:bookmarkStart w:id="44" w:name="__RefHeading___Toc8230_4193108665"/>
+      <w:bookmarkStart w:id="44" w:name="__RefHeading___Toc8230_355266826"/>
       <w:bookmarkEnd w:id="44"/>
       <w:r>
         <w:rPr/>
@@ -37552,7 +37552,7 @@
         <w:pStyle w:val="Heading2"/>
         <w:rPr/>
       </w:pPr>
-      <w:bookmarkStart w:id="45" w:name="__RefHeading___Toc8232_4193108665"/>
+      <w:bookmarkStart w:id="45" w:name="__RefHeading___Toc8232_355266826"/>
       <w:bookmarkEnd w:id="45"/>
       <w:r>
         <w:rPr/>
@@ -38006,7 +38006,7 @@
         <w:pStyle w:val="Heading1"/>
         <w:rPr/>
       </w:pPr>
-      <w:bookmarkStart w:id="46" w:name="__RefHeading___Toc8234_4193108665"/>
+      <w:bookmarkStart w:id="46" w:name="__RefHeading___Toc8234_355266826"/>
       <w:bookmarkEnd w:id="46"/>
       <w:r>
         <w:rPr/>
@@ -38171,7 +38171,7 @@
         <w:pStyle w:val="Heading2"/>
         <w:rPr/>
       </w:pPr>
-      <w:bookmarkStart w:id="47" w:name="__RefHeading___Toc8236_4193108665"/>
+      <w:bookmarkStart w:id="47" w:name="__RefHeading___Toc8236_355266826"/>
       <w:bookmarkEnd w:id="47"/>
       <w:r>
         <w:rPr/>
@@ -39288,7 +39288,7 @@
         <w:pStyle w:val="Heading2"/>
         <w:rPr/>
       </w:pPr>
-      <w:bookmarkStart w:id="48" w:name="__RefHeading___Toc8238_4193108665"/>
+      <w:bookmarkStart w:id="48" w:name="__RefHeading___Toc8238_355266826"/>
       <w:bookmarkEnd w:id="48"/>
       <w:r>
         <w:rPr/>
@@ -39522,7 +39522,7 @@
         <w:pStyle w:val="Heading2"/>
         <w:rPr/>
       </w:pPr>
-      <w:bookmarkStart w:id="49" w:name="__RefHeading___Toc8240_4193108665"/>
+      <w:bookmarkStart w:id="49" w:name="__RefHeading___Toc8240_355266826"/>
       <w:bookmarkEnd w:id="49"/>
       <w:r>
         <w:rPr/>
@@ -40339,7 +40339,7 @@
         <w:pStyle w:val="Heading2"/>
         <w:rPr/>
       </w:pPr>
-      <w:bookmarkStart w:id="50" w:name="__RefHeading___Toc8242_4193108665"/>
+      <w:bookmarkStart w:id="50" w:name="__RefHeading___Toc8242_355266826"/>
       <w:bookmarkEnd w:id="50"/>
       <w:r>
         <w:rPr/>
@@ -42035,7 +42035,7 @@
         <w:pStyle w:val="Heading2"/>
         <w:rPr/>
       </w:pPr>
-      <w:bookmarkStart w:id="51" w:name="__RefHeading___Toc8244_4193108665"/>
+      <w:bookmarkStart w:id="51" w:name="__RefHeading___Toc8244_355266826"/>
       <w:bookmarkEnd w:id="51"/>
       <w:r>
         <w:rPr/>
@@ -42735,7 +42735,7 @@
         <w:pStyle w:val="Heading2"/>
         <w:rPr/>
       </w:pPr>
-      <w:bookmarkStart w:id="52" w:name="__RefHeading___Toc8246_4193108665"/>
+      <w:bookmarkStart w:id="52" w:name="__RefHeading___Toc8246_355266826"/>
       <w:bookmarkEnd w:id="52"/>
       <w:r>
         <w:rPr/>
@@ -43093,7 +43093,7 @@
         <w:pStyle w:val="Heading1"/>
         <w:rPr/>
       </w:pPr>
-      <w:bookmarkStart w:id="53" w:name="__RefHeading___Toc8248_4193108665"/>
+      <w:bookmarkStart w:id="53" w:name="__RefHeading___Toc8248_355266826"/>
       <w:bookmarkEnd w:id="53"/>
       <w:r>
         <w:rPr/>
@@ -43125,7 +43125,7 @@
         <w:pStyle w:val="Heading2"/>
         <w:rPr/>
       </w:pPr>
-      <w:bookmarkStart w:id="54" w:name="__RefHeading___Toc8250_4193108665"/>
+      <w:bookmarkStart w:id="54" w:name="__RefHeading___Toc8250_355266826"/>
       <w:bookmarkEnd w:id="54"/>
       <w:r>
         <w:rPr/>
@@ -44449,7 +44449,7 @@
         <w:pStyle w:val="Heading2"/>
         <w:rPr/>
       </w:pPr>
-      <w:bookmarkStart w:id="55" w:name="__RefHeading___Toc8252_4193108665"/>
+      <w:bookmarkStart w:id="55" w:name="__RefHeading___Toc8252_355266826"/>
       <w:bookmarkEnd w:id="55"/>
       <w:r>
         <w:rPr/>
@@ -45184,7 +45184,7 @@
         <w:pStyle w:val="Heading2"/>
         <w:rPr/>
       </w:pPr>
-      <w:bookmarkStart w:id="56" w:name="__RefHeading___Toc8254_4193108665"/>
+      <w:bookmarkStart w:id="56" w:name="__RefHeading___Toc8254_355266826"/>
       <w:bookmarkEnd w:id="56"/>
       <w:r>
         <w:rPr/>
@@ -45236,7 +45236,7 @@
         <w:pStyle w:val="Heading2"/>
         <w:rPr/>
       </w:pPr>
-      <w:bookmarkStart w:id="57" w:name="__RefHeading___Toc8256_4193108665"/>
+      <w:bookmarkStart w:id="57" w:name="__RefHeading___Toc8256_355266826"/>
       <w:bookmarkEnd w:id="57"/>
       <w:r>
         <w:rPr/>
@@ -45519,7 +45519,7 @@
         <w:pStyle w:val="Heading1"/>
         <w:rPr/>
       </w:pPr>
-      <w:bookmarkStart w:id="58" w:name="__RefHeading___Toc8258_4193108665"/>
+      <w:bookmarkStart w:id="58" w:name="__RefHeading___Toc8258_355266826"/>
       <w:bookmarkEnd w:id="58"/>
       <w:r>
         <w:rPr/>
@@ -45531,7 +45531,7 @@
         <w:pStyle w:val="Heading2"/>
         <w:rPr/>
       </w:pPr>
-      <w:bookmarkStart w:id="59" w:name="__RefHeading___Toc8260_4193108665"/>
+      <w:bookmarkStart w:id="59" w:name="__RefHeading___Toc8260_355266826"/>
       <w:bookmarkEnd w:id="59"/>
       <w:r>
         <w:rPr/>
@@ -45619,7 +45619,7 @@
         <w:pStyle w:val="Heading2"/>
         <w:rPr/>
       </w:pPr>
-      <w:bookmarkStart w:id="60" w:name="__RefHeading___Toc8262_4193108665"/>
+      <w:bookmarkStart w:id="60" w:name="__RefHeading___Toc8262_355266826"/>
       <w:bookmarkEnd w:id="60"/>
       <w:r>
         <w:rPr/>
@@ -46185,7 +46185,7 @@
         <w:pStyle w:val="Heading1"/>
         <w:rPr/>
       </w:pPr>
-      <w:bookmarkStart w:id="61" w:name="__RefHeading___Toc8264_4193108665"/>
+      <w:bookmarkStart w:id="61" w:name="__RefHeading___Toc8264_355266826"/>
       <w:bookmarkEnd w:id="61"/>
       <w:r>
         <w:rPr/>
@@ -46641,7 +46641,7 @@
         <w:pStyle w:val="Heading2"/>
         <w:rPr/>
       </w:pPr>
-      <w:bookmarkStart w:id="62" w:name="__RefHeading___Toc8266_4193108665"/>
+      <w:bookmarkStart w:id="62" w:name="__RefHeading___Toc8266_355266826"/>
       <w:bookmarkEnd w:id="62"/>
       <w:r>
         <w:rPr/>
@@ -46732,7 +46732,7 @@
         <w:pStyle w:val="Heading2"/>
         <w:rPr/>
       </w:pPr>
-      <w:bookmarkStart w:id="63" w:name="__RefHeading___Toc8268_4193108665"/>
+      <w:bookmarkStart w:id="63" w:name="__RefHeading___Toc8268_355266826"/>
       <w:bookmarkEnd w:id="63"/>
       <w:r>
         <w:rPr/>
@@ -46845,7 +46845,7 @@
         <w:pStyle w:val="Heading2"/>
         <w:rPr/>
       </w:pPr>
-      <w:bookmarkStart w:id="64" w:name="__RefHeading___Toc8270_4193108665"/>
+      <w:bookmarkStart w:id="64" w:name="__RefHeading___Toc8270_355266826"/>
       <w:bookmarkEnd w:id="64"/>
       <w:r>
         <w:rPr/>
@@ -47058,7 +47058,7 @@
         <w:pStyle w:val="Heading1"/>
         <w:rPr/>
       </w:pPr>
-      <w:bookmarkStart w:id="65" w:name="__RefHeading___Toc8272_4193108665"/>
+      <w:bookmarkStart w:id="65" w:name="__RefHeading___Toc8272_355266826"/>
       <w:bookmarkEnd w:id="65"/>
       <w:r>
         <w:rPr/>
@@ -47850,7 +47850,7 @@
         <w:pStyle w:val="Heading1"/>
         <w:rPr/>
       </w:pPr>
-      <w:bookmarkStart w:id="66" w:name="__RefHeading___Toc8274_4193108665"/>
+      <w:bookmarkStart w:id="66" w:name="__RefHeading___Toc8274_355266826"/>
       <w:bookmarkEnd w:id="66"/>
       <w:r>
         <w:rPr/>

</xml_diff>